<commit_message>
Split events into current and past; order event filters newest first
- Events screen: active and upcoming events on top (active first, then
  soonest), a "Past events" divider, then past events newest first. Each
  event is tagged Active, Upcoming or Past. Past = not active and dated
  before today.
- Dashboard and Orders event filters: the active event always sits right
  after Today / All events, then the rest newest to oldest with a small PAST
  tag. Upcoming events are left out since they have no sales yet.
- The rules live in shared helpers (IsPastEvent, IsUpcomingEvent,
  EventsForFilter, SplitEvents) so the three screens agree.
- User manual updated.

Co-Authored-By: Claude Opus 5.5 <noreply@anthropic.com>
</commit_message>
<xml_diff>
--- a/Documents/CFS Sales App User Guide.docx
+++ b/Documents/CFS Sales App User Guide.docx
@@ -345,7 +345,7 @@
       <w:r>
         <w:fldChar w:fldCharType="separate"/>
       </w:r>
-      <w:hyperlink w:anchor="_Toc241438316" w:history="1">
+      <w:hyperlink w:anchor="_Toc241439631" w:history="1">
         <w:r>
           <w:rPr>
             <w:rStyle w:val="Hyperlink"/>
@@ -372,7 +372,7 @@
             <w:noProof/>
             <w:webHidden/>
           </w:rPr>
-          <w:instrText xml:space="preserve"> PAGEREF _Toc241438316 \h </w:instrText>
+          <w:instrText xml:space="preserve"> PAGEREF _Toc241439631 \h </w:instrText>
         </w:r>
         <w:r>
           <w:rPr>
@@ -413,7 +413,7 @@
           <w:noProof/>
         </w:rPr>
       </w:pPr>
-      <w:hyperlink w:anchor="_Toc241438317" w:history="1">
+      <w:hyperlink w:anchor="_Toc241439632" w:history="1">
         <w:r>
           <w:rPr>
             <w:rStyle w:val="Hyperlink"/>
@@ -440,7 +440,7 @@
             <w:noProof/>
             <w:webHidden/>
           </w:rPr>
-          <w:instrText xml:space="preserve"> PAGEREF _Toc241438317 \h </w:instrText>
+          <w:instrText xml:space="preserve"> PAGEREF _Toc241439632 \h </w:instrText>
         </w:r>
         <w:r>
           <w:rPr>
@@ -481,7 +481,7 @@
           <w:noProof/>
         </w:rPr>
       </w:pPr>
-      <w:hyperlink w:anchor="_Toc241438318" w:history="1">
+      <w:hyperlink w:anchor="_Toc241439633" w:history="1">
         <w:r>
           <w:rPr>
             <w:rStyle w:val="Hyperlink"/>
@@ -508,7 +508,7 @@
             <w:noProof/>
             <w:webHidden/>
           </w:rPr>
-          <w:instrText xml:space="preserve"> PAGEREF _Toc241438318 \h </w:instrText>
+          <w:instrText xml:space="preserve"> PAGEREF _Toc241439633 \h </w:instrText>
         </w:r>
         <w:r>
           <w:rPr>
@@ -549,7 +549,7 @@
           <w:noProof/>
         </w:rPr>
       </w:pPr>
-      <w:hyperlink w:anchor="_Toc241438319" w:history="1">
+      <w:hyperlink w:anchor="_Toc241439634" w:history="1">
         <w:r>
           <w:rPr>
             <w:rStyle w:val="Hyperlink"/>
@@ -576,7 +576,7 @@
             <w:noProof/>
             <w:webHidden/>
           </w:rPr>
-          <w:instrText xml:space="preserve"> PAGEREF _Toc241438319 \h </w:instrText>
+          <w:instrText xml:space="preserve"> PAGEREF _Toc241439634 \h </w:instrText>
         </w:r>
         <w:r>
           <w:rPr>
@@ -617,7 +617,7 @@
           <w:noProof/>
         </w:rPr>
       </w:pPr>
-      <w:hyperlink w:anchor="_Toc241438320" w:history="1">
+      <w:hyperlink w:anchor="_Toc241439635" w:history="1">
         <w:r>
           <w:rPr>
             <w:rStyle w:val="Hyperlink"/>
@@ -644,7 +644,7 @@
             <w:noProof/>
             <w:webHidden/>
           </w:rPr>
-          <w:instrText xml:space="preserve"> PAGEREF _Toc241438320 \h </w:instrText>
+          <w:instrText xml:space="preserve"> PAGEREF _Toc241439635 \h </w:instrText>
         </w:r>
         <w:r>
           <w:rPr>
@@ -685,7 +685,7 @@
           <w:noProof/>
         </w:rPr>
       </w:pPr>
-      <w:hyperlink w:anchor="_Toc241438321" w:history="1">
+      <w:hyperlink w:anchor="_Toc241439636" w:history="1">
         <w:r>
           <w:rPr>
             <w:rStyle w:val="Hyperlink"/>
@@ -712,7 +712,7 @@
             <w:noProof/>
             <w:webHidden/>
           </w:rPr>
-          <w:instrText xml:space="preserve"> PAGEREF _Toc241438321 \h </w:instrText>
+          <w:instrText xml:space="preserve"> PAGEREF _Toc241439636 \h </w:instrText>
         </w:r>
         <w:r>
           <w:rPr>
@@ -753,7 +753,7 @@
           <w:noProof/>
         </w:rPr>
       </w:pPr>
-      <w:hyperlink w:anchor="_Toc241438322" w:history="1">
+      <w:hyperlink w:anchor="_Toc241439637" w:history="1">
         <w:r>
           <w:rPr>
             <w:rStyle w:val="Hyperlink"/>
@@ -780,7 +780,7 @@
             <w:noProof/>
             <w:webHidden/>
           </w:rPr>
-          <w:instrText xml:space="preserve"> PAGEREF _Toc241438322 \h </w:instrText>
+          <w:instrText xml:space="preserve"> PAGEREF _Toc241439637 \h </w:instrText>
         </w:r>
         <w:r>
           <w:rPr>
@@ -821,7 +821,7 @@
           <w:noProof/>
         </w:rPr>
       </w:pPr>
-      <w:hyperlink w:anchor="_Toc241438323" w:history="1">
+      <w:hyperlink w:anchor="_Toc241439638" w:history="1">
         <w:r>
           <w:rPr>
             <w:rStyle w:val="Hyperlink"/>
@@ -848,7 +848,7 @@
             <w:noProof/>
             <w:webHidden/>
           </w:rPr>
-          <w:instrText xml:space="preserve"> PAGEREF _Toc241438323 \h </w:instrText>
+          <w:instrText xml:space="preserve"> PAGEREF _Toc241439638 \h </w:instrText>
         </w:r>
         <w:r>
           <w:rPr>
@@ -889,7 +889,7 @@
           <w:noProof/>
         </w:rPr>
       </w:pPr>
-      <w:hyperlink w:anchor="_Toc241438324" w:history="1">
+      <w:hyperlink w:anchor="_Toc241439639" w:history="1">
         <w:r>
           <w:rPr>
             <w:rStyle w:val="Hyperlink"/>
@@ -916,7 +916,7 @@
             <w:noProof/>
             <w:webHidden/>
           </w:rPr>
-          <w:instrText xml:space="preserve"> PAGEREF _Toc241438324 \h </w:instrText>
+          <w:instrText xml:space="preserve"> PAGEREF _Toc241439639 \h </w:instrText>
         </w:r>
         <w:r>
           <w:rPr>
@@ -957,7 +957,7 @@
           <w:noProof/>
         </w:rPr>
       </w:pPr>
-      <w:hyperlink w:anchor="_Toc241438325" w:history="1">
+      <w:hyperlink w:anchor="_Toc241439640" w:history="1">
         <w:r>
           <w:rPr>
             <w:rStyle w:val="Hyperlink"/>
@@ -984,7 +984,7 @@
             <w:noProof/>
             <w:webHidden/>
           </w:rPr>
-          <w:instrText xml:space="preserve"> PAGEREF _Toc241438325 \h </w:instrText>
+          <w:instrText xml:space="preserve"> PAGEREF _Toc241439640 \h </w:instrText>
         </w:r>
         <w:r>
           <w:rPr>
@@ -1025,7 +1025,7 @@
           <w:noProof/>
         </w:rPr>
       </w:pPr>
-      <w:hyperlink w:anchor="_Toc241438326" w:history="1">
+      <w:hyperlink w:anchor="_Toc241439641" w:history="1">
         <w:r>
           <w:rPr>
             <w:rStyle w:val="Hyperlink"/>
@@ -1052,7 +1052,7 @@
             <w:noProof/>
             <w:webHidden/>
           </w:rPr>
-          <w:instrText xml:space="preserve"> PAGEREF _Toc241438326 \h </w:instrText>
+          <w:instrText xml:space="preserve"> PAGEREF _Toc241439641 \h </w:instrText>
         </w:r>
         <w:r>
           <w:rPr>
@@ -1093,7 +1093,7 @@
           <w:noProof/>
         </w:rPr>
       </w:pPr>
-      <w:hyperlink w:anchor="_Toc241438327" w:history="1">
+      <w:hyperlink w:anchor="_Toc241439642" w:history="1">
         <w:r>
           <w:rPr>
             <w:rStyle w:val="Hyperlink"/>
@@ -1120,7 +1120,7 @@
             <w:noProof/>
             <w:webHidden/>
           </w:rPr>
-          <w:instrText xml:space="preserve"> PAGEREF _Toc241438327 \h </w:instrText>
+          <w:instrText xml:space="preserve"> PAGEREF _Toc241439642 \h </w:instrText>
         </w:r>
         <w:r>
           <w:rPr>
@@ -1161,7 +1161,7 @@
           <w:noProof/>
         </w:rPr>
       </w:pPr>
-      <w:hyperlink w:anchor="_Toc241438328" w:history="1">
+      <w:hyperlink w:anchor="_Toc241439643" w:history="1">
         <w:r>
           <w:rPr>
             <w:rStyle w:val="Hyperlink"/>
@@ -1188,7 +1188,7 @@
             <w:noProof/>
             <w:webHidden/>
           </w:rPr>
-          <w:instrText xml:space="preserve"> PAGEREF _Toc241438328 \h </w:instrText>
+          <w:instrText xml:space="preserve"> PAGEREF _Toc241439643 \h </w:instrText>
         </w:r>
         <w:r>
           <w:rPr>
@@ -1229,7 +1229,7 @@
           <w:noProof/>
         </w:rPr>
       </w:pPr>
-      <w:hyperlink w:anchor="_Toc241438329" w:history="1">
+      <w:hyperlink w:anchor="_Toc241439644" w:history="1">
         <w:r>
           <w:rPr>
             <w:rStyle w:val="Hyperlink"/>
@@ -1256,7 +1256,7 @@
             <w:noProof/>
             <w:webHidden/>
           </w:rPr>
-          <w:instrText xml:space="preserve"> PAGEREF _Toc241438329 \h </w:instrText>
+          <w:instrText xml:space="preserve"> PAGEREF _Toc241439644 \h </w:instrText>
         </w:r>
         <w:r>
           <w:rPr>
@@ -1297,7 +1297,7 @@
           <w:noProof/>
         </w:rPr>
       </w:pPr>
-      <w:hyperlink w:anchor="_Toc241438330" w:history="1">
+      <w:hyperlink w:anchor="_Toc241439645" w:history="1">
         <w:r>
           <w:rPr>
             <w:rStyle w:val="Hyperlink"/>
@@ -1324,7 +1324,7 @@
             <w:noProof/>
             <w:webHidden/>
           </w:rPr>
-          <w:instrText xml:space="preserve"> PAGEREF _Toc241438330 \h </w:instrText>
+          <w:instrText xml:space="preserve"> PAGEREF _Toc241439645 \h </w:instrText>
         </w:r>
         <w:r>
           <w:rPr>
@@ -1365,7 +1365,7 @@
           <w:noProof/>
         </w:rPr>
       </w:pPr>
-      <w:hyperlink w:anchor="_Toc241438331" w:history="1">
+      <w:hyperlink w:anchor="_Toc241439646" w:history="1">
         <w:r>
           <w:rPr>
             <w:rStyle w:val="Hyperlink"/>
@@ -1392,7 +1392,7 @@
             <w:noProof/>
             <w:webHidden/>
           </w:rPr>
-          <w:instrText xml:space="preserve"> PAGEREF _Toc241438331 \h </w:instrText>
+          <w:instrText xml:space="preserve"> PAGEREF _Toc241439646 \h </w:instrText>
         </w:r>
         <w:r>
           <w:rPr>
@@ -1433,7 +1433,7 @@
           <w:noProof/>
         </w:rPr>
       </w:pPr>
-      <w:hyperlink w:anchor="_Toc241438332" w:history="1">
+      <w:hyperlink w:anchor="_Toc241439647" w:history="1">
         <w:r>
           <w:rPr>
             <w:rStyle w:val="Hyperlink"/>
@@ -1460,7 +1460,7 @@
             <w:noProof/>
             <w:webHidden/>
           </w:rPr>
-          <w:instrText xml:space="preserve"> PAGEREF _Toc241438332 \h </w:instrText>
+          <w:instrText xml:space="preserve"> PAGEREF _Toc241439647 \h </w:instrText>
         </w:r>
         <w:r>
           <w:rPr>
@@ -1501,7 +1501,7 @@
           <w:noProof/>
         </w:rPr>
       </w:pPr>
-      <w:hyperlink w:anchor="_Toc241438333" w:history="1">
+      <w:hyperlink w:anchor="_Toc241439648" w:history="1">
         <w:r>
           <w:rPr>
             <w:rStyle w:val="Hyperlink"/>
@@ -1528,7 +1528,7 @@
             <w:noProof/>
             <w:webHidden/>
           </w:rPr>
-          <w:instrText xml:space="preserve"> PAGEREF _Toc241438333 \h </w:instrText>
+          <w:instrText xml:space="preserve"> PAGEREF _Toc241439648 \h </w:instrText>
         </w:r>
         <w:r>
           <w:rPr>
@@ -1569,7 +1569,7 @@
           <w:noProof/>
         </w:rPr>
       </w:pPr>
-      <w:hyperlink w:anchor="_Toc241438334" w:history="1">
+      <w:hyperlink w:anchor="_Toc241439649" w:history="1">
         <w:r>
           <w:rPr>
             <w:rStyle w:val="Hyperlink"/>
@@ -1596,7 +1596,7 @@
             <w:noProof/>
             <w:webHidden/>
           </w:rPr>
-          <w:instrText xml:space="preserve"> PAGEREF _Toc241438334 \h </w:instrText>
+          <w:instrText xml:space="preserve"> PAGEREF _Toc241439649 \h </w:instrText>
         </w:r>
         <w:r>
           <w:rPr>
@@ -1637,7 +1637,7 @@
           <w:noProof/>
         </w:rPr>
       </w:pPr>
-      <w:hyperlink w:anchor="_Toc241438335" w:history="1">
+      <w:hyperlink w:anchor="_Toc241439650" w:history="1">
         <w:r>
           <w:rPr>
             <w:rStyle w:val="Hyperlink"/>
@@ -1664,7 +1664,7 @@
             <w:noProof/>
             <w:webHidden/>
           </w:rPr>
-          <w:instrText xml:space="preserve"> PAGEREF _Toc241438335 \h </w:instrText>
+          <w:instrText xml:space="preserve"> PAGEREF _Toc241439650 \h </w:instrText>
         </w:r>
         <w:r>
           <w:rPr>
@@ -1705,7 +1705,7 @@
           <w:noProof/>
         </w:rPr>
       </w:pPr>
-      <w:hyperlink w:anchor="_Toc241438336" w:history="1">
+      <w:hyperlink w:anchor="_Toc241439651" w:history="1">
         <w:r>
           <w:rPr>
             <w:rStyle w:val="Hyperlink"/>
@@ -1732,7 +1732,7 @@
             <w:noProof/>
             <w:webHidden/>
           </w:rPr>
-          <w:instrText xml:space="preserve"> PAGEREF _Toc241438336 \h </w:instrText>
+          <w:instrText xml:space="preserve"> PAGEREF _Toc241439651 \h </w:instrText>
         </w:r>
         <w:r>
           <w:rPr>
@@ -1773,7 +1773,7 @@
           <w:noProof/>
         </w:rPr>
       </w:pPr>
-      <w:hyperlink w:anchor="_Toc241438337" w:history="1">
+      <w:hyperlink w:anchor="_Toc241439652" w:history="1">
         <w:r>
           <w:rPr>
             <w:rStyle w:val="Hyperlink"/>
@@ -1800,7 +1800,7 @@
             <w:noProof/>
             <w:webHidden/>
           </w:rPr>
-          <w:instrText xml:space="preserve"> PAGEREF _Toc241438337 \h </w:instrText>
+          <w:instrText xml:space="preserve"> PAGEREF _Toc241439652 \h </w:instrText>
         </w:r>
         <w:r>
           <w:rPr>
@@ -1841,7 +1841,7 @@
           <w:noProof/>
         </w:rPr>
       </w:pPr>
-      <w:hyperlink w:anchor="_Toc241438338" w:history="1">
+      <w:hyperlink w:anchor="_Toc241439653" w:history="1">
         <w:r>
           <w:rPr>
             <w:rStyle w:val="Hyperlink"/>
@@ -1868,7 +1868,7 @@
             <w:noProof/>
             <w:webHidden/>
           </w:rPr>
-          <w:instrText xml:space="preserve"> PAGEREF _Toc241438338 \h </w:instrText>
+          <w:instrText xml:space="preserve"> PAGEREF _Toc241439653 \h </w:instrText>
         </w:r>
         <w:r>
           <w:rPr>
@@ -1909,7 +1909,7 @@
           <w:noProof/>
         </w:rPr>
       </w:pPr>
-      <w:hyperlink w:anchor="_Toc241438339" w:history="1">
+      <w:hyperlink w:anchor="_Toc241439654" w:history="1">
         <w:r>
           <w:rPr>
             <w:rStyle w:val="Hyperlink"/>
@@ -1936,7 +1936,7 @@
             <w:noProof/>
             <w:webHidden/>
           </w:rPr>
-          <w:instrText xml:space="preserve"> PAGEREF _Toc241438339 \h </w:instrText>
+          <w:instrText xml:space="preserve"> PAGEREF _Toc241439654 \h </w:instrText>
         </w:r>
         <w:r>
           <w:rPr>
@@ -1977,7 +1977,7 @@
           <w:noProof/>
         </w:rPr>
       </w:pPr>
-      <w:hyperlink w:anchor="_Toc241438340" w:history="1">
+      <w:hyperlink w:anchor="_Toc241439655" w:history="1">
         <w:r>
           <w:rPr>
             <w:rStyle w:val="Hyperlink"/>
@@ -2004,7 +2004,7 @@
             <w:noProof/>
             <w:webHidden/>
           </w:rPr>
-          <w:instrText xml:space="preserve"> PAGEREF _Toc241438340 \h </w:instrText>
+          <w:instrText xml:space="preserve"> PAGEREF _Toc241439655 \h </w:instrText>
         </w:r>
         <w:r>
           <w:rPr>
@@ -2045,7 +2045,7 @@
           <w:noProof/>
         </w:rPr>
       </w:pPr>
-      <w:hyperlink w:anchor="_Toc241438341" w:history="1">
+      <w:hyperlink w:anchor="_Toc241439656" w:history="1">
         <w:r>
           <w:rPr>
             <w:rStyle w:val="Hyperlink"/>
@@ -2072,7 +2072,7 @@
             <w:noProof/>
             <w:webHidden/>
           </w:rPr>
-          <w:instrText xml:space="preserve"> PAGEREF _Toc241438341 \h </w:instrText>
+          <w:instrText xml:space="preserve"> PAGEREF _Toc241439656 \h </w:instrText>
         </w:r>
         <w:r>
           <w:rPr>
@@ -2113,7 +2113,7 @@
           <w:noProof/>
         </w:rPr>
       </w:pPr>
-      <w:hyperlink w:anchor="_Toc241438342" w:history="1">
+      <w:hyperlink w:anchor="_Toc241439657" w:history="1">
         <w:r>
           <w:rPr>
             <w:rStyle w:val="Hyperlink"/>
@@ -2140,7 +2140,7 @@
             <w:noProof/>
             <w:webHidden/>
           </w:rPr>
-          <w:instrText xml:space="preserve"> PAGEREF _Toc241438342 \h </w:instrText>
+          <w:instrText xml:space="preserve"> PAGEREF _Toc241439657 \h </w:instrText>
         </w:r>
         <w:r>
           <w:rPr>
@@ -2181,7 +2181,7 @@
           <w:noProof/>
         </w:rPr>
       </w:pPr>
-      <w:hyperlink w:anchor="_Toc241438343" w:history="1">
+      <w:hyperlink w:anchor="_Toc241439658" w:history="1">
         <w:r>
           <w:rPr>
             <w:rStyle w:val="Hyperlink"/>
@@ -2208,7 +2208,7 @@
             <w:noProof/>
             <w:webHidden/>
           </w:rPr>
-          <w:instrText xml:space="preserve"> PAGEREF _Toc241438343 \h </w:instrText>
+          <w:instrText xml:space="preserve"> PAGEREF _Toc241439658 \h </w:instrText>
         </w:r>
         <w:r>
           <w:rPr>
@@ -2249,7 +2249,7 @@
           <w:noProof/>
         </w:rPr>
       </w:pPr>
-      <w:hyperlink w:anchor="_Toc241438344" w:history="1">
+      <w:hyperlink w:anchor="_Toc241439659" w:history="1">
         <w:r>
           <w:rPr>
             <w:rStyle w:val="Hyperlink"/>
@@ -2276,7 +2276,7 @@
             <w:noProof/>
             <w:webHidden/>
           </w:rPr>
-          <w:instrText xml:space="preserve"> PAGEREF _Toc241438344 \h </w:instrText>
+          <w:instrText xml:space="preserve"> PAGEREF _Toc241439659 \h </w:instrText>
         </w:r>
         <w:r>
           <w:rPr>
@@ -2296,7 +2296,7 @@
             <w:noProof/>
             <w:webHidden/>
           </w:rPr>
-          <w:t>23</w:t>
+          <w:t>24</w:t>
         </w:r>
         <w:r>
           <w:rPr>
@@ -2317,7 +2317,7 @@
           <w:noProof/>
         </w:rPr>
       </w:pPr>
-      <w:hyperlink w:anchor="_Toc241438345" w:history="1">
+      <w:hyperlink w:anchor="_Toc241439660" w:history="1">
         <w:r>
           <w:rPr>
             <w:rStyle w:val="Hyperlink"/>
@@ -2344,7 +2344,7 @@
             <w:noProof/>
             <w:webHidden/>
           </w:rPr>
-          <w:instrText xml:space="preserve"> PAGEREF _Toc241438345 \h </w:instrText>
+          <w:instrText xml:space="preserve"> PAGEREF _Toc241439660 \h </w:instrText>
         </w:r>
         <w:r>
           <w:rPr>
@@ -2364,7 +2364,7 @@
             <w:noProof/>
             <w:webHidden/>
           </w:rPr>
-          <w:t>23</w:t>
+          <w:t>24</w:t>
         </w:r>
         <w:r>
           <w:rPr>
@@ -2385,7 +2385,7 @@
           <w:noProof/>
         </w:rPr>
       </w:pPr>
-      <w:hyperlink w:anchor="_Toc241438346" w:history="1">
+      <w:hyperlink w:anchor="_Toc241439661" w:history="1">
         <w:r>
           <w:rPr>
             <w:rStyle w:val="Hyperlink"/>
@@ -2412,7 +2412,7 @@
             <w:noProof/>
             <w:webHidden/>
           </w:rPr>
-          <w:instrText xml:space="preserve"> PAGEREF _Toc241438346 \h </w:instrText>
+          <w:instrText xml:space="preserve"> PAGEREF _Toc241439661 \h </w:instrText>
         </w:r>
         <w:r>
           <w:rPr>
@@ -2432,7 +2432,7 @@
             <w:noProof/>
             <w:webHidden/>
           </w:rPr>
-          <w:t>23</w:t>
+          <w:t>24</w:t>
         </w:r>
         <w:r>
           <w:rPr>
@@ -2453,7 +2453,7 @@
           <w:noProof/>
         </w:rPr>
       </w:pPr>
-      <w:hyperlink w:anchor="_Toc241438347" w:history="1">
+      <w:hyperlink w:anchor="_Toc241439662" w:history="1">
         <w:r>
           <w:rPr>
             <w:rStyle w:val="Hyperlink"/>
@@ -2480,7 +2480,7 @@
             <w:noProof/>
             <w:webHidden/>
           </w:rPr>
-          <w:instrText xml:space="preserve"> PAGEREF _Toc241438347 \h </w:instrText>
+          <w:instrText xml:space="preserve"> PAGEREF _Toc241439662 \h </w:instrText>
         </w:r>
         <w:r>
           <w:rPr>
@@ -2500,7 +2500,7 @@
             <w:noProof/>
             <w:webHidden/>
           </w:rPr>
-          <w:t>24</w:t>
+          <w:t>25</w:t>
         </w:r>
         <w:r>
           <w:rPr>
@@ -2521,7 +2521,7 @@
           <w:noProof/>
         </w:rPr>
       </w:pPr>
-      <w:hyperlink w:anchor="_Toc241438348" w:history="1">
+      <w:hyperlink w:anchor="_Toc241439663" w:history="1">
         <w:r>
           <w:rPr>
             <w:rStyle w:val="Hyperlink"/>
@@ -2548,7 +2548,7 @@
             <w:noProof/>
             <w:webHidden/>
           </w:rPr>
-          <w:instrText xml:space="preserve"> PAGEREF _Toc241438348 \h </w:instrText>
+          <w:instrText xml:space="preserve"> PAGEREF _Toc241439663 \h </w:instrText>
         </w:r>
         <w:r>
           <w:rPr>
@@ -2568,7 +2568,7 @@
             <w:noProof/>
             <w:webHidden/>
           </w:rPr>
-          <w:t>25</w:t>
+          <w:t>26</w:t>
         </w:r>
         <w:r>
           <w:rPr>
@@ -2589,7 +2589,7 @@
           <w:noProof/>
         </w:rPr>
       </w:pPr>
-      <w:hyperlink w:anchor="_Toc241438349" w:history="1">
+      <w:hyperlink w:anchor="_Toc241439664" w:history="1">
         <w:r>
           <w:rPr>
             <w:rStyle w:val="Hyperlink"/>
@@ -2616,7 +2616,7 @@
             <w:noProof/>
             <w:webHidden/>
           </w:rPr>
-          <w:instrText xml:space="preserve"> PAGEREF _Toc241438349 \h </w:instrText>
+          <w:instrText xml:space="preserve"> PAGEREF _Toc241439664 \h </w:instrText>
         </w:r>
         <w:r>
           <w:rPr>
@@ -2636,7 +2636,7 @@
             <w:noProof/>
             <w:webHidden/>
           </w:rPr>
-          <w:t>25</w:t>
+          <w:t>26</w:t>
         </w:r>
         <w:r>
           <w:rPr>
@@ -2657,7 +2657,7 @@
           <w:noProof/>
         </w:rPr>
       </w:pPr>
-      <w:hyperlink w:anchor="_Toc241438350" w:history="1">
+      <w:hyperlink w:anchor="_Toc241439665" w:history="1">
         <w:r>
           <w:rPr>
             <w:rStyle w:val="Hyperlink"/>
@@ -2684,7 +2684,7 @@
             <w:noProof/>
             <w:webHidden/>
           </w:rPr>
-          <w:instrText xml:space="preserve"> PAGEREF _Toc241438350 \h </w:instrText>
+          <w:instrText xml:space="preserve"> PAGEREF _Toc241439665 \h </w:instrText>
         </w:r>
         <w:r>
           <w:rPr>
@@ -2704,7 +2704,7 @@
             <w:noProof/>
             <w:webHidden/>
           </w:rPr>
-          <w:t>25</w:t>
+          <w:t>26</w:t>
         </w:r>
         <w:r>
           <w:rPr>
@@ -2725,7 +2725,7 @@
           <w:noProof/>
         </w:rPr>
       </w:pPr>
-      <w:hyperlink w:anchor="_Toc241438351" w:history="1">
+      <w:hyperlink w:anchor="_Toc241439666" w:history="1">
         <w:r>
           <w:rPr>
             <w:rStyle w:val="Hyperlink"/>
@@ -2752,7 +2752,7 @@
             <w:noProof/>
             <w:webHidden/>
           </w:rPr>
-          <w:instrText xml:space="preserve"> PAGEREF _Toc241438351 \h </w:instrText>
+          <w:instrText xml:space="preserve"> PAGEREF _Toc241439666 \h </w:instrText>
         </w:r>
         <w:r>
           <w:rPr>
@@ -2772,7 +2772,7 @@
             <w:noProof/>
             <w:webHidden/>
           </w:rPr>
-          <w:t>27</w:t>
+          <w:t>28</w:t>
         </w:r>
         <w:r>
           <w:rPr>
@@ -2793,7 +2793,7 @@
           <w:noProof/>
         </w:rPr>
       </w:pPr>
-      <w:hyperlink w:anchor="_Toc241438352" w:history="1">
+      <w:hyperlink w:anchor="_Toc241439667" w:history="1">
         <w:r>
           <w:rPr>
             <w:rStyle w:val="Hyperlink"/>
@@ -2820,7 +2820,7 @@
             <w:noProof/>
             <w:webHidden/>
           </w:rPr>
-          <w:instrText xml:space="preserve"> PAGEREF _Toc241438352 \h </w:instrText>
+          <w:instrText xml:space="preserve"> PAGEREF _Toc241439667 \h </w:instrText>
         </w:r>
         <w:r>
           <w:rPr>
@@ -2840,7 +2840,7 @@
             <w:noProof/>
             <w:webHidden/>
           </w:rPr>
-          <w:t>27</w:t>
+          <w:t>28</w:t>
         </w:r>
         <w:r>
           <w:rPr>
@@ -2861,7 +2861,7 @@
           <w:noProof/>
         </w:rPr>
       </w:pPr>
-      <w:hyperlink w:anchor="_Toc241438353" w:history="1">
+      <w:hyperlink w:anchor="_Toc241439668" w:history="1">
         <w:r>
           <w:rPr>
             <w:rStyle w:val="Hyperlink"/>
@@ -2888,7 +2888,7 @@
             <w:noProof/>
             <w:webHidden/>
           </w:rPr>
-          <w:instrText xml:space="preserve"> PAGEREF _Toc241438353 \h </w:instrText>
+          <w:instrText xml:space="preserve"> PAGEREF _Toc241439668 \h </w:instrText>
         </w:r>
         <w:r>
           <w:rPr>
@@ -2908,7 +2908,7 @@
             <w:noProof/>
             <w:webHidden/>
           </w:rPr>
-          <w:t>28</w:t>
+          <w:t>29</w:t>
         </w:r>
         <w:r>
           <w:rPr>
@@ -2929,7 +2929,7 @@
           <w:noProof/>
         </w:rPr>
       </w:pPr>
-      <w:hyperlink w:anchor="_Toc241438354" w:history="1">
+      <w:hyperlink w:anchor="_Toc241439669" w:history="1">
         <w:r>
           <w:rPr>
             <w:rStyle w:val="Hyperlink"/>
@@ -2956,7 +2956,7 @@
             <w:noProof/>
             <w:webHidden/>
           </w:rPr>
-          <w:instrText xml:space="preserve"> PAGEREF _Toc241438354 \h </w:instrText>
+          <w:instrText xml:space="preserve"> PAGEREF _Toc241439669 \h </w:instrText>
         </w:r>
         <w:r>
           <w:rPr>
@@ -2976,7 +2976,7 @@
             <w:noProof/>
             <w:webHidden/>
           </w:rPr>
-          <w:t>30</w:t>
+          <w:t>31</w:t>
         </w:r>
         <w:r>
           <w:rPr>
@@ -2997,7 +2997,7 @@
           <w:noProof/>
         </w:rPr>
       </w:pPr>
-      <w:hyperlink w:anchor="_Toc241438355" w:history="1">
+      <w:hyperlink w:anchor="_Toc241439670" w:history="1">
         <w:r>
           <w:rPr>
             <w:rStyle w:val="Hyperlink"/>
@@ -3024,7 +3024,7 @@
             <w:noProof/>
             <w:webHidden/>
           </w:rPr>
-          <w:instrText xml:space="preserve"> PAGEREF _Toc241438355 \h </w:instrText>
+          <w:instrText xml:space="preserve"> PAGEREF _Toc241439670 \h </w:instrText>
         </w:r>
         <w:r>
           <w:rPr>
@@ -3044,7 +3044,7 @@
             <w:noProof/>
             <w:webHidden/>
           </w:rPr>
-          <w:t>31</w:t>
+          <w:t>32</w:t>
         </w:r>
         <w:r>
           <w:rPr>
@@ -3065,7 +3065,7 @@
           <w:noProof/>
         </w:rPr>
       </w:pPr>
-      <w:hyperlink w:anchor="_Toc241438356" w:history="1">
+      <w:hyperlink w:anchor="_Toc241439671" w:history="1">
         <w:r>
           <w:rPr>
             <w:rStyle w:val="Hyperlink"/>
@@ -3092,7 +3092,7 @@
             <w:noProof/>
             <w:webHidden/>
           </w:rPr>
-          <w:instrText xml:space="preserve"> PAGEREF _Toc241438356 \h </w:instrText>
+          <w:instrText xml:space="preserve"> PAGEREF _Toc241439671 \h </w:instrText>
         </w:r>
         <w:r>
           <w:rPr>
@@ -3112,7 +3112,7 @@
             <w:noProof/>
             <w:webHidden/>
           </w:rPr>
-          <w:t>32</w:t>
+          <w:t>33</w:t>
         </w:r>
         <w:r>
           <w:rPr>
@@ -3133,7 +3133,7 @@
           <w:noProof/>
         </w:rPr>
       </w:pPr>
-      <w:hyperlink w:anchor="_Toc241438357" w:history="1">
+      <w:hyperlink w:anchor="_Toc241439672" w:history="1">
         <w:r>
           <w:rPr>
             <w:rStyle w:val="Hyperlink"/>
@@ -3160,7 +3160,7 @@
             <w:noProof/>
             <w:webHidden/>
           </w:rPr>
-          <w:instrText xml:space="preserve"> PAGEREF _Toc241438357 \h </w:instrText>
+          <w:instrText xml:space="preserve"> PAGEREF _Toc241439672 \h </w:instrText>
         </w:r>
         <w:r>
           <w:rPr>
@@ -3180,7 +3180,7 @@
             <w:noProof/>
             <w:webHidden/>
           </w:rPr>
-          <w:t>34</w:t>
+          <w:t>35</w:t>
         </w:r>
         <w:r>
           <w:rPr>
@@ -3201,7 +3201,7 @@
           <w:noProof/>
         </w:rPr>
       </w:pPr>
-      <w:hyperlink w:anchor="_Toc241438358" w:history="1">
+      <w:hyperlink w:anchor="_Toc241439673" w:history="1">
         <w:r>
           <w:rPr>
             <w:rStyle w:val="Hyperlink"/>
@@ -3228,7 +3228,7 @@
             <w:noProof/>
             <w:webHidden/>
           </w:rPr>
-          <w:instrText xml:space="preserve"> PAGEREF _Toc241438358 \h </w:instrText>
+          <w:instrText xml:space="preserve"> PAGEREF _Toc241439673 \h </w:instrText>
         </w:r>
         <w:r>
           <w:rPr>
@@ -3248,7 +3248,7 @@
             <w:noProof/>
             <w:webHidden/>
           </w:rPr>
-          <w:t>35</w:t>
+          <w:t>36</w:t>
         </w:r>
         <w:r>
           <w:rPr>
@@ -3269,7 +3269,7 @@
           <w:noProof/>
         </w:rPr>
       </w:pPr>
-      <w:hyperlink w:anchor="_Toc241438359" w:history="1">
+      <w:hyperlink w:anchor="_Toc241439674" w:history="1">
         <w:r>
           <w:rPr>
             <w:rStyle w:val="Hyperlink"/>
@@ -3296,7 +3296,7 @@
             <w:noProof/>
             <w:webHidden/>
           </w:rPr>
-          <w:instrText xml:space="preserve"> PAGEREF _Toc241438359 \h </w:instrText>
+          <w:instrText xml:space="preserve"> PAGEREF _Toc241439674 \h </w:instrText>
         </w:r>
         <w:r>
           <w:rPr>
@@ -3316,7 +3316,7 @@
             <w:noProof/>
             <w:webHidden/>
           </w:rPr>
-          <w:t>37</w:t>
+          <w:t>38</w:t>
         </w:r>
         <w:r>
           <w:rPr>
@@ -3337,7 +3337,7 @@
           <w:noProof/>
         </w:rPr>
       </w:pPr>
-      <w:hyperlink w:anchor="_Toc241438360" w:history="1">
+      <w:hyperlink w:anchor="_Toc241439675" w:history="1">
         <w:r>
           <w:rPr>
             <w:rStyle w:val="Hyperlink"/>
@@ -3364,7 +3364,7 @@
             <w:noProof/>
             <w:webHidden/>
           </w:rPr>
-          <w:instrText xml:space="preserve"> PAGEREF _Toc241438360 \h </w:instrText>
+          <w:instrText xml:space="preserve"> PAGEREF _Toc241439675 \h </w:instrText>
         </w:r>
         <w:r>
           <w:rPr>
@@ -3384,7 +3384,7 @@
             <w:noProof/>
             <w:webHidden/>
           </w:rPr>
-          <w:t>39</w:t>
+          <w:t>40</w:t>
         </w:r>
         <w:r>
           <w:rPr>
@@ -3405,7 +3405,7 @@
           <w:noProof/>
         </w:rPr>
       </w:pPr>
-      <w:hyperlink w:anchor="_Toc241438361" w:history="1">
+      <w:hyperlink w:anchor="_Toc241439676" w:history="1">
         <w:r>
           <w:rPr>
             <w:rStyle w:val="Hyperlink"/>
@@ -3432,7 +3432,7 @@
             <w:noProof/>
             <w:webHidden/>
           </w:rPr>
-          <w:instrText xml:space="preserve"> PAGEREF _Toc241438361 \h </w:instrText>
+          <w:instrText xml:space="preserve"> PAGEREF _Toc241439676 \h </w:instrText>
         </w:r>
         <w:r>
           <w:rPr>
@@ -3452,7 +3452,7 @@
             <w:noProof/>
             <w:webHidden/>
           </w:rPr>
-          <w:t>39</w:t>
+          <w:t>40</w:t>
         </w:r>
         <w:r>
           <w:rPr>
@@ -3473,7 +3473,7 @@
           <w:noProof/>
         </w:rPr>
       </w:pPr>
-      <w:hyperlink w:anchor="_Toc241438362" w:history="1">
+      <w:hyperlink w:anchor="_Toc241439677" w:history="1">
         <w:r>
           <w:rPr>
             <w:rStyle w:val="Hyperlink"/>
@@ -3500,7 +3500,7 @@
             <w:noProof/>
             <w:webHidden/>
           </w:rPr>
-          <w:instrText xml:space="preserve"> PAGEREF _Toc241438362 \h </w:instrText>
+          <w:instrText xml:space="preserve"> PAGEREF _Toc241439677 \h </w:instrText>
         </w:r>
         <w:r>
           <w:rPr>
@@ -3520,7 +3520,7 @@
             <w:noProof/>
             <w:webHidden/>
           </w:rPr>
-          <w:t>39</w:t>
+          <w:t>40</w:t>
         </w:r>
         <w:r>
           <w:rPr>
@@ -3541,7 +3541,7 @@
           <w:noProof/>
         </w:rPr>
       </w:pPr>
-      <w:hyperlink w:anchor="_Toc241438363" w:history="1">
+      <w:hyperlink w:anchor="_Toc241439678" w:history="1">
         <w:r>
           <w:rPr>
             <w:rStyle w:val="Hyperlink"/>
@@ -3568,7 +3568,7 @@
             <w:noProof/>
             <w:webHidden/>
           </w:rPr>
-          <w:instrText xml:space="preserve"> PAGEREF _Toc241438363 \h </w:instrText>
+          <w:instrText xml:space="preserve"> PAGEREF _Toc241439678 \h </w:instrText>
         </w:r>
         <w:r>
           <w:rPr>
@@ -3588,7 +3588,7 @@
             <w:noProof/>
             <w:webHidden/>
           </w:rPr>
-          <w:t>39</w:t>
+          <w:t>40</w:t>
         </w:r>
         <w:r>
           <w:rPr>
@@ -3609,7 +3609,7 @@
           <w:noProof/>
         </w:rPr>
       </w:pPr>
-      <w:hyperlink w:anchor="_Toc241438364" w:history="1">
+      <w:hyperlink w:anchor="_Toc241439679" w:history="1">
         <w:r>
           <w:rPr>
             <w:rStyle w:val="Hyperlink"/>
@@ -3636,7 +3636,7 @@
             <w:noProof/>
             <w:webHidden/>
           </w:rPr>
-          <w:instrText xml:space="preserve"> PAGEREF _Toc241438364 \h </w:instrText>
+          <w:instrText xml:space="preserve"> PAGEREF _Toc241439679 \h </w:instrText>
         </w:r>
         <w:r>
           <w:rPr>
@@ -3656,7 +3656,7 @@
             <w:noProof/>
             <w:webHidden/>
           </w:rPr>
-          <w:t>39</w:t>
+          <w:t>40</w:t>
         </w:r>
         <w:r>
           <w:rPr>
@@ -3677,7 +3677,7 @@
         <w:pStyle w:val="Heading1"/>
         <w:pageBreakBefore/>
       </w:pPr>
-      <w:bookmarkStart w:id="0" w:name="_Toc241438316"/>
+      <w:bookmarkStart w:id="0" w:name="_Toc241439631"/>
       <w:r>
         <w:lastRenderedPageBreak/>
         <w:t>Welcome</w:t>
@@ -3693,7 +3693,7 @@
       <w:pPr>
         <w:pStyle w:val="Heading2"/>
       </w:pPr>
-      <w:bookmarkStart w:id="1" w:name="_Toc241438317"/>
+      <w:bookmarkStart w:id="1" w:name="_Toc241439632"/>
       <w:r>
         <w:t>How a sale moves through the app</w:t>
       </w:r>
@@ -4176,7 +4176,7 @@
       <w:pPr>
         <w:pStyle w:val="Heading2"/>
       </w:pPr>
-      <w:bookmarkStart w:id="2" w:name="_Toc241438318"/>
+      <w:bookmarkStart w:id="2" w:name="_Toc241439633"/>
       <w:r>
         <w:t>What you'll need</w:t>
       </w:r>
@@ -4285,7 +4285,7 @@
         <w:pStyle w:val="Heading1"/>
         <w:pageBreakBefore/>
       </w:pPr>
-      <w:bookmarkStart w:id="3" w:name="_Toc241438319"/>
+      <w:bookmarkStart w:id="3" w:name="_Toc241439634"/>
       <w:r>
         <w:lastRenderedPageBreak/>
         <w:t>Who can do what</w:t>
@@ -4853,7 +4853,7 @@
         <w:pStyle w:val="Heading1"/>
         <w:pageBreakBefore/>
       </w:pPr>
-      <w:bookmarkStart w:id="4" w:name="_Toc241438320"/>
+      <w:bookmarkStart w:id="4" w:name="_Toc241439635"/>
       <w:r>
         <w:lastRenderedPageBreak/>
         <w:t>Getting started</w:t>
@@ -4864,7 +4864,7 @@
       <w:pPr>
         <w:pStyle w:val="Heading2"/>
       </w:pPr>
-      <w:bookmarkStart w:id="5" w:name="_Toc241438321"/>
+      <w:bookmarkStart w:id="5" w:name="_Toc241439636"/>
       <w:r>
         <w:t>Signing in</w:t>
       </w:r>
@@ -4881,7 +4881,7 @@
           <w:noProof/>
         </w:rPr>
         <w:drawing>
-          <wp:inline distT="0" distB="0" distL="0" distR="0" wp14:anchorId="634CAD35" wp14:editId="0F9DAA3E">
+          <wp:inline distT="0" distB="0" distL="0" distR="0" wp14:anchorId="12E5996E" wp14:editId="0D3BD4D9">
             <wp:extent cx="3291840" cy="2211705"/>
             <wp:effectExtent l="0" t="0" r="0" b="0"/>
             <wp:docPr id="1" name="Picture 1"/>
@@ -5199,7 +5199,7 @@
       <w:pPr>
         <w:pStyle w:val="Heading2"/>
       </w:pPr>
-      <w:bookmarkStart w:id="6" w:name="_Toc241438322"/>
+      <w:bookmarkStart w:id="6" w:name="_Toc241439637"/>
       <w:r>
         <w:t>Changing your PIN</w:t>
       </w:r>
@@ -5381,7 +5381,7 @@
       <w:pPr>
         <w:pStyle w:val="Heading2"/>
       </w:pPr>
-      <w:bookmarkStart w:id="7" w:name="_Toc241438323"/>
+      <w:bookmarkStart w:id="7" w:name="_Toc241439638"/>
       <w:r>
         <w:lastRenderedPageBreak/>
         <w:t>Finding your way around</w:t>
@@ -5964,7 +5964,7 @@
       <w:pPr>
         <w:pStyle w:val="Heading2"/>
       </w:pPr>
-      <w:bookmarkStart w:id="8" w:name="_Toc241438324"/>
+      <w:bookmarkStart w:id="8" w:name="_Toc241439639"/>
       <w:r>
         <w:t>Light and dark mode</w:t>
       </w:r>
@@ -5979,7 +5979,7 @@
       <w:pPr>
         <w:pStyle w:val="Heading2"/>
       </w:pPr>
-      <w:bookmarkStart w:id="9" w:name="_Toc241438325"/>
+      <w:bookmarkStart w:id="9" w:name="_Toc241439640"/>
       <w:r>
         <w:t>Signing out</w:t>
       </w:r>
@@ -6004,7 +6004,7 @@
         <w:pStyle w:val="Heading1"/>
         <w:pageBreakBefore/>
       </w:pPr>
-      <w:bookmarkStart w:id="10" w:name="_Toc241438326"/>
+      <w:bookmarkStart w:id="10" w:name="_Toc241439641"/>
       <w:r>
         <w:lastRenderedPageBreak/>
         <w:t>Taking an order on the sales floor</w:t>
@@ -6036,7 +6036,7 @@
           <w:noProof/>
         </w:rPr>
         <w:drawing>
-          <wp:inline distT="0" distB="0" distL="0" distR="0" wp14:anchorId="2E98B3CA" wp14:editId="333606C1">
+          <wp:inline distT="0" distB="0" distL="0" distR="0" wp14:anchorId="4B615209" wp14:editId="6F950EDD">
             <wp:extent cx="5760720" cy="3870484"/>
             <wp:effectExtent l="0" t="0" r="0" b="0"/>
             <wp:docPr id="2" name="Picture 2"/>
@@ -6161,7 +6161,7 @@
       <w:pPr>
         <w:pStyle w:val="Heading2"/>
       </w:pPr>
-      <w:bookmarkStart w:id="11" w:name="_Toc241438327"/>
+      <w:bookmarkStart w:id="11" w:name="_Toc241439642"/>
       <w:r>
         <w:t>Starting an order</w:t>
       </w:r>
@@ -6245,7 +6245,7 @@
       <w:pPr>
         <w:pStyle w:val="Heading2"/>
       </w:pPr>
-      <w:bookmarkStart w:id="12" w:name="_Toc241438328"/>
+      <w:bookmarkStart w:id="12" w:name="_Toc241439643"/>
       <w:r>
         <w:lastRenderedPageBreak/>
         <w:t>Adding items</w:t>
@@ -6394,7 +6394,7 @@
           <w:noProof/>
         </w:rPr>
         <w:drawing>
-          <wp:inline distT="0" distB="0" distL="0" distR="0" wp14:anchorId="3AADE0B2" wp14:editId="3B91EA8D">
+          <wp:inline distT="0" distB="0" distL="0" distR="0" wp14:anchorId="44682E32" wp14:editId="6BC0FC05">
             <wp:extent cx="5760720" cy="3870484"/>
             <wp:effectExtent l="0" t="0" r="0" b="0"/>
             <wp:docPr id="3" name="Picture 3"/>
@@ -6531,7 +6531,7 @@
           <w:noProof/>
         </w:rPr>
         <w:drawing>
-          <wp:inline distT="0" distB="0" distL="0" distR="0" wp14:anchorId="67DFED8D" wp14:editId="14A91B42">
+          <wp:inline distT="0" distB="0" distL="0" distR="0" wp14:anchorId="65912D12" wp14:editId="0D7B030E">
             <wp:extent cx="5760720" cy="3870484"/>
             <wp:effectExtent l="0" t="0" r="0" b="0"/>
             <wp:docPr id="4" name="Picture 4"/>
@@ -6876,7 +6876,7 @@
         </w:rPr>
         <w:lastRenderedPageBreak/>
         <w:drawing>
-          <wp:inline distT="0" distB="0" distL="0" distR="0" wp14:anchorId="36876F12" wp14:editId="04BCD2F2">
+          <wp:inline distT="0" distB="0" distL="0" distR="0" wp14:anchorId="4330D8B2" wp14:editId="43F60FBD">
             <wp:extent cx="5486400" cy="3686175"/>
             <wp:effectExtent l="0" t="0" r="0" b="0"/>
             <wp:docPr id="5" name="Picture 5"/>
@@ -7076,7 +7076,7 @@
       <w:pPr>
         <w:pStyle w:val="Heading2"/>
       </w:pPr>
-      <w:bookmarkStart w:id="13" w:name="_Toc241438329"/>
+      <w:bookmarkStart w:id="13" w:name="_Toc241439644"/>
       <w:r>
         <w:t>Adding shipping or a service later</w:t>
       </w:r>
@@ -7117,7 +7117,7 @@
         </w:rPr>
         <w:lastRenderedPageBreak/>
         <w:drawing>
-          <wp:inline distT="0" distB="0" distL="0" distR="0" wp14:anchorId="5AF53360" wp14:editId="0BC0E330">
+          <wp:inline distT="0" distB="0" distL="0" distR="0" wp14:anchorId="51C68ECA" wp14:editId="4960C003">
             <wp:extent cx="4754880" cy="3194685"/>
             <wp:effectExtent l="0" t="0" r="0" b="0"/>
             <wp:docPr id="6" name="Picture 6"/>
@@ -7171,7 +7171,7 @@
       <w:pPr>
         <w:pStyle w:val="Heading2"/>
       </w:pPr>
-      <w:bookmarkStart w:id="14" w:name="_Toc241438330"/>
+      <w:bookmarkStart w:id="14" w:name="_Toc241439645"/>
       <w:r>
         <w:t>Changing or removing an item</w:t>
       </w:r>
@@ -7318,7 +7318,7 @@
       <w:pPr>
         <w:pStyle w:val="Heading2"/>
       </w:pPr>
-      <w:bookmarkStart w:id="15" w:name="_Toc241438331"/>
+      <w:bookmarkStart w:id="15" w:name="_Toc241439646"/>
       <w:r>
         <w:t>Customer details</w:t>
       </w:r>
@@ -7482,7 +7482,7 @@
           <w:noProof/>
         </w:rPr>
         <w:drawing>
-          <wp:inline distT="0" distB="0" distL="0" distR="0" wp14:anchorId="01D85ED7" wp14:editId="64BB0CA2">
+          <wp:inline distT="0" distB="0" distL="0" distR="0" wp14:anchorId="1FB30AC2" wp14:editId="32B07BE2">
             <wp:extent cx="4754880" cy="3194685"/>
             <wp:effectExtent l="0" t="0" r="0" b="0"/>
             <wp:docPr id="7" name="Picture 7"/>
@@ -7536,7 +7536,7 @@
       <w:pPr>
         <w:pStyle w:val="Heading2"/>
       </w:pPr>
-      <w:bookmarkStart w:id="16" w:name="_Toc241438332"/>
+      <w:bookmarkStart w:id="16" w:name="_Toc241439647"/>
       <w:r>
         <w:t>Sending the order to checkout</w:t>
       </w:r>
@@ -7714,7 +7714,7 @@
       <w:pPr>
         <w:pStyle w:val="Heading2"/>
       </w:pPr>
-      <w:bookmarkStart w:id="17" w:name="_Toc241438333"/>
+      <w:bookmarkStart w:id="17" w:name="_Toc241439648"/>
       <w:r>
         <w:lastRenderedPageBreak/>
         <w:t>Using a phone</w:t>
@@ -7732,7 +7732,7 @@
           <w:noProof/>
         </w:rPr>
         <w:drawing>
-          <wp:inline distT="0" distB="0" distL="0" distR="0" wp14:anchorId="76E09B56" wp14:editId="21B42615">
+          <wp:inline distT="0" distB="0" distL="0" distR="0" wp14:anchorId="378D6AEA" wp14:editId="474B565E">
             <wp:extent cx="2194560" cy="4749253"/>
             <wp:effectExtent l="0" t="0" r="0" b="0"/>
             <wp:docPr id="8" name="Picture 8"/>
@@ -7810,7 +7810,7 @@
         <w:pStyle w:val="Heading1"/>
         <w:pageBreakBefore/>
       </w:pPr>
-      <w:bookmarkStart w:id="18" w:name="_Toc241438334"/>
+      <w:bookmarkStart w:id="18" w:name="_Toc241439649"/>
       <w:r>
         <w:lastRenderedPageBreak/>
         <w:t>Checking out a customer</w:t>
@@ -7851,7 +7851,7 @@
           <w:noProof/>
         </w:rPr>
         <w:drawing>
-          <wp:inline distT="0" distB="0" distL="0" distR="0" wp14:anchorId="1725C694" wp14:editId="1F3FD22A">
+          <wp:inline distT="0" distB="0" distL="0" distR="0" wp14:anchorId="303D394E" wp14:editId="37CC210E">
             <wp:extent cx="5760720" cy="3870484"/>
             <wp:effectExtent l="0" t="0" r="0" b="0"/>
             <wp:docPr id="9" name="Picture 9"/>
@@ -7905,7 +7905,7 @@
       <w:pPr>
         <w:pStyle w:val="Heading2"/>
       </w:pPr>
-      <w:bookmarkStart w:id="19" w:name="_Toc241438335"/>
+      <w:bookmarkStart w:id="19" w:name="_Toc241439650"/>
       <w:r>
         <w:t>1. Review the order with the customer</w:t>
       </w:r>
@@ -8002,7 +8002,7 @@
       <w:pPr>
         <w:pStyle w:val="Heading2"/>
       </w:pPr>
-      <w:bookmarkStart w:id="20" w:name="_Toc241438336"/>
+      <w:bookmarkStart w:id="20" w:name="_Toc241439651"/>
       <w:r>
         <w:t>2. Take payment</w:t>
       </w:r>
@@ -8316,7 +8316,7 @@
       <w:pPr>
         <w:pStyle w:val="Heading2"/>
       </w:pPr>
-      <w:bookmarkStart w:id="21" w:name="_Toc241438337"/>
+      <w:bookmarkStart w:id="21" w:name="_Toc241439652"/>
       <w:r>
         <w:t>3. Acknowledgements (initials and signature)</w:t>
       </w:r>
@@ -8498,7 +8498,7 @@
         </w:rPr>
         <w:lastRenderedPageBreak/>
         <w:drawing>
-          <wp:inline distT="0" distB="0" distL="0" distR="0" wp14:anchorId="6E6E6A26" wp14:editId="1CEB2C4B">
+          <wp:inline distT="0" distB="0" distL="0" distR="0" wp14:anchorId="2D1CE703" wp14:editId="48D71829">
             <wp:extent cx="4937760" cy="3317558"/>
             <wp:effectExtent l="0" t="0" r="0" b="0"/>
             <wp:docPr id="10" name="Picture 10"/>
@@ -8625,7 +8625,7 @@
       <w:pPr>
         <w:pStyle w:val="Heading2"/>
       </w:pPr>
-      <w:bookmarkStart w:id="22" w:name="_Toc241438338"/>
+      <w:bookmarkStart w:id="22" w:name="_Toc241439653"/>
       <w:r>
         <w:t>4. Complete and print</w:t>
       </w:r>
@@ -8814,7 +8814,7 @@
       <w:pPr>
         <w:pStyle w:val="Heading2"/>
       </w:pPr>
-      <w:bookmarkStart w:id="23" w:name="_Toc241438339"/>
+      <w:bookmarkStart w:id="23" w:name="_Toc241439654"/>
       <w:r>
         <w:lastRenderedPageBreak/>
         <w:t>Other checkout actions</w:t>
@@ -9025,7 +9025,7 @@
         <w:pStyle w:val="Heading1"/>
         <w:pageBreakBefore/>
       </w:pPr>
-      <w:bookmarkStart w:id="24" w:name="_Toc241438340"/>
+      <w:bookmarkStart w:id="24" w:name="_Toc241439655"/>
       <w:r>
         <w:lastRenderedPageBreak/>
         <w:t>The sales sheet</w:t>
@@ -9048,7 +9048,7 @@
           <w:noProof/>
         </w:rPr>
         <w:drawing>
-          <wp:inline distT="0" distB="0" distL="0" distR="0" wp14:anchorId="050EEFB9" wp14:editId="290F41B5">
+          <wp:inline distT="0" distB="0" distL="0" distR="0" wp14:anchorId="7EC6ADF7" wp14:editId="270CCB1A">
             <wp:extent cx="4023360" cy="3187256"/>
             <wp:effectExtent l="0" t="0" r="0" b="0"/>
             <wp:docPr id="11" name="Picture 11"/>
@@ -9217,7 +9217,7 @@
         <w:pStyle w:val="Heading1"/>
         <w:pageBreakBefore/>
       </w:pPr>
-      <w:bookmarkStart w:id="25" w:name="_Toc241438341"/>
+      <w:bookmarkStart w:id="25" w:name="_Toc241439656"/>
       <w:r>
         <w:lastRenderedPageBreak/>
         <w:t>Looking up orders</w:t>
@@ -9249,7 +9249,7 @@
           <w:noProof/>
         </w:rPr>
         <w:drawing>
-          <wp:inline distT="0" distB="0" distL="0" distR="0" wp14:anchorId="49588AC1" wp14:editId="64CFEB52">
+          <wp:inline distT="0" distB="0" distL="0" distR="0" wp14:anchorId="30D86D5A" wp14:editId="79E7E56A">
             <wp:extent cx="5760720" cy="3870484"/>
             <wp:effectExtent l="0" t="0" r="0" b="0"/>
             <wp:docPr id="12" name="Picture 12"/>
@@ -9369,7 +9369,7 @@
       <w:pPr>
         <w:pStyle w:val="Heading2"/>
       </w:pPr>
-      <w:bookmarkStart w:id="26" w:name="_Toc241438342"/>
+      <w:bookmarkStart w:id="26" w:name="_Toc241439657"/>
       <w:r>
         <w:t>Extra options for admins</w:t>
       </w:r>
@@ -9459,7 +9459,7 @@
         </w:rPr>
         <w:lastRenderedPageBreak/>
         <w:drawing>
-          <wp:inline distT="0" distB="0" distL="0" distR="0" wp14:anchorId="1783A77F" wp14:editId="30BD6C88">
+          <wp:inline distT="0" distB="0" distL="0" distR="0" wp14:anchorId="50591DE6" wp14:editId="05DCED48">
             <wp:extent cx="4754880" cy="3194685"/>
             <wp:effectExtent l="0" t="0" r="0" b="0"/>
             <wp:docPr id="13" name="Picture 13"/>
@@ -9581,7 +9581,7 @@
         <w:pStyle w:val="Heading1"/>
         <w:pageBreakBefore/>
       </w:pPr>
-      <w:bookmarkStart w:id="27" w:name="_Toc241438343"/>
+      <w:bookmarkStart w:id="27" w:name="_Toc241439658"/>
       <w:r>
         <w:lastRenderedPageBreak/>
         <w:t>The dashboard</w:t>
@@ -9618,6 +9618,20 @@
       </w:r>
       <w:r>
         <w:t xml:space="preserve"> for the latest figures.</w:t>
+      </w:r>
+    </w:p>
+    <w:p>
+      <w:r>
+        <w:t xml:space="preserve">On both the Dashboard and the Orders screen, the event buttons run from newest on the left to oldest on the right, with the active event always first. Past events carry a small </w:t>
+      </w:r>
+      <w:r>
+        <w:rPr>
+          <w:b/>
+        </w:rPr>
+        <w:t>PAST</w:t>
+      </w:r>
+      <w:r>
+        <w:t xml:space="preserve"> tag. Events that haven't happened yet aren't listed, since they have no sales.</w:t>
       </w:r>
     </w:p>
     <w:p>
@@ -9631,7 +9645,7 @@
           <w:noProof/>
         </w:rPr>
         <w:drawing>
-          <wp:inline distT="0" distB="0" distL="0" distR="0" wp14:anchorId="6DF97C7D" wp14:editId="1729B482">
+          <wp:inline distT="0" distB="0" distL="0" distR="0" wp14:anchorId="078785C7" wp14:editId="7523D39E">
             <wp:extent cx="4937760" cy="3317558"/>
             <wp:effectExtent l="0" t="0" r="0" b="0"/>
             <wp:docPr id="14" name="Picture 14"/>
@@ -10138,6 +10152,7 @@
               <w:rPr>
                 <w:b/>
               </w:rPr>
+              <w:lastRenderedPageBreak/>
               <w:t>Best sellers</w:t>
             </w:r>
           </w:p>
@@ -10179,7 +10194,7 @@
         <w:pStyle w:val="Heading1"/>
         <w:pageBreakBefore/>
       </w:pPr>
-      <w:bookmarkStart w:id="28" w:name="_Toc241438344"/>
+      <w:bookmarkStart w:id="28" w:name="_Toc241439659"/>
       <w:r>
         <w:lastRenderedPageBreak/>
         <w:t>Keeping inventory</w:t>
@@ -10238,7 +10253,7 @@
           <w:noProof/>
         </w:rPr>
         <w:drawing>
-          <wp:inline distT="0" distB="0" distL="0" distR="0" wp14:anchorId="35FEA4B0" wp14:editId="0500B607">
+          <wp:inline distT="0" distB="0" distL="0" distR="0" wp14:anchorId="7A7A5AAB" wp14:editId="42F53F24">
             <wp:extent cx="5760720" cy="3870484"/>
             <wp:effectExtent l="0" t="0" r="0" b="0"/>
             <wp:docPr id="15" name="Picture 15"/>
@@ -10292,7 +10307,7 @@
       <w:pPr>
         <w:pStyle w:val="Heading2"/>
       </w:pPr>
-      <w:bookmarkStart w:id="29" w:name="_Toc241438345"/>
+      <w:bookmarkStart w:id="29" w:name="_Toc241439660"/>
       <w:r>
         <w:t>What's on the screen</w:t>
       </w:r>
@@ -10374,7 +10389,7 @@
       <w:pPr>
         <w:pStyle w:val="Heading2"/>
       </w:pPr>
-      <w:bookmarkStart w:id="30" w:name="_Toc241438346"/>
+      <w:bookmarkStart w:id="30" w:name="_Toc241439661"/>
       <w:r>
         <w:t>Updating a count</w:t>
       </w:r>
@@ -10451,7 +10466,7 @@
           <w:noProof/>
         </w:rPr>
         <w:drawing>
-          <wp:inline distT="0" distB="0" distL="0" distR="0" wp14:anchorId="0753E5F7" wp14:editId="38A9E9C8">
+          <wp:inline distT="0" distB="0" distL="0" distR="0" wp14:anchorId="55842D01" wp14:editId="4ABF72E7">
             <wp:extent cx="5120640" cy="3440430"/>
             <wp:effectExtent l="0" t="0" r="0" b="0"/>
             <wp:docPr id="16" name="Picture 16"/>
@@ -10505,7 +10520,7 @@
       <w:pPr>
         <w:pStyle w:val="Heading2"/>
       </w:pPr>
-      <w:bookmarkStart w:id="31" w:name="_Toc241438347"/>
+      <w:bookmarkStart w:id="31" w:name="_Toc241439662"/>
       <w:r>
         <w:t>What changes the count automatically</w:t>
       </w:r>
@@ -10909,7 +10924,7 @@
       <w:pPr>
         <w:pStyle w:val="Heading2"/>
       </w:pPr>
-      <w:bookmarkStart w:id="32" w:name="_Toc241438348"/>
+      <w:bookmarkStart w:id="32" w:name="_Toc241439663"/>
       <w:r>
         <w:lastRenderedPageBreak/>
         <w:t>Seeing the history</w:t>
@@ -10925,7 +10940,7 @@
       <w:pPr>
         <w:pStyle w:val="Heading2"/>
       </w:pPr>
-      <w:bookmarkStart w:id="33" w:name="_Toc241438349"/>
+      <w:bookmarkStart w:id="33" w:name="_Toc241439664"/>
       <w:r>
         <w:t>Notes for the inventory sheet</w:t>
       </w:r>
@@ -10974,7 +10989,7 @@
           <w:noProof/>
         </w:rPr>
         <w:drawing>
-          <wp:inline distT="0" distB="0" distL="0" distR="0" wp14:anchorId="697A6835" wp14:editId="17FCAF32">
+          <wp:inline distT="0" distB="0" distL="0" distR="0" wp14:anchorId="2DA7E535" wp14:editId="1D10DB34">
             <wp:extent cx="5120640" cy="3440430"/>
             <wp:effectExtent l="0" t="0" r="0" b="0"/>
             <wp:docPr id="17" name="Picture 17"/>
@@ -11028,7 +11043,7 @@
       <w:pPr>
         <w:pStyle w:val="Heading2"/>
       </w:pPr>
-      <w:bookmarkStart w:id="34" w:name="_Toc241438350"/>
+      <w:bookmarkStart w:id="34" w:name="_Toc241439665"/>
       <w:r>
         <w:t>Start and end counts</w:t>
       </w:r>
@@ -11551,7 +11566,7 @@
           <w:noProof/>
         </w:rPr>
         <w:drawing>
-          <wp:inline distT="0" distB="0" distL="0" distR="0" wp14:anchorId="53D9C0E4" wp14:editId="63C9DFB7">
+          <wp:inline distT="0" distB="0" distL="0" distR="0" wp14:anchorId="2AB60F2B" wp14:editId="25709DB8">
             <wp:extent cx="5486400" cy="3686175"/>
             <wp:effectExtent l="0" t="0" r="0" b="0"/>
             <wp:docPr id="18" name="Picture 18"/>
@@ -11691,7 +11706,7 @@
         <w:pStyle w:val="Heading1"/>
         <w:pageBreakBefore/>
       </w:pPr>
-      <w:bookmarkStart w:id="35" w:name="_Toc241438351"/>
+      <w:bookmarkStart w:id="35" w:name="_Toc241439666"/>
       <w:r>
         <w:lastRenderedPageBreak/>
         <w:t>Admin: setting up an event</w:t>
@@ -11716,7 +11731,7 @@
       <w:pPr>
         <w:pStyle w:val="Heading2"/>
       </w:pPr>
-      <w:bookmarkStart w:id="36" w:name="_Toc241438352"/>
+      <w:bookmarkStart w:id="36" w:name="_Toc241439667"/>
       <w:r>
         <w:t>Creating or editing an event</w:t>
       </w:r>
@@ -11733,7 +11748,7 @@
           <w:noProof/>
         </w:rPr>
         <w:drawing>
-          <wp:inline distT="0" distB="0" distL="0" distR="0" wp14:anchorId="5298571B" wp14:editId="395288AA">
+          <wp:inline distT="0" distB="0" distL="0" distR="0" wp14:anchorId="6C5F5F0D" wp14:editId="21CE734E">
             <wp:extent cx="5760720" cy="1236154"/>
             <wp:effectExtent l="0" t="0" r="0" b="0"/>
             <wp:docPr id="19" name="Picture 19"/>
@@ -11784,6 +11799,56 @@
       </w:r>
     </w:p>
     <w:p>
+      <w:r>
+        <w:t xml:space="preserve">The list is split in two. </w:t>
+      </w:r>
+      <w:r>
+        <w:rPr>
+          <w:b/>
+        </w:rPr>
+        <w:t>Current &amp; upcoming</w:t>
+      </w:r>
+      <w:r>
+        <w:t xml:space="preserve"> at the top holds the active event (always first) and any events still to come, soonest first. Below the </w:t>
+      </w:r>
+      <w:r>
+        <w:rPr>
+          <w:b/>
+        </w:rPr>
+        <w:t>Past events</w:t>
+      </w:r>
+      <w:r>
+        <w:t xml:space="preserve"> line are the events that are over, most recent first. An event counts as past once its date has gone by and it isn't the active event. Small labels mark each one </w:t>
+      </w:r>
+      <w:r>
+        <w:rPr>
+          <w:b/>
+        </w:rPr>
+        <w:t>Active</w:t>
+      </w:r>
+      <w:r>
+        <w:t xml:space="preserve">, </w:t>
+      </w:r>
+      <w:r>
+        <w:rPr>
+          <w:b/>
+        </w:rPr>
+        <w:t>Upcoming</w:t>
+      </w:r>
+      <w:r>
+        <w:t xml:space="preserve"> or </w:t>
+      </w:r>
+      <w:r>
+        <w:rPr>
+          <w:b/>
+        </w:rPr>
+        <w:t>Past</w:t>
+      </w:r>
+      <w:r>
+        <w:t>.</w:t>
+      </w:r>
+    </w:p>
+    <w:p>
       <w:pPr>
         <w:tabs>
           <w:tab w:val="left" w:pos="504"/>
@@ -12023,7 +12088,7 @@
           <w:noProof/>
         </w:rPr>
         <w:drawing>
-          <wp:inline distT="0" distB="0" distL="0" distR="0" wp14:anchorId="2E51C424" wp14:editId="11DE5F84">
+          <wp:inline distT="0" distB="0" distL="0" distR="0" wp14:anchorId="082A3B4D" wp14:editId="5731A2C8">
             <wp:extent cx="3840480" cy="2580322"/>
             <wp:effectExtent l="0" t="0" r="0" b="0"/>
             <wp:docPr id="20" name="Picture 20"/>
@@ -12144,9 +12209,8 @@
       <w:pPr>
         <w:pStyle w:val="Heading2"/>
       </w:pPr>
-      <w:bookmarkStart w:id="37" w:name="_Toc241438353"/>
-      <w:r>
-        <w:lastRenderedPageBreak/>
+      <w:bookmarkStart w:id="37" w:name="_Toc241439668"/>
+      <w:r>
         <w:t>Event sales sheets</w:t>
       </w:r>
       <w:bookmarkEnd w:id="37"/>
@@ -12203,7 +12267,7 @@
           <w:noProof/>
         </w:rPr>
         <w:drawing>
-          <wp:inline distT="0" distB="0" distL="0" distR="0" wp14:anchorId="1B02F48A" wp14:editId="5B6C24B4">
+          <wp:inline distT="0" distB="0" distL="0" distR="0" wp14:anchorId="263EBA22" wp14:editId="4F777E45">
             <wp:extent cx="4389120" cy="2948940"/>
             <wp:effectExtent l="0" t="0" r="0" b="0"/>
             <wp:docPr id="21" name="Picture 21"/>
@@ -12332,7 +12396,7 @@
         </w:rPr>
         <w:lastRenderedPageBreak/>
         <w:drawing>
-          <wp:inline distT="0" distB="0" distL="0" distR="0" wp14:anchorId="5EC8EDAC" wp14:editId="5D52C8FB">
+          <wp:inline distT="0" distB="0" distL="0" distR="0" wp14:anchorId="363407B1" wp14:editId="0517D6FD">
             <wp:extent cx="4206240" cy="5717858"/>
             <wp:effectExtent l="0" t="0" r="0" b="0"/>
             <wp:docPr id="22" name="Picture 22"/>
@@ -12417,7 +12481,7 @@
         <w:pStyle w:val="Heading1"/>
         <w:pageBreakBefore/>
       </w:pPr>
-      <w:bookmarkStart w:id="38" w:name="_Toc241438354"/>
+      <w:bookmarkStart w:id="38" w:name="_Toc241439669"/>
       <w:r>
         <w:lastRenderedPageBreak/>
         <w:t>Admin: managing the catalog</w:t>
@@ -12458,7 +12522,7 @@
           <w:noProof/>
         </w:rPr>
         <w:drawing>
-          <wp:inline distT="0" distB="0" distL="0" distR="0" wp14:anchorId="4BF53BCB" wp14:editId="1A03C931">
+          <wp:inline distT="0" distB="0" distL="0" distR="0" wp14:anchorId="7E9F5889" wp14:editId="42147B8D">
             <wp:extent cx="5760720" cy="3870484"/>
             <wp:effectExtent l="0" t="0" r="0" b="0"/>
             <wp:docPr id="23" name="Picture 23"/>
@@ -12512,7 +12576,7 @@
       <w:pPr>
         <w:pStyle w:val="Heading2"/>
       </w:pPr>
-      <w:bookmarkStart w:id="39" w:name="_Toc241438355"/>
+      <w:bookmarkStart w:id="39" w:name="_Toc241439670"/>
       <w:r>
         <w:lastRenderedPageBreak/>
         <w:t>Adding or editing a product</w:t>
@@ -12530,7 +12594,7 @@
           <w:noProof/>
         </w:rPr>
         <w:drawing>
-          <wp:inline distT="0" distB="0" distL="0" distR="0" wp14:anchorId="1E4A2C9A" wp14:editId="1E9DD495">
+          <wp:inline distT="0" distB="0" distL="0" distR="0" wp14:anchorId="26D4ACC3" wp14:editId="47F474D4">
             <wp:extent cx="5486400" cy="3686175"/>
             <wp:effectExtent l="0" t="0" r="0" b="0"/>
             <wp:docPr id="24" name="Picture 24"/>
@@ -12953,7 +13017,7 @@
         </w:rPr>
         <w:lastRenderedPageBreak/>
         <w:drawing>
-          <wp:inline distT="0" distB="0" distL="0" distR="0" wp14:anchorId="27F11A4B" wp14:editId="678A71A1">
+          <wp:inline distT="0" distB="0" distL="0" distR="0" wp14:anchorId="0832C781" wp14:editId="1F1C5537">
             <wp:extent cx="5120640" cy="2130933"/>
             <wp:effectExtent l="0" t="0" r="0" b="0"/>
             <wp:docPr id="25" name="Picture 25"/>
@@ -13140,7 +13204,7 @@
       <w:pPr>
         <w:pStyle w:val="Heading2"/>
       </w:pPr>
-      <w:bookmarkStart w:id="40" w:name="_Toc241438356"/>
+      <w:bookmarkStart w:id="40" w:name="_Toc241439671"/>
       <w:r>
         <w:t>Delivery and services</w:t>
       </w:r>
@@ -13172,7 +13236,7 @@
         </w:rPr>
         <w:lastRenderedPageBreak/>
         <w:drawing>
-          <wp:inline distT="0" distB="0" distL="0" distR="0" wp14:anchorId="45362B25" wp14:editId="4A21F55F">
+          <wp:inline distT="0" distB="0" distL="0" distR="0" wp14:anchorId="1CFDDF0C" wp14:editId="52628E73">
             <wp:extent cx="5760720" cy="3870484"/>
             <wp:effectExtent l="0" t="0" r="0" b="0"/>
             <wp:docPr id="26" name="Picture 26"/>
@@ -13602,7 +13666,7 @@
         <w:pStyle w:val="Heading1"/>
         <w:pageBreakBefore/>
       </w:pPr>
-      <w:bookmarkStart w:id="41" w:name="_Toc241438357"/>
+      <w:bookmarkStart w:id="41" w:name="_Toc241439672"/>
       <w:r>
         <w:lastRenderedPageBreak/>
         <w:t>Admin: managing the crew</w:t>
@@ -13634,7 +13698,7 @@
           <w:noProof/>
         </w:rPr>
         <w:drawing>
-          <wp:inline distT="0" distB="0" distL="0" distR="0" wp14:anchorId="13CF0991" wp14:editId="08AEC12B">
+          <wp:inline distT="0" distB="0" distL="0" distR="0" wp14:anchorId="29FFA95F" wp14:editId="501161F3">
             <wp:extent cx="5760720" cy="1740218"/>
             <wp:effectExtent l="0" t="0" r="0" b="0"/>
             <wp:docPr id="27" name="Picture 27"/>
@@ -13906,7 +13970,7 @@
           <w:noProof/>
         </w:rPr>
         <w:drawing>
-          <wp:inline distT="0" distB="0" distL="0" distR="0" wp14:anchorId="333538A8" wp14:editId="1BCB5B0D">
+          <wp:inline distT="0" distB="0" distL="0" distR="0" wp14:anchorId="45E78935" wp14:editId="5E879F9A">
             <wp:extent cx="4023360" cy="2703195"/>
             <wp:effectExtent l="0" t="0" r="0" b="0"/>
             <wp:docPr id="28" name="Picture 28"/>
@@ -13971,7 +14035,7 @@
         <w:pStyle w:val="Heading1"/>
         <w:pageBreakBefore/>
       </w:pPr>
-      <w:bookmarkStart w:id="42" w:name="_Toc241438358"/>
+      <w:bookmarkStart w:id="42" w:name="_Toc241439673"/>
       <w:r>
         <w:lastRenderedPageBreak/>
         <w:t>Owner: permanent deletes</w:t>
@@ -14012,7 +14076,7 @@
           <w:noProof/>
         </w:rPr>
         <w:drawing>
-          <wp:inline distT="0" distB="0" distL="0" distR="0" wp14:anchorId="6370C947" wp14:editId="78E69489">
+          <wp:inline distT="0" distB="0" distL="0" distR="0" wp14:anchorId="1402BFA0" wp14:editId="487E0716">
             <wp:extent cx="4754880" cy="3312709"/>
             <wp:effectExtent l="0" t="0" r="0" b="0"/>
             <wp:docPr id="29" name="Picture 29"/>
@@ -14676,7 +14740,7 @@
         <w:pStyle w:val="Heading1"/>
         <w:pageBreakBefore/>
       </w:pPr>
-      <w:bookmarkStart w:id="43" w:name="_Toc241438359"/>
+      <w:bookmarkStart w:id="43" w:name="_Toc241439674"/>
       <w:r>
         <w:lastRenderedPageBreak/>
         <w:t>Tips and troubleshooting</w:t>
@@ -15006,7 +15070,7 @@
         <w:pStyle w:val="Heading1"/>
         <w:pageBreakBefore/>
       </w:pPr>
-      <w:bookmarkStart w:id="44" w:name="_Toc241438360"/>
+      <w:bookmarkStart w:id="44" w:name="_Toc241439675"/>
       <w:r>
         <w:lastRenderedPageBreak/>
         <w:t>Quick reference</w:t>
@@ -15017,7 +15081,7 @@
       <w:pPr>
         <w:pStyle w:val="Heading2"/>
       </w:pPr>
-      <w:bookmarkStart w:id="45" w:name="_Toc241438361"/>
+      <w:bookmarkStart w:id="45" w:name="_Toc241439676"/>
       <w:r>
         <w:t>Sales rep checklist</w:t>
       </w:r>
@@ -15161,7 +15225,7 @@
       <w:pPr>
         <w:pStyle w:val="Heading2"/>
       </w:pPr>
-      <w:bookmarkStart w:id="46" w:name="_Toc241438362"/>
+      <w:bookmarkStart w:id="46" w:name="_Toc241439677"/>
       <w:r>
         <w:t>Checkout checklist</w:t>
       </w:r>
@@ -15331,7 +15395,7 @@
       <w:pPr>
         <w:pStyle w:val="Heading2"/>
       </w:pPr>
-      <w:bookmarkStart w:id="47" w:name="_Toc241438363"/>
+      <w:bookmarkStart w:id="47" w:name="_Toc241439678"/>
       <w:r>
         <w:t>Inventory counts</w:t>
       </w:r>
@@ -15535,7 +15599,7 @@
       <w:pPr>
         <w:pStyle w:val="Heading2"/>
       </w:pPr>
-      <w:bookmarkStart w:id="48" w:name="_Toc241438364"/>
+      <w:bookmarkStart w:id="48" w:name="_Toc241439679"/>
       <w:r>
         <w:t>Order status at a glance</w:t>
       </w:r>
@@ -16155,31 +16219,31 @@
       </w:rPr>
     </w:lvl>
   </w:abstractNum>
-  <w:num w:numId="1" w16cid:durableId="1208488079">
+  <w:num w:numId="1" w16cid:durableId="1912159709">
     <w:abstractNumId w:val="8"/>
   </w:num>
-  <w:num w:numId="2" w16cid:durableId="841041823">
+  <w:num w:numId="2" w16cid:durableId="2085642830">
     <w:abstractNumId w:val="6"/>
   </w:num>
-  <w:num w:numId="3" w16cid:durableId="779835076">
+  <w:num w:numId="3" w16cid:durableId="688795761">
     <w:abstractNumId w:val="5"/>
   </w:num>
-  <w:num w:numId="4" w16cid:durableId="2099859793">
+  <w:num w:numId="4" w16cid:durableId="258637035">
     <w:abstractNumId w:val="4"/>
   </w:num>
-  <w:num w:numId="5" w16cid:durableId="241526603">
+  <w:num w:numId="5" w16cid:durableId="1950039853">
     <w:abstractNumId w:val="7"/>
   </w:num>
-  <w:num w:numId="6" w16cid:durableId="2103447124">
+  <w:num w:numId="6" w16cid:durableId="315501179">
     <w:abstractNumId w:val="3"/>
   </w:num>
-  <w:num w:numId="7" w16cid:durableId="524753912">
+  <w:num w:numId="7" w16cid:durableId="37247882">
     <w:abstractNumId w:val="2"/>
   </w:num>
-  <w:num w:numId="8" w16cid:durableId="777413378">
+  <w:num w:numId="8" w16cid:durableId="791090582">
     <w:abstractNumId w:val="1"/>
   </w:num>
-  <w:num w:numId="9" w16cid:durableId="692539975">
+  <w:num w:numId="9" w16cid:durableId="517696760">
     <w:abstractNumId w:val="0"/>
   </w:num>
 </w:numbering>
@@ -27571,7 +27635,7 @@
     <w:autoRedefine/>
     <w:uiPriority w:val="39"/>
     <w:unhideWhenUsed/>
-    <w:rsid w:val="00092FAE"/>
+    <w:rsid w:val="003914C0"/>
     <w:pPr>
       <w:spacing w:after="100"/>
     </w:pPr>
@@ -27583,7 +27647,7 @@
     <w:autoRedefine/>
     <w:uiPriority w:val="39"/>
     <w:unhideWhenUsed/>
-    <w:rsid w:val="00092FAE"/>
+    <w:rsid w:val="003914C0"/>
     <w:pPr>
       <w:spacing w:after="100"/>
       <w:ind w:left="220"/>
@@ -27594,7 +27658,7 @@
     <w:basedOn w:val="DefaultParagraphFont"/>
     <w:uiPriority w:val="99"/>
     <w:unhideWhenUsed/>
-    <w:rsid w:val="00092FAE"/>
+    <w:rsid w:val="003914C0"/>
     <w:rPr>
       <w:color w:val="0000FF" w:themeColor="hyperlink"/>
       <w:u w:val="single"/>

</xml_diff>

<commit_message>
Add milestone stars to the dashboard's Net sales tile
One gold star when net sales pass $30,000, and another for every $10,000
after that. The tooltip (and screen-reader label) names the milestone passed
and the next one; past 8 stars the rest show as "+N" so the tile never
overflows. StatCard gains an optional badge slot for it. User manual updated.

Co-Authored-By: Claude Opus 5.5 <noreply@anthropic.com>
</commit_message>
<xml_diff>
--- a/Documents/CFS Sales App User Guide.docx
+++ b/Documents/CFS Sales App User Guide.docx
@@ -345,7 +345,7 @@
       <w:r>
         <w:fldChar w:fldCharType="separate"/>
       </w:r>
-      <w:hyperlink w:anchor="_Toc241605988" w:history="1">
+      <w:hyperlink w:anchor="_Toc241606847" w:history="1">
         <w:r>
           <w:rPr>
             <w:rStyle w:val="Hyperlink"/>
@@ -372,7 +372,7 @@
             <w:noProof/>
             <w:webHidden/>
           </w:rPr>
-          <w:instrText xml:space="preserve"> PAGEREF _Toc241605988 \h </w:instrText>
+          <w:instrText xml:space="preserve"> PAGEREF _Toc241606847 \h </w:instrText>
         </w:r>
         <w:r>
           <w:rPr>
@@ -413,7 +413,7 @@
           <w:noProof/>
         </w:rPr>
       </w:pPr>
-      <w:hyperlink w:anchor="_Toc241605989" w:history="1">
+      <w:hyperlink w:anchor="_Toc241606848" w:history="1">
         <w:r>
           <w:rPr>
             <w:rStyle w:val="Hyperlink"/>
@@ -440,7 +440,7 @@
             <w:noProof/>
             <w:webHidden/>
           </w:rPr>
-          <w:instrText xml:space="preserve"> PAGEREF _Toc241605989 \h </w:instrText>
+          <w:instrText xml:space="preserve"> PAGEREF _Toc241606848 \h </w:instrText>
         </w:r>
         <w:r>
           <w:rPr>
@@ -481,7 +481,7 @@
           <w:noProof/>
         </w:rPr>
       </w:pPr>
-      <w:hyperlink w:anchor="_Toc241605990" w:history="1">
+      <w:hyperlink w:anchor="_Toc241606849" w:history="1">
         <w:r>
           <w:rPr>
             <w:rStyle w:val="Hyperlink"/>
@@ -508,7 +508,7 @@
             <w:noProof/>
             <w:webHidden/>
           </w:rPr>
-          <w:instrText xml:space="preserve"> PAGEREF _Toc241605990 \h </w:instrText>
+          <w:instrText xml:space="preserve"> PAGEREF _Toc241606849 \h </w:instrText>
         </w:r>
         <w:r>
           <w:rPr>
@@ -549,7 +549,7 @@
           <w:noProof/>
         </w:rPr>
       </w:pPr>
-      <w:hyperlink w:anchor="_Toc241605991" w:history="1">
+      <w:hyperlink w:anchor="_Toc241606850" w:history="1">
         <w:r>
           <w:rPr>
             <w:rStyle w:val="Hyperlink"/>
@@ -576,7 +576,7 @@
             <w:noProof/>
             <w:webHidden/>
           </w:rPr>
-          <w:instrText xml:space="preserve"> PAGEREF _Toc241605991 \h </w:instrText>
+          <w:instrText xml:space="preserve"> PAGEREF _Toc241606850 \h </w:instrText>
         </w:r>
         <w:r>
           <w:rPr>
@@ -617,7 +617,7 @@
           <w:noProof/>
         </w:rPr>
       </w:pPr>
-      <w:hyperlink w:anchor="_Toc241605992" w:history="1">
+      <w:hyperlink w:anchor="_Toc241606851" w:history="1">
         <w:r>
           <w:rPr>
             <w:rStyle w:val="Hyperlink"/>
@@ -644,7 +644,7 @@
             <w:noProof/>
             <w:webHidden/>
           </w:rPr>
-          <w:instrText xml:space="preserve"> PAGEREF _Toc241605992 \h </w:instrText>
+          <w:instrText xml:space="preserve"> PAGEREF _Toc241606851 \h </w:instrText>
         </w:r>
         <w:r>
           <w:rPr>
@@ -685,7 +685,7 @@
           <w:noProof/>
         </w:rPr>
       </w:pPr>
-      <w:hyperlink w:anchor="_Toc241605993" w:history="1">
+      <w:hyperlink w:anchor="_Toc241606852" w:history="1">
         <w:r>
           <w:rPr>
             <w:rStyle w:val="Hyperlink"/>
@@ -712,7 +712,7 @@
             <w:noProof/>
             <w:webHidden/>
           </w:rPr>
-          <w:instrText xml:space="preserve"> PAGEREF _Toc241605993 \h </w:instrText>
+          <w:instrText xml:space="preserve"> PAGEREF _Toc241606852 \h </w:instrText>
         </w:r>
         <w:r>
           <w:rPr>
@@ -753,7 +753,7 @@
           <w:noProof/>
         </w:rPr>
       </w:pPr>
-      <w:hyperlink w:anchor="_Toc241605994" w:history="1">
+      <w:hyperlink w:anchor="_Toc241606853" w:history="1">
         <w:r>
           <w:rPr>
             <w:rStyle w:val="Hyperlink"/>
@@ -780,7 +780,7 @@
             <w:noProof/>
             <w:webHidden/>
           </w:rPr>
-          <w:instrText xml:space="preserve"> PAGEREF _Toc241605994 \h </w:instrText>
+          <w:instrText xml:space="preserve"> PAGEREF _Toc241606853 \h </w:instrText>
         </w:r>
         <w:r>
           <w:rPr>
@@ -821,7 +821,7 @@
           <w:noProof/>
         </w:rPr>
       </w:pPr>
-      <w:hyperlink w:anchor="_Toc241605995" w:history="1">
+      <w:hyperlink w:anchor="_Toc241606854" w:history="1">
         <w:r>
           <w:rPr>
             <w:rStyle w:val="Hyperlink"/>
@@ -848,7 +848,7 @@
             <w:noProof/>
             <w:webHidden/>
           </w:rPr>
-          <w:instrText xml:space="preserve"> PAGEREF _Toc241605995 \h </w:instrText>
+          <w:instrText xml:space="preserve"> PAGEREF _Toc241606854 \h </w:instrText>
         </w:r>
         <w:r>
           <w:rPr>
@@ -889,7 +889,7 @@
           <w:noProof/>
         </w:rPr>
       </w:pPr>
-      <w:hyperlink w:anchor="_Toc241605996" w:history="1">
+      <w:hyperlink w:anchor="_Toc241606855" w:history="1">
         <w:r>
           <w:rPr>
             <w:rStyle w:val="Hyperlink"/>
@@ -916,7 +916,7 @@
             <w:noProof/>
             <w:webHidden/>
           </w:rPr>
-          <w:instrText xml:space="preserve"> PAGEREF _Toc241605996 \h </w:instrText>
+          <w:instrText xml:space="preserve"> PAGEREF _Toc241606855 \h </w:instrText>
         </w:r>
         <w:r>
           <w:rPr>
@@ -957,7 +957,7 @@
           <w:noProof/>
         </w:rPr>
       </w:pPr>
-      <w:hyperlink w:anchor="_Toc241605997" w:history="1">
+      <w:hyperlink w:anchor="_Toc241606856" w:history="1">
         <w:r>
           <w:rPr>
             <w:rStyle w:val="Hyperlink"/>
@@ -984,7 +984,7 @@
             <w:noProof/>
             <w:webHidden/>
           </w:rPr>
-          <w:instrText xml:space="preserve"> PAGEREF _Toc241605997 \h </w:instrText>
+          <w:instrText xml:space="preserve"> PAGEREF _Toc241606856 \h </w:instrText>
         </w:r>
         <w:r>
           <w:rPr>
@@ -1025,7 +1025,7 @@
           <w:noProof/>
         </w:rPr>
       </w:pPr>
-      <w:hyperlink w:anchor="_Toc241605998" w:history="1">
+      <w:hyperlink w:anchor="_Toc241606857" w:history="1">
         <w:r>
           <w:rPr>
             <w:rStyle w:val="Hyperlink"/>
@@ -1052,7 +1052,7 @@
             <w:noProof/>
             <w:webHidden/>
           </w:rPr>
-          <w:instrText xml:space="preserve"> PAGEREF _Toc241605998 \h </w:instrText>
+          <w:instrText xml:space="preserve"> PAGEREF _Toc241606857 \h </w:instrText>
         </w:r>
         <w:r>
           <w:rPr>
@@ -1093,7 +1093,7 @@
           <w:noProof/>
         </w:rPr>
       </w:pPr>
-      <w:hyperlink w:anchor="_Toc241605999" w:history="1">
+      <w:hyperlink w:anchor="_Toc241606858" w:history="1">
         <w:r>
           <w:rPr>
             <w:rStyle w:val="Hyperlink"/>
@@ -1120,7 +1120,7 @@
             <w:noProof/>
             <w:webHidden/>
           </w:rPr>
-          <w:instrText xml:space="preserve"> PAGEREF _Toc241605999 \h </w:instrText>
+          <w:instrText xml:space="preserve"> PAGEREF _Toc241606858 \h </w:instrText>
         </w:r>
         <w:r>
           <w:rPr>
@@ -1161,7 +1161,7 @@
           <w:noProof/>
         </w:rPr>
       </w:pPr>
-      <w:hyperlink w:anchor="_Toc241606000" w:history="1">
+      <w:hyperlink w:anchor="_Toc241606859" w:history="1">
         <w:r>
           <w:rPr>
             <w:rStyle w:val="Hyperlink"/>
@@ -1188,7 +1188,7 @@
             <w:noProof/>
             <w:webHidden/>
           </w:rPr>
-          <w:instrText xml:space="preserve"> PAGEREF _Toc241606000 \h </w:instrText>
+          <w:instrText xml:space="preserve"> PAGEREF _Toc241606859 \h </w:instrText>
         </w:r>
         <w:r>
           <w:rPr>
@@ -1229,7 +1229,7 @@
           <w:noProof/>
         </w:rPr>
       </w:pPr>
-      <w:hyperlink w:anchor="_Toc241606001" w:history="1">
+      <w:hyperlink w:anchor="_Toc241606860" w:history="1">
         <w:r>
           <w:rPr>
             <w:rStyle w:val="Hyperlink"/>
@@ -1256,7 +1256,7 @@
             <w:noProof/>
             <w:webHidden/>
           </w:rPr>
-          <w:instrText xml:space="preserve"> PAGEREF _Toc241606001 \h </w:instrText>
+          <w:instrText xml:space="preserve"> PAGEREF _Toc241606860 \h </w:instrText>
         </w:r>
         <w:r>
           <w:rPr>
@@ -1297,7 +1297,7 @@
           <w:noProof/>
         </w:rPr>
       </w:pPr>
-      <w:hyperlink w:anchor="_Toc241606002" w:history="1">
+      <w:hyperlink w:anchor="_Toc241606861" w:history="1">
         <w:r>
           <w:rPr>
             <w:rStyle w:val="Hyperlink"/>
@@ -1324,7 +1324,7 @@
             <w:noProof/>
             <w:webHidden/>
           </w:rPr>
-          <w:instrText xml:space="preserve"> PAGEREF _Toc241606002 \h </w:instrText>
+          <w:instrText xml:space="preserve"> PAGEREF _Toc241606861 \h </w:instrText>
         </w:r>
         <w:r>
           <w:rPr>
@@ -1365,7 +1365,7 @@
           <w:noProof/>
         </w:rPr>
       </w:pPr>
-      <w:hyperlink w:anchor="_Toc241606003" w:history="1">
+      <w:hyperlink w:anchor="_Toc241606862" w:history="1">
         <w:r>
           <w:rPr>
             <w:rStyle w:val="Hyperlink"/>
@@ -1392,7 +1392,7 @@
             <w:noProof/>
             <w:webHidden/>
           </w:rPr>
-          <w:instrText xml:space="preserve"> PAGEREF _Toc241606003 \h </w:instrText>
+          <w:instrText xml:space="preserve"> PAGEREF _Toc241606862 \h </w:instrText>
         </w:r>
         <w:r>
           <w:rPr>
@@ -1433,7 +1433,7 @@
           <w:noProof/>
         </w:rPr>
       </w:pPr>
-      <w:hyperlink w:anchor="_Toc241606004" w:history="1">
+      <w:hyperlink w:anchor="_Toc241606863" w:history="1">
         <w:r>
           <w:rPr>
             <w:rStyle w:val="Hyperlink"/>
@@ -1460,7 +1460,7 @@
             <w:noProof/>
             <w:webHidden/>
           </w:rPr>
-          <w:instrText xml:space="preserve"> PAGEREF _Toc241606004 \h </w:instrText>
+          <w:instrText xml:space="preserve"> PAGEREF _Toc241606863 \h </w:instrText>
         </w:r>
         <w:r>
           <w:rPr>
@@ -1501,7 +1501,7 @@
           <w:noProof/>
         </w:rPr>
       </w:pPr>
-      <w:hyperlink w:anchor="_Toc241606005" w:history="1">
+      <w:hyperlink w:anchor="_Toc241606864" w:history="1">
         <w:r>
           <w:rPr>
             <w:rStyle w:val="Hyperlink"/>
@@ -1528,7 +1528,7 @@
             <w:noProof/>
             <w:webHidden/>
           </w:rPr>
-          <w:instrText xml:space="preserve"> PAGEREF _Toc241606005 \h </w:instrText>
+          <w:instrText xml:space="preserve"> PAGEREF _Toc241606864 \h </w:instrText>
         </w:r>
         <w:r>
           <w:rPr>
@@ -1569,7 +1569,7 @@
           <w:noProof/>
         </w:rPr>
       </w:pPr>
-      <w:hyperlink w:anchor="_Toc241606006" w:history="1">
+      <w:hyperlink w:anchor="_Toc241606865" w:history="1">
         <w:r>
           <w:rPr>
             <w:rStyle w:val="Hyperlink"/>
@@ -1596,7 +1596,7 @@
             <w:noProof/>
             <w:webHidden/>
           </w:rPr>
-          <w:instrText xml:space="preserve"> PAGEREF _Toc241606006 \h </w:instrText>
+          <w:instrText xml:space="preserve"> PAGEREF _Toc241606865 \h </w:instrText>
         </w:r>
         <w:r>
           <w:rPr>
@@ -1637,7 +1637,7 @@
           <w:noProof/>
         </w:rPr>
       </w:pPr>
-      <w:hyperlink w:anchor="_Toc241606007" w:history="1">
+      <w:hyperlink w:anchor="_Toc241606866" w:history="1">
         <w:r>
           <w:rPr>
             <w:rStyle w:val="Hyperlink"/>
@@ -1664,7 +1664,7 @@
             <w:noProof/>
             <w:webHidden/>
           </w:rPr>
-          <w:instrText xml:space="preserve"> PAGEREF _Toc241606007 \h </w:instrText>
+          <w:instrText xml:space="preserve"> PAGEREF _Toc241606866 \h </w:instrText>
         </w:r>
         <w:r>
           <w:rPr>
@@ -1705,7 +1705,7 @@
           <w:noProof/>
         </w:rPr>
       </w:pPr>
-      <w:hyperlink w:anchor="_Toc241606008" w:history="1">
+      <w:hyperlink w:anchor="_Toc241606867" w:history="1">
         <w:r>
           <w:rPr>
             <w:rStyle w:val="Hyperlink"/>
@@ -1732,7 +1732,7 @@
             <w:noProof/>
             <w:webHidden/>
           </w:rPr>
-          <w:instrText xml:space="preserve"> PAGEREF _Toc241606008 \h </w:instrText>
+          <w:instrText xml:space="preserve"> PAGEREF _Toc241606867 \h </w:instrText>
         </w:r>
         <w:r>
           <w:rPr>
@@ -1773,7 +1773,7 @@
           <w:noProof/>
         </w:rPr>
       </w:pPr>
-      <w:hyperlink w:anchor="_Toc241606009" w:history="1">
+      <w:hyperlink w:anchor="_Toc241606868" w:history="1">
         <w:r>
           <w:rPr>
             <w:rStyle w:val="Hyperlink"/>
@@ -1800,7 +1800,7 @@
             <w:noProof/>
             <w:webHidden/>
           </w:rPr>
-          <w:instrText xml:space="preserve"> PAGEREF _Toc241606009 \h </w:instrText>
+          <w:instrText xml:space="preserve"> PAGEREF _Toc241606868 \h </w:instrText>
         </w:r>
         <w:r>
           <w:rPr>
@@ -1841,7 +1841,7 @@
           <w:noProof/>
         </w:rPr>
       </w:pPr>
-      <w:hyperlink w:anchor="_Toc241606010" w:history="1">
+      <w:hyperlink w:anchor="_Toc241606869" w:history="1">
         <w:r>
           <w:rPr>
             <w:rStyle w:val="Hyperlink"/>
@@ -1868,7 +1868,7 @@
             <w:noProof/>
             <w:webHidden/>
           </w:rPr>
-          <w:instrText xml:space="preserve"> PAGEREF _Toc241606010 \h </w:instrText>
+          <w:instrText xml:space="preserve"> PAGEREF _Toc241606869 \h </w:instrText>
         </w:r>
         <w:r>
           <w:rPr>
@@ -1909,7 +1909,7 @@
           <w:noProof/>
         </w:rPr>
       </w:pPr>
-      <w:hyperlink w:anchor="_Toc241606011" w:history="1">
+      <w:hyperlink w:anchor="_Toc241606870" w:history="1">
         <w:r>
           <w:rPr>
             <w:rStyle w:val="Hyperlink"/>
@@ -1936,7 +1936,7 @@
             <w:noProof/>
             <w:webHidden/>
           </w:rPr>
-          <w:instrText xml:space="preserve"> PAGEREF _Toc241606011 \h </w:instrText>
+          <w:instrText xml:space="preserve"> PAGEREF _Toc241606870 \h </w:instrText>
         </w:r>
         <w:r>
           <w:rPr>
@@ -1977,7 +1977,7 @@
           <w:noProof/>
         </w:rPr>
       </w:pPr>
-      <w:hyperlink w:anchor="_Toc241606012" w:history="1">
+      <w:hyperlink w:anchor="_Toc241606871" w:history="1">
         <w:r>
           <w:rPr>
             <w:rStyle w:val="Hyperlink"/>
@@ -2004,7 +2004,7 @@
             <w:noProof/>
             <w:webHidden/>
           </w:rPr>
-          <w:instrText xml:space="preserve"> PAGEREF _Toc241606012 \h </w:instrText>
+          <w:instrText xml:space="preserve"> PAGEREF _Toc241606871 \h </w:instrText>
         </w:r>
         <w:r>
           <w:rPr>
@@ -2045,7 +2045,7 @@
           <w:noProof/>
         </w:rPr>
       </w:pPr>
-      <w:hyperlink w:anchor="_Toc241606013" w:history="1">
+      <w:hyperlink w:anchor="_Toc241606872" w:history="1">
         <w:r>
           <w:rPr>
             <w:rStyle w:val="Hyperlink"/>
@@ -2072,7 +2072,7 @@
             <w:noProof/>
             <w:webHidden/>
           </w:rPr>
-          <w:instrText xml:space="preserve"> PAGEREF _Toc241606013 \h </w:instrText>
+          <w:instrText xml:space="preserve"> PAGEREF _Toc241606872 \h </w:instrText>
         </w:r>
         <w:r>
           <w:rPr>
@@ -2113,7 +2113,7 @@
           <w:noProof/>
         </w:rPr>
       </w:pPr>
-      <w:hyperlink w:anchor="_Toc241606014" w:history="1">
+      <w:hyperlink w:anchor="_Toc241606873" w:history="1">
         <w:r>
           <w:rPr>
             <w:rStyle w:val="Hyperlink"/>
@@ -2140,7 +2140,7 @@
             <w:noProof/>
             <w:webHidden/>
           </w:rPr>
-          <w:instrText xml:space="preserve"> PAGEREF _Toc241606014 \h </w:instrText>
+          <w:instrText xml:space="preserve"> PAGEREF _Toc241606873 \h </w:instrText>
         </w:r>
         <w:r>
           <w:rPr>
@@ -2181,7 +2181,7 @@
           <w:noProof/>
         </w:rPr>
       </w:pPr>
-      <w:hyperlink w:anchor="_Toc241606015" w:history="1">
+      <w:hyperlink w:anchor="_Toc241606874" w:history="1">
         <w:r>
           <w:rPr>
             <w:rStyle w:val="Hyperlink"/>
@@ -2208,7 +2208,7 @@
             <w:noProof/>
             <w:webHidden/>
           </w:rPr>
-          <w:instrText xml:space="preserve"> PAGEREF _Toc241606015 \h </w:instrText>
+          <w:instrText xml:space="preserve"> PAGEREF _Toc241606874 \h </w:instrText>
         </w:r>
         <w:r>
           <w:rPr>
@@ -2249,7 +2249,7 @@
           <w:noProof/>
         </w:rPr>
       </w:pPr>
-      <w:hyperlink w:anchor="_Toc241606016" w:history="1">
+      <w:hyperlink w:anchor="_Toc241606875" w:history="1">
         <w:r>
           <w:rPr>
             <w:rStyle w:val="Hyperlink"/>
@@ -2276,7 +2276,7 @@
             <w:noProof/>
             <w:webHidden/>
           </w:rPr>
-          <w:instrText xml:space="preserve"> PAGEREF _Toc241606016 \h </w:instrText>
+          <w:instrText xml:space="preserve"> PAGEREF _Toc241606875 \h </w:instrText>
         </w:r>
         <w:r>
           <w:rPr>
@@ -2317,7 +2317,7 @@
           <w:noProof/>
         </w:rPr>
       </w:pPr>
-      <w:hyperlink w:anchor="_Toc241606017" w:history="1">
+      <w:hyperlink w:anchor="_Toc241606876" w:history="1">
         <w:r>
           <w:rPr>
             <w:rStyle w:val="Hyperlink"/>
@@ -2344,7 +2344,7 @@
             <w:noProof/>
             <w:webHidden/>
           </w:rPr>
-          <w:instrText xml:space="preserve"> PAGEREF _Toc241606017 \h </w:instrText>
+          <w:instrText xml:space="preserve"> PAGEREF _Toc241606876 \h </w:instrText>
         </w:r>
         <w:r>
           <w:rPr>
@@ -2385,7 +2385,7 @@
           <w:noProof/>
         </w:rPr>
       </w:pPr>
-      <w:hyperlink w:anchor="_Toc241606018" w:history="1">
+      <w:hyperlink w:anchor="_Toc241606877" w:history="1">
         <w:r>
           <w:rPr>
             <w:rStyle w:val="Hyperlink"/>
@@ -2412,7 +2412,7 @@
             <w:noProof/>
             <w:webHidden/>
           </w:rPr>
-          <w:instrText xml:space="preserve"> PAGEREF _Toc241606018 \h </w:instrText>
+          <w:instrText xml:space="preserve"> PAGEREF _Toc241606877 \h </w:instrText>
         </w:r>
         <w:r>
           <w:rPr>
@@ -2453,7 +2453,7 @@
           <w:noProof/>
         </w:rPr>
       </w:pPr>
-      <w:hyperlink w:anchor="_Toc241606019" w:history="1">
+      <w:hyperlink w:anchor="_Toc241606878" w:history="1">
         <w:r>
           <w:rPr>
             <w:rStyle w:val="Hyperlink"/>
@@ -2480,7 +2480,7 @@
             <w:noProof/>
             <w:webHidden/>
           </w:rPr>
-          <w:instrText xml:space="preserve"> PAGEREF _Toc241606019 \h </w:instrText>
+          <w:instrText xml:space="preserve"> PAGEREF _Toc241606878 \h </w:instrText>
         </w:r>
         <w:r>
           <w:rPr>
@@ -2521,7 +2521,7 @@
           <w:noProof/>
         </w:rPr>
       </w:pPr>
-      <w:hyperlink w:anchor="_Toc241606020" w:history="1">
+      <w:hyperlink w:anchor="_Toc241606879" w:history="1">
         <w:r>
           <w:rPr>
             <w:rStyle w:val="Hyperlink"/>
@@ -2548,7 +2548,7 @@
             <w:noProof/>
             <w:webHidden/>
           </w:rPr>
-          <w:instrText xml:space="preserve"> PAGEREF _Toc241606020 \h </w:instrText>
+          <w:instrText xml:space="preserve"> PAGEREF _Toc241606879 \h </w:instrText>
         </w:r>
         <w:r>
           <w:rPr>
@@ -2589,7 +2589,7 @@
           <w:noProof/>
         </w:rPr>
       </w:pPr>
-      <w:hyperlink w:anchor="_Toc241606021" w:history="1">
+      <w:hyperlink w:anchor="_Toc241606880" w:history="1">
         <w:r>
           <w:rPr>
             <w:rStyle w:val="Hyperlink"/>
@@ -2616,7 +2616,7 @@
             <w:noProof/>
             <w:webHidden/>
           </w:rPr>
-          <w:instrText xml:space="preserve"> PAGEREF _Toc241606021 \h </w:instrText>
+          <w:instrText xml:space="preserve"> PAGEREF _Toc241606880 \h </w:instrText>
         </w:r>
         <w:r>
           <w:rPr>
@@ -2657,7 +2657,7 @@
           <w:noProof/>
         </w:rPr>
       </w:pPr>
-      <w:hyperlink w:anchor="_Toc241606022" w:history="1">
+      <w:hyperlink w:anchor="_Toc241606881" w:history="1">
         <w:r>
           <w:rPr>
             <w:rStyle w:val="Hyperlink"/>
@@ -2684,7 +2684,7 @@
             <w:noProof/>
             <w:webHidden/>
           </w:rPr>
-          <w:instrText xml:space="preserve"> PAGEREF _Toc241606022 \h </w:instrText>
+          <w:instrText xml:space="preserve"> PAGEREF _Toc241606881 \h </w:instrText>
         </w:r>
         <w:r>
           <w:rPr>
@@ -2725,7 +2725,7 @@
           <w:noProof/>
         </w:rPr>
       </w:pPr>
-      <w:hyperlink w:anchor="_Toc241606023" w:history="1">
+      <w:hyperlink w:anchor="_Toc241606882" w:history="1">
         <w:r>
           <w:rPr>
             <w:rStyle w:val="Hyperlink"/>
@@ -2752,7 +2752,7 @@
             <w:noProof/>
             <w:webHidden/>
           </w:rPr>
-          <w:instrText xml:space="preserve"> PAGEREF _Toc241606023 \h </w:instrText>
+          <w:instrText xml:space="preserve"> PAGEREF _Toc241606882 \h </w:instrText>
         </w:r>
         <w:r>
           <w:rPr>
@@ -2793,7 +2793,7 @@
           <w:noProof/>
         </w:rPr>
       </w:pPr>
-      <w:hyperlink w:anchor="_Toc241606024" w:history="1">
+      <w:hyperlink w:anchor="_Toc241606883" w:history="1">
         <w:r>
           <w:rPr>
             <w:rStyle w:val="Hyperlink"/>
@@ -2820,7 +2820,7 @@
             <w:noProof/>
             <w:webHidden/>
           </w:rPr>
-          <w:instrText xml:space="preserve"> PAGEREF _Toc241606024 \h </w:instrText>
+          <w:instrText xml:space="preserve"> PAGEREF _Toc241606883 \h </w:instrText>
         </w:r>
         <w:r>
           <w:rPr>
@@ -2861,7 +2861,7 @@
           <w:noProof/>
         </w:rPr>
       </w:pPr>
-      <w:hyperlink w:anchor="_Toc241606025" w:history="1">
+      <w:hyperlink w:anchor="_Toc241606884" w:history="1">
         <w:r>
           <w:rPr>
             <w:rStyle w:val="Hyperlink"/>
@@ -2888,7 +2888,7 @@
             <w:noProof/>
             <w:webHidden/>
           </w:rPr>
-          <w:instrText xml:space="preserve"> PAGEREF _Toc241606025 \h </w:instrText>
+          <w:instrText xml:space="preserve"> PAGEREF _Toc241606884 \h </w:instrText>
         </w:r>
         <w:r>
           <w:rPr>
@@ -2929,7 +2929,7 @@
           <w:noProof/>
         </w:rPr>
       </w:pPr>
-      <w:hyperlink w:anchor="_Toc241606026" w:history="1">
+      <w:hyperlink w:anchor="_Toc241606885" w:history="1">
         <w:r>
           <w:rPr>
             <w:rStyle w:val="Hyperlink"/>
@@ -2956,7 +2956,7 @@
             <w:noProof/>
             <w:webHidden/>
           </w:rPr>
-          <w:instrText xml:space="preserve"> PAGEREF _Toc241606026 \h </w:instrText>
+          <w:instrText xml:space="preserve"> PAGEREF _Toc241606885 \h </w:instrText>
         </w:r>
         <w:r>
           <w:rPr>
@@ -2997,7 +2997,7 @@
           <w:noProof/>
         </w:rPr>
       </w:pPr>
-      <w:hyperlink w:anchor="_Toc241606027" w:history="1">
+      <w:hyperlink w:anchor="_Toc241606886" w:history="1">
         <w:r>
           <w:rPr>
             <w:rStyle w:val="Hyperlink"/>
@@ -3024,7 +3024,7 @@
             <w:noProof/>
             <w:webHidden/>
           </w:rPr>
-          <w:instrText xml:space="preserve"> PAGEREF _Toc241606027 \h </w:instrText>
+          <w:instrText xml:space="preserve"> PAGEREF _Toc241606886 \h </w:instrText>
         </w:r>
         <w:r>
           <w:rPr>
@@ -3065,7 +3065,7 @@
           <w:noProof/>
         </w:rPr>
       </w:pPr>
-      <w:hyperlink w:anchor="_Toc241606028" w:history="1">
+      <w:hyperlink w:anchor="_Toc241606887" w:history="1">
         <w:r>
           <w:rPr>
             <w:rStyle w:val="Hyperlink"/>
@@ -3092,7 +3092,7 @@
             <w:noProof/>
             <w:webHidden/>
           </w:rPr>
-          <w:instrText xml:space="preserve"> PAGEREF _Toc241606028 \h </w:instrText>
+          <w:instrText xml:space="preserve"> PAGEREF _Toc241606887 \h </w:instrText>
         </w:r>
         <w:r>
           <w:rPr>
@@ -3133,7 +3133,7 @@
           <w:noProof/>
         </w:rPr>
       </w:pPr>
-      <w:hyperlink w:anchor="_Toc241606029" w:history="1">
+      <w:hyperlink w:anchor="_Toc241606888" w:history="1">
         <w:r>
           <w:rPr>
             <w:rStyle w:val="Hyperlink"/>
@@ -3160,7 +3160,7 @@
             <w:noProof/>
             <w:webHidden/>
           </w:rPr>
-          <w:instrText xml:space="preserve"> PAGEREF _Toc241606029 \h </w:instrText>
+          <w:instrText xml:space="preserve"> PAGEREF _Toc241606888 \h </w:instrText>
         </w:r>
         <w:r>
           <w:rPr>
@@ -3201,7 +3201,7 @@
           <w:noProof/>
         </w:rPr>
       </w:pPr>
-      <w:hyperlink w:anchor="_Toc241606030" w:history="1">
+      <w:hyperlink w:anchor="_Toc241606889" w:history="1">
         <w:r>
           <w:rPr>
             <w:rStyle w:val="Hyperlink"/>
@@ -3228,7 +3228,7 @@
             <w:noProof/>
             <w:webHidden/>
           </w:rPr>
-          <w:instrText xml:space="preserve"> PAGEREF _Toc241606030 \h </w:instrText>
+          <w:instrText xml:space="preserve"> PAGEREF _Toc241606889 \h </w:instrText>
         </w:r>
         <w:r>
           <w:rPr>
@@ -3269,7 +3269,7 @@
           <w:noProof/>
         </w:rPr>
       </w:pPr>
-      <w:hyperlink w:anchor="_Toc241606031" w:history="1">
+      <w:hyperlink w:anchor="_Toc241606890" w:history="1">
         <w:r>
           <w:rPr>
             <w:rStyle w:val="Hyperlink"/>
@@ -3296,7 +3296,7 @@
             <w:noProof/>
             <w:webHidden/>
           </w:rPr>
-          <w:instrText xml:space="preserve"> PAGEREF _Toc241606031 \h </w:instrText>
+          <w:instrText xml:space="preserve"> PAGEREF _Toc241606890 \h </w:instrText>
         </w:r>
         <w:r>
           <w:rPr>
@@ -3337,7 +3337,7 @@
           <w:noProof/>
         </w:rPr>
       </w:pPr>
-      <w:hyperlink w:anchor="_Toc241606032" w:history="1">
+      <w:hyperlink w:anchor="_Toc241606891" w:history="1">
         <w:r>
           <w:rPr>
             <w:rStyle w:val="Hyperlink"/>
@@ -3364,7 +3364,7 @@
             <w:noProof/>
             <w:webHidden/>
           </w:rPr>
-          <w:instrText xml:space="preserve"> PAGEREF _Toc241606032 \h </w:instrText>
+          <w:instrText xml:space="preserve"> PAGEREF _Toc241606891 \h </w:instrText>
         </w:r>
         <w:r>
           <w:rPr>
@@ -3405,7 +3405,7 @@
           <w:noProof/>
         </w:rPr>
       </w:pPr>
-      <w:hyperlink w:anchor="_Toc241606033" w:history="1">
+      <w:hyperlink w:anchor="_Toc241606892" w:history="1">
         <w:r>
           <w:rPr>
             <w:rStyle w:val="Hyperlink"/>
@@ -3432,7 +3432,7 @@
             <w:noProof/>
             <w:webHidden/>
           </w:rPr>
-          <w:instrText xml:space="preserve"> PAGEREF _Toc241606033 \h </w:instrText>
+          <w:instrText xml:space="preserve"> PAGEREF _Toc241606892 \h </w:instrText>
         </w:r>
         <w:r>
           <w:rPr>
@@ -3473,7 +3473,7 @@
           <w:noProof/>
         </w:rPr>
       </w:pPr>
-      <w:hyperlink w:anchor="_Toc241606034" w:history="1">
+      <w:hyperlink w:anchor="_Toc241606893" w:history="1">
         <w:r>
           <w:rPr>
             <w:rStyle w:val="Hyperlink"/>
@@ -3500,7 +3500,7 @@
             <w:noProof/>
             <w:webHidden/>
           </w:rPr>
-          <w:instrText xml:space="preserve"> PAGEREF _Toc241606034 \h </w:instrText>
+          <w:instrText xml:space="preserve"> PAGEREF _Toc241606893 \h </w:instrText>
         </w:r>
         <w:r>
           <w:rPr>
@@ -3541,7 +3541,7 @@
           <w:noProof/>
         </w:rPr>
       </w:pPr>
-      <w:hyperlink w:anchor="_Toc241606035" w:history="1">
+      <w:hyperlink w:anchor="_Toc241606894" w:history="1">
         <w:r>
           <w:rPr>
             <w:rStyle w:val="Hyperlink"/>
@@ -3568,7 +3568,7 @@
             <w:noProof/>
             <w:webHidden/>
           </w:rPr>
-          <w:instrText xml:space="preserve"> PAGEREF _Toc241606035 \h </w:instrText>
+          <w:instrText xml:space="preserve"> PAGEREF _Toc241606894 \h </w:instrText>
         </w:r>
         <w:r>
           <w:rPr>
@@ -3609,7 +3609,7 @@
           <w:noProof/>
         </w:rPr>
       </w:pPr>
-      <w:hyperlink w:anchor="_Toc241606036" w:history="1">
+      <w:hyperlink w:anchor="_Toc241606895" w:history="1">
         <w:r>
           <w:rPr>
             <w:rStyle w:val="Hyperlink"/>
@@ -3636,7 +3636,7 @@
             <w:noProof/>
             <w:webHidden/>
           </w:rPr>
-          <w:instrText xml:space="preserve"> PAGEREF _Toc241606036 \h </w:instrText>
+          <w:instrText xml:space="preserve"> PAGEREF _Toc241606895 \h </w:instrText>
         </w:r>
         <w:r>
           <w:rPr>
@@ -3677,7 +3677,7 @@
           <w:noProof/>
         </w:rPr>
       </w:pPr>
-      <w:hyperlink w:anchor="_Toc241606037" w:history="1">
+      <w:hyperlink w:anchor="_Toc241606896" w:history="1">
         <w:r>
           <w:rPr>
             <w:rStyle w:val="Hyperlink"/>
@@ -3704,7 +3704,7 @@
             <w:noProof/>
             <w:webHidden/>
           </w:rPr>
-          <w:instrText xml:space="preserve"> PAGEREF _Toc241606037 \h </w:instrText>
+          <w:instrText xml:space="preserve"> PAGEREF _Toc241606896 \h </w:instrText>
         </w:r>
         <w:r>
           <w:rPr>
@@ -3745,7 +3745,7 @@
         <w:pStyle w:val="Heading1"/>
         <w:pageBreakBefore/>
       </w:pPr>
-      <w:bookmarkStart w:id="0" w:name="_Toc241605988"/>
+      <w:bookmarkStart w:id="0" w:name="_Toc241606847"/>
       <w:r>
         <w:lastRenderedPageBreak/>
         <w:t>Welcome</w:t>
@@ -3761,7 +3761,7 @@
       <w:pPr>
         <w:pStyle w:val="Heading2"/>
       </w:pPr>
-      <w:bookmarkStart w:id="1" w:name="_Toc241605989"/>
+      <w:bookmarkStart w:id="1" w:name="_Toc241606848"/>
       <w:r>
         <w:t>How a sale moves through the app</w:t>
       </w:r>
@@ -4244,7 +4244,7 @@
       <w:pPr>
         <w:pStyle w:val="Heading2"/>
       </w:pPr>
-      <w:bookmarkStart w:id="2" w:name="_Toc241605990"/>
+      <w:bookmarkStart w:id="2" w:name="_Toc241606849"/>
       <w:r>
         <w:t>What you'll need</w:t>
       </w:r>
@@ -4353,7 +4353,7 @@
         <w:pStyle w:val="Heading1"/>
         <w:pageBreakBefore/>
       </w:pPr>
-      <w:bookmarkStart w:id="3" w:name="_Toc241605991"/>
+      <w:bookmarkStart w:id="3" w:name="_Toc241606850"/>
       <w:r>
         <w:lastRenderedPageBreak/>
         <w:t>Who can do what</w:t>
@@ -4921,7 +4921,7 @@
         <w:pStyle w:val="Heading1"/>
         <w:pageBreakBefore/>
       </w:pPr>
-      <w:bookmarkStart w:id="4" w:name="_Toc241605992"/>
+      <w:bookmarkStart w:id="4" w:name="_Toc241606851"/>
       <w:r>
         <w:lastRenderedPageBreak/>
         <w:t>Getting started</w:t>
@@ -4932,7 +4932,7 @@
       <w:pPr>
         <w:pStyle w:val="Heading2"/>
       </w:pPr>
-      <w:bookmarkStart w:id="5" w:name="_Toc241605993"/>
+      <w:bookmarkStart w:id="5" w:name="_Toc241606852"/>
       <w:r>
         <w:t>Signing in</w:t>
       </w:r>
@@ -4949,7 +4949,7 @@
           <w:noProof/>
         </w:rPr>
         <w:drawing>
-          <wp:inline distT="0" distB="0" distL="0" distR="0" wp14:anchorId="387A39CE" wp14:editId="440875EB">
+          <wp:inline distT="0" distB="0" distL="0" distR="0" wp14:anchorId="428A0859" wp14:editId="446F15A0">
             <wp:extent cx="3291840" cy="2211705"/>
             <wp:effectExtent l="0" t="0" r="0" b="0"/>
             <wp:docPr id="1" name="Picture 1"/>
@@ -5267,7 +5267,7 @@
       <w:pPr>
         <w:pStyle w:val="Heading2"/>
       </w:pPr>
-      <w:bookmarkStart w:id="6" w:name="_Toc241605994"/>
+      <w:bookmarkStart w:id="6" w:name="_Toc241606853"/>
       <w:r>
         <w:t>Changing your PIN</w:t>
       </w:r>
@@ -5449,7 +5449,7 @@
       <w:pPr>
         <w:pStyle w:val="Heading2"/>
       </w:pPr>
-      <w:bookmarkStart w:id="7" w:name="_Toc241605995"/>
+      <w:bookmarkStart w:id="7" w:name="_Toc241606854"/>
       <w:r>
         <w:lastRenderedPageBreak/>
         <w:t>Finding your way around</w:t>
@@ -6032,7 +6032,7 @@
       <w:pPr>
         <w:pStyle w:val="Heading2"/>
       </w:pPr>
-      <w:bookmarkStart w:id="8" w:name="_Toc241605996"/>
+      <w:bookmarkStart w:id="8" w:name="_Toc241606855"/>
       <w:r>
         <w:t>Light and dark mode</w:t>
       </w:r>
@@ -6047,7 +6047,7 @@
       <w:pPr>
         <w:pStyle w:val="Heading2"/>
       </w:pPr>
-      <w:bookmarkStart w:id="9" w:name="_Toc241605997"/>
+      <w:bookmarkStart w:id="9" w:name="_Toc241606856"/>
       <w:r>
         <w:t>Signing out</w:t>
       </w:r>
@@ -6072,7 +6072,7 @@
         <w:pStyle w:val="Heading1"/>
         <w:pageBreakBefore/>
       </w:pPr>
-      <w:bookmarkStart w:id="10" w:name="_Toc241605998"/>
+      <w:bookmarkStart w:id="10" w:name="_Toc241606857"/>
       <w:r>
         <w:lastRenderedPageBreak/>
         <w:t>Taking an order on the sales floor</w:t>
@@ -6104,7 +6104,7 @@
           <w:noProof/>
         </w:rPr>
         <w:drawing>
-          <wp:inline distT="0" distB="0" distL="0" distR="0" wp14:anchorId="13A0894C" wp14:editId="10BFE2AF">
+          <wp:inline distT="0" distB="0" distL="0" distR="0" wp14:anchorId="749D660D" wp14:editId="5560F323">
             <wp:extent cx="5760720" cy="3870484"/>
             <wp:effectExtent l="0" t="0" r="0" b="0"/>
             <wp:docPr id="2" name="Picture 2"/>
@@ -6229,7 +6229,7 @@
       <w:pPr>
         <w:pStyle w:val="Heading2"/>
       </w:pPr>
-      <w:bookmarkStart w:id="11" w:name="_Toc241605999"/>
+      <w:bookmarkStart w:id="11" w:name="_Toc241606858"/>
       <w:r>
         <w:t>Starting an order</w:t>
       </w:r>
@@ -6313,7 +6313,7 @@
       <w:pPr>
         <w:pStyle w:val="Heading2"/>
       </w:pPr>
-      <w:bookmarkStart w:id="12" w:name="_Toc241606000"/>
+      <w:bookmarkStart w:id="12" w:name="_Toc241606859"/>
       <w:r>
         <w:lastRenderedPageBreak/>
         <w:t>Adding items</w:t>
@@ -6462,7 +6462,7 @@
           <w:noProof/>
         </w:rPr>
         <w:drawing>
-          <wp:inline distT="0" distB="0" distL="0" distR="0" wp14:anchorId="2C67FE49" wp14:editId="2C92FE87">
+          <wp:inline distT="0" distB="0" distL="0" distR="0" wp14:anchorId="035C6DA5" wp14:editId="0BE703F3">
             <wp:extent cx="5760720" cy="3870484"/>
             <wp:effectExtent l="0" t="0" r="0" b="0"/>
             <wp:docPr id="3" name="Picture 3"/>
@@ -6599,7 +6599,7 @@
           <w:noProof/>
         </w:rPr>
         <w:drawing>
-          <wp:inline distT="0" distB="0" distL="0" distR="0" wp14:anchorId="1E3B49E0" wp14:editId="638DDF21">
+          <wp:inline distT="0" distB="0" distL="0" distR="0" wp14:anchorId="388F2CD0" wp14:editId="67B6EF7E">
             <wp:extent cx="5760720" cy="3870484"/>
             <wp:effectExtent l="0" t="0" r="0" b="0"/>
             <wp:docPr id="4" name="Picture 4"/>
@@ -6944,7 +6944,7 @@
         </w:rPr>
         <w:lastRenderedPageBreak/>
         <w:drawing>
-          <wp:inline distT="0" distB="0" distL="0" distR="0" wp14:anchorId="54B5DD23" wp14:editId="5FF173FC">
+          <wp:inline distT="0" distB="0" distL="0" distR="0" wp14:anchorId="700E9CFF" wp14:editId="7BA9D5E0">
             <wp:extent cx="5486400" cy="3686175"/>
             <wp:effectExtent l="0" t="0" r="0" b="0"/>
             <wp:docPr id="5" name="Picture 5"/>
@@ -7144,7 +7144,7 @@
       <w:pPr>
         <w:pStyle w:val="Heading2"/>
       </w:pPr>
-      <w:bookmarkStart w:id="13" w:name="_Toc241606001"/>
+      <w:bookmarkStart w:id="13" w:name="_Toc241606860"/>
       <w:r>
         <w:t>Adding shipping or a service later</w:t>
       </w:r>
@@ -7185,7 +7185,7 @@
         </w:rPr>
         <w:lastRenderedPageBreak/>
         <w:drawing>
-          <wp:inline distT="0" distB="0" distL="0" distR="0" wp14:anchorId="4CFB7671" wp14:editId="65FBBC78">
+          <wp:inline distT="0" distB="0" distL="0" distR="0" wp14:anchorId="3D7EDA4D" wp14:editId="4689936A">
             <wp:extent cx="4754880" cy="3194685"/>
             <wp:effectExtent l="0" t="0" r="0" b="0"/>
             <wp:docPr id="6" name="Picture 6"/>
@@ -7239,7 +7239,7 @@
       <w:pPr>
         <w:pStyle w:val="Heading2"/>
       </w:pPr>
-      <w:bookmarkStart w:id="14" w:name="_Toc241606002"/>
+      <w:bookmarkStart w:id="14" w:name="_Toc241606861"/>
       <w:r>
         <w:t>Changing or removing an item</w:t>
       </w:r>
@@ -7386,7 +7386,7 @@
       <w:pPr>
         <w:pStyle w:val="Heading2"/>
       </w:pPr>
-      <w:bookmarkStart w:id="15" w:name="_Toc241606003"/>
+      <w:bookmarkStart w:id="15" w:name="_Toc241606862"/>
       <w:r>
         <w:t>Customer details</w:t>
       </w:r>
@@ -7550,7 +7550,7 @@
           <w:noProof/>
         </w:rPr>
         <w:drawing>
-          <wp:inline distT="0" distB="0" distL="0" distR="0" wp14:anchorId="057A2542" wp14:editId="39F40A67">
+          <wp:inline distT="0" distB="0" distL="0" distR="0" wp14:anchorId="26E92260" wp14:editId="58D880AF">
             <wp:extent cx="4754880" cy="3194685"/>
             <wp:effectExtent l="0" t="0" r="0" b="0"/>
             <wp:docPr id="7" name="Picture 7"/>
@@ -7604,7 +7604,7 @@
       <w:pPr>
         <w:pStyle w:val="Heading2"/>
       </w:pPr>
-      <w:bookmarkStart w:id="16" w:name="_Toc241606004"/>
+      <w:bookmarkStart w:id="16" w:name="_Toc241606863"/>
       <w:r>
         <w:t>Sending the order to checkout</w:t>
       </w:r>
@@ -7782,7 +7782,7 @@
       <w:pPr>
         <w:pStyle w:val="Heading2"/>
       </w:pPr>
-      <w:bookmarkStart w:id="17" w:name="_Toc241606005"/>
+      <w:bookmarkStart w:id="17" w:name="_Toc241606864"/>
       <w:r>
         <w:lastRenderedPageBreak/>
         <w:t>Using a phone</w:t>
@@ -7800,7 +7800,7 @@
           <w:noProof/>
         </w:rPr>
         <w:drawing>
-          <wp:inline distT="0" distB="0" distL="0" distR="0" wp14:anchorId="623FD873" wp14:editId="465F951C">
+          <wp:inline distT="0" distB="0" distL="0" distR="0" wp14:anchorId="04CDA22E" wp14:editId="5FD361B3">
             <wp:extent cx="2194560" cy="4749253"/>
             <wp:effectExtent l="0" t="0" r="0" b="0"/>
             <wp:docPr id="8" name="Picture 8"/>
@@ -7878,7 +7878,7 @@
         <w:pStyle w:val="Heading1"/>
         <w:pageBreakBefore/>
       </w:pPr>
-      <w:bookmarkStart w:id="18" w:name="_Toc241606006"/>
+      <w:bookmarkStart w:id="18" w:name="_Toc241606865"/>
       <w:r>
         <w:lastRenderedPageBreak/>
         <w:t>Checking out a customer</w:t>
@@ -7919,7 +7919,7 @@
           <w:noProof/>
         </w:rPr>
         <w:drawing>
-          <wp:inline distT="0" distB="0" distL="0" distR="0" wp14:anchorId="5BE82B23" wp14:editId="74CBC0FE">
+          <wp:inline distT="0" distB="0" distL="0" distR="0" wp14:anchorId="4B580990" wp14:editId="0B73A49E">
             <wp:extent cx="5760720" cy="3870484"/>
             <wp:effectExtent l="0" t="0" r="0" b="0"/>
             <wp:docPr id="9" name="Picture 9"/>
@@ -7973,7 +7973,7 @@
       <w:pPr>
         <w:pStyle w:val="Heading2"/>
       </w:pPr>
-      <w:bookmarkStart w:id="19" w:name="_Toc241606007"/>
+      <w:bookmarkStart w:id="19" w:name="_Toc241606866"/>
       <w:r>
         <w:t>1. Review the order with the customer</w:t>
       </w:r>
@@ -8070,7 +8070,7 @@
       <w:pPr>
         <w:pStyle w:val="Heading2"/>
       </w:pPr>
-      <w:bookmarkStart w:id="20" w:name="_Toc241606008"/>
+      <w:bookmarkStart w:id="20" w:name="_Toc241606867"/>
       <w:r>
         <w:t>2. Take payment</w:t>
       </w:r>
@@ -8384,7 +8384,7 @@
       <w:pPr>
         <w:pStyle w:val="Heading2"/>
       </w:pPr>
-      <w:bookmarkStart w:id="21" w:name="_Toc241606009"/>
+      <w:bookmarkStart w:id="21" w:name="_Toc241606868"/>
       <w:r>
         <w:t>3. Acknowledgements (initials and signature)</w:t>
       </w:r>
@@ -8566,7 +8566,7 @@
         </w:rPr>
         <w:lastRenderedPageBreak/>
         <w:drawing>
-          <wp:inline distT="0" distB="0" distL="0" distR="0" wp14:anchorId="47B7C3F6" wp14:editId="6FE59F96">
+          <wp:inline distT="0" distB="0" distL="0" distR="0" wp14:anchorId="6E7F09ED" wp14:editId="1AACC2B5">
             <wp:extent cx="4937760" cy="3317558"/>
             <wp:effectExtent l="0" t="0" r="0" b="0"/>
             <wp:docPr id="10" name="Picture 10"/>
@@ -8693,7 +8693,7 @@
       <w:pPr>
         <w:pStyle w:val="Heading2"/>
       </w:pPr>
-      <w:bookmarkStart w:id="22" w:name="_Toc241606010"/>
+      <w:bookmarkStart w:id="22" w:name="_Toc241606869"/>
       <w:r>
         <w:t>4. Complete and print</w:t>
       </w:r>
@@ -8882,7 +8882,7 @@
       <w:pPr>
         <w:pStyle w:val="Heading2"/>
       </w:pPr>
-      <w:bookmarkStart w:id="23" w:name="_Toc241606011"/>
+      <w:bookmarkStart w:id="23" w:name="_Toc241606870"/>
       <w:r>
         <w:lastRenderedPageBreak/>
         <w:t>Other checkout actions</w:t>
@@ -9093,7 +9093,7 @@
         <w:pStyle w:val="Heading1"/>
         <w:pageBreakBefore/>
       </w:pPr>
-      <w:bookmarkStart w:id="24" w:name="_Toc241606012"/>
+      <w:bookmarkStart w:id="24" w:name="_Toc241606871"/>
       <w:r>
         <w:lastRenderedPageBreak/>
         <w:t>The sales sheet</w:t>
@@ -9116,7 +9116,7 @@
           <w:noProof/>
         </w:rPr>
         <w:drawing>
-          <wp:inline distT="0" distB="0" distL="0" distR="0" wp14:anchorId="57283AEC" wp14:editId="3D694C45">
+          <wp:inline distT="0" distB="0" distL="0" distR="0" wp14:anchorId="70B66C19" wp14:editId="215DECD3">
             <wp:extent cx="4023360" cy="3187256"/>
             <wp:effectExtent l="0" t="0" r="0" b="0"/>
             <wp:docPr id="11" name="Picture 11"/>
@@ -9285,7 +9285,7 @@
         <w:pStyle w:val="Heading1"/>
         <w:pageBreakBefore/>
       </w:pPr>
-      <w:bookmarkStart w:id="25" w:name="_Toc241606013"/>
+      <w:bookmarkStart w:id="25" w:name="_Toc241606872"/>
       <w:r>
         <w:lastRenderedPageBreak/>
         <w:t>Looking up orders</w:t>
@@ -9317,7 +9317,7 @@
           <w:noProof/>
         </w:rPr>
         <w:drawing>
-          <wp:inline distT="0" distB="0" distL="0" distR="0" wp14:anchorId="0B9FD96C" wp14:editId="0E64BC5C">
+          <wp:inline distT="0" distB="0" distL="0" distR="0" wp14:anchorId="2B532A4D" wp14:editId="308AA909">
             <wp:extent cx="5760720" cy="3870484"/>
             <wp:effectExtent l="0" t="0" r="0" b="0"/>
             <wp:docPr id="12" name="Picture 12"/>
@@ -9437,7 +9437,7 @@
       <w:pPr>
         <w:pStyle w:val="Heading2"/>
       </w:pPr>
-      <w:bookmarkStart w:id="26" w:name="_Toc241606014"/>
+      <w:bookmarkStart w:id="26" w:name="_Toc241606873"/>
       <w:r>
         <w:t>Extra options for admins</w:t>
       </w:r>
@@ -9527,7 +9527,7 @@
         </w:rPr>
         <w:lastRenderedPageBreak/>
         <w:drawing>
-          <wp:inline distT="0" distB="0" distL="0" distR="0" wp14:anchorId="499ACAC5" wp14:editId="5261CDFE">
+          <wp:inline distT="0" distB="0" distL="0" distR="0" wp14:anchorId="528388AC" wp14:editId="1B1F167D">
             <wp:extent cx="4754880" cy="3194685"/>
             <wp:effectExtent l="0" t="0" r="0" b="0"/>
             <wp:docPr id="13" name="Picture 13"/>
@@ -9649,7 +9649,7 @@
         <w:pStyle w:val="Heading1"/>
         <w:pageBreakBefore/>
       </w:pPr>
-      <w:bookmarkStart w:id="27" w:name="_Toc241606015"/>
+      <w:bookmarkStart w:id="27" w:name="_Toc241606874"/>
       <w:r>
         <w:lastRenderedPageBreak/>
         <w:t>The dashboard</w:t>
@@ -9713,7 +9713,7 @@
           <w:noProof/>
         </w:rPr>
         <w:drawing>
-          <wp:inline distT="0" distB="0" distL="0" distR="0" wp14:anchorId="0D286EBB" wp14:editId="632CAD29">
+          <wp:inline distT="0" distB="0" distL="0" distR="0" wp14:anchorId="12AE7162" wp14:editId="49408A60">
             <wp:extent cx="4937760" cy="4305110"/>
             <wp:effectExtent l="0" t="0" r="0" b="0"/>
             <wp:docPr id="14" name="Picture 14"/>
@@ -10257,6 +10257,68 @@
         <w:spacing w:after="40"/>
       </w:pPr>
     </w:p>
+    <w:tbl>
+      <w:tblPr>
+        <w:tblW w:w="0" w:type="auto"/>
+        <w:jc w:val="center"/>
+        <w:tblLook w:val="04A0" w:firstRow="1" w:lastRow="0" w:firstColumn="1" w:lastColumn="0" w:noHBand="0" w:noVBand="1"/>
+      </w:tblPr>
+      <w:tblGrid>
+        <w:gridCol w:w="9360"/>
+      </w:tblGrid>
+      <w:tr>
+        <w:trPr>
+          <w:jc w:val="center"/>
+        </w:trPr>
+        <w:tc>
+          <w:tcPr>
+            <w:tcW w:w="9360" w:type="dxa"/>
+            <w:tcBorders>
+              <w:top w:val="single" w:sz="4" w:space="0" w:color="E0F2FE"/>
+              <w:left w:val="single" w:sz="36" w:space="0" w:color="0284C7"/>
+              <w:bottom w:val="single" w:sz="4" w:space="0" w:color="E0F2FE"/>
+              <w:right w:val="single" w:sz="4" w:space="0" w:color="E0F2FE"/>
+            </w:tcBorders>
+            <w:shd w:val="clear" w:color="auto" w:fill="E0F2FE"/>
+            <w:tcMar>
+              <w:top w:w="120" w:type="dxa"/>
+              <w:left w:w="200" w:type="dxa"/>
+              <w:bottom w:w="120" w:type="dxa"/>
+              <w:right w:w="160" w:type="dxa"/>
+            </w:tcMar>
+          </w:tcPr>
+          <w:p>
+            <w:pPr>
+              <w:spacing w:after="0"/>
+            </w:pPr>
+            <w:r>
+              <w:rPr>
+                <w:b/>
+                <w:color w:val="0284C7"/>
+              </w:rPr>
+              <w:t xml:space="preserve">Tip:  </w:t>
+            </w:r>
+            <w:r>
+              <w:t xml:space="preserve">The </w:t>
+            </w:r>
+            <w:r>
+              <w:rPr>
+                <w:b/>
+              </w:rPr>
+              <w:t>Net sales</w:t>
+            </w:r>
+            <w:r>
+              <w:t xml:space="preserve"> tile earns a gold star when net sales pass $30,000, and another for every $10,000 after that: two stars at $40,000, three at $50,000, and so on. Hover over the stars to see the next milestone.</w:t>
+            </w:r>
+          </w:p>
+        </w:tc>
+      </w:tr>
+    </w:tbl>
+    <w:p>
+      <w:pPr>
+        <w:spacing w:after="40"/>
+      </w:pPr>
+    </w:p>
     <w:p>
       <w:r>
         <w:t>Below the tiles:</w:t>
@@ -10297,7 +10359,7 @@
         <w:pStyle w:val="Heading1"/>
         <w:pageBreakBefore/>
       </w:pPr>
-      <w:bookmarkStart w:id="28" w:name="_Toc241606016"/>
+      <w:bookmarkStart w:id="28" w:name="_Toc241606875"/>
       <w:r>
         <w:lastRenderedPageBreak/>
         <w:t>Keeping inventory</w:t>
@@ -10356,7 +10418,7 @@
           <w:noProof/>
         </w:rPr>
         <w:drawing>
-          <wp:inline distT="0" distB="0" distL="0" distR="0" wp14:anchorId="43FBE4B2" wp14:editId="31816299">
+          <wp:inline distT="0" distB="0" distL="0" distR="0" wp14:anchorId="4C09738B" wp14:editId="21A28034">
             <wp:extent cx="5760720" cy="3870484"/>
             <wp:effectExtent l="0" t="0" r="0" b="0"/>
             <wp:docPr id="15" name="Picture 15"/>
@@ -10410,7 +10472,7 @@
       <w:pPr>
         <w:pStyle w:val="Heading2"/>
       </w:pPr>
-      <w:bookmarkStart w:id="29" w:name="_Toc241606017"/>
+      <w:bookmarkStart w:id="29" w:name="_Toc241606876"/>
       <w:r>
         <w:t>What's on the screen</w:t>
       </w:r>
@@ -10492,7 +10554,7 @@
       <w:pPr>
         <w:pStyle w:val="Heading2"/>
       </w:pPr>
-      <w:bookmarkStart w:id="30" w:name="_Toc241606018"/>
+      <w:bookmarkStart w:id="30" w:name="_Toc241606877"/>
       <w:r>
         <w:t>Updating a count</w:t>
       </w:r>
@@ -10569,7 +10631,7 @@
           <w:noProof/>
         </w:rPr>
         <w:drawing>
-          <wp:inline distT="0" distB="0" distL="0" distR="0" wp14:anchorId="4BB04A91" wp14:editId="4529855A">
+          <wp:inline distT="0" distB="0" distL="0" distR="0" wp14:anchorId="721D0329" wp14:editId="5E0F258B">
             <wp:extent cx="5120640" cy="3440430"/>
             <wp:effectExtent l="0" t="0" r="0" b="0"/>
             <wp:docPr id="16" name="Picture 16"/>
@@ -10623,7 +10685,7 @@
       <w:pPr>
         <w:pStyle w:val="Heading2"/>
       </w:pPr>
-      <w:bookmarkStart w:id="31" w:name="_Toc241606019"/>
+      <w:bookmarkStart w:id="31" w:name="_Toc241606878"/>
       <w:r>
         <w:t>What changes the count automatically</w:t>
       </w:r>
@@ -11027,7 +11089,7 @@
       <w:pPr>
         <w:pStyle w:val="Heading2"/>
       </w:pPr>
-      <w:bookmarkStart w:id="32" w:name="_Toc241606020"/>
+      <w:bookmarkStart w:id="32" w:name="_Toc241606879"/>
       <w:r>
         <w:lastRenderedPageBreak/>
         <w:t>Seeing the history</w:t>
@@ -11043,7 +11105,7 @@
       <w:pPr>
         <w:pStyle w:val="Heading2"/>
       </w:pPr>
-      <w:bookmarkStart w:id="33" w:name="_Toc241606021"/>
+      <w:bookmarkStart w:id="33" w:name="_Toc241606880"/>
       <w:r>
         <w:t>Notes for the inventory sheet</w:t>
       </w:r>
@@ -11092,7 +11154,7 @@
           <w:noProof/>
         </w:rPr>
         <w:drawing>
-          <wp:inline distT="0" distB="0" distL="0" distR="0" wp14:anchorId="64ED9E04" wp14:editId="0AD3F4DF">
+          <wp:inline distT="0" distB="0" distL="0" distR="0" wp14:anchorId="062023D6" wp14:editId="1A0B7028">
             <wp:extent cx="5120640" cy="3440430"/>
             <wp:effectExtent l="0" t="0" r="0" b="0"/>
             <wp:docPr id="17" name="Picture 17"/>
@@ -11146,7 +11208,7 @@
       <w:pPr>
         <w:pStyle w:val="Heading2"/>
       </w:pPr>
-      <w:bookmarkStart w:id="34" w:name="_Toc241606022"/>
+      <w:bookmarkStart w:id="34" w:name="_Toc241606881"/>
       <w:r>
         <w:t>Start and end counts</w:t>
       </w:r>
@@ -11669,7 +11731,7 @@
           <w:noProof/>
         </w:rPr>
         <w:drawing>
-          <wp:inline distT="0" distB="0" distL="0" distR="0" wp14:anchorId="0065B455" wp14:editId="58C3BF86">
+          <wp:inline distT="0" distB="0" distL="0" distR="0" wp14:anchorId="43DA76D6" wp14:editId="2F0DD472">
             <wp:extent cx="5486400" cy="3686175"/>
             <wp:effectExtent l="0" t="0" r="0" b="0"/>
             <wp:docPr id="18" name="Picture 18"/>
@@ -11809,7 +11871,7 @@
         <w:pStyle w:val="Heading1"/>
         <w:pageBreakBefore/>
       </w:pPr>
-      <w:bookmarkStart w:id="35" w:name="_Toc241606023"/>
+      <w:bookmarkStart w:id="35" w:name="_Toc241606882"/>
       <w:r>
         <w:lastRenderedPageBreak/>
         <w:t>Admin: setting up an event</w:t>
@@ -11834,7 +11896,7 @@
       <w:pPr>
         <w:pStyle w:val="Heading2"/>
       </w:pPr>
-      <w:bookmarkStart w:id="36" w:name="_Toc241606024"/>
+      <w:bookmarkStart w:id="36" w:name="_Toc241606883"/>
       <w:r>
         <w:t>Creating or editing an event</w:t>
       </w:r>
@@ -11851,7 +11913,7 @@
           <w:noProof/>
         </w:rPr>
         <w:drawing>
-          <wp:inline distT="0" distB="0" distL="0" distR="0" wp14:anchorId="68975CAF" wp14:editId="11CB881C">
+          <wp:inline distT="0" distB="0" distL="0" distR="0" wp14:anchorId="409BF80C" wp14:editId="3A87CE02">
             <wp:extent cx="5760720" cy="1236154"/>
             <wp:effectExtent l="0" t="0" r="0" b="0"/>
             <wp:docPr id="19" name="Picture 19"/>
@@ -12191,7 +12253,7 @@
           <w:noProof/>
         </w:rPr>
         <w:drawing>
-          <wp:inline distT="0" distB="0" distL="0" distR="0" wp14:anchorId="4831482D" wp14:editId="25AAD46B">
+          <wp:inline distT="0" distB="0" distL="0" distR="0" wp14:anchorId="06F700EA" wp14:editId="4CEAD0D9">
             <wp:extent cx="3840480" cy="2580322"/>
             <wp:effectExtent l="0" t="0" r="0" b="0"/>
             <wp:docPr id="20" name="Picture 20"/>
@@ -12313,7 +12375,7 @@
       <w:pPr>
         <w:pStyle w:val="Heading2"/>
       </w:pPr>
-      <w:bookmarkStart w:id="37" w:name="_Toc241606025"/>
+      <w:bookmarkStart w:id="37" w:name="_Toc241606884"/>
       <w:r>
         <w:t>Closing out an event</w:t>
       </w:r>
@@ -12480,7 +12542,7 @@
       <w:pPr>
         <w:pStyle w:val="Heading2"/>
       </w:pPr>
-      <w:bookmarkStart w:id="38" w:name="_Toc241606026"/>
+      <w:bookmarkStart w:id="38" w:name="_Toc241606885"/>
       <w:r>
         <w:t>Event sales sheets</w:t>
       </w:r>
@@ -12538,7 +12600,7 @@
           <w:noProof/>
         </w:rPr>
         <w:drawing>
-          <wp:inline distT="0" distB="0" distL="0" distR="0" wp14:anchorId="25A3E031" wp14:editId="1ADC910B">
+          <wp:inline distT="0" distB="0" distL="0" distR="0" wp14:anchorId="675AE561" wp14:editId="251E9E32">
             <wp:extent cx="4389120" cy="2948940"/>
             <wp:effectExtent l="0" t="0" r="0" b="0"/>
             <wp:docPr id="21" name="Picture 21"/>
@@ -12667,7 +12729,7 @@
           <w:noProof/>
         </w:rPr>
         <w:drawing>
-          <wp:inline distT="0" distB="0" distL="0" distR="0" wp14:anchorId="1AB5134A" wp14:editId="2FB1AB84">
+          <wp:inline distT="0" distB="0" distL="0" distR="0" wp14:anchorId="22A7A37B" wp14:editId="14376BD2">
             <wp:extent cx="4206240" cy="5717858"/>
             <wp:effectExtent l="0" t="0" r="0" b="0"/>
             <wp:docPr id="22" name="Picture 22"/>
@@ -12752,7 +12814,7 @@
         <w:pStyle w:val="Heading1"/>
         <w:pageBreakBefore/>
       </w:pPr>
-      <w:bookmarkStart w:id="39" w:name="_Toc241606027"/>
+      <w:bookmarkStart w:id="39" w:name="_Toc241606886"/>
       <w:r>
         <w:lastRenderedPageBreak/>
         <w:t>Admin: managing the catalog</w:t>
@@ -12793,7 +12855,7 @@
           <w:noProof/>
         </w:rPr>
         <w:drawing>
-          <wp:inline distT="0" distB="0" distL="0" distR="0" wp14:anchorId="4E0DB22E" wp14:editId="7E7976A2">
+          <wp:inline distT="0" distB="0" distL="0" distR="0" wp14:anchorId="2D300B5E" wp14:editId="2730D1D8">
             <wp:extent cx="5760720" cy="3870484"/>
             <wp:effectExtent l="0" t="0" r="0" b="0"/>
             <wp:docPr id="23" name="Picture 23"/>
@@ -12847,7 +12909,7 @@
       <w:pPr>
         <w:pStyle w:val="Heading2"/>
       </w:pPr>
-      <w:bookmarkStart w:id="40" w:name="_Toc241606028"/>
+      <w:bookmarkStart w:id="40" w:name="_Toc241606887"/>
       <w:r>
         <w:lastRenderedPageBreak/>
         <w:t>Adding or editing a product</w:t>
@@ -12865,7 +12927,7 @@
           <w:noProof/>
         </w:rPr>
         <w:drawing>
-          <wp:inline distT="0" distB="0" distL="0" distR="0" wp14:anchorId="14C92296" wp14:editId="0340802E">
+          <wp:inline distT="0" distB="0" distL="0" distR="0" wp14:anchorId="16EF03E5" wp14:editId="6A75130C">
             <wp:extent cx="5486400" cy="3686175"/>
             <wp:effectExtent l="0" t="0" r="0" b="0"/>
             <wp:docPr id="24" name="Picture 24"/>
@@ -13288,7 +13350,7 @@
         </w:rPr>
         <w:lastRenderedPageBreak/>
         <w:drawing>
-          <wp:inline distT="0" distB="0" distL="0" distR="0" wp14:anchorId="5C821437" wp14:editId="054E61F8">
+          <wp:inline distT="0" distB="0" distL="0" distR="0" wp14:anchorId="2868AFAB" wp14:editId="5327F3B5">
             <wp:extent cx="5120640" cy="2130933"/>
             <wp:effectExtent l="0" t="0" r="0" b="0"/>
             <wp:docPr id="25" name="Picture 25"/>
@@ -13475,7 +13537,7 @@
       <w:pPr>
         <w:pStyle w:val="Heading2"/>
       </w:pPr>
-      <w:bookmarkStart w:id="41" w:name="_Toc241606029"/>
+      <w:bookmarkStart w:id="41" w:name="_Toc241606888"/>
       <w:r>
         <w:t>Delivery and services</w:t>
       </w:r>
@@ -13507,7 +13569,7 @@
         </w:rPr>
         <w:lastRenderedPageBreak/>
         <w:drawing>
-          <wp:inline distT="0" distB="0" distL="0" distR="0" wp14:anchorId="2B11255C" wp14:editId="4BD31216">
+          <wp:inline distT="0" distB="0" distL="0" distR="0" wp14:anchorId="3EBD569F" wp14:editId="00B0F2DF">
             <wp:extent cx="5760720" cy="3870484"/>
             <wp:effectExtent l="0" t="0" r="0" b="0"/>
             <wp:docPr id="26" name="Picture 26"/>
@@ -13937,7 +13999,7 @@
         <w:pStyle w:val="Heading1"/>
         <w:pageBreakBefore/>
       </w:pPr>
-      <w:bookmarkStart w:id="42" w:name="_Toc241606030"/>
+      <w:bookmarkStart w:id="42" w:name="_Toc241606889"/>
       <w:r>
         <w:lastRenderedPageBreak/>
         <w:t>Admin: managing the crew</w:t>
@@ -13969,7 +14031,7 @@
           <w:noProof/>
         </w:rPr>
         <w:drawing>
-          <wp:inline distT="0" distB="0" distL="0" distR="0" wp14:anchorId="7B69C3C2" wp14:editId="2387EDA7">
+          <wp:inline distT="0" distB="0" distL="0" distR="0" wp14:anchorId="1F621813" wp14:editId="11425A30">
             <wp:extent cx="5760720" cy="1740218"/>
             <wp:effectExtent l="0" t="0" r="0" b="0"/>
             <wp:docPr id="27" name="Picture 27"/>
@@ -14241,7 +14303,7 @@
           <w:noProof/>
         </w:rPr>
         <w:drawing>
-          <wp:inline distT="0" distB="0" distL="0" distR="0" wp14:anchorId="30B4E308" wp14:editId="267668B3">
+          <wp:inline distT="0" distB="0" distL="0" distR="0" wp14:anchorId="398A94C7" wp14:editId="147A745E">
             <wp:extent cx="4023360" cy="2703195"/>
             <wp:effectExtent l="0" t="0" r="0" b="0"/>
             <wp:docPr id="28" name="Picture 28"/>
@@ -14306,7 +14368,7 @@
         <w:pStyle w:val="Heading1"/>
         <w:pageBreakBefore/>
       </w:pPr>
-      <w:bookmarkStart w:id="43" w:name="_Toc241606031"/>
+      <w:bookmarkStart w:id="43" w:name="_Toc241606890"/>
       <w:r>
         <w:lastRenderedPageBreak/>
         <w:t>Owner: permanent deletes</w:t>
@@ -14347,7 +14409,7 @@
           <w:noProof/>
         </w:rPr>
         <w:drawing>
-          <wp:inline distT="0" distB="0" distL="0" distR="0" wp14:anchorId="279B56BF" wp14:editId="0D5BAE50">
+          <wp:inline distT="0" distB="0" distL="0" distR="0" wp14:anchorId="38CF02AE" wp14:editId="78A6A074">
             <wp:extent cx="4754880" cy="3312709"/>
             <wp:effectExtent l="0" t="0" r="0" b="0"/>
             <wp:docPr id="29" name="Picture 29"/>
@@ -15011,7 +15073,7 @@
         <w:pStyle w:val="Heading1"/>
         <w:pageBreakBefore/>
       </w:pPr>
-      <w:bookmarkStart w:id="44" w:name="_Toc241606032"/>
+      <w:bookmarkStart w:id="44" w:name="_Toc241606891"/>
       <w:r>
         <w:lastRenderedPageBreak/>
         <w:t>Tips and troubleshooting</w:t>
@@ -15341,7 +15403,7 @@
         <w:pStyle w:val="Heading1"/>
         <w:pageBreakBefore/>
       </w:pPr>
-      <w:bookmarkStart w:id="45" w:name="_Toc241606033"/>
+      <w:bookmarkStart w:id="45" w:name="_Toc241606892"/>
       <w:r>
         <w:lastRenderedPageBreak/>
         <w:t>Quick reference</w:t>
@@ -15352,7 +15414,7 @@
       <w:pPr>
         <w:pStyle w:val="Heading2"/>
       </w:pPr>
-      <w:bookmarkStart w:id="46" w:name="_Toc241606034"/>
+      <w:bookmarkStart w:id="46" w:name="_Toc241606893"/>
       <w:r>
         <w:t>Sales rep checklist</w:t>
       </w:r>
@@ -15496,7 +15558,7 @@
       <w:pPr>
         <w:pStyle w:val="Heading2"/>
       </w:pPr>
-      <w:bookmarkStart w:id="47" w:name="_Toc241606035"/>
+      <w:bookmarkStart w:id="47" w:name="_Toc241606894"/>
       <w:r>
         <w:t>Checkout checklist</w:t>
       </w:r>
@@ -15666,7 +15728,7 @@
       <w:pPr>
         <w:pStyle w:val="Heading2"/>
       </w:pPr>
-      <w:bookmarkStart w:id="48" w:name="_Toc241606036"/>
+      <w:bookmarkStart w:id="48" w:name="_Toc241606895"/>
       <w:r>
         <w:t>Inventory counts</w:t>
       </w:r>
@@ -15870,7 +15932,7 @@
       <w:pPr>
         <w:pStyle w:val="Heading2"/>
       </w:pPr>
-      <w:bookmarkStart w:id="49" w:name="_Toc241606037"/>
+      <w:bookmarkStart w:id="49" w:name="_Toc241606896"/>
       <w:r>
         <w:t>Order status at a glance</w:t>
       </w:r>
@@ -16490,31 +16552,31 @@
       </w:rPr>
     </w:lvl>
   </w:abstractNum>
-  <w:num w:numId="1" w16cid:durableId="728192512">
+  <w:num w:numId="1" w16cid:durableId="503473153">
     <w:abstractNumId w:val="8"/>
   </w:num>
-  <w:num w:numId="2" w16cid:durableId="987513546">
+  <w:num w:numId="2" w16cid:durableId="830606271">
     <w:abstractNumId w:val="6"/>
   </w:num>
-  <w:num w:numId="3" w16cid:durableId="2092656290">
+  <w:num w:numId="3" w16cid:durableId="445198476">
     <w:abstractNumId w:val="5"/>
   </w:num>
-  <w:num w:numId="4" w16cid:durableId="1990552308">
+  <w:num w:numId="4" w16cid:durableId="611132746">
     <w:abstractNumId w:val="4"/>
   </w:num>
-  <w:num w:numId="5" w16cid:durableId="228687590">
+  <w:num w:numId="5" w16cid:durableId="1785809167">
     <w:abstractNumId w:val="7"/>
   </w:num>
-  <w:num w:numId="6" w16cid:durableId="602953599">
+  <w:num w:numId="6" w16cid:durableId="1005743380">
     <w:abstractNumId w:val="3"/>
   </w:num>
-  <w:num w:numId="7" w16cid:durableId="1762221060">
+  <w:num w:numId="7" w16cid:durableId="1902403149">
     <w:abstractNumId w:val="2"/>
   </w:num>
-  <w:num w:numId="8" w16cid:durableId="1233931764">
+  <w:num w:numId="8" w16cid:durableId="1719207051">
     <w:abstractNumId w:val="1"/>
   </w:num>
-  <w:num w:numId="9" w16cid:durableId="1639795447">
+  <w:num w:numId="9" w16cid:durableId="1507936180">
     <w:abstractNumId w:val="0"/>
   </w:num>
 </w:numbering>
@@ -27906,7 +27968,7 @@
     <w:autoRedefine/>
     <w:uiPriority w:val="39"/>
     <w:unhideWhenUsed/>
-    <w:rsid w:val="00467A7B"/>
+    <w:rsid w:val="00DF0BDA"/>
     <w:pPr>
       <w:spacing w:after="100"/>
     </w:pPr>
@@ -27918,7 +27980,7 @@
     <w:autoRedefine/>
     <w:uiPriority w:val="39"/>
     <w:unhideWhenUsed/>
-    <w:rsid w:val="00467A7B"/>
+    <w:rsid w:val="00DF0BDA"/>
     <w:pPr>
       <w:spacing w:after="100"/>
       <w:ind w:left="220"/>
@@ -27929,7 +27991,7 @@
     <w:basedOn w:val="DefaultParagraphFont"/>
     <w:uiPriority w:val="99"/>
     <w:unhideWhenUsed/>
-    <w:rsid w:val="00467A7B"/>
+    <w:rsid w:val="00DF0BDA"/>
     <w:rPr>
       <w:color w:val="0000FF" w:themeColor="hyperlink"/>
       <w:u w:val="single"/>

</xml_diff>

<commit_message>
Show each user's last login time to owners on the Crew page
- Users get a LastLoginAt column (SQL Server and Postgres migrations),
  set on PIN sign-in only; token refreshes and failed attempts don't
  change it.
- The crew list includes it only for an owner, and the Crew page shows
  it under each name with how long ago it was.
- User manual: updated for emailed receipts and reports, the Complete
  sale button, and last login times.

Co-Authored-By: Claude Opus 5.5 <noreply@anthropic.com>
</commit_message>
<xml_diff>
--- a/Documents/CFS Sales App User Guide.docx
+++ b/Documents/CFS Sales App User Guide.docx
@@ -345,7 +345,7 @@
       <w:r>
         <w:fldChar w:fldCharType="separate"/>
       </w:r>
-      <w:hyperlink w:anchor="_Toc241606847" w:history="1">
+      <w:hyperlink w:anchor="_Toc241697842" w:history="1">
         <w:r>
           <w:rPr>
             <w:rStyle w:val="Hyperlink"/>
@@ -372,7 +372,7 @@
             <w:noProof/>
             <w:webHidden/>
           </w:rPr>
-          <w:instrText xml:space="preserve"> PAGEREF _Toc241606847 \h </w:instrText>
+          <w:instrText xml:space="preserve"> PAGEREF _Toc241697842 \h </w:instrText>
         </w:r>
         <w:r>
           <w:rPr>
@@ -413,7 +413,7 @@
           <w:noProof/>
         </w:rPr>
       </w:pPr>
-      <w:hyperlink w:anchor="_Toc241606848" w:history="1">
+      <w:hyperlink w:anchor="_Toc241697843" w:history="1">
         <w:r>
           <w:rPr>
             <w:rStyle w:val="Hyperlink"/>
@@ -440,7 +440,7 @@
             <w:noProof/>
             <w:webHidden/>
           </w:rPr>
-          <w:instrText xml:space="preserve"> PAGEREF _Toc241606848 \h </w:instrText>
+          <w:instrText xml:space="preserve"> PAGEREF _Toc241697843 \h </w:instrText>
         </w:r>
         <w:r>
           <w:rPr>
@@ -481,7 +481,7 @@
           <w:noProof/>
         </w:rPr>
       </w:pPr>
-      <w:hyperlink w:anchor="_Toc241606849" w:history="1">
+      <w:hyperlink w:anchor="_Toc241697844" w:history="1">
         <w:r>
           <w:rPr>
             <w:rStyle w:val="Hyperlink"/>
@@ -508,7 +508,7 @@
             <w:noProof/>
             <w:webHidden/>
           </w:rPr>
-          <w:instrText xml:space="preserve"> PAGEREF _Toc241606849 \h </w:instrText>
+          <w:instrText xml:space="preserve"> PAGEREF _Toc241697844 \h </w:instrText>
         </w:r>
         <w:r>
           <w:rPr>
@@ -549,7 +549,7 @@
           <w:noProof/>
         </w:rPr>
       </w:pPr>
-      <w:hyperlink w:anchor="_Toc241606850" w:history="1">
+      <w:hyperlink w:anchor="_Toc241697845" w:history="1">
         <w:r>
           <w:rPr>
             <w:rStyle w:val="Hyperlink"/>
@@ -576,7 +576,7 @@
             <w:noProof/>
             <w:webHidden/>
           </w:rPr>
-          <w:instrText xml:space="preserve"> PAGEREF _Toc241606850 \h </w:instrText>
+          <w:instrText xml:space="preserve"> PAGEREF _Toc241697845 \h </w:instrText>
         </w:r>
         <w:r>
           <w:rPr>
@@ -617,7 +617,7 @@
           <w:noProof/>
         </w:rPr>
       </w:pPr>
-      <w:hyperlink w:anchor="_Toc241606851" w:history="1">
+      <w:hyperlink w:anchor="_Toc241697846" w:history="1">
         <w:r>
           <w:rPr>
             <w:rStyle w:val="Hyperlink"/>
@@ -644,7 +644,7 @@
             <w:noProof/>
             <w:webHidden/>
           </w:rPr>
-          <w:instrText xml:space="preserve"> PAGEREF _Toc241606851 \h </w:instrText>
+          <w:instrText xml:space="preserve"> PAGEREF _Toc241697846 \h </w:instrText>
         </w:r>
         <w:r>
           <w:rPr>
@@ -685,7 +685,7 @@
           <w:noProof/>
         </w:rPr>
       </w:pPr>
-      <w:hyperlink w:anchor="_Toc241606852" w:history="1">
+      <w:hyperlink w:anchor="_Toc241697847" w:history="1">
         <w:r>
           <w:rPr>
             <w:rStyle w:val="Hyperlink"/>
@@ -712,7 +712,7 @@
             <w:noProof/>
             <w:webHidden/>
           </w:rPr>
-          <w:instrText xml:space="preserve"> PAGEREF _Toc241606852 \h </w:instrText>
+          <w:instrText xml:space="preserve"> PAGEREF _Toc241697847 \h </w:instrText>
         </w:r>
         <w:r>
           <w:rPr>
@@ -753,7 +753,7 @@
           <w:noProof/>
         </w:rPr>
       </w:pPr>
-      <w:hyperlink w:anchor="_Toc241606853" w:history="1">
+      <w:hyperlink w:anchor="_Toc241697848" w:history="1">
         <w:r>
           <w:rPr>
             <w:rStyle w:val="Hyperlink"/>
@@ -780,7 +780,7 @@
             <w:noProof/>
             <w:webHidden/>
           </w:rPr>
-          <w:instrText xml:space="preserve"> PAGEREF _Toc241606853 \h </w:instrText>
+          <w:instrText xml:space="preserve"> PAGEREF _Toc241697848 \h </w:instrText>
         </w:r>
         <w:r>
           <w:rPr>
@@ -821,7 +821,7 @@
           <w:noProof/>
         </w:rPr>
       </w:pPr>
-      <w:hyperlink w:anchor="_Toc241606854" w:history="1">
+      <w:hyperlink w:anchor="_Toc241697849" w:history="1">
         <w:r>
           <w:rPr>
             <w:rStyle w:val="Hyperlink"/>
@@ -848,7 +848,7 @@
             <w:noProof/>
             <w:webHidden/>
           </w:rPr>
-          <w:instrText xml:space="preserve"> PAGEREF _Toc241606854 \h </w:instrText>
+          <w:instrText xml:space="preserve"> PAGEREF _Toc241697849 \h </w:instrText>
         </w:r>
         <w:r>
           <w:rPr>
@@ -889,7 +889,7 @@
           <w:noProof/>
         </w:rPr>
       </w:pPr>
-      <w:hyperlink w:anchor="_Toc241606855" w:history="1">
+      <w:hyperlink w:anchor="_Toc241697850" w:history="1">
         <w:r>
           <w:rPr>
             <w:rStyle w:val="Hyperlink"/>
@@ -916,7 +916,7 @@
             <w:noProof/>
             <w:webHidden/>
           </w:rPr>
-          <w:instrText xml:space="preserve"> PAGEREF _Toc241606855 \h </w:instrText>
+          <w:instrText xml:space="preserve"> PAGEREF _Toc241697850 \h </w:instrText>
         </w:r>
         <w:r>
           <w:rPr>
@@ -957,7 +957,7 @@
           <w:noProof/>
         </w:rPr>
       </w:pPr>
-      <w:hyperlink w:anchor="_Toc241606856" w:history="1">
+      <w:hyperlink w:anchor="_Toc241697851" w:history="1">
         <w:r>
           <w:rPr>
             <w:rStyle w:val="Hyperlink"/>
@@ -984,7 +984,7 @@
             <w:noProof/>
             <w:webHidden/>
           </w:rPr>
-          <w:instrText xml:space="preserve"> PAGEREF _Toc241606856 \h </w:instrText>
+          <w:instrText xml:space="preserve"> PAGEREF _Toc241697851 \h </w:instrText>
         </w:r>
         <w:r>
           <w:rPr>
@@ -1025,7 +1025,7 @@
           <w:noProof/>
         </w:rPr>
       </w:pPr>
-      <w:hyperlink w:anchor="_Toc241606857" w:history="1">
+      <w:hyperlink w:anchor="_Toc241697852" w:history="1">
         <w:r>
           <w:rPr>
             <w:rStyle w:val="Hyperlink"/>
@@ -1052,7 +1052,7 @@
             <w:noProof/>
             <w:webHidden/>
           </w:rPr>
-          <w:instrText xml:space="preserve"> PAGEREF _Toc241606857 \h </w:instrText>
+          <w:instrText xml:space="preserve"> PAGEREF _Toc241697852 \h </w:instrText>
         </w:r>
         <w:r>
           <w:rPr>
@@ -1093,7 +1093,7 @@
           <w:noProof/>
         </w:rPr>
       </w:pPr>
-      <w:hyperlink w:anchor="_Toc241606858" w:history="1">
+      <w:hyperlink w:anchor="_Toc241697853" w:history="1">
         <w:r>
           <w:rPr>
             <w:rStyle w:val="Hyperlink"/>
@@ -1120,7 +1120,7 @@
             <w:noProof/>
             <w:webHidden/>
           </w:rPr>
-          <w:instrText xml:space="preserve"> PAGEREF _Toc241606858 \h </w:instrText>
+          <w:instrText xml:space="preserve"> PAGEREF _Toc241697853 \h </w:instrText>
         </w:r>
         <w:r>
           <w:rPr>
@@ -1161,7 +1161,7 @@
           <w:noProof/>
         </w:rPr>
       </w:pPr>
-      <w:hyperlink w:anchor="_Toc241606859" w:history="1">
+      <w:hyperlink w:anchor="_Toc241697854" w:history="1">
         <w:r>
           <w:rPr>
             <w:rStyle w:val="Hyperlink"/>
@@ -1188,7 +1188,7 @@
             <w:noProof/>
             <w:webHidden/>
           </w:rPr>
-          <w:instrText xml:space="preserve"> PAGEREF _Toc241606859 \h </w:instrText>
+          <w:instrText xml:space="preserve"> PAGEREF _Toc241697854 \h </w:instrText>
         </w:r>
         <w:r>
           <w:rPr>
@@ -1229,7 +1229,7 @@
           <w:noProof/>
         </w:rPr>
       </w:pPr>
-      <w:hyperlink w:anchor="_Toc241606860" w:history="1">
+      <w:hyperlink w:anchor="_Toc241697855" w:history="1">
         <w:r>
           <w:rPr>
             <w:rStyle w:val="Hyperlink"/>
@@ -1256,7 +1256,7 @@
             <w:noProof/>
             <w:webHidden/>
           </w:rPr>
-          <w:instrText xml:space="preserve"> PAGEREF _Toc241606860 \h </w:instrText>
+          <w:instrText xml:space="preserve"> PAGEREF _Toc241697855 \h </w:instrText>
         </w:r>
         <w:r>
           <w:rPr>
@@ -1297,7 +1297,7 @@
           <w:noProof/>
         </w:rPr>
       </w:pPr>
-      <w:hyperlink w:anchor="_Toc241606861" w:history="1">
+      <w:hyperlink w:anchor="_Toc241697856" w:history="1">
         <w:r>
           <w:rPr>
             <w:rStyle w:val="Hyperlink"/>
@@ -1324,7 +1324,7 @@
             <w:noProof/>
             <w:webHidden/>
           </w:rPr>
-          <w:instrText xml:space="preserve"> PAGEREF _Toc241606861 \h </w:instrText>
+          <w:instrText xml:space="preserve"> PAGEREF _Toc241697856 \h </w:instrText>
         </w:r>
         <w:r>
           <w:rPr>
@@ -1365,7 +1365,7 @@
           <w:noProof/>
         </w:rPr>
       </w:pPr>
-      <w:hyperlink w:anchor="_Toc241606862" w:history="1">
+      <w:hyperlink w:anchor="_Toc241697857" w:history="1">
         <w:r>
           <w:rPr>
             <w:rStyle w:val="Hyperlink"/>
@@ -1392,7 +1392,7 @@
             <w:noProof/>
             <w:webHidden/>
           </w:rPr>
-          <w:instrText xml:space="preserve"> PAGEREF _Toc241606862 \h </w:instrText>
+          <w:instrText xml:space="preserve"> PAGEREF _Toc241697857 \h </w:instrText>
         </w:r>
         <w:r>
           <w:rPr>
@@ -1433,7 +1433,7 @@
           <w:noProof/>
         </w:rPr>
       </w:pPr>
-      <w:hyperlink w:anchor="_Toc241606863" w:history="1">
+      <w:hyperlink w:anchor="_Toc241697858" w:history="1">
         <w:r>
           <w:rPr>
             <w:rStyle w:val="Hyperlink"/>
@@ -1460,7 +1460,7 @@
             <w:noProof/>
             <w:webHidden/>
           </w:rPr>
-          <w:instrText xml:space="preserve"> PAGEREF _Toc241606863 \h </w:instrText>
+          <w:instrText xml:space="preserve"> PAGEREF _Toc241697858 \h </w:instrText>
         </w:r>
         <w:r>
           <w:rPr>
@@ -1501,7 +1501,7 @@
           <w:noProof/>
         </w:rPr>
       </w:pPr>
-      <w:hyperlink w:anchor="_Toc241606864" w:history="1">
+      <w:hyperlink w:anchor="_Toc241697859" w:history="1">
         <w:r>
           <w:rPr>
             <w:rStyle w:val="Hyperlink"/>
@@ -1528,7 +1528,7 @@
             <w:noProof/>
             <w:webHidden/>
           </w:rPr>
-          <w:instrText xml:space="preserve"> PAGEREF _Toc241606864 \h </w:instrText>
+          <w:instrText xml:space="preserve"> PAGEREF _Toc241697859 \h </w:instrText>
         </w:r>
         <w:r>
           <w:rPr>
@@ -1569,7 +1569,7 @@
           <w:noProof/>
         </w:rPr>
       </w:pPr>
-      <w:hyperlink w:anchor="_Toc241606865" w:history="1">
+      <w:hyperlink w:anchor="_Toc241697860" w:history="1">
         <w:r>
           <w:rPr>
             <w:rStyle w:val="Hyperlink"/>
@@ -1596,7 +1596,7 @@
             <w:noProof/>
             <w:webHidden/>
           </w:rPr>
-          <w:instrText xml:space="preserve"> PAGEREF _Toc241606865 \h </w:instrText>
+          <w:instrText xml:space="preserve"> PAGEREF _Toc241697860 \h </w:instrText>
         </w:r>
         <w:r>
           <w:rPr>
@@ -1637,7 +1637,7 @@
           <w:noProof/>
         </w:rPr>
       </w:pPr>
-      <w:hyperlink w:anchor="_Toc241606866" w:history="1">
+      <w:hyperlink w:anchor="_Toc241697861" w:history="1">
         <w:r>
           <w:rPr>
             <w:rStyle w:val="Hyperlink"/>
@@ -1664,7 +1664,7 @@
             <w:noProof/>
             <w:webHidden/>
           </w:rPr>
-          <w:instrText xml:space="preserve"> PAGEREF _Toc241606866 \h </w:instrText>
+          <w:instrText xml:space="preserve"> PAGEREF _Toc241697861 \h </w:instrText>
         </w:r>
         <w:r>
           <w:rPr>
@@ -1705,7 +1705,7 @@
           <w:noProof/>
         </w:rPr>
       </w:pPr>
-      <w:hyperlink w:anchor="_Toc241606867" w:history="1">
+      <w:hyperlink w:anchor="_Toc241697862" w:history="1">
         <w:r>
           <w:rPr>
             <w:rStyle w:val="Hyperlink"/>
@@ -1732,7 +1732,7 @@
             <w:noProof/>
             <w:webHidden/>
           </w:rPr>
-          <w:instrText xml:space="preserve"> PAGEREF _Toc241606867 \h </w:instrText>
+          <w:instrText xml:space="preserve"> PAGEREF _Toc241697862 \h </w:instrText>
         </w:r>
         <w:r>
           <w:rPr>
@@ -1773,7 +1773,7 @@
           <w:noProof/>
         </w:rPr>
       </w:pPr>
-      <w:hyperlink w:anchor="_Toc241606868" w:history="1">
+      <w:hyperlink w:anchor="_Toc241697863" w:history="1">
         <w:r>
           <w:rPr>
             <w:rStyle w:val="Hyperlink"/>
@@ -1800,7 +1800,7 @@
             <w:noProof/>
             <w:webHidden/>
           </w:rPr>
-          <w:instrText xml:space="preserve"> PAGEREF _Toc241606868 \h </w:instrText>
+          <w:instrText xml:space="preserve"> PAGEREF _Toc241697863 \h </w:instrText>
         </w:r>
         <w:r>
           <w:rPr>
@@ -1841,13 +1841,13 @@
           <w:noProof/>
         </w:rPr>
       </w:pPr>
-      <w:hyperlink w:anchor="_Toc241606869" w:history="1">
+      <w:hyperlink w:anchor="_Toc241697864" w:history="1">
         <w:r>
           <w:rPr>
             <w:rStyle w:val="Hyperlink"/>
             <w:noProof/>
           </w:rPr>
-          <w:t>4. Complete and print</w:t>
+          <w:t>4. Complete the sale</w:t>
         </w:r>
         <w:r>
           <w:rPr>
@@ -1868,7 +1868,7 @@
             <w:noProof/>
             <w:webHidden/>
           </w:rPr>
-          <w:instrText xml:space="preserve"> PAGEREF _Toc241606869 \h </w:instrText>
+          <w:instrText xml:space="preserve"> PAGEREF _Toc241697864 \h </w:instrText>
         </w:r>
         <w:r>
           <w:rPr>
@@ -1909,7 +1909,7 @@
           <w:noProof/>
         </w:rPr>
       </w:pPr>
-      <w:hyperlink w:anchor="_Toc241606870" w:history="1">
+      <w:hyperlink w:anchor="_Toc241697865" w:history="1">
         <w:r>
           <w:rPr>
             <w:rStyle w:val="Hyperlink"/>
@@ -1936,7 +1936,7 @@
             <w:noProof/>
             <w:webHidden/>
           </w:rPr>
-          <w:instrText xml:space="preserve"> PAGEREF _Toc241606870 \h </w:instrText>
+          <w:instrText xml:space="preserve"> PAGEREF _Toc241697865 \h </w:instrText>
         </w:r>
         <w:r>
           <w:rPr>
@@ -1977,7 +1977,7 @@
           <w:noProof/>
         </w:rPr>
       </w:pPr>
-      <w:hyperlink w:anchor="_Toc241606871" w:history="1">
+      <w:hyperlink w:anchor="_Toc241697866" w:history="1">
         <w:r>
           <w:rPr>
             <w:rStyle w:val="Hyperlink"/>
@@ -2004,7 +2004,75 @@
             <w:noProof/>
             <w:webHidden/>
           </w:rPr>
-          <w:instrText xml:space="preserve"> PAGEREF _Toc241606871 \h </w:instrText>
+          <w:instrText xml:space="preserve"> PAGEREF _Toc241697866 \h </w:instrText>
+        </w:r>
+        <w:r>
+          <w:rPr>
+            <w:noProof/>
+            <w:webHidden/>
+          </w:rPr>
+        </w:r>
+        <w:r>
+          <w:rPr>
+            <w:noProof/>
+            <w:webHidden/>
+          </w:rPr>
+          <w:fldChar w:fldCharType="separate"/>
+        </w:r>
+        <w:r>
+          <w:rPr>
+            <w:noProof/>
+            <w:webHidden/>
+          </w:rPr>
+          <w:t>19</w:t>
+        </w:r>
+        <w:r>
+          <w:rPr>
+            <w:noProof/>
+            <w:webHidden/>
+          </w:rPr>
+          <w:fldChar w:fldCharType="end"/>
+        </w:r>
+      </w:hyperlink>
+    </w:p>
+    <w:p>
+      <w:pPr>
+        <w:pStyle w:val="TOC2"/>
+        <w:tabs>
+          <w:tab w:val="right" w:leader="dot" w:pos="9350"/>
+        </w:tabs>
+        <w:rPr>
+          <w:noProof/>
+        </w:rPr>
+      </w:pPr>
+      <w:hyperlink w:anchor="_Toc241697867" w:history="1">
+        <w:r>
+          <w:rPr>
+            <w:rStyle w:val="Hyperlink"/>
+            <w:noProof/>
+          </w:rPr>
+          <w:t>Emailing a receipt</w:t>
+        </w:r>
+        <w:r>
+          <w:rPr>
+            <w:noProof/>
+            <w:webHidden/>
+          </w:rPr>
+          <w:tab/>
+        </w:r>
+        <w:r>
+          <w:rPr>
+            <w:noProof/>
+            <w:webHidden/>
+          </w:rPr>
+          <w:fldChar w:fldCharType="begin"/>
+        </w:r>
+        <w:r>
+          <w:rPr>
+            <w:noProof/>
+            <w:webHidden/>
+          </w:rPr>
+          <w:instrText xml:space="preserve"> PAGEREF _Toc241697867 \h </w:instrText>
         </w:r>
         <w:r>
           <w:rPr>
@@ -2045,7 +2113,7 @@
           <w:noProof/>
         </w:rPr>
       </w:pPr>
-      <w:hyperlink w:anchor="_Toc241606872" w:history="1">
+      <w:hyperlink w:anchor="_Toc241697868" w:history="1">
         <w:r>
           <w:rPr>
             <w:rStyle w:val="Hyperlink"/>
@@ -2072,7 +2140,7 @@
             <w:noProof/>
             <w:webHidden/>
           </w:rPr>
-          <w:instrText xml:space="preserve"> PAGEREF _Toc241606872 \h </w:instrText>
+          <w:instrText xml:space="preserve"> PAGEREF _Toc241697868 \h </w:instrText>
         </w:r>
         <w:r>
           <w:rPr>
@@ -2092,7 +2160,7 @@
             <w:noProof/>
             <w:webHidden/>
           </w:rPr>
-          <w:t>20</w:t>
+          <w:t>21</w:t>
         </w:r>
         <w:r>
           <w:rPr>
@@ -2113,7 +2181,7 @@
           <w:noProof/>
         </w:rPr>
       </w:pPr>
-      <w:hyperlink w:anchor="_Toc241606873" w:history="1">
+      <w:hyperlink w:anchor="_Toc241697869" w:history="1">
         <w:r>
           <w:rPr>
             <w:rStyle w:val="Hyperlink"/>
@@ -2140,7 +2208,7 @@
             <w:noProof/>
             <w:webHidden/>
           </w:rPr>
-          <w:instrText xml:space="preserve"> PAGEREF _Toc241606873 \h </w:instrText>
+          <w:instrText xml:space="preserve"> PAGEREF _Toc241697869 \h </w:instrText>
         </w:r>
         <w:r>
           <w:rPr>
@@ -2160,7 +2228,7 @@
             <w:noProof/>
             <w:webHidden/>
           </w:rPr>
-          <w:t>20</w:t>
+          <w:t>21</w:t>
         </w:r>
         <w:r>
           <w:rPr>
@@ -2181,7 +2249,7 @@
           <w:noProof/>
         </w:rPr>
       </w:pPr>
-      <w:hyperlink w:anchor="_Toc241606874" w:history="1">
+      <w:hyperlink w:anchor="_Toc241697870" w:history="1">
         <w:r>
           <w:rPr>
             <w:rStyle w:val="Hyperlink"/>
@@ -2208,7 +2276,7 @@
             <w:noProof/>
             <w:webHidden/>
           </w:rPr>
-          <w:instrText xml:space="preserve"> PAGEREF _Toc241606874 \h </w:instrText>
+          <w:instrText xml:space="preserve"> PAGEREF _Toc241697870 \h </w:instrText>
         </w:r>
         <w:r>
           <w:rPr>
@@ -2228,7 +2296,7 @@
             <w:noProof/>
             <w:webHidden/>
           </w:rPr>
-          <w:t>22</w:t>
+          <w:t>23</w:t>
         </w:r>
         <w:r>
           <w:rPr>
@@ -2249,7 +2317,7 @@
           <w:noProof/>
         </w:rPr>
       </w:pPr>
-      <w:hyperlink w:anchor="_Toc241606875" w:history="1">
+      <w:hyperlink w:anchor="_Toc241697871" w:history="1">
         <w:r>
           <w:rPr>
             <w:rStyle w:val="Hyperlink"/>
@@ -2276,7 +2344,7 @@
             <w:noProof/>
             <w:webHidden/>
           </w:rPr>
-          <w:instrText xml:space="preserve"> PAGEREF _Toc241606875 \h </w:instrText>
+          <w:instrText xml:space="preserve"> PAGEREF _Toc241697871 \h </w:instrText>
         </w:r>
         <w:r>
           <w:rPr>
@@ -2296,7 +2364,7 @@
             <w:noProof/>
             <w:webHidden/>
           </w:rPr>
-          <w:t>24</w:t>
+          <w:t>25</w:t>
         </w:r>
         <w:r>
           <w:rPr>
@@ -2317,7 +2385,7 @@
           <w:noProof/>
         </w:rPr>
       </w:pPr>
-      <w:hyperlink w:anchor="_Toc241606876" w:history="1">
+      <w:hyperlink w:anchor="_Toc241697872" w:history="1">
         <w:r>
           <w:rPr>
             <w:rStyle w:val="Hyperlink"/>
@@ -2344,7 +2412,7 @@
             <w:noProof/>
             <w:webHidden/>
           </w:rPr>
-          <w:instrText xml:space="preserve"> PAGEREF _Toc241606876 \h </w:instrText>
+          <w:instrText xml:space="preserve"> PAGEREF _Toc241697872 \h </w:instrText>
         </w:r>
         <w:r>
           <w:rPr>
@@ -2364,7 +2432,7 @@
             <w:noProof/>
             <w:webHidden/>
           </w:rPr>
-          <w:t>24</w:t>
+          <w:t>25</w:t>
         </w:r>
         <w:r>
           <w:rPr>
@@ -2385,7 +2453,7 @@
           <w:noProof/>
         </w:rPr>
       </w:pPr>
-      <w:hyperlink w:anchor="_Toc241606877" w:history="1">
+      <w:hyperlink w:anchor="_Toc241697873" w:history="1">
         <w:r>
           <w:rPr>
             <w:rStyle w:val="Hyperlink"/>
@@ -2412,7 +2480,7 @@
             <w:noProof/>
             <w:webHidden/>
           </w:rPr>
-          <w:instrText xml:space="preserve"> PAGEREF _Toc241606877 \h </w:instrText>
+          <w:instrText xml:space="preserve"> PAGEREF _Toc241697873 \h </w:instrText>
         </w:r>
         <w:r>
           <w:rPr>
@@ -2432,7 +2500,7 @@
             <w:noProof/>
             <w:webHidden/>
           </w:rPr>
-          <w:t>24</w:t>
+          <w:t>25</w:t>
         </w:r>
         <w:r>
           <w:rPr>
@@ -2453,7 +2521,7 @@
           <w:noProof/>
         </w:rPr>
       </w:pPr>
-      <w:hyperlink w:anchor="_Toc241606878" w:history="1">
+      <w:hyperlink w:anchor="_Toc241697874" w:history="1">
         <w:r>
           <w:rPr>
             <w:rStyle w:val="Hyperlink"/>
@@ -2480,7 +2548,7 @@
             <w:noProof/>
             <w:webHidden/>
           </w:rPr>
-          <w:instrText xml:space="preserve"> PAGEREF _Toc241606878 \h </w:instrText>
+          <w:instrText xml:space="preserve"> PAGEREF _Toc241697874 \h </w:instrText>
         </w:r>
         <w:r>
           <w:rPr>
@@ -2500,7 +2568,7 @@
             <w:noProof/>
             <w:webHidden/>
           </w:rPr>
-          <w:t>25</w:t>
+          <w:t>26</w:t>
         </w:r>
         <w:r>
           <w:rPr>
@@ -2521,7 +2589,7 @@
           <w:noProof/>
         </w:rPr>
       </w:pPr>
-      <w:hyperlink w:anchor="_Toc241606879" w:history="1">
+      <w:hyperlink w:anchor="_Toc241697875" w:history="1">
         <w:r>
           <w:rPr>
             <w:rStyle w:val="Hyperlink"/>
@@ -2548,7 +2616,7 @@
             <w:noProof/>
             <w:webHidden/>
           </w:rPr>
-          <w:instrText xml:space="preserve"> PAGEREF _Toc241606879 \h </w:instrText>
+          <w:instrText xml:space="preserve"> PAGEREF _Toc241697875 \h </w:instrText>
         </w:r>
         <w:r>
           <w:rPr>
@@ -2568,7 +2636,7 @@
             <w:noProof/>
             <w:webHidden/>
           </w:rPr>
-          <w:t>26</w:t>
+          <w:t>27</w:t>
         </w:r>
         <w:r>
           <w:rPr>
@@ -2589,7 +2657,7 @@
           <w:noProof/>
         </w:rPr>
       </w:pPr>
-      <w:hyperlink w:anchor="_Toc241606880" w:history="1">
+      <w:hyperlink w:anchor="_Toc241697876" w:history="1">
         <w:r>
           <w:rPr>
             <w:rStyle w:val="Hyperlink"/>
@@ -2616,7 +2684,7 @@
             <w:noProof/>
             <w:webHidden/>
           </w:rPr>
-          <w:instrText xml:space="preserve"> PAGEREF _Toc241606880 \h </w:instrText>
+          <w:instrText xml:space="preserve"> PAGEREF _Toc241697876 \h </w:instrText>
         </w:r>
         <w:r>
           <w:rPr>
@@ -2636,7 +2704,7 @@
             <w:noProof/>
             <w:webHidden/>
           </w:rPr>
-          <w:t>26</w:t>
+          <w:t>27</w:t>
         </w:r>
         <w:r>
           <w:rPr>
@@ -2657,7 +2725,7 @@
           <w:noProof/>
         </w:rPr>
       </w:pPr>
-      <w:hyperlink w:anchor="_Toc241606881" w:history="1">
+      <w:hyperlink w:anchor="_Toc241697877" w:history="1">
         <w:r>
           <w:rPr>
             <w:rStyle w:val="Hyperlink"/>
@@ -2684,7 +2752,7 @@
             <w:noProof/>
             <w:webHidden/>
           </w:rPr>
-          <w:instrText xml:space="preserve"> PAGEREF _Toc241606881 \h </w:instrText>
+          <w:instrText xml:space="preserve"> PAGEREF _Toc241697877 \h </w:instrText>
         </w:r>
         <w:r>
           <w:rPr>
@@ -2704,7 +2772,7 @@
             <w:noProof/>
             <w:webHidden/>
           </w:rPr>
-          <w:t>26</w:t>
+          <w:t>27</w:t>
         </w:r>
         <w:r>
           <w:rPr>
@@ -2725,7 +2793,7 @@
           <w:noProof/>
         </w:rPr>
       </w:pPr>
-      <w:hyperlink w:anchor="_Toc241606882" w:history="1">
+      <w:hyperlink w:anchor="_Toc241697878" w:history="1">
         <w:r>
           <w:rPr>
             <w:rStyle w:val="Hyperlink"/>
@@ -2752,7 +2820,7 @@
             <w:noProof/>
             <w:webHidden/>
           </w:rPr>
-          <w:instrText xml:space="preserve"> PAGEREF _Toc241606882 \h </w:instrText>
+          <w:instrText xml:space="preserve"> PAGEREF _Toc241697878 \h </w:instrText>
         </w:r>
         <w:r>
           <w:rPr>
@@ -2772,7 +2840,7 @@
             <w:noProof/>
             <w:webHidden/>
           </w:rPr>
-          <w:t>28</w:t>
+          <w:t>29</w:t>
         </w:r>
         <w:r>
           <w:rPr>
@@ -2793,7 +2861,7 @@
           <w:noProof/>
         </w:rPr>
       </w:pPr>
-      <w:hyperlink w:anchor="_Toc241606883" w:history="1">
+      <w:hyperlink w:anchor="_Toc241697879" w:history="1">
         <w:r>
           <w:rPr>
             <w:rStyle w:val="Hyperlink"/>
@@ -2820,7 +2888,7 @@
             <w:noProof/>
             <w:webHidden/>
           </w:rPr>
-          <w:instrText xml:space="preserve"> PAGEREF _Toc241606883 \h </w:instrText>
+          <w:instrText xml:space="preserve"> PAGEREF _Toc241697879 \h </w:instrText>
         </w:r>
         <w:r>
           <w:rPr>
@@ -2840,7 +2908,7 @@
             <w:noProof/>
             <w:webHidden/>
           </w:rPr>
-          <w:t>28</w:t>
+          <w:t>29</w:t>
         </w:r>
         <w:r>
           <w:rPr>
@@ -2861,7 +2929,7 @@
           <w:noProof/>
         </w:rPr>
       </w:pPr>
-      <w:hyperlink w:anchor="_Toc241606884" w:history="1">
+      <w:hyperlink w:anchor="_Toc241697880" w:history="1">
         <w:r>
           <w:rPr>
             <w:rStyle w:val="Hyperlink"/>
@@ -2888,7 +2956,7 @@
             <w:noProof/>
             <w:webHidden/>
           </w:rPr>
-          <w:instrText xml:space="preserve"> PAGEREF _Toc241606884 \h </w:instrText>
+          <w:instrText xml:space="preserve"> PAGEREF _Toc241697880 \h </w:instrText>
         </w:r>
         <w:r>
           <w:rPr>
@@ -2908,7 +2976,7 @@
             <w:noProof/>
             <w:webHidden/>
           </w:rPr>
-          <w:t>29</w:t>
+          <w:t>30</w:t>
         </w:r>
         <w:r>
           <w:rPr>
@@ -2929,7 +2997,7 @@
           <w:noProof/>
         </w:rPr>
       </w:pPr>
-      <w:hyperlink w:anchor="_Toc241606885" w:history="1">
+      <w:hyperlink w:anchor="_Toc241697881" w:history="1">
         <w:r>
           <w:rPr>
             <w:rStyle w:val="Hyperlink"/>
@@ -2956,7 +3024,7 @@
             <w:noProof/>
             <w:webHidden/>
           </w:rPr>
-          <w:instrText xml:space="preserve"> PAGEREF _Toc241606885 \h </w:instrText>
+          <w:instrText xml:space="preserve"> PAGEREF _Toc241697881 \h </w:instrText>
         </w:r>
         <w:r>
           <w:rPr>
@@ -2976,7 +3044,7 @@
             <w:noProof/>
             <w:webHidden/>
           </w:rPr>
-          <w:t>29</w:t>
+          <w:t>30</w:t>
         </w:r>
         <w:r>
           <w:rPr>
@@ -2997,7 +3065,7 @@
           <w:noProof/>
         </w:rPr>
       </w:pPr>
-      <w:hyperlink w:anchor="_Toc241606886" w:history="1">
+      <w:hyperlink w:anchor="_Toc241697882" w:history="1">
         <w:r>
           <w:rPr>
             <w:rStyle w:val="Hyperlink"/>
@@ -3024,7 +3092,7 @@
             <w:noProof/>
             <w:webHidden/>
           </w:rPr>
-          <w:instrText xml:space="preserve"> PAGEREF _Toc241606886 \h </w:instrText>
+          <w:instrText xml:space="preserve"> PAGEREF _Toc241697882 \h </w:instrText>
         </w:r>
         <w:r>
           <w:rPr>
@@ -3044,7 +3112,7 @@
             <w:noProof/>
             <w:webHidden/>
           </w:rPr>
-          <w:t>31</w:t>
+          <w:t>33</w:t>
         </w:r>
         <w:r>
           <w:rPr>
@@ -3065,7 +3133,7 @@
           <w:noProof/>
         </w:rPr>
       </w:pPr>
-      <w:hyperlink w:anchor="_Toc241606887" w:history="1">
+      <w:hyperlink w:anchor="_Toc241697883" w:history="1">
         <w:r>
           <w:rPr>
             <w:rStyle w:val="Hyperlink"/>
@@ -3092,7 +3160,7 @@
             <w:noProof/>
             <w:webHidden/>
           </w:rPr>
-          <w:instrText xml:space="preserve"> PAGEREF _Toc241606887 \h </w:instrText>
+          <w:instrText xml:space="preserve"> PAGEREF _Toc241697883 \h </w:instrText>
         </w:r>
         <w:r>
           <w:rPr>
@@ -3112,7 +3180,7 @@
             <w:noProof/>
             <w:webHidden/>
           </w:rPr>
-          <w:t>32</w:t>
+          <w:t>34</w:t>
         </w:r>
         <w:r>
           <w:rPr>
@@ -3133,7 +3201,7 @@
           <w:noProof/>
         </w:rPr>
       </w:pPr>
-      <w:hyperlink w:anchor="_Toc241606888" w:history="1">
+      <w:hyperlink w:anchor="_Toc241697884" w:history="1">
         <w:r>
           <w:rPr>
             <w:rStyle w:val="Hyperlink"/>
@@ -3160,7 +3228,7 @@
             <w:noProof/>
             <w:webHidden/>
           </w:rPr>
-          <w:instrText xml:space="preserve"> PAGEREF _Toc241606888 \h </w:instrText>
+          <w:instrText xml:space="preserve"> PAGEREF _Toc241697884 \h </w:instrText>
         </w:r>
         <w:r>
           <w:rPr>
@@ -3180,7 +3248,7 @@
             <w:noProof/>
             <w:webHidden/>
           </w:rPr>
-          <w:t>33</w:t>
+          <w:t>35</w:t>
         </w:r>
         <w:r>
           <w:rPr>
@@ -3201,7 +3269,7 @@
           <w:noProof/>
         </w:rPr>
       </w:pPr>
-      <w:hyperlink w:anchor="_Toc241606889" w:history="1">
+      <w:hyperlink w:anchor="_Toc241697885" w:history="1">
         <w:r>
           <w:rPr>
             <w:rStyle w:val="Hyperlink"/>
@@ -3228,7 +3296,7 @@
             <w:noProof/>
             <w:webHidden/>
           </w:rPr>
-          <w:instrText xml:space="preserve"> PAGEREF _Toc241606889 \h </w:instrText>
+          <w:instrText xml:space="preserve"> PAGEREF _Toc241697885 \h </w:instrText>
         </w:r>
         <w:r>
           <w:rPr>
@@ -3248,7 +3316,7 @@
             <w:noProof/>
             <w:webHidden/>
           </w:rPr>
-          <w:t>35</w:t>
+          <w:t>37</w:t>
         </w:r>
         <w:r>
           <w:rPr>
@@ -3269,7 +3337,7 @@
           <w:noProof/>
         </w:rPr>
       </w:pPr>
-      <w:hyperlink w:anchor="_Toc241606890" w:history="1">
+      <w:hyperlink w:anchor="_Toc241697886" w:history="1">
         <w:r>
           <w:rPr>
             <w:rStyle w:val="Hyperlink"/>
@@ -3296,7 +3364,7 @@
             <w:noProof/>
             <w:webHidden/>
           </w:rPr>
-          <w:instrText xml:space="preserve"> PAGEREF _Toc241606890 \h </w:instrText>
+          <w:instrText xml:space="preserve"> PAGEREF _Toc241697886 \h </w:instrText>
         </w:r>
         <w:r>
           <w:rPr>
@@ -3316,7 +3384,7 @@
             <w:noProof/>
             <w:webHidden/>
           </w:rPr>
-          <w:t>36</w:t>
+          <w:t>39</w:t>
         </w:r>
         <w:r>
           <w:rPr>
@@ -3337,7 +3405,7 @@
           <w:noProof/>
         </w:rPr>
       </w:pPr>
-      <w:hyperlink w:anchor="_Toc241606891" w:history="1">
+      <w:hyperlink w:anchor="_Toc241697887" w:history="1">
         <w:r>
           <w:rPr>
             <w:rStyle w:val="Hyperlink"/>
@@ -3364,7 +3432,7 @@
             <w:noProof/>
             <w:webHidden/>
           </w:rPr>
-          <w:instrText xml:space="preserve"> PAGEREF _Toc241606891 \h </w:instrText>
+          <w:instrText xml:space="preserve"> PAGEREF _Toc241697887 \h </w:instrText>
         </w:r>
         <w:r>
           <w:rPr>
@@ -3384,7 +3452,7 @@
             <w:noProof/>
             <w:webHidden/>
           </w:rPr>
-          <w:t>38</w:t>
+          <w:t>41</w:t>
         </w:r>
         <w:r>
           <w:rPr>
@@ -3405,7 +3473,7 @@
           <w:noProof/>
         </w:rPr>
       </w:pPr>
-      <w:hyperlink w:anchor="_Toc241606892" w:history="1">
+      <w:hyperlink w:anchor="_Toc241697888" w:history="1">
         <w:r>
           <w:rPr>
             <w:rStyle w:val="Hyperlink"/>
@@ -3432,7 +3500,7 @@
             <w:noProof/>
             <w:webHidden/>
           </w:rPr>
-          <w:instrText xml:space="preserve"> PAGEREF _Toc241606892 \h </w:instrText>
+          <w:instrText xml:space="preserve"> PAGEREF _Toc241697888 \h </w:instrText>
         </w:r>
         <w:r>
           <w:rPr>
@@ -3452,7 +3520,7 @@
             <w:noProof/>
             <w:webHidden/>
           </w:rPr>
-          <w:t>40</w:t>
+          <w:t>43</w:t>
         </w:r>
         <w:r>
           <w:rPr>
@@ -3473,7 +3541,7 @@
           <w:noProof/>
         </w:rPr>
       </w:pPr>
-      <w:hyperlink w:anchor="_Toc241606893" w:history="1">
+      <w:hyperlink w:anchor="_Toc241697889" w:history="1">
         <w:r>
           <w:rPr>
             <w:rStyle w:val="Hyperlink"/>
@@ -3500,7 +3568,7 @@
             <w:noProof/>
             <w:webHidden/>
           </w:rPr>
-          <w:instrText xml:space="preserve"> PAGEREF _Toc241606893 \h </w:instrText>
+          <w:instrText xml:space="preserve"> PAGEREF _Toc241697889 \h </w:instrText>
         </w:r>
         <w:r>
           <w:rPr>
@@ -3520,7 +3588,7 @@
             <w:noProof/>
             <w:webHidden/>
           </w:rPr>
-          <w:t>40</w:t>
+          <w:t>43</w:t>
         </w:r>
         <w:r>
           <w:rPr>
@@ -3541,7 +3609,7 @@
           <w:noProof/>
         </w:rPr>
       </w:pPr>
-      <w:hyperlink w:anchor="_Toc241606894" w:history="1">
+      <w:hyperlink w:anchor="_Toc241697890" w:history="1">
         <w:r>
           <w:rPr>
             <w:rStyle w:val="Hyperlink"/>
@@ -3568,7 +3636,7 @@
             <w:noProof/>
             <w:webHidden/>
           </w:rPr>
-          <w:instrText xml:space="preserve"> PAGEREF _Toc241606894 \h </w:instrText>
+          <w:instrText xml:space="preserve"> PAGEREF _Toc241697890 \h </w:instrText>
         </w:r>
         <w:r>
           <w:rPr>
@@ -3588,7 +3656,7 @@
             <w:noProof/>
             <w:webHidden/>
           </w:rPr>
-          <w:t>40</w:t>
+          <w:t>43</w:t>
         </w:r>
         <w:r>
           <w:rPr>
@@ -3609,7 +3677,7 @@
           <w:noProof/>
         </w:rPr>
       </w:pPr>
-      <w:hyperlink w:anchor="_Toc241606895" w:history="1">
+      <w:hyperlink w:anchor="_Toc241697891" w:history="1">
         <w:r>
           <w:rPr>
             <w:rStyle w:val="Hyperlink"/>
@@ -3636,7 +3704,7 @@
             <w:noProof/>
             <w:webHidden/>
           </w:rPr>
-          <w:instrText xml:space="preserve"> PAGEREF _Toc241606895 \h </w:instrText>
+          <w:instrText xml:space="preserve"> PAGEREF _Toc241697891 \h </w:instrText>
         </w:r>
         <w:r>
           <w:rPr>
@@ -3656,7 +3724,7 @@
             <w:noProof/>
             <w:webHidden/>
           </w:rPr>
-          <w:t>40</w:t>
+          <w:t>43</w:t>
         </w:r>
         <w:r>
           <w:rPr>
@@ -3677,7 +3745,7 @@
           <w:noProof/>
         </w:rPr>
       </w:pPr>
-      <w:hyperlink w:anchor="_Toc241606896" w:history="1">
+      <w:hyperlink w:anchor="_Toc241697892" w:history="1">
         <w:r>
           <w:rPr>
             <w:rStyle w:val="Hyperlink"/>
@@ -3704,7 +3772,7 @@
             <w:noProof/>
             <w:webHidden/>
           </w:rPr>
-          <w:instrText xml:space="preserve"> PAGEREF _Toc241606896 \h </w:instrText>
+          <w:instrText xml:space="preserve"> PAGEREF _Toc241697892 \h </w:instrText>
         </w:r>
         <w:r>
           <w:rPr>
@@ -3724,7 +3792,7 @@
             <w:noProof/>
             <w:webHidden/>
           </w:rPr>
-          <w:t>40</w:t>
+          <w:t>43</w:t>
         </w:r>
         <w:r>
           <w:rPr>
@@ -3745,7 +3813,7 @@
         <w:pStyle w:val="Heading1"/>
         <w:pageBreakBefore/>
       </w:pPr>
-      <w:bookmarkStart w:id="0" w:name="_Toc241606847"/>
+      <w:bookmarkStart w:id="0" w:name="_Toc241697842"/>
       <w:r>
         <w:lastRenderedPageBreak/>
         <w:t>Welcome</w:t>
@@ -3761,7 +3829,7 @@
       <w:pPr>
         <w:pStyle w:val="Heading2"/>
       </w:pPr>
-      <w:bookmarkStart w:id="1" w:name="_Toc241606848"/>
+      <w:bookmarkStart w:id="1" w:name="_Toc241697843"/>
       <w:r>
         <w:t>How a sale moves through the app</w:t>
       </w:r>
@@ -4057,10 +4125,10 @@
               <w:rPr>
                 <w:b/>
               </w:rPr>
-              <w:t>Complete &amp; print</w:t>
+              <w:t>Complete sale</w:t>
             </w:r>
             <w:r>
-              <w:t>.</w:t>
+              <w:t xml:space="preserve"> and prints or emails the sales sheet.</w:t>
             </w:r>
           </w:p>
         </w:tc>
@@ -4143,7 +4211,7 @@
               <w:spacing w:after="0"/>
             </w:pPr>
             <w:r>
-              <w:t>The sales sheet prints, and the sale counts toward the dashboard totals.</w:t>
+              <w:t>The sales sheet can be printed or emailed to the customer, and the sale counts toward the dashboard totals.</w:t>
             </w:r>
           </w:p>
         </w:tc>
@@ -4244,7 +4312,7 @@
       <w:pPr>
         <w:pStyle w:val="Heading2"/>
       </w:pPr>
-      <w:bookmarkStart w:id="2" w:name="_Toc241606849"/>
+      <w:bookmarkStart w:id="2" w:name="_Toc241697844"/>
       <w:r>
         <w:t>What you'll need</w:t>
       </w:r>
@@ -4353,7 +4421,7 @@
         <w:pStyle w:val="Heading1"/>
         <w:pageBreakBefore/>
       </w:pPr>
-      <w:bookmarkStart w:id="3" w:name="_Toc241606850"/>
+      <w:bookmarkStart w:id="3" w:name="_Toc241697845"/>
       <w:r>
         <w:lastRenderedPageBreak/>
         <w:t>Who can do what</w:t>
@@ -4921,7 +4989,7 @@
         <w:pStyle w:val="Heading1"/>
         <w:pageBreakBefore/>
       </w:pPr>
-      <w:bookmarkStart w:id="4" w:name="_Toc241606851"/>
+      <w:bookmarkStart w:id="4" w:name="_Toc241697846"/>
       <w:r>
         <w:lastRenderedPageBreak/>
         <w:t>Getting started</w:t>
@@ -4932,7 +5000,7 @@
       <w:pPr>
         <w:pStyle w:val="Heading2"/>
       </w:pPr>
-      <w:bookmarkStart w:id="5" w:name="_Toc241606852"/>
+      <w:bookmarkStart w:id="5" w:name="_Toc241697847"/>
       <w:r>
         <w:t>Signing in</w:t>
       </w:r>
@@ -4949,7 +5017,7 @@
           <w:noProof/>
         </w:rPr>
         <w:drawing>
-          <wp:inline distT="0" distB="0" distL="0" distR="0" wp14:anchorId="428A0859" wp14:editId="446F15A0">
+          <wp:inline distT="0" distB="0" distL="0" distR="0" wp14:anchorId="73FCEEE9" wp14:editId="49665934">
             <wp:extent cx="3291840" cy="2211705"/>
             <wp:effectExtent l="0" t="0" r="0" b="0"/>
             <wp:docPr id="1" name="Picture 1"/>
@@ -5267,7 +5335,7 @@
       <w:pPr>
         <w:pStyle w:val="Heading2"/>
       </w:pPr>
-      <w:bookmarkStart w:id="6" w:name="_Toc241606853"/>
+      <w:bookmarkStart w:id="6" w:name="_Toc241697848"/>
       <w:r>
         <w:t>Changing your PIN</w:t>
       </w:r>
@@ -5449,7 +5517,7 @@
       <w:pPr>
         <w:pStyle w:val="Heading2"/>
       </w:pPr>
-      <w:bookmarkStart w:id="7" w:name="_Toc241606854"/>
+      <w:bookmarkStart w:id="7" w:name="_Toc241697849"/>
       <w:r>
         <w:lastRenderedPageBreak/>
         <w:t>Finding your way around</w:t>
@@ -6032,7 +6100,7 @@
       <w:pPr>
         <w:pStyle w:val="Heading2"/>
       </w:pPr>
-      <w:bookmarkStart w:id="8" w:name="_Toc241606855"/>
+      <w:bookmarkStart w:id="8" w:name="_Toc241697850"/>
       <w:r>
         <w:t>Light and dark mode</w:t>
       </w:r>
@@ -6047,7 +6115,7 @@
       <w:pPr>
         <w:pStyle w:val="Heading2"/>
       </w:pPr>
-      <w:bookmarkStart w:id="9" w:name="_Toc241606856"/>
+      <w:bookmarkStart w:id="9" w:name="_Toc241697851"/>
       <w:r>
         <w:t>Signing out</w:t>
       </w:r>
@@ -6072,7 +6140,7 @@
         <w:pStyle w:val="Heading1"/>
         <w:pageBreakBefore/>
       </w:pPr>
-      <w:bookmarkStart w:id="10" w:name="_Toc241606857"/>
+      <w:bookmarkStart w:id="10" w:name="_Toc241697852"/>
       <w:r>
         <w:lastRenderedPageBreak/>
         <w:t>Taking an order on the sales floor</w:t>
@@ -6104,7 +6172,7 @@
           <w:noProof/>
         </w:rPr>
         <w:drawing>
-          <wp:inline distT="0" distB="0" distL="0" distR="0" wp14:anchorId="749D660D" wp14:editId="5560F323">
+          <wp:inline distT="0" distB="0" distL="0" distR="0" wp14:anchorId="767903C4" wp14:editId="1B927B47">
             <wp:extent cx="5760720" cy="3870484"/>
             <wp:effectExtent l="0" t="0" r="0" b="0"/>
             <wp:docPr id="2" name="Picture 2"/>
@@ -6229,7 +6297,7 @@
       <w:pPr>
         <w:pStyle w:val="Heading2"/>
       </w:pPr>
-      <w:bookmarkStart w:id="11" w:name="_Toc241606858"/>
+      <w:bookmarkStart w:id="11" w:name="_Toc241697853"/>
       <w:r>
         <w:t>Starting an order</w:t>
       </w:r>
@@ -6313,7 +6381,7 @@
       <w:pPr>
         <w:pStyle w:val="Heading2"/>
       </w:pPr>
-      <w:bookmarkStart w:id="12" w:name="_Toc241606859"/>
+      <w:bookmarkStart w:id="12" w:name="_Toc241697854"/>
       <w:r>
         <w:lastRenderedPageBreak/>
         <w:t>Adding items</w:t>
@@ -6462,7 +6530,7 @@
           <w:noProof/>
         </w:rPr>
         <w:drawing>
-          <wp:inline distT="0" distB="0" distL="0" distR="0" wp14:anchorId="035C6DA5" wp14:editId="0BE703F3">
+          <wp:inline distT="0" distB="0" distL="0" distR="0" wp14:anchorId="5D901D0C" wp14:editId="7CB72F6B">
             <wp:extent cx="5760720" cy="3870484"/>
             <wp:effectExtent l="0" t="0" r="0" b="0"/>
             <wp:docPr id="3" name="Picture 3"/>
@@ -6599,7 +6667,7 @@
           <w:noProof/>
         </w:rPr>
         <w:drawing>
-          <wp:inline distT="0" distB="0" distL="0" distR="0" wp14:anchorId="388F2CD0" wp14:editId="67B6EF7E">
+          <wp:inline distT="0" distB="0" distL="0" distR="0" wp14:anchorId="1AA328D0" wp14:editId="006180AB">
             <wp:extent cx="5760720" cy="3870484"/>
             <wp:effectExtent l="0" t="0" r="0" b="0"/>
             <wp:docPr id="4" name="Picture 4"/>
@@ -6944,7 +7012,7 @@
         </w:rPr>
         <w:lastRenderedPageBreak/>
         <w:drawing>
-          <wp:inline distT="0" distB="0" distL="0" distR="0" wp14:anchorId="700E9CFF" wp14:editId="7BA9D5E0">
+          <wp:inline distT="0" distB="0" distL="0" distR="0" wp14:anchorId="3791D013" wp14:editId="6FE84C55">
             <wp:extent cx="5486400" cy="3686175"/>
             <wp:effectExtent l="0" t="0" r="0" b="0"/>
             <wp:docPr id="5" name="Picture 5"/>
@@ -7144,7 +7212,7 @@
       <w:pPr>
         <w:pStyle w:val="Heading2"/>
       </w:pPr>
-      <w:bookmarkStart w:id="13" w:name="_Toc241606860"/>
+      <w:bookmarkStart w:id="13" w:name="_Toc241697855"/>
       <w:r>
         <w:t>Adding shipping or a service later</w:t>
       </w:r>
@@ -7185,7 +7253,7 @@
         </w:rPr>
         <w:lastRenderedPageBreak/>
         <w:drawing>
-          <wp:inline distT="0" distB="0" distL="0" distR="0" wp14:anchorId="3D7EDA4D" wp14:editId="4689936A">
+          <wp:inline distT="0" distB="0" distL="0" distR="0" wp14:anchorId="3DC54287" wp14:editId="53961360">
             <wp:extent cx="4754880" cy="3194685"/>
             <wp:effectExtent l="0" t="0" r="0" b="0"/>
             <wp:docPr id="6" name="Picture 6"/>
@@ -7239,7 +7307,7 @@
       <w:pPr>
         <w:pStyle w:val="Heading2"/>
       </w:pPr>
-      <w:bookmarkStart w:id="14" w:name="_Toc241606861"/>
+      <w:bookmarkStart w:id="14" w:name="_Toc241697856"/>
       <w:r>
         <w:t>Changing or removing an item</w:t>
       </w:r>
@@ -7386,7 +7454,7 @@
       <w:pPr>
         <w:pStyle w:val="Heading2"/>
       </w:pPr>
-      <w:bookmarkStart w:id="15" w:name="_Toc241606862"/>
+      <w:bookmarkStart w:id="15" w:name="_Toc241697857"/>
       <w:r>
         <w:t>Customer details</w:t>
       </w:r>
@@ -7550,7 +7618,7 @@
           <w:noProof/>
         </w:rPr>
         <w:drawing>
-          <wp:inline distT="0" distB="0" distL="0" distR="0" wp14:anchorId="26E92260" wp14:editId="58D880AF">
+          <wp:inline distT="0" distB="0" distL="0" distR="0" wp14:anchorId="3F723E04" wp14:editId="1CC1E7C3">
             <wp:extent cx="4754880" cy="3194685"/>
             <wp:effectExtent l="0" t="0" r="0" b="0"/>
             <wp:docPr id="7" name="Picture 7"/>
@@ -7604,7 +7672,7 @@
       <w:pPr>
         <w:pStyle w:val="Heading2"/>
       </w:pPr>
-      <w:bookmarkStart w:id="16" w:name="_Toc241606863"/>
+      <w:bookmarkStart w:id="16" w:name="_Toc241697858"/>
       <w:r>
         <w:t>Sending the order to checkout</w:t>
       </w:r>
@@ -7782,7 +7850,7 @@
       <w:pPr>
         <w:pStyle w:val="Heading2"/>
       </w:pPr>
-      <w:bookmarkStart w:id="17" w:name="_Toc241606864"/>
+      <w:bookmarkStart w:id="17" w:name="_Toc241697859"/>
       <w:r>
         <w:lastRenderedPageBreak/>
         <w:t>Using a phone</w:t>
@@ -7800,7 +7868,7 @@
           <w:noProof/>
         </w:rPr>
         <w:drawing>
-          <wp:inline distT="0" distB="0" distL="0" distR="0" wp14:anchorId="04CDA22E" wp14:editId="5FD361B3">
+          <wp:inline distT="0" distB="0" distL="0" distR="0" wp14:anchorId="55E4E22E" wp14:editId="48C5DD58">
             <wp:extent cx="2194560" cy="4749253"/>
             <wp:effectExtent l="0" t="0" r="0" b="0"/>
             <wp:docPr id="8" name="Picture 8"/>
@@ -7878,7 +7946,7 @@
         <w:pStyle w:val="Heading1"/>
         <w:pageBreakBefore/>
       </w:pPr>
-      <w:bookmarkStart w:id="18" w:name="_Toc241606865"/>
+      <w:bookmarkStart w:id="18" w:name="_Toc241697860"/>
       <w:r>
         <w:lastRenderedPageBreak/>
         <w:t>Checking out a customer</w:t>
@@ -7919,7 +7987,7 @@
           <w:noProof/>
         </w:rPr>
         <w:drawing>
-          <wp:inline distT="0" distB="0" distL="0" distR="0" wp14:anchorId="4B580990" wp14:editId="0B73A49E">
+          <wp:inline distT="0" distB="0" distL="0" distR="0" wp14:anchorId="69C9629E" wp14:editId="6DD92595">
             <wp:extent cx="5760720" cy="3870484"/>
             <wp:effectExtent l="0" t="0" r="0" b="0"/>
             <wp:docPr id="9" name="Picture 9"/>
@@ -7973,7 +8041,7 @@
       <w:pPr>
         <w:pStyle w:val="Heading2"/>
       </w:pPr>
-      <w:bookmarkStart w:id="19" w:name="_Toc241606866"/>
+      <w:bookmarkStart w:id="19" w:name="_Toc241697861"/>
       <w:r>
         <w:t>1. Review the order with the customer</w:t>
       </w:r>
@@ -8070,7 +8138,7 @@
       <w:pPr>
         <w:pStyle w:val="Heading2"/>
       </w:pPr>
-      <w:bookmarkStart w:id="20" w:name="_Toc241606867"/>
+      <w:bookmarkStart w:id="20" w:name="_Toc241697862"/>
       <w:r>
         <w:t>2. Take payment</w:t>
       </w:r>
@@ -8384,7 +8452,7 @@
       <w:pPr>
         <w:pStyle w:val="Heading2"/>
       </w:pPr>
-      <w:bookmarkStart w:id="21" w:name="_Toc241606868"/>
+      <w:bookmarkStart w:id="21" w:name="_Toc241697863"/>
       <w:r>
         <w:t>3. Acknowledgements (initials and signature)</w:t>
       </w:r>
@@ -8566,7 +8634,7 @@
         </w:rPr>
         <w:lastRenderedPageBreak/>
         <w:drawing>
-          <wp:inline distT="0" distB="0" distL="0" distR="0" wp14:anchorId="6E7F09ED" wp14:editId="1AACC2B5">
+          <wp:inline distT="0" distB="0" distL="0" distR="0" wp14:anchorId="3E83AB55" wp14:editId="5C50AC6D">
             <wp:extent cx="4937760" cy="3317558"/>
             <wp:effectExtent l="0" t="0" r="0" b="0"/>
             <wp:docPr id="10" name="Picture 10"/>
@@ -8675,7 +8743,7 @@
               <w:rPr>
                 <w:b/>
               </w:rPr>
-              <w:t>Complete &amp; print</w:t>
+              <w:t>Complete sale</w:t>
             </w:r>
             <w:r>
               <w:t xml:space="preserve"> stays greyed out until the customer has confirmed their details, initialled every point and signed. If anyone changes the customer's name, address, phone, email or delivery address afterwards, the customer has to confirm their details again.</w:t>
@@ -8693,9 +8761,9 @@
       <w:pPr>
         <w:pStyle w:val="Heading2"/>
       </w:pPr>
-      <w:bookmarkStart w:id="22" w:name="_Toc241606869"/>
-      <w:r>
-        <w:t>4. Complete and print</w:t>
+      <w:bookmarkStart w:id="22" w:name="_Toc241697864"/>
+      <w:r>
+        <w:t>4. Complete the sale</w:t>
       </w:r>
       <w:bookmarkEnd w:id="22"/>
     </w:p>
@@ -8707,10 +8775,28 @@
         <w:rPr>
           <w:b/>
         </w:rPr>
-        <w:t>Complete &amp; print</w:t>
-      </w:r>
-      <w:r>
-        <w:t xml:space="preserve">. The order is marked complete, moves into the day's totals, and the sales sheet opens with the print window already showing. Choose your printer (or </w:t>
+        <w:t>Complete sale</w:t>
+      </w:r>
+      <w:r>
+        <w:t>. The order is marked complete, moves into the day's totals, and its sales sheet opens. From there:</w:t>
+      </w:r>
+    </w:p>
+    <w:p>
+      <w:pPr>
+        <w:pStyle w:val="ListBullet"/>
+        <w:spacing w:after="60"/>
+      </w:pPr>
+      <w:r>
+        <w:t xml:space="preserve">Tap </w:t>
+      </w:r>
+      <w:r>
+        <w:rPr>
+          <w:b/>
+        </w:rPr>
+        <w:t>Print</w:t>
+      </w:r>
+      <w:r>
+        <w:t xml:space="preserve"> to print the customer's copy (or choose </w:t>
       </w:r>
       <w:r>
         <w:rPr>
@@ -8719,7 +8805,30 @@
         <w:t>Save as PDF</w:t>
       </w:r>
       <w:r>
-        <w:t xml:space="preserve">), then tap </w:t>
+        <w:t xml:space="preserve"> as the printer).</w:t>
+      </w:r>
+    </w:p>
+    <w:p>
+      <w:pPr>
+        <w:pStyle w:val="ListBullet"/>
+        <w:spacing w:after="60"/>
+      </w:pPr>
+      <w:r>
+        <w:t xml:space="preserve">Tap </w:t>
+      </w:r>
+      <w:r>
+        <w:rPr>
+          <w:b/>
+        </w:rPr>
+        <w:t>Email</w:t>
+      </w:r>
+      <w:r>
+        <w:t xml:space="preserve"> to send the customer a copy by email instead of, or as well as, a printed one (see *Emailing a receipt*).</w:t>
+      </w:r>
+    </w:p>
+    <w:p>
+      <w:r>
+        <w:t xml:space="preserve">When you're done, tap </w:t>
       </w:r>
       <w:r>
         <w:rPr>
@@ -8840,7 +8949,11 @@
               <w:t xml:space="preserve">Important:  </w:t>
             </w:r>
             <w:r>
-              <w:t xml:space="preserve">If another customer took the last one while this order was waiting, the app says the item is out of stock and won't complete the order yet. Change that item to ship instead: remove its </w:t>
+              <w:t xml:space="preserve">If another customer took the last one while this order was waiting, the app says the </w:t>
+            </w:r>
+            <w:r>
+              <w:lastRenderedPageBreak/>
+              <w:t xml:space="preserve">item is out of stock and won't complete the order yet. Change that item to ship instead: remove its </w:t>
             </w:r>
             <w:r>
               <w:rPr>
@@ -8864,7 +8977,7 @@
               <w:rPr>
                 <w:b/>
               </w:rPr>
-              <w:t>Complete &amp; print</w:t>
+              <w:t>Complete sale</w:t>
             </w:r>
             <w:r>
               <w:t xml:space="preserve"> again.</w:t>
@@ -8882,9 +8995,8 @@
       <w:pPr>
         <w:pStyle w:val="Heading2"/>
       </w:pPr>
-      <w:bookmarkStart w:id="23" w:name="_Toc241606870"/>
-      <w:r>
-        <w:lastRenderedPageBreak/>
+      <w:bookmarkStart w:id="23" w:name="_Toc241697865"/>
+      <w:r>
         <w:t>Other checkout actions</w:t>
       </w:r>
       <w:bookmarkEnd w:id="23"/>
@@ -9093,7 +9205,7 @@
         <w:pStyle w:val="Heading1"/>
         <w:pageBreakBefore/>
       </w:pPr>
-      <w:bookmarkStart w:id="24" w:name="_Toc241606871"/>
+      <w:bookmarkStart w:id="24" w:name="_Toc241697866"/>
       <w:r>
         <w:lastRenderedPageBreak/>
         <w:t>The sales sheet</w:t>
@@ -9116,7 +9228,7 @@
           <w:noProof/>
         </w:rPr>
         <w:drawing>
-          <wp:inline distT="0" distB="0" distL="0" distR="0" wp14:anchorId="70B66C19" wp14:editId="215DECD3">
+          <wp:inline distT="0" distB="0" distL="0" distR="0" wp14:anchorId="1DF3B58E" wp14:editId="2988C7E7">
             <wp:extent cx="4023360" cy="3187256"/>
             <wp:effectExtent l="0" t="0" r="0" b="0"/>
             <wp:docPr id="11" name="Picture 11"/>
@@ -9282,28 +9394,122 @@
     </w:p>
     <w:p>
       <w:pPr>
-        <w:pStyle w:val="Heading1"/>
-        <w:pageBreakBefore/>
-      </w:pPr>
-      <w:bookmarkStart w:id="25" w:name="_Toc241606872"/>
-      <w:r>
-        <w:lastRenderedPageBreak/>
-        <w:t>Looking up orders</w:t>
+        <w:pStyle w:val="Heading2"/>
+      </w:pPr>
+      <w:bookmarkStart w:id="25" w:name="_Toc241697867"/>
+      <w:r>
+        <w:t>Emailing a receipt</w:t>
       </w:r>
       <w:bookmarkEnd w:id="25"/>
     </w:p>
     <w:p>
       <w:r>
+        <w:t>A customer who would rather have their receipt by email (or wants both) can get one from any completed sales sheet.</w:t>
+      </w:r>
+    </w:p>
+    <w:p>
+      <w:pPr>
+        <w:tabs>
+          <w:tab w:val="left" w:pos="504"/>
+        </w:tabs>
+        <w:spacing w:after="80"/>
+        <w:ind w:left="504" w:hanging="432"/>
+      </w:pPr>
+      <w:r>
+        <w:rPr>
+          <w:b/>
+          <w:color w:val="0369A1"/>
+        </w:rPr>
+        <w:t>1.</w:t>
+      </w:r>
+      <w:r>
+        <w:rPr>
+          <w:b/>
+          <w:color w:val="0369A1"/>
+        </w:rPr>
+        <w:tab/>
+      </w:r>
+      <w:r>
+        <w:t xml:space="preserve">Open the sales sheet: it opens by itself when checkout completes a sale, or tap </w:t>
+      </w:r>
+      <w:r>
+        <w:rPr>
+          <w:b/>
+        </w:rPr>
+        <w:t>Sales sheet</w:t>
+      </w:r>
+      <w:r>
+        <w:t xml:space="preserve"> on the Orders screen.</w:t>
+      </w:r>
+    </w:p>
+    <w:p>
+      <w:pPr>
+        <w:tabs>
+          <w:tab w:val="left" w:pos="504"/>
+        </w:tabs>
+        <w:spacing w:after="80"/>
+        <w:ind w:left="504" w:hanging="432"/>
+      </w:pPr>
+      <w:r>
+        <w:rPr>
+          <w:b/>
+          <w:color w:val="0369A1"/>
+        </w:rPr>
+        <w:t>2.</w:t>
+      </w:r>
+      <w:r>
+        <w:rPr>
+          <w:b/>
+          <w:color w:val="0369A1"/>
+        </w:rPr>
+        <w:tab/>
+      </w:r>
+      <w:r>
         <w:t xml:space="preserve">Tap </w:t>
       </w:r>
       <w:r>
         <w:rPr>
           <w:b/>
         </w:rPr>
-        <w:t>Orders</w:t>
-      </w:r>
-      <w:r>
-        <w:t xml:space="preserve"> to see every order for the current fundraiser. Anyone can use this screen to find an order and reprint its sales sheet.</w:t>
+        <w:t>Email</w:t>
+      </w:r>
+      <w:r>
+        <w:t>. The customer's email address from the order is already filled in.</w:t>
+      </w:r>
+    </w:p>
+    <w:p>
+      <w:pPr>
+        <w:tabs>
+          <w:tab w:val="left" w:pos="504"/>
+        </w:tabs>
+        <w:spacing w:after="80"/>
+        <w:ind w:left="504" w:hanging="432"/>
+      </w:pPr>
+      <w:r>
+        <w:rPr>
+          <w:b/>
+          <w:color w:val="0369A1"/>
+        </w:rPr>
+        <w:t>3.</w:t>
+      </w:r>
+      <w:r>
+        <w:rPr>
+          <w:b/>
+          <w:color w:val="0369A1"/>
+        </w:rPr>
+        <w:tab/>
+      </w:r>
+      <w:r>
+        <w:t xml:space="preserve">Check the address with the customer, change it if needed, and tap </w:t>
+      </w:r>
+      <w:r>
+        <w:rPr>
+          <w:b/>
+        </w:rPr>
+        <w:t>Send</w:t>
+      </w:r>
+      <w:r>
+        <w:t>.</w:t>
       </w:r>
     </w:p>
     <w:p>
@@ -9316,11 +9522,166 @@
         <w:rPr>
           <w:noProof/>
         </w:rPr>
+        <w:lastRenderedPageBreak/>
         <w:drawing>
-          <wp:inline distT="0" distB="0" distL="0" distR="0" wp14:anchorId="2B532A4D" wp14:editId="308AA909">
+          <wp:inline distT="0" distB="0" distL="0" distR="0" wp14:anchorId="7F69AF0C" wp14:editId="146D602A">
+            <wp:extent cx="4572000" cy="3071812"/>
+            <wp:effectExtent l="0" t="0" r="0" b="0"/>
+            <wp:docPr id="12" name="Picture 12"/>
+            <wp:cNvGraphicFramePr>
+              <a:graphicFrameLocks xmlns:a="http://schemas.openxmlformats.org/drawingml/2006/main" noChangeAspect="1"/>
+            </wp:cNvGraphicFramePr>
+            <a:graphic xmlns:a="http://schemas.openxmlformats.org/drawingml/2006/main">
+              <a:graphicData uri="http://schemas.openxmlformats.org/drawingml/2006/picture">
+                <pic:pic xmlns:pic="http://schemas.openxmlformats.org/drawingml/2006/picture">
+                  <pic:nvPicPr>
+                    <pic:cNvPr id="0" name="34_email_receipt.png"/>
+                    <pic:cNvPicPr/>
+                  </pic:nvPicPr>
+                  <pic:blipFill>
+                    <a:blip r:embed="rId20"/>
+                    <a:stretch>
+                      <a:fillRect/>
+                    </a:stretch>
+                  </pic:blipFill>
+                  <pic:spPr>
+                    <a:xfrm>
+                      <a:off x="0" y="0"/>
+                      <a:ext cx="4572000" cy="3071812"/>
+                    </a:xfrm>
+                    <a:prstGeom prst="rect">
+                      <a:avLst/>
+                    </a:prstGeom>
+                  </pic:spPr>
+                </pic:pic>
+              </a:graphicData>
+            </a:graphic>
+          </wp:inline>
+        </w:drawing>
+      </w:r>
+    </w:p>
+    <w:p>
+      <w:pPr>
+        <w:spacing w:after="200"/>
+        <w:jc w:val="center"/>
+      </w:pPr>
+      <w:r>
+        <w:rPr>
+          <w:i/>
+          <w:color w:val="6B7280"/>
+          <w:sz w:val="18"/>
+        </w:rPr>
+        <w:t>Emailing the customer their receipt</w:t>
+      </w:r>
+    </w:p>
+    <w:p>
+      <w:r>
+        <w:t>The customer gets a neat copy of their sales sheet: the items with any notes, shipping, totals, payments, the warranty and delivery terms, and the customer service number.</w:t>
+      </w:r>
+    </w:p>
+    <w:tbl>
+      <w:tblPr>
+        <w:tblW w:w="0" w:type="auto"/>
+        <w:jc w:val="center"/>
+        <w:tblLook w:val="04A0" w:firstRow="1" w:lastRow="0" w:firstColumn="1" w:lastColumn="0" w:noHBand="0" w:noVBand="1"/>
+      </w:tblPr>
+      <w:tblGrid>
+        <w:gridCol w:w="9360"/>
+      </w:tblGrid>
+      <w:tr>
+        <w:trPr>
+          <w:jc w:val="center"/>
+        </w:trPr>
+        <w:tc>
+          <w:tcPr>
+            <w:tcW w:w="9360" w:type="dxa"/>
+            <w:tcBorders>
+              <w:top w:val="single" w:sz="4" w:space="0" w:color="F3F4F6"/>
+              <w:left w:val="single" w:sz="36" w:space="0" w:color="6B7280"/>
+              <w:bottom w:val="single" w:sz="4" w:space="0" w:color="F3F4F6"/>
+              <w:right w:val="single" w:sz="4" w:space="0" w:color="F3F4F6"/>
+            </w:tcBorders>
+            <w:shd w:val="clear" w:color="auto" w:fill="F3F4F6"/>
+            <w:tcMar>
+              <w:top w:w="120" w:type="dxa"/>
+              <w:left w:w="200" w:type="dxa"/>
+              <w:bottom w:w="120" w:type="dxa"/>
+              <w:right w:w="160" w:type="dxa"/>
+            </w:tcMar>
+          </w:tcPr>
+          <w:p>
+            <w:pPr>
+              <w:spacing w:after="0"/>
+            </w:pPr>
+            <w:r>
+              <w:rPr>
+                <w:b/>
+                <w:color w:val="6B7280"/>
+              </w:rPr>
+              <w:t xml:space="preserve">Good to know:  </w:t>
+            </w:r>
+            <w:r>
+              <w:t xml:space="preserve">The </w:t>
+            </w:r>
+            <w:r>
+              <w:rPr>
+                <w:b/>
+              </w:rPr>
+              <w:t>Email</w:t>
+            </w:r>
+            <w:r>
+              <w:t xml:space="preserve"> button only shows on completed sales. If it says email isn't set up yet, the app hasn't been connected to an email account. Print the receipt instead and let an administrator know.</w:t>
+            </w:r>
+          </w:p>
+        </w:tc>
+      </w:tr>
+    </w:tbl>
+    <w:p>
+      <w:pPr>
+        <w:spacing w:after="40"/>
+      </w:pPr>
+    </w:p>
+    <w:p>
+      <w:pPr>
+        <w:pStyle w:val="Heading1"/>
+        <w:pageBreakBefore/>
+      </w:pPr>
+      <w:bookmarkStart w:id="26" w:name="_Toc241697868"/>
+      <w:r>
+        <w:lastRenderedPageBreak/>
+        <w:t>Looking up orders</w:t>
+      </w:r>
+      <w:bookmarkEnd w:id="26"/>
+    </w:p>
+    <w:p>
+      <w:r>
+        <w:t xml:space="preserve">Tap </w:t>
+      </w:r>
+      <w:r>
+        <w:rPr>
+          <w:b/>
+        </w:rPr>
+        <w:t>Orders</w:t>
+      </w:r>
+      <w:r>
+        <w:t xml:space="preserve"> to see every order for the current fundraiser. Anyone can use this screen to find an order and reprint its sales sheet.</w:t>
+      </w:r>
+    </w:p>
+    <w:p>
+      <w:pPr>
+        <w:keepNext/>
+        <w:spacing w:after="40"/>
+        <w:jc w:val="center"/>
+      </w:pPr>
+      <w:r>
+        <w:rPr>
+          <w:noProof/>
+        </w:rPr>
+        <w:drawing>
+          <wp:inline distT="0" distB="0" distL="0" distR="0" wp14:anchorId="430EE806" wp14:editId="2DE813EF">
             <wp:extent cx="5760720" cy="3870484"/>
             <wp:effectExtent l="0" t="0" r="0" b="0"/>
-            <wp:docPr id="12" name="Picture 12"/>
+            <wp:docPr id="13" name="Picture 13"/>
             <wp:cNvGraphicFramePr>
               <a:graphicFrameLocks xmlns:a="http://schemas.openxmlformats.org/drawingml/2006/main" noChangeAspect="1"/>
             </wp:cNvGraphicFramePr>
@@ -9332,7 +9693,7 @@
                     <pic:cNvPicPr/>
                   </pic:nvPicPr>
                   <pic:blipFill>
-                    <a:blip r:embed="rId20"/>
+                    <a:blip r:embed="rId21"/>
                     <a:stretch>
                       <a:fillRect/>
                     </a:stretch>
@@ -9412,7 +9773,7 @@
         <w:t>Sales sheet</w:t>
       </w:r>
       <w:r>
-        <w:t xml:space="preserve"> on any order to view or print it.</w:t>
+        <w:t xml:space="preserve"> on any order to view, print or email it.</w:t>
       </w:r>
     </w:p>
     <w:p>
@@ -9437,11 +9798,11 @@
       <w:pPr>
         <w:pStyle w:val="Heading2"/>
       </w:pPr>
-      <w:bookmarkStart w:id="26" w:name="_Toc241606873"/>
+      <w:bookmarkStart w:id="27" w:name="_Toc241697869"/>
       <w:r>
         <w:t>Extra options for admins</w:t>
       </w:r>
-      <w:bookmarkEnd w:id="26"/>
+      <w:bookmarkEnd w:id="27"/>
     </w:p>
     <w:p>
       <w:pPr>
@@ -9527,10 +9888,10 @@
         </w:rPr>
         <w:lastRenderedPageBreak/>
         <w:drawing>
-          <wp:inline distT="0" distB="0" distL="0" distR="0" wp14:anchorId="528388AC" wp14:editId="1B1F167D">
+          <wp:inline distT="0" distB="0" distL="0" distR="0" wp14:anchorId="3B5184ED" wp14:editId="41654E6A">
             <wp:extent cx="4754880" cy="3194685"/>
             <wp:effectExtent l="0" t="0" r="0" b="0"/>
-            <wp:docPr id="13" name="Picture 13"/>
+            <wp:docPr id="14" name="Picture 14"/>
             <wp:cNvGraphicFramePr>
               <a:graphicFrameLocks xmlns:a="http://schemas.openxmlformats.org/drawingml/2006/main" noChangeAspect="1"/>
             </wp:cNvGraphicFramePr>
@@ -9542,7 +9903,7 @@
                     <pic:cNvPicPr/>
                   </pic:nvPicPr>
                   <pic:blipFill>
-                    <a:blip r:embed="rId21"/>
+                    <a:blip r:embed="rId22"/>
                     <a:stretch>
                       <a:fillRect/>
                     </a:stretch>
@@ -9649,12 +10010,12 @@
         <w:pStyle w:val="Heading1"/>
         <w:pageBreakBefore/>
       </w:pPr>
-      <w:bookmarkStart w:id="27" w:name="_Toc241606874"/>
+      <w:bookmarkStart w:id="28" w:name="_Toc241697870"/>
       <w:r>
         <w:lastRenderedPageBreak/>
         <w:t>The dashboard</w:t>
       </w:r>
-      <w:bookmarkEnd w:id="27"/>
+      <w:bookmarkEnd w:id="28"/>
     </w:p>
     <w:p>
       <w:r>
@@ -9713,10 +10074,10 @@
           <w:noProof/>
         </w:rPr>
         <w:drawing>
-          <wp:inline distT="0" distB="0" distL="0" distR="0" wp14:anchorId="12AE7162" wp14:editId="49408A60">
+          <wp:inline distT="0" distB="0" distL="0" distR="0" wp14:anchorId="667E1BF0" wp14:editId="0F02A174">
             <wp:extent cx="4937760" cy="4305110"/>
             <wp:effectExtent l="0" t="0" r="0" b="0"/>
-            <wp:docPr id="14" name="Picture 14"/>
+            <wp:docPr id="15" name="Picture 15"/>
             <wp:cNvGraphicFramePr>
               <a:graphicFrameLocks xmlns:a="http://schemas.openxmlformats.org/drawingml/2006/main" noChangeAspect="1"/>
             </wp:cNvGraphicFramePr>
@@ -9728,7 +10089,7 @@
                     <pic:cNvPicPr/>
                   </pic:nvPicPr>
                   <pic:blipFill>
-                    <a:blip r:embed="rId22"/>
+                    <a:blip r:embed="rId23"/>
                     <a:stretch>
                       <a:fillRect/>
                     </a:stretch>
@@ -10359,12 +10720,12 @@
         <w:pStyle w:val="Heading1"/>
         <w:pageBreakBefore/>
       </w:pPr>
-      <w:bookmarkStart w:id="28" w:name="_Toc241606875"/>
+      <w:bookmarkStart w:id="29" w:name="_Toc241697871"/>
       <w:r>
         <w:lastRenderedPageBreak/>
         <w:t>Keeping inventory</w:t>
       </w:r>
-      <w:bookmarkEnd w:id="28"/>
+      <w:bookmarkEnd w:id="29"/>
     </w:p>
     <w:p>
       <w:r>
@@ -10418,10 +10779,10 @@
           <w:noProof/>
         </w:rPr>
         <w:drawing>
-          <wp:inline distT="0" distB="0" distL="0" distR="0" wp14:anchorId="4C09738B" wp14:editId="21A28034">
+          <wp:inline distT="0" distB="0" distL="0" distR="0" wp14:anchorId="72F89BC1" wp14:editId="467C394B">
             <wp:extent cx="5760720" cy="3870484"/>
             <wp:effectExtent l="0" t="0" r="0" b="0"/>
-            <wp:docPr id="15" name="Picture 15"/>
+            <wp:docPr id="16" name="Picture 16"/>
             <wp:cNvGraphicFramePr>
               <a:graphicFrameLocks xmlns:a="http://schemas.openxmlformats.org/drawingml/2006/main" noChangeAspect="1"/>
             </wp:cNvGraphicFramePr>
@@ -10433,7 +10794,7 @@
                     <pic:cNvPicPr/>
                   </pic:nvPicPr>
                   <pic:blipFill>
-                    <a:blip r:embed="rId23"/>
+                    <a:blip r:embed="rId24"/>
                     <a:stretch>
                       <a:fillRect/>
                     </a:stretch>
@@ -10472,11 +10833,11 @@
       <w:pPr>
         <w:pStyle w:val="Heading2"/>
       </w:pPr>
-      <w:bookmarkStart w:id="29" w:name="_Toc241606876"/>
+      <w:bookmarkStart w:id="30" w:name="_Toc241697872"/>
       <w:r>
         <w:t>What's on the screen</w:t>
       </w:r>
-      <w:bookmarkEnd w:id="29"/>
+      <w:bookmarkEnd w:id="30"/>
     </w:p>
     <w:p>
       <w:pPr>
@@ -10554,11 +10915,11 @@
       <w:pPr>
         <w:pStyle w:val="Heading2"/>
       </w:pPr>
-      <w:bookmarkStart w:id="30" w:name="_Toc241606877"/>
+      <w:bookmarkStart w:id="31" w:name="_Toc241697873"/>
       <w:r>
         <w:t>Updating a count</w:t>
       </w:r>
-      <w:bookmarkEnd w:id="30"/>
+      <w:bookmarkEnd w:id="31"/>
     </w:p>
     <w:p>
       <w:r>
@@ -10631,10 +10992,10 @@
           <w:noProof/>
         </w:rPr>
         <w:drawing>
-          <wp:inline distT="0" distB="0" distL="0" distR="0" wp14:anchorId="721D0329" wp14:editId="5E0F258B">
+          <wp:inline distT="0" distB="0" distL="0" distR="0" wp14:anchorId="26AEC797" wp14:editId="1A2BC16D">
             <wp:extent cx="5120640" cy="3440430"/>
             <wp:effectExtent l="0" t="0" r="0" b="0"/>
-            <wp:docPr id="16" name="Picture 16"/>
+            <wp:docPr id="17" name="Picture 17"/>
             <wp:cNvGraphicFramePr>
               <a:graphicFrameLocks xmlns:a="http://schemas.openxmlformats.org/drawingml/2006/main" noChangeAspect="1"/>
             </wp:cNvGraphicFramePr>
@@ -10646,7 +11007,7 @@
                     <pic:cNvPicPr/>
                   </pic:nvPicPr>
                   <pic:blipFill>
-                    <a:blip r:embed="rId24"/>
+                    <a:blip r:embed="rId25"/>
                     <a:stretch>
                       <a:fillRect/>
                     </a:stretch>
@@ -10685,11 +11046,11 @@
       <w:pPr>
         <w:pStyle w:val="Heading2"/>
       </w:pPr>
-      <w:bookmarkStart w:id="31" w:name="_Toc241606878"/>
+      <w:bookmarkStart w:id="32" w:name="_Toc241697874"/>
       <w:r>
         <w:t>What changes the count automatically</w:t>
       </w:r>
-      <w:bookmarkEnd w:id="31"/>
+      <w:bookmarkEnd w:id="32"/>
     </w:p>
     <w:tbl>
       <w:tblPr>
@@ -11089,12 +11450,12 @@
       <w:pPr>
         <w:pStyle w:val="Heading2"/>
       </w:pPr>
-      <w:bookmarkStart w:id="32" w:name="_Toc241606879"/>
+      <w:bookmarkStart w:id="33" w:name="_Toc241697875"/>
       <w:r>
         <w:lastRenderedPageBreak/>
         <w:t>Seeing the history</w:t>
       </w:r>
-      <w:bookmarkEnd w:id="32"/>
+      <w:bookmarkEnd w:id="33"/>
     </w:p>
     <w:p>
       <w:r>
@@ -11105,11 +11466,11 @@
       <w:pPr>
         <w:pStyle w:val="Heading2"/>
       </w:pPr>
-      <w:bookmarkStart w:id="33" w:name="_Toc241606880"/>
+      <w:bookmarkStart w:id="34" w:name="_Toc241697876"/>
       <w:r>
         <w:t>Notes for the inventory sheet</w:t>
       </w:r>
-      <w:bookmarkEnd w:id="33"/>
+      <w:bookmarkEnd w:id="34"/>
     </w:p>
     <w:p>
       <w:r>
@@ -11154,10 +11515,10 @@
           <w:noProof/>
         </w:rPr>
         <w:drawing>
-          <wp:inline distT="0" distB="0" distL="0" distR="0" wp14:anchorId="062023D6" wp14:editId="1A0B7028">
+          <wp:inline distT="0" distB="0" distL="0" distR="0" wp14:anchorId="1BA836B6" wp14:editId="1F479BDE">
             <wp:extent cx="5120640" cy="3440430"/>
             <wp:effectExtent l="0" t="0" r="0" b="0"/>
-            <wp:docPr id="17" name="Picture 17"/>
+            <wp:docPr id="18" name="Picture 18"/>
             <wp:cNvGraphicFramePr>
               <a:graphicFrameLocks xmlns:a="http://schemas.openxmlformats.org/drawingml/2006/main" noChangeAspect="1"/>
             </wp:cNvGraphicFramePr>
@@ -11169,7 +11530,7 @@
                     <pic:cNvPicPr/>
                   </pic:nvPicPr>
                   <pic:blipFill>
-                    <a:blip r:embed="rId25"/>
+                    <a:blip r:embed="rId26"/>
                     <a:stretch>
                       <a:fillRect/>
                     </a:stretch>
@@ -11208,11 +11569,11 @@
       <w:pPr>
         <w:pStyle w:val="Heading2"/>
       </w:pPr>
-      <w:bookmarkStart w:id="34" w:name="_Toc241606881"/>
+      <w:bookmarkStart w:id="35" w:name="_Toc241697877"/>
       <w:r>
         <w:t>Start and end counts</w:t>
       </w:r>
-      <w:bookmarkEnd w:id="34"/>
+      <w:bookmarkEnd w:id="35"/>
     </w:p>
     <w:p>
       <w:r>
@@ -11731,10 +12092,10 @@
           <w:noProof/>
         </w:rPr>
         <w:drawing>
-          <wp:inline distT="0" distB="0" distL="0" distR="0" wp14:anchorId="43DA76D6" wp14:editId="2F0DD472">
+          <wp:inline distT="0" distB="0" distL="0" distR="0" wp14:anchorId="19334C86" wp14:editId="600B5EFC">
             <wp:extent cx="5486400" cy="3686175"/>
             <wp:effectExtent l="0" t="0" r="0" b="0"/>
-            <wp:docPr id="18" name="Picture 18"/>
+            <wp:docPr id="19" name="Picture 19"/>
             <wp:cNvGraphicFramePr>
               <a:graphicFrameLocks xmlns:a="http://schemas.openxmlformats.org/drawingml/2006/main" noChangeAspect="1"/>
             </wp:cNvGraphicFramePr>
@@ -11746,7 +12107,7 @@
                     <pic:cNvPicPr/>
                   </pic:nvPicPr>
                   <pic:blipFill>
-                    <a:blip r:embed="rId26"/>
+                    <a:blip r:embed="rId27"/>
                     <a:stretch>
                       <a:fillRect/>
                     </a:stretch>
@@ -11871,12 +12232,12 @@
         <w:pStyle w:val="Heading1"/>
         <w:pageBreakBefore/>
       </w:pPr>
-      <w:bookmarkStart w:id="35" w:name="_Toc241606882"/>
+      <w:bookmarkStart w:id="36" w:name="_Toc241697878"/>
       <w:r>
         <w:lastRenderedPageBreak/>
         <w:t>Admin: setting up an event</w:t>
       </w:r>
-      <w:bookmarkEnd w:id="35"/>
+      <w:bookmarkEnd w:id="36"/>
     </w:p>
     <w:p>
       <w:r>
@@ -11896,11 +12257,11 @@
       <w:pPr>
         <w:pStyle w:val="Heading2"/>
       </w:pPr>
-      <w:bookmarkStart w:id="36" w:name="_Toc241606883"/>
+      <w:bookmarkStart w:id="37" w:name="_Toc241697879"/>
       <w:r>
         <w:t>Creating or editing an event</w:t>
       </w:r>
-      <w:bookmarkEnd w:id="36"/>
+      <w:bookmarkEnd w:id="37"/>
     </w:p>
     <w:p>
       <w:pPr>
@@ -11913,10 +12274,10 @@
           <w:noProof/>
         </w:rPr>
         <w:drawing>
-          <wp:inline distT="0" distB="0" distL="0" distR="0" wp14:anchorId="409BF80C" wp14:editId="3A87CE02">
+          <wp:inline distT="0" distB="0" distL="0" distR="0" wp14:anchorId="2F47CD21" wp14:editId="70952DD2">
             <wp:extent cx="5760720" cy="1236154"/>
             <wp:effectExtent l="0" t="0" r="0" b="0"/>
-            <wp:docPr id="19" name="Picture 19"/>
+            <wp:docPr id="20" name="Picture 20"/>
             <wp:cNvGraphicFramePr>
               <a:graphicFrameLocks xmlns:a="http://schemas.openxmlformats.org/drawingml/2006/main" noChangeAspect="1"/>
             </wp:cNvGraphicFramePr>
@@ -11928,7 +12289,7 @@
                     <pic:cNvPicPr/>
                   </pic:nvPicPr>
                   <pic:blipFill>
-                    <a:blip r:embed="rId27"/>
+                    <a:blip r:embed="rId28"/>
                     <a:stretch>
                       <a:fillRect/>
                     </a:stretch>
@@ -12253,10 +12614,10 @@
           <w:noProof/>
         </w:rPr>
         <w:drawing>
-          <wp:inline distT="0" distB="0" distL="0" distR="0" wp14:anchorId="06F700EA" wp14:editId="4CEAD0D9">
+          <wp:inline distT="0" distB="0" distL="0" distR="0" wp14:anchorId="260BD264" wp14:editId="2E931EF8">
             <wp:extent cx="3840480" cy="2580322"/>
             <wp:effectExtent l="0" t="0" r="0" b="0"/>
-            <wp:docPr id="20" name="Picture 20"/>
+            <wp:docPr id="21" name="Picture 21"/>
             <wp:cNvGraphicFramePr>
               <a:graphicFrameLocks xmlns:a="http://schemas.openxmlformats.org/drawingml/2006/main" noChangeAspect="1"/>
             </wp:cNvGraphicFramePr>
@@ -12268,7 +12629,7 @@
                     <pic:cNvPicPr/>
                   </pic:nvPicPr>
                   <pic:blipFill>
-                    <a:blip r:embed="rId28"/>
+                    <a:blip r:embed="rId29"/>
                     <a:stretch>
                       <a:fillRect/>
                     </a:stretch>
@@ -12375,11 +12736,11 @@
       <w:pPr>
         <w:pStyle w:val="Heading2"/>
       </w:pPr>
-      <w:bookmarkStart w:id="37" w:name="_Toc241606884"/>
+      <w:bookmarkStart w:id="38" w:name="_Toc241697880"/>
       <w:r>
         <w:t>Closing out an event</w:t>
       </w:r>
-      <w:bookmarkEnd w:id="37"/>
+      <w:bookmarkEnd w:id="38"/>
     </w:p>
     <w:p>
       <w:r>
@@ -12542,11 +12903,11 @@
       <w:pPr>
         <w:pStyle w:val="Heading2"/>
       </w:pPr>
-      <w:bookmarkStart w:id="38" w:name="_Toc241606885"/>
+      <w:bookmarkStart w:id="39" w:name="_Toc241697881"/>
       <w:r>
         <w:t>Event sales sheets</w:t>
       </w:r>
-      <w:bookmarkEnd w:id="38"/>
+      <w:bookmarkEnd w:id="39"/>
     </w:p>
     <w:p>
       <w:r>
@@ -12600,10 +12961,10 @@
           <w:noProof/>
         </w:rPr>
         <w:drawing>
-          <wp:inline distT="0" distB="0" distL="0" distR="0" wp14:anchorId="675AE561" wp14:editId="251E9E32">
+          <wp:inline distT="0" distB="0" distL="0" distR="0" wp14:anchorId="5D17E55C" wp14:editId="78C6EF62">
             <wp:extent cx="4389120" cy="2948940"/>
             <wp:effectExtent l="0" t="0" r="0" b="0"/>
-            <wp:docPr id="21" name="Picture 21"/>
+            <wp:docPr id="22" name="Picture 22"/>
             <wp:cNvGraphicFramePr>
               <a:graphicFrameLocks xmlns:a="http://schemas.openxmlformats.org/drawingml/2006/main" noChangeAspect="1"/>
             </wp:cNvGraphicFramePr>
@@ -12615,7 +12976,7 @@
                     <pic:cNvPicPr/>
                   </pic:nvPicPr>
                   <pic:blipFill>
-                    <a:blip r:embed="rId29"/>
+                    <a:blip r:embed="rId30"/>
                     <a:stretch>
                       <a:fillRect/>
                     </a:stretch>
@@ -12729,10 +13090,10 @@
           <w:noProof/>
         </w:rPr>
         <w:drawing>
-          <wp:inline distT="0" distB="0" distL="0" distR="0" wp14:anchorId="22A7A37B" wp14:editId="14376BD2">
+          <wp:inline distT="0" distB="0" distL="0" distR="0" wp14:anchorId="02DA7133" wp14:editId="113568E7">
             <wp:extent cx="4206240" cy="5717858"/>
             <wp:effectExtent l="0" t="0" r="0" b="0"/>
-            <wp:docPr id="22" name="Picture 22"/>
+            <wp:docPr id="23" name="Picture 23"/>
             <wp:cNvGraphicFramePr>
               <a:graphicFrameLocks xmlns:a="http://schemas.openxmlformats.org/drawingml/2006/main" noChangeAspect="1"/>
             </wp:cNvGraphicFramePr>
@@ -12744,7 +13105,7 @@
                     <pic:cNvPicPr/>
                   </pic:nvPicPr>
                   <pic:blipFill>
-                    <a:blip r:embed="rId30"/>
+                    <a:blip r:embed="rId31"/>
                     <a:stretch>
                       <a:fillRect/>
                     </a:stretch>
@@ -12811,15 +13172,27 @@
     </w:p>
     <w:p>
       <w:pPr>
-        <w:pStyle w:val="Heading1"/>
-        <w:pageBreakBefore/>
-      </w:pPr>
-      <w:bookmarkStart w:id="39" w:name="_Toc241606886"/>
+        <w:pStyle w:val="ListBullet"/>
+        <w:spacing w:after="60"/>
+      </w:pPr>
+      <w:r>
+        <w:rPr>
+          <w:b/>
+        </w:rPr>
+        <w:t>Email report</w:t>
+      </w:r>
+      <w:r>
+        <w:t>: email the whole event report to the director, treasurer or anyone else who needs it (see below).</w:t>
+      </w:r>
+    </w:p>
+    <w:p>
+      <w:pPr>
+        <w:pStyle w:val="Heading3"/>
+      </w:pPr>
       <w:r>
         <w:lastRenderedPageBreak/>
-        <w:t>Admin: managing the catalog</w:t>
-      </w:r>
-      <w:bookmarkEnd w:id="39"/>
+        <w:t>Emailing the event report</w:t>
+      </w:r>
     </w:p>
     <w:p>
       <w:r>
@@ -12829,19 +13202,19 @@
         <w:rPr>
           <w:b/>
         </w:rPr>
-        <w:t>Catalog</w:t>
-      </w:r>
-      <w:r>
-        <w:t xml:space="preserve"> to manage everything reps can sell. Use the category tabs and </w:t>
-      </w:r>
-      <w:r>
-        <w:rPr>
-          <w:b/>
-        </w:rPr>
-        <w:t>Search</w:t>
-      </w:r>
-      <w:r>
-        <w:t xml:space="preserve"> to find a product.</w:t>
+        <w:t>Email report</w:t>
+      </w:r>
+      <w:r>
+        <w:t xml:space="preserve">, type one or more email addresses (separate them with commas), add a message if you like, and tap </w:t>
+      </w:r>
+      <w:r>
+        <w:rPr>
+          <w:b/>
+        </w:rPr>
+        <w:t>Send</w:t>
+      </w:r>
+      <w:r>
+        <w:t>.</w:t>
       </w:r>
     </w:p>
     <w:p>
@@ -12855,10 +13228,164 @@
           <w:noProof/>
         </w:rPr>
         <w:drawing>
-          <wp:inline distT="0" distB="0" distL="0" distR="0" wp14:anchorId="2D300B5E" wp14:editId="2730D1D8">
+          <wp:inline distT="0" distB="0" distL="0" distR="0" wp14:anchorId="49062250" wp14:editId="0B5F30FB">
+            <wp:extent cx="4389120" cy="2948940"/>
+            <wp:effectExtent l="0" t="0" r="0" b="0"/>
+            <wp:docPr id="24" name="Picture 24"/>
+            <wp:cNvGraphicFramePr>
+              <a:graphicFrameLocks xmlns:a="http://schemas.openxmlformats.org/drawingml/2006/main" noChangeAspect="1"/>
+            </wp:cNvGraphicFramePr>
+            <a:graphic xmlns:a="http://schemas.openxmlformats.org/drawingml/2006/main">
+              <a:graphicData uri="http://schemas.openxmlformats.org/drawingml/2006/picture">
+                <pic:pic xmlns:pic="http://schemas.openxmlformats.org/drawingml/2006/picture">
+                  <pic:nvPicPr>
+                    <pic:cNvPr id="0" name="35_email_report.png"/>
+                    <pic:cNvPicPr/>
+                  </pic:nvPicPr>
+                  <pic:blipFill>
+                    <a:blip r:embed="rId32"/>
+                    <a:stretch>
+                      <a:fillRect/>
+                    </a:stretch>
+                  </pic:blipFill>
+                  <pic:spPr>
+                    <a:xfrm>
+                      <a:off x="0" y="0"/>
+                      <a:ext cx="4389120" cy="2948940"/>
+                    </a:xfrm>
+                    <a:prstGeom prst="rect">
+                      <a:avLst/>
+                    </a:prstGeom>
+                  </pic:spPr>
+                </pic:pic>
+              </a:graphicData>
+            </a:graphic>
+          </wp:inline>
+        </w:drawing>
+      </w:r>
+    </w:p>
+    <w:p>
+      <w:pPr>
+        <w:spacing w:after="200"/>
+        <w:jc w:val="center"/>
+      </w:pPr>
+      <w:r>
+        <w:rPr>
+          <w:i/>
+          <w:color w:val="6B7280"/>
+          <w:sz w:val="18"/>
+        </w:rPr>
+        <w:t>Emailing the event report to the organization</w:t>
+      </w:r>
+    </w:p>
+    <w:p>
+      <w:r>
+        <w:t>The email shows the event's totals, what was taken by card, cash, check, financing and layaway, the units sold, every completed sale, and the accessory inventory tally. The sales and inventory are also attached as spreadsheets that open in Excel.</w:t>
+      </w:r>
+    </w:p>
+    <w:tbl>
+      <w:tblPr>
+        <w:tblW w:w="0" w:type="auto"/>
+        <w:jc w:val="center"/>
+        <w:tblLook w:val="04A0" w:firstRow="1" w:lastRow="0" w:firstColumn="1" w:lastColumn="0" w:noHBand="0" w:noVBand="1"/>
+      </w:tblPr>
+      <w:tblGrid>
+        <w:gridCol w:w="9360"/>
+      </w:tblGrid>
+      <w:tr>
+        <w:trPr>
+          <w:jc w:val="center"/>
+        </w:trPr>
+        <w:tc>
+          <w:tcPr>
+            <w:tcW w:w="9360" w:type="dxa"/>
+            <w:tcBorders>
+              <w:top w:val="single" w:sz="4" w:space="0" w:color="F3F4F6"/>
+              <w:left w:val="single" w:sz="36" w:space="0" w:color="6B7280"/>
+              <w:bottom w:val="single" w:sz="4" w:space="0" w:color="F3F4F6"/>
+              <w:right w:val="single" w:sz="4" w:space="0" w:color="F3F4F6"/>
+            </w:tcBorders>
+            <w:shd w:val="clear" w:color="auto" w:fill="F3F4F6"/>
+            <w:tcMar>
+              <w:top w:w="120" w:type="dxa"/>
+              <w:left w:w="200" w:type="dxa"/>
+              <w:bottom w:w="120" w:type="dxa"/>
+              <w:right w:w="160" w:type="dxa"/>
+            </w:tcMar>
+          </w:tcPr>
+          <w:p>
+            <w:pPr>
+              <w:spacing w:after="0"/>
+            </w:pPr>
+            <w:r>
+              <w:rPr>
+                <w:b/>
+                <w:color w:val="6B7280"/>
+              </w:rPr>
+              <w:t xml:space="preserve">Good to know:  </w:t>
+            </w:r>
+            <w:r>
+              <w:t>Only completed sales are included. If any orders are still on the sales floor or waiting at checkout, the email says how many so nobody is surprised later.</w:t>
+            </w:r>
+          </w:p>
+        </w:tc>
+      </w:tr>
+    </w:tbl>
+    <w:p>
+      <w:pPr>
+        <w:spacing w:after="40"/>
+      </w:pPr>
+    </w:p>
+    <w:p>
+      <w:pPr>
+        <w:pStyle w:val="Heading1"/>
+        <w:pageBreakBefore/>
+      </w:pPr>
+      <w:bookmarkStart w:id="40" w:name="_Toc241697882"/>
+      <w:r>
+        <w:lastRenderedPageBreak/>
+        <w:t>Admin: managing the catalog</w:t>
+      </w:r>
+      <w:bookmarkEnd w:id="40"/>
+    </w:p>
+    <w:p>
+      <w:r>
+        <w:t xml:space="preserve">Tap </w:t>
+      </w:r>
+      <w:r>
+        <w:rPr>
+          <w:b/>
+        </w:rPr>
+        <w:t>Catalog</w:t>
+      </w:r>
+      <w:r>
+        <w:t xml:space="preserve"> to manage everything reps can sell. Use the category tabs and </w:t>
+      </w:r>
+      <w:r>
+        <w:rPr>
+          <w:b/>
+        </w:rPr>
+        <w:t>Search</w:t>
+      </w:r>
+      <w:r>
+        <w:t xml:space="preserve"> to find a product.</w:t>
+      </w:r>
+    </w:p>
+    <w:p>
+      <w:pPr>
+        <w:keepNext/>
+        <w:spacing w:after="40"/>
+        <w:jc w:val="center"/>
+      </w:pPr>
+      <w:r>
+        <w:rPr>
+          <w:noProof/>
+        </w:rPr>
+        <w:drawing>
+          <wp:inline distT="0" distB="0" distL="0" distR="0" wp14:anchorId="5DE6BF75" wp14:editId="784BE722">
             <wp:extent cx="5760720" cy="3870484"/>
             <wp:effectExtent l="0" t="0" r="0" b="0"/>
-            <wp:docPr id="23" name="Picture 23"/>
+            <wp:docPr id="25" name="Picture 25"/>
             <wp:cNvGraphicFramePr>
               <a:graphicFrameLocks xmlns:a="http://schemas.openxmlformats.org/drawingml/2006/main" noChangeAspect="1"/>
             </wp:cNvGraphicFramePr>
@@ -12870,7 +13397,7 @@
                     <pic:cNvPicPr/>
                   </pic:nvPicPr>
                   <pic:blipFill>
-                    <a:blip r:embed="rId31"/>
+                    <a:blip r:embed="rId33"/>
                     <a:stretch>
                       <a:fillRect/>
                     </a:stretch>
@@ -12909,12 +13436,12 @@
       <w:pPr>
         <w:pStyle w:val="Heading2"/>
       </w:pPr>
-      <w:bookmarkStart w:id="40" w:name="_Toc241606887"/>
+      <w:bookmarkStart w:id="41" w:name="_Toc241697883"/>
       <w:r>
         <w:lastRenderedPageBreak/>
         <w:t>Adding or editing a product</w:t>
       </w:r>
-      <w:bookmarkEnd w:id="40"/>
+      <w:bookmarkEnd w:id="41"/>
     </w:p>
     <w:p>
       <w:pPr>
@@ -12927,10 +13454,10 @@
           <w:noProof/>
         </w:rPr>
         <w:drawing>
-          <wp:inline distT="0" distB="0" distL="0" distR="0" wp14:anchorId="16EF03E5" wp14:editId="6A75130C">
+          <wp:inline distT="0" distB="0" distL="0" distR="0" wp14:anchorId="12EEF851" wp14:editId="74B903BB">
             <wp:extent cx="5486400" cy="3686175"/>
             <wp:effectExtent l="0" t="0" r="0" b="0"/>
-            <wp:docPr id="24" name="Picture 24"/>
+            <wp:docPr id="26" name="Picture 26"/>
             <wp:cNvGraphicFramePr>
               <a:graphicFrameLocks xmlns:a="http://schemas.openxmlformats.org/drawingml/2006/main" noChangeAspect="1"/>
             </wp:cNvGraphicFramePr>
@@ -12942,7 +13469,7 @@
                     <pic:cNvPicPr/>
                   </pic:nvPicPr>
                   <pic:blipFill>
-                    <a:blip r:embed="rId32"/>
+                    <a:blip r:embed="rId34"/>
                     <a:stretch>
                       <a:fillRect/>
                     </a:stretch>
@@ -13350,10 +13877,10 @@
         </w:rPr>
         <w:lastRenderedPageBreak/>
         <w:drawing>
-          <wp:inline distT="0" distB="0" distL="0" distR="0" wp14:anchorId="2868AFAB" wp14:editId="5327F3B5">
+          <wp:inline distT="0" distB="0" distL="0" distR="0" wp14:anchorId="78D101A2" wp14:editId="0538A8DA">
             <wp:extent cx="5120640" cy="2130933"/>
             <wp:effectExtent l="0" t="0" r="0" b="0"/>
-            <wp:docPr id="25" name="Picture 25"/>
+            <wp:docPr id="27" name="Picture 27"/>
             <wp:cNvGraphicFramePr>
               <a:graphicFrameLocks xmlns:a="http://schemas.openxmlformats.org/drawingml/2006/main" noChangeAspect="1"/>
             </wp:cNvGraphicFramePr>
@@ -13365,7 +13892,7 @@
                     <pic:cNvPicPr/>
                   </pic:nvPicPr>
                   <pic:blipFill>
-                    <a:blip r:embed="rId33"/>
+                    <a:blip r:embed="rId35"/>
                     <a:stretch>
                       <a:fillRect/>
                     </a:stretch>
@@ -13537,11 +14064,11 @@
       <w:pPr>
         <w:pStyle w:val="Heading2"/>
       </w:pPr>
-      <w:bookmarkStart w:id="41" w:name="_Toc241606888"/>
+      <w:bookmarkStart w:id="42" w:name="_Toc241697884"/>
       <w:r>
         <w:t>Delivery and services</w:t>
       </w:r>
-      <w:bookmarkEnd w:id="41"/>
+      <w:bookmarkEnd w:id="42"/>
     </w:p>
     <w:p>
       <w:r>
@@ -13569,10 +14096,10 @@
         </w:rPr>
         <w:lastRenderedPageBreak/>
         <w:drawing>
-          <wp:inline distT="0" distB="0" distL="0" distR="0" wp14:anchorId="3EBD569F" wp14:editId="00B0F2DF">
+          <wp:inline distT="0" distB="0" distL="0" distR="0" wp14:anchorId="69B2768E" wp14:editId="7E7B0ABC">
             <wp:extent cx="5760720" cy="3870484"/>
             <wp:effectExtent l="0" t="0" r="0" b="0"/>
-            <wp:docPr id="26" name="Picture 26"/>
+            <wp:docPr id="28" name="Picture 28"/>
             <wp:cNvGraphicFramePr>
               <a:graphicFrameLocks xmlns:a="http://schemas.openxmlformats.org/drawingml/2006/main" noChangeAspect="1"/>
             </wp:cNvGraphicFramePr>
@@ -13584,7 +14111,7 @@
                     <pic:cNvPicPr/>
                   </pic:nvPicPr>
                   <pic:blipFill>
-                    <a:blip r:embed="rId34"/>
+                    <a:blip r:embed="rId36"/>
                     <a:stretch>
                       <a:fillRect/>
                     </a:stretch>
@@ -13999,12 +14526,12 @@
         <w:pStyle w:val="Heading1"/>
         <w:pageBreakBefore/>
       </w:pPr>
-      <w:bookmarkStart w:id="42" w:name="_Toc241606889"/>
+      <w:bookmarkStart w:id="43" w:name="_Toc241697885"/>
       <w:r>
         <w:lastRenderedPageBreak/>
         <w:t>Admin: managing the crew</w:t>
       </w:r>
-      <w:bookmarkEnd w:id="42"/>
+      <w:bookmarkEnd w:id="43"/>
     </w:p>
     <w:p>
       <w:r>
@@ -14031,10 +14558,10 @@
           <w:noProof/>
         </w:rPr>
         <w:drawing>
-          <wp:inline distT="0" distB="0" distL="0" distR="0" wp14:anchorId="1F621813" wp14:editId="11425A30">
+          <wp:inline distT="0" distB="0" distL="0" distR="0" wp14:anchorId="5157D6BE" wp14:editId="31D60806">
             <wp:extent cx="5760720" cy="1740218"/>
             <wp:effectExtent l="0" t="0" r="0" b="0"/>
-            <wp:docPr id="27" name="Picture 27"/>
+            <wp:docPr id="29" name="Picture 29"/>
             <wp:cNvGraphicFramePr>
               <a:graphicFrameLocks xmlns:a="http://schemas.openxmlformats.org/drawingml/2006/main" noChangeAspect="1"/>
             </wp:cNvGraphicFramePr>
@@ -14046,7 +14573,7 @@
                     <pic:cNvPicPr/>
                   </pic:nvPicPr>
                   <pic:blipFill>
-                    <a:blip r:embed="rId35"/>
+                    <a:blip r:embed="rId37"/>
                     <a:stretch>
                       <a:fillRect/>
                     </a:stretch>
@@ -14303,10 +14830,10 @@
           <w:noProof/>
         </w:rPr>
         <w:drawing>
-          <wp:inline distT="0" distB="0" distL="0" distR="0" wp14:anchorId="398A94C7" wp14:editId="147A745E">
+          <wp:inline distT="0" distB="0" distL="0" distR="0" wp14:anchorId="7AFE8F37" wp14:editId="12C9244C">
             <wp:extent cx="4023360" cy="2703195"/>
             <wp:effectExtent l="0" t="0" r="0" b="0"/>
-            <wp:docPr id="28" name="Picture 28"/>
+            <wp:docPr id="30" name="Picture 30"/>
             <wp:cNvGraphicFramePr>
               <a:graphicFrameLocks xmlns:a="http://schemas.openxmlformats.org/drawingml/2006/main" noChangeAspect="1"/>
             </wp:cNvGraphicFramePr>
@@ -14318,7 +14845,7 @@
                     <pic:cNvPicPr/>
                   </pic:nvPicPr>
                   <pic:blipFill>
-                    <a:blip r:embed="rId36"/>
+                    <a:blip r:embed="rId38"/>
                     <a:stretch>
                       <a:fillRect/>
                     </a:stretch>
@@ -14364,16 +14891,31 @@
       </w:r>
     </w:p>
     <w:p>
+      <w:r>
+        <w:lastRenderedPageBreak/>
+        <w:t xml:space="preserve">An </w:t>
+      </w:r>
+      <w:r>
+        <w:rPr>
+          <w:b/>
+        </w:rPr>
+        <w:t>Owner</w:t>
+      </w:r>
+      <w:r>
+        <w:t xml:space="preserve"> also sees when each person last signed in, under their name (for example *Last login 9/30/26, 9:56 PM (2d 4h ago)*). It's a quick way to spot accounts nobody uses any more, which are worth deactivating. Staying signed in on a tablet doesn't update it - only signing in with a PIN does. Accounts that haven't signed in since this was added show *No sign-in recorded yet*.</w:t>
+      </w:r>
+    </w:p>
+    <w:p>
       <w:pPr>
         <w:pStyle w:val="Heading1"/>
         <w:pageBreakBefore/>
       </w:pPr>
-      <w:bookmarkStart w:id="43" w:name="_Toc241606890"/>
+      <w:bookmarkStart w:id="44" w:name="_Toc241697886"/>
       <w:r>
         <w:lastRenderedPageBreak/>
         <w:t>Owner: permanent deletes</w:t>
       </w:r>
-      <w:bookmarkEnd w:id="43"/>
+      <w:bookmarkEnd w:id="44"/>
     </w:p>
     <w:p>
       <w:r>
@@ -14409,10 +14951,10 @@
           <w:noProof/>
         </w:rPr>
         <w:drawing>
-          <wp:inline distT="0" distB="0" distL="0" distR="0" wp14:anchorId="38CF02AE" wp14:editId="78A6A074">
+          <wp:inline distT="0" distB="0" distL="0" distR="0" wp14:anchorId="49824011" wp14:editId="24E09874">
             <wp:extent cx="4754880" cy="3312709"/>
             <wp:effectExtent l="0" t="0" r="0" b="0"/>
-            <wp:docPr id="29" name="Picture 29"/>
+            <wp:docPr id="31" name="Picture 31"/>
             <wp:cNvGraphicFramePr>
               <a:graphicFrameLocks xmlns:a="http://schemas.openxmlformats.org/drawingml/2006/main" noChangeAspect="1"/>
             </wp:cNvGraphicFramePr>
@@ -14424,7 +14966,7 @@
                     <pic:cNvPicPr/>
                   </pic:nvPicPr>
                   <pic:blipFill>
-                    <a:blip r:embed="rId37"/>
+                    <a:blip r:embed="rId39"/>
                     <a:stretch>
                       <a:fillRect/>
                     </a:stretch>
@@ -15073,12 +15615,12 @@
         <w:pStyle w:val="Heading1"/>
         <w:pageBreakBefore/>
       </w:pPr>
-      <w:bookmarkStart w:id="44" w:name="_Toc241606891"/>
+      <w:bookmarkStart w:id="45" w:name="_Toc241697887"/>
       <w:r>
         <w:lastRenderedPageBreak/>
         <w:t>Tips and troubleshooting</w:t>
       </w:r>
-      <w:bookmarkEnd w:id="44"/>
+      <w:bookmarkEnd w:id="45"/>
     </w:p>
     <w:p>
       <w:r>
@@ -15231,7 +15773,42 @@
         <w:pStyle w:val="Heading3"/>
       </w:pPr>
       <w:r>
-        <w:t>Complete &amp; print is greyed out.</w:t>
+        <w:t>Email says email isn't set up.</w:t>
+      </w:r>
+    </w:p>
+    <w:p>
+      <w:r>
+        <w:t>The app hasn't been connected to an email account yet. Print the receipt or report instead, and ask whoever looks after the app to add the email settings.</w:t>
+      </w:r>
+    </w:p>
+    <w:p>
+      <w:pPr>
+        <w:pStyle w:val="Heading3"/>
+      </w:pPr>
+      <w:r>
+        <w:t>The customer didn't get their receipt email.</w:t>
+      </w:r>
+    </w:p>
+    <w:p>
+      <w:r>
+        <w:t xml:space="preserve">Ask them to check their junk or spam folder. Open the sales sheet, tap </w:t>
+      </w:r>
+      <w:r>
+        <w:rPr>
+          <w:b/>
+        </w:rPr>
+        <w:t>Email</w:t>
+      </w:r>
+      <w:r>
+        <w:t>, check the address carefully and send it again.</w:t>
+      </w:r>
+    </w:p>
+    <w:p>
+      <w:pPr>
+        <w:pStyle w:val="Heading3"/>
+      </w:pPr>
+      <w:r>
+        <w:t>Complete sale is greyed out.</w:t>
       </w:r>
     </w:p>
     <w:p>
@@ -15253,6 +15830,7 @@
         <w:pStyle w:val="Heading3"/>
       </w:pPr>
       <w:r>
+        <w:lastRenderedPageBreak/>
         <w:t>The inventory count looks wrong.</w:t>
       </w:r>
     </w:p>
@@ -15319,7 +15897,6 @@
         <w:pStyle w:val="Heading3"/>
       </w:pPr>
       <w:r>
-        <w:lastRenderedPageBreak/>
         <w:t>I want a different PIN.</w:t>
       </w:r>
     </w:p>
@@ -15403,22 +15980,22 @@
         <w:pStyle w:val="Heading1"/>
         <w:pageBreakBefore/>
       </w:pPr>
-      <w:bookmarkStart w:id="45" w:name="_Toc241606892"/>
+      <w:bookmarkStart w:id="46" w:name="_Toc241697888"/>
       <w:r>
         <w:lastRenderedPageBreak/>
         <w:t>Quick reference</w:t>
       </w:r>
-      <w:bookmarkEnd w:id="45"/>
+      <w:bookmarkEnd w:id="46"/>
     </w:p>
     <w:p>
       <w:pPr>
         <w:pStyle w:val="Heading2"/>
       </w:pPr>
-      <w:bookmarkStart w:id="46" w:name="_Toc241606893"/>
+      <w:bookmarkStart w:id="47" w:name="_Toc241697889"/>
       <w:r>
         <w:t>Sales rep checklist</w:t>
       </w:r>
-      <w:bookmarkEnd w:id="46"/>
+      <w:bookmarkEnd w:id="47"/>
     </w:p>
     <w:p>
       <w:pPr>
@@ -15558,11 +16135,11 @@
       <w:pPr>
         <w:pStyle w:val="Heading2"/>
       </w:pPr>
-      <w:bookmarkStart w:id="47" w:name="_Toc241606894"/>
+      <w:bookmarkStart w:id="48" w:name="_Toc241697890"/>
       <w:r>
         <w:t>Checkout checklist</w:t>
       </w:r>
-      <w:bookmarkEnd w:id="47"/>
+      <w:bookmarkEnd w:id="48"/>
     </w:p>
     <w:p>
       <w:pPr>
@@ -15718,21 +16295,39 @@
         <w:rPr>
           <w:b/>
         </w:rPr>
-        <w:t>Complete &amp; print</w:t>
-      </w:r>
-      <w:r>
-        <w:t>, then hand over the sales sheet.</w:t>
+        <w:t>Complete sale</w:t>
+      </w:r>
+      <w:r>
+        <w:t xml:space="preserve">, then </w:t>
+      </w:r>
+      <w:r>
+        <w:rPr>
+          <w:b/>
+        </w:rPr>
+        <w:t>Print</w:t>
+      </w:r>
+      <w:r>
+        <w:t xml:space="preserve"> the sales sheet or </w:t>
+      </w:r>
+      <w:r>
+        <w:rPr>
+          <w:b/>
+        </w:rPr>
+        <w:t>Email</w:t>
+      </w:r>
+      <w:r>
+        <w:t xml:space="preserve"> it to the customer.</w:t>
       </w:r>
     </w:p>
     <w:p>
       <w:pPr>
         <w:pStyle w:val="Heading2"/>
       </w:pPr>
-      <w:bookmarkStart w:id="48" w:name="_Toc241606895"/>
+      <w:bookmarkStart w:id="49" w:name="_Toc241697891"/>
       <w:r>
         <w:t>Inventory counts</w:t>
       </w:r>
-      <w:bookmarkEnd w:id="48"/>
+      <w:bookmarkEnd w:id="49"/>
     </w:p>
     <w:p>
       <w:pPr>
@@ -15932,11 +16527,11 @@
       <w:pPr>
         <w:pStyle w:val="Heading2"/>
       </w:pPr>
-      <w:bookmarkStart w:id="49" w:name="_Toc241606896"/>
+      <w:bookmarkStart w:id="50" w:name="_Toc241697892"/>
       <w:r>
         <w:t>Order status at a glance</w:t>
       </w:r>
-      <w:bookmarkEnd w:id="49"/>
+      <w:bookmarkEnd w:id="50"/>
     </w:p>
     <w:tbl>
       <w:tblPr>
@@ -16256,7 +16851,7 @@
       </w:pPr>
     </w:p>
     <w:sectPr>
-      <w:footerReference w:type="default" r:id="rId38"/>
+      <w:footerReference w:type="default" r:id="rId40"/>
       <w:pgSz w:w="12240" w:h="15840"/>
       <w:pgMar w:top="1296" w:right="1440" w:bottom="1296" w:left="1440" w:header="720" w:footer="720" w:gutter="0"/>
       <w:cols w:space="720"/>
@@ -16552,31 +17147,31 @@
       </w:rPr>
     </w:lvl>
   </w:abstractNum>
-  <w:num w:numId="1" w16cid:durableId="503473153">
+  <w:num w:numId="1" w16cid:durableId="194082797">
     <w:abstractNumId w:val="8"/>
   </w:num>
-  <w:num w:numId="2" w16cid:durableId="830606271">
+  <w:num w:numId="2" w16cid:durableId="603153882">
     <w:abstractNumId w:val="6"/>
   </w:num>
-  <w:num w:numId="3" w16cid:durableId="445198476">
+  <w:num w:numId="3" w16cid:durableId="1973822275">
     <w:abstractNumId w:val="5"/>
   </w:num>
-  <w:num w:numId="4" w16cid:durableId="611132746">
+  <w:num w:numId="4" w16cid:durableId="997073054">
     <w:abstractNumId w:val="4"/>
   </w:num>
-  <w:num w:numId="5" w16cid:durableId="1785809167">
+  <w:num w:numId="5" w16cid:durableId="2090495871">
     <w:abstractNumId w:val="7"/>
   </w:num>
-  <w:num w:numId="6" w16cid:durableId="1005743380">
+  <w:num w:numId="6" w16cid:durableId="1627464975">
     <w:abstractNumId w:val="3"/>
   </w:num>
-  <w:num w:numId="7" w16cid:durableId="1902403149">
+  <w:num w:numId="7" w16cid:durableId="746458070">
     <w:abstractNumId w:val="2"/>
   </w:num>
-  <w:num w:numId="8" w16cid:durableId="1719207051">
+  <w:num w:numId="8" w16cid:durableId="1397439832">
     <w:abstractNumId w:val="1"/>
   </w:num>
-  <w:num w:numId="9" w16cid:durableId="1507936180">
+  <w:num w:numId="9" w16cid:durableId="1333410129">
     <w:abstractNumId w:val="0"/>
   </w:num>
 </w:numbering>
@@ -27968,7 +28563,7 @@
     <w:autoRedefine/>
     <w:uiPriority w:val="39"/>
     <w:unhideWhenUsed/>
-    <w:rsid w:val="00DF0BDA"/>
+    <w:rsid w:val="00A865E4"/>
     <w:pPr>
       <w:spacing w:after="100"/>
     </w:pPr>
@@ -27980,7 +28575,7 @@
     <w:autoRedefine/>
     <w:uiPriority w:val="39"/>
     <w:unhideWhenUsed/>
-    <w:rsid w:val="00DF0BDA"/>
+    <w:rsid w:val="00A865E4"/>
     <w:pPr>
       <w:spacing w:after="100"/>
       <w:ind w:left="220"/>
@@ -27991,7 +28586,7 @@
     <w:basedOn w:val="DefaultParagraphFont"/>
     <w:uiPriority w:val="99"/>
     <w:unhideWhenUsed/>
-    <w:rsid w:val="00DF0BDA"/>
+    <w:rsid w:val="00A865E4"/>
     <w:rPr>
       <w:color w:val="0000FF" w:themeColor="hyperlink"/>
       <w:u w:val="single"/>

</xml_diff>

<commit_message>
Email receipts and event sheets as PDF attachments
- The dashboard builds the PDF from the sheets on screen (html2canvas-pro
  and jsPDF, loaded on demand): each sheet laid out at paper width on any
  device, one per Letter page, so it matches the printed copy. It is
  uploaded with the recipients; the API checks it is a PDF under 18 MB
  and attaches it.
- Customer receipts: CFS-Receipt-<number>.pdf, with a friendly note -
  thanks, what happens next (take-home items, shipping address, boxed
  mattress, protector for the warranty, any balance owed) and the
  customer service number.
- Event report: the stat sheet, sales sheets and inventory sheet as a
  single PDF with the sender's message; no CSV attachments.
- The email dialog shows progress while a long report is built and stays
  open until it is sent.
- README, Raspberry Pi guide and user manual updated.

Co-Authored-By: Claude Opus 5.5 <noreply@anthropic.com>
</commit_message>
<xml_diff>
--- a/Documents/CFS Sales App User Guide.docx
+++ b/Documents/CFS Sales App User Guide.docx
@@ -345,7 +345,7 @@
       <w:r>
         <w:fldChar w:fldCharType="separate"/>
       </w:r>
-      <w:hyperlink w:anchor="_Toc241697842" w:history="1">
+      <w:hyperlink w:anchor="_Toc241699080" w:history="1">
         <w:r>
           <w:rPr>
             <w:rStyle w:val="Hyperlink"/>
@@ -372,7 +372,7 @@
             <w:noProof/>
             <w:webHidden/>
           </w:rPr>
-          <w:instrText xml:space="preserve"> PAGEREF _Toc241697842 \h </w:instrText>
+          <w:instrText xml:space="preserve"> PAGEREF _Toc241699080 \h </w:instrText>
         </w:r>
         <w:r>
           <w:rPr>
@@ -413,7 +413,7 @@
           <w:noProof/>
         </w:rPr>
       </w:pPr>
-      <w:hyperlink w:anchor="_Toc241697843" w:history="1">
+      <w:hyperlink w:anchor="_Toc241699081" w:history="1">
         <w:r>
           <w:rPr>
             <w:rStyle w:val="Hyperlink"/>
@@ -440,7 +440,7 @@
             <w:noProof/>
             <w:webHidden/>
           </w:rPr>
-          <w:instrText xml:space="preserve"> PAGEREF _Toc241697843 \h </w:instrText>
+          <w:instrText xml:space="preserve"> PAGEREF _Toc241699081 \h </w:instrText>
         </w:r>
         <w:r>
           <w:rPr>
@@ -481,7 +481,7 @@
           <w:noProof/>
         </w:rPr>
       </w:pPr>
-      <w:hyperlink w:anchor="_Toc241697844" w:history="1">
+      <w:hyperlink w:anchor="_Toc241699082" w:history="1">
         <w:r>
           <w:rPr>
             <w:rStyle w:val="Hyperlink"/>
@@ -508,7 +508,7 @@
             <w:noProof/>
             <w:webHidden/>
           </w:rPr>
-          <w:instrText xml:space="preserve"> PAGEREF _Toc241697844 \h </w:instrText>
+          <w:instrText xml:space="preserve"> PAGEREF _Toc241699082 \h </w:instrText>
         </w:r>
         <w:r>
           <w:rPr>
@@ -549,7 +549,7 @@
           <w:noProof/>
         </w:rPr>
       </w:pPr>
-      <w:hyperlink w:anchor="_Toc241697845" w:history="1">
+      <w:hyperlink w:anchor="_Toc241699083" w:history="1">
         <w:r>
           <w:rPr>
             <w:rStyle w:val="Hyperlink"/>
@@ -576,7 +576,7 @@
             <w:noProof/>
             <w:webHidden/>
           </w:rPr>
-          <w:instrText xml:space="preserve"> PAGEREF _Toc241697845 \h </w:instrText>
+          <w:instrText xml:space="preserve"> PAGEREF _Toc241699083 \h </w:instrText>
         </w:r>
         <w:r>
           <w:rPr>
@@ -617,7 +617,7 @@
           <w:noProof/>
         </w:rPr>
       </w:pPr>
-      <w:hyperlink w:anchor="_Toc241697846" w:history="1">
+      <w:hyperlink w:anchor="_Toc241699084" w:history="1">
         <w:r>
           <w:rPr>
             <w:rStyle w:val="Hyperlink"/>
@@ -644,7 +644,7 @@
             <w:noProof/>
             <w:webHidden/>
           </w:rPr>
-          <w:instrText xml:space="preserve"> PAGEREF _Toc241697846 \h </w:instrText>
+          <w:instrText xml:space="preserve"> PAGEREF _Toc241699084 \h </w:instrText>
         </w:r>
         <w:r>
           <w:rPr>
@@ -685,7 +685,7 @@
           <w:noProof/>
         </w:rPr>
       </w:pPr>
-      <w:hyperlink w:anchor="_Toc241697847" w:history="1">
+      <w:hyperlink w:anchor="_Toc241699085" w:history="1">
         <w:r>
           <w:rPr>
             <w:rStyle w:val="Hyperlink"/>
@@ -712,7 +712,7 @@
             <w:noProof/>
             <w:webHidden/>
           </w:rPr>
-          <w:instrText xml:space="preserve"> PAGEREF _Toc241697847 \h </w:instrText>
+          <w:instrText xml:space="preserve"> PAGEREF _Toc241699085 \h </w:instrText>
         </w:r>
         <w:r>
           <w:rPr>
@@ -753,7 +753,7 @@
           <w:noProof/>
         </w:rPr>
       </w:pPr>
-      <w:hyperlink w:anchor="_Toc241697848" w:history="1">
+      <w:hyperlink w:anchor="_Toc241699086" w:history="1">
         <w:r>
           <w:rPr>
             <w:rStyle w:val="Hyperlink"/>
@@ -780,7 +780,7 @@
             <w:noProof/>
             <w:webHidden/>
           </w:rPr>
-          <w:instrText xml:space="preserve"> PAGEREF _Toc241697848 \h </w:instrText>
+          <w:instrText xml:space="preserve"> PAGEREF _Toc241699086 \h </w:instrText>
         </w:r>
         <w:r>
           <w:rPr>
@@ -821,7 +821,7 @@
           <w:noProof/>
         </w:rPr>
       </w:pPr>
-      <w:hyperlink w:anchor="_Toc241697849" w:history="1">
+      <w:hyperlink w:anchor="_Toc241699087" w:history="1">
         <w:r>
           <w:rPr>
             <w:rStyle w:val="Hyperlink"/>
@@ -848,7 +848,7 @@
             <w:noProof/>
             <w:webHidden/>
           </w:rPr>
-          <w:instrText xml:space="preserve"> PAGEREF _Toc241697849 \h </w:instrText>
+          <w:instrText xml:space="preserve"> PAGEREF _Toc241699087 \h </w:instrText>
         </w:r>
         <w:r>
           <w:rPr>
@@ -889,7 +889,7 @@
           <w:noProof/>
         </w:rPr>
       </w:pPr>
-      <w:hyperlink w:anchor="_Toc241697850" w:history="1">
+      <w:hyperlink w:anchor="_Toc241699088" w:history="1">
         <w:r>
           <w:rPr>
             <w:rStyle w:val="Hyperlink"/>
@@ -916,7 +916,7 @@
             <w:noProof/>
             <w:webHidden/>
           </w:rPr>
-          <w:instrText xml:space="preserve"> PAGEREF _Toc241697850 \h </w:instrText>
+          <w:instrText xml:space="preserve"> PAGEREF _Toc241699088 \h </w:instrText>
         </w:r>
         <w:r>
           <w:rPr>
@@ -957,7 +957,7 @@
           <w:noProof/>
         </w:rPr>
       </w:pPr>
-      <w:hyperlink w:anchor="_Toc241697851" w:history="1">
+      <w:hyperlink w:anchor="_Toc241699089" w:history="1">
         <w:r>
           <w:rPr>
             <w:rStyle w:val="Hyperlink"/>
@@ -984,7 +984,7 @@
             <w:noProof/>
             <w:webHidden/>
           </w:rPr>
-          <w:instrText xml:space="preserve"> PAGEREF _Toc241697851 \h </w:instrText>
+          <w:instrText xml:space="preserve"> PAGEREF _Toc241699089 \h </w:instrText>
         </w:r>
         <w:r>
           <w:rPr>
@@ -1025,7 +1025,7 @@
           <w:noProof/>
         </w:rPr>
       </w:pPr>
-      <w:hyperlink w:anchor="_Toc241697852" w:history="1">
+      <w:hyperlink w:anchor="_Toc241699090" w:history="1">
         <w:r>
           <w:rPr>
             <w:rStyle w:val="Hyperlink"/>
@@ -1052,7 +1052,7 @@
             <w:noProof/>
             <w:webHidden/>
           </w:rPr>
-          <w:instrText xml:space="preserve"> PAGEREF _Toc241697852 \h </w:instrText>
+          <w:instrText xml:space="preserve"> PAGEREF _Toc241699090 \h </w:instrText>
         </w:r>
         <w:r>
           <w:rPr>
@@ -1093,7 +1093,7 @@
           <w:noProof/>
         </w:rPr>
       </w:pPr>
-      <w:hyperlink w:anchor="_Toc241697853" w:history="1">
+      <w:hyperlink w:anchor="_Toc241699091" w:history="1">
         <w:r>
           <w:rPr>
             <w:rStyle w:val="Hyperlink"/>
@@ -1120,7 +1120,7 @@
             <w:noProof/>
             <w:webHidden/>
           </w:rPr>
-          <w:instrText xml:space="preserve"> PAGEREF _Toc241697853 \h </w:instrText>
+          <w:instrText xml:space="preserve"> PAGEREF _Toc241699091 \h </w:instrText>
         </w:r>
         <w:r>
           <w:rPr>
@@ -1161,7 +1161,7 @@
           <w:noProof/>
         </w:rPr>
       </w:pPr>
-      <w:hyperlink w:anchor="_Toc241697854" w:history="1">
+      <w:hyperlink w:anchor="_Toc241699092" w:history="1">
         <w:r>
           <w:rPr>
             <w:rStyle w:val="Hyperlink"/>
@@ -1188,7 +1188,7 @@
             <w:noProof/>
             <w:webHidden/>
           </w:rPr>
-          <w:instrText xml:space="preserve"> PAGEREF _Toc241697854 \h </w:instrText>
+          <w:instrText xml:space="preserve"> PAGEREF _Toc241699092 \h </w:instrText>
         </w:r>
         <w:r>
           <w:rPr>
@@ -1229,7 +1229,7 @@
           <w:noProof/>
         </w:rPr>
       </w:pPr>
-      <w:hyperlink w:anchor="_Toc241697855" w:history="1">
+      <w:hyperlink w:anchor="_Toc241699093" w:history="1">
         <w:r>
           <w:rPr>
             <w:rStyle w:val="Hyperlink"/>
@@ -1256,7 +1256,7 @@
             <w:noProof/>
             <w:webHidden/>
           </w:rPr>
-          <w:instrText xml:space="preserve"> PAGEREF _Toc241697855 \h </w:instrText>
+          <w:instrText xml:space="preserve"> PAGEREF _Toc241699093 \h </w:instrText>
         </w:r>
         <w:r>
           <w:rPr>
@@ -1297,7 +1297,7 @@
           <w:noProof/>
         </w:rPr>
       </w:pPr>
-      <w:hyperlink w:anchor="_Toc241697856" w:history="1">
+      <w:hyperlink w:anchor="_Toc241699094" w:history="1">
         <w:r>
           <w:rPr>
             <w:rStyle w:val="Hyperlink"/>
@@ -1324,7 +1324,7 @@
             <w:noProof/>
             <w:webHidden/>
           </w:rPr>
-          <w:instrText xml:space="preserve"> PAGEREF _Toc241697856 \h </w:instrText>
+          <w:instrText xml:space="preserve"> PAGEREF _Toc241699094 \h </w:instrText>
         </w:r>
         <w:r>
           <w:rPr>
@@ -1365,7 +1365,7 @@
           <w:noProof/>
         </w:rPr>
       </w:pPr>
-      <w:hyperlink w:anchor="_Toc241697857" w:history="1">
+      <w:hyperlink w:anchor="_Toc241699095" w:history="1">
         <w:r>
           <w:rPr>
             <w:rStyle w:val="Hyperlink"/>
@@ -1392,7 +1392,7 @@
             <w:noProof/>
             <w:webHidden/>
           </w:rPr>
-          <w:instrText xml:space="preserve"> PAGEREF _Toc241697857 \h </w:instrText>
+          <w:instrText xml:space="preserve"> PAGEREF _Toc241699095 \h </w:instrText>
         </w:r>
         <w:r>
           <w:rPr>
@@ -1433,7 +1433,7 @@
           <w:noProof/>
         </w:rPr>
       </w:pPr>
-      <w:hyperlink w:anchor="_Toc241697858" w:history="1">
+      <w:hyperlink w:anchor="_Toc241699096" w:history="1">
         <w:r>
           <w:rPr>
             <w:rStyle w:val="Hyperlink"/>
@@ -1460,7 +1460,7 @@
             <w:noProof/>
             <w:webHidden/>
           </w:rPr>
-          <w:instrText xml:space="preserve"> PAGEREF _Toc241697858 \h </w:instrText>
+          <w:instrText xml:space="preserve"> PAGEREF _Toc241699096 \h </w:instrText>
         </w:r>
         <w:r>
           <w:rPr>
@@ -1501,7 +1501,7 @@
           <w:noProof/>
         </w:rPr>
       </w:pPr>
-      <w:hyperlink w:anchor="_Toc241697859" w:history="1">
+      <w:hyperlink w:anchor="_Toc241699097" w:history="1">
         <w:r>
           <w:rPr>
             <w:rStyle w:val="Hyperlink"/>
@@ -1528,7 +1528,7 @@
             <w:noProof/>
             <w:webHidden/>
           </w:rPr>
-          <w:instrText xml:space="preserve"> PAGEREF _Toc241697859 \h </w:instrText>
+          <w:instrText xml:space="preserve"> PAGEREF _Toc241699097 \h </w:instrText>
         </w:r>
         <w:r>
           <w:rPr>
@@ -1569,7 +1569,7 @@
           <w:noProof/>
         </w:rPr>
       </w:pPr>
-      <w:hyperlink w:anchor="_Toc241697860" w:history="1">
+      <w:hyperlink w:anchor="_Toc241699098" w:history="1">
         <w:r>
           <w:rPr>
             <w:rStyle w:val="Hyperlink"/>
@@ -1596,7 +1596,7 @@
             <w:noProof/>
             <w:webHidden/>
           </w:rPr>
-          <w:instrText xml:space="preserve"> PAGEREF _Toc241697860 \h </w:instrText>
+          <w:instrText xml:space="preserve"> PAGEREF _Toc241699098 \h </w:instrText>
         </w:r>
         <w:r>
           <w:rPr>
@@ -1637,7 +1637,7 @@
           <w:noProof/>
         </w:rPr>
       </w:pPr>
-      <w:hyperlink w:anchor="_Toc241697861" w:history="1">
+      <w:hyperlink w:anchor="_Toc241699099" w:history="1">
         <w:r>
           <w:rPr>
             <w:rStyle w:val="Hyperlink"/>
@@ -1664,7 +1664,7 @@
             <w:noProof/>
             <w:webHidden/>
           </w:rPr>
-          <w:instrText xml:space="preserve"> PAGEREF _Toc241697861 \h </w:instrText>
+          <w:instrText xml:space="preserve"> PAGEREF _Toc241699099 \h </w:instrText>
         </w:r>
         <w:r>
           <w:rPr>
@@ -1705,7 +1705,7 @@
           <w:noProof/>
         </w:rPr>
       </w:pPr>
-      <w:hyperlink w:anchor="_Toc241697862" w:history="1">
+      <w:hyperlink w:anchor="_Toc241699100" w:history="1">
         <w:r>
           <w:rPr>
             <w:rStyle w:val="Hyperlink"/>
@@ -1732,7 +1732,7 @@
             <w:noProof/>
             <w:webHidden/>
           </w:rPr>
-          <w:instrText xml:space="preserve"> PAGEREF _Toc241697862 \h </w:instrText>
+          <w:instrText xml:space="preserve"> PAGEREF _Toc241699100 \h </w:instrText>
         </w:r>
         <w:r>
           <w:rPr>
@@ -1773,7 +1773,7 @@
           <w:noProof/>
         </w:rPr>
       </w:pPr>
-      <w:hyperlink w:anchor="_Toc241697863" w:history="1">
+      <w:hyperlink w:anchor="_Toc241699101" w:history="1">
         <w:r>
           <w:rPr>
             <w:rStyle w:val="Hyperlink"/>
@@ -1800,7 +1800,7 @@
             <w:noProof/>
             <w:webHidden/>
           </w:rPr>
-          <w:instrText xml:space="preserve"> PAGEREF _Toc241697863 \h </w:instrText>
+          <w:instrText xml:space="preserve"> PAGEREF _Toc241699101 \h </w:instrText>
         </w:r>
         <w:r>
           <w:rPr>
@@ -1841,7 +1841,7 @@
           <w:noProof/>
         </w:rPr>
       </w:pPr>
-      <w:hyperlink w:anchor="_Toc241697864" w:history="1">
+      <w:hyperlink w:anchor="_Toc241699102" w:history="1">
         <w:r>
           <w:rPr>
             <w:rStyle w:val="Hyperlink"/>
@@ -1868,7 +1868,7 @@
             <w:noProof/>
             <w:webHidden/>
           </w:rPr>
-          <w:instrText xml:space="preserve"> PAGEREF _Toc241697864 \h </w:instrText>
+          <w:instrText xml:space="preserve"> PAGEREF _Toc241699102 \h </w:instrText>
         </w:r>
         <w:r>
           <w:rPr>
@@ -1909,7 +1909,7 @@
           <w:noProof/>
         </w:rPr>
       </w:pPr>
-      <w:hyperlink w:anchor="_Toc241697865" w:history="1">
+      <w:hyperlink w:anchor="_Toc241699103" w:history="1">
         <w:r>
           <w:rPr>
             <w:rStyle w:val="Hyperlink"/>
@@ -1936,7 +1936,7 @@
             <w:noProof/>
             <w:webHidden/>
           </w:rPr>
-          <w:instrText xml:space="preserve"> PAGEREF _Toc241697865 \h </w:instrText>
+          <w:instrText xml:space="preserve"> PAGEREF _Toc241699103 \h </w:instrText>
         </w:r>
         <w:r>
           <w:rPr>
@@ -1977,7 +1977,7 @@
           <w:noProof/>
         </w:rPr>
       </w:pPr>
-      <w:hyperlink w:anchor="_Toc241697866" w:history="1">
+      <w:hyperlink w:anchor="_Toc241699104" w:history="1">
         <w:r>
           <w:rPr>
             <w:rStyle w:val="Hyperlink"/>
@@ -2004,7 +2004,7 @@
             <w:noProof/>
             <w:webHidden/>
           </w:rPr>
-          <w:instrText xml:space="preserve"> PAGEREF _Toc241697866 \h </w:instrText>
+          <w:instrText xml:space="preserve"> PAGEREF _Toc241699104 \h </w:instrText>
         </w:r>
         <w:r>
           <w:rPr>
@@ -2045,7 +2045,7 @@
           <w:noProof/>
         </w:rPr>
       </w:pPr>
-      <w:hyperlink w:anchor="_Toc241697867" w:history="1">
+      <w:hyperlink w:anchor="_Toc241699105" w:history="1">
         <w:r>
           <w:rPr>
             <w:rStyle w:val="Hyperlink"/>
@@ -2072,7 +2072,7 @@
             <w:noProof/>
             <w:webHidden/>
           </w:rPr>
-          <w:instrText xml:space="preserve"> PAGEREF _Toc241697867 \h </w:instrText>
+          <w:instrText xml:space="preserve"> PAGEREF _Toc241699105 \h </w:instrText>
         </w:r>
         <w:r>
           <w:rPr>
@@ -2113,7 +2113,7 @@
           <w:noProof/>
         </w:rPr>
       </w:pPr>
-      <w:hyperlink w:anchor="_Toc241697868" w:history="1">
+      <w:hyperlink w:anchor="_Toc241699106" w:history="1">
         <w:r>
           <w:rPr>
             <w:rStyle w:val="Hyperlink"/>
@@ -2140,7 +2140,7 @@
             <w:noProof/>
             <w:webHidden/>
           </w:rPr>
-          <w:instrText xml:space="preserve"> PAGEREF _Toc241697868 \h </w:instrText>
+          <w:instrText xml:space="preserve"> PAGEREF _Toc241699106 \h </w:instrText>
         </w:r>
         <w:r>
           <w:rPr>
@@ -2181,7 +2181,7 @@
           <w:noProof/>
         </w:rPr>
       </w:pPr>
-      <w:hyperlink w:anchor="_Toc241697869" w:history="1">
+      <w:hyperlink w:anchor="_Toc241699107" w:history="1">
         <w:r>
           <w:rPr>
             <w:rStyle w:val="Hyperlink"/>
@@ -2208,7 +2208,7 @@
             <w:noProof/>
             <w:webHidden/>
           </w:rPr>
-          <w:instrText xml:space="preserve"> PAGEREF _Toc241697869 \h </w:instrText>
+          <w:instrText xml:space="preserve"> PAGEREF _Toc241699107 \h </w:instrText>
         </w:r>
         <w:r>
           <w:rPr>
@@ -2249,7 +2249,7 @@
           <w:noProof/>
         </w:rPr>
       </w:pPr>
-      <w:hyperlink w:anchor="_Toc241697870" w:history="1">
+      <w:hyperlink w:anchor="_Toc241699108" w:history="1">
         <w:r>
           <w:rPr>
             <w:rStyle w:val="Hyperlink"/>
@@ -2276,7 +2276,7 @@
             <w:noProof/>
             <w:webHidden/>
           </w:rPr>
-          <w:instrText xml:space="preserve"> PAGEREF _Toc241697870 \h </w:instrText>
+          <w:instrText xml:space="preserve"> PAGEREF _Toc241699108 \h </w:instrText>
         </w:r>
         <w:r>
           <w:rPr>
@@ -2317,7 +2317,7 @@
           <w:noProof/>
         </w:rPr>
       </w:pPr>
-      <w:hyperlink w:anchor="_Toc241697871" w:history="1">
+      <w:hyperlink w:anchor="_Toc241699109" w:history="1">
         <w:r>
           <w:rPr>
             <w:rStyle w:val="Hyperlink"/>
@@ -2344,7 +2344,7 @@
             <w:noProof/>
             <w:webHidden/>
           </w:rPr>
-          <w:instrText xml:space="preserve"> PAGEREF _Toc241697871 \h </w:instrText>
+          <w:instrText xml:space="preserve"> PAGEREF _Toc241699109 \h </w:instrText>
         </w:r>
         <w:r>
           <w:rPr>
@@ -2385,7 +2385,7 @@
           <w:noProof/>
         </w:rPr>
       </w:pPr>
-      <w:hyperlink w:anchor="_Toc241697872" w:history="1">
+      <w:hyperlink w:anchor="_Toc241699110" w:history="1">
         <w:r>
           <w:rPr>
             <w:rStyle w:val="Hyperlink"/>
@@ -2412,7 +2412,7 @@
             <w:noProof/>
             <w:webHidden/>
           </w:rPr>
-          <w:instrText xml:space="preserve"> PAGEREF _Toc241697872 \h </w:instrText>
+          <w:instrText xml:space="preserve"> PAGEREF _Toc241699110 \h </w:instrText>
         </w:r>
         <w:r>
           <w:rPr>
@@ -2453,7 +2453,7 @@
           <w:noProof/>
         </w:rPr>
       </w:pPr>
-      <w:hyperlink w:anchor="_Toc241697873" w:history="1">
+      <w:hyperlink w:anchor="_Toc241699111" w:history="1">
         <w:r>
           <w:rPr>
             <w:rStyle w:val="Hyperlink"/>
@@ -2480,7 +2480,7 @@
             <w:noProof/>
             <w:webHidden/>
           </w:rPr>
-          <w:instrText xml:space="preserve"> PAGEREF _Toc241697873 \h </w:instrText>
+          <w:instrText xml:space="preserve"> PAGEREF _Toc241699111 \h </w:instrText>
         </w:r>
         <w:r>
           <w:rPr>
@@ -2521,7 +2521,7 @@
           <w:noProof/>
         </w:rPr>
       </w:pPr>
-      <w:hyperlink w:anchor="_Toc241697874" w:history="1">
+      <w:hyperlink w:anchor="_Toc241699112" w:history="1">
         <w:r>
           <w:rPr>
             <w:rStyle w:val="Hyperlink"/>
@@ -2548,7 +2548,7 @@
             <w:noProof/>
             <w:webHidden/>
           </w:rPr>
-          <w:instrText xml:space="preserve"> PAGEREF _Toc241697874 \h </w:instrText>
+          <w:instrText xml:space="preserve"> PAGEREF _Toc241699112 \h </w:instrText>
         </w:r>
         <w:r>
           <w:rPr>
@@ -2589,7 +2589,7 @@
           <w:noProof/>
         </w:rPr>
       </w:pPr>
-      <w:hyperlink w:anchor="_Toc241697875" w:history="1">
+      <w:hyperlink w:anchor="_Toc241699113" w:history="1">
         <w:r>
           <w:rPr>
             <w:rStyle w:val="Hyperlink"/>
@@ -2616,7 +2616,7 @@
             <w:noProof/>
             <w:webHidden/>
           </w:rPr>
-          <w:instrText xml:space="preserve"> PAGEREF _Toc241697875 \h </w:instrText>
+          <w:instrText xml:space="preserve"> PAGEREF _Toc241699113 \h </w:instrText>
         </w:r>
         <w:r>
           <w:rPr>
@@ -2657,7 +2657,7 @@
           <w:noProof/>
         </w:rPr>
       </w:pPr>
-      <w:hyperlink w:anchor="_Toc241697876" w:history="1">
+      <w:hyperlink w:anchor="_Toc241699114" w:history="1">
         <w:r>
           <w:rPr>
             <w:rStyle w:val="Hyperlink"/>
@@ -2684,7 +2684,7 @@
             <w:noProof/>
             <w:webHidden/>
           </w:rPr>
-          <w:instrText xml:space="preserve"> PAGEREF _Toc241697876 \h </w:instrText>
+          <w:instrText xml:space="preserve"> PAGEREF _Toc241699114 \h </w:instrText>
         </w:r>
         <w:r>
           <w:rPr>
@@ -2725,7 +2725,7 @@
           <w:noProof/>
         </w:rPr>
       </w:pPr>
-      <w:hyperlink w:anchor="_Toc241697877" w:history="1">
+      <w:hyperlink w:anchor="_Toc241699115" w:history="1">
         <w:r>
           <w:rPr>
             <w:rStyle w:val="Hyperlink"/>
@@ -2752,7 +2752,7 @@
             <w:noProof/>
             <w:webHidden/>
           </w:rPr>
-          <w:instrText xml:space="preserve"> PAGEREF _Toc241697877 \h </w:instrText>
+          <w:instrText xml:space="preserve"> PAGEREF _Toc241699115 \h </w:instrText>
         </w:r>
         <w:r>
           <w:rPr>
@@ -2793,7 +2793,7 @@
           <w:noProof/>
         </w:rPr>
       </w:pPr>
-      <w:hyperlink w:anchor="_Toc241697878" w:history="1">
+      <w:hyperlink w:anchor="_Toc241699116" w:history="1">
         <w:r>
           <w:rPr>
             <w:rStyle w:val="Hyperlink"/>
@@ -2820,7 +2820,7 @@
             <w:noProof/>
             <w:webHidden/>
           </w:rPr>
-          <w:instrText xml:space="preserve"> PAGEREF _Toc241697878 \h </w:instrText>
+          <w:instrText xml:space="preserve"> PAGEREF _Toc241699116 \h </w:instrText>
         </w:r>
         <w:r>
           <w:rPr>
@@ -2861,7 +2861,7 @@
           <w:noProof/>
         </w:rPr>
       </w:pPr>
-      <w:hyperlink w:anchor="_Toc241697879" w:history="1">
+      <w:hyperlink w:anchor="_Toc241699117" w:history="1">
         <w:r>
           <w:rPr>
             <w:rStyle w:val="Hyperlink"/>
@@ -2888,7 +2888,7 @@
             <w:noProof/>
             <w:webHidden/>
           </w:rPr>
-          <w:instrText xml:space="preserve"> PAGEREF _Toc241697879 \h </w:instrText>
+          <w:instrText xml:space="preserve"> PAGEREF _Toc241699117 \h </w:instrText>
         </w:r>
         <w:r>
           <w:rPr>
@@ -2929,7 +2929,7 @@
           <w:noProof/>
         </w:rPr>
       </w:pPr>
-      <w:hyperlink w:anchor="_Toc241697880" w:history="1">
+      <w:hyperlink w:anchor="_Toc241699118" w:history="1">
         <w:r>
           <w:rPr>
             <w:rStyle w:val="Hyperlink"/>
@@ -2956,7 +2956,7 @@
             <w:noProof/>
             <w:webHidden/>
           </w:rPr>
-          <w:instrText xml:space="preserve"> PAGEREF _Toc241697880 \h </w:instrText>
+          <w:instrText xml:space="preserve"> PAGEREF _Toc241699118 \h </w:instrText>
         </w:r>
         <w:r>
           <w:rPr>
@@ -2997,7 +2997,7 @@
           <w:noProof/>
         </w:rPr>
       </w:pPr>
-      <w:hyperlink w:anchor="_Toc241697881" w:history="1">
+      <w:hyperlink w:anchor="_Toc241699119" w:history="1">
         <w:r>
           <w:rPr>
             <w:rStyle w:val="Hyperlink"/>
@@ -3024,7 +3024,7 @@
             <w:noProof/>
             <w:webHidden/>
           </w:rPr>
-          <w:instrText xml:space="preserve"> PAGEREF _Toc241697881 \h </w:instrText>
+          <w:instrText xml:space="preserve"> PAGEREF _Toc241699119 \h </w:instrText>
         </w:r>
         <w:r>
           <w:rPr>
@@ -3065,7 +3065,7 @@
           <w:noProof/>
         </w:rPr>
       </w:pPr>
-      <w:hyperlink w:anchor="_Toc241697882" w:history="1">
+      <w:hyperlink w:anchor="_Toc241699120" w:history="1">
         <w:r>
           <w:rPr>
             <w:rStyle w:val="Hyperlink"/>
@@ -3092,7 +3092,7 @@
             <w:noProof/>
             <w:webHidden/>
           </w:rPr>
-          <w:instrText xml:space="preserve"> PAGEREF _Toc241697882 \h </w:instrText>
+          <w:instrText xml:space="preserve"> PAGEREF _Toc241699120 \h </w:instrText>
         </w:r>
         <w:r>
           <w:rPr>
@@ -3133,7 +3133,7 @@
           <w:noProof/>
         </w:rPr>
       </w:pPr>
-      <w:hyperlink w:anchor="_Toc241697883" w:history="1">
+      <w:hyperlink w:anchor="_Toc241699121" w:history="1">
         <w:r>
           <w:rPr>
             <w:rStyle w:val="Hyperlink"/>
@@ -3160,7 +3160,7 @@
             <w:noProof/>
             <w:webHidden/>
           </w:rPr>
-          <w:instrText xml:space="preserve"> PAGEREF _Toc241697883 \h </w:instrText>
+          <w:instrText xml:space="preserve"> PAGEREF _Toc241699121 \h </w:instrText>
         </w:r>
         <w:r>
           <w:rPr>
@@ -3201,7 +3201,7 @@
           <w:noProof/>
         </w:rPr>
       </w:pPr>
-      <w:hyperlink w:anchor="_Toc241697884" w:history="1">
+      <w:hyperlink w:anchor="_Toc241699122" w:history="1">
         <w:r>
           <w:rPr>
             <w:rStyle w:val="Hyperlink"/>
@@ -3228,7 +3228,7 @@
             <w:noProof/>
             <w:webHidden/>
           </w:rPr>
-          <w:instrText xml:space="preserve"> PAGEREF _Toc241697884 \h </w:instrText>
+          <w:instrText xml:space="preserve"> PAGEREF _Toc241699122 \h </w:instrText>
         </w:r>
         <w:r>
           <w:rPr>
@@ -3269,7 +3269,7 @@
           <w:noProof/>
         </w:rPr>
       </w:pPr>
-      <w:hyperlink w:anchor="_Toc241697885" w:history="1">
+      <w:hyperlink w:anchor="_Toc241699123" w:history="1">
         <w:r>
           <w:rPr>
             <w:rStyle w:val="Hyperlink"/>
@@ -3296,7 +3296,7 @@
             <w:noProof/>
             <w:webHidden/>
           </w:rPr>
-          <w:instrText xml:space="preserve"> PAGEREF _Toc241697885 \h </w:instrText>
+          <w:instrText xml:space="preserve"> PAGEREF _Toc241699123 \h </w:instrText>
         </w:r>
         <w:r>
           <w:rPr>
@@ -3337,7 +3337,7 @@
           <w:noProof/>
         </w:rPr>
       </w:pPr>
-      <w:hyperlink w:anchor="_Toc241697886" w:history="1">
+      <w:hyperlink w:anchor="_Toc241699124" w:history="1">
         <w:r>
           <w:rPr>
             <w:rStyle w:val="Hyperlink"/>
@@ -3364,7 +3364,7 @@
             <w:noProof/>
             <w:webHidden/>
           </w:rPr>
-          <w:instrText xml:space="preserve"> PAGEREF _Toc241697886 \h </w:instrText>
+          <w:instrText xml:space="preserve"> PAGEREF _Toc241699124 \h </w:instrText>
         </w:r>
         <w:r>
           <w:rPr>
@@ -3405,7 +3405,7 @@
           <w:noProof/>
         </w:rPr>
       </w:pPr>
-      <w:hyperlink w:anchor="_Toc241697887" w:history="1">
+      <w:hyperlink w:anchor="_Toc241699125" w:history="1">
         <w:r>
           <w:rPr>
             <w:rStyle w:val="Hyperlink"/>
@@ -3432,7 +3432,7 @@
             <w:noProof/>
             <w:webHidden/>
           </w:rPr>
-          <w:instrText xml:space="preserve"> PAGEREF _Toc241697887 \h </w:instrText>
+          <w:instrText xml:space="preserve"> PAGEREF _Toc241699125 \h </w:instrText>
         </w:r>
         <w:r>
           <w:rPr>
@@ -3473,7 +3473,7 @@
           <w:noProof/>
         </w:rPr>
       </w:pPr>
-      <w:hyperlink w:anchor="_Toc241697888" w:history="1">
+      <w:hyperlink w:anchor="_Toc241699126" w:history="1">
         <w:r>
           <w:rPr>
             <w:rStyle w:val="Hyperlink"/>
@@ -3500,7 +3500,7 @@
             <w:noProof/>
             <w:webHidden/>
           </w:rPr>
-          <w:instrText xml:space="preserve"> PAGEREF _Toc241697888 \h </w:instrText>
+          <w:instrText xml:space="preserve"> PAGEREF _Toc241699126 \h </w:instrText>
         </w:r>
         <w:r>
           <w:rPr>
@@ -3541,7 +3541,7 @@
           <w:noProof/>
         </w:rPr>
       </w:pPr>
-      <w:hyperlink w:anchor="_Toc241697889" w:history="1">
+      <w:hyperlink w:anchor="_Toc241699127" w:history="1">
         <w:r>
           <w:rPr>
             <w:rStyle w:val="Hyperlink"/>
@@ -3568,7 +3568,7 @@
             <w:noProof/>
             <w:webHidden/>
           </w:rPr>
-          <w:instrText xml:space="preserve"> PAGEREF _Toc241697889 \h </w:instrText>
+          <w:instrText xml:space="preserve"> PAGEREF _Toc241699127 \h </w:instrText>
         </w:r>
         <w:r>
           <w:rPr>
@@ -3609,7 +3609,7 @@
           <w:noProof/>
         </w:rPr>
       </w:pPr>
-      <w:hyperlink w:anchor="_Toc241697890" w:history="1">
+      <w:hyperlink w:anchor="_Toc241699128" w:history="1">
         <w:r>
           <w:rPr>
             <w:rStyle w:val="Hyperlink"/>
@@ -3636,7 +3636,7 @@
             <w:noProof/>
             <w:webHidden/>
           </w:rPr>
-          <w:instrText xml:space="preserve"> PAGEREF _Toc241697890 \h </w:instrText>
+          <w:instrText xml:space="preserve"> PAGEREF _Toc241699128 \h </w:instrText>
         </w:r>
         <w:r>
           <w:rPr>
@@ -3677,7 +3677,7 @@
           <w:noProof/>
         </w:rPr>
       </w:pPr>
-      <w:hyperlink w:anchor="_Toc241697891" w:history="1">
+      <w:hyperlink w:anchor="_Toc241699129" w:history="1">
         <w:r>
           <w:rPr>
             <w:rStyle w:val="Hyperlink"/>
@@ -3704,7 +3704,7 @@
             <w:noProof/>
             <w:webHidden/>
           </w:rPr>
-          <w:instrText xml:space="preserve"> PAGEREF _Toc241697891 \h </w:instrText>
+          <w:instrText xml:space="preserve"> PAGEREF _Toc241699129 \h </w:instrText>
         </w:r>
         <w:r>
           <w:rPr>
@@ -3745,7 +3745,7 @@
           <w:noProof/>
         </w:rPr>
       </w:pPr>
-      <w:hyperlink w:anchor="_Toc241697892" w:history="1">
+      <w:hyperlink w:anchor="_Toc241699130" w:history="1">
         <w:r>
           <w:rPr>
             <w:rStyle w:val="Hyperlink"/>
@@ -3772,7 +3772,7 @@
             <w:noProof/>
             <w:webHidden/>
           </w:rPr>
-          <w:instrText xml:space="preserve"> PAGEREF _Toc241697892 \h </w:instrText>
+          <w:instrText xml:space="preserve"> PAGEREF _Toc241699130 \h </w:instrText>
         </w:r>
         <w:r>
           <w:rPr>
@@ -3813,7 +3813,7 @@
         <w:pStyle w:val="Heading1"/>
         <w:pageBreakBefore/>
       </w:pPr>
-      <w:bookmarkStart w:id="0" w:name="_Toc241697842"/>
+      <w:bookmarkStart w:id="0" w:name="_Toc241699080"/>
       <w:r>
         <w:lastRenderedPageBreak/>
         <w:t>Welcome</w:t>
@@ -3829,7 +3829,7 @@
       <w:pPr>
         <w:pStyle w:val="Heading2"/>
       </w:pPr>
-      <w:bookmarkStart w:id="1" w:name="_Toc241697843"/>
+      <w:bookmarkStart w:id="1" w:name="_Toc241699081"/>
       <w:r>
         <w:t>How a sale moves through the app</w:t>
       </w:r>
@@ -4312,7 +4312,7 @@
       <w:pPr>
         <w:pStyle w:val="Heading2"/>
       </w:pPr>
-      <w:bookmarkStart w:id="2" w:name="_Toc241697844"/>
+      <w:bookmarkStart w:id="2" w:name="_Toc241699082"/>
       <w:r>
         <w:t>What you'll need</w:t>
       </w:r>
@@ -4421,7 +4421,7 @@
         <w:pStyle w:val="Heading1"/>
         <w:pageBreakBefore/>
       </w:pPr>
-      <w:bookmarkStart w:id="3" w:name="_Toc241697845"/>
+      <w:bookmarkStart w:id="3" w:name="_Toc241699083"/>
       <w:r>
         <w:lastRenderedPageBreak/>
         <w:t>Who can do what</w:t>
@@ -4989,7 +4989,7 @@
         <w:pStyle w:val="Heading1"/>
         <w:pageBreakBefore/>
       </w:pPr>
-      <w:bookmarkStart w:id="4" w:name="_Toc241697846"/>
+      <w:bookmarkStart w:id="4" w:name="_Toc241699084"/>
       <w:r>
         <w:lastRenderedPageBreak/>
         <w:t>Getting started</w:t>
@@ -5000,7 +5000,7 @@
       <w:pPr>
         <w:pStyle w:val="Heading2"/>
       </w:pPr>
-      <w:bookmarkStart w:id="5" w:name="_Toc241697847"/>
+      <w:bookmarkStart w:id="5" w:name="_Toc241699085"/>
       <w:r>
         <w:t>Signing in</w:t>
       </w:r>
@@ -5017,7 +5017,7 @@
           <w:noProof/>
         </w:rPr>
         <w:drawing>
-          <wp:inline distT="0" distB="0" distL="0" distR="0" wp14:anchorId="73FCEEE9" wp14:editId="49665934">
+          <wp:inline distT="0" distB="0" distL="0" distR="0" wp14:anchorId="43FB9261" wp14:editId="252B5B19">
             <wp:extent cx="3291840" cy="2211705"/>
             <wp:effectExtent l="0" t="0" r="0" b="0"/>
             <wp:docPr id="1" name="Picture 1"/>
@@ -5335,7 +5335,7 @@
       <w:pPr>
         <w:pStyle w:val="Heading2"/>
       </w:pPr>
-      <w:bookmarkStart w:id="6" w:name="_Toc241697848"/>
+      <w:bookmarkStart w:id="6" w:name="_Toc241699086"/>
       <w:r>
         <w:t>Changing your PIN</w:t>
       </w:r>
@@ -5517,7 +5517,7 @@
       <w:pPr>
         <w:pStyle w:val="Heading2"/>
       </w:pPr>
-      <w:bookmarkStart w:id="7" w:name="_Toc241697849"/>
+      <w:bookmarkStart w:id="7" w:name="_Toc241699087"/>
       <w:r>
         <w:lastRenderedPageBreak/>
         <w:t>Finding your way around</w:t>
@@ -6100,7 +6100,7 @@
       <w:pPr>
         <w:pStyle w:val="Heading2"/>
       </w:pPr>
-      <w:bookmarkStart w:id="8" w:name="_Toc241697850"/>
+      <w:bookmarkStart w:id="8" w:name="_Toc241699088"/>
       <w:r>
         <w:t>Light and dark mode</w:t>
       </w:r>
@@ -6115,7 +6115,7 @@
       <w:pPr>
         <w:pStyle w:val="Heading2"/>
       </w:pPr>
-      <w:bookmarkStart w:id="9" w:name="_Toc241697851"/>
+      <w:bookmarkStart w:id="9" w:name="_Toc241699089"/>
       <w:r>
         <w:t>Signing out</w:t>
       </w:r>
@@ -6140,7 +6140,7 @@
         <w:pStyle w:val="Heading1"/>
         <w:pageBreakBefore/>
       </w:pPr>
-      <w:bookmarkStart w:id="10" w:name="_Toc241697852"/>
+      <w:bookmarkStart w:id="10" w:name="_Toc241699090"/>
       <w:r>
         <w:lastRenderedPageBreak/>
         <w:t>Taking an order on the sales floor</w:t>
@@ -6172,7 +6172,7 @@
           <w:noProof/>
         </w:rPr>
         <w:drawing>
-          <wp:inline distT="0" distB="0" distL="0" distR="0" wp14:anchorId="767903C4" wp14:editId="1B927B47">
+          <wp:inline distT="0" distB="0" distL="0" distR="0" wp14:anchorId="0B5288FB" wp14:editId="785DAFD1">
             <wp:extent cx="5760720" cy="3870484"/>
             <wp:effectExtent l="0" t="0" r="0" b="0"/>
             <wp:docPr id="2" name="Picture 2"/>
@@ -6297,7 +6297,7 @@
       <w:pPr>
         <w:pStyle w:val="Heading2"/>
       </w:pPr>
-      <w:bookmarkStart w:id="11" w:name="_Toc241697853"/>
+      <w:bookmarkStart w:id="11" w:name="_Toc241699091"/>
       <w:r>
         <w:t>Starting an order</w:t>
       </w:r>
@@ -6381,7 +6381,7 @@
       <w:pPr>
         <w:pStyle w:val="Heading2"/>
       </w:pPr>
-      <w:bookmarkStart w:id="12" w:name="_Toc241697854"/>
+      <w:bookmarkStart w:id="12" w:name="_Toc241699092"/>
       <w:r>
         <w:lastRenderedPageBreak/>
         <w:t>Adding items</w:t>
@@ -6530,7 +6530,7 @@
           <w:noProof/>
         </w:rPr>
         <w:drawing>
-          <wp:inline distT="0" distB="0" distL="0" distR="0" wp14:anchorId="5D901D0C" wp14:editId="7CB72F6B">
+          <wp:inline distT="0" distB="0" distL="0" distR="0" wp14:anchorId="3D2ECC54" wp14:editId="47617F78">
             <wp:extent cx="5760720" cy="3870484"/>
             <wp:effectExtent l="0" t="0" r="0" b="0"/>
             <wp:docPr id="3" name="Picture 3"/>
@@ -6667,7 +6667,7 @@
           <w:noProof/>
         </w:rPr>
         <w:drawing>
-          <wp:inline distT="0" distB="0" distL="0" distR="0" wp14:anchorId="1AA328D0" wp14:editId="006180AB">
+          <wp:inline distT="0" distB="0" distL="0" distR="0" wp14:anchorId="0263E6FB" wp14:editId="4DA0CA21">
             <wp:extent cx="5760720" cy="3870484"/>
             <wp:effectExtent l="0" t="0" r="0" b="0"/>
             <wp:docPr id="4" name="Picture 4"/>
@@ -7012,7 +7012,7 @@
         </w:rPr>
         <w:lastRenderedPageBreak/>
         <w:drawing>
-          <wp:inline distT="0" distB="0" distL="0" distR="0" wp14:anchorId="3791D013" wp14:editId="6FE84C55">
+          <wp:inline distT="0" distB="0" distL="0" distR="0" wp14:anchorId="2C772E81" wp14:editId="733FE586">
             <wp:extent cx="5486400" cy="3686175"/>
             <wp:effectExtent l="0" t="0" r="0" b="0"/>
             <wp:docPr id="5" name="Picture 5"/>
@@ -7212,7 +7212,7 @@
       <w:pPr>
         <w:pStyle w:val="Heading2"/>
       </w:pPr>
-      <w:bookmarkStart w:id="13" w:name="_Toc241697855"/>
+      <w:bookmarkStart w:id="13" w:name="_Toc241699093"/>
       <w:r>
         <w:t>Adding shipping or a service later</w:t>
       </w:r>
@@ -7253,7 +7253,7 @@
         </w:rPr>
         <w:lastRenderedPageBreak/>
         <w:drawing>
-          <wp:inline distT="0" distB="0" distL="0" distR="0" wp14:anchorId="3DC54287" wp14:editId="53961360">
+          <wp:inline distT="0" distB="0" distL="0" distR="0" wp14:anchorId="75553DA3" wp14:editId="622A8F13">
             <wp:extent cx="4754880" cy="3194685"/>
             <wp:effectExtent l="0" t="0" r="0" b="0"/>
             <wp:docPr id="6" name="Picture 6"/>
@@ -7307,7 +7307,7 @@
       <w:pPr>
         <w:pStyle w:val="Heading2"/>
       </w:pPr>
-      <w:bookmarkStart w:id="14" w:name="_Toc241697856"/>
+      <w:bookmarkStart w:id="14" w:name="_Toc241699094"/>
       <w:r>
         <w:t>Changing or removing an item</w:t>
       </w:r>
@@ -7454,7 +7454,7 @@
       <w:pPr>
         <w:pStyle w:val="Heading2"/>
       </w:pPr>
-      <w:bookmarkStart w:id="15" w:name="_Toc241697857"/>
+      <w:bookmarkStart w:id="15" w:name="_Toc241699095"/>
       <w:r>
         <w:t>Customer details</w:t>
       </w:r>
@@ -7618,7 +7618,7 @@
           <w:noProof/>
         </w:rPr>
         <w:drawing>
-          <wp:inline distT="0" distB="0" distL="0" distR="0" wp14:anchorId="3F723E04" wp14:editId="1CC1E7C3">
+          <wp:inline distT="0" distB="0" distL="0" distR="0" wp14:anchorId="15BFA54B" wp14:editId="7434FC78">
             <wp:extent cx="4754880" cy="3194685"/>
             <wp:effectExtent l="0" t="0" r="0" b="0"/>
             <wp:docPr id="7" name="Picture 7"/>
@@ -7672,7 +7672,7 @@
       <w:pPr>
         <w:pStyle w:val="Heading2"/>
       </w:pPr>
-      <w:bookmarkStart w:id="16" w:name="_Toc241697858"/>
+      <w:bookmarkStart w:id="16" w:name="_Toc241699096"/>
       <w:r>
         <w:t>Sending the order to checkout</w:t>
       </w:r>
@@ -7850,7 +7850,7 @@
       <w:pPr>
         <w:pStyle w:val="Heading2"/>
       </w:pPr>
-      <w:bookmarkStart w:id="17" w:name="_Toc241697859"/>
+      <w:bookmarkStart w:id="17" w:name="_Toc241699097"/>
       <w:r>
         <w:lastRenderedPageBreak/>
         <w:t>Using a phone</w:t>
@@ -7868,7 +7868,7 @@
           <w:noProof/>
         </w:rPr>
         <w:drawing>
-          <wp:inline distT="0" distB="0" distL="0" distR="0" wp14:anchorId="55E4E22E" wp14:editId="48C5DD58">
+          <wp:inline distT="0" distB="0" distL="0" distR="0" wp14:anchorId="2FC679B6" wp14:editId="6C38072B">
             <wp:extent cx="2194560" cy="4749253"/>
             <wp:effectExtent l="0" t="0" r="0" b="0"/>
             <wp:docPr id="8" name="Picture 8"/>
@@ -7946,7 +7946,7 @@
         <w:pStyle w:val="Heading1"/>
         <w:pageBreakBefore/>
       </w:pPr>
-      <w:bookmarkStart w:id="18" w:name="_Toc241697860"/>
+      <w:bookmarkStart w:id="18" w:name="_Toc241699098"/>
       <w:r>
         <w:lastRenderedPageBreak/>
         <w:t>Checking out a customer</w:t>
@@ -7987,7 +7987,7 @@
           <w:noProof/>
         </w:rPr>
         <w:drawing>
-          <wp:inline distT="0" distB="0" distL="0" distR="0" wp14:anchorId="69C9629E" wp14:editId="6DD92595">
+          <wp:inline distT="0" distB="0" distL="0" distR="0" wp14:anchorId="3C77E479" wp14:editId="5E84C681">
             <wp:extent cx="5760720" cy="3870484"/>
             <wp:effectExtent l="0" t="0" r="0" b="0"/>
             <wp:docPr id="9" name="Picture 9"/>
@@ -8041,7 +8041,7 @@
       <w:pPr>
         <w:pStyle w:val="Heading2"/>
       </w:pPr>
-      <w:bookmarkStart w:id="19" w:name="_Toc241697861"/>
+      <w:bookmarkStart w:id="19" w:name="_Toc241699099"/>
       <w:r>
         <w:t>1. Review the order with the customer</w:t>
       </w:r>
@@ -8138,7 +8138,7 @@
       <w:pPr>
         <w:pStyle w:val="Heading2"/>
       </w:pPr>
-      <w:bookmarkStart w:id="20" w:name="_Toc241697862"/>
+      <w:bookmarkStart w:id="20" w:name="_Toc241699100"/>
       <w:r>
         <w:t>2. Take payment</w:t>
       </w:r>
@@ -8452,7 +8452,7 @@
       <w:pPr>
         <w:pStyle w:val="Heading2"/>
       </w:pPr>
-      <w:bookmarkStart w:id="21" w:name="_Toc241697863"/>
+      <w:bookmarkStart w:id="21" w:name="_Toc241699101"/>
       <w:r>
         <w:t>3. Acknowledgements (initials and signature)</w:t>
       </w:r>
@@ -8634,7 +8634,7 @@
         </w:rPr>
         <w:lastRenderedPageBreak/>
         <w:drawing>
-          <wp:inline distT="0" distB="0" distL="0" distR="0" wp14:anchorId="3E83AB55" wp14:editId="5C50AC6D">
+          <wp:inline distT="0" distB="0" distL="0" distR="0" wp14:anchorId="26C026D2" wp14:editId="349E059B">
             <wp:extent cx="4937760" cy="3317558"/>
             <wp:effectExtent l="0" t="0" r="0" b="0"/>
             <wp:docPr id="10" name="Picture 10"/>
@@ -8761,7 +8761,7 @@
       <w:pPr>
         <w:pStyle w:val="Heading2"/>
       </w:pPr>
-      <w:bookmarkStart w:id="22" w:name="_Toc241697864"/>
+      <w:bookmarkStart w:id="22" w:name="_Toc241699102"/>
       <w:r>
         <w:t>4. Complete the sale</w:t>
       </w:r>
@@ -8995,7 +8995,7 @@
       <w:pPr>
         <w:pStyle w:val="Heading2"/>
       </w:pPr>
-      <w:bookmarkStart w:id="23" w:name="_Toc241697865"/>
+      <w:bookmarkStart w:id="23" w:name="_Toc241699103"/>
       <w:r>
         <w:t>Other checkout actions</w:t>
       </w:r>
@@ -9205,7 +9205,7 @@
         <w:pStyle w:val="Heading1"/>
         <w:pageBreakBefore/>
       </w:pPr>
-      <w:bookmarkStart w:id="24" w:name="_Toc241697866"/>
+      <w:bookmarkStart w:id="24" w:name="_Toc241699104"/>
       <w:r>
         <w:lastRenderedPageBreak/>
         <w:t>The sales sheet</w:t>
@@ -9228,7 +9228,7 @@
           <w:noProof/>
         </w:rPr>
         <w:drawing>
-          <wp:inline distT="0" distB="0" distL="0" distR="0" wp14:anchorId="1DF3B58E" wp14:editId="2988C7E7">
+          <wp:inline distT="0" distB="0" distL="0" distR="0" wp14:anchorId="2D49D171" wp14:editId="03F4B67E">
             <wp:extent cx="4023360" cy="3187256"/>
             <wp:effectExtent l="0" t="0" r="0" b="0"/>
             <wp:docPr id="11" name="Picture 11"/>
@@ -9396,7 +9396,7 @@
       <w:pPr>
         <w:pStyle w:val="Heading2"/>
       </w:pPr>
-      <w:bookmarkStart w:id="25" w:name="_Toc241697867"/>
+      <w:bookmarkStart w:id="25" w:name="_Toc241699105"/>
       <w:r>
         <w:t>Emailing a receipt</w:t>
       </w:r>
@@ -9524,7 +9524,7 @@
         </w:rPr>
         <w:lastRenderedPageBreak/>
         <w:drawing>
-          <wp:inline distT="0" distB="0" distL="0" distR="0" wp14:anchorId="7F69AF0C" wp14:editId="146D602A">
+          <wp:inline distT="0" distB="0" distL="0" distR="0" wp14:anchorId="5E09BC77" wp14:editId="36900004">
             <wp:extent cx="4572000" cy="3071812"/>
             <wp:effectExtent l="0" t="0" r="0" b="0"/>
             <wp:docPr id="12" name="Picture 12"/>
@@ -9576,7 +9576,12 @@
     </w:p>
     <w:p>
       <w:r>
-        <w:t>The customer gets a neat copy of their sales sheet: the items with any notes, shipping, totals, payments, the warranty and delivery terms, and the customer service number.</w:t>
+        <w:t>The app turns the sales sheet into a PDF, exactly as it would print, and emails it to the customer with a friendly note. The note thanks them for supporting the organization, explains what happens next (what went home today, what's being shipped and where, how a boxed mattress expands, and keeping a protector on for the warranty), mentions any balance still owed, and gives the customer service number.</w:t>
+      </w:r>
+    </w:p>
+    <w:p>
+      <w:r>
+        <w:t>Making the PDF takes a few seconds. Keep the screen open until the app says the email was sent.</w:t>
       </w:r>
     </w:p>
     <w:tbl>
@@ -9646,7 +9651,7 @@
         <w:pStyle w:val="Heading1"/>
         <w:pageBreakBefore/>
       </w:pPr>
-      <w:bookmarkStart w:id="26" w:name="_Toc241697868"/>
+      <w:bookmarkStart w:id="26" w:name="_Toc241699106"/>
       <w:r>
         <w:lastRenderedPageBreak/>
         <w:t>Looking up orders</w:t>
@@ -9678,7 +9683,7 @@
           <w:noProof/>
         </w:rPr>
         <w:drawing>
-          <wp:inline distT="0" distB="0" distL="0" distR="0" wp14:anchorId="430EE806" wp14:editId="2DE813EF">
+          <wp:inline distT="0" distB="0" distL="0" distR="0" wp14:anchorId="4D5D6AAD" wp14:editId="13D244CB">
             <wp:extent cx="5760720" cy="3870484"/>
             <wp:effectExtent l="0" t="0" r="0" b="0"/>
             <wp:docPr id="13" name="Picture 13"/>
@@ -9798,7 +9803,7 @@
       <w:pPr>
         <w:pStyle w:val="Heading2"/>
       </w:pPr>
-      <w:bookmarkStart w:id="27" w:name="_Toc241697869"/>
+      <w:bookmarkStart w:id="27" w:name="_Toc241699107"/>
       <w:r>
         <w:t>Extra options for admins</w:t>
       </w:r>
@@ -9888,7 +9893,7 @@
         </w:rPr>
         <w:lastRenderedPageBreak/>
         <w:drawing>
-          <wp:inline distT="0" distB="0" distL="0" distR="0" wp14:anchorId="3B5184ED" wp14:editId="41654E6A">
+          <wp:inline distT="0" distB="0" distL="0" distR="0" wp14:anchorId="04A5E057" wp14:editId="6A9C0CBF">
             <wp:extent cx="4754880" cy="3194685"/>
             <wp:effectExtent l="0" t="0" r="0" b="0"/>
             <wp:docPr id="14" name="Picture 14"/>
@@ -10010,7 +10015,7 @@
         <w:pStyle w:val="Heading1"/>
         <w:pageBreakBefore/>
       </w:pPr>
-      <w:bookmarkStart w:id="28" w:name="_Toc241697870"/>
+      <w:bookmarkStart w:id="28" w:name="_Toc241699108"/>
       <w:r>
         <w:lastRenderedPageBreak/>
         <w:t>The dashboard</w:t>
@@ -10074,7 +10079,7 @@
           <w:noProof/>
         </w:rPr>
         <w:drawing>
-          <wp:inline distT="0" distB="0" distL="0" distR="0" wp14:anchorId="667E1BF0" wp14:editId="0F02A174">
+          <wp:inline distT="0" distB="0" distL="0" distR="0" wp14:anchorId="7FA1DC7D" wp14:editId="7F94B732">
             <wp:extent cx="4937760" cy="4305110"/>
             <wp:effectExtent l="0" t="0" r="0" b="0"/>
             <wp:docPr id="15" name="Picture 15"/>
@@ -10720,7 +10725,7 @@
         <w:pStyle w:val="Heading1"/>
         <w:pageBreakBefore/>
       </w:pPr>
-      <w:bookmarkStart w:id="29" w:name="_Toc241697871"/>
+      <w:bookmarkStart w:id="29" w:name="_Toc241699109"/>
       <w:r>
         <w:lastRenderedPageBreak/>
         <w:t>Keeping inventory</w:t>
@@ -10779,7 +10784,7 @@
           <w:noProof/>
         </w:rPr>
         <w:drawing>
-          <wp:inline distT="0" distB="0" distL="0" distR="0" wp14:anchorId="72F89BC1" wp14:editId="467C394B">
+          <wp:inline distT="0" distB="0" distL="0" distR="0" wp14:anchorId="0744E8E3" wp14:editId="79A6F958">
             <wp:extent cx="5760720" cy="3870484"/>
             <wp:effectExtent l="0" t="0" r="0" b="0"/>
             <wp:docPr id="16" name="Picture 16"/>
@@ -10833,7 +10838,7 @@
       <w:pPr>
         <w:pStyle w:val="Heading2"/>
       </w:pPr>
-      <w:bookmarkStart w:id="30" w:name="_Toc241697872"/>
+      <w:bookmarkStart w:id="30" w:name="_Toc241699110"/>
       <w:r>
         <w:t>What's on the screen</w:t>
       </w:r>
@@ -10915,7 +10920,7 @@
       <w:pPr>
         <w:pStyle w:val="Heading2"/>
       </w:pPr>
-      <w:bookmarkStart w:id="31" w:name="_Toc241697873"/>
+      <w:bookmarkStart w:id="31" w:name="_Toc241699111"/>
       <w:r>
         <w:t>Updating a count</w:t>
       </w:r>
@@ -10992,7 +10997,7 @@
           <w:noProof/>
         </w:rPr>
         <w:drawing>
-          <wp:inline distT="0" distB="0" distL="0" distR="0" wp14:anchorId="26AEC797" wp14:editId="1A2BC16D">
+          <wp:inline distT="0" distB="0" distL="0" distR="0" wp14:anchorId="15B89D9B" wp14:editId="668307DE">
             <wp:extent cx="5120640" cy="3440430"/>
             <wp:effectExtent l="0" t="0" r="0" b="0"/>
             <wp:docPr id="17" name="Picture 17"/>
@@ -11046,7 +11051,7 @@
       <w:pPr>
         <w:pStyle w:val="Heading2"/>
       </w:pPr>
-      <w:bookmarkStart w:id="32" w:name="_Toc241697874"/>
+      <w:bookmarkStart w:id="32" w:name="_Toc241699112"/>
       <w:r>
         <w:t>What changes the count automatically</w:t>
       </w:r>
@@ -11450,7 +11455,7 @@
       <w:pPr>
         <w:pStyle w:val="Heading2"/>
       </w:pPr>
-      <w:bookmarkStart w:id="33" w:name="_Toc241697875"/>
+      <w:bookmarkStart w:id="33" w:name="_Toc241699113"/>
       <w:r>
         <w:lastRenderedPageBreak/>
         <w:t>Seeing the history</w:t>
@@ -11466,7 +11471,7 @@
       <w:pPr>
         <w:pStyle w:val="Heading2"/>
       </w:pPr>
-      <w:bookmarkStart w:id="34" w:name="_Toc241697876"/>
+      <w:bookmarkStart w:id="34" w:name="_Toc241699114"/>
       <w:r>
         <w:t>Notes for the inventory sheet</w:t>
       </w:r>
@@ -11515,7 +11520,7 @@
           <w:noProof/>
         </w:rPr>
         <w:drawing>
-          <wp:inline distT="0" distB="0" distL="0" distR="0" wp14:anchorId="1BA836B6" wp14:editId="1F479BDE">
+          <wp:inline distT="0" distB="0" distL="0" distR="0" wp14:anchorId="4BD1B134" wp14:editId="468804C3">
             <wp:extent cx="5120640" cy="3440430"/>
             <wp:effectExtent l="0" t="0" r="0" b="0"/>
             <wp:docPr id="18" name="Picture 18"/>
@@ -11569,7 +11574,7 @@
       <w:pPr>
         <w:pStyle w:val="Heading2"/>
       </w:pPr>
-      <w:bookmarkStart w:id="35" w:name="_Toc241697877"/>
+      <w:bookmarkStart w:id="35" w:name="_Toc241699115"/>
       <w:r>
         <w:t>Start and end counts</w:t>
       </w:r>
@@ -12092,7 +12097,7 @@
           <w:noProof/>
         </w:rPr>
         <w:drawing>
-          <wp:inline distT="0" distB="0" distL="0" distR="0" wp14:anchorId="19334C86" wp14:editId="600B5EFC">
+          <wp:inline distT="0" distB="0" distL="0" distR="0" wp14:anchorId="6B2B83C1" wp14:editId="7F6A77EC">
             <wp:extent cx="5486400" cy="3686175"/>
             <wp:effectExtent l="0" t="0" r="0" b="0"/>
             <wp:docPr id="19" name="Picture 19"/>
@@ -12232,7 +12237,7 @@
         <w:pStyle w:val="Heading1"/>
         <w:pageBreakBefore/>
       </w:pPr>
-      <w:bookmarkStart w:id="36" w:name="_Toc241697878"/>
+      <w:bookmarkStart w:id="36" w:name="_Toc241699116"/>
       <w:r>
         <w:lastRenderedPageBreak/>
         <w:t>Admin: setting up an event</w:t>
@@ -12257,7 +12262,7 @@
       <w:pPr>
         <w:pStyle w:val="Heading2"/>
       </w:pPr>
-      <w:bookmarkStart w:id="37" w:name="_Toc241697879"/>
+      <w:bookmarkStart w:id="37" w:name="_Toc241699117"/>
       <w:r>
         <w:t>Creating or editing an event</w:t>
       </w:r>
@@ -12274,7 +12279,7 @@
           <w:noProof/>
         </w:rPr>
         <w:drawing>
-          <wp:inline distT="0" distB="0" distL="0" distR="0" wp14:anchorId="2F47CD21" wp14:editId="70952DD2">
+          <wp:inline distT="0" distB="0" distL="0" distR="0" wp14:anchorId="32879FD5" wp14:editId="180B750A">
             <wp:extent cx="5760720" cy="1236154"/>
             <wp:effectExtent l="0" t="0" r="0" b="0"/>
             <wp:docPr id="20" name="Picture 20"/>
@@ -12614,7 +12619,7 @@
           <w:noProof/>
         </w:rPr>
         <w:drawing>
-          <wp:inline distT="0" distB="0" distL="0" distR="0" wp14:anchorId="260BD264" wp14:editId="2E931EF8">
+          <wp:inline distT="0" distB="0" distL="0" distR="0" wp14:anchorId="0A95BF20" wp14:editId="2DD1F4D6">
             <wp:extent cx="3840480" cy="2580322"/>
             <wp:effectExtent l="0" t="0" r="0" b="0"/>
             <wp:docPr id="21" name="Picture 21"/>
@@ -12736,7 +12741,7 @@
       <w:pPr>
         <w:pStyle w:val="Heading2"/>
       </w:pPr>
-      <w:bookmarkStart w:id="38" w:name="_Toc241697880"/>
+      <w:bookmarkStart w:id="38" w:name="_Toc241699118"/>
       <w:r>
         <w:t>Closing out an event</w:t>
       </w:r>
@@ -12903,7 +12908,7 @@
       <w:pPr>
         <w:pStyle w:val="Heading2"/>
       </w:pPr>
-      <w:bookmarkStart w:id="39" w:name="_Toc241697881"/>
+      <w:bookmarkStart w:id="39" w:name="_Toc241699119"/>
       <w:r>
         <w:t>Event sales sheets</w:t>
       </w:r>
@@ -12961,7 +12966,7 @@
           <w:noProof/>
         </w:rPr>
         <w:drawing>
-          <wp:inline distT="0" distB="0" distL="0" distR="0" wp14:anchorId="5D17E55C" wp14:editId="78C6EF62">
+          <wp:inline distT="0" distB="0" distL="0" distR="0" wp14:anchorId="6AAA70C9" wp14:editId="27B5ADF5">
             <wp:extent cx="4389120" cy="2948940"/>
             <wp:effectExtent l="0" t="0" r="0" b="0"/>
             <wp:docPr id="22" name="Picture 22"/>
@@ -13090,7 +13095,7 @@
           <w:noProof/>
         </w:rPr>
         <w:drawing>
-          <wp:inline distT="0" distB="0" distL="0" distR="0" wp14:anchorId="02DA7133" wp14:editId="113568E7">
+          <wp:inline distT="0" distB="0" distL="0" distR="0" wp14:anchorId="7FDF48CC" wp14:editId="33F8AE2D">
             <wp:extent cx="4206240" cy="5717858"/>
             <wp:effectExtent l="0" t="0" r="0" b="0"/>
             <wp:docPr id="23" name="Picture 23"/>
@@ -13182,7 +13187,7 @@
         <w:t>Email report</w:t>
       </w:r>
       <w:r>
-        <w:t>: email the whole event report to the director, treasurer or anyone else who needs it (see below).</w:t>
+        <w:t>: email all of these sheets as one PDF to the director, treasurer or anyone else who needs them (see below).</w:t>
       </w:r>
     </w:p>
     <w:p>
@@ -13228,7 +13233,7 @@
           <w:noProof/>
         </w:rPr>
         <w:drawing>
-          <wp:inline distT="0" distB="0" distL="0" distR="0" wp14:anchorId="49062250" wp14:editId="0B5F30FB">
+          <wp:inline distT="0" distB="0" distL="0" distR="0" wp14:anchorId="663EB5C2" wp14:editId="0ECFC346">
             <wp:extent cx="4389120" cy="2948940"/>
             <wp:effectExtent l="0" t="0" r="0" b="0"/>
             <wp:docPr id="24" name="Picture 24"/>
@@ -13280,7 +13285,7 @@
     </w:p>
     <w:p>
       <w:r>
-        <w:t>The email shows the event's totals, what was taken by card, cash, check, financing and layaway, the units sold, every completed sale, and the accessory inventory tally. The sales and inventory are also attached as spreadsheets that open in Excel.</w:t>
+        <w:t>The app puts the same sheets you see on this screen into a single PDF - the stat sheet, every completed sales sheet and the Accessory Inventory Sheet, one per page - and attaches it to the email along with your message.</w:t>
       </w:r>
     </w:p>
     <w:tbl>
@@ -13325,7 +13330,7 @@
               <w:t xml:space="preserve">Good to know:  </w:t>
             </w:r>
             <w:r>
-              <w:t>Only completed sales are included. If any orders are still on the sales floor or waiting at checkout, the email says how many so nobody is surprised later.</w:t>
+              <w:t>Making the PDF takes a moment for a big event; the app shows which page it's on. Keep the screen open until it says the email was sent. Only completed sales are included, so finish or void any open orders first (see *Closing out an event*).</w:t>
             </w:r>
           </w:p>
         </w:tc>
@@ -13341,7 +13346,7 @@
         <w:pStyle w:val="Heading1"/>
         <w:pageBreakBefore/>
       </w:pPr>
-      <w:bookmarkStart w:id="40" w:name="_Toc241697882"/>
+      <w:bookmarkStart w:id="40" w:name="_Toc241699120"/>
       <w:r>
         <w:lastRenderedPageBreak/>
         <w:t>Admin: managing the catalog</w:t>
@@ -13382,7 +13387,7 @@
           <w:noProof/>
         </w:rPr>
         <w:drawing>
-          <wp:inline distT="0" distB="0" distL="0" distR="0" wp14:anchorId="5DE6BF75" wp14:editId="784BE722">
+          <wp:inline distT="0" distB="0" distL="0" distR="0" wp14:anchorId="53830834" wp14:editId="64DEA06F">
             <wp:extent cx="5760720" cy="3870484"/>
             <wp:effectExtent l="0" t="0" r="0" b="0"/>
             <wp:docPr id="25" name="Picture 25"/>
@@ -13436,7 +13441,7 @@
       <w:pPr>
         <w:pStyle w:val="Heading2"/>
       </w:pPr>
-      <w:bookmarkStart w:id="41" w:name="_Toc241697883"/>
+      <w:bookmarkStart w:id="41" w:name="_Toc241699121"/>
       <w:r>
         <w:lastRenderedPageBreak/>
         <w:t>Adding or editing a product</w:t>
@@ -13454,7 +13459,7 @@
           <w:noProof/>
         </w:rPr>
         <w:drawing>
-          <wp:inline distT="0" distB="0" distL="0" distR="0" wp14:anchorId="12EEF851" wp14:editId="74B903BB">
+          <wp:inline distT="0" distB="0" distL="0" distR="0" wp14:anchorId="4BBDB198" wp14:editId="4752E3F1">
             <wp:extent cx="5486400" cy="3686175"/>
             <wp:effectExtent l="0" t="0" r="0" b="0"/>
             <wp:docPr id="26" name="Picture 26"/>
@@ -13877,7 +13882,7 @@
         </w:rPr>
         <w:lastRenderedPageBreak/>
         <w:drawing>
-          <wp:inline distT="0" distB="0" distL="0" distR="0" wp14:anchorId="78D101A2" wp14:editId="0538A8DA">
+          <wp:inline distT="0" distB="0" distL="0" distR="0" wp14:anchorId="51FF7894" wp14:editId="50C1B269">
             <wp:extent cx="5120640" cy="2130933"/>
             <wp:effectExtent l="0" t="0" r="0" b="0"/>
             <wp:docPr id="27" name="Picture 27"/>
@@ -14064,7 +14069,7 @@
       <w:pPr>
         <w:pStyle w:val="Heading2"/>
       </w:pPr>
-      <w:bookmarkStart w:id="42" w:name="_Toc241697884"/>
+      <w:bookmarkStart w:id="42" w:name="_Toc241699122"/>
       <w:r>
         <w:t>Delivery and services</w:t>
       </w:r>
@@ -14096,7 +14101,7 @@
         </w:rPr>
         <w:lastRenderedPageBreak/>
         <w:drawing>
-          <wp:inline distT="0" distB="0" distL="0" distR="0" wp14:anchorId="69B2768E" wp14:editId="7E7B0ABC">
+          <wp:inline distT="0" distB="0" distL="0" distR="0" wp14:anchorId="31E64E85" wp14:editId="6B5F1F21">
             <wp:extent cx="5760720" cy="3870484"/>
             <wp:effectExtent l="0" t="0" r="0" b="0"/>
             <wp:docPr id="28" name="Picture 28"/>
@@ -14526,7 +14531,7 @@
         <w:pStyle w:val="Heading1"/>
         <w:pageBreakBefore/>
       </w:pPr>
-      <w:bookmarkStart w:id="43" w:name="_Toc241697885"/>
+      <w:bookmarkStart w:id="43" w:name="_Toc241699123"/>
       <w:r>
         <w:lastRenderedPageBreak/>
         <w:t>Admin: managing the crew</w:t>
@@ -14558,7 +14563,7 @@
           <w:noProof/>
         </w:rPr>
         <w:drawing>
-          <wp:inline distT="0" distB="0" distL="0" distR="0" wp14:anchorId="5157D6BE" wp14:editId="31D60806">
+          <wp:inline distT="0" distB="0" distL="0" distR="0" wp14:anchorId="3B3A1486" wp14:editId="3E3222EF">
             <wp:extent cx="5760720" cy="1740218"/>
             <wp:effectExtent l="0" t="0" r="0" b="0"/>
             <wp:docPr id="29" name="Picture 29"/>
@@ -14830,7 +14835,7 @@
           <w:noProof/>
         </w:rPr>
         <w:drawing>
-          <wp:inline distT="0" distB="0" distL="0" distR="0" wp14:anchorId="7AFE8F37" wp14:editId="12C9244C">
+          <wp:inline distT="0" distB="0" distL="0" distR="0" wp14:anchorId="247304E4" wp14:editId="6B8F5F0A">
             <wp:extent cx="4023360" cy="2703195"/>
             <wp:effectExtent l="0" t="0" r="0" b="0"/>
             <wp:docPr id="30" name="Picture 30"/>
@@ -14910,7 +14915,7 @@
         <w:pStyle w:val="Heading1"/>
         <w:pageBreakBefore/>
       </w:pPr>
-      <w:bookmarkStart w:id="44" w:name="_Toc241697886"/>
+      <w:bookmarkStart w:id="44" w:name="_Toc241699124"/>
       <w:r>
         <w:lastRenderedPageBreak/>
         <w:t>Owner: permanent deletes</w:t>
@@ -14951,7 +14956,7 @@
           <w:noProof/>
         </w:rPr>
         <w:drawing>
-          <wp:inline distT="0" distB="0" distL="0" distR="0" wp14:anchorId="49824011" wp14:editId="24E09874">
+          <wp:inline distT="0" distB="0" distL="0" distR="0" wp14:anchorId="763DF605" wp14:editId="42141387">
             <wp:extent cx="4754880" cy="3312709"/>
             <wp:effectExtent l="0" t="0" r="0" b="0"/>
             <wp:docPr id="31" name="Picture 31"/>
@@ -15615,7 +15620,7 @@
         <w:pStyle w:val="Heading1"/>
         <w:pageBreakBefore/>
       </w:pPr>
-      <w:bookmarkStart w:id="45" w:name="_Toc241697887"/>
+      <w:bookmarkStart w:id="45" w:name="_Toc241699125"/>
       <w:r>
         <w:lastRenderedPageBreak/>
         <w:t>Tips and troubleshooting</w:t>
@@ -15980,7 +15985,7 @@
         <w:pStyle w:val="Heading1"/>
         <w:pageBreakBefore/>
       </w:pPr>
-      <w:bookmarkStart w:id="46" w:name="_Toc241697888"/>
+      <w:bookmarkStart w:id="46" w:name="_Toc241699126"/>
       <w:r>
         <w:lastRenderedPageBreak/>
         <w:t>Quick reference</w:t>
@@ -15991,7 +15996,7 @@
       <w:pPr>
         <w:pStyle w:val="Heading2"/>
       </w:pPr>
-      <w:bookmarkStart w:id="47" w:name="_Toc241697889"/>
+      <w:bookmarkStart w:id="47" w:name="_Toc241699127"/>
       <w:r>
         <w:t>Sales rep checklist</w:t>
       </w:r>
@@ -16135,7 +16140,7 @@
       <w:pPr>
         <w:pStyle w:val="Heading2"/>
       </w:pPr>
-      <w:bookmarkStart w:id="48" w:name="_Toc241697890"/>
+      <w:bookmarkStart w:id="48" w:name="_Toc241699128"/>
       <w:r>
         <w:t>Checkout checklist</w:t>
       </w:r>
@@ -16323,7 +16328,7 @@
       <w:pPr>
         <w:pStyle w:val="Heading2"/>
       </w:pPr>
-      <w:bookmarkStart w:id="49" w:name="_Toc241697891"/>
+      <w:bookmarkStart w:id="49" w:name="_Toc241699129"/>
       <w:r>
         <w:t>Inventory counts</w:t>
       </w:r>
@@ -16527,7 +16532,7 @@
       <w:pPr>
         <w:pStyle w:val="Heading2"/>
       </w:pPr>
-      <w:bookmarkStart w:id="50" w:name="_Toc241697892"/>
+      <w:bookmarkStart w:id="50" w:name="_Toc241699130"/>
       <w:r>
         <w:t>Order status at a glance</w:t>
       </w:r>
@@ -17147,31 +17152,31 @@
       </w:rPr>
     </w:lvl>
   </w:abstractNum>
-  <w:num w:numId="1" w16cid:durableId="194082797">
+  <w:num w:numId="1" w16cid:durableId="1142772082">
     <w:abstractNumId w:val="8"/>
   </w:num>
-  <w:num w:numId="2" w16cid:durableId="603153882">
+  <w:num w:numId="2" w16cid:durableId="1137335535">
     <w:abstractNumId w:val="6"/>
   </w:num>
-  <w:num w:numId="3" w16cid:durableId="1973822275">
+  <w:num w:numId="3" w16cid:durableId="784733113">
     <w:abstractNumId w:val="5"/>
   </w:num>
-  <w:num w:numId="4" w16cid:durableId="997073054">
+  <w:num w:numId="4" w16cid:durableId="1909610008">
     <w:abstractNumId w:val="4"/>
   </w:num>
-  <w:num w:numId="5" w16cid:durableId="2090495871">
+  <w:num w:numId="5" w16cid:durableId="894514313">
     <w:abstractNumId w:val="7"/>
   </w:num>
-  <w:num w:numId="6" w16cid:durableId="1627464975">
+  <w:num w:numId="6" w16cid:durableId="661664348">
     <w:abstractNumId w:val="3"/>
   </w:num>
-  <w:num w:numId="7" w16cid:durableId="746458070">
+  <w:num w:numId="7" w16cid:durableId="878709966">
     <w:abstractNumId w:val="2"/>
   </w:num>
-  <w:num w:numId="8" w16cid:durableId="1397439832">
+  <w:num w:numId="8" w16cid:durableId="1918510911">
     <w:abstractNumId w:val="1"/>
   </w:num>
-  <w:num w:numId="9" w16cid:durableId="1333410129">
+  <w:num w:numId="9" w16cid:durableId="501161021">
     <w:abstractNumId w:val="0"/>
   </w:num>
 </w:numbering>
@@ -28563,7 +28568,7 @@
     <w:autoRedefine/>
     <w:uiPriority w:val="39"/>
     <w:unhideWhenUsed/>
-    <w:rsid w:val="00A865E4"/>
+    <w:rsid w:val="0027593C"/>
     <w:pPr>
       <w:spacing w:after="100"/>
     </w:pPr>
@@ -28575,7 +28580,7 @@
     <w:autoRedefine/>
     <w:uiPriority w:val="39"/>
     <w:unhideWhenUsed/>
-    <w:rsid w:val="00A865E4"/>
+    <w:rsid w:val="0027593C"/>
     <w:pPr>
       <w:spacing w:after="100"/>
       <w:ind w:left="220"/>
@@ -28586,7 +28591,7 @@
     <w:basedOn w:val="DefaultParagraphFont"/>
     <w:uiPriority w:val="99"/>
     <w:unhideWhenUsed/>
-    <w:rsid w:val="00A865E4"/>
+    <w:rsid w:val="0027593C"/>
     <w:rPr>
       <w:color w:val="0000FF" w:themeColor="hyperlink"/>
       <w:u w:val="single"/>

</xml_diff>

<commit_message>
Add business details, receipt subject and dashboard levels to Settings
The Settings page now has three cards, each saved on its own:

- Business details: the company name and customer service number on
  every sales sheet and in emails, and the app name in the menu bar,
  sign-in screen, browser tab and as the email sender (EMAIL_FROM_NAME
  now only overrides it).
- Receipt email: an editable subject line alongside the message, with a
  {CompanyName} placeholder; the default sign-off uses it.
- Dashboard: the net sales for the first star and between stars, and
  the running-low level for Stock to watch and the Inventory screen.

Settings are stored one row per changed value in AppSettings, read by a
SettingsProvider on the dashboard (GET /api/settings/general is open so
the sign-in screen can show the app name) and validated on save.
README, Raspberry Pi guide and user manual updated.

Co-Authored-By: Claude Opus 5.5 <noreply@anthropic.com>
</commit_message>
<xml_diff>
--- a/Documents/CFS Sales App User Guide.docx
+++ b/Documents/CFS Sales App User Guide.docx
@@ -345,7 +345,7 @@
       <w:r>
         <w:fldChar w:fldCharType="separate"/>
       </w:r>
-      <w:hyperlink w:anchor="_Toc241701835" w:history="1">
+      <w:hyperlink w:anchor="_Toc241702844" w:history="1">
         <w:r>
           <w:rPr>
             <w:rStyle w:val="Hyperlink"/>
@@ -372,7 +372,7 @@
             <w:noProof/>
             <w:webHidden/>
           </w:rPr>
-          <w:instrText xml:space="preserve"> PAGEREF _Toc241701835 \h </w:instrText>
+          <w:instrText xml:space="preserve"> PAGEREF _Toc241702844 \h </w:instrText>
         </w:r>
         <w:r>
           <w:rPr>
@@ -413,7 +413,7 @@
           <w:noProof/>
         </w:rPr>
       </w:pPr>
-      <w:hyperlink w:anchor="_Toc241701836" w:history="1">
+      <w:hyperlink w:anchor="_Toc241702845" w:history="1">
         <w:r>
           <w:rPr>
             <w:rStyle w:val="Hyperlink"/>
@@ -440,7 +440,7 @@
             <w:noProof/>
             <w:webHidden/>
           </w:rPr>
-          <w:instrText xml:space="preserve"> PAGEREF _Toc241701836 \h </w:instrText>
+          <w:instrText xml:space="preserve"> PAGEREF _Toc241702845 \h </w:instrText>
         </w:r>
         <w:r>
           <w:rPr>
@@ -481,7 +481,7 @@
           <w:noProof/>
         </w:rPr>
       </w:pPr>
-      <w:hyperlink w:anchor="_Toc241701837" w:history="1">
+      <w:hyperlink w:anchor="_Toc241702846" w:history="1">
         <w:r>
           <w:rPr>
             <w:rStyle w:val="Hyperlink"/>
@@ -508,7 +508,7 @@
             <w:noProof/>
             <w:webHidden/>
           </w:rPr>
-          <w:instrText xml:space="preserve"> PAGEREF _Toc241701837 \h </w:instrText>
+          <w:instrText xml:space="preserve"> PAGEREF _Toc241702846 \h </w:instrText>
         </w:r>
         <w:r>
           <w:rPr>
@@ -549,7 +549,7 @@
           <w:noProof/>
         </w:rPr>
       </w:pPr>
-      <w:hyperlink w:anchor="_Toc241701838" w:history="1">
+      <w:hyperlink w:anchor="_Toc241702847" w:history="1">
         <w:r>
           <w:rPr>
             <w:rStyle w:val="Hyperlink"/>
@@ -576,7 +576,7 @@
             <w:noProof/>
             <w:webHidden/>
           </w:rPr>
-          <w:instrText xml:space="preserve"> PAGEREF _Toc241701838 \h </w:instrText>
+          <w:instrText xml:space="preserve"> PAGEREF _Toc241702847 \h </w:instrText>
         </w:r>
         <w:r>
           <w:rPr>
@@ -617,7 +617,7 @@
           <w:noProof/>
         </w:rPr>
       </w:pPr>
-      <w:hyperlink w:anchor="_Toc241701839" w:history="1">
+      <w:hyperlink w:anchor="_Toc241702848" w:history="1">
         <w:r>
           <w:rPr>
             <w:rStyle w:val="Hyperlink"/>
@@ -644,7 +644,7 @@
             <w:noProof/>
             <w:webHidden/>
           </w:rPr>
-          <w:instrText xml:space="preserve"> PAGEREF _Toc241701839 \h </w:instrText>
+          <w:instrText xml:space="preserve"> PAGEREF _Toc241702848 \h </w:instrText>
         </w:r>
         <w:r>
           <w:rPr>
@@ -685,7 +685,7 @@
           <w:noProof/>
         </w:rPr>
       </w:pPr>
-      <w:hyperlink w:anchor="_Toc241701840" w:history="1">
+      <w:hyperlink w:anchor="_Toc241702849" w:history="1">
         <w:r>
           <w:rPr>
             <w:rStyle w:val="Hyperlink"/>
@@ -712,7 +712,7 @@
             <w:noProof/>
             <w:webHidden/>
           </w:rPr>
-          <w:instrText xml:space="preserve"> PAGEREF _Toc241701840 \h </w:instrText>
+          <w:instrText xml:space="preserve"> PAGEREF _Toc241702849 \h </w:instrText>
         </w:r>
         <w:r>
           <w:rPr>
@@ -753,7 +753,7 @@
           <w:noProof/>
         </w:rPr>
       </w:pPr>
-      <w:hyperlink w:anchor="_Toc241701841" w:history="1">
+      <w:hyperlink w:anchor="_Toc241702850" w:history="1">
         <w:r>
           <w:rPr>
             <w:rStyle w:val="Hyperlink"/>
@@ -780,7 +780,7 @@
             <w:noProof/>
             <w:webHidden/>
           </w:rPr>
-          <w:instrText xml:space="preserve"> PAGEREF _Toc241701841 \h </w:instrText>
+          <w:instrText xml:space="preserve"> PAGEREF _Toc241702850 \h </w:instrText>
         </w:r>
         <w:r>
           <w:rPr>
@@ -821,7 +821,7 @@
           <w:noProof/>
         </w:rPr>
       </w:pPr>
-      <w:hyperlink w:anchor="_Toc241701842" w:history="1">
+      <w:hyperlink w:anchor="_Toc241702851" w:history="1">
         <w:r>
           <w:rPr>
             <w:rStyle w:val="Hyperlink"/>
@@ -848,7 +848,7 @@
             <w:noProof/>
             <w:webHidden/>
           </w:rPr>
-          <w:instrText xml:space="preserve"> PAGEREF _Toc241701842 \h </w:instrText>
+          <w:instrText xml:space="preserve"> PAGEREF _Toc241702851 \h </w:instrText>
         </w:r>
         <w:r>
           <w:rPr>
@@ -889,7 +889,7 @@
           <w:noProof/>
         </w:rPr>
       </w:pPr>
-      <w:hyperlink w:anchor="_Toc241701843" w:history="1">
+      <w:hyperlink w:anchor="_Toc241702852" w:history="1">
         <w:r>
           <w:rPr>
             <w:rStyle w:val="Hyperlink"/>
@@ -916,7 +916,7 @@
             <w:noProof/>
             <w:webHidden/>
           </w:rPr>
-          <w:instrText xml:space="preserve"> PAGEREF _Toc241701843 \h </w:instrText>
+          <w:instrText xml:space="preserve"> PAGEREF _Toc241702852 \h </w:instrText>
         </w:r>
         <w:r>
           <w:rPr>
@@ -957,7 +957,7 @@
           <w:noProof/>
         </w:rPr>
       </w:pPr>
-      <w:hyperlink w:anchor="_Toc241701844" w:history="1">
+      <w:hyperlink w:anchor="_Toc241702853" w:history="1">
         <w:r>
           <w:rPr>
             <w:rStyle w:val="Hyperlink"/>
@@ -984,7 +984,7 @@
             <w:noProof/>
             <w:webHidden/>
           </w:rPr>
-          <w:instrText xml:space="preserve"> PAGEREF _Toc241701844 \h </w:instrText>
+          <w:instrText xml:space="preserve"> PAGEREF _Toc241702853 \h </w:instrText>
         </w:r>
         <w:r>
           <w:rPr>
@@ -1025,7 +1025,7 @@
           <w:noProof/>
         </w:rPr>
       </w:pPr>
-      <w:hyperlink w:anchor="_Toc241701845" w:history="1">
+      <w:hyperlink w:anchor="_Toc241702854" w:history="1">
         <w:r>
           <w:rPr>
             <w:rStyle w:val="Hyperlink"/>
@@ -1052,7 +1052,7 @@
             <w:noProof/>
             <w:webHidden/>
           </w:rPr>
-          <w:instrText xml:space="preserve"> PAGEREF _Toc241701845 \h </w:instrText>
+          <w:instrText xml:space="preserve"> PAGEREF _Toc241702854 \h </w:instrText>
         </w:r>
         <w:r>
           <w:rPr>
@@ -1093,7 +1093,7 @@
           <w:noProof/>
         </w:rPr>
       </w:pPr>
-      <w:hyperlink w:anchor="_Toc241701846" w:history="1">
+      <w:hyperlink w:anchor="_Toc241702855" w:history="1">
         <w:r>
           <w:rPr>
             <w:rStyle w:val="Hyperlink"/>
@@ -1120,7 +1120,7 @@
             <w:noProof/>
             <w:webHidden/>
           </w:rPr>
-          <w:instrText xml:space="preserve"> PAGEREF _Toc241701846 \h </w:instrText>
+          <w:instrText xml:space="preserve"> PAGEREF _Toc241702855 \h </w:instrText>
         </w:r>
         <w:r>
           <w:rPr>
@@ -1161,7 +1161,7 @@
           <w:noProof/>
         </w:rPr>
       </w:pPr>
-      <w:hyperlink w:anchor="_Toc241701847" w:history="1">
+      <w:hyperlink w:anchor="_Toc241702856" w:history="1">
         <w:r>
           <w:rPr>
             <w:rStyle w:val="Hyperlink"/>
@@ -1188,7 +1188,7 @@
             <w:noProof/>
             <w:webHidden/>
           </w:rPr>
-          <w:instrText xml:space="preserve"> PAGEREF _Toc241701847 \h </w:instrText>
+          <w:instrText xml:space="preserve"> PAGEREF _Toc241702856 \h </w:instrText>
         </w:r>
         <w:r>
           <w:rPr>
@@ -1229,7 +1229,7 @@
           <w:noProof/>
         </w:rPr>
       </w:pPr>
-      <w:hyperlink w:anchor="_Toc241701848" w:history="1">
+      <w:hyperlink w:anchor="_Toc241702857" w:history="1">
         <w:r>
           <w:rPr>
             <w:rStyle w:val="Hyperlink"/>
@@ -1256,7 +1256,7 @@
             <w:noProof/>
             <w:webHidden/>
           </w:rPr>
-          <w:instrText xml:space="preserve"> PAGEREF _Toc241701848 \h </w:instrText>
+          <w:instrText xml:space="preserve"> PAGEREF _Toc241702857 \h </w:instrText>
         </w:r>
         <w:r>
           <w:rPr>
@@ -1297,7 +1297,7 @@
           <w:noProof/>
         </w:rPr>
       </w:pPr>
-      <w:hyperlink w:anchor="_Toc241701849" w:history="1">
+      <w:hyperlink w:anchor="_Toc241702858" w:history="1">
         <w:r>
           <w:rPr>
             <w:rStyle w:val="Hyperlink"/>
@@ -1324,7 +1324,7 @@
             <w:noProof/>
             <w:webHidden/>
           </w:rPr>
-          <w:instrText xml:space="preserve"> PAGEREF _Toc241701849 \h </w:instrText>
+          <w:instrText xml:space="preserve"> PAGEREF _Toc241702858 \h </w:instrText>
         </w:r>
         <w:r>
           <w:rPr>
@@ -1365,7 +1365,7 @@
           <w:noProof/>
         </w:rPr>
       </w:pPr>
-      <w:hyperlink w:anchor="_Toc241701850" w:history="1">
+      <w:hyperlink w:anchor="_Toc241702859" w:history="1">
         <w:r>
           <w:rPr>
             <w:rStyle w:val="Hyperlink"/>
@@ -1392,7 +1392,7 @@
             <w:noProof/>
             <w:webHidden/>
           </w:rPr>
-          <w:instrText xml:space="preserve"> PAGEREF _Toc241701850 \h </w:instrText>
+          <w:instrText xml:space="preserve"> PAGEREF _Toc241702859 \h </w:instrText>
         </w:r>
         <w:r>
           <w:rPr>
@@ -1433,7 +1433,7 @@
           <w:noProof/>
         </w:rPr>
       </w:pPr>
-      <w:hyperlink w:anchor="_Toc241701851" w:history="1">
+      <w:hyperlink w:anchor="_Toc241702860" w:history="1">
         <w:r>
           <w:rPr>
             <w:rStyle w:val="Hyperlink"/>
@@ -1460,7 +1460,7 @@
             <w:noProof/>
             <w:webHidden/>
           </w:rPr>
-          <w:instrText xml:space="preserve"> PAGEREF _Toc241701851 \h </w:instrText>
+          <w:instrText xml:space="preserve"> PAGEREF _Toc241702860 \h </w:instrText>
         </w:r>
         <w:r>
           <w:rPr>
@@ -1501,7 +1501,7 @@
           <w:noProof/>
         </w:rPr>
       </w:pPr>
-      <w:hyperlink w:anchor="_Toc241701852" w:history="1">
+      <w:hyperlink w:anchor="_Toc241702861" w:history="1">
         <w:r>
           <w:rPr>
             <w:rStyle w:val="Hyperlink"/>
@@ -1528,7 +1528,7 @@
             <w:noProof/>
             <w:webHidden/>
           </w:rPr>
-          <w:instrText xml:space="preserve"> PAGEREF _Toc241701852 \h </w:instrText>
+          <w:instrText xml:space="preserve"> PAGEREF _Toc241702861 \h </w:instrText>
         </w:r>
         <w:r>
           <w:rPr>
@@ -1569,7 +1569,7 @@
           <w:noProof/>
         </w:rPr>
       </w:pPr>
-      <w:hyperlink w:anchor="_Toc241701853" w:history="1">
+      <w:hyperlink w:anchor="_Toc241702862" w:history="1">
         <w:r>
           <w:rPr>
             <w:rStyle w:val="Hyperlink"/>
@@ -1596,7 +1596,7 @@
             <w:noProof/>
             <w:webHidden/>
           </w:rPr>
-          <w:instrText xml:space="preserve"> PAGEREF _Toc241701853 \h </w:instrText>
+          <w:instrText xml:space="preserve"> PAGEREF _Toc241702862 \h </w:instrText>
         </w:r>
         <w:r>
           <w:rPr>
@@ -1637,7 +1637,7 @@
           <w:noProof/>
         </w:rPr>
       </w:pPr>
-      <w:hyperlink w:anchor="_Toc241701854" w:history="1">
+      <w:hyperlink w:anchor="_Toc241702863" w:history="1">
         <w:r>
           <w:rPr>
             <w:rStyle w:val="Hyperlink"/>
@@ -1664,7 +1664,7 @@
             <w:noProof/>
             <w:webHidden/>
           </w:rPr>
-          <w:instrText xml:space="preserve"> PAGEREF _Toc241701854 \h </w:instrText>
+          <w:instrText xml:space="preserve"> PAGEREF _Toc241702863 \h </w:instrText>
         </w:r>
         <w:r>
           <w:rPr>
@@ -1705,7 +1705,7 @@
           <w:noProof/>
         </w:rPr>
       </w:pPr>
-      <w:hyperlink w:anchor="_Toc241701855" w:history="1">
+      <w:hyperlink w:anchor="_Toc241702864" w:history="1">
         <w:r>
           <w:rPr>
             <w:rStyle w:val="Hyperlink"/>
@@ -1732,7 +1732,7 @@
             <w:noProof/>
             <w:webHidden/>
           </w:rPr>
-          <w:instrText xml:space="preserve"> PAGEREF _Toc241701855 \h </w:instrText>
+          <w:instrText xml:space="preserve"> PAGEREF _Toc241702864 \h </w:instrText>
         </w:r>
         <w:r>
           <w:rPr>
@@ -1773,7 +1773,7 @@
           <w:noProof/>
         </w:rPr>
       </w:pPr>
-      <w:hyperlink w:anchor="_Toc241701856" w:history="1">
+      <w:hyperlink w:anchor="_Toc241702865" w:history="1">
         <w:r>
           <w:rPr>
             <w:rStyle w:val="Hyperlink"/>
@@ -1800,7 +1800,7 @@
             <w:noProof/>
             <w:webHidden/>
           </w:rPr>
-          <w:instrText xml:space="preserve"> PAGEREF _Toc241701856 \h </w:instrText>
+          <w:instrText xml:space="preserve"> PAGEREF _Toc241702865 \h </w:instrText>
         </w:r>
         <w:r>
           <w:rPr>
@@ -1841,7 +1841,7 @@
           <w:noProof/>
         </w:rPr>
       </w:pPr>
-      <w:hyperlink w:anchor="_Toc241701857" w:history="1">
+      <w:hyperlink w:anchor="_Toc241702866" w:history="1">
         <w:r>
           <w:rPr>
             <w:rStyle w:val="Hyperlink"/>
@@ -1868,7 +1868,7 @@
             <w:noProof/>
             <w:webHidden/>
           </w:rPr>
-          <w:instrText xml:space="preserve"> PAGEREF _Toc241701857 \h </w:instrText>
+          <w:instrText xml:space="preserve"> PAGEREF _Toc241702866 \h </w:instrText>
         </w:r>
         <w:r>
           <w:rPr>
@@ -1909,7 +1909,7 @@
           <w:noProof/>
         </w:rPr>
       </w:pPr>
-      <w:hyperlink w:anchor="_Toc241701858" w:history="1">
+      <w:hyperlink w:anchor="_Toc241702867" w:history="1">
         <w:r>
           <w:rPr>
             <w:rStyle w:val="Hyperlink"/>
@@ -1936,7 +1936,7 @@
             <w:noProof/>
             <w:webHidden/>
           </w:rPr>
-          <w:instrText xml:space="preserve"> PAGEREF _Toc241701858 \h </w:instrText>
+          <w:instrText xml:space="preserve"> PAGEREF _Toc241702867 \h </w:instrText>
         </w:r>
         <w:r>
           <w:rPr>
@@ -1977,7 +1977,7 @@
           <w:noProof/>
         </w:rPr>
       </w:pPr>
-      <w:hyperlink w:anchor="_Toc241701859" w:history="1">
+      <w:hyperlink w:anchor="_Toc241702868" w:history="1">
         <w:r>
           <w:rPr>
             <w:rStyle w:val="Hyperlink"/>
@@ -2004,7 +2004,7 @@
             <w:noProof/>
             <w:webHidden/>
           </w:rPr>
-          <w:instrText xml:space="preserve"> PAGEREF _Toc241701859 \h </w:instrText>
+          <w:instrText xml:space="preserve"> PAGEREF _Toc241702868 \h </w:instrText>
         </w:r>
         <w:r>
           <w:rPr>
@@ -2045,7 +2045,7 @@
           <w:noProof/>
         </w:rPr>
       </w:pPr>
-      <w:hyperlink w:anchor="_Toc241701860" w:history="1">
+      <w:hyperlink w:anchor="_Toc241702869" w:history="1">
         <w:r>
           <w:rPr>
             <w:rStyle w:val="Hyperlink"/>
@@ -2072,7 +2072,7 @@
             <w:noProof/>
             <w:webHidden/>
           </w:rPr>
-          <w:instrText xml:space="preserve"> PAGEREF _Toc241701860 \h </w:instrText>
+          <w:instrText xml:space="preserve"> PAGEREF _Toc241702869 \h </w:instrText>
         </w:r>
         <w:r>
           <w:rPr>
@@ -2113,7 +2113,7 @@
           <w:noProof/>
         </w:rPr>
       </w:pPr>
-      <w:hyperlink w:anchor="_Toc241701861" w:history="1">
+      <w:hyperlink w:anchor="_Toc241702870" w:history="1">
         <w:r>
           <w:rPr>
             <w:rStyle w:val="Hyperlink"/>
@@ -2140,7 +2140,7 @@
             <w:noProof/>
             <w:webHidden/>
           </w:rPr>
-          <w:instrText xml:space="preserve"> PAGEREF _Toc241701861 \h </w:instrText>
+          <w:instrText xml:space="preserve"> PAGEREF _Toc241702870 \h </w:instrText>
         </w:r>
         <w:r>
           <w:rPr>
@@ -2181,7 +2181,7 @@
           <w:noProof/>
         </w:rPr>
       </w:pPr>
-      <w:hyperlink w:anchor="_Toc241701862" w:history="1">
+      <w:hyperlink w:anchor="_Toc241702871" w:history="1">
         <w:r>
           <w:rPr>
             <w:rStyle w:val="Hyperlink"/>
@@ -2208,7 +2208,7 @@
             <w:noProof/>
             <w:webHidden/>
           </w:rPr>
-          <w:instrText xml:space="preserve"> PAGEREF _Toc241701862 \h </w:instrText>
+          <w:instrText xml:space="preserve"> PAGEREF _Toc241702871 \h </w:instrText>
         </w:r>
         <w:r>
           <w:rPr>
@@ -2249,7 +2249,7 @@
           <w:noProof/>
         </w:rPr>
       </w:pPr>
-      <w:hyperlink w:anchor="_Toc241701863" w:history="1">
+      <w:hyperlink w:anchor="_Toc241702872" w:history="1">
         <w:r>
           <w:rPr>
             <w:rStyle w:val="Hyperlink"/>
@@ -2276,7 +2276,7 @@
             <w:noProof/>
             <w:webHidden/>
           </w:rPr>
-          <w:instrText xml:space="preserve"> PAGEREF _Toc241701863 \h </w:instrText>
+          <w:instrText xml:space="preserve"> PAGEREF _Toc241702872 \h </w:instrText>
         </w:r>
         <w:r>
           <w:rPr>
@@ -2317,7 +2317,7 @@
           <w:noProof/>
         </w:rPr>
       </w:pPr>
-      <w:hyperlink w:anchor="_Toc241701864" w:history="1">
+      <w:hyperlink w:anchor="_Toc241702873" w:history="1">
         <w:r>
           <w:rPr>
             <w:rStyle w:val="Hyperlink"/>
@@ -2344,7 +2344,7 @@
             <w:noProof/>
             <w:webHidden/>
           </w:rPr>
-          <w:instrText xml:space="preserve"> PAGEREF _Toc241701864 \h </w:instrText>
+          <w:instrText xml:space="preserve"> PAGEREF _Toc241702873 \h </w:instrText>
         </w:r>
         <w:r>
           <w:rPr>
@@ -2385,7 +2385,7 @@
           <w:noProof/>
         </w:rPr>
       </w:pPr>
-      <w:hyperlink w:anchor="_Toc241701865" w:history="1">
+      <w:hyperlink w:anchor="_Toc241702874" w:history="1">
         <w:r>
           <w:rPr>
             <w:rStyle w:val="Hyperlink"/>
@@ -2412,7 +2412,7 @@
             <w:noProof/>
             <w:webHidden/>
           </w:rPr>
-          <w:instrText xml:space="preserve"> PAGEREF _Toc241701865 \h </w:instrText>
+          <w:instrText xml:space="preserve"> PAGEREF _Toc241702874 \h </w:instrText>
         </w:r>
         <w:r>
           <w:rPr>
@@ -2453,7 +2453,7 @@
           <w:noProof/>
         </w:rPr>
       </w:pPr>
-      <w:hyperlink w:anchor="_Toc241701866" w:history="1">
+      <w:hyperlink w:anchor="_Toc241702875" w:history="1">
         <w:r>
           <w:rPr>
             <w:rStyle w:val="Hyperlink"/>
@@ -2480,7 +2480,7 @@
             <w:noProof/>
             <w:webHidden/>
           </w:rPr>
-          <w:instrText xml:space="preserve"> PAGEREF _Toc241701866 \h </w:instrText>
+          <w:instrText xml:space="preserve"> PAGEREF _Toc241702875 \h </w:instrText>
         </w:r>
         <w:r>
           <w:rPr>
@@ -2521,7 +2521,7 @@
           <w:noProof/>
         </w:rPr>
       </w:pPr>
-      <w:hyperlink w:anchor="_Toc241701867" w:history="1">
+      <w:hyperlink w:anchor="_Toc241702876" w:history="1">
         <w:r>
           <w:rPr>
             <w:rStyle w:val="Hyperlink"/>
@@ -2548,7 +2548,7 @@
             <w:noProof/>
             <w:webHidden/>
           </w:rPr>
-          <w:instrText xml:space="preserve"> PAGEREF _Toc241701867 \h </w:instrText>
+          <w:instrText xml:space="preserve"> PAGEREF _Toc241702876 \h </w:instrText>
         </w:r>
         <w:r>
           <w:rPr>
@@ -2589,7 +2589,7 @@
           <w:noProof/>
         </w:rPr>
       </w:pPr>
-      <w:hyperlink w:anchor="_Toc241701868" w:history="1">
+      <w:hyperlink w:anchor="_Toc241702877" w:history="1">
         <w:r>
           <w:rPr>
             <w:rStyle w:val="Hyperlink"/>
@@ -2616,7 +2616,7 @@
             <w:noProof/>
             <w:webHidden/>
           </w:rPr>
-          <w:instrText xml:space="preserve"> PAGEREF _Toc241701868 \h </w:instrText>
+          <w:instrText xml:space="preserve"> PAGEREF _Toc241702877 \h </w:instrText>
         </w:r>
         <w:r>
           <w:rPr>
@@ -2657,7 +2657,7 @@
           <w:noProof/>
         </w:rPr>
       </w:pPr>
-      <w:hyperlink w:anchor="_Toc241701869" w:history="1">
+      <w:hyperlink w:anchor="_Toc241702878" w:history="1">
         <w:r>
           <w:rPr>
             <w:rStyle w:val="Hyperlink"/>
@@ -2684,7 +2684,7 @@
             <w:noProof/>
             <w:webHidden/>
           </w:rPr>
-          <w:instrText xml:space="preserve"> PAGEREF _Toc241701869 \h </w:instrText>
+          <w:instrText xml:space="preserve"> PAGEREF _Toc241702878 \h </w:instrText>
         </w:r>
         <w:r>
           <w:rPr>
@@ -2725,7 +2725,7 @@
           <w:noProof/>
         </w:rPr>
       </w:pPr>
-      <w:hyperlink w:anchor="_Toc241701870" w:history="1">
+      <w:hyperlink w:anchor="_Toc241702879" w:history="1">
         <w:r>
           <w:rPr>
             <w:rStyle w:val="Hyperlink"/>
@@ -2752,7 +2752,7 @@
             <w:noProof/>
             <w:webHidden/>
           </w:rPr>
-          <w:instrText xml:space="preserve"> PAGEREF _Toc241701870 \h </w:instrText>
+          <w:instrText xml:space="preserve"> PAGEREF _Toc241702879 \h </w:instrText>
         </w:r>
         <w:r>
           <w:rPr>
@@ -2793,7 +2793,7 @@
           <w:noProof/>
         </w:rPr>
       </w:pPr>
-      <w:hyperlink w:anchor="_Toc241701871" w:history="1">
+      <w:hyperlink w:anchor="_Toc241702880" w:history="1">
         <w:r>
           <w:rPr>
             <w:rStyle w:val="Hyperlink"/>
@@ -2820,7 +2820,7 @@
             <w:noProof/>
             <w:webHidden/>
           </w:rPr>
-          <w:instrText xml:space="preserve"> PAGEREF _Toc241701871 \h </w:instrText>
+          <w:instrText xml:space="preserve"> PAGEREF _Toc241702880 \h </w:instrText>
         </w:r>
         <w:r>
           <w:rPr>
@@ -2861,7 +2861,7 @@
           <w:noProof/>
         </w:rPr>
       </w:pPr>
-      <w:hyperlink w:anchor="_Toc241701872" w:history="1">
+      <w:hyperlink w:anchor="_Toc241702881" w:history="1">
         <w:r>
           <w:rPr>
             <w:rStyle w:val="Hyperlink"/>
@@ -2888,7 +2888,7 @@
             <w:noProof/>
             <w:webHidden/>
           </w:rPr>
-          <w:instrText xml:space="preserve"> PAGEREF _Toc241701872 \h </w:instrText>
+          <w:instrText xml:space="preserve"> PAGEREF _Toc241702881 \h </w:instrText>
         </w:r>
         <w:r>
           <w:rPr>
@@ -2929,7 +2929,7 @@
           <w:noProof/>
         </w:rPr>
       </w:pPr>
-      <w:hyperlink w:anchor="_Toc241701873" w:history="1">
+      <w:hyperlink w:anchor="_Toc241702882" w:history="1">
         <w:r>
           <w:rPr>
             <w:rStyle w:val="Hyperlink"/>
@@ -2956,7 +2956,7 @@
             <w:noProof/>
             <w:webHidden/>
           </w:rPr>
-          <w:instrText xml:space="preserve"> PAGEREF _Toc241701873 \h </w:instrText>
+          <w:instrText xml:space="preserve"> PAGEREF _Toc241702882 \h </w:instrText>
         </w:r>
         <w:r>
           <w:rPr>
@@ -2997,7 +2997,7 @@
           <w:noProof/>
         </w:rPr>
       </w:pPr>
-      <w:hyperlink w:anchor="_Toc241701874" w:history="1">
+      <w:hyperlink w:anchor="_Toc241702883" w:history="1">
         <w:r>
           <w:rPr>
             <w:rStyle w:val="Hyperlink"/>
@@ -3024,7 +3024,7 @@
             <w:noProof/>
             <w:webHidden/>
           </w:rPr>
-          <w:instrText xml:space="preserve"> PAGEREF _Toc241701874 \h </w:instrText>
+          <w:instrText xml:space="preserve"> PAGEREF _Toc241702883 \h </w:instrText>
         </w:r>
         <w:r>
           <w:rPr>
@@ -3065,7 +3065,7 @@
           <w:noProof/>
         </w:rPr>
       </w:pPr>
-      <w:hyperlink w:anchor="_Toc241701875" w:history="1">
+      <w:hyperlink w:anchor="_Toc241702884" w:history="1">
         <w:r>
           <w:rPr>
             <w:rStyle w:val="Hyperlink"/>
@@ -3092,7 +3092,7 @@
             <w:noProof/>
             <w:webHidden/>
           </w:rPr>
-          <w:instrText xml:space="preserve"> PAGEREF _Toc241701875 \h </w:instrText>
+          <w:instrText xml:space="preserve"> PAGEREF _Toc241702884 \h </w:instrText>
         </w:r>
         <w:r>
           <w:rPr>
@@ -3133,7 +3133,7 @@
           <w:noProof/>
         </w:rPr>
       </w:pPr>
-      <w:hyperlink w:anchor="_Toc241701876" w:history="1">
+      <w:hyperlink w:anchor="_Toc241702885" w:history="1">
         <w:r>
           <w:rPr>
             <w:rStyle w:val="Hyperlink"/>
@@ -3160,7 +3160,7 @@
             <w:noProof/>
             <w:webHidden/>
           </w:rPr>
-          <w:instrText xml:space="preserve"> PAGEREF _Toc241701876 \h </w:instrText>
+          <w:instrText xml:space="preserve"> PAGEREF _Toc241702885 \h </w:instrText>
         </w:r>
         <w:r>
           <w:rPr>
@@ -3201,7 +3201,7 @@
           <w:noProof/>
         </w:rPr>
       </w:pPr>
-      <w:hyperlink w:anchor="_Toc241701877" w:history="1">
+      <w:hyperlink w:anchor="_Toc241702886" w:history="1">
         <w:r>
           <w:rPr>
             <w:rStyle w:val="Hyperlink"/>
@@ -3228,7 +3228,7 @@
             <w:noProof/>
             <w:webHidden/>
           </w:rPr>
-          <w:instrText xml:space="preserve"> PAGEREF _Toc241701877 \h </w:instrText>
+          <w:instrText xml:space="preserve"> PAGEREF _Toc241702886 \h </w:instrText>
         </w:r>
         <w:r>
           <w:rPr>
@@ -3269,7 +3269,7 @@
           <w:noProof/>
         </w:rPr>
       </w:pPr>
-      <w:hyperlink w:anchor="_Toc241701878" w:history="1">
+      <w:hyperlink w:anchor="_Toc241702887" w:history="1">
         <w:r>
           <w:rPr>
             <w:rStyle w:val="Hyperlink"/>
@@ -3296,7 +3296,7 @@
             <w:noProof/>
             <w:webHidden/>
           </w:rPr>
-          <w:instrText xml:space="preserve"> PAGEREF _Toc241701878 \h </w:instrText>
+          <w:instrText xml:space="preserve"> PAGEREF _Toc241702887 \h </w:instrText>
         </w:r>
         <w:r>
           <w:rPr>
@@ -3337,13 +3337,13 @@
           <w:noProof/>
         </w:rPr>
       </w:pPr>
-      <w:hyperlink w:anchor="_Toc241701879" w:history="1">
+      <w:hyperlink w:anchor="_Toc241702888" w:history="1">
         <w:r>
           <w:rPr>
             <w:rStyle w:val="Hyperlink"/>
             <w:noProof/>
           </w:rPr>
-          <w:t>Admin: the receipt email</w:t>
+          <w:t>Admin: settings</w:t>
         </w:r>
         <w:r>
           <w:rPr>
@@ -3364,7 +3364,7 @@
             <w:noProof/>
             <w:webHidden/>
           </w:rPr>
-          <w:instrText xml:space="preserve"> PAGEREF _Toc241701879 \h </w:instrText>
+          <w:instrText xml:space="preserve"> PAGEREF _Toc241702888 \h </w:instrText>
         </w:r>
         <w:r>
           <w:rPr>
@@ -3385,6 +3385,210 @@
             <w:webHidden/>
           </w:rPr>
           <w:t>39</w:t>
+        </w:r>
+        <w:r>
+          <w:rPr>
+            <w:noProof/>
+            <w:webHidden/>
+          </w:rPr>
+          <w:fldChar w:fldCharType="end"/>
+        </w:r>
+      </w:hyperlink>
+    </w:p>
+    <w:p>
+      <w:pPr>
+        <w:pStyle w:val="TOC2"/>
+        <w:tabs>
+          <w:tab w:val="right" w:leader="dot" w:pos="9350"/>
+        </w:tabs>
+        <w:rPr>
+          <w:noProof/>
+        </w:rPr>
+      </w:pPr>
+      <w:hyperlink w:anchor="_Toc241702889" w:history="1">
+        <w:r>
+          <w:rPr>
+            <w:rStyle w:val="Hyperlink"/>
+            <w:noProof/>
+          </w:rPr>
+          <w:t>Business details</w:t>
+        </w:r>
+        <w:r>
+          <w:rPr>
+            <w:noProof/>
+            <w:webHidden/>
+          </w:rPr>
+          <w:tab/>
+        </w:r>
+        <w:r>
+          <w:rPr>
+            <w:noProof/>
+            <w:webHidden/>
+          </w:rPr>
+          <w:fldChar w:fldCharType="begin"/>
+        </w:r>
+        <w:r>
+          <w:rPr>
+            <w:noProof/>
+            <w:webHidden/>
+          </w:rPr>
+          <w:instrText xml:space="preserve"> PAGEREF _Toc241702889 \h </w:instrText>
+        </w:r>
+        <w:r>
+          <w:rPr>
+            <w:noProof/>
+            <w:webHidden/>
+          </w:rPr>
+        </w:r>
+        <w:r>
+          <w:rPr>
+            <w:noProof/>
+            <w:webHidden/>
+          </w:rPr>
+          <w:fldChar w:fldCharType="separate"/>
+        </w:r>
+        <w:r>
+          <w:rPr>
+            <w:noProof/>
+            <w:webHidden/>
+          </w:rPr>
+          <w:t>39</w:t>
+        </w:r>
+        <w:r>
+          <w:rPr>
+            <w:noProof/>
+            <w:webHidden/>
+          </w:rPr>
+          <w:fldChar w:fldCharType="end"/>
+        </w:r>
+      </w:hyperlink>
+    </w:p>
+    <w:p>
+      <w:pPr>
+        <w:pStyle w:val="TOC2"/>
+        <w:tabs>
+          <w:tab w:val="right" w:leader="dot" w:pos="9350"/>
+        </w:tabs>
+        <w:rPr>
+          <w:noProof/>
+        </w:rPr>
+      </w:pPr>
+      <w:hyperlink w:anchor="_Toc241702890" w:history="1">
+        <w:r>
+          <w:rPr>
+            <w:rStyle w:val="Hyperlink"/>
+            <w:noProof/>
+          </w:rPr>
+          <w:t>Receipt email</w:t>
+        </w:r>
+        <w:r>
+          <w:rPr>
+            <w:noProof/>
+            <w:webHidden/>
+          </w:rPr>
+          <w:tab/>
+        </w:r>
+        <w:r>
+          <w:rPr>
+            <w:noProof/>
+            <w:webHidden/>
+          </w:rPr>
+          <w:fldChar w:fldCharType="begin"/>
+        </w:r>
+        <w:r>
+          <w:rPr>
+            <w:noProof/>
+            <w:webHidden/>
+          </w:rPr>
+          <w:instrText xml:space="preserve"> PAGEREF _Toc241702890 \h </w:instrText>
+        </w:r>
+        <w:r>
+          <w:rPr>
+            <w:noProof/>
+            <w:webHidden/>
+          </w:rPr>
+        </w:r>
+        <w:r>
+          <w:rPr>
+            <w:noProof/>
+            <w:webHidden/>
+          </w:rPr>
+          <w:fldChar w:fldCharType="separate"/>
+        </w:r>
+        <w:r>
+          <w:rPr>
+            <w:noProof/>
+            <w:webHidden/>
+          </w:rPr>
+          <w:t>39</w:t>
+        </w:r>
+        <w:r>
+          <w:rPr>
+            <w:noProof/>
+            <w:webHidden/>
+          </w:rPr>
+          <w:fldChar w:fldCharType="end"/>
+        </w:r>
+      </w:hyperlink>
+    </w:p>
+    <w:p>
+      <w:pPr>
+        <w:pStyle w:val="TOC2"/>
+        <w:tabs>
+          <w:tab w:val="right" w:leader="dot" w:pos="9350"/>
+        </w:tabs>
+        <w:rPr>
+          <w:noProof/>
+        </w:rPr>
+      </w:pPr>
+      <w:hyperlink w:anchor="_Toc241702891" w:history="1">
+        <w:r>
+          <w:rPr>
+            <w:rStyle w:val="Hyperlink"/>
+            <w:noProof/>
+          </w:rPr>
+          <w:t>Dashboard</w:t>
+        </w:r>
+        <w:r>
+          <w:rPr>
+            <w:noProof/>
+            <w:webHidden/>
+          </w:rPr>
+          <w:tab/>
+        </w:r>
+        <w:r>
+          <w:rPr>
+            <w:noProof/>
+            <w:webHidden/>
+          </w:rPr>
+          <w:fldChar w:fldCharType="begin"/>
+        </w:r>
+        <w:r>
+          <w:rPr>
+            <w:noProof/>
+            <w:webHidden/>
+          </w:rPr>
+          <w:instrText xml:space="preserve"> PAGEREF _Toc241702891 \h </w:instrText>
+        </w:r>
+        <w:r>
+          <w:rPr>
+            <w:noProof/>
+            <w:webHidden/>
+          </w:rPr>
+        </w:r>
+        <w:r>
+          <w:rPr>
+            <w:noProof/>
+            <w:webHidden/>
+          </w:rPr>
+          <w:fldChar w:fldCharType="separate"/>
+        </w:r>
+        <w:r>
+          <w:rPr>
+            <w:noProof/>
+            <w:webHidden/>
+          </w:rPr>
+          <w:t>41</w:t>
         </w:r>
         <w:r>
           <w:rPr>
@@ -3405,7 +3609,7 @@
           <w:noProof/>
         </w:rPr>
       </w:pPr>
-      <w:hyperlink w:anchor="_Toc241701880" w:history="1">
+      <w:hyperlink w:anchor="_Toc241702892" w:history="1">
         <w:r>
           <w:rPr>
             <w:rStyle w:val="Hyperlink"/>
@@ -3432,7 +3636,7 @@
             <w:noProof/>
             <w:webHidden/>
           </w:rPr>
-          <w:instrText xml:space="preserve"> PAGEREF _Toc241701880 \h </w:instrText>
+          <w:instrText xml:space="preserve"> PAGEREF _Toc241702892 \h </w:instrText>
         </w:r>
         <w:r>
           <w:rPr>
@@ -3452,7 +3656,7 @@
             <w:noProof/>
             <w:webHidden/>
           </w:rPr>
-          <w:t>41</w:t>
+          <w:t>43</w:t>
         </w:r>
         <w:r>
           <w:rPr>
@@ -3473,7 +3677,7 @@
           <w:noProof/>
         </w:rPr>
       </w:pPr>
-      <w:hyperlink w:anchor="_Toc241701881" w:history="1">
+      <w:hyperlink w:anchor="_Toc241702893" w:history="1">
         <w:r>
           <w:rPr>
             <w:rStyle w:val="Hyperlink"/>
@@ -3500,7 +3704,7 @@
             <w:noProof/>
             <w:webHidden/>
           </w:rPr>
-          <w:instrText xml:space="preserve"> PAGEREF _Toc241701881 \h </w:instrText>
+          <w:instrText xml:space="preserve"> PAGEREF _Toc241702893 \h </w:instrText>
         </w:r>
         <w:r>
           <w:rPr>
@@ -3520,7 +3724,7 @@
             <w:noProof/>
             <w:webHidden/>
           </w:rPr>
-          <w:t>43</w:t>
+          <w:t>45</w:t>
         </w:r>
         <w:r>
           <w:rPr>
@@ -3541,7 +3745,7 @@
           <w:noProof/>
         </w:rPr>
       </w:pPr>
-      <w:hyperlink w:anchor="_Toc241701882" w:history="1">
+      <w:hyperlink w:anchor="_Toc241702894" w:history="1">
         <w:r>
           <w:rPr>
             <w:rStyle w:val="Hyperlink"/>
@@ -3568,7 +3772,7 @@
             <w:noProof/>
             <w:webHidden/>
           </w:rPr>
-          <w:instrText xml:space="preserve"> PAGEREF _Toc241701882 \h </w:instrText>
+          <w:instrText xml:space="preserve"> PAGEREF _Toc241702894 \h </w:instrText>
         </w:r>
         <w:r>
           <w:rPr>
@@ -3588,7 +3792,7 @@
             <w:noProof/>
             <w:webHidden/>
           </w:rPr>
-          <w:t>45</w:t>
+          <w:t>47</w:t>
         </w:r>
         <w:r>
           <w:rPr>
@@ -3609,7 +3813,7 @@
           <w:noProof/>
         </w:rPr>
       </w:pPr>
-      <w:hyperlink w:anchor="_Toc241701883" w:history="1">
+      <w:hyperlink w:anchor="_Toc241702895" w:history="1">
         <w:r>
           <w:rPr>
             <w:rStyle w:val="Hyperlink"/>
@@ -3636,7 +3840,7 @@
             <w:noProof/>
             <w:webHidden/>
           </w:rPr>
-          <w:instrText xml:space="preserve"> PAGEREF _Toc241701883 \h </w:instrText>
+          <w:instrText xml:space="preserve"> PAGEREF _Toc241702895 \h </w:instrText>
         </w:r>
         <w:r>
           <w:rPr>
@@ -3656,7 +3860,7 @@
             <w:noProof/>
             <w:webHidden/>
           </w:rPr>
-          <w:t>45</w:t>
+          <w:t>47</w:t>
         </w:r>
         <w:r>
           <w:rPr>
@@ -3677,7 +3881,7 @@
           <w:noProof/>
         </w:rPr>
       </w:pPr>
-      <w:hyperlink w:anchor="_Toc241701884" w:history="1">
+      <w:hyperlink w:anchor="_Toc241702896" w:history="1">
         <w:r>
           <w:rPr>
             <w:rStyle w:val="Hyperlink"/>
@@ -3704,7 +3908,7 @@
             <w:noProof/>
             <w:webHidden/>
           </w:rPr>
-          <w:instrText xml:space="preserve"> PAGEREF _Toc241701884 \h </w:instrText>
+          <w:instrText xml:space="preserve"> PAGEREF _Toc241702896 \h </w:instrText>
         </w:r>
         <w:r>
           <w:rPr>
@@ -3724,7 +3928,7 @@
             <w:noProof/>
             <w:webHidden/>
           </w:rPr>
-          <w:t>45</w:t>
+          <w:t>47</w:t>
         </w:r>
         <w:r>
           <w:rPr>
@@ -3745,7 +3949,7 @@
           <w:noProof/>
         </w:rPr>
       </w:pPr>
-      <w:hyperlink w:anchor="_Toc241701885" w:history="1">
+      <w:hyperlink w:anchor="_Toc241702897" w:history="1">
         <w:r>
           <w:rPr>
             <w:rStyle w:val="Hyperlink"/>
@@ -3772,7 +3976,7 @@
             <w:noProof/>
             <w:webHidden/>
           </w:rPr>
-          <w:instrText xml:space="preserve"> PAGEREF _Toc241701885 \h </w:instrText>
+          <w:instrText xml:space="preserve"> PAGEREF _Toc241702897 \h </w:instrText>
         </w:r>
         <w:r>
           <w:rPr>
@@ -3792,7 +3996,7 @@
             <w:noProof/>
             <w:webHidden/>
           </w:rPr>
-          <w:t>45</w:t>
+          <w:t>47</w:t>
         </w:r>
         <w:r>
           <w:rPr>
@@ -3813,7 +4017,7 @@
           <w:noProof/>
         </w:rPr>
       </w:pPr>
-      <w:hyperlink w:anchor="_Toc241701886" w:history="1">
+      <w:hyperlink w:anchor="_Toc241702898" w:history="1">
         <w:r>
           <w:rPr>
             <w:rStyle w:val="Hyperlink"/>
@@ -3840,7 +4044,7 @@
             <w:noProof/>
             <w:webHidden/>
           </w:rPr>
-          <w:instrText xml:space="preserve"> PAGEREF _Toc241701886 \h </w:instrText>
+          <w:instrText xml:space="preserve"> PAGEREF _Toc241702898 \h </w:instrText>
         </w:r>
         <w:r>
           <w:rPr>
@@ -3860,7 +4064,7 @@
             <w:noProof/>
             <w:webHidden/>
           </w:rPr>
-          <w:t>45</w:t>
+          <w:t>47</w:t>
         </w:r>
         <w:r>
           <w:rPr>
@@ -3881,7 +4085,7 @@
         <w:pStyle w:val="Heading1"/>
         <w:pageBreakBefore/>
       </w:pPr>
-      <w:bookmarkStart w:id="0" w:name="_Toc241701835"/>
+      <w:bookmarkStart w:id="0" w:name="_Toc241702844"/>
       <w:r>
         <w:lastRenderedPageBreak/>
         <w:t>Welcome</w:t>
@@ -3897,7 +4101,7 @@
       <w:pPr>
         <w:pStyle w:val="Heading2"/>
       </w:pPr>
-      <w:bookmarkStart w:id="1" w:name="_Toc241701836"/>
+      <w:bookmarkStart w:id="1" w:name="_Toc241702845"/>
       <w:r>
         <w:t>How a sale moves through the app</w:t>
       </w:r>
@@ -4380,7 +4584,7 @@
       <w:pPr>
         <w:pStyle w:val="Heading2"/>
       </w:pPr>
-      <w:bookmarkStart w:id="2" w:name="_Toc241701837"/>
+      <w:bookmarkStart w:id="2" w:name="_Toc241702846"/>
       <w:r>
         <w:t>What you'll need</w:t>
       </w:r>
@@ -4489,7 +4693,7 @@
         <w:pStyle w:val="Heading1"/>
         <w:pageBreakBefore/>
       </w:pPr>
-      <w:bookmarkStart w:id="3" w:name="_Toc241701838"/>
+      <w:bookmarkStart w:id="3" w:name="_Toc241702847"/>
       <w:r>
         <w:lastRenderedPageBreak/>
         <w:t>Who can do what</w:t>
@@ -5057,7 +5261,7 @@
         <w:pStyle w:val="Heading1"/>
         <w:pageBreakBefore/>
       </w:pPr>
-      <w:bookmarkStart w:id="4" w:name="_Toc241701839"/>
+      <w:bookmarkStart w:id="4" w:name="_Toc241702848"/>
       <w:r>
         <w:lastRenderedPageBreak/>
         <w:t>Getting started</w:t>
@@ -5068,7 +5272,7 @@
       <w:pPr>
         <w:pStyle w:val="Heading2"/>
       </w:pPr>
-      <w:bookmarkStart w:id="5" w:name="_Toc241701840"/>
+      <w:bookmarkStart w:id="5" w:name="_Toc241702849"/>
       <w:r>
         <w:t>Signing in</w:t>
       </w:r>
@@ -5085,7 +5289,7 @@
           <w:noProof/>
         </w:rPr>
         <w:drawing>
-          <wp:inline distT="0" distB="0" distL="0" distR="0" wp14:anchorId="4CBB1767" wp14:editId="407D9A38">
+          <wp:inline distT="0" distB="0" distL="0" distR="0" wp14:anchorId="0EF0EC76" wp14:editId="4BAC3379">
             <wp:extent cx="3291840" cy="2211705"/>
             <wp:effectExtent l="0" t="0" r="0" b="0"/>
             <wp:docPr id="1" name="Picture 1"/>
@@ -5403,7 +5607,7 @@
       <w:pPr>
         <w:pStyle w:val="Heading2"/>
       </w:pPr>
-      <w:bookmarkStart w:id="6" w:name="_Toc241701841"/>
+      <w:bookmarkStart w:id="6" w:name="_Toc241702850"/>
       <w:r>
         <w:t>Changing your PIN</w:t>
       </w:r>
@@ -5585,7 +5789,7 @@
       <w:pPr>
         <w:pStyle w:val="Heading2"/>
       </w:pPr>
-      <w:bookmarkStart w:id="7" w:name="_Toc241701842"/>
+      <w:bookmarkStart w:id="7" w:name="_Toc241702851"/>
       <w:r>
         <w:lastRenderedPageBreak/>
         <w:t>Finding your way around</w:t>
@@ -6168,7 +6372,7 @@
       <w:pPr>
         <w:pStyle w:val="Heading2"/>
       </w:pPr>
-      <w:bookmarkStart w:id="8" w:name="_Toc241701843"/>
+      <w:bookmarkStart w:id="8" w:name="_Toc241702852"/>
       <w:r>
         <w:t>Light and dark mode</w:t>
       </w:r>
@@ -6183,7 +6387,7 @@
       <w:pPr>
         <w:pStyle w:val="Heading2"/>
       </w:pPr>
-      <w:bookmarkStart w:id="9" w:name="_Toc241701844"/>
+      <w:bookmarkStart w:id="9" w:name="_Toc241702853"/>
       <w:r>
         <w:t>Signing out</w:t>
       </w:r>
@@ -6208,7 +6412,7 @@
         <w:pStyle w:val="Heading1"/>
         <w:pageBreakBefore/>
       </w:pPr>
-      <w:bookmarkStart w:id="10" w:name="_Toc241701845"/>
+      <w:bookmarkStart w:id="10" w:name="_Toc241702854"/>
       <w:r>
         <w:lastRenderedPageBreak/>
         <w:t>Taking an order on the sales floor</w:t>
@@ -6240,7 +6444,7 @@
           <w:noProof/>
         </w:rPr>
         <w:drawing>
-          <wp:inline distT="0" distB="0" distL="0" distR="0" wp14:anchorId="2D921AFB" wp14:editId="5921D158">
+          <wp:inline distT="0" distB="0" distL="0" distR="0" wp14:anchorId="283F832C" wp14:editId="2797FD23">
             <wp:extent cx="5760720" cy="3870484"/>
             <wp:effectExtent l="0" t="0" r="0" b="0"/>
             <wp:docPr id="2" name="Picture 2"/>
@@ -6365,7 +6569,7 @@
       <w:pPr>
         <w:pStyle w:val="Heading2"/>
       </w:pPr>
-      <w:bookmarkStart w:id="11" w:name="_Toc241701846"/>
+      <w:bookmarkStart w:id="11" w:name="_Toc241702855"/>
       <w:r>
         <w:t>Starting an order</w:t>
       </w:r>
@@ -6449,7 +6653,7 @@
       <w:pPr>
         <w:pStyle w:val="Heading2"/>
       </w:pPr>
-      <w:bookmarkStart w:id="12" w:name="_Toc241701847"/>
+      <w:bookmarkStart w:id="12" w:name="_Toc241702856"/>
       <w:r>
         <w:lastRenderedPageBreak/>
         <w:t>Adding items</w:t>
@@ -6598,7 +6802,7 @@
           <w:noProof/>
         </w:rPr>
         <w:drawing>
-          <wp:inline distT="0" distB="0" distL="0" distR="0" wp14:anchorId="016905B9" wp14:editId="350D3B23">
+          <wp:inline distT="0" distB="0" distL="0" distR="0" wp14:anchorId="0CD6EC81" wp14:editId="2C3BBA9A">
             <wp:extent cx="5760720" cy="3870484"/>
             <wp:effectExtent l="0" t="0" r="0" b="0"/>
             <wp:docPr id="3" name="Picture 3"/>
@@ -6735,7 +6939,7 @@
           <w:noProof/>
         </w:rPr>
         <w:drawing>
-          <wp:inline distT="0" distB="0" distL="0" distR="0" wp14:anchorId="57A278A5" wp14:editId="0EFB2980">
+          <wp:inline distT="0" distB="0" distL="0" distR="0" wp14:anchorId="0A726018" wp14:editId="60DD2A65">
             <wp:extent cx="5760720" cy="3870484"/>
             <wp:effectExtent l="0" t="0" r="0" b="0"/>
             <wp:docPr id="4" name="Picture 4"/>
@@ -7080,7 +7284,7 @@
         </w:rPr>
         <w:lastRenderedPageBreak/>
         <w:drawing>
-          <wp:inline distT="0" distB="0" distL="0" distR="0" wp14:anchorId="5473BD4F" wp14:editId="7732672C">
+          <wp:inline distT="0" distB="0" distL="0" distR="0" wp14:anchorId="1FB04EF1" wp14:editId="49D13CC1">
             <wp:extent cx="5486400" cy="3686175"/>
             <wp:effectExtent l="0" t="0" r="0" b="0"/>
             <wp:docPr id="5" name="Picture 5"/>
@@ -7280,7 +7484,7 @@
       <w:pPr>
         <w:pStyle w:val="Heading2"/>
       </w:pPr>
-      <w:bookmarkStart w:id="13" w:name="_Toc241701848"/>
+      <w:bookmarkStart w:id="13" w:name="_Toc241702857"/>
       <w:r>
         <w:t>Adding shipping or a service later</w:t>
       </w:r>
@@ -7321,7 +7525,7 @@
         </w:rPr>
         <w:lastRenderedPageBreak/>
         <w:drawing>
-          <wp:inline distT="0" distB="0" distL="0" distR="0" wp14:anchorId="63ACFD44" wp14:editId="7E7D0453">
+          <wp:inline distT="0" distB="0" distL="0" distR="0" wp14:anchorId="7B14A3B5" wp14:editId="61D950A9">
             <wp:extent cx="4754880" cy="3194685"/>
             <wp:effectExtent l="0" t="0" r="0" b="0"/>
             <wp:docPr id="6" name="Picture 6"/>
@@ -7375,7 +7579,7 @@
       <w:pPr>
         <w:pStyle w:val="Heading2"/>
       </w:pPr>
-      <w:bookmarkStart w:id="14" w:name="_Toc241701849"/>
+      <w:bookmarkStart w:id="14" w:name="_Toc241702858"/>
       <w:r>
         <w:t>Changing or removing an item</w:t>
       </w:r>
@@ -7522,7 +7726,7 @@
       <w:pPr>
         <w:pStyle w:val="Heading2"/>
       </w:pPr>
-      <w:bookmarkStart w:id="15" w:name="_Toc241701850"/>
+      <w:bookmarkStart w:id="15" w:name="_Toc241702859"/>
       <w:r>
         <w:t>Customer details</w:t>
       </w:r>
@@ -7686,7 +7890,7 @@
           <w:noProof/>
         </w:rPr>
         <w:drawing>
-          <wp:inline distT="0" distB="0" distL="0" distR="0" wp14:anchorId="1D1BD034" wp14:editId="4F0F0BAB">
+          <wp:inline distT="0" distB="0" distL="0" distR="0" wp14:anchorId="68F8519D" wp14:editId="195FD54B">
             <wp:extent cx="4754880" cy="3194685"/>
             <wp:effectExtent l="0" t="0" r="0" b="0"/>
             <wp:docPr id="7" name="Picture 7"/>
@@ -7740,7 +7944,7 @@
       <w:pPr>
         <w:pStyle w:val="Heading2"/>
       </w:pPr>
-      <w:bookmarkStart w:id="16" w:name="_Toc241701851"/>
+      <w:bookmarkStart w:id="16" w:name="_Toc241702860"/>
       <w:r>
         <w:t>Sending the order to checkout</w:t>
       </w:r>
@@ -7918,7 +8122,7 @@
       <w:pPr>
         <w:pStyle w:val="Heading2"/>
       </w:pPr>
-      <w:bookmarkStart w:id="17" w:name="_Toc241701852"/>
+      <w:bookmarkStart w:id="17" w:name="_Toc241702861"/>
       <w:r>
         <w:lastRenderedPageBreak/>
         <w:t>Using a phone</w:t>
@@ -7936,7 +8140,7 @@
           <w:noProof/>
         </w:rPr>
         <w:drawing>
-          <wp:inline distT="0" distB="0" distL="0" distR="0" wp14:anchorId="0F3F827B" wp14:editId="127D569E">
+          <wp:inline distT="0" distB="0" distL="0" distR="0" wp14:anchorId="0C866F3F" wp14:editId="1C6684ED">
             <wp:extent cx="2194560" cy="4749253"/>
             <wp:effectExtent l="0" t="0" r="0" b="0"/>
             <wp:docPr id="8" name="Picture 8"/>
@@ -8014,7 +8218,7 @@
         <w:pStyle w:val="Heading1"/>
         <w:pageBreakBefore/>
       </w:pPr>
-      <w:bookmarkStart w:id="18" w:name="_Toc241701853"/>
+      <w:bookmarkStart w:id="18" w:name="_Toc241702862"/>
       <w:r>
         <w:lastRenderedPageBreak/>
         <w:t>Checking out a customer</w:t>
@@ -8055,7 +8259,7 @@
           <w:noProof/>
         </w:rPr>
         <w:drawing>
-          <wp:inline distT="0" distB="0" distL="0" distR="0" wp14:anchorId="6D70AC22" wp14:editId="16889229">
+          <wp:inline distT="0" distB="0" distL="0" distR="0" wp14:anchorId="2406450D" wp14:editId="1F93CC1B">
             <wp:extent cx="5760720" cy="3870484"/>
             <wp:effectExtent l="0" t="0" r="0" b="0"/>
             <wp:docPr id="9" name="Picture 9"/>
@@ -8109,7 +8313,7 @@
       <w:pPr>
         <w:pStyle w:val="Heading2"/>
       </w:pPr>
-      <w:bookmarkStart w:id="19" w:name="_Toc241701854"/>
+      <w:bookmarkStart w:id="19" w:name="_Toc241702863"/>
       <w:r>
         <w:t>1. Review the order with the customer</w:t>
       </w:r>
@@ -8206,7 +8410,7 @@
       <w:pPr>
         <w:pStyle w:val="Heading2"/>
       </w:pPr>
-      <w:bookmarkStart w:id="20" w:name="_Toc241701855"/>
+      <w:bookmarkStart w:id="20" w:name="_Toc241702864"/>
       <w:r>
         <w:t>2. Take payment</w:t>
       </w:r>
@@ -8520,7 +8724,7 @@
       <w:pPr>
         <w:pStyle w:val="Heading2"/>
       </w:pPr>
-      <w:bookmarkStart w:id="21" w:name="_Toc241701856"/>
+      <w:bookmarkStart w:id="21" w:name="_Toc241702865"/>
       <w:r>
         <w:t>3. Acknowledgements (initials and signature)</w:t>
       </w:r>
@@ -8702,7 +8906,7 @@
         </w:rPr>
         <w:lastRenderedPageBreak/>
         <w:drawing>
-          <wp:inline distT="0" distB="0" distL="0" distR="0" wp14:anchorId="105BE179" wp14:editId="2FE5A9BD">
+          <wp:inline distT="0" distB="0" distL="0" distR="0" wp14:anchorId="0409ED1F" wp14:editId="0BDA726A">
             <wp:extent cx="4937760" cy="3317558"/>
             <wp:effectExtent l="0" t="0" r="0" b="0"/>
             <wp:docPr id="10" name="Picture 10"/>
@@ -8829,7 +9033,7 @@
       <w:pPr>
         <w:pStyle w:val="Heading2"/>
       </w:pPr>
-      <w:bookmarkStart w:id="22" w:name="_Toc241701857"/>
+      <w:bookmarkStart w:id="22" w:name="_Toc241702866"/>
       <w:r>
         <w:t>4. Complete the sale</w:t>
       </w:r>
@@ -9063,7 +9267,7 @@
       <w:pPr>
         <w:pStyle w:val="Heading2"/>
       </w:pPr>
-      <w:bookmarkStart w:id="23" w:name="_Toc241701858"/>
+      <w:bookmarkStart w:id="23" w:name="_Toc241702867"/>
       <w:r>
         <w:t>Other checkout actions</w:t>
       </w:r>
@@ -9273,7 +9477,7 @@
         <w:pStyle w:val="Heading1"/>
         <w:pageBreakBefore/>
       </w:pPr>
-      <w:bookmarkStart w:id="24" w:name="_Toc241701859"/>
+      <w:bookmarkStart w:id="24" w:name="_Toc241702868"/>
       <w:r>
         <w:lastRenderedPageBreak/>
         <w:t>The sales sheet</w:t>
@@ -9296,7 +9500,7 @@
           <w:noProof/>
         </w:rPr>
         <w:drawing>
-          <wp:inline distT="0" distB="0" distL="0" distR="0" wp14:anchorId="18AD75C7" wp14:editId="518C1D06">
+          <wp:inline distT="0" distB="0" distL="0" distR="0" wp14:anchorId="5664102B" wp14:editId="57CD1C48">
             <wp:extent cx="4023360" cy="3187256"/>
             <wp:effectExtent l="0" t="0" r="0" b="0"/>
             <wp:docPr id="11" name="Picture 11"/>
@@ -9464,7 +9668,7 @@
       <w:pPr>
         <w:pStyle w:val="Heading2"/>
       </w:pPr>
-      <w:bookmarkStart w:id="25" w:name="_Toc241701860"/>
+      <w:bookmarkStart w:id="25" w:name="_Toc241702869"/>
       <w:r>
         <w:t>Emailing a receipt</w:t>
       </w:r>
@@ -9592,7 +9796,7 @@
         </w:rPr>
         <w:lastRenderedPageBreak/>
         <w:drawing>
-          <wp:inline distT="0" distB="0" distL="0" distR="0" wp14:anchorId="07423ED5" wp14:editId="13712814">
+          <wp:inline distT="0" distB="0" distL="0" distR="0" wp14:anchorId="72C2EE1D" wp14:editId="3B35C752">
             <wp:extent cx="4572000" cy="3071812"/>
             <wp:effectExtent l="0" t="0" r="0" b="0"/>
             <wp:docPr id="12" name="Picture 12"/>
@@ -9644,7 +9848,7 @@
     </w:p>
     <w:p>
       <w:r>
-        <w:t>The app turns the sales sheet into a PDF, exactly as it would print, and emails it to the customer with a friendly note. The note thanks them for supporting the organization, explains what happens next (what went home today, what's being shipped and where, how a boxed mattress expands, and keeping a protector on for the warranty), mentions any balance still owed, and gives the customer service number. An administrator can change that wording - see *Admin: the receipt email*.</w:t>
+        <w:t>The app turns the sales sheet into a PDF, exactly as it would print, and emails it to the customer with a friendly note. The note thanks them for supporting the organization, explains what happens next (what went home today, what's being shipped and where, how a boxed mattress expands, and keeping a protector on for the warranty), mentions any balance still owed, and gives the customer service number. An administrator can change that wording - see *Admin: settings*.</w:t>
       </w:r>
     </w:p>
     <w:p>
@@ -9719,7 +9923,7 @@
         <w:pStyle w:val="Heading1"/>
         <w:pageBreakBefore/>
       </w:pPr>
-      <w:bookmarkStart w:id="26" w:name="_Toc241701861"/>
+      <w:bookmarkStart w:id="26" w:name="_Toc241702870"/>
       <w:r>
         <w:lastRenderedPageBreak/>
         <w:t>Looking up orders</w:t>
@@ -9751,7 +9955,7 @@
           <w:noProof/>
         </w:rPr>
         <w:drawing>
-          <wp:inline distT="0" distB="0" distL="0" distR="0" wp14:anchorId="771B51AB" wp14:editId="6E18F51E">
+          <wp:inline distT="0" distB="0" distL="0" distR="0" wp14:anchorId="192C6723" wp14:editId="577D7517">
             <wp:extent cx="5760720" cy="3870484"/>
             <wp:effectExtent l="0" t="0" r="0" b="0"/>
             <wp:docPr id="13" name="Picture 13"/>
@@ -9871,7 +10075,7 @@
       <w:pPr>
         <w:pStyle w:val="Heading2"/>
       </w:pPr>
-      <w:bookmarkStart w:id="27" w:name="_Toc241701862"/>
+      <w:bookmarkStart w:id="27" w:name="_Toc241702871"/>
       <w:r>
         <w:t>Extra options for admins</w:t>
       </w:r>
@@ -9961,7 +10165,7 @@
         </w:rPr>
         <w:lastRenderedPageBreak/>
         <w:drawing>
-          <wp:inline distT="0" distB="0" distL="0" distR="0" wp14:anchorId="4E808499" wp14:editId="336BAF6F">
+          <wp:inline distT="0" distB="0" distL="0" distR="0" wp14:anchorId="0301E939" wp14:editId="7B5CD877">
             <wp:extent cx="4754880" cy="3194685"/>
             <wp:effectExtent l="0" t="0" r="0" b="0"/>
             <wp:docPr id="14" name="Picture 14"/>
@@ -10083,7 +10287,7 @@
         <w:pStyle w:val="Heading1"/>
         <w:pageBreakBefore/>
       </w:pPr>
-      <w:bookmarkStart w:id="28" w:name="_Toc241701863"/>
+      <w:bookmarkStart w:id="28" w:name="_Toc241702872"/>
       <w:r>
         <w:lastRenderedPageBreak/>
         <w:t>The dashboard</w:t>
@@ -10147,7 +10351,7 @@
           <w:noProof/>
         </w:rPr>
         <w:drawing>
-          <wp:inline distT="0" distB="0" distL="0" distR="0" wp14:anchorId="45360499" wp14:editId="445B422A">
+          <wp:inline distT="0" distB="0" distL="0" distR="0" wp14:anchorId="33E9463E" wp14:editId="1738906B">
             <wp:extent cx="4937760" cy="4305110"/>
             <wp:effectExtent l="0" t="0" r="0" b="0"/>
             <wp:docPr id="15" name="Picture 15"/>
@@ -10742,7 +10946,16 @@
               <w:t>Net sales</w:t>
             </w:r>
             <w:r>
-              <w:t xml:space="preserve"> tile earns a gold star when net sales pass $30,000, and another for every $10,000 after that: two stars at $40,000, three at $50,000, and so on. Hover over the stars to see the next milestone.</w:t>
+              <w:t xml:space="preserve"> tile earns a gold star when net sales pass $30,000, and another for every $10,000 after that: two stars at $40,000, three at $50,000, and so on. Hover over the stars to see the next milestone. An administrator can change both amounts under </w:t>
+            </w:r>
+            <w:r>
+              <w:rPr>
+                <w:b/>
+              </w:rPr>
+              <w:t>Settings</w:t>
+            </w:r>
+            <w:r>
+              <w:t>.</w:t>
             </w:r>
           </w:p>
         </w:tc>
@@ -10793,7 +11006,7 @@
         <w:pStyle w:val="Heading1"/>
         <w:pageBreakBefore/>
       </w:pPr>
-      <w:bookmarkStart w:id="29" w:name="_Toc241701864"/>
+      <w:bookmarkStart w:id="29" w:name="_Toc241702873"/>
       <w:r>
         <w:lastRenderedPageBreak/>
         <w:t>Keeping inventory</w:t>
@@ -10852,7 +11065,7 @@
           <w:noProof/>
         </w:rPr>
         <w:drawing>
-          <wp:inline distT="0" distB="0" distL="0" distR="0" wp14:anchorId="7C062443" wp14:editId="12AA2AD5">
+          <wp:inline distT="0" distB="0" distL="0" distR="0" wp14:anchorId="70090ED1" wp14:editId="268A5FBD">
             <wp:extent cx="5760720" cy="3870484"/>
             <wp:effectExtent l="0" t="0" r="0" b="0"/>
             <wp:docPr id="16" name="Picture 16"/>
@@ -10906,7 +11119,7 @@
       <w:pPr>
         <w:pStyle w:val="Heading2"/>
       </w:pPr>
-      <w:bookmarkStart w:id="30" w:name="_Toc241701865"/>
+      <w:bookmarkStart w:id="30" w:name="_Toc241702874"/>
       <w:r>
         <w:t>What's on the screen</w:t>
       </w:r>
@@ -10945,7 +11158,16 @@
         <w:t>Running low</w:t>
       </w:r>
       <w:r>
-        <w:t xml:space="preserve"> at 2 or fewer.</w:t>
+        <w:t xml:space="preserve"> at 2 or fewer (an administrator can change that level under </w:t>
+      </w:r>
+      <w:r>
+        <w:rPr>
+          <w:b/>
+        </w:rPr>
+        <w:t>Settings</w:t>
+      </w:r>
+      <w:r>
+        <w:t>).</w:t>
       </w:r>
     </w:p>
     <w:p>
@@ -10988,7 +11210,7 @@
       <w:pPr>
         <w:pStyle w:val="Heading2"/>
       </w:pPr>
-      <w:bookmarkStart w:id="31" w:name="_Toc241701866"/>
+      <w:bookmarkStart w:id="31" w:name="_Toc241702875"/>
       <w:r>
         <w:t>Updating a count</w:t>
       </w:r>
@@ -11065,7 +11287,7 @@
           <w:noProof/>
         </w:rPr>
         <w:drawing>
-          <wp:inline distT="0" distB="0" distL="0" distR="0" wp14:anchorId="2539F709" wp14:editId="3BC6DCF3">
+          <wp:inline distT="0" distB="0" distL="0" distR="0" wp14:anchorId="25879A39" wp14:editId="5E3437E6">
             <wp:extent cx="5120640" cy="3440430"/>
             <wp:effectExtent l="0" t="0" r="0" b="0"/>
             <wp:docPr id="17" name="Picture 17"/>
@@ -11119,7 +11341,7 @@
       <w:pPr>
         <w:pStyle w:val="Heading2"/>
       </w:pPr>
-      <w:bookmarkStart w:id="32" w:name="_Toc241701867"/>
+      <w:bookmarkStart w:id="32" w:name="_Toc241702876"/>
       <w:r>
         <w:t>What changes the count automatically</w:t>
       </w:r>
@@ -11523,7 +11745,7 @@
       <w:pPr>
         <w:pStyle w:val="Heading2"/>
       </w:pPr>
-      <w:bookmarkStart w:id="33" w:name="_Toc241701868"/>
+      <w:bookmarkStart w:id="33" w:name="_Toc241702877"/>
       <w:r>
         <w:lastRenderedPageBreak/>
         <w:t>Seeing the history</w:t>
@@ -11539,7 +11761,7 @@
       <w:pPr>
         <w:pStyle w:val="Heading2"/>
       </w:pPr>
-      <w:bookmarkStart w:id="34" w:name="_Toc241701869"/>
+      <w:bookmarkStart w:id="34" w:name="_Toc241702878"/>
       <w:r>
         <w:t>Notes for the inventory sheet</w:t>
       </w:r>
@@ -11588,7 +11810,7 @@
           <w:noProof/>
         </w:rPr>
         <w:drawing>
-          <wp:inline distT="0" distB="0" distL="0" distR="0" wp14:anchorId="57173775" wp14:editId="30B773E6">
+          <wp:inline distT="0" distB="0" distL="0" distR="0" wp14:anchorId="14515F6E" wp14:editId="10C6AF85">
             <wp:extent cx="5120640" cy="3440430"/>
             <wp:effectExtent l="0" t="0" r="0" b="0"/>
             <wp:docPr id="18" name="Picture 18"/>
@@ -11642,7 +11864,7 @@
       <w:pPr>
         <w:pStyle w:val="Heading2"/>
       </w:pPr>
-      <w:bookmarkStart w:id="35" w:name="_Toc241701870"/>
+      <w:bookmarkStart w:id="35" w:name="_Toc241702879"/>
       <w:r>
         <w:t>Start and end counts</w:t>
       </w:r>
@@ -12165,7 +12387,7 @@
           <w:noProof/>
         </w:rPr>
         <w:drawing>
-          <wp:inline distT="0" distB="0" distL="0" distR="0" wp14:anchorId="08E603B8" wp14:editId="7B29500E">
+          <wp:inline distT="0" distB="0" distL="0" distR="0" wp14:anchorId="31482967" wp14:editId="38693514">
             <wp:extent cx="5486400" cy="3686175"/>
             <wp:effectExtent l="0" t="0" r="0" b="0"/>
             <wp:docPr id="19" name="Picture 19"/>
@@ -12305,7 +12527,7 @@
         <w:pStyle w:val="Heading1"/>
         <w:pageBreakBefore/>
       </w:pPr>
-      <w:bookmarkStart w:id="36" w:name="_Toc241701871"/>
+      <w:bookmarkStart w:id="36" w:name="_Toc241702880"/>
       <w:r>
         <w:lastRenderedPageBreak/>
         <w:t>Admin: setting up an event</w:t>
@@ -12330,7 +12552,7 @@
       <w:pPr>
         <w:pStyle w:val="Heading2"/>
       </w:pPr>
-      <w:bookmarkStart w:id="37" w:name="_Toc241701872"/>
+      <w:bookmarkStart w:id="37" w:name="_Toc241702881"/>
       <w:r>
         <w:t>Creating or editing an event</w:t>
       </w:r>
@@ -12347,7 +12569,7 @@
           <w:noProof/>
         </w:rPr>
         <w:drawing>
-          <wp:inline distT="0" distB="0" distL="0" distR="0" wp14:anchorId="7AF11B59" wp14:editId="0EB325B0">
+          <wp:inline distT="0" distB="0" distL="0" distR="0" wp14:anchorId="3725FFE1" wp14:editId="47D63CBF">
             <wp:extent cx="5760720" cy="1236154"/>
             <wp:effectExtent l="0" t="0" r="0" b="0"/>
             <wp:docPr id="20" name="Picture 20"/>
@@ -12687,7 +12909,7 @@
           <w:noProof/>
         </w:rPr>
         <w:drawing>
-          <wp:inline distT="0" distB="0" distL="0" distR="0" wp14:anchorId="09B98A43" wp14:editId="2DF9DE18">
+          <wp:inline distT="0" distB="0" distL="0" distR="0" wp14:anchorId="00E53558" wp14:editId="743C2F28">
             <wp:extent cx="3840480" cy="2580322"/>
             <wp:effectExtent l="0" t="0" r="0" b="0"/>
             <wp:docPr id="21" name="Picture 21"/>
@@ -12809,7 +13031,7 @@
       <w:pPr>
         <w:pStyle w:val="Heading2"/>
       </w:pPr>
-      <w:bookmarkStart w:id="38" w:name="_Toc241701873"/>
+      <w:bookmarkStart w:id="38" w:name="_Toc241702882"/>
       <w:r>
         <w:t>Closing out an event</w:t>
       </w:r>
@@ -12976,7 +13198,7 @@
       <w:pPr>
         <w:pStyle w:val="Heading2"/>
       </w:pPr>
-      <w:bookmarkStart w:id="39" w:name="_Toc241701874"/>
+      <w:bookmarkStart w:id="39" w:name="_Toc241702883"/>
       <w:r>
         <w:t>Event sales sheets</w:t>
       </w:r>
@@ -13034,7 +13256,7 @@
           <w:noProof/>
         </w:rPr>
         <w:drawing>
-          <wp:inline distT="0" distB="0" distL="0" distR="0" wp14:anchorId="65CA0992" wp14:editId="12DE117D">
+          <wp:inline distT="0" distB="0" distL="0" distR="0" wp14:anchorId="43EA0898" wp14:editId="0458865D">
             <wp:extent cx="4389120" cy="2948940"/>
             <wp:effectExtent l="0" t="0" r="0" b="0"/>
             <wp:docPr id="22" name="Picture 22"/>
@@ -13163,7 +13385,7 @@
           <w:noProof/>
         </w:rPr>
         <w:drawing>
-          <wp:inline distT="0" distB="0" distL="0" distR="0" wp14:anchorId="6C51AE04" wp14:editId="148DC5D8">
+          <wp:inline distT="0" distB="0" distL="0" distR="0" wp14:anchorId="53275AC7" wp14:editId="27D25897">
             <wp:extent cx="4206240" cy="5717858"/>
             <wp:effectExtent l="0" t="0" r="0" b="0"/>
             <wp:docPr id="23" name="Picture 23"/>
@@ -13301,7 +13523,7 @@
           <w:noProof/>
         </w:rPr>
         <w:drawing>
-          <wp:inline distT="0" distB="0" distL="0" distR="0" wp14:anchorId="1DEBA2A6" wp14:editId="73CB701A">
+          <wp:inline distT="0" distB="0" distL="0" distR="0" wp14:anchorId="4B9D5998" wp14:editId="6E82F3A8">
             <wp:extent cx="4389120" cy="2948940"/>
             <wp:effectExtent l="0" t="0" r="0" b="0"/>
             <wp:docPr id="24" name="Picture 24"/>
@@ -13414,7 +13636,7 @@
         <w:pStyle w:val="Heading1"/>
         <w:pageBreakBefore/>
       </w:pPr>
-      <w:bookmarkStart w:id="40" w:name="_Toc241701875"/>
+      <w:bookmarkStart w:id="40" w:name="_Toc241702884"/>
       <w:r>
         <w:lastRenderedPageBreak/>
         <w:t>Admin: managing the catalog</w:t>
@@ -13455,7 +13677,7 @@
           <w:noProof/>
         </w:rPr>
         <w:drawing>
-          <wp:inline distT="0" distB="0" distL="0" distR="0" wp14:anchorId="5E987F51" wp14:editId="1B593998">
+          <wp:inline distT="0" distB="0" distL="0" distR="0" wp14:anchorId="30CA7343" wp14:editId="61B4954C">
             <wp:extent cx="5760720" cy="3870484"/>
             <wp:effectExtent l="0" t="0" r="0" b="0"/>
             <wp:docPr id="25" name="Picture 25"/>
@@ -13509,7 +13731,7 @@
       <w:pPr>
         <w:pStyle w:val="Heading2"/>
       </w:pPr>
-      <w:bookmarkStart w:id="41" w:name="_Toc241701876"/>
+      <w:bookmarkStart w:id="41" w:name="_Toc241702885"/>
       <w:r>
         <w:lastRenderedPageBreak/>
         <w:t>Adding or editing a product</w:t>
@@ -13527,7 +13749,7 @@
           <w:noProof/>
         </w:rPr>
         <w:drawing>
-          <wp:inline distT="0" distB="0" distL="0" distR="0" wp14:anchorId="490336AA" wp14:editId="1B54E550">
+          <wp:inline distT="0" distB="0" distL="0" distR="0" wp14:anchorId="67D07B25" wp14:editId="441121EB">
             <wp:extent cx="5486400" cy="3686175"/>
             <wp:effectExtent l="0" t="0" r="0" b="0"/>
             <wp:docPr id="26" name="Picture 26"/>
@@ -13950,7 +14172,7 @@
         </w:rPr>
         <w:lastRenderedPageBreak/>
         <w:drawing>
-          <wp:inline distT="0" distB="0" distL="0" distR="0" wp14:anchorId="22EDE177" wp14:editId="1AEF5CF0">
+          <wp:inline distT="0" distB="0" distL="0" distR="0" wp14:anchorId="604F084A" wp14:editId="52FDE981">
             <wp:extent cx="5120640" cy="2130933"/>
             <wp:effectExtent l="0" t="0" r="0" b="0"/>
             <wp:docPr id="27" name="Picture 27"/>
@@ -14137,7 +14359,7 @@
       <w:pPr>
         <w:pStyle w:val="Heading2"/>
       </w:pPr>
-      <w:bookmarkStart w:id="42" w:name="_Toc241701877"/>
+      <w:bookmarkStart w:id="42" w:name="_Toc241702886"/>
       <w:r>
         <w:t>Delivery and services</w:t>
       </w:r>
@@ -14169,7 +14391,7 @@
         </w:rPr>
         <w:lastRenderedPageBreak/>
         <w:drawing>
-          <wp:inline distT="0" distB="0" distL="0" distR="0" wp14:anchorId="6BCD1A55" wp14:editId="36782318">
+          <wp:inline distT="0" distB="0" distL="0" distR="0" wp14:anchorId="71F3E5E8" wp14:editId="34C7F2A3">
             <wp:extent cx="5760720" cy="3870484"/>
             <wp:effectExtent l="0" t="0" r="0" b="0"/>
             <wp:docPr id="28" name="Picture 28"/>
@@ -14599,7 +14821,7 @@
         <w:pStyle w:val="Heading1"/>
         <w:pageBreakBefore/>
       </w:pPr>
-      <w:bookmarkStart w:id="43" w:name="_Toc241701878"/>
+      <w:bookmarkStart w:id="43" w:name="_Toc241702887"/>
       <w:r>
         <w:lastRenderedPageBreak/>
         <w:t>Admin: managing the crew</w:t>
@@ -14631,7 +14853,7 @@
           <w:noProof/>
         </w:rPr>
         <w:drawing>
-          <wp:inline distT="0" distB="0" distL="0" distR="0" wp14:anchorId="39E71F12" wp14:editId="729FB6B9">
+          <wp:inline distT="0" distB="0" distL="0" distR="0" wp14:anchorId="75B42CB4" wp14:editId="1C23FF43">
             <wp:extent cx="5760720" cy="1740218"/>
             <wp:effectExtent l="0" t="0" r="0" b="0"/>
             <wp:docPr id="29" name="Picture 29"/>
@@ -14903,7 +15125,7 @@
           <w:noProof/>
         </w:rPr>
         <w:drawing>
-          <wp:inline distT="0" distB="0" distL="0" distR="0" wp14:anchorId="7431D875" wp14:editId="3749E715">
+          <wp:inline distT="0" distB="0" distL="0" distR="0" wp14:anchorId="2C046936" wp14:editId="4044F51D">
             <wp:extent cx="4023360" cy="2703195"/>
             <wp:effectExtent l="0" t="0" r="0" b="0"/>
             <wp:docPr id="30" name="Picture 30"/>
@@ -14983,10 +15205,10 @@
         <w:pStyle w:val="Heading1"/>
         <w:pageBreakBefore/>
       </w:pPr>
-      <w:bookmarkStart w:id="44" w:name="_Toc241701879"/>
+      <w:bookmarkStart w:id="44" w:name="_Toc241702888"/>
       <w:r>
         <w:lastRenderedPageBreak/>
-        <w:t>Admin: the receipt email</w:t>
+        <w:t>Admin: settings</w:t>
       </w:r>
       <w:bookmarkEnd w:id="44"/>
     </w:p>
@@ -15001,7 +15223,7 @@
         <w:t>Settings</w:t>
       </w:r>
       <w:r>
-        <w:t xml:space="preserve"> to change the note customers get with an emailed receipt. The receipt itself is always attached as a PDF; this is the message around it. On a smaller screen, </w:t>
+        <w:t xml:space="preserve"> for the things that apply to everyone using the app. On a smaller screen, </w:t>
       </w:r>
       <w:r>
         <w:rPr>
@@ -15019,8 +15241,45 @@
         <w:t>More</w:t>
       </w:r>
       <w:r>
-        <w:t>.</w:t>
-      </w:r>
+        <w:t xml:space="preserve">. The page has three sections, and each one has its own </w:t>
+      </w:r>
+      <w:r>
+        <w:rPr>
+          <w:b/>
+        </w:rPr>
+        <w:t>Save</w:t>
+      </w:r>
+      <w:r>
+        <w:t xml:space="preserve"> button, so changing one never saves half-finished changes in another. </w:t>
+      </w:r>
+      <w:r>
+        <w:rPr>
+          <w:b/>
+        </w:rPr>
+        <w:t>Discard changes</w:t>
+      </w:r>
+      <w:r>
+        <w:t xml:space="preserve"> puts back what was saved, and </w:t>
+      </w:r>
+      <w:r>
+        <w:rPr>
+          <w:b/>
+        </w:rPr>
+        <w:t>Reset to default</w:t>
+      </w:r>
+      <w:r>
+        <w:t xml:space="preserve"> goes back to the app's own values after asking you to confirm.</w:t>
+      </w:r>
+    </w:p>
+    <w:p>
+      <w:pPr>
+        <w:pStyle w:val="Heading2"/>
+      </w:pPr>
+      <w:bookmarkStart w:id="45" w:name="_Toc241702889"/>
+      <w:r>
+        <w:t>Business details</w:t>
+      </w:r>
+      <w:bookmarkEnd w:id="45"/>
     </w:p>
     <w:p>
       <w:pPr>
@@ -15033,8 +15292,8 @@
           <w:noProof/>
         </w:rPr>
         <w:drawing>
-          <wp:inline distT="0" distB="0" distL="0" distR="0" wp14:anchorId="2932DDBB" wp14:editId="1F712541">
-            <wp:extent cx="5760720" cy="4320540"/>
+          <wp:inline distT="0" distB="0" distL="0" distR="0" wp14:anchorId="307C31BA" wp14:editId="278C7E65">
+            <wp:extent cx="5760720" cy="1429893"/>
             <wp:effectExtent l="0" t="0" r="0" b="0"/>
             <wp:docPr id="31" name="Picture 31"/>
             <wp:cNvGraphicFramePr>
@@ -15044,7 +15303,7 @@
               <a:graphicData uri="http://schemas.openxmlformats.org/drawingml/2006/picture">
                 <pic:pic xmlns:pic="http://schemas.openxmlformats.org/drawingml/2006/picture">
                   <pic:nvPicPr>
-                    <pic:cNvPr id="0" name="36_settings.png"/>
+                    <pic:cNvPr id="0" name="36_settings_business.png"/>
                     <pic:cNvPicPr/>
                   </pic:nvPicPr>
                   <pic:blipFill>
@@ -15056,7 +15315,7 @@
                   <pic:spPr>
                     <a:xfrm>
                       <a:off x="0" y="0"/>
-                      <a:ext cx="5760720" cy="4320540"/>
+                      <a:ext cx="5760720" cy="1429893"/>
                     </a:xfrm>
                     <a:prstGeom prst="rect">
                       <a:avLst/>
@@ -15080,138 +15339,7 @@
           <w:color w:val="6B7280"/>
           <w:sz w:val="18"/>
         </w:rPr>
-        <w:t>Editing the receipt email, with a live preview on the right</w:t>
-      </w:r>
-    </w:p>
-    <w:p>
-      <w:pPr>
-        <w:tabs>
-          <w:tab w:val="left" w:pos="504"/>
-        </w:tabs>
-        <w:spacing w:after="80"/>
-        <w:ind w:left="504" w:hanging="432"/>
-      </w:pPr>
-      <w:r>
-        <w:rPr>
-          <w:b/>
-          <w:color w:val="0369A1"/>
-        </w:rPr>
-        <w:t>1.</w:t>
-      </w:r>
-      <w:r>
-        <w:rPr>
-          <w:b/>
-          <w:color w:val="0369A1"/>
-        </w:rPr>
-        <w:tab/>
-      </w:r>
-      <w:r>
-        <w:t xml:space="preserve">Change the wording in the </w:t>
-      </w:r>
-      <w:r>
-        <w:rPr>
-          <w:b/>
-        </w:rPr>
-        <w:t>Message</w:t>
-      </w:r>
-      <w:r>
-        <w:t xml:space="preserve"> box. The preview on the right shows how it reads for a sample order as you type.</w:t>
-      </w:r>
-    </w:p>
-    <w:p>
-      <w:pPr>
-        <w:tabs>
-          <w:tab w:val="left" w:pos="504"/>
-        </w:tabs>
-        <w:spacing w:after="80"/>
-        <w:ind w:left="504" w:hanging="432"/>
-      </w:pPr>
-      <w:r>
-        <w:rPr>
-          <w:b/>
-          <w:color w:val="0369A1"/>
-        </w:rPr>
-        <w:t>2.</w:t>
-      </w:r>
-      <w:r>
-        <w:rPr>
-          <w:b/>
-          <w:color w:val="0369A1"/>
-        </w:rPr>
-        <w:tab/>
-      </w:r>
-      <w:r>
-        <w:t>Leave a blank line between paragraphs. Start lines with a dash and a space ("- ") to make a bulleted list.</w:t>
-      </w:r>
-    </w:p>
-    <w:p>
-      <w:pPr>
-        <w:tabs>
-          <w:tab w:val="left" w:pos="504"/>
-        </w:tabs>
-        <w:spacing w:after="80"/>
-        <w:ind w:left="504" w:hanging="432"/>
-      </w:pPr>
-      <w:r>
-        <w:rPr>
-          <w:b/>
-          <w:color w:val="0369A1"/>
-        </w:rPr>
-        <w:t>3.</w:t>
-      </w:r>
-      <w:r>
-        <w:rPr>
-          <w:b/>
-          <w:color w:val="0369A1"/>
-        </w:rPr>
-        <w:tab/>
-      </w:r>
-      <w:r>
-        <w:t xml:space="preserve">To add the customer's name, the order number and so on, tap a </w:t>
-      </w:r>
-      <w:r>
-        <w:rPr>
-          <w:b/>
-        </w:rPr>
-        <w:t>placeholder</w:t>
-      </w:r>
-      <w:r>
-        <w:t xml:space="preserve"> under the box. It goes in where the cursor is, and each customer's email fills in their own details.</w:t>
-      </w:r>
-    </w:p>
-    <w:p>
-      <w:pPr>
-        <w:tabs>
-          <w:tab w:val="left" w:pos="504"/>
-        </w:tabs>
-        <w:spacing w:after="80"/>
-        <w:ind w:left="504" w:hanging="432"/>
-      </w:pPr>
-      <w:r>
-        <w:rPr>
-          <w:b/>
-          <w:color w:val="0369A1"/>
-        </w:rPr>
-        <w:t>4.</w:t>
-      </w:r>
-      <w:r>
-        <w:rPr>
-          <w:b/>
-          <w:color w:val="0369A1"/>
-        </w:rPr>
-        <w:tab/>
-      </w:r>
-      <w:r>
-        <w:t xml:space="preserve">Tap </w:t>
-      </w:r>
-      <w:r>
-        <w:rPr>
-          <w:b/>
-        </w:rPr>
-        <w:t>Save</w:t>
-      </w:r>
-      <w:r>
-        <w:t>. Every receipt emailed from then on uses the new wording.</w:t>
+        <w:t>The names and number printed on sheets and emails</w:t>
       </w:r>
     </w:p>
     <w:tbl>
@@ -15254,13 +15382,540 @@
                 <w:b/>
                 <w:color w:val="FFFFFF"/>
               </w:rPr>
+              <w:t>Setting</w:t>
+            </w:r>
+          </w:p>
+        </w:tc>
+        <w:tc>
+          <w:tcPr>
+            <w:tcW w:w="6480" w:type="dxa"/>
+            <w:tcBorders>
+              <w:top w:val="single" w:sz="4" w:space="0" w:color="0369A1"/>
+              <w:left w:val="single" w:sz="4" w:space="0" w:color="0369A1"/>
+              <w:bottom w:val="single" w:sz="4" w:space="0" w:color="0369A1"/>
+              <w:right w:val="single" w:sz="4" w:space="0" w:color="0369A1"/>
+            </w:tcBorders>
+            <w:shd w:val="clear" w:color="auto" w:fill="0369A1"/>
+            <w:tcMar>
+              <w:top w:w="100" w:type="dxa"/>
+              <w:left w:w="140" w:type="dxa"/>
+              <w:bottom w:w="100" w:type="dxa"/>
+              <w:right w:w="140" w:type="dxa"/>
+            </w:tcMar>
+          </w:tcPr>
+          <w:p>
+            <w:pPr>
+              <w:spacing w:after="0"/>
+            </w:pPr>
+            <w:r>
+              <w:rPr>
+                <w:b/>
+                <w:color w:val="FFFFFF"/>
+              </w:rPr>
+              <w:t>Where it shows</w:t>
+            </w:r>
+          </w:p>
+        </w:tc>
+      </w:tr>
+      <w:tr>
+        <w:trPr>
+          <w:jc w:val="center"/>
+        </w:trPr>
+        <w:tc>
+          <w:tcPr>
+            <w:tcW w:w="2880" w:type="dxa"/>
+            <w:tcBorders>
+              <w:top w:val="single" w:sz="4" w:space="0" w:color="D1D5DB"/>
+              <w:left w:val="single" w:sz="4" w:space="0" w:color="D1D5DB"/>
+              <w:bottom w:val="single" w:sz="4" w:space="0" w:color="D1D5DB"/>
+              <w:right w:val="single" w:sz="4" w:space="0" w:color="D1D5DB"/>
+            </w:tcBorders>
+            <w:tcMar>
+              <w:top w:w="100" w:type="dxa"/>
+              <w:left w:w="140" w:type="dxa"/>
+              <w:bottom w:w="100" w:type="dxa"/>
+              <w:right w:w="140" w:type="dxa"/>
+            </w:tcMar>
+          </w:tcPr>
+          <w:p>
+            <w:pPr>
+              <w:spacing w:after="0"/>
+            </w:pPr>
+            <w:r>
+              <w:rPr>
+                <w:b/>
+              </w:rPr>
+              <w:t>Company name</w:t>
+            </w:r>
+          </w:p>
+        </w:tc>
+        <w:tc>
+          <w:tcPr>
+            <w:tcW w:w="6480" w:type="dxa"/>
+            <w:tcBorders>
+              <w:top w:val="single" w:sz="4" w:space="0" w:color="D1D5DB"/>
+              <w:left w:val="single" w:sz="4" w:space="0" w:color="D1D5DB"/>
+              <w:bottom w:val="single" w:sz="4" w:space="0" w:color="D1D5DB"/>
+              <w:right w:val="single" w:sz="4" w:space="0" w:color="D1D5DB"/>
+            </w:tcBorders>
+            <w:tcMar>
+              <w:top w:w="100" w:type="dxa"/>
+              <w:left w:w="140" w:type="dxa"/>
+              <w:bottom w:w="100" w:type="dxa"/>
+              <w:right w:w="140" w:type="dxa"/>
+            </w:tcMar>
+          </w:tcPr>
+          <w:p>
+            <w:pPr>
+              <w:spacing w:after="0"/>
+            </w:pPr>
+            <w:r>
+              <w:t>Across the top of every sales sheet (printed, saved as PDF or emailed), and at the end of the receipt email.</w:t>
+            </w:r>
+          </w:p>
+        </w:tc>
+      </w:tr>
+      <w:tr>
+        <w:trPr>
+          <w:jc w:val="center"/>
+        </w:trPr>
+        <w:tc>
+          <w:tcPr>
+            <w:tcW w:w="2880" w:type="dxa"/>
+            <w:tcBorders>
+              <w:top w:val="single" w:sz="4" w:space="0" w:color="D1D5DB"/>
+              <w:left w:val="single" w:sz="4" w:space="0" w:color="D1D5DB"/>
+              <w:bottom w:val="single" w:sz="4" w:space="0" w:color="D1D5DB"/>
+              <w:right w:val="single" w:sz="4" w:space="0" w:color="D1D5DB"/>
+            </w:tcBorders>
+            <w:shd w:val="clear" w:color="auto" w:fill="F3F4F6"/>
+            <w:tcMar>
+              <w:top w:w="100" w:type="dxa"/>
+              <w:left w:w="140" w:type="dxa"/>
+              <w:bottom w:w="100" w:type="dxa"/>
+              <w:right w:w="140" w:type="dxa"/>
+            </w:tcMar>
+          </w:tcPr>
+          <w:p>
+            <w:pPr>
+              <w:spacing w:after="0"/>
+            </w:pPr>
+            <w:r>
+              <w:rPr>
+                <w:b/>
+              </w:rPr>
+              <w:t>Customer service phone</w:t>
+            </w:r>
+          </w:p>
+        </w:tc>
+        <w:tc>
+          <w:tcPr>
+            <w:tcW w:w="6480" w:type="dxa"/>
+            <w:tcBorders>
+              <w:top w:val="single" w:sz="4" w:space="0" w:color="D1D5DB"/>
+              <w:left w:val="single" w:sz="4" w:space="0" w:color="D1D5DB"/>
+              <w:bottom w:val="single" w:sz="4" w:space="0" w:color="D1D5DB"/>
+              <w:right w:val="single" w:sz="4" w:space="0" w:color="D1D5DB"/>
+            </w:tcBorders>
+            <w:shd w:val="clear" w:color="auto" w:fill="F3F4F6"/>
+            <w:tcMar>
+              <w:top w:w="100" w:type="dxa"/>
+              <w:left w:w="140" w:type="dxa"/>
+              <w:bottom w:w="100" w:type="dxa"/>
+              <w:right w:w="140" w:type="dxa"/>
+            </w:tcMar>
+          </w:tcPr>
+          <w:p>
+            <w:pPr>
+              <w:spacing w:after="0"/>
+            </w:pPr>
+            <w:r>
+              <w:t>Under the company name on every sales sheet, and in the receipt email.</w:t>
+            </w:r>
+          </w:p>
+        </w:tc>
+      </w:tr>
+      <w:tr>
+        <w:trPr>
+          <w:jc w:val="center"/>
+        </w:trPr>
+        <w:tc>
+          <w:tcPr>
+            <w:tcW w:w="2880" w:type="dxa"/>
+            <w:tcBorders>
+              <w:top w:val="single" w:sz="4" w:space="0" w:color="D1D5DB"/>
+              <w:left w:val="single" w:sz="4" w:space="0" w:color="D1D5DB"/>
+              <w:bottom w:val="single" w:sz="4" w:space="0" w:color="D1D5DB"/>
+              <w:right w:val="single" w:sz="4" w:space="0" w:color="D1D5DB"/>
+            </w:tcBorders>
+            <w:tcMar>
+              <w:top w:w="100" w:type="dxa"/>
+              <w:left w:w="140" w:type="dxa"/>
+              <w:bottom w:w="100" w:type="dxa"/>
+              <w:right w:w="140" w:type="dxa"/>
+            </w:tcMar>
+          </w:tcPr>
+          <w:p>
+            <w:pPr>
+              <w:spacing w:after="0"/>
+            </w:pPr>
+            <w:r>
+              <w:rPr>
+                <w:b/>
+              </w:rPr>
+              <w:t>App name</w:t>
+            </w:r>
+          </w:p>
+        </w:tc>
+        <w:tc>
+          <w:tcPr>
+            <w:tcW w:w="6480" w:type="dxa"/>
+            <w:tcBorders>
+              <w:top w:val="single" w:sz="4" w:space="0" w:color="D1D5DB"/>
+              <w:left w:val="single" w:sz="4" w:space="0" w:color="D1D5DB"/>
+              <w:bottom w:val="single" w:sz="4" w:space="0" w:color="D1D5DB"/>
+              <w:right w:val="single" w:sz="4" w:space="0" w:color="D1D5DB"/>
+            </w:tcBorders>
+            <w:tcMar>
+              <w:top w:w="100" w:type="dxa"/>
+              <w:left w:w="140" w:type="dxa"/>
+              <w:bottom w:w="100" w:type="dxa"/>
+              <w:right w:w="140" w:type="dxa"/>
+            </w:tcMar>
+          </w:tcPr>
+          <w:p>
+            <w:pPr>
+              <w:spacing w:after="0"/>
+            </w:pPr>
+            <w:r>
+              <w:t>In the menu bar, on the sign-in screen, in the browser tab, and as the name emails come from.</w:t>
+            </w:r>
+          </w:p>
+        </w:tc>
+      </w:tr>
+    </w:tbl>
+    <w:p>
+      <w:pPr>
+        <w:spacing w:after="40"/>
+      </w:pPr>
+    </w:p>
+    <w:tbl>
+      <w:tblPr>
+        <w:tblW w:w="0" w:type="auto"/>
+        <w:jc w:val="center"/>
+        <w:tblLook w:val="04A0" w:firstRow="1" w:lastRow="0" w:firstColumn="1" w:lastColumn="0" w:noHBand="0" w:noVBand="1"/>
+      </w:tblPr>
+      <w:tblGrid>
+        <w:gridCol w:w="9360"/>
+      </w:tblGrid>
+      <w:tr>
+        <w:trPr>
+          <w:jc w:val="center"/>
+        </w:trPr>
+        <w:tc>
+          <w:tcPr>
+            <w:tcW w:w="9360" w:type="dxa"/>
+            <w:tcBorders>
+              <w:top w:val="single" w:sz="4" w:space="0" w:color="F3F4F6"/>
+              <w:left w:val="single" w:sz="36" w:space="0" w:color="6B7280"/>
+              <w:bottom w:val="single" w:sz="4" w:space="0" w:color="F3F4F6"/>
+              <w:right w:val="single" w:sz="4" w:space="0" w:color="F3F4F6"/>
+            </w:tcBorders>
+            <w:shd w:val="clear" w:color="auto" w:fill="F3F4F6"/>
+            <w:tcMar>
+              <w:top w:w="120" w:type="dxa"/>
+              <w:left w:w="200" w:type="dxa"/>
+              <w:bottom w:w="120" w:type="dxa"/>
+              <w:right w:w="160" w:type="dxa"/>
+            </w:tcMar>
+          </w:tcPr>
+          <w:p>
+            <w:pPr>
+              <w:spacing w:after="0"/>
+            </w:pPr>
+            <w:r>
+              <w:rPr>
+                <w:b/>
+                <w:color w:val="6B7280"/>
+              </w:rPr>
+              <w:t xml:space="preserve">Good to know:  </w:t>
+            </w:r>
+            <w:r>
+              <w:t>Changes show straight away for you, and for everyone else the next time their screen loads. Sales sheets already printed or emailed keep the details they had.</w:t>
+            </w:r>
+          </w:p>
+        </w:tc>
+      </w:tr>
+    </w:tbl>
+    <w:p>
+      <w:pPr>
+        <w:spacing w:after="40"/>
+      </w:pPr>
+    </w:p>
+    <w:p>
+      <w:pPr>
+        <w:pStyle w:val="Heading2"/>
+      </w:pPr>
+      <w:bookmarkStart w:id="46" w:name="_Toc241702890"/>
+      <w:r>
+        <w:t>Receipt email</w:t>
+      </w:r>
+      <w:bookmarkEnd w:id="46"/>
+    </w:p>
+    <w:p>
+      <w:r>
+        <w:t>This is the note customers get with an emailed receipt. The receipt itself is always attached as a PDF; this is the message around it.</w:t>
+      </w:r>
+    </w:p>
+    <w:p>
+      <w:pPr>
+        <w:keepNext/>
+        <w:spacing w:after="40"/>
+        <w:jc w:val="center"/>
+      </w:pPr>
+      <w:r>
+        <w:rPr>
+          <w:noProof/>
+        </w:rPr>
+        <w:lastRenderedPageBreak/>
+        <w:drawing>
+          <wp:inline distT="0" distB="0" distL="0" distR="0" wp14:anchorId="53D9A9A7" wp14:editId="604E5803">
+            <wp:extent cx="5760720" cy="4450842"/>
+            <wp:effectExtent l="0" t="0" r="0" b="0"/>
+            <wp:docPr id="32" name="Picture 32"/>
+            <wp:cNvGraphicFramePr>
+              <a:graphicFrameLocks xmlns:a="http://schemas.openxmlformats.org/drawingml/2006/main" noChangeAspect="1"/>
+            </wp:cNvGraphicFramePr>
+            <a:graphic xmlns:a="http://schemas.openxmlformats.org/drawingml/2006/main">
+              <a:graphicData uri="http://schemas.openxmlformats.org/drawingml/2006/picture">
+                <pic:pic xmlns:pic="http://schemas.openxmlformats.org/drawingml/2006/picture">
+                  <pic:nvPicPr>
+                    <pic:cNvPr id="0" name="36_settings.png"/>
+                    <pic:cNvPicPr/>
+                  </pic:nvPicPr>
+                  <pic:blipFill>
+                    <a:blip r:embed="rId40"/>
+                    <a:stretch>
+                      <a:fillRect/>
+                    </a:stretch>
+                  </pic:blipFill>
+                  <pic:spPr>
+                    <a:xfrm>
+                      <a:off x="0" y="0"/>
+                      <a:ext cx="5760720" cy="4450842"/>
+                    </a:xfrm>
+                    <a:prstGeom prst="rect">
+                      <a:avLst/>
+                    </a:prstGeom>
+                  </pic:spPr>
+                </pic:pic>
+              </a:graphicData>
+            </a:graphic>
+          </wp:inline>
+        </w:drawing>
+      </w:r>
+    </w:p>
+    <w:p>
+      <w:pPr>
+        <w:spacing w:after="200"/>
+        <w:jc w:val="center"/>
+      </w:pPr>
+      <w:r>
+        <w:rPr>
+          <w:i/>
+          <w:color w:val="6B7280"/>
+          <w:sz w:val="18"/>
+        </w:rPr>
+        <w:t>Editing the receipt email, with a live preview on the right</w:t>
+      </w:r>
+    </w:p>
+    <w:p>
+      <w:pPr>
+        <w:tabs>
+          <w:tab w:val="left" w:pos="504"/>
+        </w:tabs>
+        <w:spacing w:after="80"/>
+        <w:ind w:left="504" w:hanging="432"/>
+      </w:pPr>
+      <w:r>
+        <w:rPr>
+          <w:b/>
+          <w:color w:val="0369A1"/>
+        </w:rPr>
+        <w:t>1.</w:t>
+      </w:r>
+      <w:r>
+        <w:rPr>
+          <w:b/>
+          <w:color w:val="0369A1"/>
+        </w:rPr>
+        <w:tab/>
+      </w:r>
+      <w:r>
+        <w:t xml:space="preserve">Change the </w:t>
+      </w:r>
+      <w:r>
+        <w:rPr>
+          <w:b/>
+        </w:rPr>
+        <w:t>Subject</w:t>
+      </w:r>
+      <w:r>
+        <w:t xml:space="preserve"> or the </w:t>
+      </w:r>
+      <w:r>
+        <w:rPr>
+          <w:b/>
+        </w:rPr>
+        <w:t>Message</w:t>
+      </w:r>
+      <w:r>
+        <w:t>. The preview on the right shows how the email reads for a sample order as you type.</w:t>
+      </w:r>
+    </w:p>
+    <w:p>
+      <w:pPr>
+        <w:tabs>
+          <w:tab w:val="left" w:pos="504"/>
+        </w:tabs>
+        <w:spacing w:after="80"/>
+        <w:ind w:left="504" w:hanging="432"/>
+      </w:pPr>
+      <w:r>
+        <w:rPr>
+          <w:b/>
+          <w:color w:val="0369A1"/>
+        </w:rPr>
+        <w:t>2.</w:t>
+      </w:r>
+      <w:r>
+        <w:rPr>
+          <w:b/>
+          <w:color w:val="0369A1"/>
+        </w:rPr>
+        <w:tab/>
+      </w:r>
+      <w:r>
+        <w:t>In the message, leave a blank line between paragraphs. Start lines with a dash and a space ("- ") to make a bulleted list.</w:t>
+      </w:r>
+    </w:p>
+    <w:p>
+      <w:pPr>
+        <w:tabs>
+          <w:tab w:val="left" w:pos="504"/>
+        </w:tabs>
+        <w:spacing w:after="80"/>
+        <w:ind w:left="504" w:hanging="432"/>
+      </w:pPr>
+      <w:r>
+        <w:rPr>
+          <w:b/>
+          <w:color w:val="0369A1"/>
+        </w:rPr>
+        <w:t>3.</w:t>
+      </w:r>
+      <w:r>
+        <w:rPr>
+          <w:b/>
+          <w:color w:val="0369A1"/>
+        </w:rPr>
+        <w:tab/>
+      </w:r>
+      <w:r>
+        <w:t xml:space="preserve">To add the customer's name, the order number and so on, tap a </w:t>
+      </w:r>
+      <w:r>
+        <w:rPr>
+          <w:b/>
+        </w:rPr>
+        <w:t>placeholder</w:t>
+      </w:r>
+      <w:r>
+        <w:t xml:space="preserve"> under the message. It goes in where the cursor was - in the subject or the message, whichever you were typing in - and each customer's email fills in their own details.</w:t>
+      </w:r>
+    </w:p>
+    <w:p>
+      <w:pPr>
+        <w:tabs>
+          <w:tab w:val="left" w:pos="504"/>
+        </w:tabs>
+        <w:spacing w:after="80"/>
+        <w:ind w:left="504" w:hanging="432"/>
+      </w:pPr>
+      <w:r>
+        <w:rPr>
+          <w:b/>
+          <w:color w:val="0369A1"/>
+        </w:rPr>
+        <w:t>4.</w:t>
+      </w:r>
+      <w:r>
+        <w:rPr>
+          <w:b/>
+          <w:color w:val="0369A1"/>
+        </w:rPr>
+        <w:tab/>
+      </w:r>
+      <w:r>
+        <w:t xml:space="preserve">Tap </w:t>
+      </w:r>
+      <w:r>
+        <w:rPr>
+          <w:b/>
+        </w:rPr>
+        <w:t>Save</w:t>
+      </w:r>
+      <w:r>
+        <w:t>. Every receipt emailed from then on uses the new wording.</w:t>
+      </w:r>
+    </w:p>
+    <w:tbl>
+      <w:tblPr>
+        <w:tblW w:w="0" w:type="auto"/>
+        <w:jc w:val="center"/>
+        <w:tblLook w:val="04A0" w:firstRow="1" w:lastRow="0" w:firstColumn="1" w:lastColumn="0" w:noHBand="0" w:noVBand="1"/>
+      </w:tblPr>
+      <w:tblGrid>
+        <w:gridCol w:w="3168"/>
+        <w:gridCol w:w="6192"/>
+      </w:tblGrid>
+      <w:tr>
+        <w:trPr>
+          <w:jc w:val="center"/>
+        </w:trPr>
+        <w:tc>
+          <w:tcPr>
+            <w:tcW w:w="3168" w:type="dxa"/>
+            <w:tcBorders>
+              <w:top w:val="single" w:sz="4" w:space="0" w:color="0369A1"/>
+              <w:left w:val="single" w:sz="4" w:space="0" w:color="0369A1"/>
+              <w:bottom w:val="single" w:sz="4" w:space="0" w:color="0369A1"/>
+              <w:right w:val="single" w:sz="4" w:space="0" w:color="0369A1"/>
+            </w:tcBorders>
+            <w:shd w:val="clear" w:color="auto" w:fill="0369A1"/>
+            <w:tcMar>
+              <w:top w:w="100" w:type="dxa"/>
+              <w:left w:w="140" w:type="dxa"/>
+              <w:bottom w:w="100" w:type="dxa"/>
+              <w:right w:w="140" w:type="dxa"/>
+            </w:tcMar>
+          </w:tcPr>
+          <w:p>
+            <w:pPr>
+              <w:spacing w:after="0"/>
+            </w:pPr>
+            <w:r>
+              <w:rPr>
+                <w:b/>
+                <w:color w:val="FFFFFF"/>
+              </w:rPr>
               <w:t>Placeholder</w:t>
             </w:r>
           </w:p>
         </w:tc>
         <w:tc>
           <w:tcPr>
-            <w:tcW w:w="6480" w:type="dxa"/>
+            <w:tcW w:w="6192" w:type="dxa"/>
             <w:tcBorders>
               <w:top w:val="single" w:sz="4" w:space="0" w:color="0369A1"/>
               <w:left w:val="single" w:sz="4" w:space="0" w:color="0369A1"/>
@@ -15295,7 +15950,7 @@
         </w:trPr>
         <w:tc>
           <w:tcPr>
-            <w:tcW w:w="2880" w:type="dxa"/>
+            <w:tcW w:w="3168" w:type="dxa"/>
             <w:tcBorders>
               <w:top w:val="single" w:sz="4" w:space="0" w:color="D1D5DB"/>
               <w:left w:val="single" w:sz="4" w:space="0" w:color="D1D5DB"/>
@@ -15323,7 +15978,7 @@
         </w:tc>
         <w:tc>
           <w:tcPr>
-            <w:tcW w:w="6480" w:type="dxa"/>
+            <w:tcW w:w="6192" w:type="dxa"/>
             <w:tcBorders>
               <w:top w:val="single" w:sz="4" w:space="0" w:color="D1D5DB"/>
               <w:left w:val="single" w:sz="4" w:space="0" w:color="D1D5DB"/>
@@ -15353,7 +16008,7 @@
         </w:trPr>
         <w:tc>
           <w:tcPr>
-            <w:tcW w:w="2880" w:type="dxa"/>
+            <w:tcW w:w="3168" w:type="dxa"/>
             <w:tcBorders>
               <w:top w:val="single" w:sz="4" w:space="0" w:color="D1D5DB"/>
               <w:left w:val="single" w:sz="4" w:space="0" w:color="D1D5DB"/>
@@ -15376,14 +16031,13 @@
               <w:rPr>
                 <w:b/>
               </w:rPr>
-              <w:lastRenderedPageBreak/>
               <w:t>{CustomerName}</w:t>
             </w:r>
           </w:p>
         </w:tc>
         <w:tc>
           <w:tcPr>
-            <w:tcW w:w="6480" w:type="dxa"/>
+            <w:tcW w:w="6192" w:type="dxa"/>
             <w:tcBorders>
               <w:top w:val="single" w:sz="4" w:space="0" w:color="D1D5DB"/>
               <w:left w:val="single" w:sz="4" w:space="0" w:color="D1D5DB"/>
@@ -15414,7 +16068,7 @@
         </w:trPr>
         <w:tc>
           <w:tcPr>
-            <w:tcW w:w="2880" w:type="dxa"/>
+            <w:tcW w:w="3168" w:type="dxa"/>
             <w:tcBorders>
               <w:top w:val="single" w:sz="4" w:space="0" w:color="D1D5DB"/>
               <w:left w:val="single" w:sz="4" w:space="0" w:color="D1D5DB"/>
@@ -15442,7 +16096,7 @@
         </w:tc>
         <w:tc>
           <w:tcPr>
-            <w:tcW w:w="6480" w:type="dxa"/>
+            <w:tcW w:w="6192" w:type="dxa"/>
             <w:tcBorders>
               <w:top w:val="single" w:sz="4" w:space="0" w:color="D1D5DB"/>
               <w:left w:val="single" w:sz="4" w:space="0" w:color="D1D5DB"/>
@@ -15472,7 +16126,7 @@
         </w:trPr>
         <w:tc>
           <w:tcPr>
-            <w:tcW w:w="2880" w:type="dxa"/>
+            <w:tcW w:w="3168" w:type="dxa"/>
             <w:tcBorders>
               <w:top w:val="single" w:sz="4" w:space="0" w:color="D1D5DB"/>
               <w:left w:val="single" w:sz="4" w:space="0" w:color="D1D5DB"/>
@@ -15501,7 +16155,7 @@
         </w:tc>
         <w:tc>
           <w:tcPr>
-            <w:tcW w:w="6480" w:type="dxa"/>
+            <w:tcW w:w="6192" w:type="dxa"/>
             <w:tcBorders>
               <w:top w:val="single" w:sz="4" w:space="0" w:color="D1D5DB"/>
               <w:left w:val="single" w:sz="4" w:space="0" w:color="D1D5DB"/>
@@ -15532,7 +16186,7 @@
         </w:trPr>
         <w:tc>
           <w:tcPr>
-            <w:tcW w:w="2880" w:type="dxa"/>
+            <w:tcW w:w="3168" w:type="dxa"/>
             <w:tcBorders>
               <w:top w:val="single" w:sz="4" w:space="0" w:color="D1D5DB"/>
               <w:left w:val="single" w:sz="4" w:space="0" w:color="D1D5DB"/>
@@ -15554,13 +16208,14 @@
               <w:rPr>
                 <w:b/>
               </w:rPr>
+              <w:lastRenderedPageBreak/>
               <w:t>{SaleDate}</w:t>
             </w:r>
           </w:p>
         </w:tc>
         <w:tc>
           <w:tcPr>
-            <w:tcW w:w="6480" w:type="dxa"/>
+            <w:tcW w:w="6192" w:type="dxa"/>
             <w:tcBorders>
               <w:top w:val="single" w:sz="4" w:space="0" w:color="D1D5DB"/>
               <w:left w:val="single" w:sz="4" w:space="0" w:color="D1D5DB"/>
@@ -15590,7 +16245,7 @@
         </w:trPr>
         <w:tc>
           <w:tcPr>
-            <w:tcW w:w="2880" w:type="dxa"/>
+            <w:tcW w:w="3168" w:type="dxa"/>
             <w:tcBorders>
               <w:top w:val="single" w:sz="4" w:space="0" w:color="D1D5DB"/>
               <w:left w:val="single" w:sz="4" w:space="0" w:color="D1D5DB"/>
@@ -15619,7 +16274,7 @@
         </w:tc>
         <w:tc>
           <w:tcPr>
-            <w:tcW w:w="6480" w:type="dxa"/>
+            <w:tcW w:w="6192" w:type="dxa"/>
             <w:tcBorders>
               <w:top w:val="single" w:sz="4" w:space="0" w:color="D1D5DB"/>
               <w:left w:val="single" w:sz="4" w:space="0" w:color="D1D5DB"/>
@@ -15650,7 +16305,7 @@
         </w:trPr>
         <w:tc>
           <w:tcPr>
-            <w:tcW w:w="2880" w:type="dxa"/>
+            <w:tcW w:w="3168" w:type="dxa"/>
             <w:tcBorders>
               <w:top w:val="single" w:sz="4" w:space="0" w:color="D1D5DB"/>
               <w:left w:val="single" w:sz="4" w:space="0" w:color="D1D5DB"/>
@@ -15678,7 +16333,7 @@
         </w:tc>
         <w:tc>
           <w:tcPr>
-            <w:tcW w:w="6480" w:type="dxa"/>
+            <w:tcW w:w="6192" w:type="dxa"/>
             <w:tcBorders>
               <w:top w:val="single" w:sz="4" w:space="0" w:color="D1D5DB"/>
               <w:left w:val="single" w:sz="4" w:space="0" w:color="D1D5DB"/>
@@ -15708,7 +16363,7 @@
         </w:trPr>
         <w:tc>
           <w:tcPr>
-            <w:tcW w:w="2880" w:type="dxa"/>
+            <w:tcW w:w="3168" w:type="dxa"/>
             <w:tcBorders>
               <w:top w:val="single" w:sz="4" w:space="0" w:color="D1D5DB"/>
               <w:left w:val="single" w:sz="4" w:space="0" w:color="D1D5DB"/>
@@ -15737,7 +16392,7 @@
         </w:tc>
         <w:tc>
           <w:tcPr>
-            <w:tcW w:w="6480" w:type="dxa"/>
+            <w:tcW w:w="6192" w:type="dxa"/>
             <w:tcBorders>
               <w:top w:val="single" w:sz="4" w:space="0" w:color="D1D5DB"/>
               <w:left w:val="single" w:sz="4" w:space="0" w:color="D1D5DB"/>
@@ -15768,7 +16423,7 @@
         </w:trPr>
         <w:tc>
           <w:tcPr>
-            <w:tcW w:w="2880" w:type="dxa"/>
+            <w:tcW w:w="3168" w:type="dxa"/>
             <w:tcBorders>
               <w:top w:val="single" w:sz="4" w:space="0" w:color="D1D5DB"/>
               <w:left w:val="single" w:sz="4" w:space="0" w:color="D1D5DB"/>
@@ -15796,7 +16451,7 @@
         </w:tc>
         <w:tc>
           <w:tcPr>
-            <w:tcW w:w="6480" w:type="dxa"/>
+            <w:tcW w:w="6192" w:type="dxa"/>
             <w:tcBorders>
               <w:top w:val="single" w:sz="4" w:space="0" w:color="D1D5DB"/>
               <w:left w:val="single" w:sz="4" w:space="0" w:color="D1D5DB"/>
@@ -15815,7 +16470,7 @@
               <w:spacing w:after="0"/>
             </w:pPr>
             <w:r>
-              <w:t>The customer service number</w:t>
+              <w:t>The customer service number from Business details</w:t>
             </w:r>
           </w:p>
         </w:tc>
@@ -15826,7 +16481,7 @@
         </w:trPr>
         <w:tc>
           <w:tcPr>
-            <w:tcW w:w="2880" w:type="dxa"/>
+            <w:tcW w:w="3168" w:type="dxa"/>
             <w:tcBorders>
               <w:top w:val="single" w:sz="4" w:space="0" w:color="D1D5DB"/>
               <w:left w:val="single" w:sz="4" w:space="0" w:color="D1D5DB"/>
@@ -15849,13 +16504,13 @@
               <w:rPr>
                 <w:b/>
               </w:rPr>
-              <w:t>{WhatHappensNext}</w:t>
+              <w:t>{CompanyName}</w:t>
             </w:r>
           </w:p>
         </w:tc>
         <w:tc>
           <w:tcPr>
-            <w:tcW w:w="6480" w:type="dxa"/>
+            <w:tcW w:w="6192" w:type="dxa"/>
             <w:tcBorders>
               <w:top w:val="single" w:sz="4" w:space="0" w:color="D1D5DB"/>
               <w:left w:val="single" w:sz="4" w:space="0" w:color="D1D5DB"/>
@@ -15863,6 +16518,64 @@
               <w:right w:val="single" w:sz="4" w:space="0" w:color="D1D5DB"/>
             </w:tcBorders>
             <w:shd w:val="clear" w:color="auto" w:fill="F3F4F6"/>
+            <w:tcMar>
+              <w:top w:w="100" w:type="dxa"/>
+              <w:left w:w="140" w:type="dxa"/>
+              <w:bottom w:w="100" w:type="dxa"/>
+              <w:right w:w="140" w:type="dxa"/>
+            </w:tcMar>
+          </w:tcPr>
+          <w:p>
+            <w:pPr>
+              <w:spacing w:after="0"/>
+            </w:pPr>
+            <w:r>
+              <w:t>The company name from Business details</w:t>
+            </w:r>
+          </w:p>
+        </w:tc>
+      </w:tr>
+      <w:tr>
+        <w:trPr>
+          <w:jc w:val="center"/>
+        </w:trPr>
+        <w:tc>
+          <w:tcPr>
+            <w:tcW w:w="3168" w:type="dxa"/>
+            <w:tcBorders>
+              <w:top w:val="single" w:sz="4" w:space="0" w:color="D1D5DB"/>
+              <w:left w:val="single" w:sz="4" w:space="0" w:color="D1D5DB"/>
+              <w:bottom w:val="single" w:sz="4" w:space="0" w:color="D1D5DB"/>
+              <w:right w:val="single" w:sz="4" w:space="0" w:color="D1D5DB"/>
+            </w:tcBorders>
+            <w:tcMar>
+              <w:top w:w="100" w:type="dxa"/>
+              <w:left w:w="140" w:type="dxa"/>
+              <w:bottom w:w="100" w:type="dxa"/>
+              <w:right w:w="140" w:type="dxa"/>
+            </w:tcMar>
+          </w:tcPr>
+          <w:p>
+            <w:pPr>
+              <w:spacing w:after="0"/>
+            </w:pPr>
+            <w:r>
+              <w:rPr>
+                <w:b/>
+              </w:rPr>
+              <w:t>{WhatHappensNext}</w:t>
+            </w:r>
+          </w:p>
+        </w:tc>
+        <w:tc>
+          <w:tcPr>
+            <w:tcW w:w="6192" w:type="dxa"/>
+            <w:tcBorders>
+              <w:top w:val="single" w:sz="4" w:space="0" w:color="D1D5DB"/>
+              <w:left w:val="single" w:sz="4" w:space="0" w:color="D1D5DB"/>
+              <w:bottom w:val="single" w:sz="4" w:space="0" w:color="D1D5DB"/>
+              <w:right w:val="single" w:sz="4" w:space="0" w:color="D1D5DB"/>
+            </w:tcBorders>
             <w:tcMar>
               <w:top w:w="100" w:type="dxa"/>
               <w:left w:w="140" w:type="dxa"/>
@@ -15940,59 +16653,14 @@
       </w:pPr>
     </w:p>
     <w:p>
-      <w:r>
-        <w:rPr>
-          <w:b/>
-        </w:rPr>
-        <w:t>Discard changes</w:t>
-      </w:r>
-      <w:r>
-        <w:t xml:space="preserve"> puts back the saved wording. </w:t>
-      </w:r>
-      <w:r>
-        <w:rPr>
-          <w:b/>
-        </w:rPr>
-        <w:t>Reset to default</w:t>
-      </w:r>
-      <w:r>
-        <w:t xml:space="preserve"> goes back to the app's own wording, after asking you to confirm.</w:t>
-      </w:r>
-    </w:p>
-    <w:p>
-      <w:pPr>
-        <w:pStyle w:val="Heading1"/>
-        <w:pageBreakBefore/>
-      </w:pPr>
-      <w:bookmarkStart w:id="45" w:name="_Toc241701880"/>
-      <w:r>
-        <w:lastRenderedPageBreak/>
-        <w:t>Owner: permanent deletes</w:t>
-      </w:r>
-      <w:bookmarkEnd w:id="45"/>
-    </w:p>
-    <w:p>
-      <w:r>
-        <w:t xml:space="preserve">Everything in this section is only available to </w:t>
-      </w:r>
-      <w:r>
-        <w:rPr>
-          <w:b/>
-        </w:rPr>
-        <w:t>Owners</w:t>
-      </w:r>
-      <w:r>
-        <w:t xml:space="preserve">. Admins can archive, deactivate and void, which keeps the records on file. An owner can remove records from the database for good. There's no undo, so every permanent delete asks you to type </w:t>
-      </w:r>
-      <w:r>
-        <w:rPr>
-          <w:b/>
-        </w:rPr>
-        <w:t>DELETE</w:t>
-      </w:r>
-      <w:r>
-        <w:t xml:space="preserve"> before the button unlocks.</w:t>
-      </w:r>
+      <w:pPr>
+        <w:pStyle w:val="Heading2"/>
+      </w:pPr>
+      <w:bookmarkStart w:id="47" w:name="_Toc241702891"/>
+      <w:r>
+        <w:t>Dashboard</w:t>
+      </w:r>
+      <w:bookmarkEnd w:id="47"/>
     </w:p>
     <w:p>
       <w:pPr>
@@ -16005,10 +16673,381 @@
           <w:noProof/>
         </w:rPr>
         <w:drawing>
-          <wp:inline distT="0" distB="0" distL="0" distR="0" wp14:anchorId="52AEEBAE" wp14:editId="1B944D7A">
+          <wp:inline distT="0" distB="0" distL="0" distR="0" wp14:anchorId="38935DF5" wp14:editId="088844F1">
+            <wp:extent cx="5760720" cy="1591056"/>
+            <wp:effectExtent l="0" t="0" r="0" b="0"/>
+            <wp:docPr id="33" name="Picture 33"/>
+            <wp:cNvGraphicFramePr>
+              <a:graphicFrameLocks xmlns:a="http://schemas.openxmlformats.org/drawingml/2006/main" noChangeAspect="1"/>
+            </wp:cNvGraphicFramePr>
+            <a:graphic xmlns:a="http://schemas.openxmlformats.org/drawingml/2006/main">
+              <a:graphicData uri="http://schemas.openxmlformats.org/drawingml/2006/picture">
+                <pic:pic xmlns:pic="http://schemas.openxmlformats.org/drawingml/2006/picture">
+                  <pic:nvPicPr>
+                    <pic:cNvPr id="0" name="37_settings_dashboard.png"/>
+                    <pic:cNvPicPr/>
+                  </pic:nvPicPr>
+                  <pic:blipFill>
+                    <a:blip r:embed="rId41"/>
+                    <a:stretch>
+                      <a:fillRect/>
+                    </a:stretch>
+                  </pic:blipFill>
+                  <pic:spPr>
+                    <a:xfrm>
+                      <a:off x="0" y="0"/>
+                      <a:ext cx="5760720" cy="1591056"/>
+                    </a:xfrm>
+                    <a:prstGeom prst="rect">
+                      <a:avLst/>
+                    </a:prstGeom>
+                  </pic:spPr>
+                </pic:pic>
+              </a:graphicData>
+            </a:graphic>
+          </wp:inline>
+        </w:drawing>
+      </w:r>
+    </w:p>
+    <w:p>
+      <w:pPr>
+        <w:spacing w:after="200"/>
+        <w:jc w:val="center"/>
+      </w:pPr>
+      <w:r>
+        <w:rPr>
+          <w:i/>
+          <w:color w:val="6B7280"/>
+          <w:sz w:val="18"/>
+        </w:rPr>
+        <w:t>When stars are earned, and when stock is running low</w:t>
+      </w:r>
+    </w:p>
+    <w:tbl>
+      <w:tblPr>
+        <w:tblW w:w="0" w:type="auto"/>
+        <w:jc w:val="center"/>
+        <w:tblLook w:val="04A0" w:firstRow="1" w:lastRow="0" w:firstColumn="1" w:lastColumn="0" w:noHBand="0" w:noVBand="1"/>
+      </w:tblPr>
+      <w:tblGrid>
+        <w:gridCol w:w="2880"/>
+        <w:gridCol w:w="6480"/>
+      </w:tblGrid>
+      <w:tr>
+        <w:trPr>
+          <w:jc w:val="center"/>
+        </w:trPr>
+        <w:tc>
+          <w:tcPr>
+            <w:tcW w:w="2880" w:type="dxa"/>
+            <w:tcBorders>
+              <w:top w:val="single" w:sz="4" w:space="0" w:color="0369A1"/>
+              <w:left w:val="single" w:sz="4" w:space="0" w:color="0369A1"/>
+              <w:bottom w:val="single" w:sz="4" w:space="0" w:color="0369A1"/>
+              <w:right w:val="single" w:sz="4" w:space="0" w:color="0369A1"/>
+            </w:tcBorders>
+            <w:shd w:val="clear" w:color="auto" w:fill="0369A1"/>
+            <w:tcMar>
+              <w:top w:w="100" w:type="dxa"/>
+              <w:left w:w="140" w:type="dxa"/>
+              <w:bottom w:w="100" w:type="dxa"/>
+              <w:right w:w="140" w:type="dxa"/>
+            </w:tcMar>
+          </w:tcPr>
+          <w:p>
+            <w:pPr>
+              <w:spacing w:after="0"/>
+            </w:pPr>
+            <w:r>
+              <w:rPr>
+                <w:b/>
+                <w:color w:val="FFFFFF"/>
+              </w:rPr>
+              <w:t>Setting</w:t>
+            </w:r>
+          </w:p>
+        </w:tc>
+        <w:tc>
+          <w:tcPr>
+            <w:tcW w:w="6480" w:type="dxa"/>
+            <w:tcBorders>
+              <w:top w:val="single" w:sz="4" w:space="0" w:color="0369A1"/>
+              <w:left w:val="single" w:sz="4" w:space="0" w:color="0369A1"/>
+              <w:bottom w:val="single" w:sz="4" w:space="0" w:color="0369A1"/>
+              <w:right w:val="single" w:sz="4" w:space="0" w:color="0369A1"/>
+            </w:tcBorders>
+            <w:shd w:val="clear" w:color="auto" w:fill="0369A1"/>
+            <w:tcMar>
+              <w:top w:w="100" w:type="dxa"/>
+              <w:left w:w="140" w:type="dxa"/>
+              <w:bottom w:w="100" w:type="dxa"/>
+              <w:right w:w="140" w:type="dxa"/>
+            </w:tcMar>
+          </w:tcPr>
+          <w:p>
+            <w:pPr>
+              <w:spacing w:after="0"/>
+            </w:pPr>
+            <w:r>
+              <w:rPr>
+                <w:b/>
+                <w:color w:val="FFFFFF"/>
+              </w:rPr>
+              <w:t>What it does</w:t>
+            </w:r>
+          </w:p>
+        </w:tc>
+      </w:tr>
+      <w:tr>
+        <w:trPr>
+          <w:jc w:val="center"/>
+        </w:trPr>
+        <w:tc>
+          <w:tcPr>
+            <w:tcW w:w="2880" w:type="dxa"/>
+            <w:tcBorders>
+              <w:top w:val="single" w:sz="4" w:space="0" w:color="D1D5DB"/>
+              <w:left w:val="single" w:sz="4" w:space="0" w:color="D1D5DB"/>
+              <w:bottom w:val="single" w:sz="4" w:space="0" w:color="D1D5DB"/>
+              <w:right w:val="single" w:sz="4" w:space="0" w:color="D1D5DB"/>
+            </w:tcBorders>
+            <w:tcMar>
+              <w:top w:w="100" w:type="dxa"/>
+              <w:left w:w="140" w:type="dxa"/>
+              <w:bottom w:w="100" w:type="dxa"/>
+              <w:right w:w="140" w:type="dxa"/>
+            </w:tcMar>
+          </w:tcPr>
+          <w:p>
+            <w:pPr>
+              <w:spacing w:after="0"/>
+            </w:pPr>
+            <w:r>
+              <w:rPr>
+                <w:b/>
+              </w:rPr>
+              <w:t>First star at</w:t>
+            </w:r>
+          </w:p>
+        </w:tc>
+        <w:tc>
+          <w:tcPr>
+            <w:tcW w:w="6480" w:type="dxa"/>
+            <w:tcBorders>
+              <w:top w:val="single" w:sz="4" w:space="0" w:color="D1D5DB"/>
+              <w:left w:val="single" w:sz="4" w:space="0" w:color="D1D5DB"/>
+              <w:bottom w:val="single" w:sz="4" w:space="0" w:color="D1D5DB"/>
+              <w:right w:val="single" w:sz="4" w:space="0" w:color="D1D5DB"/>
+            </w:tcBorders>
+            <w:tcMar>
+              <w:top w:w="100" w:type="dxa"/>
+              <w:left w:w="140" w:type="dxa"/>
+              <w:bottom w:w="100" w:type="dxa"/>
+              <w:right w:w="140" w:type="dxa"/>
+            </w:tcMar>
+          </w:tcPr>
+          <w:p>
+            <w:pPr>
+              <w:spacing w:after="0"/>
+            </w:pPr>
+            <w:r>
+              <w:t>The net sales that earn the first gold star on the dashboard's Net sales tile (normally $30,000).</w:t>
+            </w:r>
+          </w:p>
+        </w:tc>
+      </w:tr>
+      <w:tr>
+        <w:trPr>
+          <w:jc w:val="center"/>
+        </w:trPr>
+        <w:tc>
+          <w:tcPr>
+            <w:tcW w:w="2880" w:type="dxa"/>
+            <w:tcBorders>
+              <w:top w:val="single" w:sz="4" w:space="0" w:color="D1D5DB"/>
+              <w:left w:val="single" w:sz="4" w:space="0" w:color="D1D5DB"/>
+              <w:bottom w:val="single" w:sz="4" w:space="0" w:color="D1D5DB"/>
+              <w:right w:val="single" w:sz="4" w:space="0" w:color="D1D5DB"/>
+            </w:tcBorders>
+            <w:shd w:val="clear" w:color="auto" w:fill="F3F4F6"/>
+            <w:tcMar>
+              <w:top w:w="100" w:type="dxa"/>
+              <w:left w:w="140" w:type="dxa"/>
+              <w:bottom w:w="100" w:type="dxa"/>
+              <w:right w:w="140" w:type="dxa"/>
+            </w:tcMar>
+          </w:tcPr>
+          <w:p>
+            <w:pPr>
+              <w:spacing w:after="0"/>
+            </w:pPr>
+            <w:r>
+              <w:rPr>
+                <w:b/>
+              </w:rPr>
+              <w:t>Then a star every</w:t>
+            </w:r>
+          </w:p>
+        </w:tc>
+        <w:tc>
+          <w:tcPr>
+            <w:tcW w:w="6480" w:type="dxa"/>
+            <w:tcBorders>
+              <w:top w:val="single" w:sz="4" w:space="0" w:color="D1D5DB"/>
+              <w:left w:val="single" w:sz="4" w:space="0" w:color="D1D5DB"/>
+              <w:bottom w:val="single" w:sz="4" w:space="0" w:color="D1D5DB"/>
+              <w:right w:val="single" w:sz="4" w:space="0" w:color="D1D5DB"/>
+            </w:tcBorders>
+            <w:shd w:val="clear" w:color="auto" w:fill="F3F4F6"/>
+            <w:tcMar>
+              <w:top w:w="100" w:type="dxa"/>
+              <w:left w:w="140" w:type="dxa"/>
+              <w:bottom w:w="100" w:type="dxa"/>
+              <w:right w:w="140" w:type="dxa"/>
+            </w:tcMar>
+          </w:tcPr>
+          <w:p>
+            <w:pPr>
+              <w:spacing w:after="0"/>
+            </w:pPr>
+            <w:r>
+              <w:t>The net sales between each star after that (normally $10,000). The line under the boxes works an example out for you.</w:t>
+            </w:r>
+          </w:p>
+        </w:tc>
+      </w:tr>
+      <w:tr>
+        <w:trPr>
+          <w:jc w:val="center"/>
+        </w:trPr>
+        <w:tc>
+          <w:tcPr>
+            <w:tcW w:w="2880" w:type="dxa"/>
+            <w:tcBorders>
+              <w:top w:val="single" w:sz="4" w:space="0" w:color="D1D5DB"/>
+              <w:left w:val="single" w:sz="4" w:space="0" w:color="D1D5DB"/>
+              <w:bottom w:val="single" w:sz="4" w:space="0" w:color="D1D5DB"/>
+              <w:right w:val="single" w:sz="4" w:space="0" w:color="D1D5DB"/>
+            </w:tcBorders>
+            <w:tcMar>
+              <w:top w:w="100" w:type="dxa"/>
+              <w:left w:w="140" w:type="dxa"/>
+              <w:bottom w:w="100" w:type="dxa"/>
+              <w:right w:w="140" w:type="dxa"/>
+            </w:tcMar>
+          </w:tcPr>
+          <w:p>
+            <w:pPr>
+              <w:spacing w:after="0"/>
+            </w:pPr>
+            <w:r>
+              <w:rPr>
+                <w:b/>
+              </w:rPr>
+              <w:t>Running low at</w:t>
+            </w:r>
+          </w:p>
+        </w:tc>
+        <w:tc>
+          <w:tcPr>
+            <w:tcW w:w="6480" w:type="dxa"/>
+            <w:tcBorders>
+              <w:top w:val="single" w:sz="4" w:space="0" w:color="D1D5DB"/>
+              <w:left w:val="single" w:sz="4" w:space="0" w:color="D1D5DB"/>
+              <w:bottom w:val="single" w:sz="4" w:space="0" w:color="D1D5DB"/>
+              <w:right w:val="single" w:sz="4" w:space="0" w:color="D1D5DB"/>
+            </w:tcBorders>
+            <w:tcMar>
+              <w:top w:w="100" w:type="dxa"/>
+              <w:left w:w="140" w:type="dxa"/>
+              <w:bottom w:w="100" w:type="dxa"/>
+              <w:right w:w="140" w:type="dxa"/>
+            </w:tcMar>
+          </w:tcPr>
+          <w:p>
+            <w:pPr>
+              <w:spacing w:after="0"/>
+            </w:pPr>
+            <w:r>
+              <w:t xml:space="preserve">A counted item with this many or fewer left shows </w:t>
+            </w:r>
+            <w:r>
+              <w:rPr>
+                <w:b/>
+              </w:rPr>
+              <w:t>Running low</w:t>
+            </w:r>
+            <w:r>
+              <w:t xml:space="preserve"> on the Inventory screen and in </w:t>
+            </w:r>
+            <w:r>
+              <w:rPr>
+                <w:b/>
+              </w:rPr>
+              <w:t>Stock to watch</w:t>
+            </w:r>
+            <w:r>
+              <w:t xml:space="preserve"> on the dashboard (normally 2).</w:t>
+            </w:r>
+          </w:p>
+        </w:tc>
+      </w:tr>
+    </w:tbl>
+    <w:p>
+      <w:pPr>
+        <w:spacing w:after="40"/>
+      </w:pPr>
+    </w:p>
+    <w:p>
+      <w:pPr>
+        <w:pStyle w:val="Heading1"/>
+        <w:pageBreakBefore/>
+      </w:pPr>
+      <w:bookmarkStart w:id="48" w:name="_Toc241702892"/>
+      <w:r>
+        <w:lastRenderedPageBreak/>
+        <w:t>Owner: permanent deletes</w:t>
+      </w:r>
+      <w:bookmarkEnd w:id="48"/>
+    </w:p>
+    <w:p>
+      <w:r>
+        <w:t xml:space="preserve">Everything in this section is only available to </w:t>
+      </w:r>
+      <w:r>
+        <w:rPr>
+          <w:b/>
+        </w:rPr>
+        <w:t>Owners</w:t>
+      </w:r>
+      <w:r>
+        <w:t xml:space="preserve">. Admins can archive, deactivate and void, which keeps the records on file. An owner can remove records from the database for good. There's no undo, so every permanent delete asks you to type </w:t>
+      </w:r>
+      <w:r>
+        <w:rPr>
+          <w:b/>
+        </w:rPr>
+        <w:t>DELETE</w:t>
+      </w:r>
+      <w:r>
+        <w:t xml:space="preserve"> before the button unlocks.</w:t>
+      </w:r>
+    </w:p>
+    <w:p>
+      <w:pPr>
+        <w:keepNext/>
+        <w:spacing w:after="40"/>
+        <w:jc w:val="center"/>
+      </w:pPr>
+      <w:r>
+        <w:rPr>
+          <w:noProof/>
+        </w:rPr>
+        <w:drawing>
+          <wp:inline distT="0" distB="0" distL="0" distR="0" wp14:anchorId="6EC98938" wp14:editId="44A227F9">
             <wp:extent cx="4754880" cy="3312709"/>
             <wp:effectExtent l="0" t="0" r="0" b="0"/>
-            <wp:docPr id="32" name="Picture 32"/>
+            <wp:docPr id="34" name="Picture 34"/>
             <wp:cNvGraphicFramePr>
               <a:graphicFrameLocks xmlns:a="http://schemas.openxmlformats.org/drawingml/2006/main" noChangeAspect="1"/>
             </wp:cNvGraphicFramePr>
@@ -16020,7 +17059,7 @@
                     <pic:cNvPicPr/>
                   </pic:nvPicPr>
                   <pic:blipFill>
-                    <a:blip r:embed="rId40"/>
+                    <a:blip r:embed="rId42"/>
                     <a:stretch>
                       <a:fillRect/>
                     </a:stretch>
@@ -16669,12 +17708,12 @@
         <w:pStyle w:val="Heading1"/>
         <w:pageBreakBefore/>
       </w:pPr>
-      <w:bookmarkStart w:id="46" w:name="_Toc241701881"/>
+      <w:bookmarkStart w:id="49" w:name="_Toc241702893"/>
       <w:r>
         <w:lastRenderedPageBreak/>
         <w:t>Tips and troubleshooting</w:t>
       </w:r>
-      <w:bookmarkEnd w:id="46"/>
+      <w:bookmarkEnd w:id="49"/>
     </w:p>
     <w:p>
       <w:r>
@@ -16854,7 +17893,7 @@
         <w:t>Settings</w:t>
       </w:r>
       <w:r>
-        <w:t xml:space="preserve"> (see *Admin: the receipt email*).</w:t>
+        <w:t xml:space="preserve"> (see *Admin: settings*).</w:t>
       </w:r>
     </w:p>
     <w:p>
@@ -17056,22 +18095,22 @@
         <w:pStyle w:val="Heading1"/>
         <w:pageBreakBefore/>
       </w:pPr>
-      <w:bookmarkStart w:id="47" w:name="_Toc241701882"/>
+      <w:bookmarkStart w:id="50" w:name="_Toc241702894"/>
       <w:r>
         <w:lastRenderedPageBreak/>
         <w:t>Quick reference</w:t>
       </w:r>
-      <w:bookmarkEnd w:id="47"/>
+      <w:bookmarkEnd w:id="50"/>
     </w:p>
     <w:p>
       <w:pPr>
         <w:pStyle w:val="Heading2"/>
       </w:pPr>
-      <w:bookmarkStart w:id="48" w:name="_Toc241701883"/>
+      <w:bookmarkStart w:id="51" w:name="_Toc241702895"/>
       <w:r>
         <w:t>Sales rep checklist</w:t>
       </w:r>
-      <w:bookmarkEnd w:id="48"/>
+      <w:bookmarkEnd w:id="51"/>
     </w:p>
     <w:p>
       <w:pPr>
@@ -17211,11 +18250,11 @@
       <w:pPr>
         <w:pStyle w:val="Heading2"/>
       </w:pPr>
-      <w:bookmarkStart w:id="49" w:name="_Toc241701884"/>
+      <w:bookmarkStart w:id="52" w:name="_Toc241702896"/>
       <w:r>
         <w:t>Checkout checklist</w:t>
       </w:r>
-      <w:bookmarkEnd w:id="49"/>
+      <w:bookmarkEnd w:id="52"/>
     </w:p>
     <w:p>
       <w:pPr>
@@ -17399,11 +18438,11 @@
       <w:pPr>
         <w:pStyle w:val="Heading2"/>
       </w:pPr>
-      <w:bookmarkStart w:id="50" w:name="_Toc241701885"/>
+      <w:bookmarkStart w:id="53" w:name="_Toc241702897"/>
       <w:r>
         <w:t>Inventory counts</w:t>
       </w:r>
-      <w:bookmarkEnd w:id="50"/>
+      <w:bookmarkEnd w:id="53"/>
     </w:p>
     <w:p>
       <w:pPr>
@@ -17603,11 +18642,11 @@
       <w:pPr>
         <w:pStyle w:val="Heading2"/>
       </w:pPr>
-      <w:bookmarkStart w:id="51" w:name="_Toc241701886"/>
+      <w:bookmarkStart w:id="54" w:name="_Toc241702898"/>
       <w:r>
         <w:t>Order status at a glance</w:t>
       </w:r>
-      <w:bookmarkEnd w:id="51"/>
+      <w:bookmarkEnd w:id="54"/>
     </w:p>
     <w:tbl>
       <w:tblPr>
@@ -17927,7 +18966,7 @@
       </w:pPr>
     </w:p>
     <w:sectPr>
-      <w:footerReference w:type="default" r:id="rId41"/>
+      <w:footerReference w:type="default" r:id="rId43"/>
       <w:pgSz w:w="12240" w:h="15840"/>
       <w:pgMar w:top="1296" w:right="1440" w:bottom="1296" w:left="1440" w:header="720" w:footer="720" w:gutter="0"/>
       <w:cols w:space="720"/>
@@ -18223,31 +19262,31 @@
       </w:rPr>
     </w:lvl>
   </w:abstractNum>
-  <w:num w:numId="1" w16cid:durableId="1150487065">
+  <w:num w:numId="1" w16cid:durableId="784811448">
     <w:abstractNumId w:val="8"/>
   </w:num>
-  <w:num w:numId="2" w16cid:durableId="588542905">
+  <w:num w:numId="2" w16cid:durableId="2050640610">
     <w:abstractNumId w:val="6"/>
   </w:num>
-  <w:num w:numId="3" w16cid:durableId="700328444">
+  <w:num w:numId="3" w16cid:durableId="805246330">
     <w:abstractNumId w:val="5"/>
   </w:num>
-  <w:num w:numId="4" w16cid:durableId="2113209966">
+  <w:num w:numId="4" w16cid:durableId="283969708">
     <w:abstractNumId w:val="4"/>
   </w:num>
-  <w:num w:numId="5" w16cid:durableId="643043379">
+  <w:num w:numId="5" w16cid:durableId="1882937727">
     <w:abstractNumId w:val="7"/>
   </w:num>
-  <w:num w:numId="6" w16cid:durableId="1216939749">
+  <w:num w:numId="6" w16cid:durableId="1451437246">
     <w:abstractNumId w:val="3"/>
   </w:num>
-  <w:num w:numId="7" w16cid:durableId="328219140">
+  <w:num w:numId="7" w16cid:durableId="1059745156">
     <w:abstractNumId w:val="2"/>
   </w:num>
-  <w:num w:numId="8" w16cid:durableId="1465930970">
+  <w:num w:numId="8" w16cid:durableId="122501223">
     <w:abstractNumId w:val="1"/>
   </w:num>
-  <w:num w:numId="9" w16cid:durableId="1031691146">
+  <w:num w:numId="9" w16cid:durableId="22562689">
     <w:abstractNumId w:val="0"/>
   </w:num>
 </w:numbering>
@@ -29639,7 +30678,7 @@
     <w:autoRedefine/>
     <w:uiPriority w:val="39"/>
     <w:unhideWhenUsed/>
-    <w:rsid w:val="001A1662"/>
+    <w:rsid w:val="00B66F04"/>
     <w:pPr>
       <w:spacing w:after="100"/>
     </w:pPr>
@@ -29651,7 +30690,7 @@
     <w:autoRedefine/>
     <w:uiPriority w:val="39"/>
     <w:unhideWhenUsed/>
-    <w:rsid w:val="001A1662"/>
+    <w:rsid w:val="00B66F04"/>
     <w:pPr>
       <w:spacing w:after="100"/>
       <w:ind w:left="220"/>
@@ -29662,7 +30701,7 @@
     <w:basedOn w:val="DefaultParagraphFont"/>
     <w:uiPriority w:val="99"/>
     <w:unhideWhenUsed/>
-    <w:rsid w:val="001A1662"/>
+    <w:rsid w:val="00B66F04"/>
     <w:rPr>
       <w:color w:val="0000FF" w:themeColor="hyperlink"/>
       <w:u w:val="single"/>

</xml_diff>

<commit_message>
Explain drop ship vs white glove delivery in the receipt email
{WhatHappensNext} now reads each item's service rows:
- Drop Ship (or no service chosen): shipped straight to their door,
  with an email with tracking information once it ships and no
  confirmation call. Only a drop-shipped mattress gets the
  compressed-and-boxed note.
- White Glove: we contact them to schedule delivery once it reaches
  our Cleveland location, typically 3-4 weeks after the event, with no
  confirmation call right after the event.
- Anything else, such as Local Delivery: we'll be in touch about it.
Mixed orders get a line for each. The Settings preview's sample order
now has a white glove mattress, a drop-ship protector and a take-home
pillow. User manual updated.

Co-Authored-By: Claude Opus 5.5 <noreply@anthropic.com>
</commit_message>
<xml_diff>
--- a/Documents/CFS Sales App User Guide.docx
+++ b/Documents/CFS Sales App User Guide.docx
@@ -345,7 +345,7 @@
       <w:r>
         <w:fldChar w:fldCharType="separate"/>
       </w:r>
-      <w:hyperlink w:anchor="_Toc241784866" w:history="1">
+      <w:hyperlink w:anchor="_Toc241785344" w:history="1">
         <w:r>
           <w:rPr>
             <w:rStyle w:val="Hyperlink"/>
@@ -372,7 +372,7 @@
             <w:noProof/>
             <w:webHidden/>
           </w:rPr>
-          <w:instrText xml:space="preserve"> PAGEREF _Toc241784866 \h </w:instrText>
+          <w:instrText xml:space="preserve"> PAGEREF _Toc241785344 \h </w:instrText>
         </w:r>
         <w:r>
           <w:rPr>
@@ -413,7 +413,7 @@
           <w:noProof/>
         </w:rPr>
       </w:pPr>
-      <w:hyperlink w:anchor="_Toc241784867" w:history="1">
+      <w:hyperlink w:anchor="_Toc241785345" w:history="1">
         <w:r>
           <w:rPr>
             <w:rStyle w:val="Hyperlink"/>
@@ -440,7 +440,7 @@
             <w:noProof/>
             <w:webHidden/>
           </w:rPr>
-          <w:instrText xml:space="preserve"> PAGEREF _Toc241784867 \h </w:instrText>
+          <w:instrText xml:space="preserve"> PAGEREF _Toc241785345 \h </w:instrText>
         </w:r>
         <w:r>
           <w:rPr>
@@ -481,7 +481,7 @@
           <w:noProof/>
         </w:rPr>
       </w:pPr>
-      <w:hyperlink w:anchor="_Toc241784868" w:history="1">
+      <w:hyperlink w:anchor="_Toc241785346" w:history="1">
         <w:r>
           <w:rPr>
             <w:rStyle w:val="Hyperlink"/>
@@ -508,7 +508,7 @@
             <w:noProof/>
             <w:webHidden/>
           </w:rPr>
-          <w:instrText xml:space="preserve"> PAGEREF _Toc241784868 \h </w:instrText>
+          <w:instrText xml:space="preserve"> PAGEREF _Toc241785346 \h </w:instrText>
         </w:r>
         <w:r>
           <w:rPr>
@@ -549,7 +549,7 @@
           <w:noProof/>
         </w:rPr>
       </w:pPr>
-      <w:hyperlink w:anchor="_Toc241784869" w:history="1">
+      <w:hyperlink w:anchor="_Toc241785347" w:history="1">
         <w:r>
           <w:rPr>
             <w:rStyle w:val="Hyperlink"/>
@@ -576,7 +576,7 @@
             <w:noProof/>
             <w:webHidden/>
           </w:rPr>
-          <w:instrText xml:space="preserve"> PAGEREF _Toc241784869 \h </w:instrText>
+          <w:instrText xml:space="preserve"> PAGEREF _Toc241785347 \h </w:instrText>
         </w:r>
         <w:r>
           <w:rPr>
@@ -617,7 +617,7 @@
           <w:noProof/>
         </w:rPr>
       </w:pPr>
-      <w:hyperlink w:anchor="_Toc241784870" w:history="1">
+      <w:hyperlink w:anchor="_Toc241785348" w:history="1">
         <w:r>
           <w:rPr>
             <w:rStyle w:val="Hyperlink"/>
@@ -644,7 +644,7 @@
             <w:noProof/>
             <w:webHidden/>
           </w:rPr>
-          <w:instrText xml:space="preserve"> PAGEREF _Toc241784870 \h </w:instrText>
+          <w:instrText xml:space="preserve"> PAGEREF _Toc241785348 \h </w:instrText>
         </w:r>
         <w:r>
           <w:rPr>
@@ -685,7 +685,7 @@
           <w:noProof/>
         </w:rPr>
       </w:pPr>
-      <w:hyperlink w:anchor="_Toc241784871" w:history="1">
+      <w:hyperlink w:anchor="_Toc241785349" w:history="1">
         <w:r>
           <w:rPr>
             <w:rStyle w:val="Hyperlink"/>
@@ -712,7 +712,7 @@
             <w:noProof/>
             <w:webHidden/>
           </w:rPr>
-          <w:instrText xml:space="preserve"> PAGEREF _Toc241784871 \h </w:instrText>
+          <w:instrText xml:space="preserve"> PAGEREF _Toc241785349 \h </w:instrText>
         </w:r>
         <w:r>
           <w:rPr>
@@ -753,7 +753,7 @@
           <w:noProof/>
         </w:rPr>
       </w:pPr>
-      <w:hyperlink w:anchor="_Toc241784872" w:history="1">
+      <w:hyperlink w:anchor="_Toc241785350" w:history="1">
         <w:r>
           <w:rPr>
             <w:rStyle w:val="Hyperlink"/>
@@ -780,7 +780,7 @@
             <w:noProof/>
             <w:webHidden/>
           </w:rPr>
-          <w:instrText xml:space="preserve"> PAGEREF _Toc241784872 \h </w:instrText>
+          <w:instrText xml:space="preserve"> PAGEREF _Toc241785350 \h </w:instrText>
         </w:r>
         <w:r>
           <w:rPr>
@@ -821,7 +821,7 @@
           <w:noProof/>
         </w:rPr>
       </w:pPr>
-      <w:hyperlink w:anchor="_Toc241784873" w:history="1">
+      <w:hyperlink w:anchor="_Toc241785351" w:history="1">
         <w:r>
           <w:rPr>
             <w:rStyle w:val="Hyperlink"/>
@@ -848,7 +848,7 @@
             <w:noProof/>
             <w:webHidden/>
           </w:rPr>
-          <w:instrText xml:space="preserve"> PAGEREF _Toc241784873 \h </w:instrText>
+          <w:instrText xml:space="preserve"> PAGEREF _Toc241785351 \h </w:instrText>
         </w:r>
         <w:r>
           <w:rPr>
@@ -889,7 +889,7 @@
           <w:noProof/>
         </w:rPr>
       </w:pPr>
-      <w:hyperlink w:anchor="_Toc241784874" w:history="1">
+      <w:hyperlink w:anchor="_Toc241785352" w:history="1">
         <w:r>
           <w:rPr>
             <w:rStyle w:val="Hyperlink"/>
@@ -916,7 +916,7 @@
             <w:noProof/>
             <w:webHidden/>
           </w:rPr>
-          <w:instrText xml:space="preserve"> PAGEREF _Toc241784874 \h </w:instrText>
+          <w:instrText xml:space="preserve"> PAGEREF _Toc241785352 \h </w:instrText>
         </w:r>
         <w:r>
           <w:rPr>
@@ -957,7 +957,7 @@
           <w:noProof/>
         </w:rPr>
       </w:pPr>
-      <w:hyperlink w:anchor="_Toc241784875" w:history="1">
+      <w:hyperlink w:anchor="_Toc241785353" w:history="1">
         <w:r>
           <w:rPr>
             <w:rStyle w:val="Hyperlink"/>
@@ -984,7 +984,7 @@
             <w:noProof/>
             <w:webHidden/>
           </w:rPr>
-          <w:instrText xml:space="preserve"> PAGEREF _Toc241784875 \h </w:instrText>
+          <w:instrText xml:space="preserve"> PAGEREF _Toc241785353 \h </w:instrText>
         </w:r>
         <w:r>
           <w:rPr>
@@ -1025,7 +1025,7 @@
           <w:noProof/>
         </w:rPr>
       </w:pPr>
-      <w:hyperlink w:anchor="_Toc241784876" w:history="1">
+      <w:hyperlink w:anchor="_Toc241785354" w:history="1">
         <w:r>
           <w:rPr>
             <w:rStyle w:val="Hyperlink"/>
@@ -1052,7 +1052,7 @@
             <w:noProof/>
             <w:webHidden/>
           </w:rPr>
-          <w:instrText xml:space="preserve"> PAGEREF _Toc241784876 \h </w:instrText>
+          <w:instrText xml:space="preserve"> PAGEREF _Toc241785354 \h </w:instrText>
         </w:r>
         <w:r>
           <w:rPr>
@@ -1093,7 +1093,7 @@
           <w:noProof/>
         </w:rPr>
       </w:pPr>
-      <w:hyperlink w:anchor="_Toc241784877" w:history="1">
+      <w:hyperlink w:anchor="_Toc241785355" w:history="1">
         <w:r>
           <w:rPr>
             <w:rStyle w:val="Hyperlink"/>
@@ -1120,7 +1120,7 @@
             <w:noProof/>
             <w:webHidden/>
           </w:rPr>
-          <w:instrText xml:space="preserve"> PAGEREF _Toc241784877 \h </w:instrText>
+          <w:instrText xml:space="preserve"> PAGEREF _Toc241785355 \h </w:instrText>
         </w:r>
         <w:r>
           <w:rPr>
@@ -1161,7 +1161,7 @@
           <w:noProof/>
         </w:rPr>
       </w:pPr>
-      <w:hyperlink w:anchor="_Toc241784878" w:history="1">
+      <w:hyperlink w:anchor="_Toc241785356" w:history="1">
         <w:r>
           <w:rPr>
             <w:rStyle w:val="Hyperlink"/>
@@ -1188,7 +1188,7 @@
             <w:noProof/>
             <w:webHidden/>
           </w:rPr>
-          <w:instrText xml:space="preserve"> PAGEREF _Toc241784878 \h </w:instrText>
+          <w:instrText xml:space="preserve"> PAGEREF _Toc241785356 \h </w:instrText>
         </w:r>
         <w:r>
           <w:rPr>
@@ -1229,7 +1229,7 @@
           <w:noProof/>
         </w:rPr>
       </w:pPr>
-      <w:hyperlink w:anchor="_Toc241784879" w:history="1">
+      <w:hyperlink w:anchor="_Toc241785357" w:history="1">
         <w:r>
           <w:rPr>
             <w:rStyle w:val="Hyperlink"/>
@@ -1256,7 +1256,7 @@
             <w:noProof/>
             <w:webHidden/>
           </w:rPr>
-          <w:instrText xml:space="preserve"> PAGEREF _Toc241784879 \h </w:instrText>
+          <w:instrText xml:space="preserve"> PAGEREF _Toc241785357 \h </w:instrText>
         </w:r>
         <w:r>
           <w:rPr>
@@ -1297,7 +1297,7 @@
           <w:noProof/>
         </w:rPr>
       </w:pPr>
-      <w:hyperlink w:anchor="_Toc241784880" w:history="1">
+      <w:hyperlink w:anchor="_Toc241785358" w:history="1">
         <w:r>
           <w:rPr>
             <w:rStyle w:val="Hyperlink"/>
@@ -1324,7 +1324,7 @@
             <w:noProof/>
             <w:webHidden/>
           </w:rPr>
-          <w:instrText xml:space="preserve"> PAGEREF _Toc241784880 \h </w:instrText>
+          <w:instrText xml:space="preserve"> PAGEREF _Toc241785358 \h </w:instrText>
         </w:r>
         <w:r>
           <w:rPr>
@@ -1365,7 +1365,7 @@
           <w:noProof/>
         </w:rPr>
       </w:pPr>
-      <w:hyperlink w:anchor="_Toc241784881" w:history="1">
+      <w:hyperlink w:anchor="_Toc241785359" w:history="1">
         <w:r>
           <w:rPr>
             <w:rStyle w:val="Hyperlink"/>
@@ -1392,7 +1392,7 @@
             <w:noProof/>
             <w:webHidden/>
           </w:rPr>
-          <w:instrText xml:space="preserve"> PAGEREF _Toc241784881 \h </w:instrText>
+          <w:instrText xml:space="preserve"> PAGEREF _Toc241785359 \h </w:instrText>
         </w:r>
         <w:r>
           <w:rPr>
@@ -1433,7 +1433,7 @@
           <w:noProof/>
         </w:rPr>
       </w:pPr>
-      <w:hyperlink w:anchor="_Toc241784882" w:history="1">
+      <w:hyperlink w:anchor="_Toc241785360" w:history="1">
         <w:r>
           <w:rPr>
             <w:rStyle w:val="Hyperlink"/>
@@ -1460,7 +1460,7 @@
             <w:noProof/>
             <w:webHidden/>
           </w:rPr>
-          <w:instrText xml:space="preserve"> PAGEREF _Toc241784882 \h </w:instrText>
+          <w:instrText xml:space="preserve"> PAGEREF _Toc241785360 \h </w:instrText>
         </w:r>
         <w:r>
           <w:rPr>
@@ -1501,7 +1501,7 @@
           <w:noProof/>
         </w:rPr>
       </w:pPr>
-      <w:hyperlink w:anchor="_Toc241784883" w:history="1">
+      <w:hyperlink w:anchor="_Toc241785361" w:history="1">
         <w:r>
           <w:rPr>
             <w:rStyle w:val="Hyperlink"/>
@@ -1528,7 +1528,7 @@
             <w:noProof/>
             <w:webHidden/>
           </w:rPr>
-          <w:instrText xml:space="preserve"> PAGEREF _Toc241784883 \h </w:instrText>
+          <w:instrText xml:space="preserve"> PAGEREF _Toc241785361 \h </w:instrText>
         </w:r>
         <w:r>
           <w:rPr>
@@ -1569,7 +1569,7 @@
           <w:noProof/>
         </w:rPr>
       </w:pPr>
-      <w:hyperlink w:anchor="_Toc241784884" w:history="1">
+      <w:hyperlink w:anchor="_Toc241785362" w:history="1">
         <w:r>
           <w:rPr>
             <w:rStyle w:val="Hyperlink"/>
@@ -1596,7 +1596,7 @@
             <w:noProof/>
             <w:webHidden/>
           </w:rPr>
-          <w:instrText xml:space="preserve"> PAGEREF _Toc241784884 \h </w:instrText>
+          <w:instrText xml:space="preserve"> PAGEREF _Toc241785362 \h </w:instrText>
         </w:r>
         <w:r>
           <w:rPr>
@@ -1637,7 +1637,7 @@
           <w:noProof/>
         </w:rPr>
       </w:pPr>
-      <w:hyperlink w:anchor="_Toc241784885" w:history="1">
+      <w:hyperlink w:anchor="_Toc241785363" w:history="1">
         <w:r>
           <w:rPr>
             <w:rStyle w:val="Hyperlink"/>
@@ -1664,7 +1664,7 @@
             <w:noProof/>
             <w:webHidden/>
           </w:rPr>
-          <w:instrText xml:space="preserve"> PAGEREF _Toc241784885 \h </w:instrText>
+          <w:instrText xml:space="preserve"> PAGEREF _Toc241785363 \h </w:instrText>
         </w:r>
         <w:r>
           <w:rPr>
@@ -1705,7 +1705,7 @@
           <w:noProof/>
         </w:rPr>
       </w:pPr>
-      <w:hyperlink w:anchor="_Toc241784886" w:history="1">
+      <w:hyperlink w:anchor="_Toc241785364" w:history="1">
         <w:r>
           <w:rPr>
             <w:rStyle w:val="Hyperlink"/>
@@ -1732,7 +1732,7 @@
             <w:noProof/>
             <w:webHidden/>
           </w:rPr>
-          <w:instrText xml:space="preserve"> PAGEREF _Toc241784886 \h </w:instrText>
+          <w:instrText xml:space="preserve"> PAGEREF _Toc241785364 \h </w:instrText>
         </w:r>
         <w:r>
           <w:rPr>
@@ -1773,7 +1773,7 @@
           <w:noProof/>
         </w:rPr>
       </w:pPr>
-      <w:hyperlink w:anchor="_Toc241784887" w:history="1">
+      <w:hyperlink w:anchor="_Toc241785365" w:history="1">
         <w:r>
           <w:rPr>
             <w:rStyle w:val="Hyperlink"/>
@@ -1800,7 +1800,7 @@
             <w:noProof/>
             <w:webHidden/>
           </w:rPr>
-          <w:instrText xml:space="preserve"> PAGEREF _Toc241784887 \h </w:instrText>
+          <w:instrText xml:space="preserve"> PAGEREF _Toc241785365 \h </w:instrText>
         </w:r>
         <w:r>
           <w:rPr>
@@ -1841,7 +1841,7 @@
           <w:noProof/>
         </w:rPr>
       </w:pPr>
-      <w:hyperlink w:anchor="_Toc241784888" w:history="1">
+      <w:hyperlink w:anchor="_Toc241785366" w:history="1">
         <w:r>
           <w:rPr>
             <w:rStyle w:val="Hyperlink"/>
@@ -1868,7 +1868,7 @@
             <w:noProof/>
             <w:webHidden/>
           </w:rPr>
-          <w:instrText xml:space="preserve"> PAGEREF _Toc241784888 \h </w:instrText>
+          <w:instrText xml:space="preserve"> PAGEREF _Toc241785366 \h </w:instrText>
         </w:r>
         <w:r>
           <w:rPr>
@@ -1909,7 +1909,7 @@
           <w:noProof/>
         </w:rPr>
       </w:pPr>
-      <w:hyperlink w:anchor="_Toc241784889" w:history="1">
+      <w:hyperlink w:anchor="_Toc241785367" w:history="1">
         <w:r>
           <w:rPr>
             <w:rStyle w:val="Hyperlink"/>
@@ -1936,7 +1936,7 @@
             <w:noProof/>
             <w:webHidden/>
           </w:rPr>
-          <w:instrText xml:space="preserve"> PAGEREF _Toc241784889 \h </w:instrText>
+          <w:instrText xml:space="preserve"> PAGEREF _Toc241785367 \h </w:instrText>
         </w:r>
         <w:r>
           <w:rPr>
@@ -1977,7 +1977,7 @@
           <w:noProof/>
         </w:rPr>
       </w:pPr>
-      <w:hyperlink w:anchor="_Toc241784890" w:history="1">
+      <w:hyperlink w:anchor="_Toc241785368" w:history="1">
         <w:r>
           <w:rPr>
             <w:rStyle w:val="Hyperlink"/>
@@ -2004,7 +2004,7 @@
             <w:noProof/>
             <w:webHidden/>
           </w:rPr>
-          <w:instrText xml:space="preserve"> PAGEREF _Toc241784890 \h </w:instrText>
+          <w:instrText xml:space="preserve"> PAGEREF _Toc241785368 \h </w:instrText>
         </w:r>
         <w:r>
           <w:rPr>
@@ -2045,7 +2045,7 @@
           <w:noProof/>
         </w:rPr>
       </w:pPr>
-      <w:hyperlink w:anchor="_Toc241784891" w:history="1">
+      <w:hyperlink w:anchor="_Toc241785369" w:history="1">
         <w:r>
           <w:rPr>
             <w:rStyle w:val="Hyperlink"/>
@@ -2072,7 +2072,7 @@
             <w:noProof/>
             <w:webHidden/>
           </w:rPr>
-          <w:instrText xml:space="preserve"> PAGEREF _Toc241784891 \h </w:instrText>
+          <w:instrText xml:space="preserve"> PAGEREF _Toc241785369 \h </w:instrText>
         </w:r>
         <w:r>
           <w:rPr>
@@ -2113,7 +2113,7 @@
           <w:noProof/>
         </w:rPr>
       </w:pPr>
-      <w:hyperlink w:anchor="_Toc241784892" w:history="1">
+      <w:hyperlink w:anchor="_Toc241785370" w:history="1">
         <w:r>
           <w:rPr>
             <w:rStyle w:val="Hyperlink"/>
@@ -2140,7 +2140,7 @@
             <w:noProof/>
             <w:webHidden/>
           </w:rPr>
-          <w:instrText xml:space="preserve"> PAGEREF _Toc241784892 \h </w:instrText>
+          <w:instrText xml:space="preserve"> PAGEREF _Toc241785370 \h </w:instrText>
         </w:r>
         <w:r>
           <w:rPr>
@@ -2160,7 +2160,7 @@
             <w:noProof/>
             <w:webHidden/>
           </w:rPr>
-          <w:t>21</w:t>
+          <w:t>22</w:t>
         </w:r>
         <w:r>
           <w:rPr>
@@ -2181,7 +2181,7 @@
           <w:noProof/>
         </w:rPr>
       </w:pPr>
-      <w:hyperlink w:anchor="_Toc241784893" w:history="1">
+      <w:hyperlink w:anchor="_Toc241785371" w:history="1">
         <w:r>
           <w:rPr>
             <w:rStyle w:val="Hyperlink"/>
@@ -2208,7 +2208,7 @@
             <w:noProof/>
             <w:webHidden/>
           </w:rPr>
-          <w:instrText xml:space="preserve"> PAGEREF _Toc241784893 \h </w:instrText>
+          <w:instrText xml:space="preserve"> PAGEREF _Toc241785371 \h </w:instrText>
         </w:r>
         <w:r>
           <w:rPr>
@@ -2228,7 +2228,7 @@
             <w:noProof/>
             <w:webHidden/>
           </w:rPr>
-          <w:t>21</w:t>
+          <w:t>22</w:t>
         </w:r>
         <w:r>
           <w:rPr>
@@ -2249,7 +2249,7 @@
           <w:noProof/>
         </w:rPr>
       </w:pPr>
-      <w:hyperlink w:anchor="_Toc241784894" w:history="1">
+      <w:hyperlink w:anchor="_Toc241785372" w:history="1">
         <w:r>
           <w:rPr>
             <w:rStyle w:val="Hyperlink"/>
@@ -2276,7 +2276,7 @@
             <w:noProof/>
             <w:webHidden/>
           </w:rPr>
-          <w:instrText xml:space="preserve"> PAGEREF _Toc241784894 \h </w:instrText>
+          <w:instrText xml:space="preserve"> PAGEREF _Toc241785372 \h </w:instrText>
         </w:r>
         <w:r>
           <w:rPr>
@@ -2296,7 +2296,7 @@
             <w:noProof/>
             <w:webHidden/>
           </w:rPr>
-          <w:t>23</w:t>
+          <w:t>24</w:t>
         </w:r>
         <w:r>
           <w:rPr>
@@ -2317,7 +2317,7 @@
           <w:noProof/>
         </w:rPr>
       </w:pPr>
-      <w:hyperlink w:anchor="_Toc241784895" w:history="1">
+      <w:hyperlink w:anchor="_Toc241785373" w:history="1">
         <w:r>
           <w:rPr>
             <w:rStyle w:val="Hyperlink"/>
@@ -2344,7 +2344,7 @@
             <w:noProof/>
             <w:webHidden/>
           </w:rPr>
-          <w:instrText xml:space="preserve"> PAGEREF _Toc241784895 \h </w:instrText>
+          <w:instrText xml:space="preserve"> PAGEREF _Toc241785373 \h </w:instrText>
         </w:r>
         <w:r>
           <w:rPr>
@@ -2364,7 +2364,7 @@
             <w:noProof/>
             <w:webHidden/>
           </w:rPr>
-          <w:t>25</w:t>
+          <w:t>26</w:t>
         </w:r>
         <w:r>
           <w:rPr>
@@ -2385,7 +2385,7 @@
           <w:noProof/>
         </w:rPr>
       </w:pPr>
-      <w:hyperlink w:anchor="_Toc241784896" w:history="1">
+      <w:hyperlink w:anchor="_Toc241785374" w:history="1">
         <w:r>
           <w:rPr>
             <w:rStyle w:val="Hyperlink"/>
@@ -2412,7 +2412,7 @@
             <w:noProof/>
             <w:webHidden/>
           </w:rPr>
-          <w:instrText xml:space="preserve"> PAGEREF _Toc241784896 \h </w:instrText>
+          <w:instrText xml:space="preserve"> PAGEREF _Toc241785374 \h </w:instrText>
         </w:r>
         <w:r>
           <w:rPr>
@@ -2432,7 +2432,7 @@
             <w:noProof/>
             <w:webHidden/>
           </w:rPr>
-          <w:t>25</w:t>
+          <w:t>26</w:t>
         </w:r>
         <w:r>
           <w:rPr>
@@ -2453,7 +2453,7 @@
           <w:noProof/>
         </w:rPr>
       </w:pPr>
-      <w:hyperlink w:anchor="_Toc241784897" w:history="1">
+      <w:hyperlink w:anchor="_Toc241785375" w:history="1">
         <w:r>
           <w:rPr>
             <w:rStyle w:val="Hyperlink"/>
@@ -2480,7 +2480,7 @@
             <w:noProof/>
             <w:webHidden/>
           </w:rPr>
-          <w:instrText xml:space="preserve"> PAGEREF _Toc241784897 \h </w:instrText>
+          <w:instrText xml:space="preserve"> PAGEREF _Toc241785375 \h </w:instrText>
         </w:r>
         <w:r>
           <w:rPr>
@@ -2500,7 +2500,7 @@
             <w:noProof/>
             <w:webHidden/>
           </w:rPr>
-          <w:t>25</w:t>
+          <w:t>26</w:t>
         </w:r>
         <w:r>
           <w:rPr>
@@ -2521,7 +2521,7 @@
           <w:noProof/>
         </w:rPr>
       </w:pPr>
-      <w:hyperlink w:anchor="_Toc241784898" w:history="1">
+      <w:hyperlink w:anchor="_Toc241785376" w:history="1">
         <w:r>
           <w:rPr>
             <w:rStyle w:val="Hyperlink"/>
@@ -2548,7 +2548,7 @@
             <w:noProof/>
             <w:webHidden/>
           </w:rPr>
-          <w:instrText xml:space="preserve"> PAGEREF _Toc241784898 \h </w:instrText>
+          <w:instrText xml:space="preserve"> PAGEREF _Toc241785376 \h </w:instrText>
         </w:r>
         <w:r>
           <w:rPr>
@@ -2568,7 +2568,7 @@
             <w:noProof/>
             <w:webHidden/>
           </w:rPr>
-          <w:t>26</w:t>
+          <w:t>27</w:t>
         </w:r>
         <w:r>
           <w:rPr>
@@ -2589,7 +2589,7 @@
           <w:noProof/>
         </w:rPr>
       </w:pPr>
-      <w:hyperlink w:anchor="_Toc241784899" w:history="1">
+      <w:hyperlink w:anchor="_Toc241785377" w:history="1">
         <w:r>
           <w:rPr>
             <w:rStyle w:val="Hyperlink"/>
@@ -2616,7 +2616,7 @@
             <w:noProof/>
             <w:webHidden/>
           </w:rPr>
-          <w:instrText xml:space="preserve"> PAGEREF _Toc241784899 \h </w:instrText>
+          <w:instrText xml:space="preserve"> PAGEREF _Toc241785377 \h </w:instrText>
         </w:r>
         <w:r>
           <w:rPr>
@@ -2636,7 +2636,7 @@
             <w:noProof/>
             <w:webHidden/>
           </w:rPr>
-          <w:t>27</w:t>
+          <w:t>28</w:t>
         </w:r>
         <w:r>
           <w:rPr>
@@ -2657,7 +2657,7 @@
           <w:noProof/>
         </w:rPr>
       </w:pPr>
-      <w:hyperlink w:anchor="_Toc241784900" w:history="1">
+      <w:hyperlink w:anchor="_Toc241785378" w:history="1">
         <w:r>
           <w:rPr>
             <w:rStyle w:val="Hyperlink"/>
@@ -2684,7 +2684,7 @@
             <w:noProof/>
             <w:webHidden/>
           </w:rPr>
-          <w:instrText xml:space="preserve"> PAGEREF _Toc241784900 \h </w:instrText>
+          <w:instrText xml:space="preserve"> PAGEREF _Toc241785378 \h </w:instrText>
         </w:r>
         <w:r>
           <w:rPr>
@@ -2704,7 +2704,7 @@
             <w:noProof/>
             <w:webHidden/>
           </w:rPr>
-          <w:t>27</w:t>
+          <w:t>28</w:t>
         </w:r>
         <w:r>
           <w:rPr>
@@ -2725,7 +2725,7 @@
           <w:noProof/>
         </w:rPr>
       </w:pPr>
-      <w:hyperlink w:anchor="_Toc241784901" w:history="1">
+      <w:hyperlink w:anchor="_Toc241785379" w:history="1">
         <w:r>
           <w:rPr>
             <w:rStyle w:val="Hyperlink"/>
@@ -2752,7 +2752,7 @@
             <w:noProof/>
             <w:webHidden/>
           </w:rPr>
-          <w:instrText xml:space="preserve"> PAGEREF _Toc241784901 \h </w:instrText>
+          <w:instrText xml:space="preserve"> PAGEREF _Toc241785379 \h </w:instrText>
         </w:r>
         <w:r>
           <w:rPr>
@@ -2772,7 +2772,7 @@
             <w:noProof/>
             <w:webHidden/>
           </w:rPr>
-          <w:t>27</w:t>
+          <w:t>28</w:t>
         </w:r>
         <w:r>
           <w:rPr>
@@ -2793,7 +2793,7 @@
           <w:noProof/>
         </w:rPr>
       </w:pPr>
-      <w:hyperlink w:anchor="_Toc241784902" w:history="1">
+      <w:hyperlink w:anchor="_Toc241785380" w:history="1">
         <w:r>
           <w:rPr>
             <w:rStyle w:val="Hyperlink"/>
@@ -2820,7 +2820,7 @@
             <w:noProof/>
             <w:webHidden/>
           </w:rPr>
-          <w:instrText xml:space="preserve"> PAGEREF _Toc241784902 \h </w:instrText>
+          <w:instrText xml:space="preserve"> PAGEREF _Toc241785380 \h </w:instrText>
         </w:r>
         <w:r>
           <w:rPr>
@@ -2840,7 +2840,7 @@
             <w:noProof/>
             <w:webHidden/>
           </w:rPr>
-          <w:t>29</w:t>
+          <w:t>30</w:t>
         </w:r>
         <w:r>
           <w:rPr>
@@ -2861,7 +2861,7 @@
           <w:noProof/>
         </w:rPr>
       </w:pPr>
-      <w:hyperlink w:anchor="_Toc241784903" w:history="1">
+      <w:hyperlink w:anchor="_Toc241785381" w:history="1">
         <w:r>
           <w:rPr>
             <w:rStyle w:val="Hyperlink"/>
@@ -2888,7 +2888,7 @@
             <w:noProof/>
             <w:webHidden/>
           </w:rPr>
-          <w:instrText xml:space="preserve"> PAGEREF _Toc241784903 \h </w:instrText>
+          <w:instrText xml:space="preserve"> PAGEREF _Toc241785381 \h </w:instrText>
         </w:r>
         <w:r>
           <w:rPr>
@@ -2908,7 +2908,7 @@
             <w:noProof/>
             <w:webHidden/>
           </w:rPr>
-          <w:t>29</w:t>
+          <w:t>30</w:t>
         </w:r>
         <w:r>
           <w:rPr>
@@ -2929,7 +2929,7 @@
           <w:noProof/>
         </w:rPr>
       </w:pPr>
-      <w:hyperlink w:anchor="_Toc241784904" w:history="1">
+      <w:hyperlink w:anchor="_Toc241785382" w:history="1">
         <w:r>
           <w:rPr>
             <w:rStyle w:val="Hyperlink"/>
@@ -2956,7 +2956,7 @@
             <w:noProof/>
             <w:webHidden/>
           </w:rPr>
-          <w:instrText xml:space="preserve"> PAGEREF _Toc241784904 \h </w:instrText>
+          <w:instrText xml:space="preserve"> PAGEREF _Toc241785382 \h </w:instrText>
         </w:r>
         <w:r>
           <w:rPr>
@@ -2976,7 +2976,7 @@
             <w:noProof/>
             <w:webHidden/>
           </w:rPr>
-          <w:t>30</w:t>
+          <w:t>31</w:t>
         </w:r>
         <w:r>
           <w:rPr>
@@ -2997,7 +2997,7 @@
           <w:noProof/>
         </w:rPr>
       </w:pPr>
-      <w:hyperlink w:anchor="_Toc241784905" w:history="1">
+      <w:hyperlink w:anchor="_Toc241785383" w:history="1">
         <w:r>
           <w:rPr>
             <w:rStyle w:val="Hyperlink"/>
@@ -3024,7 +3024,7 @@
             <w:noProof/>
             <w:webHidden/>
           </w:rPr>
-          <w:instrText xml:space="preserve"> PAGEREF _Toc241784905 \h </w:instrText>
+          <w:instrText xml:space="preserve"> PAGEREF _Toc241785383 \h </w:instrText>
         </w:r>
         <w:r>
           <w:rPr>
@@ -3044,7 +3044,7 @@
             <w:noProof/>
             <w:webHidden/>
           </w:rPr>
-          <w:t>30</w:t>
+          <w:t>31</w:t>
         </w:r>
         <w:r>
           <w:rPr>
@@ -3065,7 +3065,7 @@
           <w:noProof/>
         </w:rPr>
       </w:pPr>
-      <w:hyperlink w:anchor="_Toc241784906" w:history="1">
+      <w:hyperlink w:anchor="_Toc241785384" w:history="1">
         <w:r>
           <w:rPr>
             <w:rStyle w:val="Hyperlink"/>
@@ -3092,7 +3092,7 @@
             <w:noProof/>
             <w:webHidden/>
           </w:rPr>
-          <w:instrText xml:space="preserve"> PAGEREF _Toc241784906 \h </w:instrText>
+          <w:instrText xml:space="preserve"> PAGEREF _Toc241785384 \h </w:instrText>
         </w:r>
         <w:r>
           <w:rPr>
@@ -3112,7 +3112,7 @@
             <w:noProof/>
             <w:webHidden/>
           </w:rPr>
-          <w:t>33</w:t>
+          <w:t>34</w:t>
         </w:r>
         <w:r>
           <w:rPr>
@@ -3133,7 +3133,7 @@
           <w:noProof/>
         </w:rPr>
       </w:pPr>
-      <w:hyperlink w:anchor="_Toc241784907" w:history="1">
+      <w:hyperlink w:anchor="_Toc241785385" w:history="1">
         <w:r>
           <w:rPr>
             <w:rStyle w:val="Hyperlink"/>
@@ -3160,7 +3160,7 @@
             <w:noProof/>
             <w:webHidden/>
           </w:rPr>
-          <w:instrText xml:space="preserve"> PAGEREF _Toc241784907 \h </w:instrText>
+          <w:instrText xml:space="preserve"> PAGEREF _Toc241785385 \h </w:instrText>
         </w:r>
         <w:r>
           <w:rPr>
@@ -3180,7 +3180,7 @@
             <w:noProof/>
             <w:webHidden/>
           </w:rPr>
-          <w:t>34</w:t>
+          <w:t>35</w:t>
         </w:r>
         <w:r>
           <w:rPr>
@@ -3201,7 +3201,7 @@
           <w:noProof/>
         </w:rPr>
       </w:pPr>
-      <w:hyperlink w:anchor="_Toc241784908" w:history="1">
+      <w:hyperlink w:anchor="_Toc241785386" w:history="1">
         <w:r>
           <w:rPr>
             <w:rStyle w:val="Hyperlink"/>
@@ -3228,7 +3228,7 @@
             <w:noProof/>
             <w:webHidden/>
           </w:rPr>
-          <w:instrText xml:space="preserve"> PAGEREF _Toc241784908 \h </w:instrText>
+          <w:instrText xml:space="preserve"> PAGEREF _Toc241785386 \h </w:instrText>
         </w:r>
         <w:r>
           <w:rPr>
@@ -3248,7 +3248,7 @@
             <w:noProof/>
             <w:webHidden/>
           </w:rPr>
-          <w:t>35</w:t>
+          <w:t>36</w:t>
         </w:r>
         <w:r>
           <w:rPr>
@@ -3269,7 +3269,7 @@
           <w:noProof/>
         </w:rPr>
       </w:pPr>
-      <w:hyperlink w:anchor="_Toc241784909" w:history="1">
+      <w:hyperlink w:anchor="_Toc241785387" w:history="1">
         <w:r>
           <w:rPr>
             <w:rStyle w:val="Hyperlink"/>
@@ -3296,7 +3296,7 @@
             <w:noProof/>
             <w:webHidden/>
           </w:rPr>
-          <w:instrText xml:space="preserve"> PAGEREF _Toc241784909 \h </w:instrText>
+          <w:instrText xml:space="preserve"> PAGEREF _Toc241785387 \h </w:instrText>
         </w:r>
         <w:r>
           <w:rPr>
@@ -3316,7 +3316,7 @@
             <w:noProof/>
             <w:webHidden/>
           </w:rPr>
-          <w:t>37</w:t>
+          <w:t>38</w:t>
         </w:r>
         <w:r>
           <w:rPr>
@@ -3337,7 +3337,7 @@
           <w:noProof/>
         </w:rPr>
       </w:pPr>
-      <w:hyperlink w:anchor="_Toc241784910" w:history="1">
+      <w:hyperlink w:anchor="_Toc241785388" w:history="1">
         <w:r>
           <w:rPr>
             <w:rStyle w:val="Hyperlink"/>
@@ -3364,7 +3364,7 @@
             <w:noProof/>
             <w:webHidden/>
           </w:rPr>
-          <w:instrText xml:space="preserve"> PAGEREF _Toc241784910 \h </w:instrText>
+          <w:instrText xml:space="preserve"> PAGEREF _Toc241785388 \h </w:instrText>
         </w:r>
         <w:r>
           <w:rPr>
@@ -3384,7 +3384,7 @@
             <w:noProof/>
             <w:webHidden/>
           </w:rPr>
-          <w:t>39</w:t>
+          <w:t>40</w:t>
         </w:r>
         <w:r>
           <w:rPr>
@@ -3405,7 +3405,7 @@
           <w:noProof/>
         </w:rPr>
       </w:pPr>
-      <w:hyperlink w:anchor="_Toc241784911" w:history="1">
+      <w:hyperlink w:anchor="_Toc241785389" w:history="1">
         <w:r>
           <w:rPr>
             <w:rStyle w:val="Hyperlink"/>
@@ -3432,7 +3432,7 @@
             <w:noProof/>
             <w:webHidden/>
           </w:rPr>
-          <w:instrText xml:space="preserve"> PAGEREF _Toc241784911 \h </w:instrText>
+          <w:instrText xml:space="preserve"> PAGEREF _Toc241785389 \h </w:instrText>
         </w:r>
         <w:r>
           <w:rPr>
@@ -3452,7 +3452,7 @@
             <w:noProof/>
             <w:webHidden/>
           </w:rPr>
-          <w:t>39</w:t>
+          <w:t>40</w:t>
         </w:r>
         <w:r>
           <w:rPr>
@@ -3473,7 +3473,7 @@
           <w:noProof/>
         </w:rPr>
       </w:pPr>
-      <w:hyperlink w:anchor="_Toc241784912" w:history="1">
+      <w:hyperlink w:anchor="_Toc241785390" w:history="1">
         <w:r>
           <w:rPr>
             <w:rStyle w:val="Hyperlink"/>
@@ -3500,7 +3500,7 @@
             <w:noProof/>
             <w:webHidden/>
           </w:rPr>
-          <w:instrText xml:space="preserve"> PAGEREF _Toc241784912 \h </w:instrText>
+          <w:instrText xml:space="preserve"> PAGEREF _Toc241785390 \h </w:instrText>
         </w:r>
         <w:r>
           <w:rPr>
@@ -3520,7 +3520,7 @@
             <w:noProof/>
             <w:webHidden/>
           </w:rPr>
-          <w:t>39</w:t>
+          <w:t>40</w:t>
         </w:r>
         <w:r>
           <w:rPr>
@@ -3541,7 +3541,7 @@
           <w:noProof/>
         </w:rPr>
       </w:pPr>
-      <w:hyperlink w:anchor="_Toc241784913" w:history="1">
+      <w:hyperlink w:anchor="_Toc241785391" w:history="1">
         <w:r>
           <w:rPr>
             <w:rStyle w:val="Hyperlink"/>
@@ -3568,7 +3568,7 @@
             <w:noProof/>
             <w:webHidden/>
           </w:rPr>
-          <w:instrText xml:space="preserve"> PAGEREF _Toc241784913 \h </w:instrText>
+          <w:instrText xml:space="preserve"> PAGEREF _Toc241785391 \h </w:instrText>
         </w:r>
         <w:r>
           <w:rPr>
@@ -3588,7 +3588,7 @@
             <w:noProof/>
             <w:webHidden/>
           </w:rPr>
-          <w:t>41</w:t>
+          <w:t>42</w:t>
         </w:r>
         <w:r>
           <w:rPr>
@@ -3609,7 +3609,7 @@
           <w:noProof/>
         </w:rPr>
       </w:pPr>
-      <w:hyperlink w:anchor="_Toc241784914" w:history="1">
+      <w:hyperlink w:anchor="_Toc241785392" w:history="1">
         <w:r>
           <w:rPr>
             <w:rStyle w:val="Hyperlink"/>
@@ -3636,7 +3636,7 @@
             <w:noProof/>
             <w:webHidden/>
           </w:rPr>
-          <w:instrText xml:space="preserve"> PAGEREF _Toc241784914 \h </w:instrText>
+          <w:instrText xml:space="preserve"> PAGEREF _Toc241785392 \h </w:instrText>
         </w:r>
         <w:r>
           <w:rPr>
@@ -3656,7 +3656,7 @@
             <w:noProof/>
             <w:webHidden/>
           </w:rPr>
-          <w:t>42</w:t>
+          <w:t>43</w:t>
         </w:r>
         <w:r>
           <w:rPr>
@@ -3677,7 +3677,7 @@
           <w:noProof/>
         </w:rPr>
       </w:pPr>
-      <w:hyperlink w:anchor="_Toc241784915" w:history="1">
+      <w:hyperlink w:anchor="_Toc241785393" w:history="1">
         <w:r>
           <w:rPr>
             <w:rStyle w:val="Hyperlink"/>
@@ -3704,7 +3704,7 @@
             <w:noProof/>
             <w:webHidden/>
           </w:rPr>
-          <w:instrText xml:space="preserve"> PAGEREF _Toc241784915 \h </w:instrText>
+          <w:instrText xml:space="preserve"> PAGEREF _Toc241785393 \h </w:instrText>
         </w:r>
         <w:r>
           <w:rPr>
@@ -3724,7 +3724,7 @@
             <w:noProof/>
             <w:webHidden/>
           </w:rPr>
-          <w:t>43</w:t>
+          <w:t>44</w:t>
         </w:r>
         <w:r>
           <w:rPr>
@@ -3745,7 +3745,7 @@
           <w:noProof/>
         </w:rPr>
       </w:pPr>
-      <w:hyperlink w:anchor="_Toc241784916" w:history="1">
+      <w:hyperlink w:anchor="_Toc241785394" w:history="1">
         <w:r>
           <w:rPr>
             <w:rStyle w:val="Hyperlink"/>
@@ -3772,7 +3772,7 @@
             <w:noProof/>
             <w:webHidden/>
           </w:rPr>
-          <w:instrText xml:space="preserve"> PAGEREF _Toc241784916 \h </w:instrText>
+          <w:instrText xml:space="preserve"> PAGEREF _Toc241785394 \h </w:instrText>
         </w:r>
         <w:r>
           <w:rPr>
@@ -3792,7 +3792,7 @@
             <w:noProof/>
             <w:webHidden/>
           </w:rPr>
-          <w:t>44</w:t>
+          <w:t>45</w:t>
         </w:r>
         <w:r>
           <w:rPr>
@@ -3813,7 +3813,7 @@
           <w:noProof/>
         </w:rPr>
       </w:pPr>
-      <w:hyperlink w:anchor="_Toc241784917" w:history="1">
+      <w:hyperlink w:anchor="_Toc241785395" w:history="1">
         <w:r>
           <w:rPr>
             <w:rStyle w:val="Hyperlink"/>
@@ -3840,7 +3840,7 @@
             <w:noProof/>
             <w:webHidden/>
           </w:rPr>
-          <w:instrText xml:space="preserve"> PAGEREF _Toc241784917 \h </w:instrText>
+          <w:instrText xml:space="preserve"> PAGEREF _Toc241785395 \h </w:instrText>
         </w:r>
         <w:r>
           <w:rPr>
@@ -3860,7 +3860,7 @@
             <w:noProof/>
             <w:webHidden/>
           </w:rPr>
-          <w:t>46</w:t>
+          <w:t>47</w:t>
         </w:r>
         <w:r>
           <w:rPr>
@@ -3881,7 +3881,7 @@
           <w:noProof/>
         </w:rPr>
       </w:pPr>
-      <w:hyperlink w:anchor="_Toc241784918" w:history="1">
+      <w:hyperlink w:anchor="_Toc241785396" w:history="1">
         <w:r>
           <w:rPr>
             <w:rStyle w:val="Hyperlink"/>
@@ -3908,7 +3908,7 @@
             <w:noProof/>
             <w:webHidden/>
           </w:rPr>
-          <w:instrText xml:space="preserve"> PAGEREF _Toc241784918 \h </w:instrText>
+          <w:instrText xml:space="preserve"> PAGEREF _Toc241785396 \h </w:instrText>
         </w:r>
         <w:r>
           <w:rPr>
@@ -3928,7 +3928,7 @@
             <w:noProof/>
             <w:webHidden/>
           </w:rPr>
-          <w:t>48</w:t>
+          <w:t>49</w:t>
         </w:r>
         <w:r>
           <w:rPr>
@@ -3949,7 +3949,7 @@
           <w:noProof/>
         </w:rPr>
       </w:pPr>
-      <w:hyperlink w:anchor="_Toc241784919" w:history="1">
+      <w:hyperlink w:anchor="_Toc241785397" w:history="1">
         <w:r>
           <w:rPr>
             <w:rStyle w:val="Hyperlink"/>
@@ -3976,7 +3976,7 @@
             <w:noProof/>
             <w:webHidden/>
           </w:rPr>
-          <w:instrText xml:space="preserve"> PAGEREF _Toc241784919 \h </w:instrText>
+          <w:instrText xml:space="preserve"> PAGEREF _Toc241785397 \h </w:instrText>
         </w:r>
         <w:r>
           <w:rPr>
@@ -3996,7 +3996,7 @@
             <w:noProof/>
             <w:webHidden/>
           </w:rPr>
-          <w:t>48</w:t>
+          <w:t>49</w:t>
         </w:r>
         <w:r>
           <w:rPr>
@@ -4017,7 +4017,7 @@
           <w:noProof/>
         </w:rPr>
       </w:pPr>
-      <w:hyperlink w:anchor="_Toc241784920" w:history="1">
+      <w:hyperlink w:anchor="_Toc241785398" w:history="1">
         <w:r>
           <w:rPr>
             <w:rStyle w:val="Hyperlink"/>
@@ -4044,7 +4044,7 @@
             <w:noProof/>
             <w:webHidden/>
           </w:rPr>
-          <w:instrText xml:space="preserve"> PAGEREF _Toc241784920 \h </w:instrText>
+          <w:instrText xml:space="preserve"> PAGEREF _Toc241785398 \h </w:instrText>
         </w:r>
         <w:r>
           <w:rPr>
@@ -4064,7 +4064,7 @@
             <w:noProof/>
             <w:webHidden/>
           </w:rPr>
-          <w:t>48</w:t>
+          <w:t>49</w:t>
         </w:r>
         <w:r>
           <w:rPr>
@@ -4085,7 +4085,7 @@
           <w:noProof/>
         </w:rPr>
       </w:pPr>
-      <w:hyperlink w:anchor="_Toc241784921" w:history="1">
+      <w:hyperlink w:anchor="_Toc241785399" w:history="1">
         <w:r>
           <w:rPr>
             <w:rStyle w:val="Hyperlink"/>
@@ -4112,7 +4112,7 @@
             <w:noProof/>
             <w:webHidden/>
           </w:rPr>
-          <w:instrText xml:space="preserve"> PAGEREF _Toc241784921 \h </w:instrText>
+          <w:instrText xml:space="preserve"> PAGEREF _Toc241785399 \h </w:instrText>
         </w:r>
         <w:r>
           <w:rPr>
@@ -4132,7 +4132,7 @@
             <w:noProof/>
             <w:webHidden/>
           </w:rPr>
-          <w:t>48</w:t>
+          <w:t>49</w:t>
         </w:r>
         <w:r>
           <w:rPr>
@@ -4153,7 +4153,7 @@
           <w:noProof/>
         </w:rPr>
       </w:pPr>
-      <w:hyperlink w:anchor="_Toc241784922" w:history="1">
+      <w:hyperlink w:anchor="_Toc241785400" w:history="1">
         <w:r>
           <w:rPr>
             <w:rStyle w:val="Hyperlink"/>
@@ -4180,7 +4180,7 @@
             <w:noProof/>
             <w:webHidden/>
           </w:rPr>
-          <w:instrText xml:space="preserve"> PAGEREF _Toc241784922 \h </w:instrText>
+          <w:instrText xml:space="preserve"> PAGEREF _Toc241785400 \h </w:instrText>
         </w:r>
         <w:r>
           <w:rPr>
@@ -4200,7 +4200,7 @@
             <w:noProof/>
             <w:webHidden/>
           </w:rPr>
-          <w:t>48</w:t>
+          <w:t>49</w:t>
         </w:r>
         <w:r>
           <w:rPr>
@@ -4221,7 +4221,7 @@
         <w:pStyle w:val="Heading1"/>
         <w:pageBreakBefore/>
       </w:pPr>
-      <w:bookmarkStart w:id="0" w:name="_Toc241784866"/>
+      <w:bookmarkStart w:id="0" w:name="_Toc241785344"/>
       <w:r>
         <w:lastRenderedPageBreak/>
         <w:t>Welcome</w:t>
@@ -4237,7 +4237,7 @@
       <w:pPr>
         <w:pStyle w:val="Heading2"/>
       </w:pPr>
-      <w:bookmarkStart w:id="1" w:name="_Toc241784867"/>
+      <w:bookmarkStart w:id="1" w:name="_Toc241785345"/>
       <w:r>
         <w:t>How a sale moves through the app</w:t>
       </w:r>
@@ -4720,7 +4720,7 @@
       <w:pPr>
         <w:pStyle w:val="Heading2"/>
       </w:pPr>
-      <w:bookmarkStart w:id="2" w:name="_Toc241784868"/>
+      <w:bookmarkStart w:id="2" w:name="_Toc241785346"/>
       <w:r>
         <w:t>What you'll need</w:t>
       </w:r>
@@ -4829,7 +4829,7 @@
         <w:pStyle w:val="Heading1"/>
         <w:pageBreakBefore/>
       </w:pPr>
-      <w:bookmarkStart w:id="3" w:name="_Toc241784869"/>
+      <w:bookmarkStart w:id="3" w:name="_Toc241785347"/>
       <w:r>
         <w:lastRenderedPageBreak/>
         <w:t>Who can do what</w:t>
@@ -5397,7 +5397,7 @@
         <w:pStyle w:val="Heading1"/>
         <w:pageBreakBefore/>
       </w:pPr>
-      <w:bookmarkStart w:id="4" w:name="_Toc241784870"/>
+      <w:bookmarkStart w:id="4" w:name="_Toc241785348"/>
       <w:r>
         <w:lastRenderedPageBreak/>
         <w:t>Getting started</w:t>
@@ -5408,7 +5408,7 @@
       <w:pPr>
         <w:pStyle w:val="Heading2"/>
       </w:pPr>
-      <w:bookmarkStart w:id="5" w:name="_Toc241784871"/>
+      <w:bookmarkStart w:id="5" w:name="_Toc241785349"/>
       <w:r>
         <w:t>Signing in</w:t>
       </w:r>
@@ -5425,7 +5425,7 @@
           <w:noProof/>
         </w:rPr>
         <w:drawing>
-          <wp:inline distT="0" distB="0" distL="0" distR="0" wp14:anchorId="5DB2FBF9" wp14:editId="367963A3">
+          <wp:inline distT="0" distB="0" distL="0" distR="0" wp14:anchorId="05A5E981" wp14:editId="48FBBE46">
             <wp:extent cx="3291840" cy="2211705"/>
             <wp:effectExtent l="0" t="0" r="0" b="0"/>
             <wp:docPr id="1" name="Picture 1"/>
@@ -5743,7 +5743,7 @@
       <w:pPr>
         <w:pStyle w:val="Heading2"/>
       </w:pPr>
-      <w:bookmarkStart w:id="6" w:name="_Toc241784872"/>
+      <w:bookmarkStart w:id="6" w:name="_Toc241785350"/>
       <w:r>
         <w:t>Changing your PIN</w:t>
       </w:r>
@@ -5925,7 +5925,7 @@
       <w:pPr>
         <w:pStyle w:val="Heading2"/>
       </w:pPr>
-      <w:bookmarkStart w:id="7" w:name="_Toc241784873"/>
+      <w:bookmarkStart w:id="7" w:name="_Toc241785351"/>
       <w:r>
         <w:lastRenderedPageBreak/>
         <w:t>Finding your way around</w:t>
@@ -6508,7 +6508,7 @@
       <w:pPr>
         <w:pStyle w:val="Heading2"/>
       </w:pPr>
-      <w:bookmarkStart w:id="8" w:name="_Toc241784874"/>
+      <w:bookmarkStart w:id="8" w:name="_Toc241785352"/>
       <w:r>
         <w:t>Light and dark mode</w:t>
       </w:r>
@@ -6523,7 +6523,7 @@
       <w:pPr>
         <w:pStyle w:val="Heading2"/>
       </w:pPr>
-      <w:bookmarkStart w:id="9" w:name="_Toc241784875"/>
+      <w:bookmarkStart w:id="9" w:name="_Toc241785353"/>
       <w:r>
         <w:t>Signing out</w:t>
       </w:r>
@@ -6548,7 +6548,7 @@
         <w:pStyle w:val="Heading1"/>
         <w:pageBreakBefore/>
       </w:pPr>
-      <w:bookmarkStart w:id="10" w:name="_Toc241784876"/>
+      <w:bookmarkStart w:id="10" w:name="_Toc241785354"/>
       <w:r>
         <w:lastRenderedPageBreak/>
         <w:t>Taking an order on the sales floor</w:t>
@@ -6580,7 +6580,7 @@
           <w:noProof/>
         </w:rPr>
         <w:drawing>
-          <wp:inline distT="0" distB="0" distL="0" distR="0" wp14:anchorId="69F0386F" wp14:editId="3FB1DA75">
+          <wp:inline distT="0" distB="0" distL="0" distR="0" wp14:anchorId="7CBF570C" wp14:editId="537B5C79">
             <wp:extent cx="5760720" cy="3870484"/>
             <wp:effectExtent l="0" t="0" r="0" b="0"/>
             <wp:docPr id="2" name="Picture 2"/>
@@ -6705,7 +6705,7 @@
       <w:pPr>
         <w:pStyle w:val="Heading2"/>
       </w:pPr>
-      <w:bookmarkStart w:id="11" w:name="_Toc241784877"/>
+      <w:bookmarkStart w:id="11" w:name="_Toc241785355"/>
       <w:r>
         <w:t>Starting an order</w:t>
       </w:r>
@@ -6789,7 +6789,7 @@
       <w:pPr>
         <w:pStyle w:val="Heading2"/>
       </w:pPr>
-      <w:bookmarkStart w:id="12" w:name="_Toc241784878"/>
+      <w:bookmarkStart w:id="12" w:name="_Toc241785356"/>
       <w:r>
         <w:lastRenderedPageBreak/>
         <w:t>Adding items</w:t>
@@ -6938,7 +6938,7 @@
           <w:noProof/>
         </w:rPr>
         <w:drawing>
-          <wp:inline distT="0" distB="0" distL="0" distR="0" wp14:anchorId="25169611" wp14:editId="6E87E2AA">
+          <wp:inline distT="0" distB="0" distL="0" distR="0" wp14:anchorId="3E976433" wp14:editId="50EBD4FD">
             <wp:extent cx="5760720" cy="3870484"/>
             <wp:effectExtent l="0" t="0" r="0" b="0"/>
             <wp:docPr id="3" name="Picture 3"/>
@@ -7075,7 +7075,7 @@
           <w:noProof/>
         </w:rPr>
         <w:drawing>
-          <wp:inline distT="0" distB="0" distL="0" distR="0" wp14:anchorId="6E0F8173" wp14:editId="63E615FB">
+          <wp:inline distT="0" distB="0" distL="0" distR="0" wp14:anchorId="0256CD4C" wp14:editId="570E98DA">
             <wp:extent cx="5760720" cy="3870484"/>
             <wp:effectExtent l="0" t="0" r="0" b="0"/>
             <wp:docPr id="4" name="Picture 4"/>
@@ -7420,7 +7420,7 @@
         </w:rPr>
         <w:lastRenderedPageBreak/>
         <w:drawing>
-          <wp:inline distT="0" distB="0" distL="0" distR="0" wp14:anchorId="0CE62C1B" wp14:editId="7536CD30">
+          <wp:inline distT="0" distB="0" distL="0" distR="0" wp14:anchorId="660ABE89" wp14:editId="453C685C">
             <wp:extent cx="5486400" cy="3686175"/>
             <wp:effectExtent l="0" t="0" r="0" b="0"/>
             <wp:docPr id="5" name="Picture 5"/>
@@ -7620,7 +7620,7 @@
       <w:pPr>
         <w:pStyle w:val="Heading2"/>
       </w:pPr>
-      <w:bookmarkStart w:id="13" w:name="_Toc241784879"/>
+      <w:bookmarkStart w:id="13" w:name="_Toc241785357"/>
       <w:r>
         <w:t>Adding shipping or a service later</w:t>
       </w:r>
@@ -7661,7 +7661,7 @@
         </w:rPr>
         <w:lastRenderedPageBreak/>
         <w:drawing>
-          <wp:inline distT="0" distB="0" distL="0" distR="0" wp14:anchorId="526AB248" wp14:editId="62465A22">
+          <wp:inline distT="0" distB="0" distL="0" distR="0" wp14:anchorId="397C5C0D" wp14:editId="72E43543">
             <wp:extent cx="4754880" cy="3194685"/>
             <wp:effectExtent l="0" t="0" r="0" b="0"/>
             <wp:docPr id="6" name="Picture 6"/>
@@ -7715,7 +7715,7 @@
       <w:pPr>
         <w:pStyle w:val="Heading2"/>
       </w:pPr>
-      <w:bookmarkStart w:id="14" w:name="_Toc241784880"/>
+      <w:bookmarkStart w:id="14" w:name="_Toc241785358"/>
       <w:r>
         <w:t>Changing or removing an item</w:t>
       </w:r>
@@ -7862,7 +7862,7 @@
       <w:pPr>
         <w:pStyle w:val="Heading2"/>
       </w:pPr>
-      <w:bookmarkStart w:id="15" w:name="_Toc241784881"/>
+      <w:bookmarkStart w:id="15" w:name="_Toc241785359"/>
       <w:r>
         <w:t>Customer details</w:t>
       </w:r>
@@ -8026,7 +8026,7 @@
           <w:noProof/>
         </w:rPr>
         <w:drawing>
-          <wp:inline distT="0" distB="0" distL="0" distR="0" wp14:anchorId="3FFCAC5C" wp14:editId="5B6D0F60">
+          <wp:inline distT="0" distB="0" distL="0" distR="0" wp14:anchorId="37DC43AD" wp14:editId="181D12E6">
             <wp:extent cx="4754880" cy="3194685"/>
             <wp:effectExtent l="0" t="0" r="0" b="0"/>
             <wp:docPr id="7" name="Picture 7"/>
@@ -8080,7 +8080,7 @@
       <w:pPr>
         <w:pStyle w:val="Heading2"/>
       </w:pPr>
-      <w:bookmarkStart w:id="16" w:name="_Toc241784882"/>
+      <w:bookmarkStart w:id="16" w:name="_Toc241785360"/>
       <w:r>
         <w:t>Sending the order to checkout</w:t>
       </w:r>
@@ -8258,7 +8258,7 @@
       <w:pPr>
         <w:pStyle w:val="Heading2"/>
       </w:pPr>
-      <w:bookmarkStart w:id="17" w:name="_Toc241784883"/>
+      <w:bookmarkStart w:id="17" w:name="_Toc241785361"/>
       <w:r>
         <w:lastRenderedPageBreak/>
         <w:t>Using a phone</w:t>
@@ -8276,7 +8276,7 @@
           <w:noProof/>
         </w:rPr>
         <w:drawing>
-          <wp:inline distT="0" distB="0" distL="0" distR="0" wp14:anchorId="01F3BA6F" wp14:editId="7E43DEA8">
+          <wp:inline distT="0" distB="0" distL="0" distR="0" wp14:anchorId="2E6ACD3C" wp14:editId="52503BCE">
             <wp:extent cx="2194560" cy="4749253"/>
             <wp:effectExtent l="0" t="0" r="0" b="0"/>
             <wp:docPr id="8" name="Picture 8"/>
@@ -8354,7 +8354,7 @@
         <w:pStyle w:val="Heading1"/>
         <w:pageBreakBefore/>
       </w:pPr>
-      <w:bookmarkStart w:id="18" w:name="_Toc241784884"/>
+      <w:bookmarkStart w:id="18" w:name="_Toc241785362"/>
       <w:r>
         <w:lastRenderedPageBreak/>
         <w:t>Checking out a customer</w:t>
@@ -8395,7 +8395,7 @@
           <w:noProof/>
         </w:rPr>
         <w:drawing>
-          <wp:inline distT="0" distB="0" distL="0" distR="0" wp14:anchorId="0CC1C4EE" wp14:editId="00AC8641">
+          <wp:inline distT="0" distB="0" distL="0" distR="0" wp14:anchorId="6B1332D6" wp14:editId="5A923640">
             <wp:extent cx="5760720" cy="3870484"/>
             <wp:effectExtent l="0" t="0" r="0" b="0"/>
             <wp:docPr id="9" name="Picture 9"/>
@@ -8449,7 +8449,7 @@
       <w:pPr>
         <w:pStyle w:val="Heading2"/>
       </w:pPr>
-      <w:bookmarkStart w:id="19" w:name="_Toc241784885"/>
+      <w:bookmarkStart w:id="19" w:name="_Toc241785363"/>
       <w:r>
         <w:t>1. Review the order with the customer</w:t>
       </w:r>
@@ -8546,7 +8546,7 @@
       <w:pPr>
         <w:pStyle w:val="Heading2"/>
       </w:pPr>
-      <w:bookmarkStart w:id="20" w:name="_Toc241784886"/>
+      <w:bookmarkStart w:id="20" w:name="_Toc241785364"/>
       <w:r>
         <w:t>2. Take payment</w:t>
       </w:r>
@@ -8860,7 +8860,7 @@
       <w:pPr>
         <w:pStyle w:val="Heading2"/>
       </w:pPr>
-      <w:bookmarkStart w:id="21" w:name="_Toc241784887"/>
+      <w:bookmarkStart w:id="21" w:name="_Toc241785365"/>
       <w:r>
         <w:t>3. Acknowledgements (initials and signature)</w:t>
       </w:r>
@@ -9042,7 +9042,7 @@
         </w:rPr>
         <w:lastRenderedPageBreak/>
         <w:drawing>
-          <wp:inline distT="0" distB="0" distL="0" distR="0" wp14:anchorId="75A70A08" wp14:editId="2438CB5F">
+          <wp:inline distT="0" distB="0" distL="0" distR="0" wp14:anchorId="36380E7E" wp14:editId="1F90B810">
             <wp:extent cx="4937760" cy="3317558"/>
             <wp:effectExtent l="0" t="0" r="0" b="0"/>
             <wp:docPr id="10" name="Picture 10"/>
@@ -9231,7 +9231,7 @@
       <w:pPr>
         <w:pStyle w:val="Heading2"/>
       </w:pPr>
-      <w:bookmarkStart w:id="22" w:name="_Toc241784888"/>
+      <w:bookmarkStart w:id="22" w:name="_Toc241785366"/>
       <w:r>
         <w:t>4. Complete the sale</w:t>
       </w:r>
@@ -9462,7 +9462,7 @@
       <w:pPr>
         <w:pStyle w:val="Heading2"/>
       </w:pPr>
-      <w:bookmarkStart w:id="23" w:name="_Toc241784889"/>
+      <w:bookmarkStart w:id="23" w:name="_Toc241785367"/>
       <w:r>
         <w:t>Other checkout actions</w:t>
       </w:r>
@@ -9672,7 +9672,7 @@
         <w:pStyle w:val="Heading1"/>
         <w:pageBreakBefore/>
       </w:pPr>
-      <w:bookmarkStart w:id="24" w:name="_Toc241784890"/>
+      <w:bookmarkStart w:id="24" w:name="_Toc241785368"/>
       <w:r>
         <w:lastRenderedPageBreak/>
         <w:t>The sales sheet</w:t>
@@ -9695,7 +9695,7 @@
           <w:noProof/>
         </w:rPr>
         <w:drawing>
-          <wp:inline distT="0" distB="0" distL="0" distR="0" wp14:anchorId="31DEC145" wp14:editId="49A95207">
+          <wp:inline distT="0" distB="0" distL="0" distR="0" wp14:anchorId="0DF211CF" wp14:editId="1AA1FD6E">
             <wp:extent cx="4023360" cy="3187256"/>
             <wp:effectExtent l="0" t="0" r="0" b="0"/>
             <wp:docPr id="11" name="Picture 11"/>
@@ -9863,7 +9863,7 @@
       <w:pPr>
         <w:pStyle w:val="Heading2"/>
       </w:pPr>
-      <w:bookmarkStart w:id="25" w:name="_Toc241784891"/>
+      <w:bookmarkStart w:id="25" w:name="_Toc241785369"/>
       <w:r>
         <w:t>Emailing a receipt</w:t>
       </w:r>
@@ -9991,7 +9991,7 @@
         </w:rPr>
         <w:lastRenderedPageBreak/>
         <w:drawing>
-          <wp:inline distT="0" distB="0" distL="0" distR="0" wp14:anchorId="7FBCA7D6" wp14:editId="037FC005">
+          <wp:inline distT="0" distB="0" distL="0" distR="0" wp14:anchorId="53842686" wp14:editId="0FC6BA0D">
             <wp:extent cx="4572000" cy="3071812"/>
             <wp:effectExtent l="0" t="0" r="0" b="0"/>
             <wp:docPr id="12" name="Picture 12"/>
@@ -10043,7 +10043,340 @@
     </w:p>
     <w:p>
       <w:r>
-        <w:t>The app turns the sales sheet into a PDF, exactly as it would print, and emails it to the customer with a friendly note. The note thanks them for supporting the organization, explains what happens next (what went home today, what's being shipped and where, how a boxed mattress expands, and keeping a protector on for the warranty), mentions any balance still owed, and gives the customer service number. An administrator can change that wording - see *Admin: settings*.</w:t>
+        <w:t>The app turns the sales sheet into a PDF, exactly as it would print, and emails it to the customer with a friendly note. The note thanks them for supporting the organization, explains what happens next, mentions any balance still owed, and gives the customer service number. An administrator can change that wording - see *Admin: settings*.</w:t>
+      </w:r>
+    </w:p>
+    <w:p>
+      <w:r>
+        <w:t>What happens next depends on how each item is leaving:</w:t>
+      </w:r>
+    </w:p>
+    <w:tbl>
+      <w:tblPr>
+        <w:tblW w:w="0" w:type="auto"/>
+        <w:jc w:val="center"/>
+        <w:tblLook w:val="04A0" w:firstRow="1" w:lastRow="0" w:firstColumn="1" w:lastColumn="0" w:noHBand="0" w:noVBand="1"/>
+      </w:tblPr>
+      <w:tblGrid>
+        <w:gridCol w:w="3168"/>
+        <w:gridCol w:w="6192"/>
+      </w:tblGrid>
+      <w:tr>
+        <w:trPr>
+          <w:jc w:val="center"/>
+        </w:trPr>
+        <w:tc>
+          <w:tcPr>
+            <w:tcW w:w="3168" w:type="dxa"/>
+            <w:tcBorders>
+              <w:top w:val="single" w:sz="4" w:space="0" w:color="0369A1"/>
+              <w:left w:val="single" w:sz="4" w:space="0" w:color="0369A1"/>
+              <w:bottom w:val="single" w:sz="4" w:space="0" w:color="0369A1"/>
+              <w:right w:val="single" w:sz="4" w:space="0" w:color="0369A1"/>
+            </w:tcBorders>
+            <w:shd w:val="clear" w:color="auto" w:fill="0369A1"/>
+            <w:tcMar>
+              <w:top w:w="100" w:type="dxa"/>
+              <w:left w:w="140" w:type="dxa"/>
+              <w:bottom w:w="100" w:type="dxa"/>
+              <w:right w:w="140" w:type="dxa"/>
+            </w:tcMar>
+          </w:tcPr>
+          <w:p>
+            <w:pPr>
+              <w:spacing w:after="0"/>
+            </w:pPr>
+            <w:r>
+              <w:rPr>
+                <w:b/>
+                <w:color w:val="FFFFFF"/>
+              </w:rPr>
+              <w:t>How it's leaving</w:t>
+            </w:r>
+          </w:p>
+        </w:tc>
+        <w:tc>
+          <w:tcPr>
+            <w:tcW w:w="6192" w:type="dxa"/>
+            <w:tcBorders>
+              <w:top w:val="single" w:sz="4" w:space="0" w:color="0369A1"/>
+              <w:left w:val="single" w:sz="4" w:space="0" w:color="0369A1"/>
+              <w:bottom w:val="single" w:sz="4" w:space="0" w:color="0369A1"/>
+              <w:right w:val="single" w:sz="4" w:space="0" w:color="0369A1"/>
+            </w:tcBorders>
+            <w:shd w:val="clear" w:color="auto" w:fill="0369A1"/>
+            <w:tcMar>
+              <w:top w:w="100" w:type="dxa"/>
+              <w:left w:w="140" w:type="dxa"/>
+              <w:bottom w:w="100" w:type="dxa"/>
+              <w:right w:w="140" w:type="dxa"/>
+            </w:tcMar>
+          </w:tcPr>
+          <w:p>
+            <w:pPr>
+              <w:spacing w:after="0"/>
+            </w:pPr>
+            <w:r>
+              <w:rPr>
+                <w:b/>
+                <w:color w:val="FFFFFF"/>
+              </w:rPr>
+              <w:t>What the email tells the customer</w:t>
+            </w:r>
+          </w:p>
+        </w:tc>
+      </w:tr>
+      <w:tr>
+        <w:trPr>
+          <w:jc w:val="center"/>
+        </w:trPr>
+        <w:tc>
+          <w:tcPr>
+            <w:tcW w:w="3168" w:type="dxa"/>
+            <w:tcBorders>
+              <w:top w:val="single" w:sz="4" w:space="0" w:color="D1D5DB"/>
+              <w:left w:val="single" w:sz="4" w:space="0" w:color="D1D5DB"/>
+              <w:bottom w:val="single" w:sz="4" w:space="0" w:color="D1D5DB"/>
+              <w:right w:val="single" w:sz="4" w:space="0" w:color="D1D5DB"/>
+            </w:tcBorders>
+            <w:tcMar>
+              <w:top w:w="100" w:type="dxa"/>
+              <w:left w:w="140" w:type="dxa"/>
+              <w:bottom w:w="100" w:type="dxa"/>
+              <w:right w:w="140" w:type="dxa"/>
+            </w:tcMar>
+          </w:tcPr>
+          <w:p>
+            <w:pPr>
+              <w:spacing w:after="0"/>
+            </w:pPr>
+            <w:r>
+              <w:rPr>
+                <w:b/>
+              </w:rPr>
+              <w:t>Take With</w:t>
+            </w:r>
+          </w:p>
+        </w:tc>
+        <w:tc>
+          <w:tcPr>
+            <w:tcW w:w="6192" w:type="dxa"/>
+            <w:tcBorders>
+              <w:top w:val="single" w:sz="4" w:space="0" w:color="D1D5DB"/>
+              <w:left w:val="single" w:sz="4" w:space="0" w:color="D1D5DB"/>
+              <w:bottom w:val="single" w:sz="4" w:space="0" w:color="D1D5DB"/>
+              <w:right w:val="single" w:sz="4" w:space="0" w:color="D1D5DB"/>
+            </w:tcBorders>
+            <w:tcMar>
+              <w:top w:w="100" w:type="dxa"/>
+              <w:left w:w="140" w:type="dxa"/>
+              <w:bottom w:w="100" w:type="dxa"/>
+              <w:right w:w="140" w:type="dxa"/>
+            </w:tcMar>
+          </w:tcPr>
+          <w:p>
+            <w:pPr>
+              <w:spacing w:after="0"/>
+            </w:pPr>
+            <w:r>
+              <w:t>It went home with them today.</w:t>
+            </w:r>
+          </w:p>
+        </w:tc>
+      </w:tr>
+      <w:tr>
+        <w:trPr>
+          <w:jc w:val="center"/>
+        </w:trPr>
+        <w:tc>
+          <w:tcPr>
+            <w:tcW w:w="3168" w:type="dxa"/>
+            <w:tcBorders>
+              <w:top w:val="single" w:sz="4" w:space="0" w:color="D1D5DB"/>
+              <w:left w:val="single" w:sz="4" w:space="0" w:color="D1D5DB"/>
+              <w:bottom w:val="single" w:sz="4" w:space="0" w:color="D1D5DB"/>
+              <w:right w:val="single" w:sz="4" w:space="0" w:color="D1D5DB"/>
+            </w:tcBorders>
+            <w:shd w:val="clear" w:color="auto" w:fill="F3F4F6"/>
+            <w:tcMar>
+              <w:top w:w="100" w:type="dxa"/>
+              <w:left w:w="140" w:type="dxa"/>
+              <w:bottom w:w="100" w:type="dxa"/>
+              <w:right w:w="140" w:type="dxa"/>
+            </w:tcMar>
+          </w:tcPr>
+          <w:p>
+            <w:pPr>
+              <w:spacing w:after="0"/>
+            </w:pPr>
+            <w:r>
+              <w:rPr>
+                <w:b/>
+              </w:rPr>
+              <w:t>Drop Ship</w:t>
+            </w:r>
+            <w:r>
+              <w:t xml:space="preserve"> (or no service chosen)</w:t>
+            </w:r>
+          </w:p>
+        </w:tc>
+        <w:tc>
+          <w:tcPr>
+            <w:tcW w:w="6192" w:type="dxa"/>
+            <w:tcBorders>
+              <w:top w:val="single" w:sz="4" w:space="0" w:color="D1D5DB"/>
+              <w:left w:val="single" w:sz="4" w:space="0" w:color="D1D5DB"/>
+              <w:bottom w:val="single" w:sz="4" w:space="0" w:color="D1D5DB"/>
+              <w:right w:val="single" w:sz="4" w:space="0" w:color="D1D5DB"/>
+            </w:tcBorders>
+            <w:shd w:val="clear" w:color="auto" w:fill="F3F4F6"/>
+            <w:tcMar>
+              <w:top w:w="100" w:type="dxa"/>
+              <w:left w:w="140" w:type="dxa"/>
+              <w:bottom w:w="100" w:type="dxa"/>
+              <w:right w:w="140" w:type="dxa"/>
+            </w:tcMar>
+          </w:tcPr>
+          <w:p>
+            <w:pPr>
+              <w:spacing w:after="0"/>
+            </w:pPr>
+            <w:r>
+              <w:t>It's shipped straight to their door, and they'll get an email with tracking information once it ships. There's no confirmation call. A drop-shipped mattress also gets a note that it arrives compressed and boxed and takes 24-48 hours to expand.</w:t>
+            </w:r>
+          </w:p>
+        </w:tc>
+      </w:tr>
+      <w:tr>
+        <w:trPr>
+          <w:jc w:val="center"/>
+        </w:trPr>
+        <w:tc>
+          <w:tcPr>
+            <w:tcW w:w="3168" w:type="dxa"/>
+            <w:tcBorders>
+              <w:top w:val="single" w:sz="4" w:space="0" w:color="D1D5DB"/>
+              <w:left w:val="single" w:sz="4" w:space="0" w:color="D1D5DB"/>
+              <w:bottom w:val="single" w:sz="4" w:space="0" w:color="D1D5DB"/>
+              <w:right w:val="single" w:sz="4" w:space="0" w:color="D1D5DB"/>
+            </w:tcBorders>
+            <w:tcMar>
+              <w:top w:w="100" w:type="dxa"/>
+              <w:left w:w="140" w:type="dxa"/>
+              <w:bottom w:w="100" w:type="dxa"/>
+              <w:right w:w="140" w:type="dxa"/>
+            </w:tcMar>
+          </w:tcPr>
+          <w:p>
+            <w:pPr>
+              <w:spacing w:after="0"/>
+            </w:pPr>
+            <w:r>
+              <w:rPr>
+                <w:b/>
+              </w:rPr>
+              <w:t>White Glove</w:t>
+            </w:r>
+          </w:p>
+        </w:tc>
+        <w:tc>
+          <w:tcPr>
+            <w:tcW w:w="6192" w:type="dxa"/>
+            <w:tcBorders>
+              <w:top w:val="single" w:sz="4" w:space="0" w:color="D1D5DB"/>
+              <w:left w:val="single" w:sz="4" w:space="0" w:color="D1D5DB"/>
+              <w:bottom w:val="single" w:sz="4" w:space="0" w:color="D1D5DB"/>
+              <w:right w:val="single" w:sz="4" w:space="0" w:color="D1D5DB"/>
+            </w:tcBorders>
+            <w:tcMar>
+              <w:top w:w="100" w:type="dxa"/>
+              <w:left w:w="140" w:type="dxa"/>
+              <w:bottom w:w="100" w:type="dxa"/>
+              <w:right w:w="140" w:type="dxa"/>
+            </w:tcMar>
+          </w:tcPr>
+          <w:p>
+            <w:pPr>
+              <w:spacing w:after="0"/>
+            </w:pPr>
+            <w:r>
+              <w:t>We'll contact them to schedule delivery once it arrives at our Cleveland location, typically about 3-4 weeks after the event. There's no confirmation call right after the event.</w:t>
+            </w:r>
+          </w:p>
+        </w:tc>
+      </w:tr>
+      <w:tr>
+        <w:trPr>
+          <w:jc w:val="center"/>
+        </w:trPr>
+        <w:tc>
+          <w:tcPr>
+            <w:tcW w:w="3168" w:type="dxa"/>
+            <w:tcBorders>
+              <w:top w:val="single" w:sz="4" w:space="0" w:color="D1D5DB"/>
+              <w:left w:val="single" w:sz="4" w:space="0" w:color="D1D5DB"/>
+              <w:bottom w:val="single" w:sz="4" w:space="0" w:color="D1D5DB"/>
+              <w:right w:val="single" w:sz="4" w:space="0" w:color="D1D5DB"/>
+            </w:tcBorders>
+            <w:shd w:val="clear" w:color="auto" w:fill="F3F4F6"/>
+            <w:tcMar>
+              <w:top w:w="100" w:type="dxa"/>
+              <w:left w:w="140" w:type="dxa"/>
+              <w:bottom w:w="100" w:type="dxa"/>
+              <w:right w:w="140" w:type="dxa"/>
+            </w:tcMar>
+          </w:tcPr>
+          <w:p>
+            <w:pPr>
+              <w:spacing w:after="0"/>
+            </w:pPr>
+            <w:r>
+              <w:rPr>
+                <w:b/>
+              </w:rPr>
+              <w:t>Anything else</w:t>
+            </w:r>
+            <w:r>
+              <w:t xml:space="preserve"> (such as Local Delivery)</w:t>
+            </w:r>
+          </w:p>
+        </w:tc>
+        <w:tc>
+          <w:tcPr>
+            <w:tcW w:w="6192" w:type="dxa"/>
+            <w:tcBorders>
+              <w:top w:val="single" w:sz="4" w:space="0" w:color="D1D5DB"/>
+              <w:left w:val="single" w:sz="4" w:space="0" w:color="D1D5DB"/>
+              <w:bottom w:val="single" w:sz="4" w:space="0" w:color="D1D5DB"/>
+              <w:right w:val="single" w:sz="4" w:space="0" w:color="D1D5DB"/>
+            </w:tcBorders>
+            <w:shd w:val="clear" w:color="auto" w:fill="F3F4F6"/>
+            <w:tcMar>
+              <w:top w:w="100" w:type="dxa"/>
+              <w:left w:w="140" w:type="dxa"/>
+              <w:bottom w:w="100" w:type="dxa"/>
+              <w:right w:w="140" w:type="dxa"/>
+            </w:tcMar>
+          </w:tcPr>
+          <w:p>
+            <w:pPr>
+              <w:spacing w:after="0"/>
+            </w:pPr>
+            <w:r>
+              <w:t>We'll be in touch about it.</w:t>
+            </w:r>
+          </w:p>
+        </w:tc>
+      </w:tr>
+    </w:tbl>
+    <w:p>
+      <w:pPr>
+        <w:spacing w:after="40"/>
+      </w:pPr>
+    </w:p>
+    <w:p>
+      <w:r>
+        <w:t>When an order mixes these - say a white glove mattress and drop-shipped sheets - each part gets its own line. Anyone buying a mattress is also reminded to keep a protector on for the warranty.</w:t>
       </w:r>
     </w:p>
     <w:p>
@@ -10090,6 +10423,7 @@
                 <w:b/>
                 <w:color w:val="6B7280"/>
               </w:rPr>
+              <w:lastRenderedPageBreak/>
               <w:t xml:space="preserve">Good to know:  </w:t>
             </w:r>
             <w:r>
@@ -10118,7 +10452,7 @@
         <w:pStyle w:val="Heading1"/>
         <w:pageBreakBefore/>
       </w:pPr>
-      <w:bookmarkStart w:id="26" w:name="_Toc241784892"/>
+      <w:bookmarkStart w:id="26" w:name="_Toc241785370"/>
       <w:r>
         <w:lastRenderedPageBreak/>
         <w:t>Looking up orders</w:t>
@@ -10150,7 +10484,7 @@
           <w:noProof/>
         </w:rPr>
         <w:drawing>
-          <wp:inline distT="0" distB="0" distL="0" distR="0" wp14:anchorId="56F63C48" wp14:editId="3F738666">
+          <wp:inline distT="0" distB="0" distL="0" distR="0" wp14:anchorId="55DC3041" wp14:editId="7B341BE8">
             <wp:extent cx="5760720" cy="3870484"/>
             <wp:effectExtent l="0" t="0" r="0" b="0"/>
             <wp:docPr id="13" name="Picture 13"/>
@@ -10270,7 +10604,7 @@
       <w:pPr>
         <w:pStyle w:val="Heading2"/>
       </w:pPr>
-      <w:bookmarkStart w:id="27" w:name="_Toc241784893"/>
+      <w:bookmarkStart w:id="27" w:name="_Toc241785371"/>
       <w:r>
         <w:t>Extra options for admins</w:t>
       </w:r>
@@ -10360,7 +10694,7 @@
         </w:rPr>
         <w:lastRenderedPageBreak/>
         <w:drawing>
-          <wp:inline distT="0" distB="0" distL="0" distR="0" wp14:anchorId="4DF7D4A4" wp14:editId="37A56C66">
+          <wp:inline distT="0" distB="0" distL="0" distR="0" wp14:anchorId="191F7B82" wp14:editId="67D1F72D">
             <wp:extent cx="4754880" cy="3194685"/>
             <wp:effectExtent l="0" t="0" r="0" b="0"/>
             <wp:docPr id="14" name="Picture 14"/>
@@ -10482,7 +10816,7 @@
         <w:pStyle w:val="Heading1"/>
         <w:pageBreakBefore/>
       </w:pPr>
-      <w:bookmarkStart w:id="28" w:name="_Toc241784894"/>
+      <w:bookmarkStart w:id="28" w:name="_Toc241785372"/>
       <w:r>
         <w:lastRenderedPageBreak/>
         <w:t>The dashboard</w:t>
@@ -10546,7 +10880,7 @@
           <w:noProof/>
         </w:rPr>
         <w:drawing>
-          <wp:inline distT="0" distB="0" distL="0" distR="0" wp14:anchorId="603C5035" wp14:editId="04DDE237">
+          <wp:inline distT="0" distB="0" distL="0" distR="0" wp14:anchorId="7D046817" wp14:editId="2D1A2607">
             <wp:extent cx="4937760" cy="4305110"/>
             <wp:effectExtent l="0" t="0" r="0" b="0"/>
             <wp:docPr id="15" name="Picture 15"/>
@@ -11201,7 +11535,7 @@
         <w:pStyle w:val="Heading1"/>
         <w:pageBreakBefore/>
       </w:pPr>
-      <w:bookmarkStart w:id="29" w:name="_Toc241784895"/>
+      <w:bookmarkStart w:id="29" w:name="_Toc241785373"/>
       <w:r>
         <w:lastRenderedPageBreak/>
         <w:t>Keeping inventory</w:t>
@@ -11260,7 +11594,7 @@
           <w:noProof/>
         </w:rPr>
         <w:drawing>
-          <wp:inline distT="0" distB="0" distL="0" distR="0" wp14:anchorId="4F3C0D1B" wp14:editId="4DCF9654">
+          <wp:inline distT="0" distB="0" distL="0" distR="0" wp14:anchorId="5F31B521" wp14:editId="10FEA3FC">
             <wp:extent cx="5760720" cy="3870484"/>
             <wp:effectExtent l="0" t="0" r="0" b="0"/>
             <wp:docPr id="16" name="Picture 16"/>
@@ -11314,7 +11648,7 @@
       <w:pPr>
         <w:pStyle w:val="Heading2"/>
       </w:pPr>
-      <w:bookmarkStart w:id="30" w:name="_Toc241784896"/>
+      <w:bookmarkStart w:id="30" w:name="_Toc241785374"/>
       <w:r>
         <w:t>What's on the screen</w:t>
       </w:r>
@@ -11405,7 +11739,7 @@
       <w:pPr>
         <w:pStyle w:val="Heading2"/>
       </w:pPr>
-      <w:bookmarkStart w:id="31" w:name="_Toc241784897"/>
+      <w:bookmarkStart w:id="31" w:name="_Toc241785375"/>
       <w:r>
         <w:t>Updating a count</w:t>
       </w:r>
@@ -11482,7 +11816,7 @@
           <w:noProof/>
         </w:rPr>
         <w:drawing>
-          <wp:inline distT="0" distB="0" distL="0" distR="0" wp14:anchorId="2FC70655" wp14:editId="014AC15A">
+          <wp:inline distT="0" distB="0" distL="0" distR="0" wp14:anchorId="13E5AABB" wp14:editId="6CD3738A">
             <wp:extent cx="5120640" cy="3440430"/>
             <wp:effectExtent l="0" t="0" r="0" b="0"/>
             <wp:docPr id="17" name="Picture 17"/>
@@ -11536,7 +11870,7 @@
       <w:pPr>
         <w:pStyle w:val="Heading2"/>
       </w:pPr>
-      <w:bookmarkStart w:id="32" w:name="_Toc241784898"/>
+      <w:bookmarkStart w:id="32" w:name="_Toc241785376"/>
       <w:r>
         <w:t>What changes the count automatically</w:t>
       </w:r>
@@ -11940,7 +12274,7 @@
       <w:pPr>
         <w:pStyle w:val="Heading2"/>
       </w:pPr>
-      <w:bookmarkStart w:id="33" w:name="_Toc241784899"/>
+      <w:bookmarkStart w:id="33" w:name="_Toc241785377"/>
       <w:r>
         <w:lastRenderedPageBreak/>
         <w:t>Seeing the history</w:t>
@@ -11956,7 +12290,7 @@
       <w:pPr>
         <w:pStyle w:val="Heading2"/>
       </w:pPr>
-      <w:bookmarkStart w:id="34" w:name="_Toc241784900"/>
+      <w:bookmarkStart w:id="34" w:name="_Toc241785378"/>
       <w:r>
         <w:t>Notes for the inventory sheet</w:t>
       </w:r>
@@ -12005,7 +12339,7 @@
           <w:noProof/>
         </w:rPr>
         <w:drawing>
-          <wp:inline distT="0" distB="0" distL="0" distR="0" wp14:anchorId="2BE83E56" wp14:editId="07AC3C45">
+          <wp:inline distT="0" distB="0" distL="0" distR="0" wp14:anchorId="07046A66" wp14:editId="4F7288DF">
             <wp:extent cx="5120640" cy="3440430"/>
             <wp:effectExtent l="0" t="0" r="0" b="0"/>
             <wp:docPr id="18" name="Picture 18"/>
@@ -12059,7 +12393,7 @@
       <w:pPr>
         <w:pStyle w:val="Heading2"/>
       </w:pPr>
-      <w:bookmarkStart w:id="35" w:name="_Toc241784901"/>
+      <w:bookmarkStart w:id="35" w:name="_Toc241785379"/>
       <w:r>
         <w:t>Start and end counts</w:t>
       </w:r>
@@ -12582,7 +12916,7 @@
           <w:noProof/>
         </w:rPr>
         <w:drawing>
-          <wp:inline distT="0" distB="0" distL="0" distR="0" wp14:anchorId="7590C591" wp14:editId="4DF85176">
+          <wp:inline distT="0" distB="0" distL="0" distR="0" wp14:anchorId="77F9A73A" wp14:editId="3F916291">
             <wp:extent cx="5486400" cy="3686175"/>
             <wp:effectExtent l="0" t="0" r="0" b="0"/>
             <wp:docPr id="19" name="Picture 19"/>
@@ -12722,7 +13056,7 @@
         <w:pStyle w:val="Heading1"/>
         <w:pageBreakBefore/>
       </w:pPr>
-      <w:bookmarkStart w:id="36" w:name="_Toc241784902"/>
+      <w:bookmarkStart w:id="36" w:name="_Toc241785380"/>
       <w:r>
         <w:lastRenderedPageBreak/>
         <w:t>Admin: setting up an event</w:t>
@@ -12747,7 +13081,7 @@
       <w:pPr>
         <w:pStyle w:val="Heading2"/>
       </w:pPr>
-      <w:bookmarkStart w:id="37" w:name="_Toc241784903"/>
+      <w:bookmarkStart w:id="37" w:name="_Toc241785381"/>
       <w:r>
         <w:t>Creating or editing an event</w:t>
       </w:r>
@@ -12764,7 +13098,7 @@
           <w:noProof/>
         </w:rPr>
         <w:drawing>
-          <wp:inline distT="0" distB="0" distL="0" distR="0" wp14:anchorId="4A59EED0" wp14:editId="772B7E52">
+          <wp:inline distT="0" distB="0" distL="0" distR="0" wp14:anchorId="477F3050" wp14:editId="756D4C85">
             <wp:extent cx="5760720" cy="1134142"/>
             <wp:effectExtent l="0" t="0" r="0" b="0"/>
             <wp:docPr id="20" name="Picture 20"/>
@@ -13113,7 +13447,7 @@
           <w:noProof/>
         </w:rPr>
         <w:drawing>
-          <wp:inline distT="0" distB="0" distL="0" distR="0" wp14:anchorId="5A9A0B0B" wp14:editId="62A69D8E">
+          <wp:inline distT="0" distB="0" distL="0" distR="0" wp14:anchorId="7D1D73E3" wp14:editId="6DF3C91E">
             <wp:extent cx="3840480" cy="2580322"/>
             <wp:effectExtent l="0" t="0" r="0" b="0"/>
             <wp:docPr id="21" name="Picture 21"/>
@@ -13235,7 +13569,7 @@
       <w:pPr>
         <w:pStyle w:val="Heading2"/>
       </w:pPr>
-      <w:bookmarkStart w:id="38" w:name="_Toc241784904"/>
+      <w:bookmarkStart w:id="38" w:name="_Toc241785382"/>
       <w:r>
         <w:t>Closing out an event</w:t>
       </w:r>
@@ -13402,7 +13736,7 @@
       <w:pPr>
         <w:pStyle w:val="Heading2"/>
       </w:pPr>
-      <w:bookmarkStart w:id="39" w:name="_Toc241784905"/>
+      <w:bookmarkStart w:id="39" w:name="_Toc241785383"/>
       <w:r>
         <w:t>Event sales sheets</w:t>
       </w:r>
@@ -13460,7 +13794,7 @@
           <w:noProof/>
         </w:rPr>
         <w:drawing>
-          <wp:inline distT="0" distB="0" distL="0" distR="0" wp14:anchorId="2CF73464" wp14:editId="22A1B812">
+          <wp:inline distT="0" distB="0" distL="0" distR="0" wp14:anchorId="3C777544" wp14:editId="4DDA84CC">
             <wp:extent cx="4389120" cy="2948940"/>
             <wp:effectExtent l="0" t="0" r="0" b="0"/>
             <wp:docPr id="22" name="Picture 22"/>
@@ -13589,7 +13923,7 @@
           <w:noProof/>
         </w:rPr>
         <w:drawing>
-          <wp:inline distT="0" distB="0" distL="0" distR="0" wp14:anchorId="311F58EA" wp14:editId="1AA2E2B3">
+          <wp:inline distT="0" distB="0" distL="0" distR="0" wp14:anchorId="532570CE" wp14:editId="5E6581D9">
             <wp:extent cx="4206240" cy="5717858"/>
             <wp:effectExtent l="0" t="0" r="0" b="0"/>
             <wp:docPr id="23" name="Picture 23"/>
@@ -13727,7 +14061,7 @@
           <w:noProof/>
         </w:rPr>
         <w:drawing>
-          <wp:inline distT="0" distB="0" distL="0" distR="0" wp14:anchorId="75DFB0C2" wp14:editId="218D0A79">
+          <wp:inline distT="0" distB="0" distL="0" distR="0" wp14:anchorId="77335B10" wp14:editId="083970F9">
             <wp:extent cx="4389120" cy="2948940"/>
             <wp:effectExtent l="0" t="0" r="0" b="0"/>
             <wp:docPr id="24" name="Picture 24"/>
@@ -13840,7 +14174,7 @@
         <w:pStyle w:val="Heading1"/>
         <w:pageBreakBefore/>
       </w:pPr>
-      <w:bookmarkStart w:id="40" w:name="_Toc241784906"/>
+      <w:bookmarkStart w:id="40" w:name="_Toc241785384"/>
       <w:r>
         <w:lastRenderedPageBreak/>
         <w:t>Admin: managing the catalog</w:t>
@@ -13881,7 +14215,7 @@
           <w:noProof/>
         </w:rPr>
         <w:drawing>
-          <wp:inline distT="0" distB="0" distL="0" distR="0" wp14:anchorId="3AD79182" wp14:editId="7AF601FD">
+          <wp:inline distT="0" distB="0" distL="0" distR="0" wp14:anchorId="1EAFB330" wp14:editId="5579EACA">
             <wp:extent cx="5760720" cy="3870484"/>
             <wp:effectExtent l="0" t="0" r="0" b="0"/>
             <wp:docPr id="25" name="Picture 25"/>
@@ -13935,7 +14269,7 @@
       <w:pPr>
         <w:pStyle w:val="Heading2"/>
       </w:pPr>
-      <w:bookmarkStart w:id="41" w:name="_Toc241784907"/>
+      <w:bookmarkStart w:id="41" w:name="_Toc241785385"/>
       <w:r>
         <w:lastRenderedPageBreak/>
         <w:t>Adding or editing a product</w:t>
@@ -13953,7 +14287,7 @@
           <w:noProof/>
         </w:rPr>
         <w:drawing>
-          <wp:inline distT="0" distB="0" distL="0" distR="0" wp14:anchorId="4AB737FA" wp14:editId="71EB4F67">
+          <wp:inline distT="0" distB="0" distL="0" distR="0" wp14:anchorId="4131239F" wp14:editId="1530553E">
             <wp:extent cx="5486400" cy="3686175"/>
             <wp:effectExtent l="0" t="0" r="0" b="0"/>
             <wp:docPr id="26" name="Picture 26"/>
@@ -14376,7 +14710,7 @@
         </w:rPr>
         <w:lastRenderedPageBreak/>
         <w:drawing>
-          <wp:inline distT="0" distB="0" distL="0" distR="0" wp14:anchorId="6B521D99" wp14:editId="48466819">
+          <wp:inline distT="0" distB="0" distL="0" distR="0" wp14:anchorId="7A42F420" wp14:editId="759C7033">
             <wp:extent cx="5120640" cy="2130933"/>
             <wp:effectExtent l="0" t="0" r="0" b="0"/>
             <wp:docPr id="27" name="Picture 27"/>
@@ -14563,7 +14897,7 @@
       <w:pPr>
         <w:pStyle w:val="Heading2"/>
       </w:pPr>
-      <w:bookmarkStart w:id="42" w:name="_Toc241784908"/>
+      <w:bookmarkStart w:id="42" w:name="_Toc241785386"/>
       <w:r>
         <w:t>Delivery and services</w:t>
       </w:r>
@@ -14595,7 +14929,7 @@
         </w:rPr>
         <w:lastRenderedPageBreak/>
         <w:drawing>
-          <wp:inline distT="0" distB="0" distL="0" distR="0" wp14:anchorId="5014681D" wp14:editId="39EB02FE">
+          <wp:inline distT="0" distB="0" distL="0" distR="0" wp14:anchorId="0D89490B" wp14:editId="66C3EFDA">
             <wp:extent cx="5760720" cy="3870484"/>
             <wp:effectExtent l="0" t="0" r="0" b="0"/>
             <wp:docPr id="28" name="Picture 28"/>
@@ -15025,7 +15359,7 @@
         <w:pStyle w:val="Heading1"/>
         <w:pageBreakBefore/>
       </w:pPr>
-      <w:bookmarkStart w:id="43" w:name="_Toc241784909"/>
+      <w:bookmarkStart w:id="43" w:name="_Toc241785387"/>
       <w:r>
         <w:lastRenderedPageBreak/>
         <w:t>Admin: managing the crew</w:t>
@@ -15057,7 +15391,7 @@
           <w:noProof/>
         </w:rPr>
         <w:drawing>
-          <wp:inline distT="0" distB="0" distL="0" distR="0" wp14:anchorId="07DE97AE" wp14:editId="016D93AE">
+          <wp:inline distT="0" distB="0" distL="0" distR="0" wp14:anchorId="05D57BA1" wp14:editId="69F48582">
             <wp:extent cx="5760720" cy="1935242"/>
             <wp:effectExtent l="0" t="0" r="0" b="0"/>
             <wp:docPr id="29" name="Picture 29"/>
@@ -15329,7 +15663,7 @@
           <w:noProof/>
         </w:rPr>
         <w:drawing>
-          <wp:inline distT="0" distB="0" distL="0" distR="0" wp14:anchorId="63C726CB" wp14:editId="6A281682">
+          <wp:inline distT="0" distB="0" distL="0" distR="0" wp14:anchorId="64B2CB01" wp14:editId="3A22CC17">
             <wp:extent cx="4023360" cy="2703195"/>
             <wp:effectExtent l="0" t="0" r="0" b="0"/>
             <wp:docPr id="30" name="Picture 30"/>
@@ -15409,7 +15743,7 @@
         <w:pStyle w:val="Heading1"/>
         <w:pageBreakBefore/>
       </w:pPr>
-      <w:bookmarkStart w:id="44" w:name="_Toc241784910"/>
+      <w:bookmarkStart w:id="44" w:name="_Toc241785388"/>
       <w:r>
         <w:lastRenderedPageBreak/>
         <w:t>Admin: settings</w:t>
@@ -15479,7 +15813,7 @@
       <w:pPr>
         <w:pStyle w:val="Heading2"/>
       </w:pPr>
-      <w:bookmarkStart w:id="45" w:name="_Toc241784911"/>
+      <w:bookmarkStart w:id="45" w:name="_Toc241785389"/>
       <w:r>
         <w:t>Business details</w:t>
       </w:r>
@@ -15496,7 +15830,7 @@
           <w:noProof/>
         </w:rPr>
         <w:drawing>
-          <wp:inline distT="0" distB="0" distL="0" distR="0" wp14:anchorId="1EF45996" wp14:editId="1F1D9999">
+          <wp:inline distT="0" distB="0" distL="0" distR="0" wp14:anchorId="63FC6951" wp14:editId="656135E5">
             <wp:extent cx="5760720" cy="1429893"/>
             <wp:effectExtent l="0" t="0" r="0" b="0"/>
             <wp:docPr id="31" name="Picture 31"/>
@@ -15860,7 +16194,7 @@
       <w:pPr>
         <w:pStyle w:val="Heading2"/>
       </w:pPr>
-      <w:bookmarkStart w:id="46" w:name="_Toc241784912"/>
+      <w:bookmarkStart w:id="46" w:name="_Toc241785390"/>
       <w:r>
         <w:t>Sales sheet terms</w:t>
       </w:r>
@@ -15883,7 +16217,7 @@
         </w:rPr>
         <w:lastRenderedPageBreak/>
         <w:drawing>
-          <wp:inline distT="0" distB="0" distL="0" distR="0" wp14:anchorId="4D9A4EB5" wp14:editId="33CA6493">
+          <wp:inline distT="0" distB="0" distL="0" distR="0" wp14:anchorId="5D5D7A7D" wp14:editId="6631079E">
             <wp:extent cx="5760720" cy="4937760"/>
             <wp:effectExtent l="0" t="0" r="0" b="0"/>
             <wp:docPr id="32" name="Picture 32"/>
@@ -16256,7 +16590,7 @@
       <w:pPr>
         <w:pStyle w:val="Heading2"/>
       </w:pPr>
-      <w:bookmarkStart w:id="47" w:name="_Toc241784913"/>
+      <w:bookmarkStart w:id="47" w:name="_Toc241785391"/>
       <w:r>
         <w:t>Receipt email</w:t>
       </w:r>
@@ -16278,7 +16612,7 @@
           <w:noProof/>
         </w:rPr>
         <w:drawing>
-          <wp:inline distT="0" distB="0" distL="0" distR="0" wp14:anchorId="768127AD" wp14:editId="53DC149A">
+          <wp:inline distT="0" distB="0" distL="0" distR="0" wp14:anchorId="01FE1C0F" wp14:editId="0C870EE5">
             <wp:extent cx="5760720" cy="4454271"/>
             <wp:effectExtent l="0" t="0" r="0" b="0"/>
             <wp:docPr id="33" name="Picture 33"/>
@@ -17187,7 +17521,7 @@
               <w:spacing w:after="0"/>
             </w:pPr>
             <w:r>
-              <w:t>A "What happens next" list written for that order: what went home today, what's being shipped and where, the boxed mattress, keeping a protector on, and any balance owed. Put it on a line of its own; it disappears when none of it applies.</w:t>
+              <w:t>A "What happens next" list written for that order: what went home today, drop-ship items (with the tracking email), white glove items (scheduled once they reach Cleveland), the boxed mattress, keeping a protector on, and any balance owed - see *Emailing a receipt*. Put it on a line of its own; it disappears when none of it applies.</w:t>
             </w:r>
           </w:p>
         </w:tc>
@@ -17255,7 +17589,7 @@
       <w:pPr>
         <w:pStyle w:val="Heading2"/>
       </w:pPr>
-      <w:bookmarkStart w:id="48" w:name="_Toc241784914"/>
+      <w:bookmarkStart w:id="48" w:name="_Toc241785392"/>
       <w:r>
         <w:t>New events</w:t>
       </w:r>
@@ -17272,7 +17606,7 @@
           <w:noProof/>
         </w:rPr>
         <w:drawing>
-          <wp:inline distT="0" distB="0" distL="0" distR="0" wp14:anchorId="3D0F426B" wp14:editId="0D73E0FC">
+          <wp:inline distT="0" distB="0" distL="0" distR="0" wp14:anchorId="34531773" wp14:editId="72B76058">
             <wp:extent cx="5760720" cy="1512189"/>
             <wp:effectExtent l="0" t="0" r="0" b="0"/>
             <wp:docPr id="34" name="Picture 34"/>
@@ -17350,7 +17684,7 @@
       <w:pPr>
         <w:pStyle w:val="Heading2"/>
       </w:pPr>
-      <w:bookmarkStart w:id="49" w:name="_Toc241784915"/>
+      <w:bookmarkStart w:id="49" w:name="_Toc241785393"/>
       <w:r>
         <w:t>Dashboard</w:t>
       </w:r>
@@ -17367,7 +17701,7 @@
           <w:noProof/>
         </w:rPr>
         <w:drawing>
-          <wp:inline distT="0" distB="0" distL="0" distR="0" wp14:anchorId="318ADC6B" wp14:editId="3736C98A">
+          <wp:inline distT="0" distB="0" distL="0" distR="0" wp14:anchorId="7FF80F28" wp14:editId="6A6A6B70">
             <wp:extent cx="5760720" cy="1594485"/>
             <wp:effectExtent l="0" t="0" r="0" b="0"/>
             <wp:docPr id="35" name="Picture 35"/>
@@ -17697,7 +18031,7 @@
         <w:pStyle w:val="Heading1"/>
         <w:pageBreakBefore/>
       </w:pPr>
-      <w:bookmarkStart w:id="50" w:name="_Toc241784916"/>
+      <w:bookmarkStart w:id="50" w:name="_Toc241785394"/>
       <w:r>
         <w:lastRenderedPageBreak/>
         <w:t>Owner: permanent deletes</w:t>
@@ -17738,7 +18072,7 @@
           <w:noProof/>
         </w:rPr>
         <w:drawing>
-          <wp:inline distT="0" distB="0" distL="0" distR="0" wp14:anchorId="4BDE96B6" wp14:editId="3548AD51">
+          <wp:inline distT="0" distB="0" distL="0" distR="0" wp14:anchorId="0FA895E9" wp14:editId="518BC68A">
             <wp:extent cx="4754880" cy="3312709"/>
             <wp:effectExtent l="0" t="0" r="0" b="0"/>
             <wp:docPr id="36" name="Picture 36"/>
@@ -18402,7 +18736,7 @@
         <w:pStyle w:val="Heading1"/>
         <w:pageBreakBefore/>
       </w:pPr>
-      <w:bookmarkStart w:id="51" w:name="_Toc241784917"/>
+      <w:bookmarkStart w:id="51" w:name="_Toc241785395"/>
       <w:r>
         <w:lastRenderedPageBreak/>
         <w:t>Tips and troubleshooting</w:t>
@@ -18789,7 +19123,7 @@
         <w:pStyle w:val="Heading1"/>
         <w:pageBreakBefore/>
       </w:pPr>
-      <w:bookmarkStart w:id="52" w:name="_Toc241784918"/>
+      <w:bookmarkStart w:id="52" w:name="_Toc241785396"/>
       <w:r>
         <w:lastRenderedPageBreak/>
         <w:t>Quick reference</w:t>
@@ -18800,7 +19134,7 @@
       <w:pPr>
         <w:pStyle w:val="Heading2"/>
       </w:pPr>
-      <w:bookmarkStart w:id="53" w:name="_Toc241784919"/>
+      <w:bookmarkStart w:id="53" w:name="_Toc241785397"/>
       <w:r>
         <w:t>Sales rep checklist</w:t>
       </w:r>
@@ -18944,7 +19278,7 @@
       <w:pPr>
         <w:pStyle w:val="Heading2"/>
       </w:pPr>
-      <w:bookmarkStart w:id="54" w:name="_Toc241784920"/>
+      <w:bookmarkStart w:id="54" w:name="_Toc241785398"/>
       <w:r>
         <w:t>Checkout checklist</w:t>
       </w:r>
@@ -19132,7 +19466,7 @@
       <w:pPr>
         <w:pStyle w:val="Heading2"/>
       </w:pPr>
-      <w:bookmarkStart w:id="55" w:name="_Toc241784921"/>
+      <w:bookmarkStart w:id="55" w:name="_Toc241785399"/>
       <w:r>
         <w:t>Inventory counts</w:t>
       </w:r>
@@ -19336,7 +19670,7 @@
       <w:pPr>
         <w:pStyle w:val="Heading2"/>
       </w:pPr>
-      <w:bookmarkStart w:id="56" w:name="_Toc241784922"/>
+      <w:bookmarkStart w:id="56" w:name="_Toc241785400"/>
       <w:r>
         <w:t>Order status at a glance</w:t>
       </w:r>
@@ -19956,31 +20290,31 @@
       </w:rPr>
     </w:lvl>
   </w:abstractNum>
-  <w:num w:numId="1" w16cid:durableId="1666006693">
+  <w:num w:numId="1" w16cid:durableId="23528546">
     <w:abstractNumId w:val="8"/>
   </w:num>
-  <w:num w:numId="2" w16cid:durableId="1228145663">
+  <w:num w:numId="2" w16cid:durableId="718892888">
     <w:abstractNumId w:val="6"/>
   </w:num>
-  <w:num w:numId="3" w16cid:durableId="134957342">
+  <w:num w:numId="3" w16cid:durableId="322779423">
     <w:abstractNumId w:val="5"/>
   </w:num>
-  <w:num w:numId="4" w16cid:durableId="852260381">
+  <w:num w:numId="4" w16cid:durableId="162401927">
     <w:abstractNumId w:val="4"/>
   </w:num>
-  <w:num w:numId="5" w16cid:durableId="1179346413">
+  <w:num w:numId="5" w16cid:durableId="180248234">
     <w:abstractNumId w:val="7"/>
   </w:num>
-  <w:num w:numId="6" w16cid:durableId="356809605">
+  <w:num w:numId="6" w16cid:durableId="1450465973">
     <w:abstractNumId w:val="3"/>
   </w:num>
-  <w:num w:numId="7" w16cid:durableId="1271670159">
+  <w:num w:numId="7" w16cid:durableId="1186408699">
     <w:abstractNumId w:val="2"/>
   </w:num>
-  <w:num w:numId="8" w16cid:durableId="1369451013">
+  <w:num w:numId="8" w16cid:durableId="1316571860">
     <w:abstractNumId w:val="1"/>
   </w:num>
-  <w:num w:numId="9" w16cid:durableId="1864662054">
+  <w:num w:numId="9" w16cid:durableId="2146700023">
     <w:abstractNumId w:val="0"/>
   </w:num>
 </w:numbering>
@@ -31372,7 +31706,7 @@
     <w:autoRedefine/>
     <w:uiPriority w:val="39"/>
     <w:unhideWhenUsed/>
-    <w:rsid w:val="00143C49"/>
+    <w:rsid w:val="00815895"/>
     <w:pPr>
       <w:spacing w:after="100"/>
     </w:pPr>
@@ -31384,7 +31718,7 @@
     <w:autoRedefine/>
     <w:uiPriority w:val="39"/>
     <w:unhideWhenUsed/>
-    <w:rsid w:val="00143C49"/>
+    <w:rsid w:val="00815895"/>
     <w:pPr>
       <w:spacing w:after="100"/>
       <w:ind w:left="220"/>
@@ -31395,7 +31729,7 @@
     <w:basedOn w:val="DefaultParagraphFont"/>
     <w:uiPriority w:val="99"/>
     <w:unhideWhenUsed/>
-    <w:rsid w:val="00143C49"/>
+    <w:rsid w:val="00815895"/>
     <w:rPr>
       <w:color w:val="0000FF" w:themeColor="hyperlink"/>
       <w:u w:val="single"/>

</xml_diff>

<commit_message>
Owner-only catalog export and restore
- Export catalog saves the whole catalog as a JSON file: every product
  (archived ones too) with sizes, prices, sales, selections, bundles,
  delivery choices and Track inventory, plus the delivery options list.
  No database ids, so a file can move between installations.
- Restore catalog either updates products matched by brand and name (and
  sizes, selections, choices and delivery options by name, keeping their
  ids and stock counts) and adds new ones, or clears the catalog for good
  (sold items included) and rebuilds it from the file.
- The file is checked in full and the restore runs in one transaction;
  anything that can't be brought in is listed in the result.
- README and user guide updated.

Co-Authored-By: Claude Opus 5.5 <noreply@anthropic.com>
</commit_message>
<xml_diff>
--- a/Documents/CFS Sales App User Guide.docx
+++ b/Documents/CFS Sales App User Guide.docx
@@ -345,7 +345,7 @@
       <w:r>
         <w:fldChar w:fldCharType="separate"/>
       </w:r>
-      <w:hyperlink w:anchor="_Toc242011239" w:history="1">
+      <w:hyperlink w:anchor="_Toc242013109" w:history="1">
         <w:r>
           <w:rPr>
             <w:rStyle w:val="Hyperlink"/>
@@ -372,7 +372,7 @@
             <w:noProof/>
             <w:webHidden/>
           </w:rPr>
-          <w:instrText xml:space="preserve"> PAGEREF _Toc242011239 \h </w:instrText>
+          <w:instrText xml:space="preserve"> PAGEREF _Toc242013109 \h </w:instrText>
         </w:r>
         <w:r>
           <w:rPr>
@@ -413,7 +413,7 @@
           <w:noProof/>
         </w:rPr>
       </w:pPr>
-      <w:hyperlink w:anchor="_Toc242011240" w:history="1">
+      <w:hyperlink w:anchor="_Toc242013110" w:history="1">
         <w:r>
           <w:rPr>
             <w:rStyle w:val="Hyperlink"/>
@@ -440,7 +440,7 @@
             <w:noProof/>
             <w:webHidden/>
           </w:rPr>
-          <w:instrText xml:space="preserve"> PAGEREF _Toc242011240 \h </w:instrText>
+          <w:instrText xml:space="preserve"> PAGEREF _Toc242013110 \h </w:instrText>
         </w:r>
         <w:r>
           <w:rPr>
@@ -481,7 +481,7 @@
           <w:noProof/>
         </w:rPr>
       </w:pPr>
-      <w:hyperlink w:anchor="_Toc242011241" w:history="1">
+      <w:hyperlink w:anchor="_Toc242013111" w:history="1">
         <w:r>
           <w:rPr>
             <w:rStyle w:val="Hyperlink"/>
@@ -508,7 +508,7 @@
             <w:noProof/>
             <w:webHidden/>
           </w:rPr>
-          <w:instrText xml:space="preserve"> PAGEREF _Toc242011241 \h </w:instrText>
+          <w:instrText xml:space="preserve"> PAGEREF _Toc242013111 \h </w:instrText>
         </w:r>
         <w:r>
           <w:rPr>
@@ -549,7 +549,7 @@
           <w:noProof/>
         </w:rPr>
       </w:pPr>
-      <w:hyperlink w:anchor="_Toc242011242" w:history="1">
+      <w:hyperlink w:anchor="_Toc242013112" w:history="1">
         <w:r>
           <w:rPr>
             <w:rStyle w:val="Hyperlink"/>
@@ -576,7 +576,7 @@
             <w:noProof/>
             <w:webHidden/>
           </w:rPr>
-          <w:instrText xml:space="preserve"> PAGEREF _Toc242011242 \h </w:instrText>
+          <w:instrText xml:space="preserve"> PAGEREF _Toc242013112 \h </w:instrText>
         </w:r>
         <w:r>
           <w:rPr>
@@ -617,7 +617,7 @@
           <w:noProof/>
         </w:rPr>
       </w:pPr>
-      <w:hyperlink w:anchor="_Toc242011243" w:history="1">
+      <w:hyperlink w:anchor="_Toc242013113" w:history="1">
         <w:r>
           <w:rPr>
             <w:rStyle w:val="Hyperlink"/>
@@ -644,7 +644,7 @@
             <w:noProof/>
             <w:webHidden/>
           </w:rPr>
-          <w:instrText xml:space="preserve"> PAGEREF _Toc242011243 \h </w:instrText>
+          <w:instrText xml:space="preserve"> PAGEREF _Toc242013113 \h </w:instrText>
         </w:r>
         <w:r>
           <w:rPr>
@@ -685,7 +685,7 @@
           <w:noProof/>
         </w:rPr>
       </w:pPr>
-      <w:hyperlink w:anchor="_Toc242011244" w:history="1">
+      <w:hyperlink w:anchor="_Toc242013114" w:history="1">
         <w:r>
           <w:rPr>
             <w:rStyle w:val="Hyperlink"/>
@@ -712,7 +712,7 @@
             <w:noProof/>
             <w:webHidden/>
           </w:rPr>
-          <w:instrText xml:space="preserve"> PAGEREF _Toc242011244 \h </w:instrText>
+          <w:instrText xml:space="preserve"> PAGEREF _Toc242013114 \h </w:instrText>
         </w:r>
         <w:r>
           <w:rPr>
@@ -753,7 +753,7 @@
           <w:noProof/>
         </w:rPr>
       </w:pPr>
-      <w:hyperlink w:anchor="_Toc242011245" w:history="1">
+      <w:hyperlink w:anchor="_Toc242013115" w:history="1">
         <w:r>
           <w:rPr>
             <w:rStyle w:val="Hyperlink"/>
@@ -780,7 +780,7 @@
             <w:noProof/>
             <w:webHidden/>
           </w:rPr>
-          <w:instrText xml:space="preserve"> PAGEREF _Toc242011245 \h </w:instrText>
+          <w:instrText xml:space="preserve"> PAGEREF _Toc242013115 \h </w:instrText>
         </w:r>
         <w:r>
           <w:rPr>
@@ -821,7 +821,7 @@
           <w:noProof/>
         </w:rPr>
       </w:pPr>
-      <w:hyperlink w:anchor="_Toc242011246" w:history="1">
+      <w:hyperlink w:anchor="_Toc242013116" w:history="1">
         <w:r>
           <w:rPr>
             <w:rStyle w:val="Hyperlink"/>
@@ -848,7 +848,7 @@
             <w:noProof/>
             <w:webHidden/>
           </w:rPr>
-          <w:instrText xml:space="preserve"> PAGEREF _Toc242011246 \h </w:instrText>
+          <w:instrText xml:space="preserve"> PAGEREF _Toc242013116 \h </w:instrText>
         </w:r>
         <w:r>
           <w:rPr>
@@ -889,7 +889,7 @@
           <w:noProof/>
         </w:rPr>
       </w:pPr>
-      <w:hyperlink w:anchor="_Toc242011247" w:history="1">
+      <w:hyperlink w:anchor="_Toc242013117" w:history="1">
         <w:r>
           <w:rPr>
             <w:rStyle w:val="Hyperlink"/>
@@ -916,7 +916,7 @@
             <w:noProof/>
             <w:webHidden/>
           </w:rPr>
-          <w:instrText xml:space="preserve"> PAGEREF _Toc242011247 \h </w:instrText>
+          <w:instrText xml:space="preserve"> PAGEREF _Toc242013117 \h </w:instrText>
         </w:r>
         <w:r>
           <w:rPr>
@@ -957,7 +957,7 @@
           <w:noProof/>
         </w:rPr>
       </w:pPr>
-      <w:hyperlink w:anchor="_Toc242011248" w:history="1">
+      <w:hyperlink w:anchor="_Toc242013118" w:history="1">
         <w:r>
           <w:rPr>
             <w:rStyle w:val="Hyperlink"/>
@@ -984,7 +984,7 @@
             <w:noProof/>
             <w:webHidden/>
           </w:rPr>
-          <w:instrText xml:space="preserve"> PAGEREF _Toc242011248 \h </w:instrText>
+          <w:instrText xml:space="preserve"> PAGEREF _Toc242013118 \h </w:instrText>
         </w:r>
         <w:r>
           <w:rPr>
@@ -1025,7 +1025,7 @@
           <w:noProof/>
         </w:rPr>
       </w:pPr>
-      <w:hyperlink w:anchor="_Toc242011249" w:history="1">
+      <w:hyperlink w:anchor="_Toc242013119" w:history="1">
         <w:r>
           <w:rPr>
             <w:rStyle w:val="Hyperlink"/>
@@ -1052,7 +1052,7 @@
             <w:noProof/>
             <w:webHidden/>
           </w:rPr>
-          <w:instrText xml:space="preserve"> PAGEREF _Toc242011249 \h </w:instrText>
+          <w:instrText xml:space="preserve"> PAGEREF _Toc242013119 \h </w:instrText>
         </w:r>
         <w:r>
           <w:rPr>
@@ -1093,7 +1093,7 @@
           <w:noProof/>
         </w:rPr>
       </w:pPr>
-      <w:hyperlink w:anchor="_Toc242011250" w:history="1">
+      <w:hyperlink w:anchor="_Toc242013120" w:history="1">
         <w:r>
           <w:rPr>
             <w:rStyle w:val="Hyperlink"/>
@@ -1120,7 +1120,7 @@
             <w:noProof/>
             <w:webHidden/>
           </w:rPr>
-          <w:instrText xml:space="preserve"> PAGEREF _Toc242011250 \h </w:instrText>
+          <w:instrText xml:space="preserve"> PAGEREF _Toc242013120 \h </w:instrText>
         </w:r>
         <w:r>
           <w:rPr>
@@ -1161,7 +1161,7 @@
           <w:noProof/>
         </w:rPr>
       </w:pPr>
-      <w:hyperlink w:anchor="_Toc242011251" w:history="1">
+      <w:hyperlink w:anchor="_Toc242013121" w:history="1">
         <w:r>
           <w:rPr>
             <w:rStyle w:val="Hyperlink"/>
@@ -1188,7 +1188,7 @@
             <w:noProof/>
             <w:webHidden/>
           </w:rPr>
-          <w:instrText xml:space="preserve"> PAGEREF _Toc242011251 \h </w:instrText>
+          <w:instrText xml:space="preserve"> PAGEREF _Toc242013121 \h </w:instrText>
         </w:r>
         <w:r>
           <w:rPr>
@@ -1229,7 +1229,7 @@
           <w:noProof/>
         </w:rPr>
       </w:pPr>
-      <w:hyperlink w:anchor="_Toc242011252" w:history="1">
+      <w:hyperlink w:anchor="_Toc242013122" w:history="1">
         <w:r>
           <w:rPr>
             <w:rStyle w:val="Hyperlink"/>
@@ -1256,7 +1256,7 @@
             <w:noProof/>
             <w:webHidden/>
           </w:rPr>
-          <w:instrText xml:space="preserve"> PAGEREF _Toc242011252 \h </w:instrText>
+          <w:instrText xml:space="preserve"> PAGEREF _Toc242013122 \h </w:instrText>
         </w:r>
         <w:r>
           <w:rPr>
@@ -1297,7 +1297,7 @@
           <w:noProof/>
         </w:rPr>
       </w:pPr>
-      <w:hyperlink w:anchor="_Toc242011253" w:history="1">
+      <w:hyperlink w:anchor="_Toc242013123" w:history="1">
         <w:r>
           <w:rPr>
             <w:rStyle w:val="Hyperlink"/>
@@ -1324,7 +1324,7 @@
             <w:noProof/>
             <w:webHidden/>
           </w:rPr>
-          <w:instrText xml:space="preserve"> PAGEREF _Toc242011253 \h </w:instrText>
+          <w:instrText xml:space="preserve"> PAGEREF _Toc242013123 \h </w:instrText>
         </w:r>
         <w:r>
           <w:rPr>
@@ -1365,7 +1365,7 @@
           <w:noProof/>
         </w:rPr>
       </w:pPr>
-      <w:hyperlink w:anchor="_Toc242011254" w:history="1">
+      <w:hyperlink w:anchor="_Toc242013124" w:history="1">
         <w:r>
           <w:rPr>
             <w:rStyle w:val="Hyperlink"/>
@@ -1392,7 +1392,7 @@
             <w:noProof/>
             <w:webHidden/>
           </w:rPr>
-          <w:instrText xml:space="preserve"> PAGEREF _Toc242011254 \h </w:instrText>
+          <w:instrText xml:space="preserve"> PAGEREF _Toc242013124 \h </w:instrText>
         </w:r>
         <w:r>
           <w:rPr>
@@ -1433,7 +1433,7 @@
           <w:noProof/>
         </w:rPr>
       </w:pPr>
-      <w:hyperlink w:anchor="_Toc242011255" w:history="1">
+      <w:hyperlink w:anchor="_Toc242013125" w:history="1">
         <w:r>
           <w:rPr>
             <w:rStyle w:val="Hyperlink"/>
@@ -1460,7 +1460,7 @@
             <w:noProof/>
             <w:webHidden/>
           </w:rPr>
-          <w:instrText xml:space="preserve"> PAGEREF _Toc242011255 \h </w:instrText>
+          <w:instrText xml:space="preserve"> PAGEREF _Toc242013125 \h </w:instrText>
         </w:r>
         <w:r>
           <w:rPr>
@@ -1501,7 +1501,7 @@
           <w:noProof/>
         </w:rPr>
       </w:pPr>
-      <w:hyperlink w:anchor="_Toc242011256" w:history="1">
+      <w:hyperlink w:anchor="_Toc242013126" w:history="1">
         <w:r>
           <w:rPr>
             <w:rStyle w:val="Hyperlink"/>
@@ -1528,7 +1528,7 @@
             <w:noProof/>
             <w:webHidden/>
           </w:rPr>
-          <w:instrText xml:space="preserve"> PAGEREF _Toc242011256 \h </w:instrText>
+          <w:instrText xml:space="preserve"> PAGEREF _Toc242013126 \h </w:instrText>
         </w:r>
         <w:r>
           <w:rPr>
@@ -1569,7 +1569,7 @@
           <w:noProof/>
         </w:rPr>
       </w:pPr>
-      <w:hyperlink w:anchor="_Toc242011257" w:history="1">
+      <w:hyperlink w:anchor="_Toc242013127" w:history="1">
         <w:r>
           <w:rPr>
             <w:rStyle w:val="Hyperlink"/>
@@ -1596,7 +1596,7 @@
             <w:noProof/>
             <w:webHidden/>
           </w:rPr>
-          <w:instrText xml:space="preserve"> PAGEREF _Toc242011257 \h </w:instrText>
+          <w:instrText xml:space="preserve"> PAGEREF _Toc242013127 \h </w:instrText>
         </w:r>
         <w:r>
           <w:rPr>
@@ -1637,7 +1637,7 @@
           <w:noProof/>
         </w:rPr>
       </w:pPr>
-      <w:hyperlink w:anchor="_Toc242011258" w:history="1">
+      <w:hyperlink w:anchor="_Toc242013128" w:history="1">
         <w:r>
           <w:rPr>
             <w:rStyle w:val="Hyperlink"/>
@@ -1664,7 +1664,7 @@
             <w:noProof/>
             <w:webHidden/>
           </w:rPr>
-          <w:instrText xml:space="preserve"> PAGEREF _Toc242011258 \h </w:instrText>
+          <w:instrText xml:space="preserve"> PAGEREF _Toc242013128 \h </w:instrText>
         </w:r>
         <w:r>
           <w:rPr>
@@ -1705,7 +1705,7 @@
           <w:noProof/>
         </w:rPr>
       </w:pPr>
-      <w:hyperlink w:anchor="_Toc242011259" w:history="1">
+      <w:hyperlink w:anchor="_Toc242013129" w:history="1">
         <w:r>
           <w:rPr>
             <w:rStyle w:val="Hyperlink"/>
@@ -1732,7 +1732,7 @@
             <w:noProof/>
             <w:webHidden/>
           </w:rPr>
-          <w:instrText xml:space="preserve"> PAGEREF _Toc242011259 \h </w:instrText>
+          <w:instrText xml:space="preserve"> PAGEREF _Toc242013129 \h </w:instrText>
         </w:r>
         <w:r>
           <w:rPr>
@@ -1773,7 +1773,7 @@
           <w:noProof/>
         </w:rPr>
       </w:pPr>
-      <w:hyperlink w:anchor="_Toc242011260" w:history="1">
+      <w:hyperlink w:anchor="_Toc242013130" w:history="1">
         <w:r>
           <w:rPr>
             <w:rStyle w:val="Hyperlink"/>
@@ -1800,7 +1800,7 @@
             <w:noProof/>
             <w:webHidden/>
           </w:rPr>
-          <w:instrText xml:space="preserve"> PAGEREF _Toc242011260 \h </w:instrText>
+          <w:instrText xml:space="preserve"> PAGEREF _Toc242013130 \h </w:instrText>
         </w:r>
         <w:r>
           <w:rPr>
@@ -1841,7 +1841,7 @@
           <w:noProof/>
         </w:rPr>
       </w:pPr>
-      <w:hyperlink w:anchor="_Toc242011261" w:history="1">
+      <w:hyperlink w:anchor="_Toc242013131" w:history="1">
         <w:r>
           <w:rPr>
             <w:rStyle w:val="Hyperlink"/>
@@ -1868,7 +1868,7 @@
             <w:noProof/>
             <w:webHidden/>
           </w:rPr>
-          <w:instrText xml:space="preserve"> PAGEREF _Toc242011261 \h </w:instrText>
+          <w:instrText xml:space="preserve"> PAGEREF _Toc242013131 \h </w:instrText>
         </w:r>
         <w:r>
           <w:rPr>
@@ -1909,7 +1909,7 @@
           <w:noProof/>
         </w:rPr>
       </w:pPr>
-      <w:hyperlink w:anchor="_Toc242011262" w:history="1">
+      <w:hyperlink w:anchor="_Toc242013132" w:history="1">
         <w:r>
           <w:rPr>
             <w:rStyle w:val="Hyperlink"/>
@@ -1936,7 +1936,7 @@
             <w:noProof/>
             <w:webHidden/>
           </w:rPr>
-          <w:instrText xml:space="preserve"> PAGEREF _Toc242011262 \h </w:instrText>
+          <w:instrText xml:space="preserve"> PAGEREF _Toc242013132 \h </w:instrText>
         </w:r>
         <w:r>
           <w:rPr>
@@ -1977,7 +1977,7 @@
           <w:noProof/>
         </w:rPr>
       </w:pPr>
-      <w:hyperlink w:anchor="_Toc242011263" w:history="1">
+      <w:hyperlink w:anchor="_Toc242013133" w:history="1">
         <w:r>
           <w:rPr>
             <w:rStyle w:val="Hyperlink"/>
@@ -2004,7 +2004,7 @@
             <w:noProof/>
             <w:webHidden/>
           </w:rPr>
-          <w:instrText xml:space="preserve"> PAGEREF _Toc242011263 \h </w:instrText>
+          <w:instrText xml:space="preserve"> PAGEREF _Toc242013133 \h </w:instrText>
         </w:r>
         <w:r>
           <w:rPr>
@@ -2045,7 +2045,7 @@
           <w:noProof/>
         </w:rPr>
       </w:pPr>
-      <w:hyperlink w:anchor="_Toc242011264" w:history="1">
+      <w:hyperlink w:anchor="_Toc242013134" w:history="1">
         <w:r>
           <w:rPr>
             <w:rStyle w:val="Hyperlink"/>
@@ -2072,7 +2072,7 @@
             <w:noProof/>
             <w:webHidden/>
           </w:rPr>
-          <w:instrText xml:space="preserve"> PAGEREF _Toc242011264 \h </w:instrText>
+          <w:instrText xml:space="preserve"> PAGEREF _Toc242013134 \h </w:instrText>
         </w:r>
         <w:r>
           <w:rPr>
@@ -2113,7 +2113,7 @@
           <w:noProof/>
         </w:rPr>
       </w:pPr>
-      <w:hyperlink w:anchor="_Toc242011265" w:history="1">
+      <w:hyperlink w:anchor="_Toc242013135" w:history="1">
         <w:r>
           <w:rPr>
             <w:rStyle w:val="Hyperlink"/>
@@ -2140,7 +2140,7 @@
             <w:noProof/>
             <w:webHidden/>
           </w:rPr>
-          <w:instrText xml:space="preserve"> PAGEREF _Toc242011265 \h </w:instrText>
+          <w:instrText xml:space="preserve"> PAGEREF _Toc242013135 \h </w:instrText>
         </w:r>
         <w:r>
           <w:rPr>
@@ -2181,7 +2181,7 @@
           <w:noProof/>
         </w:rPr>
       </w:pPr>
-      <w:hyperlink w:anchor="_Toc242011266" w:history="1">
+      <w:hyperlink w:anchor="_Toc242013136" w:history="1">
         <w:r>
           <w:rPr>
             <w:rStyle w:val="Hyperlink"/>
@@ -2208,7 +2208,7 @@
             <w:noProof/>
             <w:webHidden/>
           </w:rPr>
-          <w:instrText xml:space="preserve"> PAGEREF _Toc242011266 \h </w:instrText>
+          <w:instrText xml:space="preserve"> PAGEREF _Toc242013136 \h </w:instrText>
         </w:r>
         <w:r>
           <w:rPr>
@@ -2249,7 +2249,7 @@
           <w:noProof/>
         </w:rPr>
       </w:pPr>
-      <w:hyperlink w:anchor="_Toc242011267" w:history="1">
+      <w:hyperlink w:anchor="_Toc242013137" w:history="1">
         <w:r>
           <w:rPr>
             <w:rStyle w:val="Hyperlink"/>
@@ -2276,7 +2276,7 @@
             <w:noProof/>
             <w:webHidden/>
           </w:rPr>
-          <w:instrText xml:space="preserve"> PAGEREF _Toc242011267 \h </w:instrText>
+          <w:instrText xml:space="preserve"> PAGEREF _Toc242013137 \h </w:instrText>
         </w:r>
         <w:r>
           <w:rPr>
@@ -2317,7 +2317,7 @@
           <w:noProof/>
         </w:rPr>
       </w:pPr>
-      <w:hyperlink w:anchor="_Toc242011268" w:history="1">
+      <w:hyperlink w:anchor="_Toc242013138" w:history="1">
         <w:r>
           <w:rPr>
             <w:rStyle w:val="Hyperlink"/>
@@ -2344,7 +2344,7 @@
             <w:noProof/>
             <w:webHidden/>
           </w:rPr>
-          <w:instrText xml:space="preserve"> PAGEREF _Toc242011268 \h </w:instrText>
+          <w:instrText xml:space="preserve"> PAGEREF _Toc242013138 \h </w:instrText>
         </w:r>
         <w:r>
           <w:rPr>
@@ -2385,7 +2385,7 @@
           <w:noProof/>
         </w:rPr>
       </w:pPr>
-      <w:hyperlink w:anchor="_Toc242011269" w:history="1">
+      <w:hyperlink w:anchor="_Toc242013139" w:history="1">
         <w:r>
           <w:rPr>
             <w:rStyle w:val="Hyperlink"/>
@@ -2412,7 +2412,7 @@
             <w:noProof/>
             <w:webHidden/>
           </w:rPr>
-          <w:instrText xml:space="preserve"> PAGEREF _Toc242011269 \h </w:instrText>
+          <w:instrText xml:space="preserve"> PAGEREF _Toc242013139 \h </w:instrText>
         </w:r>
         <w:r>
           <w:rPr>
@@ -2453,7 +2453,7 @@
           <w:noProof/>
         </w:rPr>
       </w:pPr>
-      <w:hyperlink w:anchor="_Toc242011270" w:history="1">
+      <w:hyperlink w:anchor="_Toc242013140" w:history="1">
         <w:r>
           <w:rPr>
             <w:rStyle w:val="Hyperlink"/>
@@ -2480,7 +2480,7 @@
             <w:noProof/>
             <w:webHidden/>
           </w:rPr>
-          <w:instrText xml:space="preserve"> PAGEREF _Toc242011270 \h </w:instrText>
+          <w:instrText xml:space="preserve"> PAGEREF _Toc242013140 \h </w:instrText>
         </w:r>
         <w:r>
           <w:rPr>
@@ -2521,7 +2521,7 @@
           <w:noProof/>
         </w:rPr>
       </w:pPr>
-      <w:hyperlink w:anchor="_Toc242011271" w:history="1">
+      <w:hyperlink w:anchor="_Toc242013141" w:history="1">
         <w:r>
           <w:rPr>
             <w:rStyle w:val="Hyperlink"/>
@@ -2548,7 +2548,7 @@
             <w:noProof/>
             <w:webHidden/>
           </w:rPr>
-          <w:instrText xml:space="preserve"> PAGEREF _Toc242011271 \h </w:instrText>
+          <w:instrText xml:space="preserve"> PAGEREF _Toc242013141 \h </w:instrText>
         </w:r>
         <w:r>
           <w:rPr>
@@ -2589,7 +2589,7 @@
           <w:noProof/>
         </w:rPr>
       </w:pPr>
-      <w:hyperlink w:anchor="_Toc242011272" w:history="1">
+      <w:hyperlink w:anchor="_Toc242013142" w:history="1">
         <w:r>
           <w:rPr>
             <w:rStyle w:val="Hyperlink"/>
@@ -2616,7 +2616,7 @@
             <w:noProof/>
             <w:webHidden/>
           </w:rPr>
-          <w:instrText xml:space="preserve"> PAGEREF _Toc242011272 \h </w:instrText>
+          <w:instrText xml:space="preserve"> PAGEREF _Toc242013142 \h </w:instrText>
         </w:r>
         <w:r>
           <w:rPr>
@@ -2657,7 +2657,7 @@
           <w:noProof/>
         </w:rPr>
       </w:pPr>
-      <w:hyperlink w:anchor="_Toc242011273" w:history="1">
+      <w:hyperlink w:anchor="_Toc242013143" w:history="1">
         <w:r>
           <w:rPr>
             <w:rStyle w:val="Hyperlink"/>
@@ -2684,7 +2684,7 @@
             <w:noProof/>
             <w:webHidden/>
           </w:rPr>
-          <w:instrText xml:space="preserve"> PAGEREF _Toc242011273 \h </w:instrText>
+          <w:instrText xml:space="preserve"> PAGEREF _Toc242013143 \h </w:instrText>
         </w:r>
         <w:r>
           <w:rPr>
@@ -2725,7 +2725,7 @@
           <w:noProof/>
         </w:rPr>
       </w:pPr>
-      <w:hyperlink w:anchor="_Toc242011274" w:history="1">
+      <w:hyperlink w:anchor="_Toc242013144" w:history="1">
         <w:r>
           <w:rPr>
             <w:rStyle w:val="Hyperlink"/>
@@ -2752,7 +2752,7 @@
             <w:noProof/>
             <w:webHidden/>
           </w:rPr>
-          <w:instrText xml:space="preserve"> PAGEREF _Toc242011274 \h </w:instrText>
+          <w:instrText xml:space="preserve"> PAGEREF _Toc242013144 \h </w:instrText>
         </w:r>
         <w:r>
           <w:rPr>
@@ -2793,7 +2793,7 @@
           <w:noProof/>
         </w:rPr>
       </w:pPr>
-      <w:hyperlink w:anchor="_Toc242011275" w:history="1">
+      <w:hyperlink w:anchor="_Toc242013145" w:history="1">
         <w:r>
           <w:rPr>
             <w:rStyle w:val="Hyperlink"/>
@@ -2820,7 +2820,7 @@
             <w:noProof/>
             <w:webHidden/>
           </w:rPr>
-          <w:instrText xml:space="preserve"> PAGEREF _Toc242011275 \h </w:instrText>
+          <w:instrText xml:space="preserve"> PAGEREF _Toc242013145 \h </w:instrText>
         </w:r>
         <w:r>
           <w:rPr>
@@ -2861,7 +2861,7 @@
           <w:noProof/>
         </w:rPr>
       </w:pPr>
-      <w:hyperlink w:anchor="_Toc242011276" w:history="1">
+      <w:hyperlink w:anchor="_Toc242013146" w:history="1">
         <w:r>
           <w:rPr>
             <w:rStyle w:val="Hyperlink"/>
@@ -2888,7 +2888,7 @@
             <w:noProof/>
             <w:webHidden/>
           </w:rPr>
-          <w:instrText xml:space="preserve"> PAGEREF _Toc242011276 \h </w:instrText>
+          <w:instrText xml:space="preserve"> PAGEREF _Toc242013146 \h </w:instrText>
         </w:r>
         <w:r>
           <w:rPr>
@@ -2929,7 +2929,7 @@
           <w:noProof/>
         </w:rPr>
       </w:pPr>
-      <w:hyperlink w:anchor="_Toc242011277" w:history="1">
+      <w:hyperlink w:anchor="_Toc242013147" w:history="1">
         <w:r>
           <w:rPr>
             <w:rStyle w:val="Hyperlink"/>
@@ -2956,7 +2956,7 @@
             <w:noProof/>
             <w:webHidden/>
           </w:rPr>
-          <w:instrText xml:space="preserve"> PAGEREF _Toc242011277 \h </w:instrText>
+          <w:instrText xml:space="preserve"> PAGEREF _Toc242013147 \h </w:instrText>
         </w:r>
         <w:r>
           <w:rPr>
@@ -2997,7 +2997,7 @@
           <w:noProof/>
         </w:rPr>
       </w:pPr>
-      <w:hyperlink w:anchor="_Toc242011278" w:history="1">
+      <w:hyperlink w:anchor="_Toc242013148" w:history="1">
         <w:r>
           <w:rPr>
             <w:rStyle w:val="Hyperlink"/>
@@ -3024,7 +3024,7 @@
             <w:noProof/>
             <w:webHidden/>
           </w:rPr>
-          <w:instrText xml:space="preserve"> PAGEREF _Toc242011278 \h </w:instrText>
+          <w:instrText xml:space="preserve"> PAGEREF _Toc242013148 \h </w:instrText>
         </w:r>
         <w:r>
           <w:rPr>
@@ -3065,7 +3065,7 @@
           <w:noProof/>
         </w:rPr>
       </w:pPr>
-      <w:hyperlink w:anchor="_Toc242011279" w:history="1">
+      <w:hyperlink w:anchor="_Toc242013149" w:history="1">
         <w:r>
           <w:rPr>
             <w:rStyle w:val="Hyperlink"/>
@@ -3092,7 +3092,7 @@
             <w:noProof/>
             <w:webHidden/>
           </w:rPr>
-          <w:instrText xml:space="preserve"> PAGEREF _Toc242011279 \h </w:instrText>
+          <w:instrText xml:space="preserve"> PAGEREF _Toc242013149 \h </w:instrText>
         </w:r>
         <w:r>
           <w:rPr>
@@ -3133,7 +3133,7 @@
           <w:noProof/>
         </w:rPr>
       </w:pPr>
-      <w:hyperlink w:anchor="_Toc242011280" w:history="1">
+      <w:hyperlink w:anchor="_Toc242013150" w:history="1">
         <w:r>
           <w:rPr>
             <w:rStyle w:val="Hyperlink"/>
@@ -3160,7 +3160,7 @@
             <w:noProof/>
             <w:webHidden/>
           </w:rPr>
-          <w:instrText xml:space="preserve"> PAGEREF _Toc242011280 \h </w:instrText>
+          <w:instrText xml:space="preserve"> PAGEREF _Toc242013150 \h </w:instrText>
         </w:r>
         <w:r>
           <w:rPr>
@@ -3201,7 +3201,7 @@
           <w:noProof/>
         </w:rPr>
       </w:pPr>
-      <w:hyperlink w:anchor="_Toc242011281" w:history="1">
+      <w:hyperlink w:anchor="_Toc242013151" w:history="1">
         <w:r>
           <w:rPr>
             <w:rStyle w:val="Hyperlink"/>
@@ -3228,7 +3228,7 @@
             <w:noProof/>
             <w:webHidden/>
           </w:rPr>
-          <w:instrText xml:space="preserve"> PAGEREF _Toc242011281 \h </w:instrText>
+          <w:instrText xml:space="preserve"> PAGEREF _Toc242013151 \h </w:instrText>
         </w:r>
         <w:r>
           <w:rPr>
@@ -3269,7 +3269,7 @@
           <w:noProof/>
         </w:rPr>
       </w:pPr>
-      <w:hyperlink w:anchor="_Toc242011282" w:history="1">
+      <w:hyperlink w:anchor="_Toc242013152" w:history="1">
         <w:r>
           <w:rPr>
             <w:rStyle w:val="Hyperlink"/>
@@ -3296,7 +3296,7 @@
             <w:noProof/>
             <w:webHidden/>
           </w:rPr>
-          <w:instrText xml:space="preserve"> PAGEREF _Toc242011282 \h </w:instrText>
+          <w:instrText xml:space="preserve"> PAGEREF _Toc242013152 \h </w:instrText>
         </w:r>
         <w:r>
           <w:rPr>
@@ -3337,7 +3337,7 @@
           <w:noProof/>
         </w:rPr>
       </w:pPr>
-      <w:hyperlink w:anchor="_Toc242011283" w:history="1">
+      <w:hyperlink w:anchor="_Toc242013153" w:history="1">
         <w:r>
           <w:rPr>
             <w:rStyle w:val="Hyperlink"/>
@@ -3364,7 +3364,7 @@
             <w:noProof/>
             <w:webHidden/>
           </w:rPr>
-          <w:instrText xml:space="preserve"> PAGEREF _Toc242011283 \h </w:instrText>
+          <w:instrText xml:space="preserve"> PAGEREF _Toc242013153 \h </w:instrText>
         </w:r>
         <w:r>
           <w:rPr>
@@ -3405,7 +3405,7 @@
           <w:noProof/>
         </w:rPr>
       </w:pPr>
-      <w:hyperlink w:anchor="_Toc242011284" w:history="1">
+      <w:hyperlink w:anchor="_Toc242013154" w:history="1">
         <w:r>
           <w:rPr>
             <w:rStyle w:val="Hyperlink"/>
@@ -3432,7 +3432,7 @@
             <w:noProof/>
             <w:webHidden/>
           </w:rPr>
-          <w:instrText xml:space="preserve"> PAGEREF _Toc242011284 \h </w:instrText>
+          <w:instrText xml:space="preserve"> PAGEREF _Toc242013154 \h </w:instrText>
         </w:r>
         <w:r>
           <w:rPr>
@@ -3473,7 +3473,7 @@
           <w:noProof/>
         </w:rPr>
       </w:pPr>
-      <w:hyperlink w:anchor="_Toc242011285" w:history="1">
+      <w:hyperlink w:anchor="_Toc242013155" w:history="1">
         <w:r>
           <w:rPr>
             <w:rStyle w:val="Hyperlink"/>
@@ -3500,7 +3500,7 @@
             <w:noProof/>
             <w:webHidden/>
           </w:rPr>
-          <w:instrText xml:space="preserve"> PAGEREF _Toc242011285 \h </w:instrText>
+          <w:instrText xml:space="preserve"> PAGEREF _Toc242013155 \h </w:instrText>
         </w:r>
         <w:r>
           <w:rPr>
@@ -3541,7 +3541,7 @@
           <w:noProof/>
         </w:rPr>
       </w:pPr>
-      <w:hyperlink w:anchor="_Toc242011286" w:history="1">
+      <w:hyperlink w:anchor="_Toc242013156" w:history="1">
         <w:r>
           <w:rPr>
             <w:rStyle w:val="Hyperlink"/>
@@ -3568,7 +3568,7 @@
             <w:noProof/>
             <w:webHidden/>
           </w:rPr>
-          <w:instrText xml:space="preserve"> PAGEREF _Toc242011286 \h </w:instrText>
+          <w:instrText xml:space="preserve"> PAGEREF _Toc242013156 \h </w:instrText>
         </w:r>
         <w:r>
           <w:rPr>
@@ -3609,7 +3609,7 @@
           <w:noProof/>
         </w:rPr>
       </w:pPr>
-      <w:hyperlink w:anchor="_Toc242011287" w:history="1">
+      <w:hyperlink w:anchor="_Toc242013157" w:history="1">
         <w:r>
           <w:rPr>
             <w:rStyle w:val="Hyperlink"/>
@@ -3636,7 +3636,7 @@
             <w:noProof/>
             <w:webHidden/>
           </w:rPr>
-          <w:instrText xml:space="preserve"> PAGEREF _Toc242011287 \h </w:instrText>
+          <w:instrText xml:space="preserve"> PAGEREF _Toc242013157 \h </w:instrText>
         </w:r>
         <w:r>
           <w:rPr>
@@ -3677,7 +3677,7 @@
           <w:noProof/>
         </w:rPr>
       </w:pPr>
-      <w:hyperlink w:anchor="_Toc242011288" w:history="1">
+      <w:hyperlink w:anchor="_Toc242013158" w:history="1">
         <w:r>
           <w:rPr>
             <w:rStyle w:val="Hyperlink"/>
@@ -3704,7 +3704,7 @@
             <w:noProof/>
             <w:webHidden/>
           </w:rPr>
-          <w:instrText xml:space="preserve"> PAGEREF _Toc242011288 \h </w:instrText>
+          <w:instrText xml:space="preserve"> PAGEREF _Toc242013158 \h </w:instrText>
         </w:r>
         <w:r>
           <w:rPr>
@@ -3745,7 +3745,7 @@
           <w:noProof/>
         </w:rPr>
       </w:pPr>
-      <w:hyperlink w:anchor="_Toc242011289" w:history="1">
+      <w:hyperlink w:anchor="_Toc242013159" w:history="1">
         <w:r>
           <w:rPr>
             <w:rStyle w:val="Hyperlink"/>
@@ -3772,7 +3772,7 @@
             <w:noProof/>
             <w:webHidden/>
           </w:rPr>
-          <w:instrText xml:space="preserve"> PAGEREF _Toc242011289 \h </w:instrText>
+          <w:instrText xml:space="preserve"> PAGEREF _Toc242013159 \h </w:instrText>
         </w:r>
         <w:r>
           <w:rPr>
@@ -3813,13 +3813,13 @@
           <w:noProof/>
         </w:rPr>
       </w:pPr>
-      <w:hyperlink w:anchor="_Toc242011290" w:history="1">
+      <w:hyperlink w:anchor="_Toc242013160" w:history="1">
         <w:r>
           <w:rPr>
             <w:rStyle w:val="Hyperlink"/>
             <w:noProof/>
           </w:rPr>
-          <w:t>Tips and troubleshooting</w:t>
+          <w:t>Owner: backing up and restoring the catalog</w:t>
         </w:r>
         <w:r>
           <w:rPr>
@@ -3840,7 +3840,143 @@
             <w:noProof/>
             <w:webHidden/>
           </w:rPr>
-          <w:instrText xml:space="preserve"> PAGEREF _Toc242011290 \h </w:instrText>
+          <w:instrText xml:space="preserve"> PAGEREF _Toc242013160 \h </w:instrText>
+        </w:r>
+        <w:r>
+          <w:rPr>
+            <w:noProof/>
+            <w:webHidden/>
+          </w:rPr>
+        </w:r>
+        <w:r>
+          <w:rPr>
+            <w:noProof/>
+            <w:webHidden/>
+          </w:rPr>
+          <w:fldChar w:fldCharType="separate"/>
+        </w:r>
+        <w:r>
+          <w:rPr>
+            <w:noProof/>
+            <w:webHidden/>
+          </w:rPr>
+          <w:t>51</w:t>
+        </w:r>
+        <w:r>
+          <w:rPr>
+            <w:noProof/>
+            <w:webHidden/>
+          </w:rPr>
+          <w:fldChar w:fldCharType="end"/>
+        </w:r>
+      </w:hyperlink>
+    </w:p>
+    <w:p>
+      <w:pPr>
+        <w:pStyle w:val="TOC2"/>
+        <w:tabs>
+          <w:tab w:val="right" w:leader="dot" w:pos="9350"/>
+        </w:tabs>
+        <w:rPr>
+          <w:noProof/>
+        </w:rPr>
+      </w:pPr>
+      <w:hyperlink w:anchor="_Toc242013161" w:history="1">
+        <w:r>
+          <w:rPr>
+            <w:rStyle w:val="Hyperlink"/>
+            <w:noProof/>
+          </w:rPr>
+          <w:t>Export catalog</w:t>
+        </w:r>
+        <w:r>
+          <w:rPr>
+            <w:noProof/>
+            <w:webHidden/>
+          </w:rPr>
+          <w:tab/>
+        </w:r>
+        <w:r>
+          <w:rPr>
+            <w:noProof/>
+            <w:webHidden/>
+          </w:rPr>
+          <w:fldChar w:fldCharType="begin"/>
+        </w:r>
+        <w:r>
+          <w:rPr>
+            <w:noProof/>
+            <w:webHidden/>
+          </w:rPr>
+          <w:instrText xml:space="preserve"> PAGEREF _Toc242013161 \h </w:instrText>
+        </w:r>
+        <w:r>
+          <w:rPr>
+            <w:noProof/>
+            <w:webHidden/>
+          </w:rPr>
+        </w:r>
+        <w:r>
+          <w:rPr>
+            <w:noProof/>
+            <w:webHidden/>
+          </w:rPr>
+          <w:fldChar w:fldCharType="separate"/>
+        </w:r>
+        <w:r>
+          <w:rPr>
+            <w:noProof/>
+            <w:webHidden/>
+          </w:rPr>
+          <w:t>51</w:t>
+        </w:r>
+        <w:r>
+          <w:rPr>
+            <w:noProof/>
+            <w:webHidden/>
+          </w:rPr>
+          <w:fldChar w:fldCharType="end"/>
+        </w:r>
+      </w:hyperlink>
+    </w:p>
+    <w:p>
+      <w:pPr>
+        <w:pStyle w:val="TOC2"/>
+        <w:tabs>
+          <w:tab w:val="right" w:leader="dot" w:pos="9350"/>
+        </w:tabs>
+        <w:rPr>
+          <w:noProof/>
+        </w:rPr>
+      </w:pPr>
+      <w:hyperlink w:anchor="_Toc242013162" w:history="1">
+        <w:r>
+          <w:rPr>
+            <w:rStyle w:val="Hyperlink"/>
+            <w:noProof/>
+          </w:rPr>
+          <w:t>Restore catalog</w:t>
+        </w:r>
+        <w:r>
+          <w:rPr>
+            <w:noProof/>
+            <w:webHidden/>
+          </w:rPr>
+          <w:tab/>
+        </w:r>
+        <w:r>
+          <w:rPr>
+            <w:noProof/>
+            <w:webHidden/>
+          </w:rPr>
+          <w:fldChar w:fldCharType="begin"/>
+        </w:r>
+        <w:r>
+          <w:rPr>
+            <w:noProof/>
+            <w:webHidden/>
+          </w:rPr>
+          <w:instrText xml:space="preserve"> PAGEREF _Toc242013162 \h </w:instrText>
         </w:r>
         <w:r>
           <w:rPr>
@@ -3881,12 +4017,80 @@
           <w:noProof/>
         </w:rPr>
       </w:pPr>
-      <w:hyperlink w:anchor="_Toc242011291" w:history="1">
+      <w:hyperlink w:anchor="_Toc242013163" w:history="1">
         <w:r>
           <w:rPr>
             <w:rStyle w:val="Hyperlink"/>
             <w:noProof/>
           </w:rPr>
+          <w:t>Tips and troubleshooting</w:t>
+        </w:r>
+        <w:r>
+          <w:rPr>
+            <w:noProof/>
+            <w:webHidden/>
+          </w:rPr>
+          <w:tab/>
+        </w:r>
+        <w:r>
+          <w:rPr>
+            <w:noProof/>
+            <w:webHidden/>
+          </w:rPr>
+          <w:fldChar w:fldCharType="begin"/>
+        </w:r>
+        <w:r>
+          <w:rPr>
+            <w:noProof/>
+            <w:webHidden/>
+          </w:rPr>
+          <w:instrText xml:space="preserve"> PAGEREF _Toc242013163 \h </w:instrText>
+        </w:r>
+        <w:r>
+          <w:rPr>
+            <w:noProof/>
+            <w:webHidden/>
+          </w:rPr>
+        </w:r>
+        <w:r>
+          <w:rPr>
+            <w:noProof/>
+            <w:webHidden/>
+          </w:rPr>
+          <w:fldChar w:fldCharType="separate"/>
+        </w:r>
+        <w:r>
+          <w:rPr>
+            <w:noProof/>
+            <w:webHidden/>
+          </w:rPr>
+          <w:t>54</w:t>
+        </w:r>
+        <w:r>
+          <w:rPr>
+            <w:noProof/>
+            <w:webHidden/>
+          </w:rPr>
+          <w:fldChar w:fldCharType="end"/>
+        </w:r>
+      </w:hyperlink>
+    </w:p>
+    <w:p>
+      <w:pPr>
+        <w:pStyle w:val="TOC1"/>
+        <w:tabs>
+          <w:tab w:val="right" w:leader="dot" w:pos="9350"/>
+        </w:tabs>
+        <w:rPr>
+          <w:noProof/>
+        </w:rPr>
+      </w:pPr>
+      <w:hyperlink w:anchor="_Toc242013164" w:history="1">
+        <w:r>
+          <w:rPr>
+            <w:rStyle w:val="Hyperlink"/>
+            <w:noProof/>
+          </w:rPr>
           <w:t>Quick reference</w:t>
         </w:r>
         <w:r>
@@ -3908,7 +4112,7 @@
             <w:noProof/>
             <w:webHidden/>
           </w:rPr>
-          <w:instrText xml:space="preserve"> PAGEREF _Toc242011291 \h </w:instrText>
+          <w:instrText xml:space="preserve"> PAGEREF _Toc242013164 \h </w:instrText>
         </w:r>
         <w:r>
           <w:rPr>
@@ -3928,7 +4132,7 @@
             <w:noProof/>
             <w:webHidden/>
           </w:rPr>
-          <w:t>53</w:t>
+          <w:t>56</w:t>
         </w:r>
         <w:r>
           <w:rPr>
@@ -3949,7 +4153,7 @@
           <w:noProof/>
         </w:rPr>
       </w:pPr>
-      <w:hyperlink w:anchor="_Toc242011292" w:history="1">
+      <w:hyperlink w:anchor="_Toc242013165" w:history="1">
         <w:r>
           <w:rPr>
             <w:rStyle w:val="Hyperlink"/>
@@ -3976,7 +4180,7 @@
             <w:noProof/>
             <w:webHidden/>
           </w:rPr>
-          <w:instrText xml:space="preserve"> PAGEREF _Toc242011292 \h </w:instrText>
+          <w:instrText xml:space="preserve"> PAGEREF _Toc242013165 \h </w:instrText>
         </w:r>
         <w:r>
           <w:rPr>
@@ -3996,7 +4200,7 @@
             <w:noProof/>
             <w:webHidden/>
           </w:rPr>
-          <w:t>53</w:t>
+          <w:t>56</w:t>
         </w:r>
         <w:r>
           <w:rPr>
@@ -4017,7 +4221,7 @@
           <w:noProof/>
         </w:rPr>
       </w:pPr>
-      <w:hyperlink w:anchor="_Toc242011293" w:history="1">
+      <w:hyperlink w:anchor="_Toc242013166" w:history="1">
         <w:r>
           <w:rPr>
             <w:rStyle w:val="Hyperlink"/>
@@ -4044,7 +4248,7 @@
             <w:noProof/>
             <w:webHidden/>
           </w:rPr>
-          <w:instrText xml:space="preserve"> PAGEREF _Toc242011293 \h </w:instrText>
+          <w:instrText xml:space="preserve"> PAGEREF _Toc242013166 \h </w:instrText>
         </w:r>
         <w:r>
           <w:rPr>
@@ -4064,7 +4268,7 @@
             <w:noProof/>
             <w:webHidden/>
           </w:rPr>
-          <w:t>53</w:t>
+          <w:t>56</w:t>
         </w:r>
         <w:r>
           <w:rPr>
@@ -4085,7 +4289,7 @@
           <w:noProof/>
         </w:rPr>
       </w:pPr>
-      <w:hyperlink w:anchor="_Toc242011294" w:history="1">
+      <w:hyperlink w:anchor="_Toc242013167" w:history="1">
         <w:r>
           <w:rPr>
             <w:rStyle w:val="Hyperlink"/>
@@ -4112,7 +4316,7 @@
             <w:noProof/>
             <w:webHidden/>
           </w:rPr>
-          <w:instrText xml:space="preserve"> PAGEREF _Toc242011294 \h </w:instrText>
+          <w:instrText xml:space="preserve"> PAGEREF _Toc242013167 \h </w:instrText>
         </w:r>
         <w:r>
           <w:rPr>
@@ -4132,7 +4336,7 @@
             <w:noProof/>
             <w:webHidden/>
           </w:rPr>
-          <w:t>53</w:t>
+          <w:t>56</w:t>
         </w:r>
         <w:r>
           <w:rPr>
@@ -4153,7 +4357,7 @@
           <w:noProof/>
         </w:rPr>
       </w:pPr>
-      <w:hyperlink w:anchor="_Toc242011295" w:history="1">
+      <w:hyperlink w:anchor="_Toc242013168" w:history="1">
         <w:r>
           <w:rPr>
             <w:rStyle w:val="Hyperlink"/>
@@ -4180,7 +4384,7 @@
             <w:noProof/>
             <w:webHidden/>
           </w:rPr>
-          <w:instrText xml:space="preserve"> PAGEREF _Toc242011295 \h </w:instrText>
+          <w:instrText xml:space="preserve"> PAGEREF _Toc242013168 \h </w:instrText>
         </w:r>
         <w:r>
           <w:rPr>
@@ -4200,7 +4404,7 @@
             <w:noProof/>
             <w:webHidden/>
           </w:rPr>
-          <w:t>53</w:t>
+          <w:t>56</w:t>
         </w:r>
         <w:r>
           <w:rPr>
@@ -4221,7 +4425,7 @@
         <w:pStyle w:val="Heading1"/>
         <w:pageBreakBefore/>
       </w:pPr>
-      <w:bookmarkStart w:id="0" w:name="_Toc242011239"/>
+      <w:bookmarkStart w:id="0" w:name="_Toc242013109"/>
       <w:r>
         <w:lastRenderedPageBreak/>
         <w:t>Welcome</w:t>
@@ -4237,7 +4441,7 @@
       <w:pPr>
         <w:pStyle w:val="Heading2"/>
       </w:pPr>
-      <w:bookmarkStart w:id="1" w:name="_Toc242011240"/>
+      <w:bookmarkStart w:id="1" w:name="_Toc242013110"/>
       <w:r>
         <w:t>How a sale moves through the app</w:t>
       </w:r>
@@ -4720,7 +4924,7 @@
       <w:pPr>
         <w:pStyle w:val="Heading2"/>
       </w:pPr>
-      <w:bookmarkStart w:id="2" w:name="_Toc242011241"/>
+      <w:bookmarkStart w:id="2" w:name="_Toc242013111"/>
       <w:r>
         <w:t>What you'll need</w:t>
       </w:r>
@@ -4829,7 +5033,7 @@
         <w:pStyle w:val="Heading1"/>
         <w:pageBreakBefore/>
       </w:pPr>
-      <w:bookmarkStart w:id="3" w:name="_Toc242011242"/>
+      <w:bookmarkStart w:id="3" w:name="_Toc242013112"/>
       <w:r>
         <w:lastRenderedPageBreak/>
         <w:t>Who can do what</w:t>
@@ -5381,7 +5585,7 @@
               <w:t>permanently</w:t>
             </w:r>
             <w:r>
-              <w:t>. Only an owner can make someone else an owner.</w:t>
+              <w:t>, and exporting and restoring the whole catalog. Only an owner can make someone else an owner.</w:t>
             </w:r>
           </w:p>
         </w:tc>
@@ -5397,7 +5601,7 @@
         <w:pStyle w:val="Heading1"/>
         <w:pageBreakBefore/>
       </w:pPr>
-      <w:bookmarkStart w:id="4" w:name="_Toc242011243"/>
+      <w:bookmarkStart w:id="4" w:name="_Toc242013113"/>
       <w:r>
         <w:lastRenderedPageBreak/>
         <w:t>Getting started</w:t>
@@ -5408,7 +5612,7 @@
       <w:pPr>
         <w:pStyle w:val="Heading2"/>
       </w:pPr>
-      <w:bookmarkStart w:id="5" w:name="_Toc242011244"/>
+      <w:bookmarkStart w:id="5" w:name="_Toc242013114"/>
       <w:r>
         <w:t>Signing in</w:t>
       </w:r>
@@ -5425,7 +5629,7 @@
           <w:noProof/>
         </w:rPr>
         <w:drawing>
-          <wp:inline distT="0" distB="0" distL="0" distR="0" wp14:anchorId="261346DA" wp14:editId="4C91D955">
+          <wp:inline distT="0" distB="0" distL="0" distR="0" wp14:anchorId="25D9C2C4" wp14:editId="2E11991E">
             <wp:extent cx="3291840" cy="2211705"/>
             <wp:effectExtent l="0" t="0" r="0" b="0"/>
             <wp:docPr id="1" name="Picture 1"/>
@@ -5743,7 +5947,7 @@
       <w:pPr>
         <w:pStyle w:val="Heading2"/>
       </w:pPr>
-      <w:bookmarkStart w:id="6" w:name="_Toc242011245"/>
+      <w:bookmarkStart w:id="6" w:name="_Toc242013115"/>
       <w:r>
         <w:t>Changing your PIN</w:t>
       </w:r>
@@ -5925,7 +6129,7 @@
       <w:pPr>
         <w:pStyle w:val="Heading2"/>
       </w:pPr>
-      <w:bookmarkStart w:id="7" w:name="_Toc242011246"/>
+      <w:bookmarkStart w:id="7" w:name="_Toc242013116"/>
       <w:r>
         <w:lastRenderedPageBreak/>
         <w:t>Finding your way around</w:t>
@@ -6508,7 +6712,7 @@
       <w:pPr>
         <w:pStyle w:val="Heading2"/>
       </w:pPr>
-      <w:bookmarkStart w:id="8" w:name="_Toc242011247"/>
+      <w:bookmarkStart w:id="8" w:name="_Toc242013117"/>
       <w:r>
         <w:t>Light and dark mode</w:t>
       </w:r>
@@ -6523,7 +6727,7 @@
       <w:pPr>
         <w:pStyle w:val="Heading2"/>
       </w:pPr>
-      <w:bookmarkStart w:id="9" w:name="_Toc242011248"/>
+      <w:bookmarkStart w:id="9" w:name="_Toc242013118"/>
       <w:r>
         <w:t>Signing out</w:t>
       </w:r>
@@ -6548,7 +6752,7 @@
         <w:pStyle w:val="Heading1"/>
         <w:pageBreakBefore/>
       </w:pPr>
-      <w:bookmarkStart w:id="10" w:name="_Toc242011249"/>
+      <w:bookmarkStart w:id="10" w:name="_Toc242013119"/>
       <w:r>
         <w:lastRenderedPageBreak/>
         <w:t>Taking an order on the sales floor</w:t>
@@ -6580,7 +6784,7 @@
           <w:noProof/>
         </w:rPr>
         <w:drawing>
-          <wp:inline distT="0" distB="0" distL="0" distR="0" wp14:anchorId="124B7E4E" wp14:editId="75392371">
+          <wp:inline distT="0" distB="0" distL="0" distR="0" wp14:anchorId="742BEB69" wp14:editId="53F32157">
             <wp:extent cx="5760720" cy="3870484"/>
             <wp:effectExtent l="0" t="0" r="0" b="0"/>
             <wp:docPr id="2" name="Picture 2"/>
@@ -6705,7 +6909,7 @@
       <w:pPr>
         <w:pStyle w:val="Heading2"/>
       </w:pPr>
-      <w:bookmarkStart w:id="11" w:name="_Toc242011250"/>
+      <w:bookmarkStart w:id="11" w:name="_Toc242013120"/>
       <w:r>
         <w:t>Starting an order</w:t>
       </w:r>
@@ -6789,7 +6993,7 @@
       <w:pPr>
         <w:pStyle w:val="Heading2"/>
       </w:pPr>
-      <w:bookmarkStart w:id="12" w:name="_Toc242011251"/>
+      <w:bookmarkStart w:id="12" w:name="_Toc242013121"/>
       <w:r>
         <w:lastRenderedPageBreak/>
         <w:t>Adding items</w:t>
@@ -6938,7 +7142,7 @@
           <w:noProof/>
         </w:rPr>
         <w:drawing>
-          <wp:inline distT="0" distB="0" distL="0" distR="0" wp14:anchorId="2C118D3B" wp14:editId="3863C88E">
+          <wp:inline distT="0" distB="0" distL="0" distR="0" wp14:anchorId="3152ECBC" wp14:editId="5550B1E0">
             <wp:extent cx="5760720" cy="3870484"/>
             <wp:effectExtent l="0" t="0" r="0" b="0"/>
             <wp:docPr id="3" name="Picture 3"/>
@@ -7075,7 +7279,7 @@
           <w:noProof/>
         </w:rPr>
         <w:drawing>
-          <wp:inline distT="0" distB="0" distL="0" distR="0" wp14:anchorId="6711CB4C" wp14:editId="30B1090A">
+          <wp:inline distT="0" distB="0" distL="0" distR="0" wp14:anchorId="13C4C674" wp14:editId="7EFE0F14">
             <wp:extent cx="5760720" cy="3870484"/>
             <wp:effectExtent l="0" t="0" r="0" b="0"/>
             <wp:docPr id="4" name="Picture 4"/>
@@ -7472,7 +7676,7 @@
           <w:noProof/>
         </w:rPr>
         <w:drawing>
-          <wp:inline distT="0" distB="0" distL="0" distR="0" wp14:anchorId="12B483BA" wp14:editId="322E27CD">
+          <wp:inline distT="0" distB="0" distL="0" distR="0" wp14:anchorId="73956248" wp14:editId="44E85346">
             <wp:extent cx="5760720" cy="4545568"/>
             <wp:effectExtent l="0" t="0" r="0" b="0"/>
             <wp:docPr id="5" name="Picture 5"/>
@@ -7687,7 +7891,7 @@
           <w:noProof/>
         </w:rPr>
         <w:drawing>
-          <wp:inline distT="0" distB="0" distL="0" distR="0" wp14:anchorId="2FB9A3EA" wp14:editId="7FD20392">
+          <wp:inline distT="0" distB="0" distL="0" distR="0" wp14:anchorId="1FCF8CA8" wp14:editId="7853D5E8">
             <wp:extent cx="5486400" cy="3686175"/>
             <wp:effectExtent l="0" t="0" r="0" b="0"/>
             <wp:docPr id="6" name="Picture 6"/>
@@ -7901,7 +8105,7 @@
       <w:pPr>
         <w:pStyle w:val="Heading2"/>
       </w:pPr>
-      <w:bookmarkStart w:id="13" w:name="_Toc242011252"/>
+      <w:bookmarkStart w:id="13" w:name="_Toc242013122"/>
       <w:r>
         <w:t>Adding shipping or a service later</w:t>
       </w:r>
@@ -7942,7 +8146,7 @@
         </w:rPr>
         <w:lastRenderedPageBreak/>
         <w:drawing>
-          <wp:inline distT="0" distB="0" distL="0" distR="0" wp14:anchorId="36E007C1" wp14:editId="4B963993">
+          <wp:inline distT="0" distB="0" distL="0" distR="0" wp14:anchorId="43420D0F" wp14:editId="57FBC1F4">
             <wp:extent cx="4754880" cy="3194685"/>
             <wp:effectExtent l="0" t="0" r="0" b="0"/>
             <wp:docPr id="7" name="Picture 7"/>
@@ -7996,7 +8200,7 @@
       <w:pPr>
         <w:pStyle w:val="Heading2"/>
       </w:pPr>
-      <w:bookmarkStart w:id="14" w:name="_Toc242011253"/>
+      <w:bookmarkStart w:id="14" w:name="_Toc242013123"/>
       <w:r>
         <w:t>Changing or removing an item</w:t>
       </w:r>
@@ -8170,7 +8374,7 @@
       <w:pPr>
         <w:pStyle w:val="Heading2"/>
       </w:pPr>
-      <w:bookmarkStart w:id="15" w:name="_Toc242011254"/>
+      <w:bookmarkStart w:id="15" w:name="_Toc242013124"/>
       <w:r>
         <w:t>Customer details</w:t>
       </w:r>
@@ -8334,7 +8538,7 @@
           <w:noProof/>
         </w:rPr>
         <w:drawing>
-          <wp:inline distT="0" distB="0" distL="0" distR="0" wp14:anchorId="5D2B9AA9" wp14:editId="6CD93290">
+          <wp:inline distT="0" distB="0" distL="0" distR="0" wp14:anchorId="704C8EBF" wp14:editId="440D1ED0">
             <wp:extent cx="4754880" cy="3194685"/>
             <wp:effectExtent l="0" t="0" r="0" b="0"/>
             <wp:docPr id="8" name="Picture 8"/>
@@ -8388,7 +8592,7 @@
       <w:pPr>
         <w:pStyle w:val="Heading2"/>
       </w:pPr>
-      <w:bookmarkStart w:id="16" w:name="_Toc242011255"/>
+      <w:bookmarkStart w:id="16" w:name="_Toc242013125"/>
       <w:r>
         <w:t>Sending the order to checkout</w:t>
       </w:r>
@@ -8566,7 +8770,7 @@
       <w:pPr>
         <w:pStyle w:val="Heading2"/>
       </w:pPr>
-      <w:bookmarkStart w:id="17" w:name="_Toc242011256"/>
+      <w:bookmarkStart w:id="17" w:name="_Toc242013126"/>
       <w:r>
         <w:lastRenderedPageBreak/>
         <w:t>Using a phone</w:t>
@@ -8584,7 +8788,7 @@
           <w:noProof/>
         </w:rPr>
         <w:drawing>
-          <wp:inline distT="0" distB="0" distL="0" distR="0" wp14:anchorId="6375B11A" wp14:editId="351816C6">
+          <wp:inline distT="0" distB="0" distL="0" distR="0" wp14:anchorId="4663DAEB" wp14:editId="7FD23C8A">
             <wp:extent cx="2194560" cy="4749253"/>
             <wp:effectExtent l="0" t="0" r="0" b="0"/>
             <wp:docPr id="9" name="Picture 9"/>
@@ -8662,7 +8866,7 @@
         <w:pStyle w:val="Heading1"/>
         <w:pageBreakBefore/>
       </w:pPr>
-      <w:bookmarkStart w:id="18" w:name="_Toc242011257"/>
+      <w:bookmarkStart w:id="18" w:name="_Toc242013127"/>
       <w:r>
         <w:lastRenderedPageBreak/>
         <w:t>Checking out a customer</w:t>
@@ -8703,7 +8907,7 @@
           <w:noProof/>
         </w:rPr>
         <w:drawing>
-          <wp:inline distT="0" distB="0" distL="0" distR="0" wp14:anchorId="782E8C15" wp14:editId="2CC0FFE2">
+          <wp:inline distT="0" distB="0" distL="0" distR="0" wp14:anchorId="3F696BCD" wp14:editId="4A596014">
             <wp:extent cx="5760720" cy="3870484"/>
             <wp:effectExtent l="0" t="0" r="0" b="0"/>
             <wp:docPr id="10" name="Picture 10"/>
@@ -8757,7 +8961,7 @@
       <w:pPr>
         <w:pStyle w:val="Heading2"/>
       </w:pPr>
-      <w:bookmarkStart w:id="19" w:name="_Toc242011258"/>
+      <w:bookmarkStart w:id="19" w:name="_Toc242013128"/>
       <w:r>
         <w:t>1. Review the order with the customer</w:t>
       </w:r>
@@ -8854,7 +9058,7 @@
       <w:pPr>
         <w:pStyle w:val="Heading2"/>
       </w:pPr>
-      <w:bookmarkStart w:id="20" w:name="_Toc242011259"/>
+      <w:bookmarkStart w:id="20" w:name="_Toc242013129"/>
       <w:r>
         <w:t>2. Take payment</w:t>
       </w:r>
@@ -9168,7 +9372,7 @@
       <w:pPr>
         <w:pStyle w:val="Heading2"/>
       </w:pPr>
-      <w:bookmarkStart w:id="21" w:name="_Toc242011260"/>
+      <w:bookmarkStart w:id="21" w:name="_Toc242013130"/>
       <w:r>
         <w:t>3. Acknowledgements (initials and signature)</w:t>
       </w:r>
@@ -9350,7 +9554,7 @@
         </w:rPr>
         <w:lastRenderedPageBreak/>
         <w:drawing>
-          <wp:inline distT="0" distB="0" distL="0" distR="0" wp14:anchorId="03255D7E" wp14:editId="4B805CD3">
+          <wp:inline distT="0" distB="0" distL="0" distR="0" wp14:anchorId="61C7B97A" wp14:editId="462371D5">
             <wp:extent cx="4937760" cy="3317558"/>
             <wp:effectExtent l="0" t="0" r="0" b="0"/>
             <wp:docPr id="11" name="Picture 11"/>
@@ -9539,7 +9743,7 @@
       <w:pPr>
         <w:pStyle w:val="Heading2"/>
       </w:pPr>
-      <w:bookmarkStart w:id="22" w:name="_Toc242011261"/>
+      <w:bookmarkStart w:id="22" w:name="_Toc242013131"/>
       <w:r>
         <w:t>4. Complete the sale</w:t>
       </w:r>
@@ -9770,7 +9974,7 @@
       <w:pPr>
         <w:pStyle w:val="Heading2"/>
       </w:pPr>
-      <w:bookmarkStart w:id="23" w:name="_Toc242011262"/>
+      <w:bookmarkStart w:id="23" w:name="_Toc242013132"/>
       <w:r>
         <w:t>Other checkout actions</w:t>
       </w:r>
@@ -9980,7 +10184,7 @@
         <w:pStyle w:val="Heading1"/>
         <w:pageBreakBefore/>
       </w:pPr>
-      <w:bookmarkStart w:id="24" w:name="_Toc242011263"/>
+      <w:bookmarkStart w:id="24" w:name="_Toc242013133"/>
       <w:r>
         <w:lastRenderedPageBreak/>
         <w:t>The sales sheet</w:t>
@@ -10003,7 +10207,7 @@
           <w:noProof/>
         </w:rPr>
         <w:drawing>
-          <wp:inline distT="0" distB="0" distL="0" distR="0" wp14:anchorId="1675F162" wp14:editId="45BA0834">
+          <wp:inline distT="0" distB="0" distL="0" distR="0" wp14:anchorId="58D2E386" wp14:editId="2D6F8225">
             <wp:extent cx="4023360" cy="3187256"/>
             <wp:effectExtent l="0" t="0" r="0" b="0"/>
             <wp:docPr id="12" name="Picture 12"/>
@@ -10171,7 +10375,7 @@
       <w:pPr>
         <w:pStyle w:val="Heading2"/>
       </w:pPr>
-      <w:bookmarkStart w:id="25" w:name="_Toc242011264"/>
+      <w:bookmarkStart w:id="25" w:name="_Toc242013134"/>
       <w:r>
         <w:t>Emailing a receipt</w:t>
       </w:r>
@@ -10299,7 +10503,7 @@
         </w:rPr>
         <w:lastRenderedPageBreak/>
         <w:drawing>
-          <wp:inline distT="0" distB="0" distL="0" distR="0" wp14:anchorId="0CD9974C" wp14:editId="128E0160">
+          <wp:inline distT="0" distB="0" distL="0" distR="0" wp14:anchorId="29E07F96" wp14:editId="248B7589">
             <wp:extent cx="4572000" cy="3071812"/>
             <wp:effectExtent l="0" t="0" r="0" b="0"/>
             <wp:docPr id="13" name="Picture 13"/>
@@ -10760,7 +10964,7 @@
         <w:pStyle w:val="Heading1"/>
         <w:pageBreakBefore/>
       </w:pPr>
-      <w:bookmarkStart w:id="26" w:name="_Toc242011265"/>
+      <w:bookmarkStart w:id="26" w:name="_Toc242013135"/>
       <w:r>
         <w:lastRenderedPageBreak/>
         <w:t>Looking up orders</w:t>
@@ -10792,7 +10996,7 @@
           <w:noProof/>
         </w:rPr>
         <w:drawing>
-          <wp:inline distT="0" distB="0" distL="0" distR="0" wp14:anchorId="6CD76D47" wp14:editId="1F883FD8">
+          <wp:inline distT="0" distB="0" distL="0" distR="0" wp14:anchorId="1528CCA8" wp14:editId="5940123C">
             <wp:extent cx="5760720" cy="3870484"/>
             <wp:effectExtent l="0" t="0" r="0" b="0"/>
             <wp:docPr id="14" name="Picture 14"/>
@@ -10912,7 +11116,7 @@
       <w:pPr>
         <w:pStyle w:val="Heading2"/>
       </w:pPr>
-      <w:bookmarkStart w:id="27" w:name="_Toc242011266"/>
+      <w:bookmarkStart w:id="27" w:name="_Toc242013136"/>
       <w:r>
         <w:t>Extra options for admins</w:t>
       </w:r>
@@ -11002,7 +11206,7 @@
         </w:rPr>
         <w:lastRenderedPageBreak/>
         <w:drawing>
-          <wp:inline distT="0" distB="0" distL="0" distR="0" wp14:anchorId="49060F78" wp14:editId="088C4BCF">
+          <wp:inline distT="0" distB="0" distL="0" distR="0" wp14:anchorId="0A087366" wp14:editId="013FBD3E">
             <wp:extent cx="4754880" cy="3194685"/>
             <wp:effectExtent l="0" t="0" r="0" b="0"/>
             <wp:docPr id="15" name="Picture 15"/>
@@ -11124,7 +11328,7 @@
         <w:pStyle w:val="Heading1"/>
         <w:pageBreakBefore/>
       </w:pPr>
-      <w:bookmarkStart w:id="28" w:name="_Toc242011267"/>
+      <w:bookmarkStart w:id="28" w:name="_Toc242013137"/>
       <w:r>
         <w:lastRenderedPageBreak/>
         <w:t>The dashboard</w:t>
@@ -11188,7 +11392,7 @@
           <w:noProof/>
         </w:rPr>
         <w:drawing>
-          <wp:inline distT="0" distB="0" distL="0" distR="0" wp14:anchorId="0944F62E" wp14:editId="35A4FC1B">
+          <wp:inline distT="0" distB="0" distL="0" distR="0" wp14:anchorId="054B94F2" wp14:editId="3F9DBBD7">
             <wp:extent cx="4937760" cy="4305110"/>
             <wp:effectExtent l="0" t="0" r="0" b="0"/>
             <wp:docPr id="16" name="Picture 16"/>
@@ -11843,7 +12047,7 @@
         <w:pStyle w:val="Heading1"/>
         <w:pageBreakBefore/>
       </w:pPr>
-      <w:bookmarkStart w:id="29" w:name="_Toc242011268"/>
+      <w:bookmarkStart w:id="29" w:name="_Toc242013138"/>
       <w:r>
         <w:lastRenderedPageBreak/>
         <w:t>Keeping inventory</w:t>
@@ -11902,7 +12106,7 @@
           <w:noProof/>
         </w:rPr>
         <w:drawing>
-          <wp:inline distT="0" distB="0" distL="0" distR="0" wp14:anchorId="156876E5" wp14:editId="63A5F5EC">
+          <wp:inline distT="0" distB="0" distL="0" distR="0" wp14:anchorId="213C07B9" wp14:editId="17010BEB">
             <wp:extent cx="5760720" cy="3870484"/>
             <wp:effectExtent l="0" t="0" r="0" b="0"/>
             <wp:docPr id="17" name="Picture 17"/>
@@ -11956,7 +12160,7 @@
       <w:pPr>
         <w:pStyle w:val="Heading2"/>
       </w:pPr>
-      <w:bookmarkStart w:id="30" w:name="_Toc242011269"/>
+      <w:bookmarkStart w:id="30" w:name="_Toc242013139"/>
       <w:r>
         <w:t>What's on the screen</w:t>
       </w:r>
@@ -12064,7 +12268,7 @@
         </w:rPr>
         <w:lastRenderedPageBreak/>
         <w:drawing>
-          <wp:inline distT="0" distB="0" distL="0" distR="0" wp14:anchorId="70D84A8E" wp14:editId="34B11209">
+          <wp:inline distT="0" distB="0" distL="0" distR="0" wp14:anchorId="1E32E355" wp14:editId="2147E6C2">
             <wp:extent cx="5120640" cy="2295459"/>
             <wp:effectExtent l="0" t="0" r="0" b="0"/>
             <wp:docPr id="18" name="Picture 18"/>
@@ -12189,7 +12393,7 @@
       <w:pPr>
         <w:pStyle w:val="Heading2"/>
       </w:pPr>
-      <w:bookmarkStart w:id="31" w:name="_Toc242011270"/>
+      <w:bookmarkStart w:id="31" w:name="_Toc242013140"/>
       <w:r>
         <w:t>Updating a count</w:t>
       </w:r>
@@ -12266,7 +12470,7 @@
         </w:rPr>
         <w:lastRenderedPageBreak/>
         <w:drawing>
-          <wp:inline distT="0" distB="0" distL="0" distR="0" wp14:anchorId="080DC534" wp14:editId="13531EE1">
+          <wp:inline distT="0" distB="0" distL="0" distR="0" wp14:anchorId="5E6C60C3" wp14:editId="7EC91332">
             <wp:extent cx="5120640" cy="3440430"/>
             <wp:effectExtent l="0" t="0" r="0" b="0"/>
             <wp:docPr id="19" name="Picture 19"/>
@@ -12320,7 +12524,7 @@
       <w:pPr>
         <w:pStyle w:val="Heading2"/>
       </w:pPr>
-      <w:bookmarkStart w:id="32" w:name="_Toc242011271"/>
+      <w:bookmarkStart w:id="32" w:name="_Toc242013141"/>
       <w:r>
         <w:t>What changes the count automatically</w:t>
       </w:r>
@@ -12724,7 +12928,7 @@
       <w:pPr>
         <w:pStyle w:val="Heading2"/>
       </w:pPr>
-      <w:bookmarkStart w:id="33" w:name="_Toc242011272"/>
+      <w:bookmarkStart w:id="33" w:name="_Toc242013142"/>
       <w:r>
         <w:t>Seeing the history</w:t>
       </w:r>
@@ -12739,7 +12943,7 @@
       <w:pPr>
         <w:pStyle w:val="Heading2"/>
       </w:pPr>
-      <w:bookmarkStart w:id="34" w:name="_Toc242011273"/>
+      <w:bookmarkStart w:id="34" w:name="_Toc242013143"/>
       <w:r>
         <w:lastRenderedPageBreak/>
         <w:t>Notes for the inventory sheet</w:t>
@@ -12789,7 +12993,7 @@
           <w:noProof/>
         </w:rPr>
         <w:drawing>
-          <wp:inline distT="0" distB="0" distL="0" distR="0" wp14:anchorId="76D4600C" wp14:editId="4C75A30C">
+          <wp:inline distT="0" distB="0" distL="0" distR="0" wp14:anchorId="02F256C2" wp14:editId="25F7120A">
             <wp:extent cx="5120640" cy="3440430"/>
             <wp:effectExtent l="0" t="0" r="0" b="0"/>
             <wp:docPr id="20" name="Picture 20"/>
@@ -12843,7 +13047,7 @@
       <w:pPr>
         <w:pStyle w:val="Heading2"/>
       </w:pPr>
-      <w:bookmarkStart w:id="35" w:name="_Toc242011274"/>
+      <w:bookmarkStart w:id="35" w:name="_Toc242013144"/>
       <w:r>
         <w:t>Start and end counts</w:t>
       </w:r>
@@ -13367,7 +13571,7 @@
           <w:noProof/>
         </w:rPr>
         <w:drawing>
-          <wp:inline distT="0" distB="0" distL="0" distR="0" wp14:anchorId="57FCD268" wp14:editId="1920D1D3">
+          <wp:inline distT="0" distB="0" distL="0" distR="0" wp14:anchorId="127BE101" wp14:editId="3573A5E7">
             <wp:extent cx="5486400" cy="3686175"/>
             <wp:effectExtent l="0" t="0" r="0" b="0"/>
             <wp:docPr id="21" name="Picture 21"/>
@@ -13507,7 +13711,7 @@
         <w:pStyle w:val="Heading1"/>
         <w:pageBreakBefore/>
       </w:pPr>
-      <w:bookmarkStart w:id="36" w:name="_Toc242011275"/>
+      <w:bookmarkStart w:id="36" w:name="_Toc242013145"/>
       <w:r>
         <w:lastRenderedPageBreak/>
         <w:t>Admin: setting up an event</w:t>
@@ -13532,7 +13736,7 @@
       <w:pPr>
         <w:pStyle w:val="Heading2"/>
       </w:pPr>
-      <w:bookmarkStart w:id="37" w:name="_Toc242011276"/>
+      <w:bookmarkStart w:id="37" w:name="_Toc242013146"/>
       <w:r>
         <w:t>Creating or editing an event</w:t>
       </w:r>
@@ -13549,7 +13753,7 @@
           <w:noProof/>
         </w:rPr>
         <w:drawing>
-          <wp:inline distT="0" distB="0" distL="0" distR="0" wp14:anchorId="1B1E50AA" wp14:editId="75094865">
+          <wp:inline distT="0" distB="0" distL="0" distR="0" wp14:anchorId="30B04DC9" wp14:editId="76A4DAB4">
             <wp:extent cx="5760720" cy="1134142"/>
             <wp:effectExtent l="0" t="0" r="0" b="0"/>
             <wp:docPr id="22" name="Picture 22"/>
@@ -13898,7 +14102,7 @@
           <w:noProof/>
         </w:rPr>
         <w:drawing>
-          <wp:inline distT="0" distB="0" distL="0" distR="0" wp14:anchorId="002B4534" wp14:editId="170A8EC5">
+          <wp:inline distT="0" distB="0" distL="0" distR="0" wp14:anchorId="2D671E8F" wp14:editId="680C0E77">
             <wp:extent cx="3840480" cy="2580322"/>
             <wp:effectExtent l="0" t="0" r="0" b="0"/>
             <wp:docPr id="23" name="Picture 23"/>
@@ -14020,7 +14224,7 @@
       <w:pPr>
         <w:pStyle w:val="Heading2"/>
       </w:pPr>
-      <w:bookmarkStart w:id="38" w:name="_Toc242011277"/>
+      <w:bookmarkStart w:id="38" w:name="_Toc242013147"/>
       <w:r>
         <w:t>Closing out an event</w:t>
       </w:r>
@@ -14187,7 +14391,7 @@
       <w:pPr>
         <w:pStyle w:val="Heading2"/>
       </w:pPr>
-      <w:bookmarkStart w:id="39" w:name="_Toc242011278"/>
+      <w:bookmarkStart w:id="39" w:name="_Toc242013148"/>
       <w:r>
         <w:t>Event sales sheets</w:t>
       </w:r>
@@ -14245,7 +14449,7 @@
           <w:noProof/>
         </w:rPr>
         <w:drawing>
-          <wp:inline distT="0" distB="0" distL="0" distR="0" wp14:anchorId="0B13DBDC" wp14:editId="13E642EC">
+          <wp:inline distT="0" distB="0" distL="0" distR="0" wp14:anchorId="3193E61D" wp14:editId="11EFBC2E">
             <wp:extent cx="4389120" cy="2948940"/>
             <wp:effectExtent l="0" t="0" r="0" b="0"/>
             <wp:docPr id="24" name="Picture 24"/>
@@ -14374,7 +14578,7 @@
           <w:noProof/>
         </w:rPr>
         <w:drawing>
-          <wp:inline distT="0" distB="0" distL="0" distR="0" wp14:anchorId="03A22605" wp14:editId="7E994205">
+          <wp:inline distT="0" distB="0" distL="0" distR="0" wp14:anchorId="3512FBCA" wp14:editId="34524E5F">
             <wp:extent cx="4206240" cy="5717858"/>
             <wp:effectExtent l="0" t="0" r="0" b="0"/>
             <wp:docPr id="25" name="Picture 25"/>
@@ -14512,7 +14716,7 @@
           <w:noProof/>
         </w:rPr>
         <w:drawing>
-          <wp:inline distT="0" distB="0" distL="0" distR="0" wp14:anchorId="5886B2A8" wp14:editId="4280B837">
+          <wp:inline distT="0" distB="0" distL="0" distR="0" wp14:anchorId="5495721F" wp14:editId="0447E06A">
             <wp:extent cx="4389120" cy="2948940"/>
             <wp:effectExtent l="0" t="0" r="0" b="0"/>
             <wp:docPr id="26" name="Picture 26"/>
@@ -14625,7 +14829,7 @@
         <w:pStyle w:val="Heading1"/>
         <w:pageBreakBefore/>
       </w:pPr>
-      <w:bookmarkStart w:id="40" w:name="_Toc242011279"/>
+      <w:bookmarkStart w:id="40" w:name="_Toc242013149"/>
       <w:r>
         <w:lastRenderedPageBreak/>
         <w:t>Admin: managing the catalog</w:t>
@@ -14666,7 +14870,7 @@
           <w:noProof/>
         </w:rPr>
         <w:drawing>
-          <wp:inline distT="0" distB="0" distL="0" distR="0" wp14:anchorId="5F27E002" wp14:editId="17C99840">
+          <wp:inline distT="0" distB="0" distL="0" distR="0" wp14:anchorId="5478EB1E" wp14:editId="3DE0C8F9">
             <wp:extent cx="5760720" cy="3870484"/>
             <wp:effectExtent l="0" t="0" r="0" b="0"/>
             <wp:docPr id="27" name="Picture 27"/>
@@ -14720,7 +14924,7 @@
       <w:pPr>
         <w:pStyle w:val="Heading2"/>
       </w:pPr>
-      <w:bookmarkStart w:id="41" w:name="_Toc242011280"/>
+      <w:bookmarkStart w:id="41" w:name="_Toc242013150"/>
       <w:r>
         <w:lastRenderedPageBreak/>
         <w:t>Adding or editing a product</w:t>
@@ -14738,7 +14942,7 @@
           <w:noProof/>
         </w:rPr>
         <w:drawing>
-          <wp:inline distT="0" distB="0" distL="0" distR="0" wp14:anchorId="2BE29BD4" wp14:editId="2F80DFEB">
+          <wp:inline distT="0" distB="0" distL="0" distR="0" wp14:anchorId="738AC196" wp14:editId="2D317C1F">
             <wp:extent cx="5486400" cy="3686175"/>
             <wp:effectExtent l="0" t="0" r="0" b="0"/>
             <wp:docPr id="28" name="Picture 28"/>
@@ -15205,7 +15409,7 @@
         </w:rPr>
         <w:lastRenderedPageBreak/>
         <w:drawing>
-          <wp:inline distT="0" distB="0" distL="0" distR="0" wp14:anchorId="7E1B1448" wp14:editId="6FE60D28">
+          <wp:inline distT="0" distB="0" distL="0" distR="0" wp14:anchorId="5E738900" wp14:editId="115BB9BE">
             <wp:extent cx="5120640" cy="2130933"/>
             <wp:effectExtent l="0" t="0" r="0" b="0"/>
             <wp:docPr id="29" name="Picture 29"/>
@@ -15386,7 +15590,7 @@
           <w:noProof/>
         </w:rPr>
         <w:drawing>
-          <wp:inline distT="0" distB="0" distL="0" distR="0" wp14:anchorId="6793B33C" wp14:editId="285000CE">
+          <wp:inline distT="0" distB="0" distL="0" distR="0" wp14:anchorId="06F1615A" wp14:editId="75307D6D">
             <wp:extent cx="5486400" cy="3686175"/>
             <wp:effectExtent l="0" t="0" r="0" b="0"/>
             <wp:docPr id="30" name="Picture 30"/>
@@ -15588,7 +15792,7 @@
           <w:noProof/>
         </w:rPr>
         <w:drawing>
-          <wp:inline distT="0" distB="0" distL="0" distR="0" wp14:anchorId="203BA9EB" wp14:editId="2BF25000">
+          <wp:inline distT="0" distB="0" distL="0" distR="0" wp14:anchorId="6048C697" wp14:editId="62F782C5">
             <wp:extent cx="5486400" cy="3686175"/>
             <wp:effectExtent l="0" t="0" r="0" b="0"/>
             <wp:docPr id="31" name="Picture 31"/>
@@ -15845,7 +16049,7 @@
       <w:pPr>
         <w:pStyle w:val="Heading2"/>
       </w:pPr>
-      <w:bookmarkStart w:id="42" w:name="_Toc242011281"/>
+      <w:bookmarkStart w:id="42" w:name="_Toc242013151"/>
       <w:r>
         <w:t>Delivery and services</w:t>
       </w:r>
@@ -15876,7 +16080,7 @@
           <w:noProof/>
         </w:rPr>
         <w:drawing>
-          <wp:inline distT="0" distB="0" distL="0" distR="0" wp14:anchorId="09F3C940" wp14:editId="687C4708">
+          <wp:inline distT="0" distB="0" distL="0" distR="0" wp14:anchorId="4C609954" wp14:editId="30E71C95">
             <wp:extent cx="5760720" cy="3870484"/>
             <wp:effectExtent l="0" t="0" r="0" b="0"/>
             <wp:docPr id="32" name="Picture 32"/>
@@ -16307,7 +16511,7 @@
         <w:pStyle w:val="Heading1"/>
         <w:pageBreakBefore/>
       </w:pPr>
-      <w:bookmarkStart w:id="43" w:name="_Toc242011282"/>
+      <w:bookmarkStart w:id="43" w:name="_Toc242013152"/>
       <w:r>
         <w:lastRenderedPageBreak/>
         <w:t>Admin: managing the crew</w:t>
@@ -16339,7 +16543,7 @@
           <w:noProof/>
         </w:rPr>
         <w:drawing>
-          <wp:inline distT="0" distB="0" distL="0" distR="0" wp14:anchorId="02BDF33F" wp14:editId="4C297C98">
+          <wp:inline distT="0" distB="0" distL="0" distR="0" wp14:anchorId="2D405DA4" wp14:editId="19552A6E">
             <wp:extent cx="5760720" cy="1935242"/>
             <wp:effectExtent l="0" t="0" r="0" b="0"/>
             <wp:docPr id="33" name="Picture 33"/>
@@ -16611,7 +16815,7 @@
           <w:noProof/>
         </w:rPr>
         <w:drawing>
-          <wp:inline distT="0" distB="0" distL="0" distR="0" wp14:anchorId="6E9DC2B6" wp14:editId="3543BBC0">
+          <wp:inline distT="0" distB="0" distL="0" distR="0" wp14:anchorId="73498D3B" wp14:editId="67BC1761">
             <wp:extent cx="4023360" cy="2703195"/>
             <wp:effectExtent l="0" t="0" r="0" b="0"/>
             <wp:docPr id="34" name="Picture 34"/>
@@ -16691,7 +16895,7 @@
         <w:pStyle w:val="Heading1"/>
         <w:pageBreakBefore/>
       </w:pPr>
-      <w:bookmarkStart w:id="44" w:name="_Toc242011283"/>
+      <w:bookmarkStart w:id="44" w:name="_Toc242013153"/>
       <w:r>
         <w:lastRenderedPageBreak/>
         <w:t>Admin: settings</w:t>
@@ -16761,7 +16965,7 @@
       <w:pPr>
         <w:pStyle w:val="Heading2"/>
       </w:pPr>
-      <w:bookmarkStart w:id="45" w:name="_Toc242011284"/>
+      <w:bookmarkStart w:id="45" w:name="_Toc242013154"/>
       <w:r>
         <w:t>Business details</w:t>
       </w:r>
@@ -16778,7 +16982,7 @@
           <w:noProof/>
         </w:rPr>
         <w:drawing>
-          <wp:inline distT="0" distB="0" distL="0" distR="0" wp14:anchorId="02868381" wp14:editId="7D6F9BAA">
+          <wp:inline distT="0" distB="0" distL="0" distR="0" wp14:anchorId="35D9C353" wp14:editId="7E270DE2">
             <wp:extent cx="5760720" cy="1429893"/>
             <wp:effectExtent l="0" t="0" r="0" b="0"/>
             <wp:docPr id="35" name="Picture 35"/>
@@ -17142,7 +17346,7 @@
       <w:pPr>
         <w:pStyle w:val="Heading2"/>
       </w:pPr>
-      <w:bookmarkStart w:id="46" w:name="_Toc242011285"/>
+      <w:bookmarkStart w:id="46" w:name="_Toc242013155"/>
       <w:r>
         <w:t>Sales sheet terms</w:t>
       </w:r>
@@ -17165,7 +17369,7 @@
         </w:rPr>
         <w:lastRenderedPageBreak/>
         <w:drawing>
-          <wp:inline distT="0" distB="0" distL="0" distR="0" wp14:anchorId="3DB3C49E" wp14:editId="348AB58B">
+          <wp:inline distT="0" distB="0" distL="0" distR="0" wp14:anchorId="3B4C82ED" wp14:editId="01478043">
             <wp:extent cx="5760720" cy="4937760"/>
             <wp:effectExtent l="0" t="0" r="0" b="0"/>
             <wp:docPr id="36" name="Picture 36"/>
@@ -17538,7 +17742,7 @@
       <w:pPr>
         <w:pStyle w:val="Heading2"/>
       </w:pPr>
-      <w:bookmarkStart w:id="47" w:name="_Toc242011286"/>
+      <w:bookmarkStart w:id="47" w:name="_Toc242013156"/>
       <w:r>
         <w:t>Receipt email</w:t>
       </w:r>
@@ -17560,7 +17764,7 @@
           <w:noProof/>
         </w:rPr>
         <w:drawing>
-          <wp:inline distT="0" distB="0" distL="0" distR="0" wp14:anchorId="48636EA9" wp14:editId="29992914">
+          <wp:inline distT="0" distB="0" distL="0" distR="0" wp14:anchorId="2F104CBA" wp14:editId="1F5C52DE">
             <wp:extent cx="5760720" cy="4454271"/>
             <wp:effectExtent l="0" t="0" r="0" b="0"/>
             <wp:docPr id="37" name="Picture 37"/>
@@ -18537,7 +18741,7 @@
       <w:pPr>
         <w:pStyle w:val="Heading2"/>
       </w:pPr>
-      <w:bookmarkStart w:id="48" w:name="_Toc242011287"/>
+      <w:bookmarkStart w:id="48" w:name="_Toc242013157"/>
       <w:r>
         <w:t>New events</w:t>
       </w:r>
@@ -18554,7 +18758,7 @@
           <w:noProof/>
         </w:rPr>
         <w:drawing>
-          <wp:inline distT="0" distB="0" distL="0" distR="0" wp14:anchorId="73C9BC61" wp14:editId="1D4CC675">
+          <wp:inline distT="0" distB="0" distL="0" distR="0" wp14:anchorId="33E3BEB7" wp14:editId="43184D2E">
             <wp:extent cx="5760720" cy="1512189"/>
             <wp:effectExtent l="0" t="0" r="0" b="0"/>
             <wp:docPr id="38" name="Picture 38"/>
@@ -18632,7 +18836,7 @@
       <w:pPr>
         <w:pStyle w:val="Heading2"/>
       </w:pPr>
-      <w:bookmarkStart w:id="49" w:name="_Toc242011288"/>
+      <w:bookmarkStart w:id="49" w:name="_Toc242013158"/>
       <w:r>
         <w:t>Dashboard</w:t>
       </w:r>
@@ -18649,7 +18853,7 @@
           <w:noProof/>
         </w:rPr>
         <w:drawing>
-          <wp:inline distT="0" distB="0" distL="0" distR="0" wp14:anchorId="25663BAA" wp14:editId="5E0BB555">
+          <wp:inline distT="0" distB="0" distL="0" distR="0" wp14:anchorId="1655C5FA" wp14:editId="7398C4F5">
             <wp:extent cx="5760720" cy="1594485"/>
             <wp:effectExtent l="0" t="0" r="0" b="0"/>
             <wp:docPr id="39" name="Picture 39"/>
@@ -18979,7 +19183,7 @@
         <w:pStyle w:val="Heading1"/>
         <w:pageBreakBefore/>
       </w:pPr>
-      <w:bookmarkStart w:id="50" w:name="_Toc242011289"/>
+      <w:bookmarkStart w:id="50" w:name="_Toc242013159"/>
       <w:r>
         <w:lastRenderedPageBreak/>
         <w:t>Owner: permanent deletes</w:t>
@@ -19020,7 +19224,7 @@
           <w:noProof/>
         </w:rPr>
         <w:drawing>
-          <wp:inline distT="0" distB="0" distL="0" distR="0" wp14:anchorId="02387026" wp14:editId="4A33155B">
+          <wp:inline distT="0" distB="0" distL="0" distR="0" wp14:anchorId="46C8F399" wp14:editId="26361385">
             <wp:extent cx="4754880" cy="3312709"/>
             <wp:effectExtent l="0" t="0" r="0" b="0"/>
             <wp:docPr id="40" name="Picture 40"/>
@@ -19684,433 +19888,94 @@
         <w:pStyle w:val="Heading1"/>
         <w:pageBreakBefore/>
       </w:pPr>
-      <w:bookmarkStart w:id="51" w:name="_Toc242011290"/>
+      <w:bookmarkStart w:id="51" w:name="_Toc242013160"/>
       <w:r>
         <w:lastRenderedPageBreak/>
-        <w:t>Tips and troubleshooting</w:t>
+        <w:t>Owner: backing up and restoring the catalog</w:t>
       </w:r>
       <w:bookmarkEnd w:id="51"/>
     </w:p>
     <w:p>
       <w:r>
-        <w:t xml:space="preserve">If the tablet loses touch with the server (usually the Wi-Fi dropping out), an amber strip appears under the menu: </w:t>
-      </w:r>
-      <w:r>
-        <w:rPr>
-          <w:b/>
-        </w:rPr>
-        <w:t>Can't reach the server - retrying</w:t>
-      </w:r>
-      <w:r>
-        <w:t xml:space="preserve">. Anything you change while it's showing won't save. You can still move between screens, and the strip disappears on its own, with a </w:t>
-      </w:r>
-      <w:r>
-        <w:rPr>
-          <w:b/>
-        </w:rPr>
-        <w:t>Reconnected</w:t>
-      </w:r>
-      <w:r>
-        <w:t xml:space="preserve"> message, once the server answers again.</w:t>
-      </w:r>
-    </w:p>
-    <w:p>
-      <w:pPr>
-        <w:pStyle w:val="Heading3"/>
-      </w:pPr>
-      <w:r>
-        <w:t>I can't start a new order.</w:t>
-      </w:r>
-    </w:p>
-    <w:p>
-      <w:r>
-        <w:t xml:space="preserve">No event is active. An administrator needs to open </w:t>
-      </w:r>
-      <w:r>
-        <w:rPr>
-          <w:b/>
-        </w:rPr>
-        <w:t>Events</w:t>
-      </w:r>
-      <w:r>
-        <w:t xml:space="preserve">, edit the fundraiser and tick </w:t>
-      </w:r>
-      <w:r>
-        <w:rPr>
-          <w:b/>
-        </w:rPr>
-        <w:t>Active event</w:t>
-      </w:r>
-      <w:r>
-        <w:t>.</w:t>
-      </w:r>
-    </w:p>
-    <w:p>
-      <w:pPr>
-        <w:pStyle w:val="Heading3"/>
-      </w:pPr>
-      <w:r>
-        <w:t>The Complete button is greyed out.</w:t>
-      </w:r>
-    </w:p>
-    <w:p>
-      <w:r>
-        <w:t>The order needs at least one item and the customer's name.</w:t>
-      </w:r>
-    </w:p>
-    <w:p>
-      <w:pPr>
-        <w:pStyle w:val="Heading3"/>
-      </w:pPr>
-      <w:r>
-        <w:t>The card fee showed up on the total.</w:t>
-      </w:r>
-    </w:p>
-    <w:p>
-      <w:r>
-        <w:t xml:space="preserve">That's expected when </w:t>
-      </w:r>
-      <w:r>
-        <w:rPr>
-          <w:b/>
-        </w:rPr>
-        <w:t>Credit/Debit Card</w:t>
-      </w:r>
-      <w:r>
-        <w:t xml:space="preserve"> is selected. Switch to Cash or Check and it comes off.</w:t>
-      </w:r>
-    </w:p>
-    <w:p>
-      <w:pPr>
-        <w:pStyle w:val="Heading3"/>
-      </w:pPr>
-      <w:r>
-        <w:t>A product shows "Inquire" instead of a price.</w:t>
-      </w:r>
-    </w:p>
-    <w:p>
-      <w:r>
-        <w:t>Type in the agreed price in the Price box that appears when you pick that size.</w:t>
-      </w:r>
-    </w:p>
-    <w:p>
-      <w:pPr>
-        <w:pStyle w:val="Heading3"/>
-      </w:pPr>
-      <w:r>
-        <w:t>The app says "Pick a color first."</w:t>
-      </w:r>
-    </w:p>
-    <w:p>
-      <w:r>
-        <w:t>That product needs a choice made before it can be added. Tap one of the choices under that heading.</w:t>
-      </w:r>
-    </w:p>
-    <w:p>
-      <w:pPr>
-        <w:pStyle w:val="Heading3"/>
-      </w:pPr>
-      <w:r>
-        <w:t>A sale price didn't change on an order.</w:t>
-      </w:r>
-    </w:p>
-    <w:p>
-      <w:r>
-        <w:t>Items keep the price they were added at. Remove the item and add it again to pick up the new sale.</w:t>
-      </w:r>
-    </w:p>
-    <w:p>
-      <w:pPr>
-        <w:pStyle w:val="Heading3"/>
-      </w:pPr>
-      <w:r>
-        <w:t>The Take With button is greyed out.</w:t>
-      </w:r>
-    </w:p>
-    <w:p>
-      <w:r>
-        <w:t xml:space="preserve">That size is out of stock, or there aren't enough for the quantity you picked. Choose a shipping method instead, or lower the quantity. If there really are some on the shelf, ask checkout to update the count on the </w:t>
-      </w:r>
-      <w:r>
-        <w:rPr>
-          <w:b/>
-        </w:rPr>
-        <w:t>Inventory</w:t>
-      </w:r>
-      <w:r>
-        <w:t xml:space="preserve"> screen.</w:t>
-      </w:r>
-    </w:p>
-    <w:p>
-      <w:pPr>
-        <w:pStyle w:val="Heading3"/>
-      </w:pPr>
-      <w:r>
-        <w:t>Checkout says an item is out of stock and won't complete the order.</w:t>
-      </w:r>
-    </w:p>
-    <w:p>
-      <w:r>
-        <w:t xml:space="preserve">Someone else took the last one first. Remove the item's Take With row, add a shipping method with </w:t>
-      </w:r>
-      <w:r>
-        <w:rPr>
-          <w:b/>
-        </w:rPr>
-        <w:t>Add service</w:t>
-      </w:r>
-      <w:r>
-        <w:t>, and complete the order again.</w:t>
-      </w:r>
-    </w:p>
-    <w:p>
-      <w:pPr>
-        <w:pStyle w:val="Heading3"/>
-      </w:pPr>
-      <w:r>
-        <w:t>Email says email isn't set up.</w:t>
-      </w:r>
-    </w:p>
-    <w:p>
-      <w:r>
-        <w:t>The app hasn't been connected to an email account yet. Print the receipt or report instead, and ask whoever looks after the app to add the email settings.</w:t>
-      </w:r>
-    </w:p>
-    <w:p>
-      <w:pPr>
-        <w:pStyle w:val="Heading3"/>
-      </w:pPr>
-      <w:r>
-        <w:t>I want to change what the receipt email says.</w:t>
-      </w:r>
-    </w:p>
-    <w:p>
-      <w:r>
-        <w:t xml:space="preserve">An administrator can change it under </w:t>
-      </w:r>
-      <w:r>
-        <w:rPr>
-          <w:b/>
-        </w:rPr>
-        <w:t>Settings</w:t>
-      </w:r>
-      <w:r>
-        <w:t xml:space="preserve"> (see *Admin: settings*).</w:t>
-      </w:r>
-    </w:p>
-    <w:p>
-      <w:pPr>
-        <w:pStyle w:val="Heading3"/>
-      </w:pPr>
-      <w:r>
-        <w:lastRenderedPageBreak/>
-        <w:t>The customer didn't get their receipt email.</w:t>
-      </w:r>
-    </w:p>
-    <w:p>
-      <w:r>
-        <w:t xml:space="preserve">Ask them to check their junk or spam folder. Open the sales sheet, tap </w:t>
-      </w:r>
-      <w:r>
-        <w:rPr>
-          <w:b/>
-        </w:rPr>
-        <w:t>Email</w:t>
-      </w:r>
-      <w:r>
-        <w:t>, check the address carefully and send it again.</w:t>
-      </w:r>
-    </w:p>
-    <w:p>
-      <w:pPr>
-        <w:pStyle w:val="Heading3"/>
-      </w:pPr>
-      <w:r>
-        <w:t>Complete sale is greyed out.</w:t>
-      </w:r>
-    </w:p>
-    <w:p>
-      <w:r>
-        <w:t xml:space="preserve">The customer still needs to confirm their details, initial each point and sign. Tap </w:t>
-      </w:r>
-      <w:r>
-        <w:rPr>
-          <w:b/>
-        </w:rPr>
-        <w:t>Hand to customer</w:t>
-      </w:r>
-      <w:r>
-        <w:t xml:space="preserve"> in Acknowledgements. If their details were changed after they confirmed them, they need to confirm them again.</w:t>
-      </w:r>
-    </w:p>
-    <w:p>
-      <w:pPr>
-        <w:pStyle w:val="Heading3"/>
-      </w:pPr>
-      <w:r>
-        <w:t>The inventory count looks wrong.</w:t>
-      </w:r>
-    </w:p>
-    <w:p>
-      <w:r>
-        <w:t>Tap the clock icon to see its history, then tap the number and enter the real count. Add a note so everyone knows why it changed.</w:t>
-      </w:r>
-    </w:p>
-    <w:p>
-      <w:pPr>
-        <w:pStyle w:val="Heading3"/>
-      </w:pPr>
-      <w:r>
-        <w:t>I can't find a product.</w:t>
-      </w:r>
-    </w:p>
-    <w:p>
-      <w:r>
-        <w:t xml:space="preserve">Check that you're on the right category tab or </w:t>
-      </w:r>
-      <w:r>
-        <w:rPr>
-          <w:b/>
-        </w:rPr>
-        <w:t>All</w:t>
-      </w:r>
-      <w:r>
-        <w:t xml:space="preserve">, and clear the search box. If it still isn't there, an admin may have hidden it. Use </w:t>
-      </w:r>
-      <w:r>
-        <w:rPr>
-          <w:b/>
-        </w:rPr>
-        <w:t>Something not in the catalog</w:t>
-      </w:r>
-      <w:r>
-        <w:t xml:space="preserve"> in the meantime.</w:t>
-      </w:r>
-    </w:p>
-    <w:p>
-      <w:pPr>
-        <w:pStyle w:val="Heading3"/>
-      </w:pPr>
-      <w:r>
-        <w:t>The customer changed their mind at checkout.</w:t>
-      </w:r>
-    </w:p>
-    <w:p>
-      <w:r>
-        <w:t xml:space="preserve">Use </w:t>
-      </w:r>
-      <w:r>
-        <w:rPr>
-          <w:b/>
-        </w:rPr>
-        <w:t>Send back</w:t>
-      </w:r>
-      <w:r>
-        <w:t xml:space="preserve"> to return the order to the sales floor, or edit the items right there at checkout.</w:t>
-      </w:r>
-    </w:p>
-    <w:p>
-      <w:pPr>
-        <w:pStyle w:val="Heading3"/>
-      </w:pPr>
-      <w:r>
-        <w:t>I want a different PIN.</w:t>
-      </w:r>
-    </w:p>
-    <w:p>
-      <w:r>
-        <w:t xml:space="preserve">Tap your initials in the top-right corner, then </w:t>
-      </w:r>
-      <w:r>
-        <w:rPr>
-          <w:b/>
-        </w:rPr>
-        <w:t>Change PIN</w:t>
-      </w:r>
-      <w:r>
-        <w:t>. If you've forgotten your current PIN, an administrator can set a new one on the Crew screen.</w:t>
-      </w:r>
-    </w:p>
-    <w:p>
-      <w:pPr>
-        <w:pStyle w:val="Heading3"/>
-      </w:pPr>
-      <w:r>
-        <w:t>A completed order has a mistake.</w:t>
-      </w:r>
-    </w:p>
-    <w:p>
-      <w:r>
-        <w:t xml:space="preserve">Ask an admin to </w:t>
-      </w:r>
-      <w:r>
-        <w:rPr>
-          <w:b/>
-        </w:rPr>
-        <w:t>Reopen</w:t>
-      </w:r>
-      <w:r>
-        <w:t xml:space="preserve"> it from the Orders screen.</w:t>
-      </w:r>
-    </w:p>
-    <w:p>
-      <w:pPr>
-        <w:pStyle w:val="Heading3"/>
-      </w:pPr>
-      <w:r>
-        <w:t>I can't see a screen mentioned in this guide.</w:t>
-      </w:r>
-    </w:p>
-    <w:p>
-      <w:r>
-        <w:t>Your role doesn't include it. Ask an administrator if you need access.</w:t>
-      </w:r>
-    </w:p>
-    <w:p>
-      <w:pPr>
-        <w:pStyle w:val="Heading3"/>
-      </w:pPr>
-      <w:r>
-        <w:t>A new order isn't showing at checkout.</w:t>
-      </w:r>
-    </w:p>
-    <w:p>
-      <w:r>
-        <w:t>Tap the order list or refresh the page. Orders normally appear straight away.</w:t>
-      </w:r>
-    </w:p>
-    <w:p>
-      <w:pPr>
-        <w:pStyle w:val="Heading3"/>
-      </w:pPr>
-      <w:r>
-        <w:t>I'm on a shared tablet.</w:t>
-      </w:r>
-    </w:p>
-    <w:p>
-      <w:r>
-        <w:t>Always check the name in the top-right corner before you start, and sign out when you're done.</w:t>
-      </w:r>
-    </w:p>
-    <w:p>
-      <w:pPr>
-        <w:pStyle w:val="Heading1"/>
-        <w:pageBreakBefore/>
-      </w:pPr>
-      <w:bookmarkStart w:id="52" w:name="_Toc242011291"/>
-      <w:r>
-        <w:lastRenderedPageBreak/>
-        <w:t>Quick reference</w:t>
+        <w:t xml:space="preserve">An </w:t>
+      </w:r>
+      <w:r>
+        <w:rPr>
+          <w:b/>
+        </w:rPr>
+        <w:t>Owner</w:t>
+      </w:r>
+      <w:r>
+        <w:t xml:space="preserve"> can save the whole catalog to a file and load it back later - as a backup before big changes, or to copy a catalog from one installation to another. Both buttons are at the top of the </w:t>
+      </w:r>
+      <w:r>
+        <w:rPr>
+          <w:b/>
+        </w:rPr>
+        <w:t>Catalog</w:t>
+      </w:r>
+      <w:r>
+        <w:t xml:space="preserve"> screen and only appear for owners.</w:t>
+      </w:r>
+    </w:p>
+    <w:p>
+      <w:pPr>
+        <w:pStyle w:val="Heading2"/>
+      </w:pPr>
+      <w:bookmarkStart w:id="52" w:name="_Toc242013161"/>
+      <w:r>
+        <w:t>Export catalog</w:t>
       </w:r>
       <w:bookmarkEnd w:id="52"/>
     </w:p>
     <w:p>
+      <w:r>
+        <w:t xml:space="preserve">Tap </w:t>
+      </w:r>
+      <w:r>
+        <w:rPr>
+          <w:b/>
+        </w:rPr>
+        <w:t>Export catalog</w:t>
+      </w:r>
+      <w:r>
+        <w:t xml:space="preserve">. Your device saves a file named like </w:t>
+      </w:r>
+      <w:r>
+        <w:rPr>
+          <w:b/>
+        </w:rPr>
+        <w:t>catalog-2026-10-04.json</w:t>
+      </w:r>
+      <w:r>
+        <w:t xml:space="preserve">. It holds every product - archived ones too - with its sizes, prices, sales, selections and their choices, what each size includes as a bundle, which delivery options it offers, and whether it tracks inventory. It also holds the </w:t>
+      </w:r>
+      <w:r>
+        <w:rPr>
+          <w:b/>
+        </w:rPr>
+        <w:t>Delivery</w:t>
+      </w:r>
+      <w:r>
+        <w:t xml:space="preserve"> list. Stock counts, orders and settings are </w:t>
+      </w:r>
+      <w:r>
+        <w:rPr>
+          <w:b/>
+        </w:rPr>
+        <w:t>not</w:t>
+      </w:r>
+      <w:r>
+        <w:t xml:space="preserve"> in the file.</w:t>
+      </w:r>
+    </w:p>
+    <w:p>
       <w:pPr>
         <w:pStyle w:val="Heading2"/>
       </w:pPr>
-      <w:bookmarkStart w:id="53" w:name="_Toc242011292"/>
-      <w:r>
-        <w:t>Sales rep checklist</w:t>
+      <w:bookmarkStart w:id="53" w:name="_Toc242013162"/>
+      <w:r>
+        <w:t>Restore catalog</w:t>
       </w:r>
       <w:bookmarkEnd w:id="53"/>
     </w:p>
@@ -20137,13 +20002,16 @@
         <w:tab/>
       </w:r>
       <w:r>
-        <w:rPr>
-          <w:b/>
-        </w:rPr>
-        <w:t>New</w:t>
-      </w:r>
-      <w:r>
-        <w:t>: start the order.</w:t>
+        <w:t xml:space="preserve">Tap </w:t>
+      </w:r>
+      <w:r>
+        <w:rPr>
+          <w:b/>
+        </w:rPr>
+        <w:t>Restore catalog</w:t>
+      </w:r>
+      <w:r>
+        <w:t xml:space="preserve"> and choose the file. The app shows how many products and delivery options it holds and when it was exported.</w:t>
       </w:r>
     </w:p>
     <w:p>
@@ -20169,13 +20037,7 @@
         <w:tab/>
       </w:r>
       <w:r>
-        <w:rPr>
-          <w:b/>
-        </w:rPr>
-        <w:t>Add item</w:t>
-      </w:r>
-      <w:r>
-        <w:t>: pick the product, size, shipping and quantity.</w:t>
+        <w:t>Pick how to restore it (see below).</w:t>
       </w:r>
     </w:p>
     <w:p>
@@ -20201,17 +20063,956 @@
         <w:tab/>
       </w:r>
       <w:r>
-        <w:t xml:space="preserve">Fill in the customer details, or tap </w:t>
-      </w:r>
-      <w:r>
-        <w:rPr>
-          <w:b/>
-        </w:rPr>
-        <w:t>Hand tablet to customer</w:t>
+        <w:t xml:space="preserve">Tap </w:t>
+      </w:r>
+      <w:r>
+        <w:rPr>
+          <w:b/>
+        </w:rPr>
+        <w:t>Restore</w:t>
+      </w:r>
+      <w:r>
+        <w:t>. When it's done, a summary shows what was added and updated, and anything that couldn't be brought in.</w:t>
+      </w:r>
+    </w:p>
+    <w:p>
+      <w:pPr>
+        <w:keepNext/>
+        <w:spacing w:after="40"/>
+        <w:jc w:val="center"/>
+      </w:pPr>
+      <w:r>
+        <w:rPr>
+          <w:noProof/>
+        </w:rPr>
+        <w:lastRenderedPageBreak/>
+        <w:drawing>
+          <wp:inline distT="0" distB="0" distL="0" distR="0" wp14:anchorId="03978E1E" wp14:editId="6833BC3C">
+            <wp:extent cx="4206240" cy="5882164"/>
+            <wp:effectExtent l="0" t="0" r="0" b="0"/>
+            <wp:docPr id="41" name="Picture 41"/>
+            <wp:cNvGraphicFramePr>
+              <a:graphicFrameLocks xmlns:a="http://schemas.openxmlformats.org/drawingml/2006/main" noChangeAspect="1"/>
+            </wp:cNvGraphicFramePr>
+            <a:graphic xmlns:a="http://schemas.openxmlformats.org/drawingml/2006/main">
+              <a:graphicData uri="http://schemas.openxmlformats.org/drawingml/2006/picture">
+                <pic:pic xmlns:pic="http://schemas.openxmlformats.org/drawingml/2006/picture">
+                  <pic:nvPicPr>
+                    <pic:cNvPr id="0" name="44_catalog_restore.png"/>
+                    <pic:cNvPicPr/>
+                  </pic:nvPicPr>
+                  <pic:blipFill>
+                    <a:blip r:embed="rId49"/>
+                    <a:stretch>
+                      <a:fillRect/>
+                    </a:stretch>
+                  </pic:blipFill>
+                  <pic:spPr>
+                    <a:xfrm>
+                      <a:off x="0" y="0"/>
+                      <a:ext cx="4206240" cy="5882164"/>
+                    </a:xfrm>
+                    <a:prstGeom prst="rect">
+                      <a:avLst/>
+                    </a:prstGeom>
+                  </pic:spPr>
+                </pic:pic>
+              </a:graphicData>
+            </a:graphic>
+          </wp:inline>
+        </w:drawing>
+      </w:r>
+    </w:p>
+    <w:p>
+      <w:pPr>
+        <w:spacing w:after="200"/>
+        <w:jc w:val="center"/>
+      </w:pPr>
+      <w:r>
+        <w:rPr>
+          <w:i/>
+          <w:color w:val="6B7280"/>
+          <w:sz w:val="18"/>
+        </w:rPr>
+        <w:t>Restoring a catalog file, with Clear the catalog and replace it picked</w:t>
+      </w:r>
+    </w:p>
+    <w:tbl>
+      <w:tblPr>
+        <w:tblW w:w="0" w:type="auto"/>
+        <w:jc w:val="center"/>
+        <w:tblLook w:val="04A0" w:firstRow="1" w:lastRow="0" w:firstColumn="1" w:lastColumn="0" w:noHBand="0" w:noVBand="1"/>
+      </w:tblPr>
+      <w:tblGrid>
+        <w:gridCol w:w="3168"/>
+        <w:gridCol w:w="6192"/>
+      </w:tblGrid>
+      <w:tr>
+        <w:trPr>
+          <w:jc w:val="center"/>
+        </w:trPr>
+        <w:tc>
+          <w:tcPr>
+            <w:tcW w:w="3168" w:type="dxa"/>
+            <w:tcBorders>
+              <w:top w:val="single" w:sz="4" w:space="0" w:color="0369A1"/>
+              <w:left w:val="single" w:sz="4" w:space="0" w:color="0369A1"/>
+              <w:bottom w:val="single" w:sz="4" w:space="0" w:color="0369A1"/>
+              <w:right w:val="single" w:sz="4" w:space="0" w:color="0369A1"/>
+            </w:tcBorders>
+            <w:shd w:val="clear" w:color="auto" w:fill="0369A1"/>
+            <w:tcMar>
+              <w:top w:w="100" w:type="dxa"/>
+              <w:left w:w="140" w:type="dxa"/>
+              <w:bottom w:w="100" w:type="dxa"/>
+              <w:right w:w="140" w:type="dxa"/>
+            </w:tcMar>
+          </w:tcPr>
+          <w:p>
+            <w:pPr>
+              <w:spacing w:after="0"/>
+            </w:pPr>
+            <w:r>
+              <w:rPr>
+                <w:b/>
+                <w:color w:val="FFFFFF"/>
+              </w:rPr>
+              <w:t>Choice</w:t>
+            </w:r>
+          </w:p>
+        </w:tc>
+        <w:tc>
+          <w:tcPr>
+            <w:tcW w:w="6192" w:type="dxa"/>
+            <w:tcBorders>
+              <w:top w:val="single" w:sz="4" w:space="0" w:color="0369A1"/>
+              <w:left w:val="single" w:sz="4" w:space="0" w:color="0369A1"/>
+              <w:bottom w:val="single" w:sz="4" w:space="0" w:color="0369A1"/>
+              <w:right w:val="single" w:sz="4" w:space="0" w:color="0369A1"/>
+            </w:tcBorders>
+            <w:shd w:val="clear" w:color="auto" w:fill="0369A1"/>
+            <w:tcMar>
+              <w:top w:w="100" w:type="dxa"/>
+              <w:left w:w="140" w:type="dxa"/>
+              <w:bottom w:w="100" w:type="dxa"/>
+              <w:right w:w="140" w:type="dxa"/>
+            </w:tcMar>
+          </w:tcPr>
+          <w:p>
+            <w:pPr>
+              <w:spacing w:after="0"/>
+            </w:pPr>
+            <w:r>
+              <w:rPr>
+                <w:b/>
+                <w:color w:val="FFFFFF"/>
+              </w:rPr>
+              <w:t>What happens</w:t>
+            </w:r>
+          </w:p>
+        </w:tc>
+      </w:tr>
+      <w:tr>
+        <w:trPr>
+          <w:jc w:val="center"/>
+        </w:trPr>
+        <w:tc>
+          <w:tcPr>
+            <w:tcW w:w="3168" w:type="dxa"/>
+            <w:tcBorders>
+              <w:top w:val="single" w:sz="4" w:space="0" w:color="D1D5DB"/>
+              <w:left w:val="single" w:sz="4" w:space="0" w:color="D1D5DB"/>
+              <w:bottom w:val="single" w:sz="4" w:space="0" w:color="D1D5DB"/>
+              <w:right w:val="single" w:sz="4" w:space="0" w:color="D1D5DB"/>
+            </w:tcBorders>
+            <w:tcMar>
+              <w:top w:w="100" w:type="dxa"/>
+              <w:left w:w="140" w:type="dxa"/>
+              <w:bottom w:w="100" w:type="dxa"/>
+              <w:right w:w="140" w:type="dxa"/>
+            </w:tcMar>
+          </w:tcPr>
+          <w:p>
+            <w:pPr>
+              <w:spacing w:after="0"/>
+            </w:pPr>
+            <w:r>
+              <w:rPr>
+                <w:b/>
+              </w:rPr>
+              <w:t>Update the catalog from this file</w:t>
+            </w:r>
+          </w:p>
+        </w:tc>
+        <w:tc>
+          <w:tcPr>
+            <w:tcW w:w="6192" w:type="dxa"/>
+            <w:tcBorders>
+              <w:top w:val="single" w:sz="4" w:space="0" w:color="D1D5DB"/>
+              <w:left w:val="single" w:sz="4" w:space="0" w:color="D1D5DB"/>
+              <w:bottom w:val="single" w:sz="4" w:space="0" w:color="D1D5DB"/>
+              <w:right w:val="single" w:sz="4" w:space="0" w:color="D1D5DB"/>
+            </w:tcBorders>
+            <w:tcMar>
+              <w:top w:w="100" w:type="dxa"/>
+              <w:left w:w="140" w:type="dxa"/>
+              <w:bottom w:w="100" w:type="dxa"/>
+              <w:right w:w="140" w:type="dxa"/>
+            </w:tcMar>
+          </w:tcPr>
+          <w:p>
+            <w:pPr>
+              <w:spacing w:after="0"/>
+            </w:pPr>
+            <w:r>
+              <w:t>A product in the file that's already in the catalog - same brand and name - is changed to match the file: sizes, prices, sales, selections, bundles and delivery. Anything new is added. Products and delivery options that aren't in the file are left alone. Stock counts, including counts for each color, are kept.</w:t>
+            </w:r>
+          </w:p>
+        </w:tc>
+      </w:tr>
+      <w:tr>
+        <w:trPr>
+          <w:jc w:val="center"/>
+        </w:trPr>
+        <w:tc>
+          <w:tcPr>
+            <w:tcW w:w="3168" w:type="dxa"/>
+            <w:tcBorders>
+              <w:top w:val="single" w:sz="4" w:space="0" w:color="D1D5DB"/>
+              <w:left w:val="single" w:sz="4" w:space="0" w:color="D1D5DB"/>
+              <w:bottom w:val="single" w:sz="4" w:space="0" w:color="D1D5DB"/>
+              <w:right w:val="single" w:sz="4" w:space="0" w:color="D1D5DB"/>
+            </w:tcBorders>
+            <w:shd w:val="clear" w:color="auto" w:fill="F3F4F6"/>
+            <w:tcMar>
+              <w:top w:w="100" w:type="dxa"/>
+              <w:left w:w="140" w:type="dxa"/>
+              <w:bottom w:w="100" w:type="dxa"/>
+              <w:right w:w="140" w:type="dxa"/>
+            </w:tcMar>
+          </w:tcPr>
+          <w:p>
+            <w:pPr>
+              <w:spacing w:after="0"/>
+            </w:pPr>
+            <w:r>
+              <w:rPr>
+                <w:b/>
+              </w:rPr>
+              <w:t>Clear the catalog and replace it</w:t>
+            </w:r>
+          </w:p>
+        </w:tc>
+        <w:tc>
+          <w:tcPr>
+            <w:tcW w:w="6192" w:type="dxa"/>
+            <w:tcBorders>
+              <w:top w:val="single" w:sz="4" w:space="0" w:color="D1D5DB"/>
+              <w:left w:val="single" w:sz="4" w:space="0" w:color="D1D5DB"/>
+              <w:bottom w:val="single" w:sz="4" w:space="0" w:color="D1D5DB"/>
+              <w:right w:val="single" w:sz="4" w:space="0" w:color="D1D5DB"/>
+            </w:tcBorders>
+            <w:shd w:val="clear" w:color="auto" w:fill="F3F4F6"/>
+            <w:tcMar>
+              <w:top w:w="100" w:type="dxa"/>
+              <w:left w:w="140" w:type="dxa"/>
+              <w:bottom w:w="100" w:type="dxa"/>
+              <w:right w:w="140" w:type="dxa"/>
+            </w:tcMar>
+          </w:tcPr>
+          <w:p>
+            <w:pPr>
+              <w:spacing w:after="0"/>
+            </w:pPr>
+            <w:r>
+              <w:t xml:space="preserve">Every product and delivery option is </w:t>
+            </w:r>
+            <w:r>
+              <w:rPr>
+                <w:b/>
+              </w:rPr>
+              <w:t>deleted for good</w:t>
+            </w:r>
+            <w:r>
+              <w:t xml:space="preserve"> - including ones that have been sold - along with their stock counts and inventory history. Then the catalog is rebuilt from the file. Past </w:t>
+            </w:r>
+            <w:r>
+              <w:lastRenderedPageBreak/>
+              <w:t xml:space="preserve">sales sheets still print exactly as they were sold. You have to type </w:t>
+            </w:r>
+            <w:r>
+              <w:rPr>
+                <w:b/>
+              </w:rPr>
+              <w:t>REPLACE</w:t>
+            </w:r>
+            <w:r>
+              <w:t xml:space="preserve"> before the button unlocks.</w:t>
+            </w:r>
+          </w:p>
+        </w:tc>
+      </w:tr>
+    </w:tbl>
+    <w:p>
+      <w:pPr>
+        <w:spacing w:after="40"/>
+      </w:pPr>
+    </w:p>
+    <w:p>
+      <w:pPr>
+        <w:keepNext/>
+        <w:spacing w:after="40"/>
+        <w:jc w:val="center"/>
+      </w:pPr>
+      <w:r>
+        <w:rPr>
+          <w:noProof/>
+        </w:rPr>
+        <w:drawing>
+          <wp:inline distT="0" distB="0" distL="0" distR="0" wp14:anchorId="23C93180" wp14:editId="787CBDF5">
+            <wp:extent cx="4206240" cy="1993582"/>
+            <wp:effectExtent l="0" t="0" r="0" b="0"/>
+            <wp:docPr id="42" name="Picture 42"/>
+            <wp:cNvGraphicFramePr>
+              <a:graphicFrameLocks xmlns:a="http://schemas.openxmlformats.org/drawingml/2006/main" noChangeAspect="1"/>
+            </wp:cNvGraphicFramePr>
+            <a:graphic xmlns:a="http://schemas.openxmlformats.org/drawingml/2006/main">
+              <a:graphicData uri="http://schemas.openxmlformats.org/drawingml/2006/picture">
+                <pic:pic xmlns:pic="http://schemas.openxmlformats.org/drawingml/2006/picture">
+                  <pic:nvPicPr>
+                    <pic:cNvPr id="0" name="45_catalog_restored.png"/>
+                    <pic:cNvPicPr/>
+                  </pic:nvPicPr>
+                  <pic:blipFill>
+                    <a:blip r:embed="rId50"/>
+                    <a:stretch>
+                      <a:fillRect/>
+                    </a:stretch>
+                  </pic:blipFill>
+                  <pic:spPr>
+                    <a:xfrm>
+                      <a:off x="0" y="0"/>
+                      <a:ext cx="4206240" cy="1993582"/>
+                    </a:xfrm>
+                    <a:prstGeom prst="rect">
+                      <a:avLst/>
+                    </a:prstGeom>
+                  </pic:spPr>
+                </pic:pic>
+              </a:graphicData>
+            </a:graphic>
+          </wp:inline>
+        </w:drawing>
+      </w:r>
+    </w:p>
+    <w:p>
+      <w:pPr>
+        <w:spacing w:after="200"/>
+        <w:jc w:val="center"/>
+      </w:pPr>
+      <w:r>
+        <w:rPr>
+          <w:i/>
+          <w:color w:val="6B7280"/>
+          <w:sz w:val="18"/>
+        </w:rPr>
+        <w:t>The summary after a restore</w:t>
+      </w:r>
+    </w:p>
+    <w:tbl>
+      <w:tblPr>
+        <w:tblW w:w="0" w:type="auto"/>
+        <w:jc w:val="center"/>
+        <w:tblLook w:val="04A0" w:firstRow="1" w:lastRow="0" w:firstColumn="1" w:lastColumn="0" w:noHBand="0" w:noVBand="1"/>
+      </w:tblPr>
+      <w:tblGrid>
+        <w:gridCol w:w="9360"/>
+      </w:tblGrid>
+      <w:tr>
+        <w:trPr>
+          <w:jc w:val="center"/>
+        </w:trPr>
+        <w:tc>
+          <w:tcPr>
+            <w:tcW w:w="9360" w:type="dxa"/>
+            <w:tcBorders>
+              <w:top w:val="single" w:sz="4" w:space="0" w:color="FEF3C7"/>
+              <w:left w:val="single" w:sz="36" w:space="0" w:color="D97706"/>
+              <w:bottom w:val="single" w:sz="4" w:space="0" w:color="FEF3C7"/>
+              <w:right w:val="single" w:sz="4" w:space="0" w:color="FEF3C7"/>
+            </w:tcBorders>
+            <w:shd w:val="clear" w:color="auto" w:fill="FEF3C7"/>
+            <w:tcMar>
+              <w:top w:w="120" w:type="dxa"/>
+              <w:left w:w="200" w:type="dxa"/>
+              <w:bottom w:w="120" w:type="dxa"/>
+              <w:right w:w="160" w:type="dxa"/>
+            </w:tcMar>
+          </w:tcPr>
+          <w:p>
+            <w:pPr>
+              <w:spacing w:after="0"/>
+            </w:pPr>
+            <w:r>
+              <w:rPr>
+                <w:b/>
+                <w:color w:val="D97706"/>
+              </w:rPr>
+              <w:t xml:space="preserve">Important:  </w:t>
+            </w:r>
+            <w:r>
+              <w:t>A restore either goes in completely or not at all. If the file has a problem - it isn't a catalog file, or a price or sale doesn't make sense - nothing is changed and the app says what's wrong.</w:t>
+            </w:r>
+          </w:p>
+        </w:tc>
+      </w:tr>
+    </w:tbl>
+    <w:p>
+      <w:pPr>
+        <w:spacing w:after="40"/>
+      </w:pPr>
+    </w:p>
+    <w:tbl>
+      <w:tblPr>
+        <w:tblW w:w="0" w:type="auto"/>
+        <w:jc w:val="center"/>
+        <w:tblLook w:val="04A0" w:firstRow="1" w:lastRow="0" w:firstColumn="1" w:lastColumn="0" w:noHBand="0" w:noVBand="1"/>
+      </w:tblPr>
+      <w:tblGrid>
+        <w:gridCol w:w="9360"/>
+      </w:tblGrid>
+      <w:tr>
+        <w:trPr>
+          <w:jc w:val="center"/>
+        </w:trPr>
+        <w:tc>
+          <w:tcPr>
+            <w:tcW w:w="9360" w:type="dxa"/>
+            <w:tcBorders>
+              <w:top w:val="single" w:sz="4" w:space="0" w:color="E0F2FE"/>
+              <w:left w:val="single" w:sz="36" w:space="0" w:color="0284C7"/>
+              <w:bottom w:val="single" w:sz="4" w:space="0" w:color="E0F2FE"/>
+              <w:right w:val="single" w:sz="4" w:space="0" w:color="E0F2FE"/>
+            </w:tcBorders>
+            <w:shd w:val="clear" w:color="auto" w:fill="E0F2FE"/>
+            <w:tcMar>
+              <w:top w:w="120" w:type="dxa"/>
+              <w:left w:w="200" w:type="dxa"/>
+              <w:bottom w:w="120" w:type="dxa"/>
+              <w:right w:w="160" w:type="dxa"/>
+            </w:tcMar>
+          </w:tcPr>
+          <w:p>
+            <w:pPr>
+              <w:spacing w:after="0"/>
+            </w:pPr>
+            <w:r>
+              <w:rPr>
+                <w:b/>
+                <w:color w:val="0284C7"/>
+              </w:rPr>
+              <w:t xml:space="preserve">Tip:  </w:t>
+            </w:r>
+            <w:r>
+              <w:t xml:space="preserve">Export the catalog before you restore over it. If the result isn't what you wanted, restore that file with </w:t>
+            </w:r>
+            <w:r>
+              <w:rPr>
+                <w:b/>
+              </w:rPr>
+              <w:t>Clear the catalog and replace it</w:t>
+            </w:r>
+            <w:r>
+              <w:t xml:space="preserve"> to put everything back as it was (stock counts aside).</w:t>
+            </w:r>
+          </w:p>
+        </w:tc>
+      </w:tr>
+    </w:tbl>
+    <w:p>
+      <w:pPr>
+        <w:spacing w:after="40"/>
+      </w:pPr>
+    </w:p>
+    <w:p>
+      <w:r>
+        <w:t>Things the summary may list as not brought in:</w:t>
+      </w:r>
+    </w:p>
+    <w:p>
+      <w:pPr>
+        <w:pStyle w:val="ListBullet"/>
+        <w:spacing w:after="60"/>
+      </w:pPr>
+      <w:r>
+        <w:t>A product offering a delivery option that isn't in the Delivery list - that option is left off the product.</w:t>
+      </w:r>
+    </w:p>
+    <w:p>
+      <w:pPr>
+        <w:pStyle w:val="ListBullet"/>
+        <w:spacing w:after="60"/>
+      </w:pPr>
+      <w:r>
+        <w:t>A bundle including an item that isn't in the catalog, or that is a bundle itself - that item is left out of the bundle.</w:t>
+      </w:r>
+    </w:p>
+    <w:p>
+      <w:pPr>
+        <w:pStyle w:val="Heading1"/>
+        <w:pageBreakBefore/>
+      </w:pPr>
+      <w:bookmarkStart w:id="54" w:name="_Toc242013163"/>
+      <w:r>
+        <w:lastRenderedPageBreak/>
+        <w:t>Tips and troubleshooting</w:t>
+      </w:r>
+      <w:bookmarkEnd w:id="54"/>
+    </w:p>
+    <w:p>
+      <w:r>
+        <w:t xml:space="preserve">If the tablet loses touch with the server (usually the Wi-Fi dropping out), an amber strip appears under the menu: </w:t>
+      </w:r>
+      <w:r>
+        <w:rPr>
+          <w:b/>
+        </w:rPr>
+        <w:t>Can't reach the server - retrying</w:t>
+      </w:r>
+      <w:r>
+        <w:t xml:space="preserve">. Anything you change while it's showing won't save. You can still move between screens, and the strip disappears on its own, with a </w:t>
+      </w:r>
+      <w:r>
+        <w:rPr>
+          <w:b/>
+        </w:rPr>
+        <w:t>Reconnected</w:t>
+      </w:r>
+      <w:r>
+        <w:t xml:space="preserve"> message, once the server answers again.</w:t>
+      </w:r>
+    </w:p>
+    <w:p>
+      <w:pPr>
+        <w:pStyle w:val="Heading3"/>
+      </w:pPr>
+      <w:r>
+        <w:t>I can't start a new order.</w:t>
+      </w:r>
+    </w:p>
+    <w:p>
+      <w:r>
+        <w:t xml:space="preserve">No event is active. An administrator needs to open </w:t>
+      </w:r>
+      <w:r>
+        <w:rPr>
+          <w:b/>
+        </w:rPr>
+        <w:t>Events</w:t>
+      </w:r>
+      <w:r>
+        <w:t xml:space="preserve">, edit the fundraiser and tick </w:t>
+      </w:r>
+      <w:r>
+        <w:rPr>
+          <w:b/>
+        </w:rPr>
+        <w:t>Active event</w:t>
       </w:r>
       <w:r>
         <w:t>.</w:t>
       </w:r>
+    </w:p>
+    <w:p>
+      <w:pPr>
+        <w:pStyle w:val="Heading3"/>
+      </w:pPr>
+      <w:r>
+        <w:t>The Complete button is greyed out.</w:t>
+      </w:r>
+    </w:p>
+    <w:p>
+      <w:r>
+        <w:t>The order needs at least one item and the customer's name.</w:t>
+      </w:r>
+    </w:p>
+    <w:p>
+      <w:pPr>
+        <w:pStyle w:val="Heading3"/>
+      </w:pPr>
+      <w:r>
+        <w:t>The card fee showed up on the total.</w:t>
+      </w:r>
+    </w:p>
+    <w:p>
+      <w:r>
+        <w:t xml:space="preserve">That's expected when </w:t>
+      </w:r>
+      <w:r>
+        <w:rPr>
+          <w:b/>
+        </w:rPr>
+        <w:t>Credit/Debit Card</w:t>
+      </w:r>
+      <w:r>
+        <w:t xml:space="preserve"> is selected. Switch to Cash or Check and it comes off.</w:t>
+      </w:r>
+    </w:p>
+    <w:p>
+      <w:pPr>
+        <w:pStyle w:val="Heading3"/>
+      </w:pPr>
+      <w:r>
+        <w:t>A product shows "Inquire" instead of a price.</w:t>
+      </w:r>
+    </w:p>
+    <w:p>
+      <w:r>
+        <w:t>Type in the agreed price in the Price box that appears when you pick that size.</w:t>
+      </w:r>
+    </w:p>
+    <w:p>
+      <w:pPr>
+        <w:pStyle w:val="Heading3"/>
+      </w:pPr>
+      <w:r>
+        <w:t>The app says "Pick a color first."</w:t>
+      </w:r>
+    </w:p>
+    <w:p>
+      <w:r>
+        <w:t>That product needs a choice made before it can be added. Tap one of the choices under that heading.</w:t>
+      </w:r>
+    </w:p>
+    <w:p>
+      <w:pPr>
+        <w:pStyle w:val="Heading3"/>
+      </w:pPr>
+      <w:r>
+        <w:t>A sale price didn't change on an order.</w:t>
+      </w:r>
+    </w:p>
+    <w:p>
+      <w:r>
+        <w:t>Items keep the price they were added at. Remove the item and add it again to pick up the new sale.</w:t>
+      </w:r>
+    </w:p>
+    <w:p>
+      <w:pPr>
+        <w:pStyle w:val="Heading3"/>
+      </w:pPr>
+      <w:r>
+        <w:t>The Take With button is greyed out.</w:t>
+      </w:r>
+    </w:p>
+    <w:p>
+      <w:r>
+        <w:t xml:space="preserve">That size is out of stock, or there aren't enough for the quantity you picked. Choose a shipping method instead, or lower the quantity. If there really are some on the shelf, ask checkout to update the count on the </w:t>
+      </w:r>
+      <w:r>
+        <w:rPr>
+          <w:b/>
+        </w:rPr>
+        <w:t>Inventory</w:t>
+      </w:r>
+      <w:r>
+        <w:t xml:space="preserve"> screen.</w:t>
+      </w:r>
+    </w:p>
+    <w:p>
+      <w:pPr>
+        <w:pStyle w:val="Heading3"/>
+      </w:pPr>
+      <w:r>
+        <w:t>Checkout says an item is out of stock and won't complete the order.</w:t>
+      </w:r>
+    </w:p>
+    <w:p>
+      <w:r>
+        <w:t xml:space="preserve">Someone else took the last one first. Remove the item's Take With row, add a shipping method with </w:t>
+      </w:r>
+      <w:r>
+        <w:rPr>
+          <w:b/>
+        </w:rPr>
+        <w:t>Add service</w:t>
+      </w:r>
+      <w:r>
+        <w:t>, and complete the order again.</w:t>
+      </w:r>
+    </w:p>
+    <w:p>
+      <w:pPr>
+        <w:pStyle w:val="Heading3"/>
+      </w:pPr>
+      <w:r>
+        <w:t>Email says email isn't set up.</w:t>
+      </w:r>
+    </w:p>
+    <w:p>
+      <w:r>
+        <w:t>The app hasn't been connected to an email account yet. Print the receipt or report instead, and ask whoever looks after the app to add the email settings.</w:t>
+      </w:r>
+    </w:p>
+    <w:p>
+      <w:pPr>
+        <w:pStyle w:val="Heading3"/>
+      </w:pPr>
+      <w:r>
+        <w:t>I want to change what the receipt email says.</w:t>
+      </w:r>
+    </w:p>
+    <w:p>
+      <w:r>
+        <w:t xml:space="preserve">An administrator can change it under </w:t>
+      </w:r>
+      <w:r>
+        <w:rPr>
+          <w:b/>
+        </w:rPr>
+        <w:t>Settings</w:t>
+      </w:r>
+      <w:r>
+        <w:t xml:space="preserve"> (see *Admin: settings*).</w:t>
+      </w:r>
+    </w:p>
+    <w:p>
+      <w:pPr>
+        <w:pStyle w:val="Heading3"/>
+      </w:pPr>
+      <w:r>
+        <w:t>The customer didn't get their receipt email.</w:t>
+      </w:r>
+    </w:p>
+    <w:p>
+      <w:r>
+        <w:t xml:space="preserve">Ask them to check their junk or spam folder. Open the sales sheet, tap </w:t>
+      </w:r>
+      <w:r>
+        <w:rPr>
+          <w:b/>
+        </w:rPr>
+        <w:t>Email</w:t>
+      </w:r>
+      <w:r>
+        <w:t>, check the address carefully and send it again.</w:t>
+      </w:r>
+    </w:p>
+    <w:p>
+      <w:pPr>
+        <w:pStyle w:val="Heading3"/>
+      </w:pPr>
+      <w:r>
+        <w:lastRenderedPageBreak/>
+        <w:t>Complete sale is greyed out.</w:t>
+      </w:r>
+    </w:p>
+    <w:p>
+      <w:r>
+        <w:t xml:space="preserve">The customer still needs to confirm their details, initial each point and sign. Tap </w:t>
+      </w:r>
+      <w:r>
+        <w:rPr>
+          <w:b/>
+        </w:rPr>
+        <w:t>Hand to customer</w:t>
+      </w:r>
+      <w:r>
+        <w:t xml:space="preserve"> in Acknowledgements. If their details were changed after they confirmed them, they need to confirm them again.</w:t>
+      </w:r>
+    </w:p>
+    <w:p>
+      <w:pPr>
+        <w:pStyle w:val="Heading3"/>
+      </w:pPr>
+      <w:r>
+        <w:t>The inventory count looks wrong.</w:t>
+      </w:r>
+    </w:p>
+    <w:p>
+      <w:r>
+        <w:t>Tap the clock icon to see its history, then tap the number and enter the real count. Add a note so everyone knows why it changed.</w:t>
+      </w:r>
+    </w:p>
+    <w:p>
+      <w:pPr>
+        <w:pStyle w:val="Heading3"/>
+      </w:pPr>
+      <w:r>
+        <w:t>I can't find a product.</w:t>
+      </w:r>
+    </w:p>
+    <w:p>
+      <w:r>
+        <w:t xml:space="preserve">Check that you're on the right category tab or </w:t>
+      </w:r>
+      <w:r>
+        <w:rPr>
+          <w:b/>
+        </w:rPr>
+        <w:t>All</w:t>
+      </w:r>
+      <w:r>
+        <w:t xml:space="preserve">, and clear the search box. If it still isn't there, an admin may have hidden it. Use </w:t>
+      </w:r>
+      <w:r>
+        <w:rPr>
+          <w:b/>
+        </w:rPr>
+        <w:t>Something not in the catalog</w:t>
+      </w:r>
+      <w:r>
+        <w:t xml:space="preserve"> in the meantime.</w:t>
+      </w:r>
+    </w:p>
+    <w:p>
+      <w:pPr>
+        <w:pStyle w:val="Heading3"/>
+      </w:pPr>
+      <w:r>
+        <w:t>The customer changed their mind at checkout.</w:t>
+      </w:r>
+    </w:p>
+    <w:p>
+      <w:r>
+        <w:t xml:space="preserve">Use </w:t>
+      </w:r>
+      <w:r>
+        <w:rPr>
+          <w:b/>
+        </w:rPr>
+        <w:t>Send back</w:t>
+      </w:r>
+      <w:r>
+        <w:t xml:space="preserve"> to return the order to the sales floor, or edit the items right there at checkout.</w:t>
+      </w:r>
+    </w:p>
+    <w:p>
+      <w:pPr>
+        <w:pStyle w:val="Heading3"/>
+      </w:pPr>
+      <w:r>
+        <w:t>I want a different PIN.</w:t>
+      </w:r>
+    </w:p>
+    <w:p>
+      <w:r>
+        <w:t xml:space="preserve">Tap your initials in the top-right corner, then </w:t>
+      </w:r>
+      <w:r>
+        <w:rPr>
+          <w:b/>
+        </w:rPr>
+        <w:t>Change PIN</w:t>
+      </w:r>
+      <w:r>
+        <w:t>. If you've forgotten your current PIN, an administrator can set a new one on the Crew screen.</w:t>
+      </w:r>
+    </w:p>
+    <w:p>
+      <w:pPr>
+        <w:pStyle w:val="Heading3"/>
+      </w:pPr>
+      <w:r>
+        <w:t>A completed order has a mistake.</w:t>
+      </w:r>
+    </w:p>
+    <w:p>
+      <w:r>
+        <w:t xml:space="preserve">Ask an admin to </w:t>
+      </w:r>
+      <w:r>
+        <w:rPr>
+          <w:b/>
+        </w:rPr>
+        <w:t>Reopen</w:t>
+      </w:r>
+      <w:r>
+        <w:t xml:space="preserve"> it from the Orders screen.</w:t>
+      </w:r>
+    </w:p>
+    <w:p>
+      <w:pPr>
+        <w:pStyle w:val="Heading3"/>
+      </w:pPr>
+      <w:r>
+        <w:t>I can't see a screen mentioned in this guide.</w:t>
+      </w:r>
+    </w:p>
+    <w:p>
+      <w:r>
+        <w:t>Your role doesn't include it. Ask an administrator if you need access.</w:t>
+      </w:r>
+    </w:p>
+    <w:p>
+      <w:pPr>
+        <w:pStyle w:val="Heading3"/>
+      </w:pPr>
+      <w:r>
+        <w:t>A new order isn't showing at checkout.</w:t>
+      </w:r>
+    </w:p>
+    <w:p>
+      <w:r>
+        <w:t>Tap the order list or refresh the page. Orders normally appear straight away.</w:t>
+      </w:r>
+    </w:p>
+    <w:p>
+      <w:pPr>
+        <w:pStyle w:val="Heading3"/>
+      </w:pPr>
+      <w:r>
+        <w:t>Export catalog or Restore catalog isn't on my Catalog screen.</w:t>
+      </w:r>
+    </w:p>
+    <w:p>
+      <w:r>
+        <w:t xml:space="preserve">Only an </w:t>
+      </w:r>
+      <w:r>
+        <w:rPr>
+          <w:b/>
+        </w:rPr>
+        <w:t>Owner</w:t>
+      </w:r>
+      <w:r>
+        <w:t xml:space="preserve"> can export or restore the catalog.</w:t>
+      </w:r>
+    </w:p>
+    <w:p>
+      <w:pPr>
+        <w:pStyle w:val="Heading3"/>
+      </w:pPr>
+      <w:r>
+        <w:t>I'm on a shared tablet.</w:t>
+      </w:r>
+    </w:p>
+    <w:p>
+      <w:r>
+        <w:t>Always check the name in the top-right corner before you start, and sign out when you're done.</w:t>
+      </w:r>
+    </w:p>
+    <w:p>
+      <w:pPr>
+        <w:pStyle w:val="Heading1"/>
+        <w:pageBreakBefore/>
+      </w:pPr>
+      <w:bookmarkStart w:id="55" w:name="_Toc242013164"/>
+      <w:r>
+        <w:lastRenderedPageBreak/>
+        <w:t>Quick reference</w:t>
+      </w:r>
+      <w:bookmarkEnd w:id="55"/>
+    </w:p>
+    <w:p>
+      <w:pPr>
+        <w:pStyle w:val="Heading2"/>
+      </w:pPr>
+      <w:bookmarkStart w:id="56" w:name="_Toc242013165"/>
+      <w:r>
+        <w:t>Sales rep checklist</w:t>
+      </w:r>
+      <w:bookmarkEnd w:id="56"/>
     </w:p>
     <w:p>
       <w:pPr>
@@ -20226,7 +21027,7 @@
           <w:b/>
           <w:color w:val="0369A1"/>
         </w:rPr>
-        <w:t>4.</w:t>
+        <w:t>1.</w:t>
       </w:r>
       <w:r>
         <w:rPr>
@@ -20236,27 +21037,14 @@
         <w:tab/>
       </w:r>
       <w:r>
-        <w:t xml:space="preserve">Tap </w:t>
-      </w:r>
-      <w:r>
-        <w:rPr>
-          <w:b/>
-        </w:rPr>
-        <w:t>Complete</w:t>
-      </w:r>
-      <w:r>
-        <w:t xml:space="preserve"> and send the customer to checkout.</w:t>
-      </w:r>
-    </w:p>
-    <w:p>
-      <w:pPr>
-        <w:pStyle w:val="Heading2"/>
-      </w:pPr>
-      <w:bookmarkStart w:id="54" w:name="_Toc242011293"/>
-      <w:r>
-        <w:t>Checkout checklist</w:t>
-      </w:r>
-      <w:bookmarkEnd w:id="54"/>
+        <w:rPr>
+          <w:b/>
+        </w:rPr>
+        <w:t>New</w:t>
+      </w:r>
+      <w:r>
+        <w:t>: start the order.</w:t>
+      </w:r>
     </w:p>
     <w:p>
       <w:pPr>
@@ -20271,7 +21059,7 @@
           <w:b/>
           <w:color w:val="0369A1"/>
         </w:rPr>
-        <w:t>1.</w:t>
+        <w:t>2.</w:t>
       </w:r>
       <w:r>
         <w:rPr>
@@ -20281,16 +21069,13 @@
         <w:tab/>
       </w:r>
       <w:r>
-        <w:t xml:space="preserve">Tap the customer's order in </w:t>
-      </w:r>
-      <w:r>
-        <w:rPr>
-          <w:b/>
-        </w:rPr>
-        <w:t>Waiting to pay</w:t>
-      </w:r>
-      <w:r>
-        <w:t>.</w:t>
+        <w:rPr>
+          <w:b/>
+        </w:rPr>
+        <w:t>Add item</w:t>
+      </w:r>
+      <w:r>
+        <w:t>: pick the product, size, shipping and quantity.</w:t>
       </w:r>
     </w:p>
     <w:p>
@@ -20306,7 +21091,7 @@
           <w:b/>
           <w:color w:val="0369A1"/>
         </w:rPr>
-        <w:t>2.</w:t>
+        <w:t>3.</w:t>
       </w:r>
       <w:r>
         <w:rPr>
@@ -20316,7 +21101,16 @@
         <w:tab/>
       </w:r>
       <w:r>
-        <w:t>Review the items and details with the customer.</w:t>
+        <w:t xml:space="preserve">Fill in the customer details, or tap </w:t>
+      </w:r>
+      <w:r>
+        <w:rPr>
+          <w:b/>
+        </w:rPr>
+        <w:t>Hand tablet to customer</w:t>
+      </w:r>
+      <w:r>
+        <w:t>.</w:t>
       </w:r>
     </w:p>
     <w:p>
@@ -20332,7 +21126,7 @@
           <w:b/>
           <w:color w:val="0369A1"/>
         </w:rPr>
-        <w:t>3.</w:t>
+        <w:t>4.</w:t>
       </w:r>
       <w:r>
         <w:rPr>
@@ -20342,17 +21136,27 @@
         <w:tab/>
       </w:r>
       <w:r>
-        <w:t xml:space="preserve">Pick the payment method, then </w:t>
-      </w:r>
-      <w:r>
-        <w:rPr>
-          <w:b/>
-        </w:rPr>
-        <w:t>Record payment</w:t>
-      </w:r>
-      <w:r>
-        <w:t>.</w:t>
-      </w:r>
+        <w:t xml:space="preserve">Tap </w:t>
+      </w:r>
+      <w:r>
+        <w:rPr>
+          <w:b/>
+        </w:rPr>
+        <w:t>Complete</w:t>
+      </w:r>
+      <w:r>
+        <w:t xml:space="preserve"> and send the customer to checkout.</w:t>
+      </w:r>
+    </w:p>
+    <w:p>
+      <w:pPr>
+        <w:pStyle w:val="Heading2"/>
+      </w:pPr>
+      <w:bookmarkStart w:id="57" w:name="_Toc242013166"/>
+      <w:r>
+        <w:t>Checkout checklist</w:t>
+      </w:r>
+      <w:bookmarkEnd w:id="57"/>
     </w:p>
     <w:p>
       <w:pPr>
@@ -20367,7 +21171,7 @@
           <w:b/>
           <w:color w:val="0369A1"/>
         </w:rPr>
-        <w:t>4.</w:t>
+        <w:t>1.</w:t>
       </w:r>
       <w:r>
         <w:rPr>
@@ -20377,13 +21181,16 @@
         <w:tab/>
       </w:r>
       <w:r>
-        <w:rPr>
-          <w:b/>
-        </w:rPr>
-        <w:t>Hand to customer</w:t>
-      </w:r>
-      <w:r>
-        <w:t xml:space="preserve"> to confirm details, initial and sign.</w:t>
+        <w:t xml:space="preserve">Tap the customer's order in </w:t>
+      </w:r>
+      <w:r>
+        <w:rPr>
+          <w:b/>
+        </w:rPr>
+        <w:t>Waiting to pay</w:t>
+      </w:r>
+      <w:r>
+        <w:t>.</w:t>
       </w:r>
     </w:p>
     <w:p>
@@ -20399,7 +21206,7 @@
           <w:b/>
           <w:color w:val="0369A1"/>
         </w:rPr>
-        <w:t>5.</w:t>
+        <w:t>2.</w:t>
       </w:r>
       <w:r>
         <w:rPr>
@@ -20409,42 +21216,8 @@
         <w:tab/>
       </w:r>
       <w:r>
-        <w:rPr>
-          <w:b/>
-        </w:rPr>
-        <w:t>Complete sale</w:t>
-      </w:r>
-      <w:r>
-        <w:t xml:space="preserve">, then </w:t>
-      </w:r>
-      <w:r>
-        <w:rPr>
-          <w:b/>
-        </w:rPr>
-        <w:t>Print</w:t>
-      </w:r>
-      <w:r>
-        <w:t xml:space="preserve"> the sales sheet or </w:t>
-      </w:r>
-      <w:r>
-        <w:rPr>
-          <w:b/>
-        </w:rPr>
-        <w:t>Email</w:t>
-      </w:r>
-      <w:r>
-        <w:t xml:space="preserve"> it to the customer.</w:t>
-      </w:r>
-    </w:p>
-    <w:p>
-      <w:pPr>
-        <w:pStyle w:val="Heading2"/>
-      </w:pPr>
-      <w:bookmarkStart w:id="55" w:name="_Toc242011294"/>
-      <w:r>
-        <w:t>Inventory counts</w:t>
-      </w:r>
-      <w:bookmarkEnd w:id="55"/>
+        <w:t>Review the items and details with the customer.</w:t>
+      </w:r>
     </w:p>
     <w:p>
       <w:pPr>
@@ -20459,7 +21232,7 @@
           <w:b/>
           <w:color w:val="0369A1"/>
         </w:rPr>
-        <w:t>1.</w:t>
+        <w:t>3.</w:t>
       </w:r>
       <w:r>
         <w:rPr>
@@ -20469,31 +21242,13 @@
         <w:tab/>
       </w:r>
       <w:r>
-        <w:t xml:space="preserve">Before the doors open: </w:t>
-      </w:r>
-      <w:r>
-        <w:rPr>
-          <w:b/>
-        </w:rPr>
-        <w:t>Inventory</w:t>
-      </w:r>
-      <w:r>
-        <w:t xml:space="preserve"> → </w:t>
-      </w:r>
-      <w:r>
-        <w:rPr>
-          <w:b/>
-        </w:rPr>
-        <w:t>Start-of-event count</w:t>
-      </w:r>
-      <w:r>
-        <w:t xml:space="preserve"> → </w:t>
-      </w:r>
-      <w:r>
-        <w:rPr>
-          <w:b/>
-        </w:rPr>
-        <w:t>Count now</w:t>
+        <w:t xml:space="preserve">Pick the payment method, then </w:t>
+      </w:r>
+      <w:r>
+        <w:rPr>
+          <w:b/>
+        </w:rPr>
+        <w:t>Record payment</w:t>
       </w:r>
       <w:r>
         <w:t>.</w:t>
@@ -20512,7 +21267,7 @@
           <w:b/>
           <w:color w:val="0369A1"/>
         </w:rPr>
-        <w:t>2.</w:t>
+        <w:t>4.</w:t>
       </w:r>
       <w:r>
         <w:rPr>
@@ -20522,34 +21277,13 @@
         <w:tab/>
       </w:r>
       <w:r>
-        <w:t xml:space="preserve">After the event: </w:t>
-      </w:r>
-      <w:r>
-        <w:rPr>
-          <w:b/>
-        </w:rPr>
-        <w:t>Inventory</w:t>
-      </w:r>
-      <w:r>
-        <w:t xml:space="preserve"> → </w:t>
-      </w:r>
-      <w:r>
-        <w:rPr>
-          <w:b/>
-        </w:rPr>
-        <w:t>End-of-event count</w:t>
-      </w:r>
-      <w:r>
-        <w:t xml:space="preserve"> → </w:t>
-      </w:r>
-      <w:r>
-        <w:rPr>
-          <w:b/>
-        </w:rPr>
-        <w:t>Count now</w:t>
-      </w:r>
-      <w:r>
-        <w:t>.</w:t>
+        <w:rPr>
+          <w:b/>
+        </w:rPr>
+        <w:t>Hand to customer</w:t>
+      </w:r>
+      <w:r>
+        <w:t xml:space="preserve"> to confirm details, initial and sign.</w:t>
       </w:r>
     </w:p>
     <w:p>
@@ -20565,7 +21299,7 @@
           <w:b/>
           <w:color w:val="0369A1"/>
         </w:rPr>
-        <w:t>3.</w:t>
+        <w:t>5.</w:t>
       </w:r>
       <w:r>
         <w:rPr>
@@ -20575,35 +21309,42 @@
         <w:tab/>
       </w:r>
       <w:r>
-        <w:t xml:space="preserve">Enter what's on the shelf for each size, or tap </w:t>
-      </w:r>
-      <w:r>
-        <w:rPr>
-          <w:b/>
-        </w:rPr>
-        <w:t>Matches</w:t>
-      </w:r>
-      <w:r>
-        <w:t xml:space="preserve"> (or </w:t>
-      </w:r>
-      <w:r>
-        <w:rPr>
-          <w:b/>
-        </w:rPr>
-        <w:t>Fill the rest as matching</w:t>
-      </w:r>
-      <w:r>
-        <w:t xml:space="preserve">), then </w:t>
-      </w:r>
-      <w:r>
-        <w:rPr>
-          <w:b/>
-        </w:rPr>
-        <w:t>Save count</w:t>
-      </w:r>
-      <w:r>
-        <w:t>.</w:t>
-      </w:r>
+        <w:rPr>
+          <w:b/>
+        </w:rPr>
+        <w:t>Complete sale</w:t>
+      </w:r>
+      <w:r>
+        <w:t xml:space="preserve">, then </w:t>
+      </w:r>
+      <w:r>
+        <w:rPr>
+          <w:b/>
+        </w:rPr>
+        <w:t>Print</w:t>
+      </w:r>
+      <w:r>
+        <w:t xml:space="preserve"> the sales sheet or </w:t>
+      </w:r>
+      <w:r>
+        <w:rPr>
+          <w:b/>
+        </w:rPr>
+        <w:t>Email</w:t>
+      </w:r>
+      <w:r>
+        <w:t xml:space="preserve"> it to the customer.</w:t>
+      </w:r>
+    </w:p>
+    <w:p>
+      <w:pPr>
+        <w:pStyle w:val="Heading2"/>
+      </w:pPr>
+      <w:bookmarkStart w:id="58" w:name="_Toc242013167"/>
+      <w:r>
+        <w:t>Inventory counts</w:t>
+      </w:r>
+      <w:bookmarkEnd w:id="58"/>
     </w:p>
     <w:p>
       <w:pPr>
@@ -20618,6 +21359,165 @@
           <w:b/>
           <w:color w:val="0369A1"/>
         </w:rPr>
+        <w:t>1.</w:t>
+      </w:r>
+      <w:r>
+        <w:rPr>
+          <w:b/>
+          <w:color w:val="0369A1"/>
+        </w:rPr>
+        <w:tab/>
+      </w:r>
+      <w:r>
+        <w:t xml:space="preserve">Before the doors open: </w:t>
+      </w:r>
+      <w:r>
+        <w:rPr>
+          <w:b/>
+        </w:rPr>
+        <w:t>Inventory</w:t>
+      </w:r>
+      <w:r>
+        <w:t xml:space="preserve"> → </w:t>
+      </w:r>
+      <w:r>
+        <w:rPr>
+          <w:b/>
+        </w:rPr>
+        <w:t>Start-of-event count</w:t>
+      </w:r>
+      <w:r>
+        <w:t xml:space="preserve"> → </w:t>
+      </w:r>
+      <w:r>
+        <w:rPr>
+          <w:b/>
+        </w:rPr>
+        <w:t>Count now</w:t>
+      </w:r>
+      <w:r>
+        <w:t>.</w:t>
+      </w:r>
+    </w:p>
+    <w:p>
+      <w:pPr>
+        <w:tabs>
+          <w:tab w:val="left" w:pos="504"/>
+        </w:tabs>
+        <w:spacing w:after="80"/>
+        <w:ind w:left="504" w:hanging="432"/>
+      </w:pPr>
+      <w:r>
+        <w:rPr>
+          <w:b/>
+          <w:color w:val="0369A1"/>
+        </w:rPr>
+        <w:t>2.</w:t>
+      </w:r>
+      <w:r>
+        <w:rPr>
+          <w:b/>
+          <w:color w:val="0369A1"/>
+        </w:rPr>
+        <w:tab/>
+      </w:r>
+      <w:r>
+        <w:t xml:space="preserve">After the event: </w:t>
+      </w:r>
+      <w:r>
+        <w:rPr>
+          <w:b/>
+        </w:rPr>
+        <w:t>Inventory</w:t>
+      </w:r>
+      <w:r>
+        <w:t xml:space="preserve"> → </w:t>
+      </w:r>
+      <w:r>
+        <w:rPr>
+          <w:b/>
+        </w:rPr>
+        <w:t>End-of-event count</w:t>
+      </w:r>
+      <w:r>
+        <w:t xml:space="preserve"> → </w:t>
+      </w:r>
+      <w:r>
+        <w:rPr>
+          <w:b/>
+        </w:rPr>
+        <w:t>Count now</w:t>
+      </w:r>
+      <w:r>
+        <w:t>.</w:t>
+      </w:r>
+    </w:p>
+    <w:p>
+      <w:pPr>
+        <w:tabs>
+          <w:tab w:val="left" w:pos="504"/>
+        </w:tabs>
+        <w:spacing w:after="80"/>
+        <w:ind w:left="504" w:hanging="432"/>
+      </w:pPr>
+      <w:r>
+        <w:rPr>
+          <w:b/>
+          <w:color w:val="0369A1"/>
+        </w:rPr>
+        <w:t>3.</w:t>
+      </w:r>
+      <w:r>
+        <w:rPr>
+          <w:b/>
+          <w:color w:val="0369A1"/>
+        </w:rPr>
+        <w:tab/>
+      </w:r>
+      <w:r>
+        <w:t xml:space="preserve">Enter what's on the shelf for each size, or tap </w:t>
+      </w:r>
+      <w:r>
+        <w:rPr>
+          <w:b/>
+        </w:rPr>
+        <w:t>Matches</w:t>
+      </w:r>
+      <w:r>
+        <w:t xml:space="preserve"> (or </w:t>
+      </w:r>
+      <w:r>
+        <w:rPr>
+          <w:b/>
+        </w:rPr>
+        <w:t>Fill the rest as matching</w:t>
+      </w:r>
+      <w:r>
+        <w:t xml:space="preserve">), then </w:t>
+      </w:r>
+      <w:r>
+        <w:rPr>
+          <w:b/>
+        </w:rPr>
+        <w:t>Save count</w:t>
+      </w:r>
+      <w:r>
+        <w:t>.</w:t>
+      </w:r>
+    </w:p>
+    <w:p>
+      <w:pPr>
+        <w:tabs>
+          <w:tab w:val="left" w:pos="504"/>
+        </w:tabs>
+        <w:spacing w:after="80"/>
+        <w:ind w:left="504" w:hanging="432"/>
+      </w:pPr>
+      <w:r>
+        <w:rPr>
+          <w:b/>
+          <w:color w:val="0369A1"/>
+        </w:rPr>
         <w:t>4.</w:t>
       </w:r>
       <w:r>
@@ -20644,11 +21544,11 @@
       <w:pPr>
         <w:pStyle w:val="Heading2"/>
       </w:pPr>
-      <w:bookmarkStart w:id="56" w:name="_Toc242011295"/>
+      <w:bookmarkStart w:id="59" w:name="_Toc242013168"/>
       <w:r>
         <w:t>Order status at a glance</w:t>
       </w:r>
-      <w:bookmarkEnd w:id="56"/>
+      <w:bookmarkEnd w:id="59"/>
     </w:p>
     <w:tbl>
       <w:tblPr>
@@ -20968,7 +21868,7 @@
       </w:pPr>
     </w:p>
     <w:sectPr>
-      <w:footerReference w:type="default" r:id="rId49"/>
+      <w:footerReference w:type="default" r:id="rId51"/>
       <w:pgSz w:w="12240" w:h="15840"/>
       <w:pgMar w:top="1296" w:right="1440" w:bottom="1296" w:left="1440" w:header="720" w:footer="720" w:gutter="0"/>
       <w:cols w:space="720"/>
@@ -21264,31 +22164,31 @@
       </w:rPr>
     </w:lvl>
   </w:abstractNum>
-  <w:num w:numId="1" w16cid:durableId="159195658">
+  <w:num w:numId="1" w16cid:durableId="1473449284">
     <w:abstractNumId w:val="8"/>
   </w:num>
-  <w:num w:numId="2" w16cid:durableId="251353431">
+  <w:num w:numId="2" w16cid:durableId="152067001">
     <w:abstractNumId w:val="6"/>
   </w:num>
-  <w:num w:numId="3" w16cid:durableId="1567229824">
+  <w:num w:numId="3" w16cid:durableId="1385981142">
     <w:abstractNumId w:val="5"/>
   </w:num>
-  <w:num w:numId="4" w16cid:durableId="1335887360">
+  <w:num w:numId="4" w16cid:durableId="1463764056">
     <w:abstractNumId w:val="4"/>
   </w:num>
-  <w:num w:numId="5" w16cid:durableId="976371370">
+  <w:num w:numId="5" w16cid:durableId="14772041">
     <w:abstractNumId w:val="7"/>
   </w:num>
-  <w:num w:numId="6" w16cid:durableId="1864435299">
+  <w:num w:numId="6" w16cid:durableId="363559026">
     <w:abstractNumId w:val="3"/>
   </w:num>
-  <w:num w:numId="7" w16cid:durableId="231626068">
+  <w:num w:numId="7" w16cid:durableId="585845614">
     <w:abstractNumId w:val="2"/>
   </w:num>
-  <w:num w:numId="8" w16cid:durableId="1786191671">
+  <w:num w:numId="8" w16cid:durableId="1926185301">
     <w:abstractNumId w:val="1"/>
   </w:num>
-  <w:num w:numId="9" w16cid:durableId="541212968">
+  <w:num w:numId="9" w16cid:durableId="418408840">
     <w:abstractNumId w:val="0"/>
   </w:num>
 </w:numbering>
@@ -32680,7 +33580,7 @@
     <w:autoRedefine/>
     <w:uiPriority w:val="39"/>
     <w:unhideWhenUsed/>
-    <w:rsid w:val="00241AE8"/>
+    <w:rsid w:val="00F15F69"/>
     <w:pPr>
       <w:spacing w:after="100"/>
     </w:pPr>
@@ -32692,7 +33592,7 @@
     <w:autoRedefine/>
     <w:uiPriority w:val="39"/>
     <w:unhideWhenUsed/>
-    <w:rsid w:val="00241AE8"/>
+    <w:rsid w:val="00F15F69"/>
     <w:pPr>
       <w:spacing w:after="100"/>
       <w:ind w:left="220"/>
@@ -32703,7 +33603,7 @@
     <w:basedOn w:val="DefaultParagraphFont"/>
     <w:uiPriority w:val="99"/>
     <w:unhideWhenUsed/>
-    <w:rsid w:val="00241AE8"/>
+    <w:rsid w:val="00F15F69"/>
     <w:rPr>
       <w:color w:val="0000FF" w:themeColor="hyperlink"/>
       <w:u w:val="single"/>

</xml_diff>

<commit_message>
Mattress size guide for every role
- A ruler button in the menu bar, on every screen and for every role,
  opens the mattress size chart (public/mattress_sizes.png) with each
  size's width and length in inches alongside.
- Add item has a Size guide link beside Size & configuration that opens
  the same chart over the item.
- README and user guide updated.

Co-Authored-By: Claude Opus 5.5 <noreply@anthropic.com>
</commit_message>
<xml_diff>
--- a/Documents/CFS Sales App User Guide.docx
+++ b/Documents/CFS Sales App User Guide.docx
@@ -345,7 +345,7 @@
       <w:r>
         <w:fldChar w:fldCharType="separate"/>
       </w:r>
-      <w:hyperlink w:anchor="_Toc242102868" w:history="1">
+      <w:hyperlink w:anchor="_Toc242187218" w:history="1">
         <w:r>
           <w:rPr>
             <w:rStyle w:val="Hyperlink"/>
@@ -372,7 +372,7 @@
             <w:noProof/>
             <w:webHidden/>
           </w:rPr>
-          <w:instrText xml:space="preserve"> PAGEREF _Toc242102868 \h </w:instrText>
+          <w:instrText xml:space="preserve"> PAGEREF _Toc242187218 \h </w:instrText>
         </w:r>
         <w:r>
           <w:rPr>
@@ -413,7 +413,7 @@
           <w:noProof/>
         </w:rPr>
       </w:pPr>
-      <w:hyperlink w:anchor="_Toc242102869" w:history="1">
+      <w:hyperlink w:anchor="_Toc242187219" w:history="1">
         <w:r>
           <w:rPr>
             <w:rStyle w:val="Hyperlink"/>
@@ -440,7 +440,7 @@
             <w:noProof/>
             <w:webHidden/>
           </w:rPr>
-          <w:instrText xml:space="preserve"> PAGEREF _Toc242102869 \h </w:instrText>
+          <w:instrText xml:space="preserve"> PAGEREF _Toc242187219 \h </w:instrText>
         </w:r>
         <w:r>
           <w:rPr>
@@ -481,7 +481,7 @@
           <w:noProof/>
         </w:rPr>
       </w:pPr>
-      <w:hyperlink w:anchor="_Toc242102870" w:history="1">
+      <w:hyperlink w:anchor="_Toc242187220" w:history="1">
         <w:r>
           <w:rPr>
             <w:rStyle w:val="Hyperlink"/>
@@ -508,7 +508,7 @@
             <w:noProof/>
             <w:webHidden/>
           </w:rPr>
-          <w:instrText xml:space="preserve"> PAGEREF _Toc242102870 \h </w:instrText>
+          <w:instrText xml:space="preserve"> PAGEREF _Toc242187220 \h </w:instrText>
         </w:r>
         <w:r>
           <w:rPr>
@@ -549,7 +549,7 @@
           <w:noProof/>
         </w:rPr>
       </w:pPr>
-      <w:hyperlink w:anchor="_Toc242102871" w:history="1">
+      <w:hyperlink w:anchor="_Toc242187221" w:history="1">
         <w:r>
           <w:rPr>
             <w:rStyle w:val="Hyperlink"/>
@@ -576,7 +576,7 @@
             <w:noProof/>
             <w:webHidden/>
           </w:rPr>
-          <w:instrText xml:space="preserve"> PAGEREF _Toc242102871 \h </w:instrText>
+          <w:instrText xml:space="preserve"> PAGEREF _Toc242187221 \h </w:instrText>
         </w:r>
         <w:r>
           <w:rPr>
@@ -617,7 +617,7 @@
           <w:noProof/>
         </w:rPr>
       </w:pPr>
-      <w:hyperlink w:anchor="_Toc242102872" w:history="1">
+      <w:hyperlink w:anchor="_Toc242187222" w:history="1">
         <w:r>
           <w:rPr>
             <w:rStyle w:val="Hyperlink"/>
@@ -644,7 +644,7 @@
             <w:noProof/>
             <w:webHidden/>
           </w:rPr>
-          <w:instrText xml:space="preserve"> PAGEREF _Toc242102872 \h </w:instrText>
+          <w:instrText xml:space="preserve"> PAGEREF _Toc242187222 \h </w:instrText>
         </w:r>
         <w:r>
           <w:rPr>
@@ -685,7 +685,7 @@
           <w:noProof/>
         </w:rPr>
       </w:pPr>
-      <w:hyperlink w:anchor="_Toc242102873" w:history="1">
+      <w:hyperlink w:anchor="_Toc242187223" w:history="1">
         <w:r>
           <w:rPr>
             <w:rStyle w:val="Hyperlink"/>
@@ -712,7 +712,7 @@
             <w:noProof/>
             <w:webHidden/>
           </w:rPr>
-          <w:instrText xml:space="preserve"> PAGEREF _Toc242102873 \h </w:instrText>
+          <w:instrText xml:space="preserve"> PAGEREF _Toc242187223 \h </w:instrText>
         </w:r>
         <w:r>
           <w:rPr>
@@ -753,7 +753,7 @@
           <w:noProof/>
         </w:rPr>
       </w:pPr>
-      <w:hyperlink w:anchor="_Toc242102874" w:history="1">
+      <w:hyperlink w:anchor="_Toc242187224" w:history="1">
         <w:r>
           <w:rPr>
             <w:rStyle w:val="Hyperlink"/>
@@ -780,7 +780,7 @@
             <w:noProof/>
             <w:webHidden/>
           </w:rPr>
-          <w:instrText xml:space="preserve"> PAGEREF _Toc242102874 \h </w:instrText>
+          <w:instrText xml:space="preserve"> PAGEREF _Toc242187224 \h </w:instrText>
         </w:r>
         <w:r>
           <w:rPr>
@@ -821,7 +821,7 @@
           <w:noProof/>
         </w:rPr>
       </w:pPr>
-      <w:hyperlink w:anchor="_Toc242102875" w:history="1">
+      <w:hyperlink w:anchor="_Toc242187225" w:history="1">
         <w:r>
           <w:rPr>
             <w:rStyle w:val="Hyperlink"/>
@@ -848,7 +848,7 @@
             <w:noProof/>
             <w:webHidden/>
           </w:rPr>
-          <w:instrText xml:space="preserve"> PAGEREF _Toc242102875 \h </w:instrText>
+          <w:instrText xml:space="preserve"> PAGEREF _Toc242187225 \h </w:instrText>
         </w:r>
         <w:r>
           <w:rPr>
@@ -889,13 +889,13 @@
           <w:noProof/>
         </w:rPr>
       </w:pPr>
-      <w:hyperlink w:anchor="_Toc242102876" w:history="1">
+      <w:hyperlink w:anchor="_Toc242187226" w:history="1">
         <w:r>
           <w:rPr>
             <w:rStyle w:val="Hyperlink"/>
             <w:noProof/>
           </w:rPr>
-          <w:t>Light and dark mode</w:t>
+          <w:t>Mattress size guide</w:t>
         </w:r>
         <w:r>
           <w:rPr>
@@ -916,7 +916,7 @@
             <w:noProof/>
             <w:webHidden/>
           </w:rPr>
-          <w:instrText xml:space="preserve"> PAGEREF _Toc242102876 \h </w:instrText>
+          <w:instrText xml:space="preserve"> PAGEREF _Toc242187226 \h </w:instrText>
         </w:r>
         <w:r>
           <w:rPr>
@@ -957,12 +957,80 @@
           <w:noProof/>
         </w:rPr>
       </w:pPr>
-      <w:hyperlink w:anchor="_Toc242102877" w:history="1">
+      <w:hyperlink w:anchor="_Toc242187227" w:history="1">
         <w:r>
           <w:rPr>
             <w:rStyle w:val="Hyperlink"/>
             <w:noProof/>
           </w:rPr>
+          <w:t>Light and dark mode</w:t>
+        </w:r>
+        <w:r>
+          <w:rPr>
+            <w:noProof/>
+            <w:webHidden/>
+          </w:rPr>
+          <w:tab/>
+        </w:r>
+        <w:r>
+          <w:rPr>
+            <w:noProof/>
+            <w:webHidden/>
+          </w:rPr>
+          <w:fldChar w:fldCharType="begin"/>
+        </w:r>
+        <w:r>
+          <w:rPr>
+            <w:noProof/>
+            <w:webHidden/>
+          </w:rPr>
+          <w:instrText xml:space="preserve"> PAGEREF _Toc242187227 \h </w:instrText>
+        </w:r>
+        <w:r>
+          <w:rPr>
+            <w:noProof/>
+            <w:webHidden/>
+          </w:rPr>
+        </w:r>
+        <w:r>
+          <w:rPr>
+            <w:noProof/>
+            <w:webHidden/>
+          </w:rPr>
+          <w:fldChar w:fldCharType="separate"/>
+        </w:r>
+        <w:r>
+          <w:rPr>
+            <w:noProof/>
+            <w:webHidden/>
+          </w:rPr>
+          <w:t>8</w:t>
+        </w:r>
+        <w:r>
+          <w:rPr>
+            <w:noProof/>
+            <w:webHidden/>
+          </w:rPr>
+          <w:fldChar w:fldCharType="end"/>
+        </w:r>
+      </w:hyperlink>
+    </w:p>
+    <w:p>
+      <w:pPr>
+        <w:pStyle w:val="TOC2"/>
+        <w:tabs>
+          <w:tab w:val="right" w:leader="dot" w:pos="9350"/>
+        </w:tabs>
+        <w:rPr>
+          <w:noProof/>
+        </w:rPr>
+      </w:pPr>
+      <w:hyperlink w:anchor="_Toc242187228" w:history="1">
+        <w:r>
+          <w:rPr>
+            <w:rStyle w:val="Hyperlink"/>
+            <w:noProof/>
+          </w:rPr>
           <w:t>Signing out</w:t>
         </w:r>
         <w:r>
@@ -984,7 +1052,7 @@
             <w:noProof/>
             <w:webHidden/>
           </w:rPr>
-          <w:instrText xml:space="preserve"> PAGEREF _Toc242102877 \h </w:instrText>
+          <w:instrText xml:space="preserve"> PAGEREF _Toc242187228 \h </w:instrText>
         </w:r>
         <w:r>
           <w:rPr>
@@ -1004,7 +1072,7 @@
             <w:noProof/>
             <w:webHidden/>
           </w:rPr>
-          <w:t>7</w:t>
+          <w:t>8</w:t>
         </w:r>
         <w:r>
           <w:rPr>
@@ -1025,7 +1093,7 @@
           <w:noProof/>
         </w:rPr>
       </w:pPr>
-      <w:hyperlink w:anchor="_Toc242102878" w:history="1">
+      <w:hyperlink w:anchor="_Toc242187229" w:history="1">
         <w:r>
           <w:rPr>
             <w:rStyle w:val="Hyperlink"/>
@@ -1052,7 +1120,7 @@
             <w:noProof/>
             <w:webHidden/>
           </w:rPr>
-          <w:instrText xml:space="preserve"> PAGEREF _Toc242102878 \h </w:instrText>
+          <w:instrText xml:space="preserve"> PAGEREF _Toc242187229 \h </w:instrText>
         </w:r>
         <w:r>
           <w:rPr>
@@ -1072,7 +1140,7 @@
             <w:noProof/>
             <w:webHidden/>
           </w:rPr>
-          <w:t>8</w:t>
+          <w:t>9</w:t>
         </w:r>
         <w:r>
           <w:rPr>
@@ -1093,7 +1161,7 @@
           <w:noProof/>
         </w:rPr>
       </w:pPr>
-      <w:hyperlink w:anchor="_Toc242102879" w:history="1">
+      <w:hyperlink w:anchor="_Toc242187230" w:history="1">
         <w:r>
           <w:rPr>
             <w:rStyle w:val="Hyperlink"/>
@@ -1120,7 +1188,7 @@
             <w:noProof/>
             <w:webHidden/>
           </w:rPr>
-          <w:instrText xml:space="preserve"> PAGEREF _Toc242102879 \h </w:instrText>
+          <w:instrText xml:space="preserve"> PAGEREF _Toc242187230 \h </w:instrText>
         </w:r>
         <w:r>
           <w:rPr>
@@ -1140,7 +1208,7 @@
             <w:noProof/>
             <w:webHidden/>
           </w:rPr>
-          <w:t>8</w:t>
+          <w:t>9</w:t>
         </w:r>
         <w:r>
           <w:rPr>
@@ -1161,7 +1229,7 @@
           <w:noProof/>
         </w:rPr>
       </w:pPr>
-      <w:hyperlink w:anchor="_Toc242102880" w:history="1">
+      <w:hyperlink w:anchor="_Toc242187231" w:history="1">
         <w:r>
           <w:rPr>
             <w:rStyle w:val="Hyperlink"/>
@@ -1188,7 +1256,7 @@
             <w:noProof/>
             <w:webHidden/>
           </w:rPr>
-          <w:instrText xml:space="preserve"> PAGEREF _Toc242102880 \h </w:instrText>
+          <w:instrText xml:space="preserve"> PAGEREF _Toc242187231 \h </w:instrText>
         </w:r>
         <w:r>
           <w:rPr>
@@ -1208,7 +1276,7 @@
             <w:noProof/>
             <w:webHidden/>
           </w:rPr>
-          <w:t>9</w:t>
+          <w:t>10</w:t>
         </w:r>
         <w:r>
           <w:rPr>
@@ -1229,7 +1297,7 @@
           <w:noProof/>
         </w:rPr>
       </w:pPr>
-      <w:hyperlink w:anchor="_Toc242102881" w:history="1">
+      <w:hyperlink w:anchor="_Toc242187232" w:history="1">
         <w:r>
           <w:rPr>
             <w:rStyle w:val="Hyperlink"/>
@@ -1256,7 +1324,7 @@
             <w:noProof/>
             <w:webHidden/>
           </w:rPr>
-          <w:instrText xml:space="preserve"> PAGEREF _Toc242102881 \h </w:instrText>
+          <w:instrText xml:space="preserve"> PAGEREF _Toc242187232 \h </w:instrText>
         </w:r>
         <w:r>
           <w:rPr>
@@ -1276,7 +1344,7 @@
             <w:noProof/>
             <w:webHidden/>
           </w:rPr>
-          <w:t>12</w:t>
+          <w:t>13</w:t>
         </w:r>
         <w:r>
           <w:rPr>
@@ -1297,7 +1365,7 @@
           <w:noProof/>
         </w:rPr>
       </w:pPr>
-      <w:hyperlink w:anchor="_Toc242102882" w:history="1">
+      <w:hyperlink w:anchor="_Toc242187233" w:history="1">
         <w:r>
           <w:rPr>
             <w:rStyle w:val="Hyperlink"/>
@@ -1324,7 +1392,7 @@
             <w:noProof/>
             <w:webHidden/>
           </w:rPr>
-          <w:instrText xml:space="preserve"> PAGEREF _Toc242102882 \h </w:instrText>
+          <w:instrText xml:space="preserve"> PAGEREF _Toc242187233 \h </w:instrText>
         </w:r>
         <w:r>
           <w:rPr>
@@ -1344,7 +1412,7 @@
             <w:noProof/>
             <w:webHidden/>
           </w:rPr>
-          <w:t>13</w:t>
+          <w:t>14</w:t>
         </w:r>
         <w:r>
           <w:rPr>
@@ -1365,7 +1433,7 @@
           <w:noProof/>
         </w:rPr>
       </w:pPr>
-      <w:hyperlink w:anchor="_Toc242102883" w:history="1">
+      <w:hyperlink w:anchor="_Toc242187234" w:history="1">
         <w:r>
           <w:rPr>
             <w:rStyle w:val="Hyperlink"/>
@@ -1392,7 +1460,7 @@
             <w:noProof/>
             <w:webHidden/>
           </w:rPr>
-          <w:instrText xml:space="preserve"> PAGEREF _Toc242102883 \h </w:instrText>
+          <w:instrText xml:space="preserve"> PAGEREF _Toc242187234 \h </w:instrText>
         </w:r>
         <w:r>
           <w:rPr>
@@ -1412,7 +1480,7 @@
             <w:noProof/>
             <w:webHidden/>
           </w:rPr>
-          <w:t>13</w:t>
+          <w:t>14</w:t>
         </w:r>
         <w:r>
           <w:rPr>
@@ -1433,7 +1501,7 @@
           <w:noProof/>
         </w:rPr>
       </w:pPr>
-      <w:hyperlink w:anchor="_Toc242102884" w:history="1">
+      <w:hyperlink w:anchor="_Toc242187235" w:history="1">
         <w:r>
           <w:rPr>
             <w:rStyle w:val="Hyperlink"/>
@@ -1460,7 +1528,7 @@
             <w:noProof/>
             <w:webHidden/>
           </w:rPr>
-          <w:instrText xml:space="preserve"> PAGEREF _Toc242102884 \h </w:instrText>
+          <w:instrText xml:space="preserve"> PAGEREF _Toc242187235 \h </w:instrText>
         </w:r>
         <w:r>
           <w:rPr>
@@ -1480,7 +1548,7 @@
             <w:noProof/>
             <w:webHidden/>
           </w:rPr>
-          <w:t>14</w:t>
+          <w:t>15</w:t>
         </w:r>
         <w:r>
           <w:rPr>
@@ -1501,7 +1569,7 @@
           <w:noProof/>
         </w:rPr>
       </w:pPr>
-      <w:hyperlink w:anchor="_Toc242102885" w:history="1">
+      <w:hyperlink w:anchor="_Toc242187236" w:history="1">
         <w:r>
           <w:rPr>
             <w:rStyle w:val="Hyperlink"/>
@@ -1528,7 +1596,7 @@
             <w:noProof/>
             <w:webHidden/>
           </w:rPr>
-          <w:instrText xml:space="preserve"> PAGEREF _Toc242102885 \h </w:instrText>
+          <w:instrText xml:space="preserve"> PAGEREF _Toc242187236 \h </w:instrText>
         </w:r>
         <w:r>
           <w:rPr>
@@ -1548,7 +1616,7 @@
             <w:noProof/>
             <w:webHidden/>
           </w:rPr>
-          <w:t>15</w:t>
+          <w:t>16</w:t>
         </w:r>
         <w:r>
           <w:rPr>
@@ -1569,7 +1637,7 @@
           <w:noProof/>
         </w:rPr>
       </w:pPr>
-      <w:hyperlink w:anchor="_Toc242102886" w:history="1">
+      <w:hyperlink w:anchor="_Toc242187237" w:history="1">
         <w:r>
           <w:rPr>
             <w:rStyle w:val="Hyperlink"/>
@@ -1596,7 +1664,7 @@
             <w:noProof/>
             <w:webHidden/>
           </w:rPr>
-          <w:instrText xml:space="preserve"> PAGEREF _Toc242102886 \h </w:instrText>
+          <w:instrText xml:space="preserve"> PAGEREF _Toc242187237 \h </w:instrText>
         </w:r>
         <w:r>
           <w:rPr>
@@ -1616,7 +1684,7 @@
             <w:noProof/>
             <w:webHidden/>
           </w:rPr>
-          <w:t>16</w:t>
+          <w:t>17</w:t>
         </w:r>
         <w:r>
           <w:rPr>
@@ -1637,7 +1705,7 @@
           <w:noProof/>
         </w:rPr>
       </w:pPr>
-      <w:hyperlink w:anchor="_Toc242102887" w:history="1">
+      <w:hyperlink w:anchor="_Toc242187238" w:history="1">
         <w:r>
           <w:rPr>
             <w:rStyle w:val="Hyperlink"/>
@@ -1664,7 +1732,7 @@
             <w:noProof/>
             <w:webHidden/>
           </w:rPr>
-          <w:instrText xml:space="preserve"> PAGEREF _Toc242102887 \h </w:instrText>
+          <w:instrText xml:space="preserve"> PAGEREF _Toc242187238 \h </w:instrText>
         </w:r>
         <w:r>
           <w:rPr>
@@ -1684,7 +1752,7 @@
             <w:noProof/>
             <w:webHidden/>
           </w:rPr>
-          <w:t>16</w:t>
+          <w:t>17</w:t>
         </w:r>
         <w:r>
           <w:rPr>
@@ -1705,7 +1773,7 @@
           <w:noProof/>
         </w:rPr>
       </w:pPr>
-      <w:hyperlink w:anchor="_Toc242102888" w:history="1">
+      <w:hyperlink w:anchor="_Toc242187239" w:history="1">
         <w:r>
           <w:rPr>
             <w:rStyle w:val="Hyperlink"/>
@@ -1732,7 +1800,7 @@
             <w:noProof/>
             <w:webHidden/>
           </w:rPr>
-          <w:instrText xml:space="preserve"> PAGEREF _Toc242102888 \h </w:instrText>
+          <w:instrText xml:space="preserve"> PAGEREF _Toc242187239 \h </w:instrText>
         </w:r>
         <w:r>
           <w:rPr>
@@ -1752,7 +1820,7 @@
             <w:noProof/>
             <w:webHidden/>
           </w:rPr>
-          <w:t>16</w:t>
+          <w:t>17</w:t>
         </w:r>
         <w:r>
           <w:rPr>
@@ -1773,7 +1841,7 @@
           <w:noProof/>
         </w:rPr>
       </w:pPr>
-      <w:hyperlink w:anchor="_Toc242102889" w:history="1">
+      <w:hyperlink w:anchor="_Toc242187240" w:history="1">
         <w:r>
           <w:rPr>
             <w:rStyle w:val="Hyperlink"/>
@@ -1800,7 +1868,7 @@
             <w:noProof/>
             <w:webHidden/>
           </w:rPr>
-          <w:instrText xml:space="preserve"> PAGEREF _Toc242102889 \h </w:instrText>
+          <w:instrText xml:space="preserve"> PAGEREF _Toc242187240 \h </w:instrText>
         </w:r>
         <w:r>
           <w:rPr>
@@ -1820,7 +1888,7 @@
             <w:noProof/>
             <w:webHidden/>
           </w:rPr>
-          <w:t>17</w:t>
+          <w:t>18</w:t>
         </w:r>
         <w:r>
           <w:rPr>
@@ -1841,7 +1909,7 @@
           <w:noProof/>
         </w:rPr>
       </w:pPr>
-      <w:hyperlink w:anchor="_Toc242102890" w:history="1">
+      <w:hyperlink w:anchor="_Toc242187241" w:history="1">
         <w:r>
           <w:rPr>
             <w:rStyle w:val="Hyperlink"/>
@@ -1868,7 +1936,7 @@
             <w:noProof/>
             <w:webHidden/>
           </w:rPr>
-          <w:instrText xml:space="preserve"> PAGEREF _Toc242102890 \h </w:instrText>
+          <w:instrText xml:space="preserve"> PAGEREF _Toc242187241 \h </w:instrText>
         </w:r>
         <w:r>
           <w:rPr>
@@ -1888,7 +1956,7 @@
             <w:noProof/>
             <w:webHidden/>
           </w:rPr>
-          <w:t>18</w:t>
+          <w:t>19</w:t>
         </w:r>
         <w:r>
           <w:rPr>
@@ -1909,7 +1977,7 @@
           <w:noProof/>
         </w:rPr>
       </w:pPr>
-      <w:hyperlink w:anchor="_Toc242102891" w:history="1">
+      <w:hyperlink w:anchor="_Toc242187242" w:history="1">
         <w:r>
           <w:rPr>
             <w:rStyle w:val="Hyperlink"/>
@@ -1936,7 +2004,7 @@
             <w:noProof/>
             <w:webHidden/>
           </w:rPr>
-          <w:instrText xml:space="preserve"> PAGEREF _Toc242102891 \h </w:instrText>
+          <w:instrText xml:space="preserve"> PAGEREF _Toc242187242 \h </w:instrText>
         </w:r>
         <w:r>
           <w:rPr>
@@ -1956,7 +2024,7 @@
             <w:noProof/>
             <w:webHidden/>
           </w:rPr>
-          <w:t>19</w:t>
+          <w:t>20</w:t>
         </w:r>
         <w:r>
           <w:rPr>
@@ -1977,7 +2045,7 @@
           <w:noProof/>
         </w:rPr>
       </w:pPr>
-      <w:hyperlink w:anchor="_Toc242102892" w:history="1">
+      <w:hyperlink w:anchor="_Toc242187243" w:history="1">
         <w:r>
           <w:rPr>
             <w:rStyle w:val="Hyperlink"/>
@@ -2004,7 +2072,7 @@
             <w:noProof/>
             <w:webHidden/>
           </w:rPr>
-          <w:instrText xml:space="preserve"> PAGEREF _Toc242102892 \h </w:instrText>
+          <w:instrText xml:space="preserve"> PAGEREF _Toc242187243 \h </w:instrText>
         </w:r>
         <w:r>
           <w:rPr>
@@ -2024,7 +2092,7 @@
             <w:noProof/>
             <w:webHidden/>
           </w:rPr>
-          <w:t>20</w:t>
+          <w:t>21</w:t>
         </w:r>
         <w:r>
           <w:rPr>
@@ -2045,7 +2113,7 @@
           <w:noProof/>
         </w:rPr>
       </w:pPr>
-      <w:hyperlink w:anchor="_Toc242102893" w:history="1">
+      <w:hyperlink w:anchor="_Toc242187244" w:history="1">
         <w:r>
           <w:rPr>
             <w:rStyle w:val="Hyperlink"/>
@@ -2072,7 +2140,7 @@
             <w:noProof/>
             <w:webHidden/>
           </w:rPr>
-          <w:instrText xml:space="preserve"> PAGEREF _Toc242102893 \h </w:instrText>
+          <w:instrText xml:space="preserve"> PAGEREF _Toc242187244 \h </w:instrText>
         </w:r>
         <w:r>
           <w:rPr>
@@ -2092,7 +2160,7 @@
             <w:noProof/>
             <w:webHidden/>
           </w:rPr>
-          <w:t>21</w:t>
+          <w:t>22</w:t>
         </w:r>
         <w:r>
           <w:rPr>
@@ -2113,7 +2181,7 @@
           <w:noProof/>
         </w:rPr>
       </w:pPr>
-      <w:hyperlink w:anchor="_Toc242102894" w:history="1">
+      <w:hyperlink w:anchor="_Toc242187245" w:history="1">
         <w:r>
           <w:rPr>
             <w:rStyle w:val="Hyperlink"/>
@@ -2140,7 +2208,7 @@
             <w:noProof/>
             <w:webHidden/>
           </w:rPr>
-          <w:instrText xml:space="preserve"> PAGEREF _Toc242102894 \h </w:instrText>
+          <w:instrText xml:space="preserve"> PAGEREF _Toc242187245 \h </w:instrText>
         </w:r>
         <w:r>
           <w:rPr>
@@ -2160,7 +2228,7 @@
             <w:noProof/>
             <w:webHidden/>
           </w:rPr>
-          <w:t>23</w:t>
+          <w:t>24</w:t>
         </w:r>
         <w:r>
           <w:rPr>
@@ -2181,7 +2249,7 @@
           <w:noProof/>
         </w:rPr>
       </w:pPr>
-      <w:hyperlink w:anchor="_Toc242102895" w:history="1">
+      <w:hyperlink w:anchor="_Toc242187246" w:history="1">
         <w:r>
           <w:rPr>
             <w:rStyle w:val="Hyperlink"/>
@@ -2208,7 +2276,7 @@
             <w:noProof/>
             <w:webHidden/>
           </w:rPr>
-          <w:instrText xml:space="preserve"> PAGEREF _Toc242102895 \h </w:instrText>
+          <w:instrText xml:space="preserve"> PAGEREF _Toc242187246 \h </w:instrText>
         </w:r>
         <w:r>
           <w:rPr>
@@ -2228,7 +2296,7 @@
             <w:noProof/>
             <w:webHidden/>
           </w:rPr>
-          <w:t>23</w:t>
+          <w:t>24</w:t>
         </w:r>
         <w:r>
           <w:rPr>
@@ -2249,7 +2317,7 @@
           <w:noProof/>
         </w:rPr>
       </w:pPr>
-      <w:hyperlink w:anchor="_Toc242102896" w:history="1">
+      <w:hyperlink w:anchor="_Toc242187247" w:history="1">
         <w:r>
           <w:rPr>
             <w:rStyle w:val="Hyperlink"/>
@@ -2276,7 +2344,7 @@
             <w:noProof/>
             <w:webHidden/>
           </w:rPr>
-          <w:instrText xml:space="preserve"> PAGEREF _Toc242102896 \h </w:instrText>
+          <w:instrText xml:space="preserve"> PAGEREF _Toc242187247 \h </w:instrText>
         </w:r>
         <w:r>
           <w:rPr>
@@ -2296,7 +2364,7 @@
             <w:noProof/>
             <w:webHidden/>
           </w:rPr>
-          <w:t>25</w:t>
+          <w:t>26</w:t>
         </w:r>
         <w:r>
           <w:rPr>
@@ -2317,7 +2385,7 @@
           <w:noProof/>
         </w:rPr>
       </w:pPr>
-      <w:hyperlink w:anchor="_Toc242102897" w:history="1">
+      <w:hyperlink w:anchor="_Toc242187248" w:history="1">
         <w:r>
           <w:rPr>
             <w:rStyle w:val="Hyperlink"/>
@@ -2344,7 +2412,7 @@
             <w:noProof/>
             <w:webHidden/>
           </w:rPr>
-          <w:instrText xml:space="preserve"> PAGEREF _Toc242102897 \h </w:instrText>
+          <w:instrText xml:space="preserve"> PAGEREF _Toc242187248 \h </w:instrText>
         </w:r>
         <w:r>
           <w:rPr>
@@ -2364,7 +2432,7 @@
             <w:noProof/>
             <w:webHidden/>
           </w:rPr>
-          <w:t>27</w:t>
+          <w:t>28</w:t>
         </w:r>
         <w:r>
           <w:rPr>
@@ -2385,7 +2453,7 @@
           <w:noProof/>
         </w:rPr>
       </w:pPr>
-      <w:hyperlink w:anchor="_Toc242102898" w:history="1">
+      <w:hyperlink w:anchor="_Toc242187249" w:history="1">
         <w:r>
           <w:rPr>
             <w:rStyle w:val="Hyperlink"/>
@@ -2412,7 +2480,7 @@
             <w:noProof/>
             <w:webHidden/>
           </w:rPr>
-          <w:instrText xml:space="preserve"> PAGEREF _Toc242102898 \h </w:instrText>
+          <w:instrText xml:space="preserve"> PAGEREF _Toc242187249 \h </w:instrText>
         </w:r>
         <w:r>
           <w:rPr>
@@ -2432,7 +2500,7 @@
             <w:noProof/>
             <w:webHidden/>
           </w:rPr>
-          <w:t>27</w:t>
+          <w:t>28</w:t>
         </w:r>
         <w:r>
           <w:rPr>
@@ -2453,7 +2521,7 @@
           <w:noProof/>
         </w:rPr>
       </w:pPr>
-      <w:hyperlink w:anchor="_Toc242102899" w:history="1">
+      <w:hyperlink w:anchor="_Toc242187250" w:history="1">
         <w:r>
           <w:rPr>
             <w:rStyle w:val="Hyperlink"/>
@@ -2480,7 +2548,7 @@
             <w:noProof/>
             <w:webHidden/>
           </w:rPr>
-          <w:instrText xml:space="preserve"> PAGEREF _Toc242102899 \h </w:instrText>
+          <w:instrText xml:space="preserve"> PAGEREF _Toc242187250 \h </w:instrText>
         </w:r>
         <w:r>
           <w:rPr>
@@ -2500,7 +2568,7 @@
             <w:noProof/>
             <w:webHidden/>
           </w:rPr>
-          <w:t>28</w:t>
+          <w:t>29</w:t>
         </w:r>
         <w:r>
           <w:rPr>
@@ -2521,7 +2589,7 @@
           <w:noProof/>
         </w:rPr>
       </w:pPr>
-      <w:hyperlink w:anchor="_Toc242102900" w:history="1">
+      <w:hyperlink w:anchor="_Toc242187251" w:history="1">
         <w:r>
           <w:rPr>
             <w:rStyle w:val="Hyperlink"/>
@@ -2548,7 +2616,7 @@
             <w:noProof/>
             <w:webHidden/>
           </w:rPr>
-          <w:instrText xml:space="preserve"> PAGEREF _Toc242102900 \h </w:instrText>
+          <w:instrText xml:space="preserve"> PAGEREF _Toc242187251 \h </w:instrText>
         </w:r>
         <w:r>
           <w:rPr>
@@ -2568,7 +2636,7 @@
             <w:noProof/>
             <w:webHidden/>
           </w:rPr>
-          <w:t>29</w:t>
+          <w:t>30</w:t>
         </w:r>
         <w:r>
           <w:rPr>
@@ -2589,7 +2657,7 @@
           <w:noProof/>
         </w:rPr>
       </w:pPr>
-      <w:hyperlink w:anchor="_Toc242102901" w:history="1">
+      <w:hyperlink w:anchor="_Toc242187252" w:history="1">
         <w:r>
           <w:rPr>
             <w:rStyle w:val="Hyperlink"/>
@@ -2616,7 +2684,7 @@
             <w:noProof/>
             <w:webHidden/>
           </w:rPr>
-          <w:instrText xml:space="preserve"> PAGEREF _Toc242102901 \h </w:instrText>
+          <w:instrText xml:space="preserve"> PAGEREF _Toc242187252 \h </w:instrText>
         </w:r>
         <w:r>
           <w:rPr>
@@ -2636,7 +2704,7 @@
             <w:noProof/>
             <w:webHidden/>
           </w:rPr>
-          <w:t>29</w:t>
+          <w:t>30</w:t>
         </w:r>
         <w:r>
           <w:rPr>
@@ -2657,7 +2725,7 @@
           <w:noProof/>
         </w:rPr>
       </w:pPr>
-      <w:hyperlink w:anchor="_Toc242102902" w:history="1">
+      <w:hyperlink w:anchor="_Toc242187253" w:history="1">
         <w:r>
           <w:rPr>
             <w:rStyle w:val="Hyperlink"/>
@@ -2684,7 +2752,7 @@
             <w:noProof/>
             <w:webHidden/>
           </w:rPr>
-          <w:instrText xml:space="preserve"> PAGEREF _Toc242102902 \h </w:instrText>
+          <w:instrText xml:space="preserve"> PAGEREF _Toc242187253 \h </w:instrText>
         </w:r>
         <w:r>
           <w:rPr>
@@ -2704,7 +2772,7 @@
             <w:noProof/>
             <w:webHidden/>
           </w:rPr>
-          <w:t>30</w:t>
+          <w:t>31</w:t>
         </w:r>
         <w:r>
           <w:rPr>
@@ -2725,7 +2793,7 @@
           <w:noProof/>
         </w:rPr>
       </w:pPr>
-      <w:hyperlink w:anchor="_Toc242102903" w:history="1">
+      <w:hyperlink w:anchor="_Toc242187254" w:history="1">
         <w:r>
           <w:rPr>
             <w:rStyle w:val="Hyperlink"/>
@@ -2752,7 +2820,7 @@
             <w:noProof/>
             <w:webHidden/>
           </w:rPr>
-          <w:instrText xml:space="preserve"> PAGEREF _Toc242102903 \h </w:instrText>
+          <w:instrText xml:space="preserve"> PAGEREF _Toc242187254 \h </w:instrText>
         </w:r>
         <w:r>
           <w:rPr>
@@ -2772,7 +2840,7 @@
             <w:noProof/>
             <w:webHidden/>
           </w:rPr>
-          <w:t>30</w:t>
+          <w:t>31</w:t>
         </w:r>
         <w:r>
           <w:rPr>
@@ -2793,7 +2861,7 @@
           <w:noProof/>
         </w:rPr>
       </w:pPr>
-      <w:hyperlink w:anchor="_Toc242102904" w:history="1">
+      <w:hyperlink w:anchor="_Toc242187255" w:history="1">
         <w:r>
           <w:rPr>
             <w:rStyle w:val="Hyperlink"/>
@@ -2820,7 +2888,7 @@
             <w:noProof/>
             <w:webHidden/>
           </w:rPr>
-          <w:instrText xml:space="preserve"> PAGEREF _Toc242102904 \h </w:instrText>
+          <w:instrText xml:space="preserve"> PAGEREF _Toc242187255 \h </w:instrText>
         </w:r>
         <w:r>
           <w:rPr>
@@ -2840,7 +2908,7 @@
             <w:noProof/>
             <w:webHidden/>
           </w:rPr>
-          <w:t>32</w:t>
+          <w:t>33</w:t>
         </w:r>
         <w:r>
           <w:rPr>
@@ -2861,7 +2929,7 @@
           <w:noProof/>
         </w:rPr>
       </w:pPr>
-      <w:hyperlink w:anchor="_Toc242102905" w:history="1">
+      <w:hyperlink w:anchor="_Toc242187256" w:history="1">
         <w:r>
           <w:rPr>
             <w:rStyle w:val="Hyperlink"/>
@@ -2888,7 +2956,7 @@
             <w:noProof/>
             <w:webHidden/>
           </w:rPr>
-          <w:instrText xml:space="preserve"> PAGEREF _Toc242102905 \h </w:instrText>
+          <w:instrText xml:space="preserve"> PAGEREF _Toc242187256 \h </w:instrText>
         </w:r>
         <w:r>
           <w:rPr>
@@ -2908,7 +2976,7 @@
             <w:noProof/>
             <w:webHidden/>
           </w:rPr>
-          <w:t>32</w:t>
+          <w:t>33</w:t>
         </w:r>
         <w:r>
           <w:rPr>
@@ -2929,7 +2997,7 @@
           <w:noProof/>
         </w:rPr>
       </w:pPr>
-      <w:hyperlink w:anchor="_Toc242102906" w:history="1">
+      <w:hyperlink w:anchor="_Toc242187257" w:history="1">
         <w:r>
           <w:rPr>
             <w:rStyle w:val="Hyperlink"/>
@@ -2956,7 +3024,7 @@
             <w:noProof/>
             <w:webHidden/>
           </w:rPr>
-          <w:instrText xml:space="preserve"> PAGEREF _Toc242102906 \h </w:instrText>
+          <w:instrText xml:space="preserve"> PAGEREF _Toc242187257 \h </w:instrText>
         </w:r>
         <w:r>
           <w:rPr>
@@ -2976,7 +3044,7 @@
             <w:noProof/>
             <w:webHidden/>
           </w:rPr>
-          <w:t>33</w:t>
+          <w:t>34</w:t>
         </w:r>
         <w:r>
           <w:rPr>
@@ -2997,7 +3065,7 @@
           <w:noProof/>
         </w:rPr>
       </w:pPr>
-      <w:hyperlink w:anchor="_Toc242102907" w:history="1">
+      <w:hyperlink w:anchor="_Toc242187258" w:history="1">
         <w:r>
           <w:rPr>
             <w:rStyle w:val="Hyperlink"/>
@@ -3024,7 +3092,7 @@
             <w:noProof/>
             <w:webHidden/>
           </w:rPr>
-          <w:instrText xml:space="preserve"> PAGEREF _Toc242102907 \h </w:instrText>
+          <w:instrText xml:space="preserve"> PAGEREF _Toc242187258 \h </w:instrText>
         </w:r>
         <w:r>
           <w:rPr>
@@ -3044,7 +3112,7 @@
             <w:noProof/>
             <w:webHidden/>
           </w:rPr>
-          <w:t>33</w:t>
+          <w:t>34</w:t>
         </w:r>
         <w:r>
           <w:rPr>
@@ -3065,7 +3133,7 @@
           <w:noProof/>
         </w:rPr>
       </w:pPr>
-      <w:hyperlink w:anchor="_Toc242102908" w:history="1">
+      <w:hyperlink w:anchor="_Toc242187259" w:history="1">
         <w:r>
           <w:rPr>
             <w:rStyle w:val="Hyperlink"/>
@@ -3092,7 +3160,7 @@
             <w:noProof/>
             <w:webHidden/>
           </w:rPr>
-          <w:instrText xml:space="preserve"> PAGEREF _Toc242102908 \h </w:instrText>
+          <w:instrText xml:space="preserve"> PAGEREF _Toc242187259 \h </w:instrText>
         </w:r>
         <w:r>
           <w:rPr>
@@ -3112,7 +3180,7 @@
             <w:noProof/>
             <w:webHidden/>
           </w:rPr>
-          <w:t>36</w:t>
+          <w:t>37</w:t>
         </w:r>
         <w:r>
           <w:rPr>
@@ -3133,7 +3201,7 @@
           <w:noProof/>
         </w:rPr>
       </w:pPr>
-      <w:hyperlink w:anchor="_Toc242102909" w:history="1">
+      <w:hyperlink w:anchor="_Toc242187260" w:history="1">
         <w:r>
           <w:rPr>
             <w:rStyle w:val="Hyperlink"/>
@@ -3160,7 +3228,7 @@
             <w:noProof/>
             <w:webHidden/>
           </w:rPr>
-          <w:instrText xml:space="preserve"> PAGEREF _Toc242102909 \h </w:instrText>
+          <w:instrText xml:space="preserve"> PAGEREF _Toc242187260 \h </w:instrText>
         </w:r>
         <w:r>
           <w:rPr>
@@ -3180,7 +3248,7 @@
             <w:noProof/>
             <w:webHidden/>
           </w:rPr>
-          <w:t>37</w:t>
+          <w:t>38</w:t>
         </w:r>
         <w:r>
           <w:rPr>
@@ -3201,7 +3269,7 @@
           <w:noProof/>
         </w:rPr>
       </w:pPr>
-      <w:hyperlink w:anchor="_Toc242102910" w:history="1">
+      <w:hyperlink w:anchor="_Toc242187261" w:history="1">
         <w:r>
           <w:rPr>
             <w:rStyle w:val="Hyperlink"/>
@@ -3228,7 +3296,7 @@
             <w:noProof/>
             <w:webHidden/>
           </w:rPr>
-          <w:instrText xml:space="preserve"> PAGEREF _Toc242102910 \h </w:instrText>
+          <w:instrText xml:space="preserve"> PAGEREF _Toc242187261 \h </w:instrText>
         </w:r>
         <w:r>
           <w:rPr>
@@ -3248,7 +3316,7 @@
             <w:noProof/>
             <w:webHidden/>
           </w:rPr>
-          <w:t>40</w:t>
+          <w:t>41</w:t>
         </w:r>
         <w:r>
           <w:rPr>
@@ -3269,7 +3337,7 @@
           <w:noProof/>
         </w:rPr>
       </w:pPr>
-      <w:hyperlink w:anchor="_Toc242102911" w:history="1">
+      <w:hyperlink w:anchor="_Toc242187262" w:history="1">
         <w:r>
           <w:rPr>
             <w:rStyle w:val="Hyperlink"/>
@@ -3296,7 +3364,7 @@
             <w:noProof/>
             <w:webHidden/>
           </w:rPr>
-          <w:instrText xml:space="preserve"> PAGEREF _Toc242102911 \h </w:instrText>
+          <w:instrText xml:space="preserve"> PAGEREF _Toc242187262 \h </w:instrText>
         </w:r>
         <w:r>
           <w:rPr>
@@ -3316,7 +3384,7 @@
             <w:noProof/>
             <w:webHidden/>
           </w:rPr>
-          <w:t>42</w:t>
+          <w:t>43</w:t>
         </w:r>
         <w:r>
           <w:rPr>
@@ -3337,7 +3405,7 @@
           <w:noProof/>
         </w:rPr>
       </w:pPr>
-      <w:hyperlink w:anchor="_Toc242102912" w:history="1">
+      <w:hyperlink w:anchor="_Toc242187263" w:history="1">
         <w:r>
           <w:rPr>
             <w:rStyle w:val="Hyperlink"/>
@@ -3364,7 +3432,7 @@
             <w:noProof/>
             <w:webHidden/>
           </w:rPr>
-          <w:instrText xml:space="preserve"> PAGEREF _Toc242102912 \h </w:instrText>
+          <w:instrText xml:space="preserve"> PAGEREF _Toc242187263 \h </w:instrText>
         </w:r>
         <w:r>
           <w:rPr>
@@ -3384,7 +3452,7 @@
             <w:noProof/>
             <w:webHidden/>
           </w:rPr>
-          <w:t>44</w:t>
+          <w:t>45</w:t>
         </w:r>
         <w:r>
           <w:rPr>
@@ -3405,7 +3473,7 @@
           <w:noProof/>
         </w:rPr>
       </w:pPr>
-      <w:hyperlink w:anchor="_Toc242102913" w:history="1">
+      <w:hyperlink w:anchor="_Toc242187264" w:history="1">
         <w:r>
           <w:rPr>
             <w:rStyle w:val="Hyperlink"/>
@@ -3432,7 +3500,7 @@
             <w:noProof/>
             <w:webHidden/>
           </w:rPr>
-          <w:instrText xml:space="preserve"> PAGEREF _Toc242102913 \h </w:instrText>
+          <w:instrText xml:space="preserve"> PAGEREF _Toc242187264 \h </w:instrText>
         </w:r>
         <w:r>
           <w:rPr>
@@ -3452,7 +3520,7 @@
             <w:noProof/>
             <w:webHidden/>
           </w:rPr>
-          <w:t>44</w:t>
+          <w:t>45</w:t>
         </w:r>
         <w:r>
           <w:rPr>
@@ -3473,7 +3541,7 @@
           <w:noProof/>
         </w:rPr>
       </w:pPr>
-      <w:hyperlink w:anchor="_Toc242102914" w:history="1">
+      <w:hyperlink w:anchor="_Toc242187265" w:history="1">
         <w:r>
           <w:rPr>
             <w:rStyle w:val="Hyperlink"/>
@@ -3500,7 +3568,7 @@
             <w:noProof/>
             <w:webHidden/>
           </w:rPr>
-          <w:instrText xml:space="preserve"> PAGEREF _Toc242102914 \h </w:instrText>
+          <w:instrText xml:space="preserve"> PAGEREF _Toc242187265 \h </w:instrText>
         </w:r>
         <w:r>
           <w:rPr>
@@ -3520,7 +3588,7 @@
             <w:noProof/>
             <w:webHidden/>
           </w:rPr>
-          <w:t>44</w:t>
+          <w:t>45</w:t>
         </w:r>
         <w:r>
           <w:rPr>
@@ -3541,7 +3609,7 @@
           <w:noProof/>
         </w:rPr>
       </w:pPr>
-      <w:hyperlink w:anchor="_Toc242102915" w:history="1">
+      <w:hyperlink w:anchor="_Toc242187266" w:history="1">
         <w:r>
           <w:rPr>
             <w:rStyle w:val="Hyperlink"/>
@@ -3568,7 +3636,7 @@
             <w:noProof/>
             <w:webHidden/>
           </w:rPr>
-          <w:instrText xml:space="preserve"> PAGEREF _Toc242102915 \h </w:instrText>
+          <w:instrText xml:space="preserve"> PAGEREF _Toc242187266 \h </w:instrText>
         </w:r>
         <w:r>
           <w:rPr>
@@ -3588,7 +3656,7 @@
             <w:noProof/>
             <w:webHidden/>
           </w:rPr>
-          <w:t>46</w:t>
+          <w:t>47</w:t>
         </w:r>
         <w:r>
           <w:rPr>
@@ -3609,7 +3677,7 @@
           <w:noProof/>
         </w:rPr>
       </w:pPr>
-      <w:hyperlink w:anchor="_Toc242102916" w:history="1">
+      <w:hyperlink w:anchor="_Toc242187267" w:history="1">
         <w:r>
           <w:rPr>
             <w:rStyle w:val="Hyperlink"/>
@@ -3636,7 +3704,7 @@
             <w:noProof/>
             <w:webHidden/>
           </w:rPr>
-          <w:instrText xml:space="preserve"> PAGEREF _Toc242102916 \h </w:instrText>
+          <w:instrText xml:space="preserve"> PAGEREF _Toc242187267 \h </w:instrText>
         </w:r>
         <w:r>
           <w:rPr>
@@ -3656,7 +3724,7 @@
             <w:noProof/>
             <w:webHidden/>
           </w:rPr>
-          <w:t>47</w:t>
+          <w:t>48</w:t>
         </w:r>
         <w:r>
           <w:rPr>
@@ -3677,7 +3745,7 @@
           <w:noProof/>
         </w:rPr>
       </w:pPr>
-      <w:hyperlink w:anchor="_Toc242102917" w:history="1">
+      <w:hyperlink w:anchor="_Toc242187268" w:history="1">
         <w:r>
           <w:rPr>
             <w:rStyle w:val="Hyperlink"/>
@@ -3704,7 +3772,7 @@
             <w:noProof/>
             <w:webHidden/>
           </w:rPr>
-          <w:instrText xml:space="preserve"> PAGEREF _Toc242102917 \h </w:instrText>
+          <w:instrText xml:space="preserve"> PAGEREF _Toc242187268 \h </w:instrText>
         </w:r>
         <w:r>
           <w:rPr>
@@ -3724,7 +3792,7 @@
             <w:noProof/>
             <w:webHidden/>
           </w:rPr>
-          <w:t>48</w:t>
+          <w:t>49</w:t>
         </w:r>
         <w:r>
           <w:rPr>
@@ -3745,7 +3813,7 @@
           <w:noProof/>
         </w:rPr>
       </w:pPr>
-      <w:hyperlink w:anchor="_Toc242102918" w:history="1">
+      <w:hyperlink w:anchor="_Toc242187269" w:history="1">
         <w:r>
           <w:rPr>
             <w:rStyle w:val="Hyperlink"/>
@@ -3772,7 +3840,7 @@
             <w:noProof/>
             <w:webHidden/>
           </w:rPr>
-          <w:instrText xml:space="preserve"> PAGEREF _Toc242102918 \h </w:instrText>
+          <w:instrText xml:space="preserve"> PAGEREF _Toc242187269 \h </w:instrText>
         </w:r>
         <w:r>
           <w:rPr>
@@ -3792,7 +3860,7 @@
             <w:noProof/>
             <w:webHidden/>
           </w:rPr>
-          <w:t>49</w:t>
+          <w:t>50</w:t>
         </w:r>
         <w:r>
           <w:rPr>
@@ -3813,7 +3881,7 @@
           <w:noProof/>
         </w:rPr>
       </w:pPr>
-      <w:hyperlink w:anchor="_Toc242102919" w:history="1">
+      <w:hyperlink w:anchor="_Toc242187270" w:history="1">
         <w:r>
           <w:rPr>
             <w:rStyle w:val="Hyperlink"/>
@@ -3840,7 +3908,7 @@
             <w:noProof/>
             <w:webHidden/>
           </w:rPr>
-          <w:instrText xml:space="preserve"> PAGEREF _Toc242102919 \h </w:instrText>
+          <w:instrText xml:space="preserve"> PAGEREF _Toc242187270 \h </w:instrText>
         </w:r>
         <w:r>
           <w:rPr>
@@ -3860,7 +3928,7 @@
             <w:noProof/>
             <w:webHidden/>
           </w:rPr>
-          <w:t>51</w:t>
+          <w:t>52</w:t>
         </w:r>
         <w:r>
           <w:rPr>
@@ -3881,7 +3949,7 @@
           <w:noProof/>
         </w:rPr>
       </w:pPr>
-      <w:hyperlink w:anchor="_Toc242102920" w:history="1">
+      <w:hyperlink w:anchor="_Toc242187271" w:history="1">
         <w:r>
           <w:rPr>
             <w:rStyle w:val="Hyperlink"/>
@@ -3908,7 +3976,7 @@
             <w:noProof/>
             <w:webHidden/>
           </w:rPr>
-          <w:instrText xml:space="preserve"> PAGEREF _Toc242102920 \h </w:instrText>
+          <w:instrText xml:space="preserve"> PAGEREF _Toc242187271 \h </w:instrText>
         </w:r>
         <w:r>
           <w:rPr>
@@ -3928,7 +3996,7 @@
             <w:noProof/>
             <w:webHidden/>
           </w:rPr>
-          <w:t>51</w:t>
+          <w:t>52</w:t>
         </w:r>
         <w:r>
           <w:rPr>
@@ -3949,7 +4017,7 @@
           <w:noProof/>
         </w:rPr>
       </w:pPr>
-      <w:hyperlink w:anchor="_Toc242102921" w:history="1">
+      <w:hyperlink w:anchor="_Toc242187272" w:history="1">
         <w:r>
           <w:rPr>
             <w:rStyle w:val="Hyperlink"/>
@@ -3976,7 +4044,7 @@
             <w:noProof/>
             <w:webHidden/>
           </w:rPr>
-          <w:instrText xml:space="preserve"> PAGEREF _Toc242102921 \h </w:instrText>
+          <w:instrText xml:space="preserve"> PAGEREF _Toc242187272 \h </w:instrText>
         </w:r>
         <w:r>
           <w:rPr>
@@ -3996,7 +4064,7 @@
             <w:noProof/>
             <w:webHidden/>
           </w:rPr>
-          <w:t>51</w:t>
+          <w:t>52</w:t>
         </w:r>
         <w:r>
           <w:rPr>
@@ -4017,7 +4085,7 @@
           <w:noProof/>
         </w:rPr>
       </w:pPr>
-      <w:hyperlink w:anchor="_Toc242102922" w:history="1">
+      <w:hyperlink w:anchor="_Toc242187273" w:history="1">
         <w:r>
           <w:rPr>
             <w:rStyle w:val="Hyperlink"/>
@@ -4044,7 +4112,7 @@
             <w:noProof/>
             <w:webHidden/>
           </w:rPr>
-          <w:instrText xml:space="preserve"> PAGEREF _Toc242102922 \h </w:instrText>
+          <w:instrText xml:space="preserve"> PAGEREF _Toc242187273 \h </w:instrText>
         </w:r>
         <w:r>
           <w:rPr>
@@ -4064,7 +4132,7 @@
             <w:noProof/>
             <w:webHidden/>
           </w:rPr>
-          <w:t>54</w:t>
+          <w:t>55</w:t>
         </w:r>
         <w:r>
           <w:rPr>
@@ -4085,7 +4153,7 @@
           <w:noProof/>
         </w:rPr>
       </w:pPr>
-      <w:hyperlink w:anchor="_Toc242102923" w:history="1">
+      <w:hyperlink w:anchor="_Toc242187274" w:history="1">
         <w:r>
           <w:rPr>
             <w:rStyle w:val="Hyperlink"/>
@@ -4112,7 +4180,7 @@
             <w:noProof/>
             <w:webHidden/>
           </w:rPr>
-          <w:instrText xml:space="preserve"> PAGEREF _Toc242102923 \h </w:instrText>
+          <w:instrText xml:space="preserve"> PAGEREF _Toc242187274 \h </w:instrText>
         </w:r>
         <w:r>
           <w:rPr>
@@ -4132,7 +4200,7 @@
             <w:noProof/>
             <w:webHidden/>
           </w:rPr>
-          <w:t>56</w:t>
+          <w:t>57</w:t>
         </w:r>
         <w:r>
           <w:rPr>
@@ -4153,7 +4221,7 @@
           <w:noProof/>
         </w:rPr>
       </w:pPr>
-      <w:hyperlink w:anchor="_Toc242102924" w:history="1">
+      <w:hyperlink w:anchor="_Toc242187275" w:history="1">
         <w:r>
           <w:rPr>
             <w:rStyle w:val="Hyperlink"/>
@@ -4180,7 +4248,7 @@
             <w:noProof/>
             <w:webHidden/>
           </w:rPr>
-          <w:instrText xml:space="preserve"> PAGEREF _Toc242102924 \h </w:instrText>
+          <w:instrText xml:space="preserve"> PAGEREF _Toc242187275 \h </w:instrText>
         </w:r>
         <w:r>
           <w:rPr>
@@ -4200,7 +4268,7 @@
             <w:noProof/>
             <w:webHidden/>
           </w:rPr>
-          <w:t>56</w:t>
+          <w:t>57</w:t>
         </w:r>
         <w:r>
           <w:rPr>
@@ -4221,7 +4289,7 @@
           <w:noProof/>
         </w:rPr>
       </w:pPr>
-      <w:hyperlink w:anchor="_Toc242102925" w:history="1">
+      <w:hyperlink w:anchor="_Toc242187276" w:history="1">
         <w:r>
           <w:rPr>
             <w:rStyle w:val="Hyperlink"/>
@@ -4248,7 +4316,7 @@
             <w:noProof/>
             <w:webHidden/>
           </w:rPr>
-          <w:instrText xml:space="preserve"> PAGEREF _Toc242102925 \h </w:instrText>
+          <w:instrText xml:space="preserve"> PAGEREF _Toc242187276 \h </w:instrText>
         </w:r>
         <w:r>
           <w:rPr>
@@ -4268,7 +4336,7 @@
             <w:noProof/>
             <w:webHidden/>
           </w:rPr>
-          <w:t>56</w:t>
+          <w:t>57</w:t>
         </w:r>
         <w:r>
           <w:rPr>
@@ -4289,7 +4357,7 @@
           <w:noProof/>
         </w:rPr>
       </w:pPr>
-      <w:hyperlink w:anchor="_Toc242102926" w:history="1">
+      <w:hyperlink w:anchor="_Toc242187277" w:history="1">
         <w:r>
           <w:rPr>
             <w:rStyle w:val="Hyperlink"/>
@@ -4316,7 +4384,7 @@
             <w:noProof/>
             <w:webHidden/>
           </w:rPr>
-          <w:instrText xml:space="preserve"> PAGEREF _Toc242102926 \h </w:instrText>
+          <w:instrText xml:space="preserve"> PAGEREF _Toc242187277 \h </w:instrText>
         </w:r>
         <w:r>
           <w:rPr>
@@ -4336,7 +4404,7 @@
             <w:noProof/>
             <w:webHidden/>
           </w:rPr>
-          <w:t>56</w:t>
+          <w:t>57</w:t>
         </w:r>
         <w:r>
           <w:rPr>
@@ -4357,7 +4425,7 @@
           <w:noProof/>
         </w:rPr>
       </w:pPr>
-      <w:hyperlink w:anchor="_Toc242102927" w:history="1">
+      <w:hyperlink w:anchor="_Toc242187278" w:history="1">
         <w:r>
           <w:rPr>
             <w:rStyle w:val="Hyperlink"/>
@@ -4384,7 +4452,7 @@
             <w:noProof/>
             <w:webHidden/>
           </w:rPr>
-          <w:instrText xml:space="preserve"> PAGEREF _Toc242102927 \h </w:instrText>
+          <w:instrText xml:space="preserve"> PAGEREF _Toc242187278 \h </w:instrText>
         </w:r>
         <w:r>
           <w:rPr>
@@ -4404,7 +4472,7 @@
             <w:noProof/>
             <w:webHidden/>
           </w:rPr>
-          <w:t>56</w:t>
+          <w:t>57</w:t>
         </w:r>
         <w:r>
           <w:rPr>
@@ -4425,7 +4493,7 @@
         <w:pStyle w:val="Heading1"/>
         <w:pageBreakBefore/>
       </w:pPr>
-      <w:bookmarkStart w:id="0" w:name="_Toc242102868"/>
+      <w:bookmarkStart w:id="0" w:name="_Toc242187218"/>
       <w:r>
         <w:lastRenderedPageBreak/>
         <w:t>Welcome</w:t>
@@ -4441,7 +4509,7 @@
       <w:pPr>
         <w:pStyle w:val="Heading2"/>
       </w:pPr>
-      <w:bookmarkStart w:id="1" w:name="_Toc242102869"/>
+      <w:bookmarkStart w:id="1" w:name="_Toc242187219"/>
       <w:r>
         <w:t>How a sale moves through the app</w:t>
       </w:r>
@@ -4924,7 +4992,7 @@
       <w:pPr>
         <w:pStyle w:val="Heading2"/>
       </w:pPr>
-      <w:bookmarkStart w:id="2" w:name="_Toc242102870"/>
+      <w:bookmarkStart w:id="2" w:name="_Toc242187220"/>
       <w:r>
         <w:t>What you'll need</w:t>
       </w:r>
@@ -5033,7 +5101,7 @@
         <w:pStyle w:val="Heading1"/>
         <w:pageBreakBefore/>
       </w:pPr>
-      <w:bookmarkStart w:id="3" w:name="_Toc242102871"/>
+      <w:bookmarkStart w:id="3" w:name="_Toc242187221"/>
       <w:r>
         <w:lastRenderedPageBreak/>
         <w:t>Who can do what</w:t>
@@ -5601,7 +5669,7 @@
         <w:pStyle w:val="Heading1"/>
         <w:pageBreakBefore/>
       </w:pPr>
-      <w:bookmarkStart w:id="4" w:name="_Toc242102872"/>
+      <w:bookmarkStart w:id="4" w:name="_Toc242187222"/>
       <w:r>
         <w:lastRenderedPageBreak/>
         <w:t>Getting started</w:t>
@@ -5612,7 +5680,7 @@
       <w:pPr>
         <w:pStyle w:val="Heading2"/>
       </w:pPr>
-      <w:bookmarkStart w:id="5" w:name="_Toc242102873"/>
+      <w:bookmarkStart w:id="5" w:name="_Toc242187223"/>
       <w:r>
         <w:t>Signing in</w:t>
       </w:r>
@@ -5629,7 +5697,7 @@
           <w:noProof/>
         </w:rPr>
         <w:drawing>
-          <wp:inline distT="0" distB="0" distL="0" distR="0" wp14:anchorId="3EE3B301" wp14:editId="40571630">
+          <wp:inline distT="0" distB="0" distL="0" distR="0" wp14:anchorId="2CDC5D5E" wp14:editId="1CF69B65">
             <wp:extent cx="3291840" cy="2211705"/>
             <wp:effectExtent l="0" t="0" r="0" b="0"/>
             <wp:docPr id="1" name="Picture 1"/>
@@ -5947,7 +6015,7 @@
       <w:pPr>
         <w:pStyle w:val="Heading2"/>
       </w:pPr>
-      <w:bookmarkStart w:id="6" w:name="_Toc242102874"/>
+      <w:bookmarkStart w:id="6" w:name="_Toc242187224"/>
       <w:r>
         <w:t>Changing your PIN</w:t>
       </w:r>
@@ -6129,7 +6197,7 @@
       <w:pPr>
         <w:pStyle w:val="Heading2"/>
       </w:pPr>
-      <w:bookmarkStart w:id="7" w:name="_Toc242102875"/>
+      <w:bookmarkStart w:id="7" w:name="_Toc242187225"/>
       <w:r>
         <w:lastRenderedPageBreak/>
         <w:t>Finding your way around</w:t>
@@ -6712,65 +6780,15 @@
       <w:pPr>
         <w:pStyle w:val="Heading2"/>
       </w:pPr>
-      <w:bookmarkStart w:id="8" w:name="_Toc242102876"/>
-      <w:r>
-        <w:t>Light and dark mode</w:t>
+      <w:bookmarkStart w:id="8" w:name="_Toc242187226"/>
+      <w:r>
+        <w:t>Mattress size guide</w:t>
       </w:r>
       <w:bookmarkEnd w:id="8"/>
     </w:p>
     <w:p>
       <w:r>
-        <w:t>Tap the half-moon button in the top-right corner to switch between light, dark and your device's own setting. Dark mode is easier on the eyes at an evening event.</w:t>
-      </w:r>
-    </w:p>
-    <w:p>
-      <w:pPr>
-        <w:pStyle w:val="Heading2"/>
-      </w:pPr>
-      <w:bookmarkStart w:id="9" w:name="_Toc242102877"/>
-      <w:r>
-        <w:t>Signing out</w:t>
-      </w:r>
-      <w:bookmarkEnd w:id="9"/>
-    </w:p>
-    <w:p>
-      <w:r>
-        <w:t xml:space="preserve">Tap your initials in the top-right corner, then tap </w:t>
-      </w:r>
-      <w:r>
-        <w:rPr>
-          <w:b/>
-        </w:rPr>
-        <w:t>Sign out</w:t>
-      </w:r>
-      <w:r>
-        <w:t>. Please always sign out on a shared tablet at the end of your shift, since orders are recorded under the person who is signed in.</w:t>
-      </w:r>
-    </w:p>
-    <w:p>
-      <w:pPr>
-        <w:pStyle w:val="Heading1"/>
-        <w:pageBreakBefore/>
-      </w:pPr>
-      <w:bookmarkStart w:id="10" w:name="_Toc242102878"/>
-      <w:r>
-        <w:lastRenderedPageBreak/>
-        <w:t>Taking an order on the sales floor</w:t>
-      </w:r>
-      <w:bookmarkEnd w:id="10"/>
-    </w:p>
-    <w:p>
-      <w:r>
-        <w:t xml:space="preserve">Tap </w:t>
-      </w:r>
-      <w:r>
-        <w:rPr>
-          <w:b/>
-        </w:rPr>
-        <w:t>Sell</w:t>
-      </w:r>
-      <w:r>
-        <w:t xml:space="preserve"> in the menu. The fundraiser's name appears at the top of the screen, followed by a tab for each order you have open.</w:t>
+        <w:t>Tap the ruler button in the top-right corner, on any screen, to show a customer how the mattress sizes compare. The chart draws every size to scale against the others, with each one's width and length in inches listed alongside: Twin, Twin XL, Full, Queen, King and California King. A Split King is two Twin XLs side by side, together the size of a King. Tap the chart to open it full size, and the X to close it.</w:t>
       </w:r>
     </w:p>
     <w:p>
@@ -6783,11 +6801,161 @@
         <w:rPr>
           <w:noProof/>
         </w:rPr>
+        <w:lastRenderedPageBreak/>
         <w:drawing>
-          <wp:inline distT="0" distB="0" distL="0" distR="0" wp14:anchorId="67FB0DB2" wp14:editId="254952D6">
+          <wp:inline distT="0" distB="0" distL="0" distR="0" wp14:anchorId="3BB426AB" wp14:editId="093C31B6">
+            <wp:extent cx="5486400" cy="3686175"/>
+            <wp:effectExtent l="0" t="0" r="0" b="0"/>
+            <wp:docPr id="2" name="Picture 2"/>
+            <wp:cNvGraphicFramePr>
+              <a:graphicFrameLocks xmlns:a="http://schemas.openxmlformats.org/drawingml/2006/main" noChangeAspect="1"/>
+            </wp:cNvGraphicFramePr>
+            <a:graphic xmlns:a="http://schemas.openxmlformats.org/drawingml/2006/main">
+              <a:graphicData uri="http://schemas.openxmlformats.org/drawingml/2006/picture">
+                <pic:pic xmlns:pic="http://schemas.openxmlformats.org/drawingml/2006/picture">
+                  <pic:nvPicPr>
+                    <pic:cNvPr id="0" name="47_size_guide.png"/>
+                    <pic:cNvPicPr/>
+                  </pic:nvPicPr>
+                  <pic:blipFill>
+                    <a:blip r:embed="rId10"/>
+                    <a:stretch>
+                      <a:fillRect/>
+                    </a:stretch>
+                  </pic:blipFill>
+                  <pic:spPr>
+                    <a:xfrm>
+                      <a:off x="0" y="0"/>
+                      <a:ext cx="5486400" cy="3686175"/>
+                    </a:xfrm>
+                    <a:prstGeom prst="rect">
+                      <a:avLst/>
+                    </a:prstGeom>
+                  </pic:spPr>
+                </pic:pic>
+              </a:graphicData>
+            </a:graphic>
+          </wp:inline>
+        </w:drawing>
+      </w:r>
+    </w:p>
+    <w:p>
+      <w:pPr>
+        <w:spacing w:after="200"/>
+        <w:jc w:val="center"/>
+      </w:pPr>
+      <w:r>
+        <w:rPr>
+          <w:i/>
+          <w:color w:val="6B7280"/>
+          <w:sz w:val="18"/>
+        </w:rPr>
+        <w:t>The mattress size guide</w:t>
+      </w:r>
+    </w:p>
+    <w:p>
+      <w:r>
+        <w:t xml:space="preserve">While adding an item, </w:t>
+      </w:r>
+      <w:r>
+        <w:rPr>
+          <w:b/>
+        </w:rPr>
+        <w:t>Size guide</w:t>
+      </w:r>
+      <w:r>
+        <w:t xml:space="preserve"> beside </w:t>
+      </w:r>
+      <w:r>
+        <w:rPr>
+          <w:b/>
+        </w:rPr>
+        <w:t>Size &amp; configuration</w:t>
+      </w:r>
+      <w:r>
+        <w:t xml:space="preserve"> opens the same chart without leaving the item.</w:t>
+      </w:r>
+    </w:p>
+    <w:p>
+      <w:pPr>
+        <w:pStyle w:val="Heading2"/>
+      </w:pPr>
+      <w:bookmarkStart w:id="9" w:name="_Toc242187227"/>
+      <w:r>
+        <w:t>Light and dark mode</w:t>
+      </w:r>
+      <w:bookmarkEnd w:id="9"/>
+    </w:p>
+    <w:p>
+      <w:r>
+        <w:t>Tap the half-moon button in the top-right corner to switch between light, dark and your device's own setting. Dark mode is easier on the eyes at an evening event.</w:t>
+      </w:r>
+    </w:p>
+    <w:p>
+      <w:pPr>
+        <w:pStyle w:val="Heading2"/>
+      </w:pPr>
+      <w:bookmarkStart w:id="10" w:name="_Toc242187228"/>
+      <w:r>
+        <w:t>Signing out</w:t>
+      </w:r>
+      <w:bookmarkEnd w:id="10"/>
+    </w:p>
+    <w:p>
+      <w:r>
+        <w:t xml:space="preserve">Tap your initials in the top-right corner, then tap </w:t>
+      </w:r>
+      <w:r>
+        <w:rPr>
+          <w:b/>
+        </w:rPr>
+        <w:t>Sign out</w:t>
+      </w:r>
+      <w:r>
+        <w:t>. Please always sign out on a shared tablet at the end of your shift, since orders are recorded under the person who is signed in.</w:t>
+      </w:r>
+    </w:p>
+    <w:p>
+      <w:pPr>
+        <w:pStyle w:val="Heading1"/>
+        <w:pageBreakBefore/>
+      </w:pPr>
+      <w:bookmarkStart w:id="11" w:name="_Toc242187229"/>
+      <w:r>
+        <w:lastRenderedPageBreak/>
+        <w:t>Taking an order on the sales floor</w:t>
+      </w:r>
+      <w:bookmarkEnd w:id="11"/>
+    </w:p>
+    <w:p>
+      <w:r>
+        <w:t xml:space="preserve">Tap </w:t>
+      </w:r>
+      <w:r>
+        <w:rPr>
+          <w:b/>
+        </w:rPr>
+        <w:t>Sell</w:t>
+      </w:r>
+      <w:r>
+        <w:t xml:space="preserve"> in the menu. The fundraiser's name appears at the top of the screen, followed by a tab for each order you have open.</w:t>
+      </w:r>
+    </w:p>
+    <w:p>
+      <w:pPr>
+        <w:keepNext/>
+        <w:spacing w:after="40"/>
+        <w:jc w:val="center"/>
+      </w:pPr>
+      <w:r>
+        <w:rPr>
+          <w:noProof/>
+        </w:rPr>
+        <w:drawing>
+          <wp:inline distT="0" distB="0" distL="0" distR="0" wp14:anchorId="654BC072" wp14:editId="2622D17F">
             <wp:extent cx="5760720" cy="3870484"/>
             <wp:effectExtent l="0" t="0" r="0" b="0"/>
-            <wp:docPr id="2" name="Picture 2"/>
+            <wp:docPr id="3" name="Picture 3"/>
             <wp:cNvGraphicFramePr>
               <a:graphicFrameLocks xmlns:a="http://schemas.openxmlformats.org/drawingml/2006/main" noChangeAspect="1"/>
             </wp:cNvGraphicFramePr>
@@ -6799,7 +6967,7 @@
                     <pic:cNvPicPr/>
                   </pic:nvPicPr>
                   <pic:blipFill>
-                    <a:blip r:embed="rId10"/>
+                    <a:blip r:embed="rId11"/>
                     <a:stretch>
                       <a:fillRect/>
                     </a:stretch>
@@ -6909,11 +7077,11 @@
       <w:pPr>
         <w:pStyle w:val="Heading2"/>
       </w:pPr>
-      <w:bookmarkStart w:id="11" w:name="_Toc242102879"/>
+      <w:bookmarkStart w:id="12" w:name="_Toc242187230"/>
       <w:r>
         <w:t>Starting an order</w:t>
       </w:r>
-      <w:bookmarkEnd w:id="11"/>
+      <w:bookmarkEnd w:id="12"/>
     </w:p>
     <w:p>
       <w:pPr>
@@ -6993,12 +7161,12 @@
       <w:pPr>
         <w:pStyle w:val="Heading2"/>
       </w:pPr>
-      <w:bookmarkStart w:id="12" w:name="_Toc242102880"/>
+      <w:bookmarkStart w:id="13" w:name="_Toc242187231"/>
       <w:r>
         <w:lastRenderedPageBreak/>
         <w:t>Adding items</w:t>
       </w:r>
-      <w:bookmarkEnd w:id="12"/>
+      <w:bookmarkEnd w:id="13"/>
     </w:p>
     <w:p>
       <w:pPr>
@@ -7142,144 +7310,7 @@
           <w:noProof/>
         </w:rPr>
         <w:drawing>
-          <wp:inline distT="0" distB="0" distL="0" distR="0" wp14:anchorId="08FBA82C" wp14:editId="396F5DF3">
-            <wp:extent cx="5760720" cy="3870484"/>
-            <wp:effectExtent l="0" t="0" r="0" b="0"/>
-            <wp:docPr id="3" name="Picture 3"/>
-            <wp:cNvGraphicFramePr>
-              <a:graphicFrameLocks xmlns:a="http://schemas.openxmlformats.org/drawingml/2006/main" noChangeAspect="1"/>
-            </wp:cNvGraphicFramePr>
-            <a:graphic xmlns:a="http://schemas.openxmlformats.org/drawingml/2006/main">
-              <a:graphicData uri="http://schemas.openxmlformats.org/drawingml/2006/picture">
-                <pic:pic xmlns:pic="http://schemas.openxmlformats.org/drawingml/2006/picture">
-                  <pic:nvPicPr>
-                    <pic:cNvPr id="0" name="03_add_item.png"/>
-                    <pic:cNvPicPr/>
-                  </pic:nvPicPr>
-                  <pic:blipFill>
-                    <a:blip r:embed="rId11"/>
-                    <a:stretch>
-                      <a:fillRect/>
-                    </a:stretch>
-                  </pic:blipFill>
-                  <pic:spPr>
-                    <a:xfrm>
-                      <a:off x="0" y="0"/>
-                      <a:ext cx="5760720" cy="3870484"/>
-                    </a:xfrm>
-                    <a:prstGeom prst="rect">
-                      <a:avLst/>
-                    </a:prstGeom>
-                  </pic:spPr>
-                </pic:pic>
-              </a:graphicData>
-            </a:graphic>
-          </wp:inline>
-        </w:drawing>
-      </w:r>
-    </w:p>
-    <w:p>
-      <w:pPr>
-        <w:spacing w:after="200"/>
-        <w:jc w:val="center"/>
-      </w:pPr>
-      <w:r>
-        <w:rPr>
-          <w:i/>
-          <w:color w:val="6B7280"/>
-          <w:sz w:val="18"/>
-        </w:rPr>
-        <w:t>Choosing a product. Each tile shows the brand and starting price.</w:t>
-      </w:r>
-    </w:p>
-    <w:p>
-      <w:pPr>
-        <w:pStyle w:val="Heading3"/>
-      </w:pPr>
-      <w:r>
-        <w:t>Sorting the list</w:t>
-      </w:r>
-    </w:p>
-    <w:p>
-      <w:r>
-        <w:t xml:space="preserve">The </w:t>
-      </w:r>
-      <w:r>
-        <w:rPr>
-          <w:b/>
-        </w:rPr>
-        <w:t>Sort</w:t>
-      </w:r>
-      <w:r>
-        <w:t xml:space="preserve"> buttons change the order of the list. It starts on </w:t>
-      </w:r>
-      <w:r>
-        <w:rPr>
-          <w:b/>
-        </w:rPr>
-        <w:t>Name A-Z</w:t>
-      </w:r>
-      <w:r>
-        <w:t xml:space="preserve">. You can also sort </w:t>
-      </w:r>
-      <w:r>
-        <w:rPr>
-          <w:b/>
-        </w:rPr>
-        <w:t>Name Z-A</w:t>
-      </w:r>
-      <w:r>
-        <w:t xml:space="preserve">, </w:t>
-      </w:r>
-      <w:r>
-        <w:rPr>
-          <w:b/>
-        </w:rPr>
-        <w:t>Price low-high</w:t>
-      </w:r>
-      <w:r>
-        <w:t xml:space="preserve">, </w:t>
-      </w:r>
-      <w:r>
-        <w:rPr>
-          <w:b/>
-        </w:rPr>
-        <w:t>Price high-low</w:t>
-      </w:r>
-      <w:r>
-        <w:t xml:space="preserve"> or by </w:t>
-      </w:r>
-      <w:r>
-        <w:rPr>
-          <w:b/>
-        </w:rPr>
-        <w:t>Brand</w:t>
-      </w:r>
-      <w:r>
-        <w:t>. Products stay grouped by category. Items without a set price (marked Inquire) always sort to the end when you sort by price.</w:t>
-      </w:r>
-    </w:p>
-    <w:p>
-      <w:pPr>
-        <w:pStyle w:val="Heading3"/>
-      </w:pPr>
-      <w:r>
-        <w:lastRenderedPageBreak/>
-        <w:t>Choosing size, shipping and quantity</w:t>
-      </w:r>
-    </w:p>
-    <w:p>
-      <w:pPr>
-        <w:keepNext/>
-        <w:spacing w:after="40"/>
-        <w:jc w:val="center"/>
-      </w:pPr>
-      <w:r>
-        <w:rPr>
-          <w:noProof/>
-        </w:rPr>
-        <w:drawing>
-          <wp:inline distT="0" distB="0" distL="0" distR="0" wp14:anchorId="00741570" wp14:editId="00671B38">
+          <wp:inline distT="0" distB="0" distL="0" distR="0" wp14:anchorId="20CBC72F" wp14:editId="44A52BF1">
             <wp:extent cx="5760720" cy="3870484"/>
             <wp:effectExtent l="0" t="0" r="0" b="0"/>
             <wp:docPr id="4" name="Picture 4"/>
@@ -7290,7 +7321,7 @@
               <a:graphicData uri="http://schemas.openxmlformats.org/drawingml/2006/picture">
                 <pic:pic xmlns:pic="http://schemas.openxmlformats.org/drawingml/2006/picture">
                   <pic:nvPicPr>
-                    <pic:cNvPr id="0" name="04_add_item_detail.png"/>
+                    <pic:cNvPr id="0" name="03_add_item.png"/>
                     <pic:cNvPicPr/>
                   </pic:nvPicPr>
                   <pic:blipFill>
@@ -7326,6 +7357,143 @@
           <w:color w:val="6B7280"/>
           <w:sz w:val="18"/>
         </w:rPr>
+        <w:t>Choosing a product. Each tile shows the brand and starting price.</w:t>
+      </w:r>
+    </w:p>
+    <w:p>
+      <w:pPr>
+        <w:pStyle w:val="Heading3"/>
+      </w:pPr>
+      <w:r>
+        <w:t>Sorting the list</w:t>
+      </w:r>
+    </w:p>
+    <w:p>
+      <w:r>
+        <w:t xml:space="preserve">The </w:t>
+      </w:r>
+      <w:r>
+        <w:rPr>
+          <w:b/>
+        </w:rPr>
+        <w:t>Sort</w:t>
+      </w:r>
+      <w:r>
+        <w:t xml:space="preserve"> buttons change the order of the list. It starts on </w:t>
+      </w:r>
+      <w:r>
+        <w:rPr>
+          <w:b/>
+        </w:rPr>
+        <w:t>Name A-Z</w:t>
+      </w:r>
+      <w:r>
+        <w:t xml:space="preserve">. You can also sort </w:t>
+      </w:r>
+      <w:r>
+        <w:rPr>
+          <w:b/>
+        </w:rPr>
+        <w:t>Name Z-A</w:t>
+      </w:r>
+      <w:r>
+        <w:t xml:space="preserve">, </w:t>
+      </w:r>
+      <w:r>
+        <w:rPr>
+          <w:b/>
+        </w:rPr>
+        <w:t>Price low-high</w:t>
+      </w:r>
+      <w:r>
+        <w:t xml:space="preserve">, </w:t>
+      </w:r>
+      <w:r>
+        <w:rPr>
+          <w:b/>
+        </w:rPr>
+        <w:t>Price high-low</w:t>
+      </w:r>
+      <w:r>
+        <w:t xml:space="preserve"> or by </w:t>
+      </w:r>
+      <w:r>
+        <w:rPr>
+          <w:b/>
+        </w:rPr>
+        <w:t>Brand</w:t>
+      </w:r>
+      <w:r>
+        <w:t>. Products stay grouped by category. Items without a set price (marked Inquire) always sort to the end when you sort by price.</w:t>
+      </w:r>
+    </w:p>
+    <w:p>
+      <w:pPr>
+        <w:pStyle w:val="Heading3"/>
+      </w:pPr>
+      <w:r>
+        <w:lastRenderedPageBreak/>
+        <w:t>Choosing size, shipping and quantity</w:t>
+      </w:r>
+    </w:p>
+    <w:p>
+      <w:pPr>
+        <w:keepNext/>
+        <w:spacing w:after="40"/>
+        <w:jc w:val="center"/>
+      </w:pPr>
+      <w:r>
+        <w:rPr>
+          <w:noProof/>
+        </w:rPr>
+        <w:drawing>
+          <wp:inline distT="0" distB="0" distL="0" distR="0" wp14:anchorId="0F939C8A" wp14:editId="2CE90166">
+            <wp:extent cx="5760720" cy="3870484"/>
+            <wp:effectExtent l="0" t="0" r="0" b="0"/>
+            <wp:docPr id="5" name="Picture 5"/>
+            <wp:cNvGraphicFramePr>
+              <a:graphicFrameLocks xmlns:a="http://schemas.openxmlformats.org/drawingml/2006/main" noChangeAspect="1"/>
+            </wp:cNvGraphicFramePr>
+            <a:graphic xmlns:a="http://schemas.openxmlformats.org/drawingml/2006/main">
+              <a:graphicData uri="http://schemas.openxmlformats.org/drawingml/2006/picture">
+                <pic:pic xmlns:pic="http://schemas.openxmlformats.org/drawingml/2006/picture">
+                  <pic:nvPicPr>
+                    <pic:cNvPr id="0" name="04_add_item_detail.png"/>
+                    <pic:cNvPicPr/>
+                  </pic:nvPicPr>
+                  <pic:blipFill>
+                    <a:blip r:embed="rId13"/>
+                    <a:stretch>
+                      <a:fillRect/>
+                    </a:stretch>
+                  </pic:blipFill>
+                  <pic:spPr>
+                    <a:xfrm>
+                      <a:off x="0" y="0"/>
+                      <a:ext cx="5760720" cy="3870484"/>
+                    </a:xfrm>
+                    <a:prstGeom prst="rect">
+                      <a:avLst/>
+                    </a:prstGeom>
+                  </pic:spPr>
+                </pic:pic>
+              </a:graphicData>
+            </a:graphic>
+          </wp:inline>
+        </w:drawing>
+      </w:r>
+    </w:p>
+    <w:p>
+      <w:pPr>
+        <w:spacing w:after="200"/>
+        <w:jc w:val="center"/>
+      </w:pPr>
+      <w:r>
+        <w:rPr>
+          <w:i/>
+          <w:color w:val="6B7280"/>
+          <w:sz w:val="18"/>
+        </w:rPr>
         <w:t>Choosing the size and configuration, shipping, quantity and discount</w:t>
       </w:r>
     </w:p>
@@ -7676,10 +7844,10 @@
           <w:noProof/>
         </w:rPr>
         <w:drawing>
-          <wp:inline distT="0" distB="0" distL="0" distR="0" wp14:anchorId="0E8BE94C" wp14:editId="2881BF32">
+          <wp:inline distT="0" distB="0" distL="0" distR="0" wp14:anchorId="01E7606E" wp14:editId="246AFC2F">
             <wp:extent cx="5760720" cy="4545568"/>
             <wp:effectExtent l="0" t="0" r="0" b="0"/>
-            <wp:docPr id="5" name="Picture 5"/>
+            <wp:docPr id="6" name="Picture 6"/>
             <wp:cNvGraphicFramePr>
               <a:graphicFrameLocks xmlns:a="http://schemas.openxmlformats.org/drawingml/2006/main" noChangeAspect="1"/>
             </wp:cNvGraphicFramePr>
@@ -7691,7 +7859,7 @@
                     <pic:cNvPicPr/>
                   </pic:nvPicPr>
                   <pic:blipFill>
-                    <a:blip r:embed="rId13"/>
+                    <a:blip r:embed="rId14"/>
                     <a:stretch>
                       <a:fillRect/>
                     </a:stretch>
@@ -7891,10 +8059,10 @@
           <w:noProof/>
         </w:rPr>
         <w:drawing>
-          <wp:inline distT="0" distB="0" distL="0" distR="0" wp14:anchorId="1490A02F" wp14:editId="0B5DD556">
+          <wp:inline distT="0" distB="0" distL="0" distR="0" wp14:anchorId="37594E99" wp14:editId="782924E9">
             <wp:extent cx="5486400" cy="3686175"/>
             <wp:effectExtent l="0" t="0" r="0" b="0"/>
-            <wp:docPr id="6" name="Picture 6"/>
+            <wp:docPr id="7" name="Picture 7"/>
             <wp:cNvGraphicFramePr>
               <a:graphicFrameLocks xmlns:a="http://schemas.openxmlformats.org/drawingml/2006/main" noChangeAspect="1"/>
             </wp:cNvGraphicFramePr>
@@ -7906,7 +8074,7 @@
                     <pic:cNvPicPr/>
                   </pic:nvPicPr>
                   <pic:blipFill>
-                    <a:blip r:embed="rId14"/>
+                    <a:blip r:embed="rId15"/>
                     <a:stretch>
                       <a:fillRect/>
                     </a:stretch>
@@ -8105,11 +8273,11 @@
       <w:pPr>
         <w:pStyle w:val="Heading2"/>
       </w:pPr>
-      <w:bookmarkStart w:id="13" w:name="_Toc242102881"/>
+      <w:bookmarkStart w:id="14" w:name="_Toc242187232"/>
       <w:r>
         <w:t>Adding shipping or a service later</w:t>
       </w:r>
-      <w:bookmarkEnd w:id="13"/>
+      <w:bookmarkEnd w:id="14"/>
     </w:p>
     <w:p>
       <w:r>
@@ -8146,399 +8314,7 @@
         </w:rPr>
         <w:lastRenderedPageBreak/>
         <w:drawing>
-          <wp:inline distT="0" distB="0" distL="0" distR="0" wp14:anchorId="29CE08CE" wp14:editId="60348207">
-            <wp:extent cx="4754880" cy="3194685"/>
-            <wp:effectExtent l="0" t="0" r="0" b="0"/>
-            <wp:docPr id="7" name="Picture 7"/>
-            <wp:cNvGraphicFramePr>
-              <a:graphicFrameLocks xmlns:a="http://schemas.openxmlformats.org/drawingml/2006/main" noChangeAspect="1"/>
-            </wp:cNvGraphicFramePr>
-            <a:graphic xmlns:a="http://schemas.openxmlformats.org/drawingml/2006/main">
-              <a:graphicData uri="http://schemas.openxmlformats.org/drawingml/2006/picture">
-                <pic:pic xmlns:pic="http://schemas.openxmlformats.org/drawingml/2006/picture">
-                  <pic:nvPicPr>
-                    <pic:cNvPr id="0" name="06_add_service.png"/>
-                    <pic:cNvPicPr/>
-                  </pic:nvPicPr>
-                  <pic:blipFill>
-                    <a:blip r:embed="rId15"/>
-                    <a:stretch>
-                      <a:fillRect/>
-                    </a:stretch>
-                  </pic:blipFill>
-                  <pic:spPr>
-                    <a:xfrm>
-                      <a:off x="0" y="0"/>
-                      <a:ext cx="4754880" cy="3194685"/>
-                    </a:xfrm>
-                    <a:prstGeom prst="rect">
-                      <a:avLst/>
-                    </a:prstGeom>
-                  </pic:spPr>
-                </pic:pic>
-              </a:graphicData>
-            </a:graphic>
-          </wp:inline>
-        </w:drawing>
-      </w:r>
-    </w:p>
-    <w:p>
-      <w:pPr>
-        <w:spacing w:after="200"/>
-        <w:jc w:val="center"/>
-      </w:pPr>
-      <w:r>
-        <w:rPr>
-          <w:i/>
-          <w:color w:val="6B7280"/>
-          <w:sz w:val="18"/>
-        </w:rPr>
-        <w:t>Adding a service to an item already on the order</w:t>
-      </w:r>
-    </w:p>
-    <w:p>
-      <w:pPr>
-        <w:pStyle w:val="Heading2"/>
-      </w:pPr>
-      <w:bookmarkStart w:id="14" w:name="_Toc242102882"/>
-      <w:r>
-        <w:t>Changing or removing an item</w:t>
-      </w:r>
-      <w:bookmarkEnd w:id="14"/>
-    </w:p>
-    <w:p>
-      <w:pPr>
-        <w:pStyle w:val="ListBullet"/>
-        <w:spacing w:after="60"/>
-      </w:pPr>
-      <w:r>
-        <w:rPr>
-          <w:b/>
-        </w:rPr>
-        <w:t>Edit</w:t>
-      </w:r>
-      <w:r>
-        <w:t xml:space="preserve"> lets you change the description, brand, size, unit price, discount (a percent or a dollar amount off each) and quantity. It also lets you mark the item </w:t>
-      </w:r>
-      <w:r>
-        <w:rPr>
-          <w:b/>
-        </w:rPr>
-        <w:t>Take with</w:t>
-      </w:r>
-      <w:r>
-        <w:t xml:space="preserve"> (the customer carries it out today) or </w:t>
-      </w:r>
-      <w:r>
-        <w:rPr>
-          <w:b/>
-        </w:rPr>
-        <w:t>Taxable</w:t>
-      </w:r>
-      <w:r>
-        <w:t>. For counted items, the Take with box shows how many are in stock and can't be ticked when there aren't enough.</w:t>
-      </w:r>
-    </w:p>
-    <w:p>
-      <w:pPr>
-        <w:pStyle w:val="ListBullet"/>
-        <w:spacing w:after="60"/>
-      </w:pPr>
-      <w:r>
-        <w:rPr>
-          <w:b/>
-        </w:rPr>
-        <w:t>-</w:t>
-      </w:r>
-      <w:r>
-        <w:t xml:space="preserve"> and </w:t>
-      </w:r>
-      <w:r>
-        <w:rPr>
-          <w:b/>
-        </w:rPr>
-        <w:t>+</w:t>
-      </w:r>
-      <w:r>
-        <w:t xml:space="preserve"> next to an item change its quantity straight away, without opening Edit.</w:t>
-      </w:r>
-    </w:p>
-    <w:p>
-      <w:pPr>
-        <w:pStyle w:val="ListBullet"/>
-        <w:spacing w:after="60"/>
-      </w:pPr>
-      <w:r>
-        <w:rPr>
-          <w:b/>
-        </w:rPr>
-        <w:t>Notes</w:t>
-      </w:r>
-      <w:r>
-        <w:t xml:space="preserve">: add or change an item's note with </w:t>
-      </w:r>
-      <w:r>
-        <w:rPr>
-          <w:b/>
-        </w:rPr>
-        <w:t>Edit</w:t>
-      </w:r>
-      <w:r>
-        <w:t>. The note shows under the item on screen, and on the sales sheet it prints directly under the item, above its shipping row.</w:t>
-      </w:r>
-    </w:p>
-    <w:p>
-      <w:pPr>
-        <w:pStyle w:val="ListBullet"/>
-        <w:spacing w:after="60"/>
-      </w:pPr>
-      <w:r>
-        <w:rPr>
-          <w:b/>
-        </w:rPr>
-        <w:t>Remove</w:t>
-      </w:r>
-      <w:r>
-        <w:t xml:space="preserve"> takes the item off the order. The app asks you to confirm first.</w:t>
-      </w:r>
-    </w:p>
-    <w:p>
-      <w:r>
-        <w:t xml:space="preserve">Small labels on each item help you check the order at a glance: </w:t>
-      </w:r>
-      <w:r>
-        <w:rPr>
-          <w:b/>
-        </w:rPr>
-        <w:t>Take with</w:t>
-      </w:r>
-      <w:r>
-        <w:t xml:space="preserve">, </w:t>
-      </w:r>
-      <w:r>
-        <w:rPr>
-          <w:b/>
-        </w:rPr>
-        <w:t>Included</w:t>
-      </w:r>
-      <w:r>
-        <w:t xml:space="preserve"> (part of a bundle), a sale such as </w:t>
-      </w:r>
-      <w:r>
-        <w:rPr>
-          <w:b/>
-        </w:rPr>
-        <w:t>Sale -20%</w:t>
-      </w:r>
-      <w:r>
-        <w:t xml:space="preserve">, your extra discount such as </w:t>
-      </w:r>
-      <w:r>
-        <w:rPr>
-          <w:b/>
-        </w:rPr>
-        <w:t>-10%</w:t>
-      </w:r>
-      <w:r>
-        <w:t xml:space="preserve"> or </w:t>
-      </w:r>
-      <w:r>
-        <w:rPr>
-          <w:b/>
-        </w:rPr>
-        <w:t>-$5 ea</w:t>
-      </w:r>
-      <w:r>
-        <w:t xml:space="preserve">, and </w:t>
-      </w:r>
-      <w:r>
-        <w:rPr>
-          <w:b/>
-        </w:rPr>
-        <w:t>Not on sales sheet</w:t>
-      </w:r>
-      <w:r>
-        <w:t xml:space="preserve"> for a free service row that won't print. Any selections show after the name, for example </w:t>
-      </w:r>
-      <w:r>
-        <w:rPr>
-          <w:b/>
-        </w:rPr>
-        <w:t>Color: Gray</w:t>
-      </w:r>
-      <w:r>
-        <w:t>, and print the same way on the sales sheet.</w:t>
-      </w:r>
-    </w:p>
-    <w:p>
-      <w:pPr>
-        <w:pStyle w:val="Heading2"/>
-      </w:pPr>
-      <w:bookmarkStart w:id="15" w:name="_Toc242102883"/>
-      <w:r>
-        <w:t>Customer details</w:t>
-      </w:r>
-      <w:bookmarkEnd w:id="15"/>
-    </w:p>
-    <w:p>
-      <w:r>
-        <w:t xml:space="preserve">The right side of the screen (or the </w:t>
-      </w:r>
-      <w:r>
-        <w:rPr>
-          <w:b/>
-        </w:rPr>
-        <w:t>Customer</w:t>
-      </w:r>
-      <w:r>
-        <w:t xml:space="preserve"> tab on a phone) holds the same fields as the paper sales sheet:</w:t>
-      </w:r>
-    </w:p>
-    <w:p>
-      <w:pPr>
-        <w:pStyle w:val="ListBullet"/>
-        <w:spacing w:after="60"/>
-      </w:pPr>
-      <w:r>
-        <w:rPr>
-          <w:b/>
-        </w:rPr>
-        <w:t>Sale details</w:t>
-      </w:r>
-      <w:r>
-        <w:t>: Organization, Advertising source, Referral name and CFS rep name.</w:t>
-      </w:r>
-    </w:p>
-    <w:p>
-      <w:pPr>
-        <w:pStyle w:val="ListBullet"/>
-        <w:spacing w:after="60"/>
-      </w:pPr>
-      <w:r>
-        <w:rPr>
-          <w:b/>
-        </w:rPr>
-        <w:t>Customer billing name and address</w:t>
-      </w:r>
-      <w:r>
-        <w:t>: name, street address, unit, floor, suite, city, state, zip, cell, alternate phone and email.</w:t>
-      </w:r>
-    </w:p>
-    <w:p>
-      <w:pPr>
-        <w:pStyle w:val="ListBullet"/>
-        <w:spacing w:after="60"/>
-      </w:pPr>
-      <w:r>
-        <w:rPr>
-          <w:b/>
-        </w:rPr>
-        <w:t>Delivery address</w:t>
-      </w:r>
-      <w:r>
-        <w:t xml:space="preserve">: leave </w:t>
-      </w:r>
-      <w:r>
-        <w:rPr>
-          <w:b/>
-        </w:rPr>
-        <w:t>Same as billing</w:t>
-      </w:r>
-      <w:r>
-        <w:t xml:space="preserve"> ticked, or untick it to enter a different address.</w:t>
-      </w:r>
-    </w:p>
-    <w:p>
-      <w:pPr>
-        <w:pStyle w:val="ListBullet"/>
-        <w:spacing w:after="60"/>
-      </w:pPr>
-      <w:r>
-        <w:rPr>
-          <w:b/>
-        </w:rPr>
-        <w:t>Comments</w:t>
-      </w:r>
-      <w:r>
-        <w:t>: anything the delivery crew or checkout table should know.</w:t>
-      </w:r>
-    </w:p>
-    <w:p>
-      <w:r>
-        <w:lastRenderedPageBreak/>
-        <w:t>Details tidy themselves up when you move to the next box: a phone number becomes (724) 555-0100, the state becomes capitals, and the email is lower-cased.</w:t>
-      </w:r>
-    </w:p>
-    <w:p>
-      <w:pPr>
-        <w:pStyle w:val="Heading3"/>
-      </w:pPr>
-      <w:r>
-        <w:t>Letting the customer type it in</w:t>
-      </w:r>
-    </w:p>
-    <w:p>
-      <w:r>
-        <w:t xml:space="preserve">Customers are often quicker (and more accurate) typing their own address. Tap </w:t>
-      </w:r>
-      <w:r>
-        <w:rPr>
-          <w:b/>
-        </w:rPr>
-        <w:t>Hand tablet to customer</w:t>
-      </w:r>
-      <w:r>
-        <w:t xml:space="preserve">. The customer sees a simple, large-print form titled </w:t>
-      </w:r>
-      <w:r>
-        <w:rPr>
-          <w:b/>
-        </w:rPr>
-        <w:t>Where should we deliver?</w:t>
-      </w:r>
-      <w:r>
-        <w:t xml:space="preserve"> with only the fields they need, including a choice of delivering </w:t>
-      </w:r>
-      <w:r>
-        <w:rPr>
-          <w:b/>
-        </w:rPr>
-        <w:t>To the address above</w:t>
-      </w:r>
-      <w:r>
-        <w:t xml:space="preserve"> or </w:t>
-      </w:r>
-      <w:r>
-        <w:rPr>
-          <w:b/>
-        </w:rPr>
-        <w:t>Somewhere else</w:t>
-      </w:r>
-      <w:r>
-        <w:t xml:space="preserve">. When they tap </w:t>
-      </w:r>
-      <w:r>
-        <w:rPr>
-          <w:b/>
-        </w:rPr>
-        <w:t>Done</w:t>
-      </w:r>
-      <w:r>
-        <w:t>, the details drop into the order and they hand the tablet back.</w:t>
-      </w:r>
-    </w:p>
-    <w:p>
-      <w:pPr>
-        <w:keepNext/>
-        <w:spacing w:after="40"/>
-        <w:jc w:val="center"/>
-      </w:pPr>
-      <w:r>
-        <w:rPr>
-          <w:noProof/>
-        </w:rPr>
-        <w:drawing>
-          <wp:inline distT="0" distB="0" distL="0" distR="0" wp14:anchorId="596D336A" wp14:editId="4D5A406D">
+          <wp:inline distT="0" distB="0" distL="0" distR="0" wp14:anchorId="5D79FCF9" wp14:editId="2BEABFE3">
             <wp:extent cx="4754880" cy="3194685"/>
             <wp:effectExtent l="0" t="0" r="0" b="0"/>
             <wp:docPr id="8" name="Picture 8"/>
@@ -8549,7 +8325,7 @@
               <a:graphicData uri="http://schemas.openxmlformats.org/drawingml/2006/picture">
                 <pic:pic xmlns:pic="http://schemas.openxmlformats.org/drawingml/2006/picture">
                   <pic:nvPicPr>
-                    <pic:cNvPr id="0" name="05_customer_sheet.png"/>
+                    <pic:cNvPr id="0" name="06_add_service.png"/>
                     <pic:cNvPicPr/>
                   </pic:nvPicPr>
                   <pic:blipFill>
@@ -8585,6 +8361,398 @@
           <w:color w:val="6B7280"/>
           <w:sz w:val="18"/>
         </w:rPr>
+        <w:t>Adding a service to an item already on the order</w:t>
+      </w:r>
+    </w:p>
+    <w:p>
+      <w:pPr>
+        <w:pStyle w:val="Heading2"/>
+      </w:pPr>
+      <w:bookmarkStart w:id="15" w:name="_Toc242187233"/>
+      <w:r>
+        <w:t>Changing or removing an item</w:t>
+      </w:r>
+      <w:bookmarkEnd w:id="15"/>
+    </w:p>
+    <w:p>
+      <w:pPr>
+        <w:pStyle w:val="ListBullet"/>
+        <w:spacing w:after="60"/>
+      </w:pPr>
+      <w:r>
+        <w:rPr>
+          <w:b/>
+        </w:rPr>
+        <w:t>Edit</w:t>
+      </w:r>
+      <w:r>
+        <w:t xml:space="preserve"> lets you change the description, brand, size, unit price, discount (a percent or a dollar amount off each) and quantity. It also lets you mark the item </w:t>
+      </w:r>
+      <w:r>
+        <w:rPr>
+          <w:b/>
+        </w:rPr>
+        <w:t>Take with</w:t>
+      </w:r>
+      <w:r>
+        <w:t xml:space="preserve"> (the customer carries it out today) or </w:t>
+      </w:r>
+      <w:r>
+        <w:rPr>
+          <w:b/>
+        </w:rPr>
+        <w:t>Taxable</w:t>
+      </w:r>
+      <w:r>
+        <w:t>. For counted items, the Take with box shows how many are in stock and can't be ticked when there aren't enough.</w:t>
+      </w:r>
+    </w:p>
+    <w:p>
+      <w:pPr>
+        <w:pStyle w:val="ListBullet"/>
+        <w:spacing w:after="60"/>
+      </w:pPr>
+      <w:r>
+        <w:rPr>
+          <w:b/>
+        </w:rPr>
+        <w:t>-</w:t>
+      </w:r>
+      <w:r>
+        <w:t xml:space="preserve"> and </w:t>
+      </w:r>
+      <w:r>
+        <w:rPr>
+          <w:b/>
+        </w:rPr>
+        <w:t>+</w:t>
+      </w:r>
+      <w:r>
+        <w:t xml:space="preserve"> next to an item change its quantity straight away, without opening Edit.</w:t>
+      </w:r>
+    </w:p>
+    <w:p>
+      <w:pPr>
+        <w:pStyle w:val="ListBullet"/>
+        <w:spacing w:after="60"/>
+      </w:pPr>
+      <w:r>
+        <w:rPr>
+          <w:b/>
+        </w:rPr>
+        <w:t>Notes</w:t>
+      </w:r>
+      <w:r>
+        <w:t xml:space="preserve">: add or change an item's note with </w:t>
+      </w:r>
+      <w:r>
+        <w:rPr>
+          <w:b/>
+        </w:rPr>
+        <w:t>Edit</w:t>
+      </w:r>
+      <w:r>
+        <w:t>. The note shows under the item on screen, and on the sales sheet it prints directly under the item, above its shipping row.</w:t>
+      </w:r>
+    </w:p>
+    <w:p>
+      <w:pPr>
+        <w:pStyle w:val="ListBullet"/>
+        <w:spacing w:after="60"/>
+      </w:pPr>
+      <w:r>
+        <w:rPr>
+          <w:b/>
+        </w:rPr>
+        <w:t>Remove</w:t>
+      </w:r>
+      <w:r>
+        <w:t xml:space="preserve"> takes the item off the order. The app asks you to confirm first.</w:t>
+      </w:r>
+    </w:p>
+    <w:p>
+      <w:r>
+        <w:t xml:space="preserve">Small labels on each item help you check the order at a glance: </w:t>
+      </w:r>
+      <w:r>
+        <w:rPr>
+          <w:b/>
+        </w:rPr>
+        <w:t>Take with</w:t>
+      </w:r>
+      <w:r>
+        <w:t xml:space="preserve">, </w:t>
+      </w:r>
+      <w:r>
+        <w:rPr>
+          <w:b/>
+        </w:rPr>
+        <w:t>Included</w:t>
+      </w:r>
+      <w:r>
+        <w:t xml:space="preserve"> (part of a bundle), a sale such as </w:t>
+      </w:r>
+      <w:r>
+        <w:rPr>
+          <w:b/>
+        </w:rPr>
+        <w:t>Sale -20%</w:t>
+      </w:r>
+      <w:r>
+        <w:t xml:space="preserve">, your extra discount such as </w:t>
+      </w:r>
+      <w:r>
+        <w:rPr>
+          <w:b/>
+        </w:rPr>
+        <w:t>-10%</w:t>
+      </w:r>
+      <w:r>
+        <w:t xml:space="preserve"> or </w:t>
+      </w:r>
+      <w:r>
+        <w:rPr>
+          <w:b/>
+        </w:rPr>
+        <w:t>-$5 ea</w:t>
+      </w:r>
+      <w:r>
+        <w:t xml:space="preserve">, and </w:t>
+      </w:r>
+      <w:r>
+        <w:rPr>
+          <w:b/>
+        </w:rPr>
+        <w:t>Not on sales sheet</w:t>
+      </w:r>
+      <w:r>
+        <w:t xml:space="preserve"> for a free service row that won't print. Any selections show after the name, for example </w:t>
+      </w:r>
+      <w:r>
+        <w:rPr>
+          <w:b/>
+        </w:rPr>
+        <w:t>Color: Gray</w:t>
+      </w:r>
+      <w:r>
+        <w:t>, and print the same way on the sales sheet.</w:t>
+      </w:r>
+    </w:p>
+    <w:p>
+      <w:pPr>
+        <w:pStyle w:val="Heading2"/>
+      </w:pPr>
+      <w:bookmarkStart w:id="16" w:name="_Toc242187234"/>
+      <w:r>
+        <w:t>Customer details</w:t>
+      </w:r>
+      <w:bookmarkEnd w:id="16"/>
+    </w:p>
+    <w:p>
+      <w:r>
+        <w:t xml:space="preserve">The right side of the screen (or the </w:t>
+      </w:r>
+      <w:r>
+        <w:rPr>
+          <w:b/>
+        </w:rPr>
+        <w:t>Customer</w:t>
+      </w:r>
+      <w:r>
+        <w:t xml:space="preserve"> tab on a phone) holds the same fields as the paper sales sheet:</w:t>
+      </w:r>
+    </w:p>
+    <w:p>
+      <w:pPr>
+        <w:pStyle w:val="ListBullet"/>
+        <w:spacing w:after="60"/>
+      </w:pPr>
+      <w:r>
+        <w:rPr>
+          <w:b/>
+        </w:rPr>
+        <w:t>Sale details</w:t>
+      </w:r>
+      <w:r>
+        <w:t>: Organization, Advertising source, Referral name and CFS rep name.</w:t>
+      </w:r>
+    </w:p>
+    <w:p>
+      <w:pPr>
+        <w:pStyle w:val="ListBullet"/>
+        <w:spacing w:after="60"/>
+      </w:pPr>
+      <w:r>
+        <w:rPr>
+          <w:b/>
+        </w:rPr>
+        <w:t>Customer billing name and address</w:t>
+      </w:r>
+      <w:r>
+        <w:t>: name, street address, unit, floor, suite, city, state, zip, cell, alternate phone and email.</w:t>
+      </w:r>
+    </w:p>
+    <w:p>
+      <w:pPr>
+        <w:pStyle w:val="ListBullet"/>
+        <w:spacing w:after="60"/>
+      </w:pPr>
+      <w:r>
+        <w:rPr>
+          <w:b/>
+        </w:rPr>
+        <w:t>Delivery address</w:t>
+      </w:r>
+      <w:r>
+        <w:t xml:space="preserve">: leave </w:t>
+      </w:r>
+      <w:r>
+        <w:rPr>
+          <w:b/>
+        </w:rPr>
+        <w:t>Same as billing</w:t>
+      </w:r>
+      <w:r>
+        <w:t xml:space="preserve"> ticked, or untick it to enter a different address.</w:t>
+      </w:r>
+    </w:p>
+    <w:p>
+      <w:pPr>
+        <w:pStyle w:val="ListBullet"/>
+        <w:spacing w:after="60"/>
+      </w:pPr>
+      <w:r>
+        <w:rPr>
+          <w:b/>
+        </w:rPr>
+        <w:t>Comments</w:t>
+      </w:r>
+      <w:r>
+        <w:t>: anything the delivery crew or checkout table should know.</w:t>
+      </w:r>
+    </w:p>
+    <w:p>
+      <w:r>
+        <w:lastRenderedPageBreak/>
+        <w:t>Details tidy themselves up when you move to the next box: a phone number becomes (724) 555-0100, the state becomes capitals, and the email is lower-cased.</w:t>
+      </w:r>
+    </w:p>
+    <w:p>
+      <w:pPr>
+        <w:pStyle w:val="Heading3"/>
+      </w:pPr>
+      <w:r>
+        <w:t>Letting the customer type it in</w:t>
+      </w:r>
+    </w:p>
+    <w:p>
+      <w:r>
+        <w:t xml:space="preserve">Customers are often quicker (and more accurate) typing their own address. Tap </w:t>
+      </w:r>
+      <w:r>
+        <w:rPr>
+          <w:b/>
+        </w:rPr>
+        <w:t>Hand tablet to customer</w:t>
+      </w:r>
+      <w:r>
+        <w:t xml:space="preserve">. The customer sees a simple, large-print form titled </w:t>
+      </w:r>
+      <w:r>
+        <w:rPr>
+          <w:b/>
+        </w:rPr>
+        <w:t>Where should we deliver?</w:t>
+      </w:r>
+      <w:r>
+        <w:t xml:space="preserve"> with only the fields they need, including a choice of delivering </w:t>
+      </w:r>
+      <w:r>
+        <w:rPr>
+          <w:b/>
+        </w:rPr>
+        <w:t>To the address above</w:t>
+      </w:r>
+      <w:r>
+        <w:t xml:space="preserve"> or </w:t>
+      </w:r>
+      <w:r>
+        <w:rPr>
+          <w:b/>
+        </w:rPr>
+        <w:t>Somewhere else</w:t>
+      </w:r>
+      <w:r>
+        <w:t xml:space="preserve">. When they tap </w:t>
+      </w:r>
+      <w:r>
+        <w:rPr>
+          <w:b/>
+        </w:rPr>
+        <w:t>Done</w:t>
+      </w:r>
+      <w:r>
+        <w:t>, the details drop into the order and they hand the tablet back.</w:t>
+      </w:r>
+    </w:p>
+    <w:p>
+      <w:pPr>
+        <w:keepNext/>
+        <w:spacing w:after="40"/>
+        <w:jc w:val="center"/>
+      </w:pPr>
+      <w:r>
+        <w:rPr>
+          <w:noProof/>
+        </w:rPr>
+        <w:drawing>
+          <wp:inline distT="0" distB="0" distL="0" distR="0" wp14:anchorId="67D042BA" wp14:editId="3B9CBC8D">
+            <wp:extent cx="4754880" cy="3194685"/>
+            <wp:effectExtent l="0" t="0" r="0" b="0"/>
+            <wp:docPr id="9" name="Picture 9"/>
+            <wp:cNvGraphicFramePr>
+              <a:graphicFrameLocks xmlns:a="http://schemas.openxmlformats.org/drawingml/2006/main" noChangeAspect="1"/>
+            </wp:cNvGraphicFramePr>
+            <a:graphic xmlns:a="http://schemas.openxmlformats.org/drawingml/2006/main">
+              <a:graphicData uri="http://schemas.openxmlformats.org/drawingml/2006/picture">
+                <pic:pic xmlns:pic="http://schemas.openxmlformats.org/drawingml/2006/picture">
+                  <pic:nvPicPr>
+                    <pic:cNvPr id="0" name="05_customer_sheet.png"/>
+                    <pic:cNvPicPr/>
+                  </pic:nvPicPr>
+                  <pic:blipFill>
+                    <a:blip r:embed="rId17"/>
+                    <a:stretch>
+                      <a:fillRect/>
+                    </a:stretch>
+                  </pic:blipFill>
+                  <pic:spPr>
+                    <a:xfrm>
+                      <a:off x="0" y="0"/>
+                      <a:ext cx="4754880" cy="3194685"/>
+                    </a:xfrm>
+                    <a:prstGeom prst="rect">
+                      <a:avLst/>
+                    </a:prstGeom>
+                  </pic:spPr>
+                </pic:pic>
+              </a:graphicData>
+            </a:graphic>
+          </wp:inline>
+        </w:drawing>
+      </w:r>
+    </w:p>
+    <w:p>
+      <w:pPr>
+        <w:spacing w:after="200"/>
+        <w:jc w:val="center"/>
+      </w:pPr>
+      <w:r>
+        <w:rPr>
+          <w:i/>
+          <w:color w:val="6B7280"/>
+          <w:sz w:val="18"/>
+        </w:rPr>
         <w:t>The customer-friendly address form</w:t>
       </w:r>
     </w:p>
@@ -8592,11 +8760,11 @@
       <w:pPr>
         <w:pStyle w:val="Heading2"/>
       </w:pPr>
-      <w:bookmarkStart w:id="16" w:name="_Toc242102884"/>
+      <w:bookmarkStart w:id="17" w:name="_Toc242187235"/>
       <w:r>
         <w:t>Sending the order to checkout</w:t>
       </w:r>
-      <w:bookmarkEnd w:id="16"/>
+      <w:bookmarkEnd w:id="17"/>
     </w:p>
     <w:p>
       <w:r>
@@ -8770,12 +8938,12 @@
       <w:pPr>
         <w:pStyle w:val="Heading2"/>
       </w:pPr>
-      <w:bookmarkStart w:id="17" w:name="_Toc242102885"/>
+      <w:bookmarkStart w:id="18" w:name="_Toc242187236"/>
       <w:r>
         <w:lastRenderedPageBreak/>
         <w:t>Using a phone</w:t>
       </w:r>
-      <w:bookmarkEnd w:id="17"/>
+      <w:bookmarkEnd w:id="18"/>
     </w:p>
     <w:p>
       <w:pPr>
@@ -8788,10 +8956,10 @@
           <w:noProof/>
         </w:rPr>
         <w:drawing>
-          <wp:inline distT="0" distB="0" distL="0" distR="0" wp14:anchorId="1A66640D" wp14:editId="65190104">
+          <wp:inline distT="0" distB="0" distL="0" distR="0" wp14:anchorId="06FA450B" wp14:editId="4A3765FA">
             <wp:extent cx="2194560" cy="4749253"/>
             <wp:effectExtent l="0" t="0" r="0" b="0"/>
-            <wp:docPr id="9" name="Picture 9"/>
+            <wp:docPr id="10" name="Picture 10"/>
             <wp:cNvGraphicFramePr>
               <a:graphicFrameLocks xmlns:a="http://schemas.openxmlformats.org/drawingml/2006/main" noChangeAspect="1"/>
             </wp:cNvGraphicFramePr>
@@ -8803,7 +8971,7 @@
                     <pic:cNvPicPr/>
                   </pic:nvPicPr>
                   <pic:blipFill>
-                    <a:blip r:embed="rId17"/>
+                    <a:blip r:embed="rId18"/>
                     <a:stretch>
                       <a:fillRect/>
                     </a:stretch>
@@ -8866,12 +9034,12 @@
         <w:pStyle w:val="Heading1"/>
         <w:pageBreakBefore/>
       </w:pPr>
-      <w:bookmarkStart w:id="18" w:name="_Toc242102886"/>
+      <w:bookmarkStart w:id="19" w:name="_Toc242187237"/>
       <w:r>
         <w:lastRenderedPageBreak/>
         <w:t>Checking out a customer</w:t>
       </w:r>
-      <w:bookmarkEnd w:id="18"/>
+      <w:bookmarkEnd w:id="19"/>
     </w:p>
     <w:p>
       <w:r>
@@ -8907,10 +9075,10 @@
           <w:noProof/>
         </w:rPr>
         <w:drawing>
-          <wp:inline distT="0" distB="0" distL="0" distR="0" wp14:anchorId="0B48DC6F" wp14:editId="053D49F9">
+          <wp:inline distT="0" distB="0" distL="0" distR="0" wp14:anchorId="4A4FFD63" wp14:editId="79B8A96F">
             <wp:extent cx="5760720" cy="3870484"/>
             <wp:effectExtent l="0" t="0" r="0" b="0"/>
-            <wp:docPr id="10" name="Picture 10"/>
+            <wp:docPr id="11" name="Picture 11"/>
             <wp:cNvGraphicFramePr>
               <a:graphicFrameLocks xmlns:a="http://schemas.openxmlformats.org/drawingml/2006/main" noChangeAspect="1"/>
             </wp:cNvGraphicFramePr>
@@ -8922,7 +9090,7 @@
                     <pic:cNvPicPr/>
                   </pic:nvPicPr>
                   <pic:blipFill>
-                    <a:blip r:embed="rId18"/>
+                    <a:blip r:embed="rId19"/>
                     <a:stretch>
                       <a:fillRect/>
                     </a:stretch>
@@ -8961,11 +9129,11 @@
       <w:pPr>
         <w:pStyle w:val="Heading2"/>
       </w:pPr>
-      <w:bookmarkStart w:id="19" w:name="_Toc242102887"/>
+      <w:bookmarkStart w:id="20" w:name="_Toc242187238"/>
       <w:r>
         <w:t>1. Review the order with the customer</w:t>
       </w:r>
-      <w:bookmarkEnd w:id="19"/>
+      <w:bookmarkEnd w:id="20"/>
     </w:p>
     <w:p>
       <w:r>
@@ -9058,11 +9226,11 @@
       <w:pPr>
         <w:pStyle w:val="Heading2"/>
       </w:pPr>
-      <w:bookmarkStart w:id="20" w:name="_Toc242102888"/>
+      <w:bookmarkStart w:id="21" w:name="_Toc242187239"/>
       <w:r>
         <w:t>2. Take payment</w:t>
       </w:r>
-      <w:bookmarkEnd w:id="20"/>
+      <w:bookmarkEnd w:id="21"/>
     </w:p>
     <w:p>
       <w:pPr>
@@ -9372,11 +9540,11 @@
       <w:pPr>
         <w:pStyle w:val="Heading2"/>
       </w:pPr>
-      <w:bookmarkStart w:id="21" w:name="_Toc242102889"/>
+      <w:bookmarkStart w:id="22" w:name="_Toc242187240"/>
       <w:r>
         <w:t>3. Acknowledgements (initials and signature)</w:t>
       </w:r>
-      <w:bookmarkEnd w:id="21"/>
+      <w:bookmarkEnd w:id="22"/>
     </w:p>
     <w:p>
       <w:r>
@@ -9554,10 +9722,10 @@
         </w:rPr>
         <w:lastRenderedPageBreak/>
         <w:drawing>
-          <wp:inline distT="0" distB="0" distL="0" distR="0" wp14:anchorId="1B4B790D" wp14:editId="396FA5EA">
+          <wp:inline distT="0" distB="0" distL="0" distR="0" wp14:anchorId="3C490BCC" wp14:editId="59567058">
             <wp:extent cx="4937760" cy="3317558"/>
             <wp:effectExtent l="0" t="0" r="0" b="0"/>
-            <wp:docPr id="11" name="Picture 11"/>
+            <wp:docPr id="12" name="Picture 12"/>
             <wp:cNvGraphicFramePr>
               <a:graphicFrameLocks xmlns:a="http://schemas.openxmlformats.org/drawingml/2006/main" noChangeAspect="1"/>
             </wp:cNvGraphicFramePr>
@@ -9569,7 +9737,7 @@
                     <pic:cNvPicPr/>
                   </pic:nvPicPr>
                   <pic:blipFill>
-                    <a:blip r:embed="rId19"/>
+                    <a:blip r:embed="rId20"/>
                     <a:stretch>
                       <a:fillRect/>
                     </a:stretch>
@@ -9743,11 +9911,11 @@
       <w:pPr>
         <w:pStyle w:val="Heading2"/>
       </w:pPr>
-      <w:bookmarkStart w:id="22" w:name="_Toc242102890"/>
+      <w:bookmarkStart w:id="23" w:name="_Toc242187241"/>
       <w:r>
         <w:t>4. Complete the sale</w:t>
       </w:r>
-      <w:bookmarkEnd w:id="22"/>
+      <w:bookmarkEnd w:id="23"/>
     </w:p>
     <w:p>
       <w:r>
@@ -9965,11 +10133,11 @@
       <w:pPr>
         <w:pStyle w:val="Heading2"/>
       </w:pPr>
-      <w:bookmarkStart w:id="23" w:name="_Toc242102891"/>
+      <w:bookmarkStart w:id="24" w:name="_Toc242187242"/>
       <w:r>
         <w:t>Other checkout actions</w:t>
       </w:r>
-      <w:bookmarkEnd w:id="23"/>
+      <w:bookmarkEnd w:id="24"/>
     </w:p>
     <w:tbl>
       <w:tblPr>
@@ -10175,12 +10343,12 @@
         <w:pStyle w:val="Heading1"/>
         <w:pageBreakBefore/>
       </w:pPr>
-      <w:bookmarkStart w:id="24" w:name="_Toc242102892"/>
+      <w:bookmarkStart w:id="25" w:name="_Toc242187243"/>
       <w:r>
         <w:lastRenderedPageBreak/>
         <w:t>The sales sheet</w:t>
       </w:r>
-      <w:bookmarkEnd w:id="24"/>
+      <w:bookmarkEnd w:id="25"/>
     </w:p>
     <w:p>
       <w:r>
@@ -10198,10 +10366,10 @@
           <w:noProof/>
         </w:rPr>
         <w:drawing>
-          <wp:inline distT="0" distB="0" distL="0" distR="0" wp14:anchorId="0B3CD2B6" wp14:editId="376C3548">
+          <wp:inline distT="0" distB="0" distL="0" distR="0" wp14:anchorId="6420B4A3" wp14:editId="55BEB4CB">
             <wp:extent cx="4023360" cy="3187256"/>
             <wp:effectExtent l="0" t="0" r="0" b="0"/>
-            <wp:docPr id="12" name="Picture 12"/>
+            <wp:docPr id="13" name="Picture 13"/>
             <wp:cNvGraphicFramePr>
               <a:graphicFrameLocks xmlns:a="http://schemas.openxmlformats.org/drawingml/2006/main" noChangeAspect="1"/>
             </wp:cNvGraphicFramePr>
@@ -10213,7 +10381,7 @@
                     <pic:cNvPicPr/>
                   </pic:nvPicPr>
                   <pic:blipFill>
-                    <a:blip r:embed="rId20"/>
+                    <a:blip r:embed="rId21"/>
                     <a:stretch>
                       <a:fillRect/>
                     </a:stretch>
@@ -10645,11 +10813,11 @@
       <w:pPr>
         <w:pStyle w:val="Heading2"/>
       </w:pPr>
-      <w:bookmarkStart w:id="25" w:name="_Toc242102893"/>
+      <w:bookmarkStart w:id="26" w:name="_Toc242187244"/>
       <w:r>
         <w:t>Emailing a receipt</w:t>
       </w:r>
-      <w:bookmarkEnd w:id="25"/>
+      <w:bookmarkEnd w:id="26"/>
     </w:p>
     <w:p>
       <w:r>
@@ -10772,10 +10940,10 @@
           <w:noProof/>
         </w:rPr>
         <w:drawing>
-          <wp:inline distT="0" distB="0" distL="0" distR="0" wp14:anchorId="4D44E897" wp14:editId="679BD619">
+          <wp:inline distT="0" distB="0" distL="0" distR="0" wp14:anchorId="102AB8F3" wp14:editId="5205F6A7">
             <wp:extent cx="4572000" cy="3071812"/>
             <wp:effectExtent l="0" t="0" r="0" b="0"/>
-            <wp:docPr id="13" name="Picture 13"/>
+            <wp:docPr id="14" name="Picture 14"/>
             <wp:cNvGraphicFramePr>
               <a:graphicFrameLocks xmlns:a="http://schemas.openxmlformats.org/drawingml/2006/main" noChangeAspect="1"/>
             </wp:cNvGraphicFramePr>
@@ -10787,7 +10955,7 @@
                     <pic:cNvPicPr/>
                   </pic:nvPicPr>
                   <pic:blipFill>
-                    <a:blip r:embed="rId21"/>
+                    <a:blip r:embed="rId22"/>
                     <a:stretch>
                       <a:fillRect/>
                     </a:stretch>
@@ -11233,12 +11401,12 @@
         <w:pStyle w:val="Heading1"/>
         <w:pageBreakBefore/>
       </w:pPr>
-      <w:bookmarkStart w:id="26" w:name="_Toc242102894"/>
+      <w:bookmarkStart w:id="27" w:name="_Toc242187245"/>
       <w:r>
         <w:lastRenderedPageBreak/>
         <w:t>Looking up orders</w:t>
       </w:r>
-      <w:bookmarkEnd w:id="26"/>
+      <w:bookmarkEnd w:id="27"/>
     </w:p>
     <w:p>
       <w:r>
@@ -11265,10 +11433,10 @@
           <w:noProof/>
         </w:rPr>
         <w:drawing>
-          <wp:inline distT="0" distB="0" distL="0" distR="0" wp14:anchorId="607176D7" wp14:editId="7BE8F64F">
+          <wp:inline distT="0" distB="0" distL="0" distR="0" wp14:anchorId="49D43D3C" wp14:editId="6E3DF518">
             <wp:extent cx="5760720" cy="3870484"/>
             <wp:effectExtent l="0" t="0" r="0" b="0"/>
-            <wp:docPr id="14" name="Picture 14"/>
+            <wp:docPr id="15" name="Picture 15"/>
             <wp:cNvGraphicFramePr>
               <a:graphicFrameLocks xmlns:a="http://schemas.openxmlformats.org/drawingml/2006/main" noChangeAspect="1"/>
             </wp:cNvGraphicFramePr>
@@ -11280,7 +11448,7 @@
                     <pic:cNvPicPr/>
                   </pic:nvPicPr>
                   <pic:blipFill>
-                    <a:blip r:embed="rId22"/>
+                    <a:blip r:embed="rId23"/>
                     <a:stretch>
                       <a:fillRect/>
                     </a:stretch>
@@ -11385,11 +11553,11 @@
       <w:pPr>
         <w:pStyle w:val="Heading2"/>
       </w:pPr>
-      <w:bookmarkStart w:id="27" w:name="_Toc242102895"/>
+      <w:bookmarkStart w:id="28" w:name="_Toc242187246"/>
       <w:r>
         <w:t>Extra options for admins</w:t>
       </w:r>
-      <w:bookmarkEnd w:id="27"/>
+      <w:bookmarkEnd w:id="28"/>
     </w:p>
     <w:p>
       <w:pPr>
@@ -11475,10 +11643,10 @@
         </w:rPr>
         <w:lastRenderedPageBreak/>
         <w:drawing>
-          <wp:inline distT="0" distB="0" distL="0" distR="0" wp14:anchorId="333E3D98" wp14:editId="75CDC4A9">
+          <wp:inline distT="0" distB="0" distL="0" distR="0" wp14:anchorId="59F092CD" wp14:editId="7D3CB0B0">
             <wp:extent cx="4754880" cy="3194685"/>
             <wp:effectExtent l="0" t="0" r="0" b="0"/>
-            <wp:docPr id="15" name="Picture 15"/>
+            <wp:docPr id="16" name="Picture 16"/>
             <wp:cNvGraphicFramePr>
               <a:graphicFrameLocks xmlns:a="http://schemas.openxmlformats.org/drawingml/2006/main" noChangeAspect="1"/>
             </wp:cNvGraphicFramePr>
@@ -11490,7 +11658,7 @@
                     <pic:cNvPicPr/>
                   </pic:nvPicPr>
                   <pic:blipFill>
-                    <a:blip r:embed="rId23"/>
+                    <a:blip r:embed="rId24"/>
                     <a:stretch>
                       <a:fillRect/>
                     </a:stretch>
@@ -11597,12 +11765,12 @@
         <w:pStyle w:val="Heading1"/>
         <w:pageBreakBefore/>
       </w:pPr>
-      <w:bookmarkStart w:id="28" w:name="_Toc242102896"/>
+      <w:bookmarkStart w:id="29" w:name="_Toc242187247"/>
       <w:r>
         <w:lastRenderedPageBreak/>
         <w:t>The dashboard</w:t>
       </w:r>
-      <w:bookmarkEnd w:id="28"/>
+      <w:bookmarkEnd w:id="29"/>
     </w:p>
     <w:p>
       <w:r>
@@ -11661,10 +11829,10 @@
           <w:noProof/>
         </w:rPr>
         <w:drawing>
-          <wp:inline distT="0" distB="0" distL="0" distR="0" wp14:anchorId="71FE7C6E" wp14:editId="4AF87DAC">
+          <wp:inline distT="0" distB="0" distL="0" distR="0" wp14:anchorId="1C53578F" wp14:editId="4452DA19">
             <wp:extent cx="4937760" cy="4305110"/>
             <wp:effectExtent l="0" t="0" r="0" b="0"/>
-            <wp:docPr id="16" name="Picture 16"/>
+            <wp:docPr id="17" name="Picture 17"/>
             <wp:cNvGraphicFramePr>
               <a:graphicFrameLocks xmlns:a="http://schemas.openxmlformats.org/drawingml/2006/main" noChangeAspect="1"/>
             </wp:cNvGraphicFramePr>
@@ -11676,7 +11844,7 @@
                     <pic:cNvPicPr/>
                   </pic:nvPicPr>
                   <pic:blipFill>
-                    <a:blip r:embed="rId24"/>
+                    <a:blip r:embed="rId25"/>
                     <a:stretch>
                       <a:fillRect/>
                     </a:stretch>
@@ -12316,12 +12484,12 @@
         <w:pStyle w:val="Heading1"/>
         <w:pageBreakBefore/>
       </w:pPr>
-      <w:bookmarkStart w:id="29" w:name="_Toc242102897"/>
+      <w:bookmarkStart w:id="30" w:name="_Toc242187248"/>
       <w:r>
         <w:lastRenderedPageBreak/>
         <w:t>Keeping inventory</w:t>
       </w:r>
-      <w:bookmarkEnd w:id="29"/>
+      <w:bookmarkEnd w:id="30"/>
     </w:p>
     <w:p>
       <w:r>
@@ -12375,10 +12543,10 @@
           <w:noProof/>
         </w:rPr>
         <w:drawing>
-          <wp:inline distT="0" distB="0" distL="0" distR="0" wp14:anchorId="39FA171C" wp14:editId="4A556F07">
+          <wp:inline distT="0" distB="0" distL="0" distR="0" wp14:anchorId="3985C00F" wp14:editId="5B25C428">
             <wp:extent cx="5760720" cy="3870484"/>
             <wp:effectExtent l="0" t="0" r="0" b="0"/>
-            <wp:docPr id="17" name="Picture 17"/>
+            <wp:docPr id="18" name="Picture 18"/>
             <wp:cNvGraphicFramePr>
               <a:graphicFrameLocks xmlns:a="http://schemas.openxmlformats.org/drawingml/2006/main" noChangeAspect="1"/>
             </wp:cNvGraphicFramePr>
@@ -12390,7 +12558,7 @@
                     <pic:cNvPicPr/>
                   </pic:nvPicPr>
                   <pic:blipFill>
-                    <a:blip r:embed="rId25"/>
+                    <a:blip r:embed="rId26"/>
                     <a:stretch>
                       <a:fillRect/>
                     </a:stretch>
@@ -12429,11 +12597,11 @@
       <w:pPr>
         <w:pStyle w:val="Heading2"/>
       </w:pPr>
-      <w:bookmarkStart w:id="30" w:name="_Toc242102898"/>
+      <w:bookmarkStart w:id="31" w:name="_Toc242187249"/>
       <w:r>
         <w:t>What's on the screen</w:t>
       </w:r>
-      <w:bookmarkEnd w:id="30"/>
+      <w:bookmarkEnd w:id="31"/>
     </w:p>
     <w:p>
       <w:pPr>
@@ -12537,10 +12705,10 @@
         </w:rPr>
         <w:lastRenderedPageBreak/>
         <w:drawing>
-          <wp:inline distT="0" distB="0" distL="0" distR="0" wp14:anchorId="4A9141EC" wp14:editId="419AE788">
+          <wp:inline distT="0" distB="0" distL="0" distR="0" wp14:anchorId="52E32206" wp14:editId="6E9D24CE">
             <wp:extent cx="5120640" cy="2295459"/>
             <wp:effectExtent l="0" t="0" r="0" b="0"/>
-            <wp:docPr id="18" name="Picture 18"/>
+            <wp:docPr id="19" name="Picture 19"/>
             <wp:cNvGraphicFramePr>
               <a:graphicFrameLocks xmlns:a="http://schemas.openxmlformats.org/drawingml/2006/main" noChangeAspect="1"/>
             </wp:cNvGraphicFramePr>
@@ -12552,7 +12720,7 @@
                     <pic:cNvPicPr/>
                   </pic:nvPicPr>
                   <pic:blipFill>
-                    <a:blip r:embed="rId26"/>
+                    <a:blip r:embed="rId27"/>
                     <a:stretch>
                       <a:fillRect/>
                     </a:stretch>
@@ -12662,11 +12830,11 @@
       <w:pPr>
         <w:pStyle w:val="Heading2"/>
       </w:pPr>
-      <w:bookmarkStart w:id="31" w:name="_Toc242102899"/>
+      <w:bookmarkStart w:id="32" w:name="_Toc242187250"/>
       <w:r>
         <w:t>Updating a count</w:t>
       </w:r>
-      <w:bookmarkEnd w:id="31"/>
+      <w:bookmarkEnd w:id="32"/>
     </w:p>
     <w:p>
       <w:r>
@@ -12739,10 +12907,10 @@
         </w:rPr>
         <w:lastRenderedPageBreak/>
         <w:drawing>
-          <wp:inline distT="0" distB="0" distL="0" distR="0" wp14:anchorId="6EB11C5A" wp14:editId="1B99A1A2">
+          <wp:inline distT="0" distB="0" distL="0" distR="0" wp14:anchorId="1D99F0DE" wp14:editId="35BA3C35">
             <wp:extent cx="5120640" cy="3440430"/>
             <wp:effectExtent l="0" t="0" r="0" b="0"/>
-            <wp:docPr id="19" name="Picture 19"/>
+            <wp:docPr id="20" name="Picture 20"/>
             <wp:cNvGraphicFramePr>
               <a:graphicFrameLocks xmlns:a="http://schemas.openxmlformats.org/drawingml/2006/main" noChangeAspect="1"/>
             </wp:cNvGraphicFramePr>
@@ -12754,7 +12922,7 @@
                     <pic:cNvPicPr/>
                   </pic:nvPicPr>
                   <pic:blipFill>
-                    <a:blip r:embed="rId27"/>
+                    <a:blip r:embed="rId28"/>
                     <a:stretch>
                       <a:fillRect/>
                     </a:stretch>
@@ -12793,11 +12961,11 @@
       <w:pPr>
         <w:pStyle w:val="Heading2"/>
       </w:pPr>
-      <w:bookmarkStart w:id="32" w:name="_Toc242102900"/>
+      <w:bookmarkStart w:id="33" w:name="_Toc242187251"/>
       <w:r>
         <w:t>What changes the count automatically</w:t>
       </w:r>
-      <w:bookmarkEnd w:id="32"/>
+      <w:bookmarkEnd w:id="33"/>
     </w:p>
     <w:tbl>
       <w:tblPr>
@@ -13197,11 +13365,11 @@
       <w:pPr>
         <w:pStyle w:val="Heading2"/>
       </w:pPr>
-      <w:bookmarkStart w:id="33" w:name="_Toc242102901"/>
+      <w:bookmarkStart w:id="34" w:name="_Toc242187252"/>
       <w:r>
         <w:t>Seeing the history</w:t>
       </w:r>
-      <w:bookmarkEnd w:id="33"/>
+      <w:bookmarkEnd w:id="34"/>
     </w:p>
     <w:p>
       <w:r>
@@ -13212,12 +13380,12 @@
       <w:pPr>
         <w:pStyle w:val="Heading2"/>
       </w:pPr>
-      <w:bookmarkStart w:id="34" w:name="_Toc242102902"/>
+      <w:bookmarkStart w:id="35" w:name="_Toc242187253"/>
       <w:r>
         <w:lastRenderedPageBreak/>
         <w:t>Notes for the inventory sheet</w:t>
       </w:r>
-      <w:bookmarkEnd w:id="34"/>
+      <w:bookmarkEnd w:id="35"/>
     </w:p>
     <w:p>
       <w:r>
@@ -13262,10 +13430,10 @@
           <w:noProof/>
         </w:rPr>
         <w:drawing>
-          <wp:inline distT="0" distB="0" distL="0" distR="0" wp14:anchorId="6FDA7DEB" wp14:editId="2C1D97CF">
+          <wp:inline distT="0" distB="0" distL="0" distR="0" wp14:anchorId="44A482A3" wp14:editId="763488B2">
             <wp:extent cx="5120640" cy="3440430"/>
             <wp:effectExtent l="0" t="0" r="0" b="0"/>
-            <wp:docPr id="20" name="Picture 20"/>
+            <wp:docPr id="21" name="Picture 21"/>
             <wp:cNvGraphicFramePr>
               <a:graphicFrameLocks xmlns:a="http://schemas.openxmlformats.org/drawingml/2006/main" noChangeAspect="1"/>
             </wp:cNvGraphicFramePr>
@@ -13277,7 +13445,7 @@
                     <pic:cNvPicPr/>
                   </pic:nvPicPr>
                   <pic:blipFill>
-                    <a:blip r:embed="rId28"/>
+                    <a:blip r:embed="rId29"/>
                     <a:stretch>
                       <a:fillRect/>
                     </a:stretch>
@@ -13316,11 +13484,11 @@
       <w:pPr>
         <w:pStyle w:val="Heading2"/>
       </w:pPr>
-      <w:bookmarkStart w:id="35" w:name="_Toc242102903"/>
+      <w:bookmarkStart w:id="36" w:name="_Toc242187254"/>
       <w:r>
         <w:t>Start and end counts</w:t>
       </w:r>
-      <w:bookmarkEnd w:id="35"/>
+      <w:bookmarkEnd w:id="36"/>
     </w:p>
     <w:p>
       <w:r>
@@ -13840,10 +14008,10 @@
           <w:noProof/>
         </w:rPr>
         <w:drawing>
-          <wp:inline distT="0" distB="0" distL="0" distR="0" wp14:anchorId="0655A85C" wp14:editId="1F2881D4">
+          <wp:inline distT="0" distB="0" distL="0" distR="0" wp14:anchorId="586CFA91" wp14:editId="67D567B6">
             <wp:extent cx="5486400" cy="3686175"/>
             <wp:effectExtent l="0" t="0" r="0" b="0"/>
-            <wp:docPr id="21" name="Picture 21"/>
+            <wp:docPr id="22" name="Picture 22"/>
             <wp:cNvGraphicFramePr>
               <a:graphicFrameLocks xmlns:a="http://schemas.openxmlformats.org/drawingml/2006/main" noChangeAspect="1"/>
             </wp:cNvGraphicFramePr>
@@ -13855,7 +14023,7 @@
                     <pic:cNvPicPr/>
                   </pic:nvPicPr>
                   <pic:blipFill>
-                    <a:blip r:embed="rId29"/>
+                    <a:blip r:embed="rId30"/>
                     <a:stretch>
                       <a:fillRect/>
                     </a:stretch>
@@ -13980,12 +14148,12 @@
         <w:pStyle w:val="Heading1"/>
         <w:pageBreakBefore/>
       </w:pPr>
-      <w:bookmarkStart w:id="36" w:name="_Toc242102904"/>
+      <w:bookmarkStart w:id="37" w:name="_Toc242187255"/>
       <w:r>
         <w:lastRenderedPageBreak/>
         <w:t>Admin: setting up an event</w:t>
       </w:r>
-      <w:bookmarkEnd w:id="36"/>
+      <w:bookmarkEnd w:id="37"/>
     </w:p>
     <w:p>
       <w:r>
@@ -14005,11 +14173,11 @@
       <w:pPr>
         <w:pStyle w:val="Heading2"/>
       </w:pPr>
-      <w:bookmarkStart w:id="37" w:name="_Toc242102905"/>
+      <w:bookmarkStart w:id="38" w:name="_Toc242187256"/>
       <w:r>
         <w:t>Creating or editing an event</w:t>
       </w:r>
-      <w:bookmarkEnd w:id="37"/>
+      <w:bookmarkEnd w:id="38"/>
     </w:p>
     <w:p>
       <w:pPr>
@@ -14022,10 +14190,10 @@
           <w:noProof/>
         </w:rPr>
         <w:drawing>
-          <wp:inline distT="0" distB="0" distL="0" distR="0" wp14:anchorId="70096287" wp14:editId="3315BDF2">
+          <wp:inline distT="0" distB="0" distL="0" distR="0" wp14:anchorId="00F8A58F" wp14:editId="5DF41CC3">
             <wp:extent cx="5760720" cy="1134142"/>
             <wp:effectExtent l="0" t="0" r="0" b="0"/>
-            <wp:docPr id="22" name="Picture 22"/>
+            <wp:docPr id="23" name="Picture 23"/>
             <wp:cNvGraphicFramePr>
               <a:graphicFrameLocks xmlns:a="http://schemas.openxmlformats.org/drawingml/2006/main" noChangeAspect="1"/>
             </wp:cNvGraphicFramePr>
@@ -14037,7 +14205,7 @@
                     <pic:cNvPicPr/>
                   </pic:nvPicPr>
                   <pic:blipFill>
-                    <a:blip r:embed="rId30"/>
+                    <a:blip r:embed="rId31"/>
                     <a:stretch>
                       <a:fillRect/>
                     </a:stretch>
@@ -14371,10 +14539,10 @@
           <w:noProof/>
         </w:rPr>
         <w:drawing>
-          <wp:inline distT="0" distB="0" distL="0" distR="0" wp14:anchorId="6424ABC7" wp14:editId="6DDEDA57">
+          <wp:inline distT="0" distB="0" distL="0" distR="0" wp14:anchorId="79005F6C" wp14:editId="1E599DD5">
             <wp:extent cx="3840480" cy="2580322"/>
             <wp:effectExtent l="0" t="0" r="0" b="0"/>
-            <wp:docPr id="23" name="Picture 23"/>
+            <wp:docPr id="24" name="Picture 24"/>
             <wp:cNvGraphicFramePr>
               <a:graphicFrameLocks xmlns:a="http://schemas.openxmlformats.org/drawingml/2006/main" noChangeAspect="1"/>
             </wp:cNvGraphicFramePr>
@@ -14386,7 +14554,7 @@
                     <pic:cNvPicPr/>
                   </pic:nvPicPr>
                   <pic:blipFill>
-                    <a:blip r:embed="rId31"/>
+                    <a:blip r:embed="rId32"/>
                     <a:stretch>
                       <a:fillRect/>
                     </a:stretch>
@@ -14493,11 +14661,11 @@
       <w:pPr>
         <w:pStyle w:val="Heading2"/>
       </w:pPr>
-      <w:bookmarkStart w:id="38" w:name="_Toc242102906"/>
+      <w:bookmarkStart w:id="39" w:name="_Toc242187257"/>
       <w:r>
         <w:t>Closing out an event</w:t>
       </w:r>
-      <w:bookmarkEnd w:id="38"/>
+      <w:bookmarkEnd w:id="39"/>
     </w:p>
     <w:p>
       <w:r>
@@ -14660,11 +14828,11 @@
       <w:pPr>
         <w:pStyle w:val="Heading2"/>
       </w:pPr>
-      <w:bookmarkStart w:id="39" w:name="_Toc242102907"/>
+      <w:bookmarkStart w:id="40" w:name="_Toc242187258"/>
       <w:r>
         <w:t>Event sales sheets</w:t>
       </w:r>
-      <w:bookmarkEnd w:id="39"/>
+      <w:bookmarkEnd w:id="40"/>
     </w:p>
     <w:p>
       <w:r>
@@ -14718,10 +14886,10 @@
           <w:noProof/>
         </w:rPr>
         <w:drawing>
-          <wp:inline distT="0" distB="0" distL="0" distR="0" wp14:anchorId="196B2EC6" wp14:editId="3FEE1C73">
+          <wp:inline distT="0" distB="0" distL="0" distR="0" wp14:anchorId="6F08C7EC" wp14:editId="3EEA96E1">
             <wp:extent cx="4389120" cy="2948940"/>
             <wp:effectExtent l="0" t="0" r="0" b="0"/>
-            <wp:docPr id="24" name="Picture 24"/>
+            <wp:docPr id="25" name="Picture 25"/>
             <wp:cNvGraphicFramePr>
               <a:graphicFrameLocks xmlns:a="http://schemas.openxmlformats.org/drawingml/2006/main" noChangeAspect="1"/>
             </wp:cNvGraphicFramePr>
@@ -14733,7 +14901,7 @@
                     <pic:cNvPicPr/>
                   </pic:nvPicPr>
                   <pic:blipFill>
-                    <a:blip r:embed="rId32"/>
+                    <a:blip r:embed="rId33"/>
                     <a:stretch>
                       <a:fillRect/>
                     </a:stretch>
@@ -14847,10 +15015,10 @@
           <w:noProof/>
         </w:rPr>
         <w:drawing>
-          <wp:inline distT="0" distB="0" distL="0" distR="0" wp14:anchorId="2CC63C4C" wp14:editId="4C040541">
+          <wp:inline distT="0" distB="0" distL="0" distR="0" wp14:anchorId="48AB102D" wp14:editId="65987167">
             <wp:extent cx="4206240" cy="5717858"/>
             <wp:effectExtent l="0" t="0" r="0" b="0"/>
-            <wp:docPr id="25" name="Picture 25"/>
+            <wp:docPr id="26" name="Picture 26"/>
             <wp:cNvGraphicFramePr>
               <a:graphicFrameLocks xmlns:a="http://schemas.openxmlformats.org/drawingml/2006/main" noChangeAspect="1"/>
             </wp:cNvGraphicFramePr>
@@ -14862,7 +15030,7 @@
                     <pic:cNvPicPr/>
                   </pic:nvPicPr>
                   <pic:blipFill>
-                    <a:blip r:embed="rId33"/>
+                    <a:blip r:embed="rId34"/>
                     <a:stretch>
                       <a:fillRect/>
                     </a:stretch>
@@ -14985,10 +15153,10 @@
           <w:noProof/>
         </w:rPr>
         <w:drawing>
-          <wp:inline distT="0" distB="0" distL="0" distR="0" wp14:anchorId="514A59B1" wp14:editId="2C5FB54B">
+          <wp:inline distT="0" distB="0" distL="0" distR="0" wp14:anchorId="24435B34" wp14:editId="470EAB1D">
             <wp:extent cx="4389120" cy="2948940"/>
             <wp:effectExtent l="0" t="0" r="0" b="0"/>
-            <wp:docPr id="26" name="Picture 26"/>
+            <wp:docPr id="27" name="Picture 27"/>
             <wp:cNvGraphicFramePr>
               <a:graphicFrameLocks xmlns:a="http://schemas.openxmlformats.org/drawingml/2006/main" noChangeAspect="1"/>
             </wp:cNvGraphicFramePr>
@@ -15000,7 +15168,7 @@
                     <pic:cNvPicPr/>
                   </pic:nvPicPr>
                   <pic:blipFill>
-                    <a:blip r:embed="rId34"/>
+                    <a:blip r:embed="rId35"/>
                     <a:stretch>
                       <a:fillRect/>
                     </a:stretch>
@@ -15098,12 +15266,12 @@
         <w:pStyle w:val="Heading1"/>
         <w:pageBreakBefore/>
       </w:pPr>
-      <w:bookmarkStart w:id="40" w:name="_Toc242102908"/>
+      <w:bookmarkStart w:id="41" w:name="_Toc242187259"/>
       <w:r>
         <w:lastRenderedPageBreak/>
         <w:t>Admin: managing the catalog</w:t>
       </w:r>
-      <w:bookmarkEnd w:id="40"/>
+      <w:bookmarkEnd w:id="41"/>
     </w:p>
     <w:p>
       <w:r>
@@ -15202,10 +15370,10 @@
           <w:noProof/>
         </w:rPr>
         <w:drawing>
-          <wp:inline distT="0" distB="0" distL="0" distR="0" wp14:anchorId="6EBAB77D" wp14:editId="0C1E2DED">
+          <wp:inline distT="0" distB="0" distL="0" distR="0" wp14:anchorId="18C74D7B" wp14:editId="30F42846">
             <wp:extent cx="5760720" cy="4050506"/>
             <wp:effectExtent l="0" t="0" r="0" b="0"/>
-            <wp:docPr id="27" name="Picture 27"/>
+            <wp:docPr id="28" name="Picture 28"/>
             <wp:cNvGraphicFramePr>
               <a:graphicFrameLocks xmlns:a="http://schemas.openxmlformats.org/drawingml/2006/main" noChangeAspect="1"/>
             </wp:cNvGraphicFramePr>
@@ -15217,7 +15385,7 @@
                     <pic:cNvPicPr/>
                   </pic:nvPicPr>
                   <pic:blipFill>
-                    <a:blip r:embed="rId35"/>
+                    <a:blip r:embed="rId36"/>
                     <a:stretch>
                       <a:fillRect/>
                     </a:stretch>
@@ -15256,12 +15424,12 @@
       <w:pPr>
         <w:pStyle w:val="Heading2"/>
       </w:pPr>
-      <w:bookmarkStart w:id="41" w:name="_Toc242102909"/>
+      <w:bookmarkStart w:id="42" w:name="_Toc242187260"/>
       <w:r>
         <w:lastRenderedPageBreak/>
         <w:t>Adding or editing a product</w:t>
       </w:r>
-      <w:bookmarkEnd w:id="41"/>
+      <w:bookmarkEnd w:id="42"/>
     </w:p>
     <w:p>
       <w:pPr>
@@ -15274,10 +15442,10 @@
           <w:noProof/>
         </w:rPr>
         <w:drawing>
-          <wp:inline distT="0" distB="0" distL="0" distR="0" wp14:anchorId="7CD485C8" wp14:editId="001D3BB4">
+          <wp:inline distT="0" distB="0" distL="0" distR="0" wp14:anchorId="21B9CEF0" wp14:editId="704487EE">
             <wp:extent cx="5486400" cy="3686175"/>
             <wp:effectExtent l="0" t="0" r="0" b="0"/>
-            <wp:docPr id="28" name="Picture 28"/>
+            <wp:docPr id="29" name="Picture 29"/>
             <wp:cNvGraphicFramePr>
               <a:graphicFrameLocks xmlns:a="http://schemas.openxmlformats.org/drawingml/2006/main" noChangeAspect="1"/>
             </wp:cNvGraphicFramePr>
@@ -15289,7 +15457,7 @@
                     <pic:cNvPicPr/>
                   </pic:nvPicPr>
                   <pic:blipFill>
-                    <a:blip r:embed="rId36"/>
+                    <a:blip r:embed="rId37"/>
                     <a:stretch>
                       <a:fillRect/>
                     </a:stretch>
@@ -15741,10 +15909,10 @@
         </w:rPr>
         <w:lastRenderedPageBreak/>
         <w:drawing>
-          <wp:inline distT="0" distB="0" distL="0" distR="0" wp14:anchorId="7C88072F" wp14:editId="09888905">
+          <wp:inline distT="0" distB="0" distL="0" distR="0" wp14:anchorId="101F9EE3" wp14:editId="281F33D2">
             <wp:extent cx="5120640" cy="2130933"/>
             <wp:effectExtent l="0" t="0" r="0" b="0"/>
-            <wp:docPr id="29" name="Picture 29"/>
+            <wp:docPr id="30" name="Picture 30"/>
             <wp:cNvGraphicFramePr>
               <a:graphicFrameLocks xmlns:a="http://schemas.openxmlformats.org/drawingml/2006/main" noChangeAspect="1"/>
             </wp:cNvGraphicFramePr>
@@ -15756,7 +15924,7 @@
                     <pic:cNvPicPr/>
                   </pic:nvPicPr>
                   <pic:blipFill>
-                    <a:blip r:embed="rId37"/>
+                    <a:blip r:embed="rId38"/>
                     <a:stretch>
                       <a:fillRect/>
                     </a:stretch>
@@ -15922,10 +16090,10 @@
           <w:noProof/>
         </w:rPr>
         <w:drawing>
-          <wp:inline distT="0" distB="0" distL="0" distR="0" wp14:anchorId="55FD38BE" wp14:editId="6E76A624">
+          <wp:inline distT="0" distB="0" distL="0" distR="0" wp14:anchorId="5013D275" wp14:editId="237DC42C">
             <wp:extent cx="5486400" cy="3686175"/>
             <wp:effectExtent l="0" t="0" r="0" b="0"/>
-            <wp:docPr id="30" name="Picture 30"/>
+            <wp:docPr id="31" name="Picture 31"/>
             <wp:cNvGraphicFramePr>
               <a:graphicFrameLocks xmlns:a="http://schemas.openxmlformats.org/drawingml/2006/main" noChangeAspect="1"/>
             </wp:cNvGraphicFramePr>
@@ -15937,7 +16105,7 @@
                     <pic:cNvPicPr/>
                   </pic:nvPicPr>
                   <pic:blipFill>
-                    <a:blip r:embed="rId38"/>
+                    <a:blip r:embed="rId39"/>
                     <a:stretch>
                       <a:fillRect/>
                     </a:stretch>
@@ -16124,10 +16292,10 @@
           <w:noProof/>
         </w:rPr>
         <w:drawing>
-          <wp:inline distT="0" distB="0" distL="0" distR="0" wp14:anchorId="58D09A1A" wp14:editId="55B4CE5B">
+          <wp:inline distT="0" distB="0" distL="0" distR="0" wp14:anchorId="2ADB9484" wp14:editId="44DD5F33">
             <wp:extent cx="5486400" cy="3686175"/>
             <wp:effectExtent l="0" t="0" r="0" b="0"/>
-            <wp:docPr id="31" name="Picture 31"/>
+            <wp:docPr id="32" name="Picture 32"/>
             <wp:cNvGraphicFramePr>
               <a:graphicFrameLocks xmlns:a="http://schemas.openxmlformats.org/drawingml/2006/main" noChangeAspect="1"/>
             </wp:cNvGraphicFramePr>
@@ -16139,7 +16307,7 @@
                     <pic:cNvPicPr/>
                   </pic:nvPicPr>
                   <pic:blipFill>
-                    <a:blip r:embed="rId39"/>
+                    <a:blip r:embed="rId40"/>
                     <a:stretch>
                       <a:fillRect/>
                     </a:stretch>
@@ -16381,11 +16549,11 @@
       <w:pPr>
         <w:pStyle w:val="Heading2"/>
       </w:pPr>
-      <w:bookmarkStart w:id="42" w:name="_Toc242102910"/>
+      <w:bookmarkStart w:id="43" w:name="_Toc242187261"/>
       <w:r>
         <w:t>Delivery and services</w:t>
       </w:r>
-      <w:bookmarkEnd w:id="42"/>
+      <w:bookmarkEnd w:id="43"/>
     </w:p>
     <w:p>
       <w:r>
@@ -16412,10 +16580,10 @@
           <w:noProof/>
         </w:rPr>
         <w:drawing>
-          <wp:inline distT="0" distB="0" distL="0" distR="0" wp14:anchorId="145D5D04" wp14:editId="5CC621C4">
+          <wp:inline distT="0" distB="0" distL="0" distR="0" wp14:anchorId="7B99F9CC" wp14:editId="5D10F1E1">
             <wp:extent cx="5760720" cy="3870484"/>
             <wp:effectExtent l="0" t="0" r="0" b="0"/>
-            <wp:docPr id="32" name="Picture 32"/>
+            <wp:docPr id="33" name="Picture 33"/>
             <wp:cNvGraphicFramePr>
               <a:graphicFrameLocks xmlns:a="http://schemas.openxmlformats.org/drawingml/2006/main" noChangeAspect="1"/>
             </wp:cNvGraphicFramePr>
@@ -16427,7 +16595,7 @@
                     <pic:cNvPicPr/>
                   </pic:nvPicPr>
                   <pic:blipFill>
-                    <a:blip r:embed="rId40"/>
+                    <a:blip r:embed="rId41"/>
                     <a:stretch>
                       <a:fillRect/>
                     </a:stretch>
@@ -16843,12 +17011,12 @@
         <w:pStyle w:val="Heading1"/>
         <w:pageBreakBefore/>
       </w:pPr>
-      <w:bookmarkStart w:id="43" w:name="_Toc242102911"/>
+      <w:bookmarkStart w:id="44" w:name="_Toc242187262"/>
       <w:r>
         <w:lastRenderedPageBreak/>
         <w:t>Admin: managing the crew</w:t>
       </w:r>
-      <w:bookmarkEnd w:id="43"/>
+      <w:bookmarkEnd w:id="44"/>
     </w:p>
     <w:p>
       <w:r>
@@ -16875,10 +17043,10 @@
           <w:noProof/>
         </w:rPr>
         <w:drawing>
-          <wp:inline distT="0" distB="0" distL="0" distR="0" wp14:anchorId="380A48B3" wp14:editId="7D93D576">
+          <wp:inline distT="0" distB="0" distL="0" distR="0" wp14:anchorId="6E1C3ECB" wp14:editId="4CA1EDD4">
             <wp:extent cx="5760720" cy="1935242"/>
             <wp:effectExtent l="0" t="0" r="0" b="0"/>
-            <wp:docPr id="33" name="Picture 33"/>
+            <wp:docPr id="34" name="Picture 34"/>
             <wp:cNvGraphicFramePr>
               <a:graphicFrameLocks xmlns:a="http://schemas.openxmlformats.org/drawingml/2006/main" noChangeAspect="1"/>
             </wp:cNvGraphicFramePr>
@@ -16890,7 +17058,7 @@
                     <pic:cNvPicPr/>
                   </pic:nvPicPr>
                   <pic:blipFill>
-                    <a:blip r:embed="rId41"/>
+                    <a:blip r:embed="rId42"/>
                     <a:stretch>
                       <a:fillRect/>
                     </a:stretch>
@@ -17147,10 +17315,10 @@
           <w:noProof/>
         </w:rPr>
         <w:drawing>
-          <wp:inline distT="0" distB="0" distL="0" distR="0" wp14:anchorId="2B71194A" wp14:editId="2CE3E475">
+          <wp:inline distT="0" distB="0" distL="0" distR="0" wp14:anchorId="7B2DB00F" wp14:editId="22C82BAF">
             <wp:extent cx="4023360" cy="2703195"/>
             <wp:effectExtent l="0" t="0" r="0" b="0"/>
-            <wp:docPr id="34" name="Picture 34"/>
+            <wp:docPr id="35" name="Picture 35"/>
             <wp:cNvGraphicFramePr>
               <a:graphicFrameLocks xmlns:a="http://schemas.openxmlformats.org/drawingml/2006/main" noChangeAspect="1"/>
             </wp:cNvGraphicFramePr>
@@ -17162,7 +17330,7 @@
                     <pic:cNvPicPr/>
                   </pic:nvPicPr>
                   <pic:blipFill>
-                    <a:blip r:embed="rId42"/>
+                    <a:blip r:embed="rId43"/>
                     <a:stretch>
                       <a:fillRect/>
                     </a:stretch>
@@ -17227,12 +17395,12 @@
         <w:pStyle w:val="Heading1"/>
         <w:pageBreakBefore/>
       </w:pPr>
-      <w:bookmarkStart w:id="44" w:name="_Toc242102912"/>
+      <w:bookmarkStart w:id="45" w:name="_Toc242187263"/>
       <w:r>
         <w:lastRenderedPageBreak/>
         <w:t>Admin: settings</w:t>
       </w:r>
-      <w:bookmarkEnd w:id="44"/>
+      <w:bookmarkEnd w:id="45"/>
     </w:p>
     <w:p>
       <w:r>
@@ -17297,11 +17465,11 @@
       <w:pPr>
         <w:pStyle w:val="Heading2"/>
       </w:pPr>
-      <w:bookmarkStart w:id="45" w:name="_Toc242102913"/>
+      <w:bookmarkStart w:id="46" w:name="_Toc242187264"/>
       <w:r>
         <w:t>Business details</w:t>
       </w:r>
-      <w:bookmarkEnd w:id="45"/>
+      <w:bookmarkEnd w:id="46"/>
     </w:p>
     <w:p>
       <w:pPr>
@@ -17314,10 +17482,10 @@
           <w:noProof/>
         </w:rPr>
         <w:drawing>
-          <wp:inline distT="0" distB="0" distL="0" distR="0" wp14:anchorId="3DC0154D" wp14:editId="0CFDF8AD">
+          <wp:inline distT="0" distB="0" distL="0" distR="0" wp14:anchorId="74409257" wp14:editId="6C3B1587">
             <wp:extent cx="5760720" cy="1429893"/>
             <wp:effectExtent l="0" t="0" r="0" b="0"/>
-            <wp:docPr id="35" name="Picture 35"/>
+            <wp:docPr id="36" name="Picture 36"/>
             <wp:cNvGraphicFramePr>
               <a:graphicFrameLocks xmlns:a="http://schemas.openxmlformats.org/drawingml/2006/main" noChangeAspect="1"/>
             </wp:cNvGraphicFramePr>
@@ -17329,7 +17497,7 @@
                     <pic:cNvPicPr/>
                   </pic:nvPicPr>
                   <pic:blipFill>
-                    <a:blip r:embed="rId43"/>
+                    <a:blip r:embed="rId44"/>
                     <a:stretch>
                       <a:fillRect/>
                     </a:stretch>
@@ -17678,11 +17846,11 @@
       <w:pPr>
         <w:pStyle w:val="Heading2"/>
       </w:pPr>
-      <w:bookmarkStart w:id="46" w:name="_Toc242102914"/>
+      <w:bookmarkStart w:id="47" w:name="_Toc242187265"/>
       <w:r>
         <w:t>Sales sheet terms</w:t>
       </w:r>
-      <w:bookmarkEnd w:id="46"/>
+      <w:bookmarkEnd w:id="47"/>
     </w:p>
     <w:p>
       <w:r>
@@ -17701,10 +17869,10 @@
         </w:rPr>
         <w:lastRenderedPageBreak/>
         <w:drawing>
-          <wp:inline distT="0" distB="0" distL="0" distR="0" wp14:anchorId="0639C630" wp14:editId="7174E1E5">
+          <wp:inline distT="0" distB="0" distL="0" distR="0" wp14:anchorId="31B5DB0C" wp14:editId="28A130B4">
             <wp:extent cx="5760720" cy="4937760"/>
             <wp:effectExtent l="0" t="0" r="0" b="0"/>
-            <wp:docPr id="36" name="Picture 36"/>
+            <wp:docPr id="37" name="Picture 37"/>
             <wp:cNvGraphicFramePr>
               <a:graphicFrameLocks xmlns:a="http://schemas.openxmlformats.org/drawingml/2006/main" noChangeAspect="1"/>
             </wp:cNvGraphicFramePr>
@@ -17716,7 +17884,7 @@
                     <pic:cNvPicPr/>
                   </pic:nvPicPr>
                   <pic:blipFill>
-                    <a:blip r:embed="rId44"/>
+                    <a:blip r:embed="rId45"/>
                     <a:stretch>
                       <a:fillRect/>
                     </a:stretch>
@@ -18074,11 +18242,11 @@
       <w:pPr>
         <w:pStyle w:val="Heading2"/>
       </w:pPr>
-      <w:bookmarkStart w:id="47" w:name="_Toc242102915"/>
+      <w:bookmarkStart w:id="48" w:name="_Toc242187266"/>
       <w:r>
         <w:t>Receipt email</w:t>
       </w:r>
-      <w:bookmarkEnd w:id="47"/>
+      <w:bookmarkEnd w:id="48"/>
     </w:p>
     <w:p>
       <w:r>
@@ -18096,10 +18264,10 @@
           <w:noProof/>
         </w:rPr>
         <w:drawing>
-          <wp:inline distT="0" distB="0" distL="0" distR="0" wp14:anchorId="2C0B12D1" wp14:editId="3FDDA2E2">
+          <wp:inline distT="0" distB="0" distL="0" distR="0" wp14:anchorId="4AD63EF5" wp14:editId="183A277B">
             <wp:extent cx="5760720" cy="4454271"/>
             <wp:effectExtent l="0" t="0" r="0" b="0"/>
-            <wp:docPr id="37" name="Picture 37"/>
+            <wp:docPr id="38" name="Picture 38"/>
             <wp:cNvGraphicFramePr>
               <a:graphicFrameLocks xmlns:a="http://schemas.openxmlformats.org/drawingml/2006/main" noChangeAspect="1"/>
             </wp:cNvGraphicFramePr>
@@ -18111,7 +18279,7 @@
                     <pic:cNvPicPr/>
                   </pic:nvPicPr>
                   <pic:blipFill>
-                    <a:blip r:embed="rId45"/>
+                    <a:blip r:embed="rId46"/>
                     <a:stretch>
                       <a:fillRect/>
                     </a:stretch>
@@ -19073,11 +19241,11 @@
       <w:pPr>
         <w:pStyle w:val="Heading2"/>
       </w:pPr>
-      <w:bookmarkStart w:id="48" w:name="_Toc242102916"/>
+      <w:bookmarkStart w:id="49" w:name="_Toc242187267"/>
       <w:r>
         <w:t>New events</w:t>
       </w:r>
-      <w:bookmarkEnd w:id="48"/>
+      <w:bookmarkEnd w:id="49"/>
     </w:p>
     <w:p>
       <w:pPr>
@@ -19090,10 +19258,10 @@
           <w:noProof/>
         </w:rPr>
         <w:drawing>
-          <wp:inline distT="0" distB="0" distL="0" distR="0" wp14:anchorId="34BE9277" wp14:editId="0E05BB52">
+          <wp:inline distT="0" distB="0" distL="0" distR="0" wp14:anchorId="0A09516F" wp14:editId="2285C832">
             <wp:extent cx="5760720" cy="1512189"/>
             <wp:effectExtent l="0" t="0" r="0" b="0"/>
-            <wp:docPr id="38" name="Picture 38"/>
+            <wp:docPr id="39" name="Picture 39"/>
             <wp:cNvGraphicFramePr>
               <a:graphicFrameLocks xmlns:a="http://schemas.openxmlformats.org/drawingml/2006/main" noChangeAspect="1"/>
             </wp:cNvGraphicFramePr>
@@ -19105,7 +19273,7 @@
                     <pic:cNvPicPr/>
                   </pic:nvPicPr>
                   <pic:blipFill>
-                    <a:blip r:embed="rId46"/>
+                    <a:blip r:embed="rId47"/>
                     <a:stretch>
                       <a:fillRect/>
                     </a:stretch>
@@ -19168,11 +19336,11 @@
       <w:pPr>
         <w:pStyle w:val="Heading2"/>
       </w:pPr>
-      <w:bookmarkStart w:id="49" w:name="_Toc242102917"/>
+      <w:bookmarkStart w:id="50" w:name="_Toc242187268"/>
       <w:r>
         <w:t>Dashboard</w:t>
       </w:r>
-      <w:bookmarkEnd w:id="49"/>
+      <w:bookmarkEnd w:id="50"/>
     </w:p>
     <w:p>
       <w:pPr>
@@ -19185,10 +19353,10 @@
           <w:noProof/>
         </w:rPr>
         <w:drawing>
-          <wp:inline distT="0" distB="0" distL="0" distR="0" wp14:anchorId="0CEFF556" wp14:editId="6CA38EB9">
+          <wp:inline distT="0" distB="0" distL="0" distR="0" wp14:anchorId="015DFAD6" wp14:editId="0D6CA0F6">
             <wp:extent cx="5760720" cy="1594485"/>
             <wp:effectExtent l="0" t="0" r="0" b="0"/>
-            <wp:docPr id="39" name="Picture 39"/>
+            <wp:docPr id="40" name="Picture 40"/>
             <wp:cNvGraphicFramePr>
               <a:graphicFrameLocks xmlns:a="http://schemas.openxmlformats.org/drawingml/2006/main" noChangeAspect="1"/>
             </wp:cNvGraphicFramePr>
@@ -19200,7 +19368,7 @@
                     <pic:cNvPicPr/>
                   </pic:nvPicPr>
                   <pic:blipFill>
-                    <a:blip r:embed="rId47"/>
+                    <a:blip r:embed="rId48"/>
                     <a:stretch>
                       <a:fillRect/>
                     </a:stretch>
@@ -19515,12 +19683,12 @@
         <w:pStyle w:val="Heading1"/>
         <w:pageBreakBefore/>
       </w:pPr>
-      <w:bookmarkStart w:id="50" w:name="_Toc242102918"/>
+      <w:bookmarkStart w:id="51" w:name="_Toc242187269"/>
       <w:r>
         <w:lastRenderedPageBreak/>
         <w:t>Owner: permanent deletes</w:t>
       </w:r>
-      <w:bookmarkEnd w:id="50"/>
+      <w:bookmarkEnd w:id="51"/>
     </w:p>
     <w:p>
       <w:r>
@@ -19556,10 +19724,10 @@
           <w:noProof/>
         </w:rPr>
         <w:drawing>
-          <wp:inline distT="0" distB="0" distL="0" distR="0" wp14:anchorId="59A74F09" wp14:editId="028FE19E">
+          <wp:inline distT="0" distB="0" distL="0" distR="0" wp14:anchorId="1B67C035" wp14:editId="76457121">
             <wp:extent cx="4754880" cy="3312709"/>
             <wp:effectExtent l="0" t="0" r="0" b="0"/>
-            <wp:docPr id="40" name="Picture 40"/>
+            <wp:docPr id="41" name="Picture 41"/>
             <wp:cNvGraphicFramePr>
               <a:graphicFrameLocks xmlns:a="http://schemas.openxmlformats.org/drawingml/2006/main" noChangeAspect="1"/>
             </wp:cNvGraphicFramePr>
@@ -19571,7 +19739,7 @@
                     <pic:cNvPicPr/>
                   </pic:nvPicPr>
                   <pic:blipFill>
-                    <a:blip r:embed="rId48"/>
+                    <a:blip r:embed="rId49"/>
                     <a:stretch>
                       <a:fillRect/>
                     </a:stretch>
@@ -20220,12 +20388,12 @@
         <w:pStyle w:val="Heading1"/>
         <w:pageBreakBefore/>
       </w:pPr>
-      <w:bookmarkStart w:id="51" w:name="_Toc242102919"/>
+      <w:bookmarkStart w:id="52" w:name="_Toc242187270"/>
       <w:r>
         <w:lastRenderedPageBreak/>
         <w:t>Owner: backing up and restoring the catalog</w:t>
       </w:r>
-      <w:bookmarkEnd w:id="51"/>
+      <w:bookmarkEnd w:id="52"/>
     </w:p>
     <w:p>
       <w:r>
@@ -20254,11 +20422,11 @@
       <w:pPr>
         <w:pStyle w:val="Heading2"/>
       </w:pPr>
-      <w:bookmarkStart w:id="52" w:name="_Toc242102920"/>
+      <w:bookmarkStart w:id="53" w:name="_Toc242187271"/>
       <w:r>
         <w:t>Export catalog</w:t>
       </w:r>
-      <w:bookmarkEnd w:id="52"/>
+      <w:bookmarkEnd w:id="53"/>
     </w:p>
     <w:p>
       <w:r>
@@ -20305,11 +20473,11 @@
       <w:pPr>
         <w:pStyle w:val="Heading2"/>
       </w:pPr>
-      <w:bookmarkStart w:id="53" w:name="_Toc242102921"/>
+      <w:bookmarkStart w:id="54" w:name="_Toc242187272"/>
       <w:r>
         <w:t>Restore catalog</w:t>
       </w:r>
-      <w:bookmarkEnd w:id="53"/>
+      <w:bookmarkEnd w:id="54"/>
     </w:p>
     <w:p>
       <w:pPr>
@@ -20419,10 +20587,10 @@
         </w:rPr>
         <w:lastRenderedPageBreak/>
         <w:drawing>
-          <wp:inline distT="0" distB="0" distL="0" distR="0" wp14:anchorId="64CF199A" wp14:editId="7816136B">
+          <wp:inline distT="0" distB="0" distL="0" distR="0" wp14:anchorId="6111E633" wp14:editId="06B927A5">
             <wp:extent cx="4206240" cy="5882164"/>
             <wp:effectExtent l="0" t="0" r="0" b="0"/>
-            <wp:docPr id="41" name="Picture 41"/>
+            <wp:docPr id="42" name="Picture 42"/>
             <wp:cNvGraphicFramePr>
               <a:graphicFrameLocks xmlns:a="http://schemas.openxmlformats.org/drawingml/2006/main" noChangeAspect="1"/>
             </wp:cNvGraphicFramePr>
@@ -20434,7 +20602,7 @@
                     <pic:cNvPicPr/>
                   </pic:nvPicPr>
                   <pic:blipFill>
-                    <a:blip r:embed="rId49"/>
+                    <a:blip r:embed="rId50"/>
                     <a:stretch>
                       <a:fillRect/>
                     </a:stretch>
@@ -20701,10 +20869,10 @@
           <w:noProof/>
         </w:rPr>
         <w:drawing>
-          <wp:inline distT="0" distB="0" distL="0" distR="0" wp14:anchorId="01F3E4FD" wp14:editId="04A46DCB">
+          <wp:inline distT="0" distB="0" distL="0" distR="0" wp14:anchorId="083294C0" wp14:editId="178138E2">
             <wp:extent cx="4206240" cy="1993582"/>
             <wp:effectExtent l="0" t="0" r="0" b="0"/>
-            <wp:docPr id="42" name="Picture 42"/>
+            <wp:docPr id="43" name="Picture 43"/>
             <wp:cNvGraphicFramePr>
               <a:graphicFrameLocks xmlns:a="http://schemas.openxmlformats.org/drawingml/2006/main" noChangeAspect="1"/>
             </wp:cNvGraphicFramePr>
@@ -20716,7 +20884,7 @@
                     <pic:cNvPicPr/>
                   </pic:nvPicPr>
                   <pic:blipFill>
-                    <a:blip r:embed="rId50"/>
+                    <a:blip r:embed="rId51"/>
                     <a:stretch>
                       <a:fillRect/>
                     </a:stretch>
@@ -20894,12 +21062,12 @@
         <w:pStyle w:val="Heading1"/>
         <w:pageBreakBefore/>
       </w:pPr>
-      <w:bookmarkStart w:id="54" w:name="_Toc242102922"/>
+      <w:bookmarkStart w:id="55" w:name="_Toc242187273"/>
       <w:r>
         <w:lastRenderedPageBreak/>
         <w:t>Tips and troubleshooting</w:t>
       </w:r>
-      <w:bookmarkEnd w:id="54"/>
+      <w:bookmarkEnd w:id="55"/>
     </w:p>
     <w:p>
       <w:r>
@@ -21329,22 +21497,22 @@
         <w:pStyle w:val="Heading1"/>
         <w:pageBreakBefore/>
       </w:pPr>
-      <w:bookmarkStart w:id="55" w:name="_Toc242102923"/>
+      <w:bookmarkStart w:id="56" w:name="_Toc242187274"/>
       <w:r>
         <w:lastRenderedPageBreak/>
         <w:t>Quick reference</w:t>
       </w:r>
-      <w:bookmarkEnd w:id="55"/>
+      <w:bookmarkEnd w:id="56"/>
     </w:p>
     <w:p>
       <w:pPr>
         <w:pStyle w:val="Heading2"/>
       </w:pPr>
-      <w:bookmarkStart w:id="56" w:name="_Toc242102924"/>
+      <w:bookmarkStart w:id="57" w:name="_Toc242187275"/>
       <w:r>
         <w:t>Sales rep checklist</w:t>
       </w:r>
-      <w:bookmarkEnd w:id="56"/>
+      <w:bookmarkEnd w:id="57"/>
     </w:p>
     <w:p>
       <w:pPr>
@@ -21484,11 +21652,11 @@
       <w:pPr>
         <w:pStyle w:val="Heading2"/>
       </w:pPr>
-      <w:bookmarkStart w:id="57" w:name="_Toc242102925"/>
+      <w:bookmarkStart w:id="58" w:name="_Toc242187276"/>
       <w:r>
         <w:t>Checkout checklist</w:t>
       </w:r>
-      <w:bookmarkEnd w:id="57"/>
+      <w:bookmarkEnd w:id="58"/>
     </w:p>
     <w:p>
       <w:pPr>
@@ -21672,11 +21840,11 @@
       <w:pPr>
         <w:pStyle w:val="Heading2"/>
       </w:pPr>
-      <w:bookmarkStart w:id="58" w:name="_Toc242102926"/>
+      <w:bookmarkStart w:id="59" w:name="_Toc242187277"/>
       <w:r>
         <w:t>Inventory counts</w:t>
       </w:r>
-      <w:bookmarkEnd w:id="58"/>
+      <w:bookmarkEnd w:id="59"/>
     </w:p>
     <w:p>
       <w:pPr>
@@ -21876,11 +22044,11 @@
       <w:pPr>
         <w:pStyle w:val="Heading2"/>
       </w:pPr>
-      <w:bookmarkStart w:id="59" w:name="_Toc242102927"/>
+      <w:bookmarkStart w:id="60" w:name="_Toc242187278"/>
       <w:r>
         <w:t>Order status at a glance</w:t>
       </w:r>
-      <w:bookmarkEnd w:id="59"/>
+      <w:bookmarkEnd w:id="60"/>
     </w:p>
     <w:tbl>
       <w:tblPr>
@@ -22200,7 +22368,7 @@
       </w:pPr>
     </w:p>
     <w:sectPr>
-      <w:footerReference w:type="default" r:id="rId51"/>
+      <w:footerReference w:type="default" r:id="rId52"/>
       <w:pgSz w:w="12240" w:h="15840"/>
       <w:pgMar w:top="1296" w:right="1440" w:bottom="1296" w:left="1440" w:header="720" w:footer="720" w:gutter="0"/>
       <w:cols w:space="720"/>
@@ -22496,31 +22664,31 @@
       </w:rPr>
     </w:lvl>
   </w:abstractNum>
-  <w:num w:numId="1" w16cid:durableId="1242524297">
+  <w:num w:numId="1" w16cid:durableId="1226181855">
     <w:abstractNumId w:val="8"/>
   </w:num>
-  <w:num w:numId="2" w16cid:durableId="1507474166">
+  <w:num w:numId="2" w16cid:durableId="586115146">
     <w:abstractNumId w:val="6"/>
   </w:num>
-  <w:num w:numId="3" w16cid:durableId="1093429214">
+  <w:num w:numId="3" w16cid:durableId="822963395">
     <w:abstractNumId w:val="5"/>
   </w:num>
-  <w:num w:numId="4" w16cid:durableId="404960151">
+  <w:num w:numId="4" w16cid:durableId="179658870">
     <w:abstractNumId w:val="4"/>
   </w:num>
-  <w:num w:numId="5" w16cid:durableId="426850991">
+  <w:num w:numId="5" w16cid:durableId="1838809980">
     <w:abstractNumId w:val="7"/>
   </w:num>
-  <w:num w:numId="6" w16cid:durableId="1597981859">
+  <w:num w:numId="6" w16cid:durableId="1991980144">
     <w:abstractNumId w:val="3"/>
   </w:num>
-  <w:num w:numId="7" w16cid:durableId="1325279473">
+  <w:num w:numId="7" w16cid:durableId="634525606">
     <w:abstractNumId w:val="2"/>
   </w:num>
-  <w:num w:numId="8" w16cid:durableId="2115587314">
+  <w:num w:numId="8" w16cid:durableId="1596327828">
     <w:abstractNumId w:val="1"/>
   </w:num>
-  <w:num w:numId="9" w16cid:durableId="1113941122">
+  <w:num w:numId="9" w16cid:durableId="389496530">
     <w:abstractNumId w:val="0"/>
   </w:num>
 </w:numbering>
@@ -33912,7 +34080,7 @@
     <w:autoRedefine/>
     <w:uiPriority w:val="39"/>
     <w:unhideWhenUsed/>
-    <w:rsid w:val="004C25C9"/>
+    <w:rsid w:val="00207AA3"/>
     <w:pPr>
       <w:spacing w:after="100"/>
     </w:pPr>
@@ -33924,7 +34092,7 @@
     <w:autoRedefine/>
     <w:uiPriority w:val="39"/>
     <w:unhideWhenUsed/>
-    <w:rsid w:val="004C25C9"/>
+    <w:rsid w:val="00207AA3"/>
     <w:pPr>
       <w:spacing w:after="100"/>
       <w:ind w:left="220"/>
@@ -33935,7 +34103,7 @@
     <w:basedOn w:val="DefaultParagraphFont"/>
     <w:uiPriority w:val="99"/>
     <w:unhideWhenUsed/>
-    <w:rsid w:val="004C25C9"/>
+    <w:rsid w:val="00207AA3"/>
     <w:rPr>
       <w:color w:val="0000FF" w:themeColor="hyperlink"/>
       <w:u w:val="single"/>

</xml_diff>

<commit_message>
Unit #, Floor and Suite # on the customer address form
The Hand tablet to customer form now asks for Unit #, Floor and Suite #
for both the billing and delivery addresses, matching the employee form
and the sales sheet. Billing floor and suite are saved with the order.

Co-Authored-By: Claude Opus 5.5 <noreply@anthropic.com>
</commit_message>
<xml_diff>
--- a/Documents/CFS Sales App User Guide.docx
+++ b/Documents/CFS Sales App User Guide.docx
@@ -345,7 +345,7 @@
       <w:r>
         <w:fldChar w:fldCharType="separate"/>
       </w:r>
-      <w:hyperlink w:anchor="_Toc242212648" w:history="1">
+      <w:hyperlink w:anchor="_Toc242216365" w:history="1">
         <w:r>
           <w:rPr>
             <w:rStyle w:val="Hyperlink"/>
@@ -372,7 +372,7 @@
             <w:noProof/>
             <w:webHidden/>
           </w:rPr>
-          <w:instrText xml:space="preserve"> PAGEREF _Toc242212648 \h </w:instrText>
+          <w:instrText xml:space="preserve"> PAGEREF _Toc242216365 \h </w:instrText>
         </w:r>
         <w:r>
           <w:rPr>
@@ -413,7 +413,7 @@
           <w:noProof/>
         </w:rPr>
       </w:pPr>
-      <w:hyperlink w:anchor="_Toc242212649" w:history="1">
+      <w:hyperlink w:anchor="_Toc242216366" w:history="1">
         <w:r>
           <w:rPr>
             <w:rStyle w:val="Hyperlink"/>
@@ -440,7 +440,7 @@
             <w:noProof/>
             <w:webHidden/>
           </w:rPr>
-          <w:instrText xml:space="preserve"> PAGEREF _Toc242212649 \h </w:instrText>
+          <w:instrText xml:space="preserve"> PAGEREF _Toc242216366 \h </w:instrText>
         </w:r>
         <w:r>
           <w:rPr>
@@ -481,7 +481,7 @@
           <w:noProof/>
         </w:rPr>
       </w:pPr>
-      <w:hyperlink w:anchor="_Toc242212650" w:history="1">
+      <w:hyperlink w:anchor="_Toc242216367" w:history="1">
         <w:r>
           <w:rPr>
             <w:rStyle w:val="Hyperlink"/>
@@ -508,7 +508,7 @@
             <w:noProof/>
             <w:webHidden/>
           </w:rPr>
-          <w:instrText xml:space="preserve"> PAGEREF _Toc242212650 \h </w:instrText>
+          <w:instrText xml:space="preserve"> PAGEREF _Toc242216367 \h </w:instrText>
         </w:r>
         <w:r>
           <w:rPr>
@@ -549,7 +549,7 @@
           <w:noProof/>
         </w:rPr>
       </w:pPr>
-      <w:hyperlink w:anchor="_Toc242212651" w:history="1">
+      <w:hyperlink w:anchor="_Toc242216368" w:history="1">
         <w:r>
           <w:rPr>
             <w:rStyle w:val="Hyperlink"/>
@@ -576,7 +576,7 @@
             <w:noProof/>
             <w:webHidden/>
           </w:rPr>
-          <w:instrText xml:space="preserve"> PAGEREF _Toc242212651 \h </w:instrText>
+          <w:instrText xml:space="preserve"> PAGEREF _Toc242216368 \h </w:instrText>
         </w:r>
         <w:r>
           <w:rPr>
@@ -617,7 +617,7 @@
           <w:noProof/>
         </w:rPr>
       </w:pPr>
-      <w:hyperlink w:anchor="_Toc242212652" w:history="1">
+      <w:hyperlink w:anchor="_Toc242216369" w:history="1">
         <w:r>
           <w:rPr>
             <w:rStyle w:val="Hyperlink"/>
@@ -644,7 +644,7 @@
             <w:noProof/>
             <w:webHidden/>
           </w:rPr>
-          <w:instrText xml:space="preserve"> PAGEREF _Toc242212652 \h </w:instrText>
+          <w:instrText xml:space="preserve"> PAGEREF _Toc242216369 \h </w:instrText>
         </w:r>
         <w:r>
           <w:rPr>
@@ -685,7 +685,7 @@
           <w:noProof/>
         </w:rPr>
       </w:pPr>
-      <w:hyperlink w:anchor="_Toc242212653" w:history="1">
+      <w:hyperlink w:anchor="_Toc242216370" w:history="1">
         <w:r>
           <w:rPr>
             <w:rStyle w:val="Hyperlink"/>
@@ -712,7 +712,7 @@
             <w:noProof/>
             <w:webHidden/>
           </w:rPr>
-          <w:instrText xml:space="preserve"> PAGEREF _Toc242212653 \h </w:instrText>
+          <w:instrText xml:space="preserve"> PAGEREF _Toc242216370 \h </w:instrText>
         </w:r>
         <w:r>
           <w:rPr>
@@ -753,7 +753,7 @@
           <w:noProof/>
         </w:rPr>
       </w:pPr>
-      <w:hyperlink w:anchor="_Toc242212654" w:history="1">
+      <w:hyperlink w:anchor="_Toc242216371" w:history="1">
         <w:r>
           <w:rPr>
             <w:rStyle w:val="Hyperlink"/>
@@ -780,7 +780,7 @@
             <w:noProof/>
             <w:webHidden/>
           </w:rPr>
-          <w:instrText xml:space="preserve"> PAGEREF _Toc242212654 \h </w:instrText>
+          <w:instrText xml:space="preserve"> PAGEREF _Toc242216371 \h </w:instrText>
         </w:r>
         <w:r>
           <w:rPr>
@@ -821,7 +821,7 @@
           <w:noProof/>
         </w:rPr>
       </w:pPr>
-      <w:hyperlink w:anchor="_Toc242212655" w:history="1">
+      <w:hyperlink w:anchor="_Toc242216372" w:history="1">
         <w:r>
           <w:rPr>
             <w:rStyle w:val="Hyperlink"/>
@@ -848,7 +848,7 @@
             <w:noProof/>
             <w:webHidden/>
           </w:rPr>
-          <w:instrText xml:space="preserve"> PAGEREF _Toc242212655 \h </w:instrText>
+          <w:instrText xml:space="preserve"> PAGEREF _Toc242216372 \h </w:instrText>
         </w:r>
         <w:r>
           <w:rPr>
@@ -889,7 +889,7 @@
           <w:noProof/>
         </w:rPr>
       </w:pPr>
-      <w:hyperlink w:anchor="_Toc242212656" w:history="1">
+      <w:hyperlink w:anchor="_Toc242216373" w:history="1">
         <w:r>
           <w:rPr>
             <w:rStyle w:val="Hyperlink"/>
@@ -916,7 +916,7 @@
             <w:noProof/>
             <w:webHidden/>
           </w:rPr>
-          <w:instrText xml:space="preserve"> PAGEREF _Toc242212656 \h </w:instrText>
+          <w:instrText xml:space="preserve"> PAGEREF _Toc242216373 \h </w:instrText>
         </w:r>
         <w:r>
           <w:rPr>
@@ -957,7 +957,7 @@
           <w:noProof/>
         </w:rPr>
       </w:pPr>
-      <w:hyperlink w:anchor="_Toc242212657" w:history="1">
+      <w:hyperlink w:anchor="_Toc242216374" w:history="1">
         <w:r>
           <w:rPr>
             <w:rStyle w:val="Hyperlink"/>
@@ -984,7 +984,7 @@
             <w:noProof/>
             <w:webHidden/>
           </w:rPr>
-          <w:instrText xml:space="preserve"> PAGEREF _Toc242212657 \h </w:instrText>
+          <w:instrText xml:space="preserve"> PAGEREF _Toc242216374 \h </w:instrText>
         </w:r>
         <w:r>
           <w:rPr>
@@ -1025,7 +1025,7 @@
           <w:noProof/>
         </w:rPr>
       </w:pPr>
-      <w:hyperlink w:anchor="_Toc242212658" w:history="1">
+      <w:hyperlink w:anchor="_Toc242216375" w:history="1">
         <w:r>
           <w:rPr>
             <w:rStyle w:val="Hyperlink"/>
@@ -1052,7 +1052,7 @@
             <w:noProof/>
             <w:webHidden/>
           </w:rPr>
-          <w:instrText xml:space="preserve"> PAGEREF _Toc242212658 \h </w:instrText>
+          <w:instrText xml:space="preserve"> PAGEREF _Toc242216375 \h </w:instrText>
         </w:r>
         <w:r>
           <w:rPr>
@@ -1093,7 +1093,7 @@
           <w:noProof/>
         </w:rPr>
       </w:pPr>
-      <w:hyperlink w:anchor="_Toc242212659" w:history="1">
+      <w:hyperlink w:anchor="_Toc242216376" w:history="1">
         <w:r>
           <w:rPr>
             <w:rStyle w:val="Hyperlink"/>
@@ -1120,7 +1120,7 @@
             <w:noProof/>
             <w:webHidden/>
           </w:rPr>
-          <w:instrText xml:space="preserve"> PAGEREF _Toc242212659 \h </w:instrText>
+          <w:instrText xml:space="preserve"> PAGEREF _Toc242216376 \h </w:instrText>
         </w:r>
         <w:r>
           <w:rPr>
@@ -1161,7 +1161,7 @@
           <w:noProof/>
         </w:rPr>
       </w:pPr>
-      <w:hyperlink w:anchor="_Toc242212660" w:history="1">
+      <w:hyperlink w:anchor="_Toc242216377" w:history="1">
         <w:r>
           <w:rPr>
             <w:rStyle w:val="Hyperlink"/>
@@ -1188,7 +1188,7 @@
             <w:noProof/>
             <w:webHidden/>
           </w:rPr>
-          <w:instrText xml:space="preserve"> PAGEREF _Toc242212660 \h </w:instrText>
+          <w:instrText xml:space="preserve"> PAGEREF _Toc242216377 \h </w:instrText>
         </w:r>
         <w:r>
           <w:rPr>
@@ -1229,7 +1229,7 @@
           <w:noProof/>
         </w:rPr>
       </w:pPr>
-      <w:hyperlink w:anchor="_Toc242212661" w:history="1">
+      <w:hyperlink w:anchor="_Toc242216378" w:history="1">
         <w:r>
           <w:rPr>
             <w:rStyle w:val="Hyperlink"/>
@@ -1256,7 +1256,7 @@
             <w:noProof/>
             <w:webHidden/>
           </w:rPr>
-          <w:instrText xml:space="preserve"> PAGEREF _Toc242212661 \h </w:instrText>
+          <w:instrText xml:space="preserve"> PAGEREF _Toc242216378 \h </w:instrText>
         </w:r>
         <w:r>
           <w:rPr>
@@ -1297,7 +1297,7 @@
           <w:noProof/>
         </w:rPr>
       </w:pPr>
-      <w:hyperlink w:anchor="_Toc242212662" w:history="1">
+      <w:hyperlink w:anchor="_Toc242216379" w:history="1">
         <w:r>
           <w:rPr>
             <w:rStyle w:val="Hyperlink"/>
@@ -1324,7 +1324,7 @@
             <w:noProof/>
             <w:webHidden/>
           </w:rPr>
-          <w:instrText xml:space="preserve"> PAGEREF _Toc242212662 \h </w:instrText>
+          <w:instrText xml:space="preserve"> PAGEREF _Toc242216379 \h </w:instrText>
         </w:r>
         <w:r>
           <w:rPr>
@@ -1365,7 +1365,7 @@
           <w:noProof/>
         </w:rPr>
       </w:pPr>
-      <w:hyperlink w:anchor="_Toc242212663" w:history="1">
+      <w:hyperlink w:anchor="_Toc242216380" w:history="1">
         <w:r>
           <w:rPr>
             <w:rStyle w:val="Hyperlink"/>
@@ -1392,7 +1392,7 @@
             <w:noProof/>
             <w:webHidden/>
           </w:rPr>
-          <w:instrText xml:space="preserve"> PAGEREF _Toc242212663 \h </w:instrText>
+          <w:instrText xml:space="preserve"> PAGEREF _Toc242216380 \h </w:instrText>
         </w:r>
         <w:r>
           <w:rPr>
@@ -1433,7 +1433,7 @@
           <w:noProof/>
         </w:rPr>
       </w:pPr>
-      <w:hyperlink w:anchor="_Toc242212664" w:history="1">
+      <w:hyperlink w:anchor="_Toc242216381" w:history="1">
         <w:r>
           <w:rPr>
             <w:rStyle w:val="Hyperlink"/>
@@ -1460,7 +1460,7 @@
             <w:noProof/>
             <w:webHidden/>
           </w:rPr>
-          <w:instrText xml:space="preserve"> PAGEREF _Toc242212664 \h </w:instrText>
+          <w:instrText xml:space="preserve"> PAGEREF _Toc242216381 \h </w:instrText>
         </w:r>
         <w:r>
           <w:rPr>
@@ -1501,7 +1501,7 @@
           <w:noProof/>
         </w:rPr>
       </w:pPr>
-      <w:hyperlink w:anchor="_Toc242212665" w:history="1">
+      <w:hyperlink w:anchor="_Toc242216382" w:history="1">
         <w:r>
           <w:rPr>
             <w:rStyle w:val="Hyperlink"/>
@@ -1528,7 +1528,7 @@
             <w:noProof/>
             <w:webHidden/>
           </w:rPr>
-          <w:instrText xml:space="preserve"> PAGEREF _Toc242212665 \h </w:instrText>
+          <w:instrText xml:space="preserve"> PAGEREF _Toc242216382 \h </w:instrText>
         </w:r>
         <w:r>
           <w:rPr>
@@ -1569,7 +1569,7 @@
           <w:noProof/>
         </w:rPr>
       </w:pPr>
-      <w:hyperlink w:anchor="_Toc242212666" w:history="1">
+      <w:hyperlink w:anchor="_Toc242216383" w:history="1">
         <w:r>
           <w:rPr>
             <w:rStyle w:val="Hyperlink"/>
@@ -1596,7 +1596,7 @@
             <w:noProof/>
             <w:webHidden/>
           </w:rPr>
-          <w:instrText xml:space="preserve"> PAGEREF _Toc242212666 \h </w:instrText>
+          <w:instrText xml:space="preserve"> PAGEREF _Toc242216383 \h </w:instrText>
         </w:r>
         <w:r>
           <w:rPr>
@@ -1637,7 +1637,7 @@
           <w:noProof/>
         </w:rPr>
       </w:pPr>
-      <w:hyperlink w:anchor="_Toc242212667" w:history="1">
+      <w:hyperlink w:anchor="_Toc242216384" w:history="1">
         <w:r>
           <w:rPr>
             <w:rStyle w:val="Hyperlink"/>
@@ -1664,7 +1664,7 @@
             <w:noProof/>
             <w:webHidden/>
           </w:rPr>
-          <w:instrText xml:space="preserve"> PAGEREF _Toc242212667 \h </w:instrText>
+          <w:instrText xml:space="preserve"> PAGEREF _Toc242216384 \h </w:instrText>
         </w:r>
         <w:r>
           <w:rPr>
@@ -1705,7 +1705,7 @@
           <w:noProof/>
         </w:rPr>
       </w:pPr>
-      <w:hyperlink w:anchor="_Toc242212668" w:history="1">
+      <w:hyperlink w:anchor="_Toc242216385" w:history="1">
         <w:r>
           <w:rPr>
             <w:rStyle w:val="Hyperlink"/>
@@ -1732,7 +1732,7 @@
             <w:noProof/>
             <w:webHidden/>
           </w:rPr>
-          <w:instrText xml:space="preserve"> PAGEREF _Toc242212668 \h </w:instrText>
+          <w:instrText xml:space="preserve"> PAGEREF _Toc242216385 \h </w:instrText>
         </w:r>
         <w:r>
           <w:rPr>
@@ -1773,7 +1773,7 @@
           <w:noProof/>
         </w:rPr>
       </w:pPr>
-      <w:hyperlink w:anchor="_Toc242212669" w:history="1">
+      <w:hyperlink w:anchor="_Toc242216386" w:history="1">
         <w:r>
           <w:rPr>
             <w:rStyle w:val="Hyperlink"/>
@@ -1800,7 +1800,7 @@
             <w:noProof/>
             <w:webHidden/>
           </w:rPr>
-          <w:instrText xml:space="preserve"> PAGEREF _Toc242212669 \h </w:instrText>
+          <w:instrText xml:space="preserve"> PAGEREF _Toc242216386 \h </w:instrText>
         </w:r>
         <w:r>
           <w:rPr>
@@ -1841,7 +1841,7 @@
           <w:noProof/>
         </w:rPr>
       </w:pPr>
-      <w:hyperlink w:anchor="_Toc242212670" w:history="1">
+      <w:hyperlink w:anchor="_Toc242216387" w:history="1">
         <w:r>
           <w:rPr>
             <w:rStyle w:val="Hyperlink"/>
@@ -1868,7 +1868,7 @@
             <w:noProof/>
             <w:webHidden/>
           </w:rPr>
-          <w:instrText xml:space="preserve"> PAGEREF _Toc242212670 \h </w:instrText>
+          <w:instrText xml:space="preserve"> PAGEREF _Toc242216387 \h </w:instrText>
         </w:r>
         <w:r>
           <w:rPr>
@@ -1909,7 +1909,7 @@
           <w:noProof/>
         </w:rPr>
       </w:pPr>
-      <w:hyperlink w:anchor="_Toc242212671" w:history="1">
+      <w:hyperlink w:anchor="_Toc242216388" w:history="1">
         <w:r>
           <w:rPr>
             <w:rStyle w:val="Hyperlink"/>
@@ -1936,7 +1936,7 @@
             <w:noProof/>
             <w:webHidden/>
           </w:rPr>
-          <w:instrText xml:space="preserve"> PAGEREF _Toc242212671 \h </w:instrText>
+          <w:instrText xml:space="preserve"> PAGEREF _Toc242216388 \h </w:instrText>
         </w:r>
         <w:r>
           <w:rPr>
@@ -1977,7 +1977,7 @@
           <w:noProof/>
         </w:rPr>
       </w:pPr>
-      <w:hyperlink w:anchor="_Toc242212672" w:history="1">
+      <w:hyperlink w:anchor="_Toc242216389" w:history="1">
         <w:r>
           <w:rPr>
             <w:rStyle w:val="Hyperlink"/>
@@ -2004,7 +2004,7 @@
             <w:noProof/>
             <w:webHidden/>
           </w:rPr>
-          <w:instrText xml:space="preserve"> PAGEREF _Toc242212672 \h </w:instrText>
+          <w:instrText xml:space="preserve"> PAGEREF _Toc242216389 \h </w:instrText>
         </w:r>
         <w:r>
           <w:rPr>
@@ -2045,7 +2045,7 @@
           <w:noProof/>
         </w:rPr>
       </w:pPr>
-      <w:hyperlink w:anchor="_Toc242212673" w:history="1">
+      <w:hyperlink w:anchor="_Toc242216390" w:history="1">
         <w:r>
           <w:rPr>
             <w:rStyle w:val="Hyperlink"/>
@@ -2072,7 +2072,7 @@
             <w:noProof/>
             <w:webHidden/>
           </w:rPr>
-          <w:instrText xml:space="preserve"> PAGEREF _Toc242212673 \h </w:instrText>
+          <w:instrText xml:space="preserve"> PAGEREF _Toc242216390 \h </w:instrText>
         </w:r>
         <w:r>
           <w:rPr>
@@ -2113,7 +2113,7 @@
           <w:noProof/>
         </w:rPr>
       </w:pPr>
-      <w:hyperlink w:anchor="_Toc242212674" w:history="1">
+      <w:hyperlink w:anchor="_Toc242216391" w:history="1">
         <w:r>
           <w:rPr>
             <w:rStyle w:val="Hyperlink"/>
@@ -2140,7 +2140,7 @@
             <w:noProof/>
             <w:webHidden/>
           </w:rPr>
-          <w:instrText xml:space="preserve"> PAGEREF _Toc242212674 \h </w:instrText>
+          <w:instrText xml:space="preserve"> PAGEREF _Toc242216391 \h </w:instrText>
         </w:r>
         <w:r>
           <w:rPr>
@@ -2181,7 +2181,7 @@
           <w:noProof/>
         </w:rPr>
       </w:pPr>
-      <w:hyperlink w:anchor="_Toc242212675" w:history="1">
+      <w:hyperlink w:anchor="_Toc242216392" w:history="1">
         <w:r>
           <w:rPr>
             <w:rStyle w:val="Hyperlink"/>
@@ -2208,7 +2208,7 @@
             <w:noProof/>
             <w:webHidden/>
           </w:rPr>
-          <w:instrText xml:space="preserve"> PAGEREF _Toc242212675 \h </w:instrText>
+          <w:instrText xml:space="preserve"> PAGEREF _Toc242216392 \h </w:instrText>
         </w:r>
         <w:r>
           <w:rPr>
@@ -2249,7 +2249,7 @@
           <w:noProof/>
         </w:rPr>
       </w:pPr>
-      <w:hyperlink w:anchor="_Toc242212676" w:history="1">
+      <w:hyperlink w:anchor="_Toc242216393" w:history="1">
         <w:r>
           <w:rPr>
             <w:rStyle w:val="Hyperlink"/>
@@ -2276,7 +2276,7 @@
             <w:noProof/>
             <w:webHidden/>
           </w:rPr>
-          <w:instrText xml:space="preserve"> PAGEREF _Toc242212676 \h </w:instrText>
+          <w:instrText xml:space="preserve"> PAGEREF _Toc242216393 \h </w:instrText>
         </w:r>
         <w:r>
           <w:rPr>
@@ -2317,7 +2317,7 @@
           <w:noProof/>
         </w:rPr>
       </w:pPr>
-      <w:hyperlink w:anchor="_Toc242212677" w:history="1">
+      <w:hyperlink w:anchor="_Toc242216394" w:history="1">
         <w:r>
           <w:rPr>
             <w:rStyle w:val="Hyperlink"/>
@@ -2344,7 +2344,7 @@
             <w:noProof/>
             <w:webHidden/>
           </w:rPr>
-          <w:instrText xml:space="preserve"> PAGEREF _Toc242212677 \h </w:instrText>
+          <w:instrText xml:space="preserve"> PAGEREF _Toc242216394 \h </w:instrText>
         </w:r>
         <w:r>
           <w:rPr>
@@ -2385,7 +2385,7 @@
           <w:noProof/>
         </w:rPr>
       </w:pPr>
-      <w:hyperlink w:anchor="_Toc242212678" w:history="1">
+      <w:hyperlink w:anchor="_Toc242216395" w:history="1">
         <w:r>
           <w:rPr>
             <w:rStyle w:val="Hyperlink"/>
@@ -2412,7 +2412,7 @@
             <w:noProof/>
             <w:webHidden/>
           </w:rPr>
-          <w:instrText xml:space="preserve"> PAGEREF _Toc242212678 \h </w:instrText>
+          <w:instrText xml:space="preserve"> PAGEREF _Toc242216395 \h </w:instrText>
         </w:r>
         <w:r>
           <w:rPr>
@@ -2453,7 +2453,7 @@
           <w:noProof/>
         </w:rPr>
       </w:pPr>
-      <w:hyperlink w:anchor="_Toc242212679" w:history="1">
+      <w:hyperlink w:anchor="_Toc242216396" w:history="1">
         <w:r>
           <w:rPr>
             <w:rStyle w:val="Hyperlink"/>
@@ -2480,7 +2480,7 @@
             <w:noProof/>
             <w:webHidden/>
           </w:rPr>
-          <w:instrText xml:space="preserve"> PAGEREF _Toc242212679 \h </w:instrText>
+          <w:instrText xml:space="preserve"> PAGEREF _Toc242216396 \h </w:instrText>
         </w:r>
         <w:r>
           <w:rPr>
@@ -2521,7 +2521,7 @@
           <w:noProof/>
         </w:rPr>
       </w:pPr>
-      <w:hyperlink w:anchor="_Toc242212680" w:history="1">
+      <w:hyperlink w:anchor="_Toc242216397" w:history="1">
         <w:r>
           <w:rPr>
             <w:rStyle w:val="Hyperlink"/>
@@ -2548,7 +2548,7 @@
             <w:noProof/>
             <w:webHidden/>
           </w:rPr>
-          <w:instrText xml:space="preserve"> PAGEREF _Toc242212680 \h </w:instrText>
+          <w:instrText xml:space="preserve"> PAGEREF _Toc242216397 \h </w:instrText>
         </w:r>
         <w:r>
           <w:rPr>
@@ -2589,7 +2589,7 @@
           <w:noProof/>
         </w:rPr>
       </w:pPr>
-      <w:hyperlink w:anchor="_Toc242212681" w:history="1">
+      <w:hyperlink w:anchor="_Toc242216398" w:history="1">
         <w:r>
           <w:rPr>
             <w:rStyle w:val="Hyperlink"/>
@@ -2616,7 +2616,7 @@
             <w:noProof/>
             <w:webHidden/>
           </w:rPr>
-          <w:instrText xml:space="preserve"> PAGEREF _Toc242212681 \h </w:instrText>
+          <w:instrText xml:space="preserve"> PAGEREF _Toc242216398 \h </w:instrText>
         </w:r>
         <w:r>
           <w:rPr>
@@ -2657,7 +2657,7 @@
           <w:noProof/>
         </w:rPr>
       </w:pPr>
-      <w:hyperlink w:anchor="_Toc242212682" w:history="1">
+      <w:hyperlink w:anchor="_Toc242216399" w:history="1">
         <w:r>
           <w:rPr>
             <w:rStyle w:val="Hyperlink"/>
@@ -2684,7 +2684,7 @@
             <w:noProof/>
             <w:webHidden/>
           </w:rPr>
-          <w:instrText xml:space="preserve"> PAGEREF _Toc242212682 \h </w:instrText>
+          <w:instrText xml:space="preserve"> PAGEREF _Toc242216399 \h </w:instrText>
         </w:r>
         <w:r>
           <w:rPr>
@@ -2725,7 +2725,7 @@
           <w:noProof/>
         </w:rPr>
       </w:pPr>
-      <w:hyperlink w:anchor="_Toc242212683" w:history="1">
+      <w:hyperlink w:anchor="_Toc242216400" w:history="1">
         <w:r>
           <w:rPr>
             <w:rStyle w:val="Hyperlink"/>
@@ -2752,7 +2752,7 @@
             <w:noProof/>
             <w:webHidden/>
           </w:rPr>
-          <w:instrText xml:space="preserve"> PAGEREF _Toc242212683 \h </w:instrText>
+          <w:instrText xml:space="preserve"> PAGEREF _Toc242216400 \h </w:instrText>
         </w:r>
         <w:r>
           <w:rPr>
@@ -2793,7 +2793,7 @@
           <w:noProof/>
         </w:rPr>
       </w:pPr>
-      <w:hyperlink w:anchor="_Toc242212684" w:history="1">
+      <w:hyperlink w:anchor="_Toc242216401" w:history="1">
         <w:r>
           <w:rPr>
             <w:rStyle w:val="Hyperlink"/>
@@ -2820,7 +2820,7 @@
             <w:noProof/>
             <w:webHidden/>
           </w:rPr>
-          <w:instrText xml:space="preserve"> PAGEREF _Toc242212684 \h </w:instrText>
+          <w:instrText xml:space="preserve"> PAGEREF _Toc242216401 \h </w:instrText>
         </w:r>
         <w:r>
           <w:rPr>
@@ -2861,7 +2861,7 @@
           <w:noProof/>
         </w:rPr>
       </w:pPr>
-      <w:hyperlink w:anchor="_Toc242212685" w:history="1">
+      <w:hyperlink w:anchor="_Toc242216402" w:history="1">
         <w:r>
           <w:rPr>
             <w:rStyle w:val="Hyperlink"/>
@@ -2888,7 +2888,7 @@
             <w:noProof/>
             <w:webHidden/>
           </w:rPr>
-          <w:instrText xml:space="preserve"> PAGEREF _Toc242212685 \h </w:instrText>
+          <w:instrText xml:space="preserve"> PAGEREF _Toc242216402 \h </w:instrText>
         </w:r>
         <w:r>
           <w:rPr>
@@ -2929,7 +2929,7 @@
           <w:noProof/>
         </w:rPr>
       </w:pPr>
-      <w:hyperlink w:anchor="_Toc242212686" w:history="1">
+      <w:hyperlink w:anchor="_Toc242216403" w:history="1">
         <w:r>
           <w:rPr>
             <w:rStyle w:val="Hyperlink"/>
@@ -2956,7 +2956,7 @@
             <w:noProof/>
             <w:webHidden/>
           </w:rPr>
-          <w:instrText xml:space="preserve"> PAGEREF _Toc242212686 \h </w:instrText>
+          <w:instrText xml:space="preserve"> PAGEREF _Toc242216403 \h </w:instrText>
         </w:r>
         <w:r>
           <w:rPr>
@@ -2997,7 +2997,7 @@
           <w:noProof/>
         </w:rPr>
       </w:pPr>
-      <w:hyperlink w:anchor="_Toc242212687" w:history="1">
+      <w:hyperlink w:anchor="_Toc242216404" w:history="1">
         <w:r>
           <w:rPr>
             <w:rStyle w:val="Hyperlink"/>
@@ -3024,7 +3024,7 @@
             <w:noProof/>
             <w:webHidden/>
           </w:rPr>
-          <w:instrText xml:space="preserve"> PAGEREF _Toc242212687 \h </w:instrText>
+          <w:instrText xml:space="preserve"> PAGEREF _Toc242216404 \h </w:instrText>
         </w:r>
         <w:r>
           <w:rPr>
@@ -3065,7 +3065,7 @@
           <w:noProof/>
         </w:rPr>
       </w:pPr>
-      <w:hyperlink w:anchor="_Toc242212688" w:history="1">
+      <w:hyperlink w:anchor="_Toc242216405" w:history="1">
         <w:r>
           <w:rPr>
             <w:rStyle w:val="Hyperlink"/>
@@ -3092,7 +3092,7 @@
             <w:noProof/>
             <w:webHidden/>
           </w:rPr>
-          <w:instrText xml:space="preserve"> PAGEREF _Toc242212688 \h </w:instrText>
+          <w:instrText xml:space="preserve"> PAGEREF _Toc242216405 \h </w:instrText>
         </w:r>
         <w:r>
           <w:rPr>
@@ -3133,7 +3133,7 @@
           <w:noProof/>
         </w:rPr>
       </w:pPr>
-      <w:hyperlink w:anchor="_Toc242212689" w:history="1">
+      <w:hyperlink w:anchor="_Toc242216406" w:history="1">
         <w:r>
           <w:rPr>
             <w:rStyle w:val="Hyperlink"/>
@@ -3160,7 +3160,7 @@
             <w:noProof/>
             <w:webHidden/>
           </w:rPr>
-          <w:instrText xml:space="preserve"> PAGEREF _Toc242212689 \h </w:instrText>
+          <w:instrText xml:space="preserve"> PAGEREF _Toc242216406 \h </w:instrText>
         </w:r>
         <w:r>
           <w:rPr>
@@ -3201,7 +3201,7 @@
           <w:noProof/>
         </w:rPr>
       </w:pPr>
-      <w:hyperlink w:anchor="_Toc242212690" w:history="1">
+      <w:hyperlink w:anchor="_Toc242216407" w:history="1">
         <w:r>
           <w:rPr>
             <w:rStyle w:val="Hyperlink"/>
@@ -3228,7 +3228,7 @@
             <w:noProof/>
             <w:webHidden/>
           </w:rPr>
-          <w:instrText xml:space="preserve"> PAGEREF _Toc242212690 \h </w:instrText>
+          <w:instrText xml:space="preserve"> PAGEREF _Toc242216407 \h </w:instrText>
         </w:r>
         <w:r>
           <w:rPr>
@@ -3269,7 +3269,7 @@
           <w:noProof/>
         </w:rPr>
       </w:pPr>
-      <w:hyperlink w:anchor="_Toc242212691" w:history="1">
+      <w:hyperlink w:anchor="_Toc242216408" w:history="1">
         <w:r>
           <w:rPr>
             <w:rStyle w:val="Hyperlink"/>
@@ -3296,7 +3296,7 @@
             <w:noProof/>
             <w:webHidden/>
           </w:rPr>
-          <w:instrText xml:space="preserve"> PAGEREF _Toc242212691 \h </w:instrText>
+          <w:instrText xml:space="preserve"> PAGEREF _Toc242216408 \h </w:instrText>
         </w:r>
         <w:r>
           <w:rPr>
@@ -3337,7 +3337,7 @@
           <w:noProof/>
         </w:rPr>
       </w:pPr>
-      <w:hyperlink w:anchor="_Toc242212692" w:history="1">
+      <w:hyperlink w:anchor="_Toc242216409" w:history="1">
         <w:r>
           <w:rPr>
             <w:rStyle w:val="Hyperlink"/>
@@ -3364,7 +3364,7 @@
             <w:noProof/>
             <w:webHidden/>
           </w:rPr>
-          <w:instrText xml:space="preserve"> PAGEREF _Toc242212692 \h </w:instrText>
+          <w:instrText xml:space="preserve"> PAGEREF _Toc242216409 \h </w:instrText>
         </w:r>
         <w:r>
           <w:rPr>
@@ -3405,7 +3405,7 @@
           <w:noProof/>
         </w:rPr>
       </w:pPr>
-      <w:hyperlink w:anchor="_Toc242212693" w:history="1">
+      <w:hyperlink w:anchor="_Toc242216410" w:history="1">
         <w:r>
           <w:rPr>
             <w:rStyle w:val="Hyperlink"/>
@@ -3432,7 +3432,7 @@
             <w:noProof/>
             <w:webHidden/>
           </w:rPr>
-          <w:instrText xml:space="preserve"> PAGEREF _Toc242212693 \h </w:instrText>
+          <w:instrText xml:space="preserve"> PAGEREF _Toc242216410 \h </w:instrText>
         </w:r>
         <w:r>
           <w:rPr>
@@ -3473,7 +3473,7 @@
           <w:noProof/>
         </w:rPr>
       </w:pPr>
-      <w:hyperlink w:anchor="_Toc242212694" w:history="1">
+      <w:hyperlink w:anchor="_Toc242216411" w:history="1">
         <w:r>
           <w:rPr>
             <w:rStyle w:val="Hyperlink"/>
@@ -3500,7 +3500,7 @@
             <w:noProof/>
             <w:webHidden/>
           </w:rPr>
-          <w:instrText xml:space="preserve"> PAGEREF _Toc242212694 \h </w:instrText>
+          <w:instrText xml:space="preserve"> PAGEREF _Toc242216411 \h </w:instrText>
         </w:r>
         <w:r>
           <w:rPr>
@@ -3541,7 +3541,7 @@
           <w:noProof/>
         </w:rPr>
       </w:pPr>
-      <w:hyperlink w:anchor="_Toc242212695" w:history="1">
+      <w:hyperlink w:anchor="_Toc242216412" w:history="1">
         <w:r>
           <w:rPr>
             <w:rStyle w:val="Hyperlink"/>
@@ -3568,7 +3568,7 @@
             <w:noProof/>
             <w:webHidden/>
           </w:rPr>
-          <w:instrText xml:space="preserve"> PAGEREF _Toc242212695 \h </w:instrText>
+          <w:instrText xml:space="preserve"> PAGEREF _Toc242216412 \h </w:instrText>
         </w:r>
         <w:r>
           <w:rPr>
@@ -3609,7 +3609,7 @@
           <w:noProof/>
         </w:rPr>
       </w:pPr>
-      <w:hyperlink w:anchor="_Toc242212696" w:history="1">
+      <w:hyperlink w:anchor="_Toc242216413" w:history="1">
         <w:r>
           <w:rPr>
             <w:rStyle w:val="Hyperlink"/>
@@ -3636,7 +3636,7 @@
             <w:noProof/>
             <w:webHidden/>
           </w:rPr>
-          <w:instrText xml:space="preserve"> PAGEREF _Toc242212696 \h </w:instrText>
+          <w:instrText xml:space="preserve"> PAGEREF _Toc242216413 \h </w:instrText>
         </w:r>
         <w:r>
           <w:rPr>
@@ -3677,7 +3677,7 @@
           <w:noProof/>
         </w:rPr>
       </w:pPr>
-      <w:hyperlink w:anchor="_Toc242212697" w:history="1">
+      <w:hyperlink w:anchor="_Toc242216414" w:history="1">
         <w:r>
           <w:rPr>
             <w:rStyle w:val="Hyperlink"/>
@@ -3704,7 +3704,7 @@
             <w:noProof/>
             <w:webHidden/>
           </w:rPr>
-          <w:instrText xml:space="preserve"> PAGEREF _Toc242212697 \h </w:instrText>
+          <w:instrText xml:space="preserve"> PAGEREF _Toc242216414 \h </w:instrText>
         </w:r>
         <w:r>
           <w:rPr>
@@ -3745,7 +3745,7 @@
           <w:noProof/>
         </w:rPr>
       </w:pPr>
-      <w:hyperlink w:anchor="_Toc242212698" w:history="1">
+      <w:hyperlink w:anchor="_Toc242216415" w:history="1">
         <w:r>
           <w:rPr>
             <w:rStyle w:val="Hyperlink"/>
@@ -3772,7 +3772,7 @@
             <w:noProof/>
             <w:webHidden/>
           </w:rPr>
-          <w:instrText xml:space="preserve"> PAGEREF _Toc242212698 \h </w:instrText>
+          <w:instrText xml:space="preserve"> PAGEREF _Toc242216415 \h </w:instrText>
         </w:r>
         <w:r>
           <w:rPr>
@@ -3813,7 +3813,7 @@
           <w:noProof/>
         </w:rPr>
       </w:pPr>
-      <w:hyperlink w:anchor="_Toc242212699" w:history="1">
+      <w:hyperlink w:anchor="_Toc242216416" w:history="1">
         <w:r>
           <w:rPr>
             <w:rStyle w:val="Hyperlink"/>
@@ -3840,7 +3840,7 @@
             <w:noProof/>
             <w:webHidden/>
           </w:rPr>
-          <w:instrText xml:space="preserve"> PAGEREF _Toc242212699 \h </w:instrText>
+          <w:instrText xml:space="preserve"> PAGEREF _Toc242216416 \h </w:instrText>
         </w:r>
         <w:r>
           <w:rPr>
@@ -3881,7 +3881,7 @@
           <w:noProof/>
         </w:rPr>
       </w:pPr>
-      <w:hyperlink w:anchor="_Toc242212700" w:history="1">
+      <w:hyperlink w:anchor="_Toc242216417" w:history="1">
         <w:r>
           <w:rPr>
             <w:rStyle w:val="Hyperlink"/>
@@ -3908,7 +3908,7 @@
             <w:noProof/>
             <w:webHidden/>
           </w:rPr>
-          <w:instrText xml:space="preserve"> PAGEREF _Toc242212700 \h </w:instrText>
+          <w:instrText xml:space="preserve"> PAGEREF _Toc242216417 \h </w:instrText>
         </w:r>
         <w:r>
           <w:rPr>
@@ -3949,7 +3949,7 @@
           <w:noProof/>
         </w:rPr>
       </w:pPr>
-      <w:hyperlink w:anchor="_Toc242212701" w:history="1">
+      <w:hyperlink w:anchor="_Toc242216418" w:history="1">
         <w:r>
           <w:rPr>
             <w:rStyle w:val="Hyperlink"/>
@@ -3976,7 +3976,7 @@
             <w:noProof/>
             <w:webHidden/>
           </w:rPr>
-          <w:instrText xml:space="preserve"> PAGEREF _Toc242212701 \h </w:instrText>
+          <w:instrText xml:space="preserve"> PAGEREF _Toc242216418 \h </w:instrText>
         </w:r>
         <w:r>
           <w:rPr>
@@ -4017,7 +4017,7 @@
           <w:noProof/>
         </w:rPr>
       </w:pPr>
-      <w:hyperlink w:anchor="_Toc242212702" w:history="1">
+      <w:hyperlink w:anchor="_Toc242216419" w:history="1">
         <w:r>
           <w:rPr>
             <w:rStyle w:val="Hyperlink"/>
@@ -4044,7 +4044,7 @@
             <w:noProof/>
             <w:webHidden/>
           </w:rPr>
-          <w:instrText xml:space="preserve"> PAGEREF _Toc242212702 \h </w:instrText>
+          <w:instrText xml:space="preserve"> PAGEREF _Toc242216419 \h </w:instrText>
         </w:r>
         <w:r>
           <w:rPr>
@@ -4085,7 +4085,7 @@
           <w:noProof/>
         </w:rPr>
       </w:pPr>
-      <w:hyperlink w:anchor="_Toc242212703" w:history="1">
+      <w:hyperlink w:anchor="_Toc242216420" w:history="1">
         <w:r>
           <w:rPr>
             <w:rStyle w:val="Hyperlink"/>
@@ -4112,7 +4112,7 @@
             <w:noProof/>
             <w:webHidden/>
           </w:rPr>
-          <w:instrText xml:space="preserve"> PAGEREF _Toc242212703 \h </w:instrText>
+          <w:instrText xml:space="preserve"> PAGEREF _Toc242216420 \h </w:instrText>
         </w:r>
         <w:r>
           <w:rPr>
@@ -4153,7 +4153,7 @@
           <w:noProof/>
         </w:rPr>
       </w:pPr>
-      <w:hyperlink w:anchor="_Toc242212704" w:history="1">
+      <w:hyperlink w:anchor="_Toc242216421" w:history="1">
         <w:r>
           <w:rPr>
             <w:rStyle w:val="Hyperlink"/>
@@ -4180,7 +4180,7 @@
             <w:noProof/>
             <w:webHidden/>
           </w:rPr>
-          <w:instrText xml:space="preserve"> PAGEREF _Toc242212704 \h </w:instrText>
+          <w:instrText xml:space="preserve"> PAGEREF _Toc242216421 \h </w:instrText>
         </w:r>
         <w:r>
           <w:rPr>
@@ -4221,7 +4221,7 @@
         <w:pStyle w:val="Heading1"/>
         <w:pageBreakBefore/>
       </w:pPr>
-      <w:bookmarkStart w:id="0" w:name="_Toc242212648"/>
+      <w:bookmarkStart w:id="0" w:name="_Toc242216365"/>
       <w:r>
         <w:lastRenderedPageBreak/>
         <w:t>Welcome</w:t>
@@ -4237,7 +4237,7 @@
       <w:pPr>
         <w:pStyle w:val="Heading2"/>
       </w:pPr>
-      <w:bookmarkStart w:id="1" w:name="_Toc242212649"/>
+      <w:bookmarkStart w:id="1" w:name="_Toc242216366"/>
       <w:r>
         <w:t>How a sale moves through the app</w:t>
       </w:r>
@@ -4720,7 +4720,7 @@
       <w:pPr>
         <w:pStyle w:val="Heading2"/>
       </w:pPr>
-      <w:bookmarkStart w:id="2" w:name="_Toc242212650"/>
+      <w:bookmarkStart w:id="2" w:name="_Toc242216367"/>
       <w:r>
         <w:t>What you'll need</w:t>
       </w:r>
@@ -4829,7 +4829,7 @@
         <w:pStyle w:val="Heading1"/>
         <w:pageBreakBefore/>
       </w:pPr>
-      <w:bookmarkStart w:id="3" w:name="_Toc242212651"/>
+      <w:bookmarkStart w:id="3" w:name="_Toc242216368"/>
       <w:r>
         <w:lastRenderedPageBreak/>
         <w:t>Who can do what</w:t>
@@ -5305,7 +5305,7 @@
         <w:pStyle w:val="Heading1"/>
         <w:pageBreakBefore/>
       </w:pPr>
-      <w:bookmarkStart w:id="4" w:name="_Toc242212652"/>
+      <w:bookmarkStart w:id="4" w:name="_Toc242216369"/>
       <w:r>
         <w:lastRenderedPageBreak/>
         <w:t>Getting started</w:t>
@@ -5316,7 +5316,7 @@
       <w:pPr>
         <w:pStyle w:val="Heading2"/>
       </w:pPr>
-      <w:bookmarkStart w:id="5" w:name="_Toc242212653"/>
+      <w:bookmarkStart w:id="5" w:name="_Toc242216370"/>
       <w:r>
         <w:t>Signing in</w:t>
       </w:r>
@@ -5333,7 +5333,7 @@
           <w:noProof/>
         </w:rPr>
         <w:drawing>
-          <wp:inline distT="0" distB="0" distL="0" distR="0" wp14:anchorId="0D66ECEE" wp14:editId="409C1D02">
+          <wp:inline distT="0" distB="0" distL="0" distR="0" wp14:anchorId="672F4AE1" wp14:editId="1C589945">
             <wp:extent cx="3291840" cy="2211705"/>
             <wp:effectExtent l="0" t="0" r="0" b="0"/>
             <wp:docPr id="1" name="Picture 1"/>
@@ -5651,7 +5651,7 @@
       <w:pPr>
         <w:pStyle w:val="Heading2"/>
       </w:pPr>
-      <w:bookmarkStart w:id="6" w:name="_Toc242212654"/>
+      <w:bookmarkStart w:id="6" w:name="_Toc242216371"/>
       <w:r>
         <w:t>Changing your PIN</w:t>
       </w:r>
@@ -5833,7 +5833,7 @@
       <w:pPr>
         <w:pStyle w:val="Heading2"/>
       </w:pPr>
-      <w:bookmarkStart w:id="7" w:name="_Toc242212655"/>
+      <w:bookmarkStart w:id="7" w:name="_Toc242216372"/>
       <w:r>
         <w:lastRenderedPageBreak/>
         <w:t>Finding your way around</w:t>
@@ -6416,7 +6416,7 @@
       <w:pPr>
         <w:pStyle w:val="Heading2"/>
       </w:pPr>
-      <w:bookmarkStart w:id="8" w:name="_Toc242212656"/>
+      <w:bookmarkStart w:id="8" w:name="_Toc242216373"/>
       <w:r>
         <w:t>Mattress size guide</w:t>
       </w:r>
@@ -6439,7 +6439,7 @@
         </w:rPr>
         <w:lastRenderedPageBreak/>
         <w:drawing>
-          <wp:inline distT="0" distB="0" distL="0" distR="0" wp14:anchorId="4011B88F" wp14:editId="02E20FD5">
+          <wp:inline distT="0" distB="0" distL="0" distR="0" wp14:anchorId="0DFCA564" wp14:editId="30619F15">
             <wp:extent cx="5486400" cy="3686175"/>
             <wp:effectExtent l="0" t="0" r="0" b="0"/>
             <wp:docPr id="2" name="Picture 2"/>
@@ -6516,7 +6516,7 @@
       <w:pPr>
         <w:pStyle w:val="Heading2"/>
       </w:pPr>
-      <w:bookmarkStart w:id="9" w:name="_Toc242212657"/>
+      <w:bookmarkStart w:id="9" w:name="_Toc242216374"/>
       <w:r>
         <w:t>Light and dark mode</w:t>
       </w:r>
@@ -6531,7 +6531,7 @@
       <w:pPr>
         <w:pStyle w:val="Heading2"/>
       </w:pPr>
-      <w:bookmarkStart w:id="10" w:name="_Toc242212658"/>
+      <w:bookmarkStart w:id="10" w:name="_Toc242216375"/>
       <w:r>
         <w:t>Signing out</w:t>
       </w:r>
@@ -6556,7 +6556,7 @@
         <w:pStyle w:val="Heading1"/>
         <w:pageBreakBefore/>
       </w:pPr>
-      <w:bookmarkStart w:id="11" w:name="_Toc242212659"/>
+      <w:bookmarkStart w:id="11" w:name="_Toc242216376"/>
       <w:r>
         <w:lastRenderedPageBreak/>
         <w:t>Taking an order on the sales floor</w:t>
@@ -6588,7 +6588,7 @@
           <w:noProof/>
         </w:rPr>
         <w:drawing>
-          <wp:inline distT="0" distB="0" distL="0" distR="0" wp14:anchorId="3586159A" wp14:editId="73F789C3">
+          <wp:inline distT="0" distB="0" distL="0" distR="0" wp14:anchorId="2C20B37C" wp14:editId="7D926121">
             <wp:extent cx="5760720" cy="3870484"/>
             <wp:effectExtent l="0" t="0" r="0" b="0"/>
             <wp:docPr id="3" name="Picture 3"/>
@@ -6713,7 +6713,7 @@
       <w:pPr>
         <w:pStyle w:val="Heading2"/>
       </w:pPr>
-      <w:bookmarkStart w:id="12" w:name="_Toc242212660"/>
+      <w:bookmarkStart w:id="12" w:name="_Toc242216377"/>
       <w:r>
         <w:t>Starting an order</w:t>
       </w:r>
@@ -6797,7 +6797,7 @@
       <w:pPr>
         <w:pStyle w:val="Heading2"/>
       </w:pPr>
-      <w:bookmarkStart w:id="13" w:name="_Toc242212661"/>
+      <w:bookmarkStart w:id="13" w:name="_Toc242216378"/>
       <w:r>
         <w:lastRenderedPageBreak/>
         <w:t>Adding items</w:t>
@@ -6946,7 +6946,7 @@
           <w:noProof/>
         </w:rPr>
         <w:drawing>
-          <wp:inline distT="0" distB="0" distL="0" distR="0" wp14:anchorId="7A6D065B" wp14:editId="4399CF76">
+          <wp:inline distT="0" distB="0" distL="0" distR="0" wp14:anchorId="73A51AF5" wp14:editId="20081F78">
             <wp:extent cx="5760720" cy="3870484"/>
             <wp:effectExtent l="0" t="0" r="0" b="0"/>
             <wp:docPr id="4" name="Picture 4"/>
@@ -7083,7 +7083,7 @@
           <w:noProof/>
         </w:rPr>
         <w:drawing>
-          <wp:inline distT="0" distB="0" distL="0" distR="0" wp14:anchorId="7EB8CC30" wp14:editId="127E43FA">
+          <wp:inline distT="0" distB="0" distL="0" distR="0" wp14:anchorId="72ABF8CF" wp14:editId="4A752292">
             <wp:extent cx="5760720" cy="3870484"/>
             <wp:effectExtent l="0" t="0" r="0" b="0"/>
             <wp:docPr id="5" name="Picture 5"/>
@@ -7480,7 +7480,7 @@
           <w:noProof/>
         </w:rPr>
         <w:drawing>
-          <wp:inline distT="0" distB="0" distL="0" distR="0" wp14:anchorId="11028F16" wp14:editId="2A37FA7D">
+          <wp:inline distT="0" distB="0" distL="0" distR="0" wp14:anchorId="0ABC212B" wp14:editId="6E513833">
             <wp:extent cx="5760720" cy="4545568"/>
             <wp:effectExtent l="0" t="0" r="0" b="0"/>
             <wp:docPr id="6" name="Picture 6"/>
@@ -7626,7 +7626,7 @@
         </w:rPr>
         <w:lastRenderedPageBreak/>
         <w:drawing>
-          <wp:inline distT="0" distB="0" distL="0" distR="0" wp14:anchorId="4091496E" wp14:editId="20BAC765">
+          <wp:inline distT="0" distB="0" distL="0" distR="0" wp14:anchorId="3CE5E49A" wp14:editId="5A7FCD52">
             <wp:extent cx="5760720" cy="4050506"/>
             <wp:effectExtent l="0" t="0" r="0" b="0"/>
             <wp:docPr id="7" name="Picture 7"/>
@@ -7788,7 +7788,7 @@
         </w:rPr>
         <w:lastRenderedPageBreak/>
         <w:drawing>
-          <wp:inline distT="0" distB="0" distL="0" distR="0" wp14:anchorId="38803DA4" wp14:editId="2AC98F27">
+          <wp:inline distT="0" distB="0" distL="0" distR="0" wp14:anchorId="73F4B9C6" wp14:editId="0E87CBDB">
             <wp:extent cx="5486400" cy="3686175"/>
             <wp:effectExtent l="0" t="0" r="0" b="0"/>
             <wp:docPr id="8" name="Picture 8"/>
@@ -8002,7 +8002,7 @@
       <w:pPr>
         <w:pStyle w:val="Heading2"/>
       </w:pPr>
-      <w:bookmarkStart w:id="14" w:name="_Toc242212662"/>
+      <w:bookmarkStart w:id="14" w:name="_Toc242216379"/>
       <w:r>
         <w:t>Adding shipping or a service later</w:t>
       </w:r>
@@ -8043,7 +8043,7 @@
         </w:rPr>
         <w:lastRenderedPageBreak/>
         <w:drawing>
-          <wp:inline distT="0" distB="0" distL="0" distR="0" wp14:anchorId="11858517" wp14:editId="4A4F867E">
+          <wp:inline distT="0" distB="0" distL="0" distR="0" wp14:anchorId="0AA44BD5" wp14:editId="5BFDD17D">
             <wp:extent cx="4754880" cy="3145155"/>
             <wp:effectExtent l="0" t="0" r="0" b="0"/>
             <wp:docPr id="9" name="Picture 9"/>
@@ -8159,7 +8159,7 @@
       <w:pPr>
         <w:pStyle w:val="Heading2"/>
       </w:pPr>
-      <w:bookmarkStart w:id="15" w:name="_Toc242212663"/>
+      <w:bookmarkStart w:id="15" w:name="_Toc242216380"/>
       <w:r>
         <w:t>Changing or removing an item</w:t>
       </w:r>
@@ -8333,7 +8333,7 @@
       <w:pPr>
         <w:pStyle w:val="Heading2"/>
       </w:pPr>
-      <w:bookmarkStart w:id="16" w:name="_Toc242212664"/>
+      <w:bookmarkStart w:id="16" w:name="_Toc242216381"/>
       <w:r>
         <w:t>Customer details</w:t>
       </w:r>
@@ -8456,7 +8456,34 @@
         <w:t>Where should we deliver?</w:t>
       </w:r>
       <w:r>
-        <w:t xml:space="preserve"> with only the fields they need, including a choice of delivering </w:t>
+        <w:t xml:space="preserve"> with only the fields they need: the same </w:t>
+      </w:r>
+      <w:r>
+        <w:rPr>
+          <w:b/>
+        </w:rPr>
+        <w:t>Unit #</w:t>
+      </w:r>
+      <w:r>
+        <w:t xml:space="preserve">, </w:t>
+      </w:r>
+      <w:r>
+        <w:rPr>
+          <w:b/>
+        </w:rPr>
+        <w:t>Floor</w:t>
+      </w:r>
+      <w:r>
+        <w:t xml:space="preserve"> and </w:t>
+      </w:r>
+      <w:r>
+        <w:rPr>
+          <w:b/>
+        </w:rPr>
+        <w:t>Suite #</w:t>
+      </w:r>
+      <w:r>
+        <w:t xml:space="preserve"> boxes as your form (all optional), and a choice of delivering </w:t>
       </w:r>
       <w:r>
         <w:rPr>
@@ -8474,7 +8501,7 @@
         <w:t>Somewhere else</w:t>
       </w:r>
       <w:r>
-        <w:t xml:space="preserve">. When they tap </w:t>
+        <w:t xml:space="preserve">, which asks for the delivery address the same way. When they tap </w:t>
       </w:r>
       <w:r>
         <w:rPr>
@@ -8497,7 +8524,7 @@
           <w:noProof/>
         </w:rPr>
         <w:drawing>
-          <wp:inline distT="0" distB="0" distL="0" distR="0" wp14:anchorId="67E76005" wp14:editId="325B8E43">
+          <wp:inline distT="0" distB="0" distL="0" distR="0" wp14:anchorId="335AA192" wp14:editId="36F52CDD">
             <wp:extent cx="4754880" cy="3194685"/>
             <wp:effectExtent l="0" t="0" r="0" b="0"/>
             <wp:docPr id="10" name="Picture 10"/>
@@ -8551,7 +8578,7 @@
       <w:pPr>
         <w:pStyle w:val="Heading2"/>
       </w:pPr>
-      <w:bookmarkStart w:id="17" w:name="_Toc242212665"/>
+      <w:bookmarkStart w:id="17" w:name="_Toc242216382"/>
       <w:r>
         <w:t>Sending the order to checkout</w:t>
       </w:r>
@@ -8730,7 +8757,7 @@
       <w:pPr>
         <w:pStyle w:val="Heading2"/>
       </w:pPr>
-      <w:bookmarkStart w:id="18" w:name="_Toc242212666"/>
+      <w:bookmarkStart w:id="18" w:name="_Toc242216383"/>
       <w:r>
         <w:t>Using a phone</w:t>
       </w:r>
@@ -8747,7 +8774,7 @@
           <w:noProof/>
         </w:rPr>
         <w:drawing>
-          <wp:inline distT="0" distB="0" distL="0" distR="0" wp14:anchorId="7D6D7023" wp14:editId="6A73D9B6">
+          <wp:inline distT="0" distB="0" distL="0" distR="0" wp14:anchorId="76C6F76B" wp14:editId="4A0EBB9B">
             <wp:extent cx="2194560" cy="4749253"/>
             <wp:effectExtent l="0" t="0" r="0" b="0"/>
             <wp:docPr id="11" name="Picture 11"/>
@@ -8825,7 +8852,7 @@
         <w:pStyle w:val="Heading1"/>
         <w:pageBreakBefore/>
       </w:pPr>
-      <w:bookmarkStart w:id="19" w:name="_Toc242212667"/>
+      <w:bookmarkStart w:id="19" w:name="_Toc242216384"/>
       <w:r>
         <w:lastRenderedPageBreak/>
         <w:t>Checking out a customer</w:t>
@@ -8866,7 +8893,7 @@
           <w:noProof/>
         </w:rPr>
         <w:drawing>
-          <wp:inline distT="0" distB="0" distL="0" distR="0" wp14:anchorId="797403A4" wp14:editId="72BC9353">
+          <wp:inline distT="0" distB="0" distL="0" distR="0" wp14:anchorId="32400D57" wp14:editId="5E4C88E3">
             <wp:extent cx="5760720" cy="3870484"/>
             <wp:effectExtent l="0" t="0" r="0" b="0"/>
             <wp:docPr id="12" name="Picture 12"/>
@@ -8920,7 +8947,7 @@
       <w:pPr>
         <w:pStyle w:val="Heading2"/>
       </w:pPr>
-      <w:bookmarkStart w:id="20" w:name="_Toc242212668"/>
+      <w:bookmarkStart w:id="20" w:name="_Toc242216385"/>
       <w:r>
         <w:t>1. Review the order with the customer</w:t>
       </w:r>
@@ -9017,7 +9044,7 @@
       <w:pPr>
         <w:pStyle w:val="Heading2"/>
       </w:pPr>
-      <w:bookmarkStart w:id="21" w:name="_Toc242212669"/>
+      <w:bookmarkStart w:id="21" w:name="_Toc242216386"/>
       <w:r>
         <w:t>2. Take payment</w:t>
       </w:r>
@@ -9331,7 +9358,7 @@
       <w:pPr>
         <w:pStyle w:val="Heading2"/>
       </w:pPr>
-      <w:bookmarkStart w:id="22" w:name="_Toc242212670"/>
+      <w:bookmarkStart w:id="22" w:name="_Toc242216387"/>
       <w:r>
         <w:t>3. Acknowledgements (initials and signature)</w:t>
       </w:r>
@@ -9513,7 +9540,7 @@
         </w:rPr>
         <w:lastRenderedPageBreak/>
         <w:drawing>
-          <wp:inline distT="0" distB="0" distL="0" distR="0" wp14:anchorId="476CD4F5" wp14:editId="353293F2">
+          <wp:inline distT="0" distB="0" distL="0" distR="0" wp14:anchorId="392C54D7" wp14:editId="74BF96EA">
             <wp:extent cx="4937760" cy="3317558"/>
             <wp:effectExtent l="0" t="0" r="0" b="0"/>
             <wp:docPr id="13" name="Picture 13"/>
@@ -9702,7 +9729,7 @@
       <w:pPr>
         <w:pStyle w:val="Heading2"/>
       </w:pPr>
-      <w:bookmarkStart w:id="23" w:name="_Toc242212671"/>
+      <w:bookmarkStart w:id="23" w:name="_Toc242216388"/>
       <w:r>
         <w:t>4. Complete the sale</w:t>
       </w:r>
@@ -9924,7 +9951,7 @@
       <w:pPr>
         <w:pStyle w:val="Heading2"/>
       </w:pPr>
-      <w:bookmarkStart w:id="24" w:name="_Toc242212672"/>
+      <w:bookmarkStart w:id="24" w:name="_Toc242216389"/>
       <w:r>
         <w:t>Other checkout actions</w:t>
       </w:r>
@@ -10134,7 +10161,7 @@
         <w:pStyle w:val="Heading1"/>
         <w:pageBreakBefore/>
       </w:pPr>
-      <w:bookmarkStart w:id="25" w:name="_Toc242212673"/>
+      <w:bookmarkStart w:id="25" w:name="_Toc242216390"/>
       <w:r>
         <w:lastRenderedPageBreak/>
         <w:t>The sales sheet</w:t>
@@ -10157,7 +10184,7 @@
           <w:noProof/>
         </w:rPr>
         <w:drawing>
-          <wp:inline distT="0" distB="0" distL="0" distR="0" wp14:anchorId="706275B1" wp14:editId="0C49EBC8">
+          <wp:inline distT="0" distB="0" distL="0" distR="0" wp14:anchorId="750D94E7" wp14:editId="2516528A">
             <wp:extent cx="4023360" cy="3187256"/>
             <wp:effectExtent l="0" t="0" r="0" b="0"/>
             <wp:docPr id="14" name="Picture 14"/>
@@ -10604,7 +10631,7 @@
       <w:pPr>
         <w:pStyle w:val="Heading2"/>
       </w:pPr>
-      <w:bookmarkStart w:id="26" w:name="_Toc242212674"/>
+      <w:bookmarkStart w:id="26" w:name="_Toc242216391"/>
       <w:r>
         <w:t>Emailing a receipt</w:t>
       </w:r>
@@ -10731,7 +10758,7 @@
           <w:noProof/>
         </w:rPr>
         <w:drawing>
-          <wp:inline distT="0" distB="0" distL="0" distR="0" wp14:anchorId="0AE72177" wp14:editId="5FFB827C">
+          <wp:inline distT="0" distB="0" distL="0" distR="0" wp14:anchorId="64692BE8" wp14:editId="31C650D4">
             <wp:extent cx="4572000" cy="3071812"/>
             <wp:effectExtent l="0" t="0" r="0" b="0"/>
             <wp:docPr id="15" name="Picture 15"/>
@@ -11192,7 +11219,7 @@
         <w:pStyle w:val="Heading1"/>
         <w:pageBreakBefore/>
       </w:pPr>
-      <w:bookmarkStart w:id="27" w:name="_Toc242212675"/>
+      <w:bookmarkStart w:id="27" w:name="_Toc242216392"/>
       <w:r>
         <w:lastRenderedPageBreak/>
         <w:t>Looking up orders</w:t>
@@ -11224,7 +11251,7 @@
           <w:noProof/>
         </w:rPr>
         <w:drawing>
-          <wp:inline distT="0" distB="0" distL="0" distR="0" wp14:anchorId="4EC9A7FC" wp14:editId="293E5FB1">
+          <wp:inline distT="0" distB="0" distL="0" distR="0" wp14:anchorId="20179DEC" wp14:editId="45123675">
             <wp:extent cx="5760720" cy="3870484"/>
             <wp:effectExtent l="0" t="0" r="0" b="0"/>
             <wp:docPr id="16" name="Picture 16"/>
@@ -11344,7 +11371,7 @@
       <w:pPr>
         <w:pStyle w:val="Heading2"/>
       </w:pPr>
-      <w:bookmarkStart w:id="28" w:name="_Toc242212676"/>
+      <w:bookmarkStart w:id="28" w:name="_Toc242216393"/>
       <w:r>
         <w:t>Extra options for admins</w:t>
       </w:r>
@@ -11434,7 +11461,7 @@
         </w:rPr>
         <w:lastRenderedPageBreak/>
         <w:drawing>
-          <wp:inline distT="0" distB="0" distL="0" distR="0" wp14:anchorId="58E9C76A" wp14:editId="1B941D9A">
+          <wp:inline distT="0" distB="0" distL="0" distR="0" wp14:anchorId="66C00A88" wp14:editId="7060F00D">
             <wp:extent cx="4754880" cy="3194685"/>
             <wp:effectExtent l="0" t="0" r="0" b="0"/>
             <wp:docPr id="17" name="Picture 17"/>
@@ -11542,7 +11569,7 @@
         <w:pStyle w:val="Heading1"/>
         <w:pageBreakBefore/>
       </w:pPr>
-      <w:bookmarkStart w:id="29" w:name="_Toc242212677"/>
+      <w:bookmarkStart w:id="29" w:name="_Toc242216394"/>
       <w:r>
         <w:lastRenderedPageBreak/>
         <w:t>The dashboard</w:t>
@@ -11606,7 +11633,7 @@
           <w:noProof/>
         </w:rPr>
         <w:drawing>
-          <wp:inline distT="0" distB="0" distL="0" distR="0" wp14:anchorId="1C406C99" wp14:editId="6E92E047">
+          <wp:inline distT="0" distB="0" distL="0" distR="0" wp14:anchorId="51E60B19" wp14:editId="014498F9">
             <wp:extent cx="4937760" cy="4305110"/>
             <wp:effectExtent l="0" t="0" r="0" b="0"/>
             <wp:docPr id="18" name="Picture 18"/>
@@ -12261,7 +12288,7 @@
         <w:pStyle w:val="Heading1"/>
         <w:pageBreakBefore/>
       </w:pPr>
-      <w:bookmarkStart w:id="30" w:name="_Toc242212678"/>
+      <w:bookmarkStart w:id="30" w:name="_Toc242216395"/>
       <w:r>
         <w:lastRenderedPageBreak/>
         <w:t>Keeping inventory</w:t>
@@ -12320,7 +12347,7 @@
           <w:noProof/>
         </w:rPr>
         <w:drawing>
-          <wp:inline distT="0" distB="0" distL="0" distR="0" wp14:anchorId="13B2F490" wp14:editId="535CFA06">
+          <wp:inline distT="0" distB="0" distL="0" distR="0" wp14:anchorId="3FAD4899" wp14:editId="75C6DBA3">
             <wp:extent cx="5760720" cy="3870484"/>
             <wp:effectExtent l="0" t="0" r="0" b="0"/>
             <wp:docPr id="19" name="Picture 19"/>
@@ -12374,7 +12401,7 @@
       <w:pPr>
         <w:pStyle w:val="Heading2"/>
       </w:pPr>
-      <w:bookmarkStart w:id="31" w:name="_Toc242212679"/>
+      <w:bookmarkStart w:id="31" w:name="_Toc242216396"/>
       <w:r>
         <w:t>What's on the screen</w:t>
       </w:r>
@@ -12482,7 +12509,7 @@
         </w:rPr>
         <w:lastRenderedPageBreak/>
         <w:drawing>
-          <wp:inline distT="0" distB="0" distL="0" distR="0" wp14:anchorId="30F09D7C" wp14:editId="19D667B4">
+          <wp:inline distT="0" distB="0" distL="0" distR="0" wp14:anchorId="68E50183" wp14:editId="3477DDD3">
             <wp:extent cx="5120640" cy="2295459"/>
             <wp:effectExtent l="0" t="0" r="0" b="0"/>
             <wp:docPr id="20" name="Picture 20"/>
@@ -12607,7 +12634,7 @@
       <w:pPr>
         <w:pStyle w:val="Heading2"/>
       </w:pPr>
-      <w:bookmarkStart w:id="32" w:name="_Toc242212680"/>
+      <w:bookmarkStart w:id="32" w:name="_Toc242216397"/>
       <w:r>
         <w:t>Updating a count</w:t>
       </w:r>
@@ -12684,7 +12711,7 @@
         </w:rPr>
         <w:lastRenderedPageBreak/>
         <w:drawing>
-          <wp:inline distT="0" distB="0" distL="0" distR="0" wp14:anchorId="51552D12" wp14:editId="4BAEECB8">
+          <wp:inline distT="0" distB="0" distL="0" distR="0" wp14:anchorId="7585BC52" wp14:editId="2696795F">
             <wp:extent cx="5120640" cy="3440430"/>
             <wp:effectExtent l="0" t="0" r="0" b="0"/>
             <wp:docPr id="21" name="Picture 21"/>
@@ -12738,7 +12765,7 @@
       <w:pPr>
         <w:pStyle w:val="Heading2"/>
       </w:pPr>
-      <w:bookmarkStart w:id="33" w:name="_Toc242212681"/>
+      <w:bookmarkStart w:id="33" w:name="_Toc242216398"/>
       <w:r>
         <w:t>What changes the count automatically</w:t>
       </w:r>
@@ -13142,7 +13169,7 @@
       <w:pPr>
         <w:pStyle w:val="Heading2"/>
       </w:pPr>
-      <w:bookmarkStart w:id="34" w:name="_Toc242212682"/>
+      <w:bookmarkStart w:id="34" w:name="_Toc242216399"/>
       <w:r>
         <w:t>Seeing the history</w:t>
       </w:r>
@@ -13157,7 +13184,7 @@
       <w:pPr>
         <w:pStyle w:val="Heading2"/>
       </w:pPr>
-      <w:bookmarkStart w:id="35" w:name="_Toc242212683"/>
+      <w:bookmarkStart w:id="35" w:name="_Toc242216400"/>
       <w:r>
         <w:lastRenderedPageBreak/>
         <w:t>Notes for the inventory sheet</w:t>
@@ -13207,7 +13234,7 @@
           <w:noProof/>
         </w:rPr>
         <w:drawing>
-          <wp:inline distT="0" distB="0" distL="0" distR="0" wp14:anchorId="10BC3F3D" wp14:editId="20D2CC52">
+          <wp:inline distT="0" distB="0" distL="0" distR="0" wp14:anchorId="75BAF46B" wp14:editId="203FB4F1">
             <wp:extent cx="5120640" cy="3440430"/>
             <wp:effectExtent l="0" t="0" r="0" b="0"/>
             <wp:docPr id="22" name="Picture 22"/>
@@ -13261,7 +13288,7 @@
       <w:pPr>
         <w:pStyle w:val="Heading2"/>
       </w:pPr>
-      <w:bookmarkStart w:id="36" w:name="_Toc242212684"/>
+      <w:bookmarkStart w:id="36" w:name="_Toc242216401"/>
       <w:r>
         <w:t>Start and end counts</w:t>
       </w:r>
@@ -13785,7 +13812,7 @@
           <w:noProof/>
         </w:rPr>
         <w:drawing>
-          <wp:inline distT="0" distB="0" distL="0" distR="0" wp14:anchorId="51F5325D" wp14:editId="469A0C0D">
+          <wp:inline distT="0" distB="0" distL="0" distR="0" wp14:anchorId="470D55FF" wp14:editId="65A8E64F">
             <wp:extent cx="5486400" cy="3686175"/>
             <wp:effectExtent l="0" t="0" r="0" b="0"/>
             <wp:docPr id="23" name="Picture 23"/>
@@ -13925,7 +13952,7 @@
         <w:pStyle w:val="Heading1"/>
         <w:pageBreakBefore/>
       </w:pPr>
-      <w:bookmarkStart w:id="37" w:name="_Toc242212685"/>
+      <w:bookmarkStart w:id="37" w:name="_Toc242216402"/>
       <w:r>
         <w:lastRenderedPageBreak/>
         <w:t>Admin: setting up an event</w:t>
@@ -13950,7 +13977,7 @@
       <w:pPr>
         <w:pStyle w:val="Heading2"/>
       </w:pPr>
-      <w:bookmarkStart w:id="38" w:name="_Toc242212686"/>
+      <w:bookmarkStart w:id="38" w:name="_Toc242216403"/>
       <w:r>
         <w:t>Creating or editing an event</w:t>
       </w:r>
@@ -13967,7 +13994,7 @@
           <w:noProof/>
         </w:rPr>
         <w:drawing>
-          <wp:inline distT="0" distB="0" distL="0" distR="0" wp14:anchorId="1ECD28A4" wp14:editId="3F9CCDDB">
+          <wp:inline distT="0" distB="0" distL="0" distR="0" wp14:anchorId="1B985A44" wp14:editId="3ECB95F4">
             <wp:extent cx="5760720" cy="1134142"/>
             <wp:effectExtent l="0" t="0" r="0" b="0"/>
             <wp:docPr id="24" name="Picture 24"/>
@@ -14316,7 +14343,7 @@
           <w:noProof/>
         </w:rPr>
         <w:drawing>
-          <wp:inline distT="0" distB="0" distL="0" distR="0" wp14:anchorId="7D921FD3" wp14:editId="69DBD69D">
+          <wp:inline distT="0" distB="0" distL="0" distR="0" wp14:anchorId="234494C6" wp14:editId="190C2F52">
             <wp:extent cx="3840480" cy="2580322"/>
             <wp:effectExtent l="0" t="0" r="0" b="0"/>
             <wp:docPr id="25" name="Picture 25"/>
@@ -14429,7 +14456,7 @@
       <w:pPr>
         <w:pStyle w:val="Heading2"/>
       </w:pPr>
-      <w:bookmarkStart w:id="39" w:name="_Toc242212687"/>
+      <w:bookmarkStart w:id="39" w:name="_Toc242216404"/>
       <w:r>
         <w:t>Closing out an event</w:t>
       </w:r>
@@ -14596,7 +14623,7 @@
       <w:pPr>
         <w:pStyle w:val="Heading2"/>
       </w:pPr>
-      <w:bookmarkStart w:id="40" w:name="_Toc242212688"/>
+      <w:bookmarkStart w:id="40" w:name="_Toc242216405"/>
       <w:r>
         <w:t>Event sales sheets</w:t>
       </w:r>
@@ -14654,7 +14681,7 @@
           <w:noProof/>
         </w:rPr>
         <w:drawing>
-          <wp:inline distT="0" distB="0" distL="0" distR="0" wp14:anchorId="31C533B5" wp14:editId="755D6517">
+          <wp:inline distT="0" distB="0" distL="0" distR="0" wp14:anchorId="038029E5" wp14:editId="66D3E625">
             <wp:extent cx="4389120" cy="2948940"/>
             <wp:effectExtent l="0" t="0" r="0" b="0"/>
             <wp:docPr id="26" name="Picture 26"/>
@@ -14783,7 +14810,7 @@
           <w:noProof/>
         </w:rPr>
         <w:drawing>
-          <wp:inline distT="0" distB="0" distL="0" distR="0" wp14:anchorId="1AFC285B" wp14:editId="56A4EE6B">
+          <wp:inline distT="0" distB="0" distL="0" distR="0" wp14:anchorId="6A30FCDE" wp14:editId="7461D246">
             <wp:extent cx="4206240" cy="5717858"/>
             <wp:effectExtent l="0" t="0" r="0" b="0"/>
             <wp:docPr id="27" name="Picture 27"/>
@@ -14921,7 +14948,7 @@
           <w:noProof/>
         </w:rPr>
         <w:drawing>
-          <wp:inline distT="0" distB="0" distL="0" distR="0" wp14:anchorId="105B6407" wp14:editId="1D191C43">
+          <wp:inline distT="0" distB="0" distL="0" distR="0" wp14:anchorId="67CCAA68" wp14:editId="31B25609">
             <wp:extent cx="4389120" cy="2948940"/>
             <wp:effectExtent l="0" t="0" r="0" b="0"/>
             <wp:docPr id="28" name="Picture 28"/>
@@ -15034,7 +15061,7 @@
         <w:pStyle w:val="Heading1"/>
         <w:pageBreakBefore/>
       </w:pPr>
-      <w:bookmarkStart w:id="41" w:name="_Toc242212689"/>
+      <w:bookmarkStart w:id="41" w:name="_Toc242216406"/>
       <w:r>
         <w:lastRenderedPageBreak/>
         <w:t>Admin: managing the catalog</w:t>
@@ -15138,7 +15165,7 @@
           <w:noProof/>
         </w:rPr>
         <w:drawing>
-          <wp:inline distT="0" distB="0" distL="0" distR="0" wp14:anchorId="675E0743" wp14:editId="1D4975C6">
+          <wp:inline distT="0" distB="0" distL="0" distR="0" wp14:anchorId="219B7395" wp14:editId="63ADEC93">
             <wp:extent cx="5760720" cy="4050506"/>
             <wp:effectExtent l="0" t="0" r="0" b="0"/>
             <wp:docPr id="29" name="Picture 29"/>
@@ -15192,7 +15219,7 @@
       <w:pPr>
         <w:pStyle w:val="Heading2"/>
       </w:pPr>
-      <w:bookmarkStart w:id="42" w:name="_Toc242212690"/>
+      <w:bookmarkStart w:id="42" w:name="_Toc242216407"/>
       <w:r>
         <w:lastRenderedPageBreak/>
         <w:t>Adding or editing a product</w:t>
@@ -15210,7 +15237,7 @@
           <w:noProof/>
         </w:rPr>
         <w:drawing>
-          <wp:inline distT="0" distB="0" distL="0" distR="0" wp14:anchorId="2637FE01" wp14:editId="4D18345E">
+          <wp:inline distT="0" distB="0" distL="0" distR="0" wp14:anchorId="2259AE41" wp14:editId="657EA7D6">
             <wp:extent cx="5486400" cy="3686175"/>
             <wp:effectExtent l="0" t="0" r="0" b="0"/>
             <wp:docPr id="30" name="Picture 30"/>
@@ -15677,7 +15704,7 @@
         </w:rPr>
         <w:lastRenderedPageBreak/>
         <w:drawing>
-          <wp:inline distT="0" distB="0" distL="0" distR="0" wp14:anchorId="349DE958" wp14:editId="290D9DBA">
+          <wp:inline distT="0" distB="0" distL="0" distR="0" wp14:anchorId="46F9ADBC" wp14:editId="738ADBD6">
             <wp:extent cx="5120640" cy="2130933"/>
             <wp:effectExtent l="0" t="0" r="0" b="0"/>
             <wp:docPr id="31" name="Picture 31"/>
@@ -15858,7 +15885,7 @@
           <w:noProof/>
         </w:rPr>
         <w:drawing>
-          <wp:inline distT="0" distB="0" distL="0" distR="0" wp14:anchorId="0A68AA5C" wp14:editId="6C5C5154">
+          <wp:inline distT="0" distB="0" distL="0" distR="0" wp14:anchorId="31209914" wp14:editId="4A9D6351">
             <wp:extent cx="5486400" cy="3686175"/>
             <wp:effectExtent l="0" t="0" r="0" b="0"/>
             <wp:docPr id="32" name="Picture 32"/>
@@ -16060,7 +16087,7 @@
           <w:noProof/>
         </w:rPr>
         <w:drawing>
-          <wp:inline distT="0" distB="0" distL="0" distR="0" wp14:anchorId="2CA8EF6A" wp14:editId="67F57E90">
+          <wp:inline distT="0" distB="0" distL="0" distR="0" wp14:anchorId="12F7E61B" wp14:editId="4B435ED1">
             <wp:extent cx="5486400" cy="3686175"/>
             <wp:effectExtent l="0" t="0" r="0" b="0"/>
             <wp:docPr id="33" name="Picture 33"/>
@@ -16308,7 +16335,7 @@
       <w:pPr>
         <w:pStyle w:val="Heading2"/>
       </w:pPr>
-      <w:bookmarkStart w:id="43" w:name="_Toc242212691"/>
+      <w:bookmarkStart w:id="43" w:name="_Toc242216408"/>
       <w:r>
         <w:t>Delivery and services</w:t>
       </w:r>
@@ -16339,7 +16366,7 @@
           <w:noProof/>
         </w:rPr>
         <w:drawing>
-          <wp:inline distT="0" distB="0" distL="0" distR="0" wp14:anchorId="500537F9" wp14:editId="7341273E">
+          <wp:inline distT="0" distB="0" distL="0" distR="0" wp14:anchorId="72995CED" wp14:editId="008EEA9C">
             <wp:extent cx="5760720" cy="3870484"/>
             <wp:effectExtent l="0" t="0" r="0" b="0"/>
             <wp:docPr id="34" name="Picture 34"/>
@@ -16860,7 +16887,7 @@
           <w:noProof/>
         </w:rPr>
         <w:drawing>
-          <wp:inline distT="0" distB="0" distL="0" distR="0" wp14:anchorId="258B62EC" wp14:editId="6F5EB2B3">
+          <wp:inline distT="0" distB="0" distL="0" distR="0" wp14:anchorId="05CB158D" wp14:editId="5B068283">
             <wp:extent cx="4206240" cy="4534852"/>
             <wp:effectExtent l="0" t="0" r="0" b="0"/>
             <wp:docPr id="35" name="Picture 35"/>
@@ -16972,7 +16999,7 @@
         </w:rPr>
         <w:lastRenderedPageBreak/>
         <w:drawing>
-          <wp:inline distT="0" distB="0" distL="0" distR="0" wp14:anchorId="1EFA7B5C" wp14:editId="0A5B357E">
+          <wp:inline distT="0" distB="0" distL="0" distR="0" wp14:anchorId="23C9BB15" wp14:editId="0D1AE6E7">
             <wp:extent cx="5120640" cy="3829050"/>
             <wp:effectExtent l="0" t="0" r="0" b="0"/>
             <wp:docPr id="36" name="Picture 36"/>
@@ -17027,7 +17054,7 @@
         <w:pStyle w:val="Heading1"/>
         <w:pageBreakBefore/>
       </w:pPr>
-      <w:bookmarkStart w:id="44" w:name="_Toc242212692"/>
+      <w:bookmarkStart w:id="44" w:name="_Toc242216409"/>
       <w:r>
         <w:lastRenderedPageBreak/>
         <w:t>Admin: managing the crew</w:t>
@@ -17059,7 +17086,7 @@
           <w:noProof/>
         </w:rPr>
         <w:drawing>
-          <wp:inline distT="0" distB="0" distL="0" distR="0" wp14:anchorId="681FD7AC" wp14:editId="28A1C477">
+          <wp:inline distT="0" distB="0" distL="0" distR="0" wp14:anchorId="5C18F053" wp14:editId="43C89A23">
             <wp:extent cx="5760720" cy="1854232"/>
             <wp:effectExtent l="0" t="0" r="0" b="0"/>
             <wp:docPr id="37" name="Picture 37"/>
@@ -17331,7 +17358,7 @@
           <w:noProof/>
         </w:rPr>
         <w:drawing>
-          <wp:inline distT="0" distB="0" distL="0" distR="0" wp14:anchorId="60FAE10B" wp14:editId="13985EB5">
+          <wp:inline distT="0" distB="0" distL="0" distR="0" wp14:anchorId="01CDFF78" wp14:editId="56CE4E66">
             <wp:extent cx="4023360" cy="2703195"/>
             <wp:effectExtent l="0" t="0" r="0" b="0"/>
             <wp:docPr id="38" name="Picture 38"/>
@@ -17391,7 +17418,7 @@
         <w:pStyle w:val="Heading1"/>
         <w:pageBreakBefore/>
       </w:pPr>
-      <w:bookmarkStart w:id="45" w:name="_Toc242212693"/>
+      <w:bookmarkStart w:id="45" w:name="_Toc242216410"/>
       <w:r>
         <w:lastRenderedPageBreak/>
         <w:t>Admin: settings</w:t>
@@ -17461,7 +17488,7 @@
       <w:pPr>
         <w:pStyle w:val="Heading2"/>
       </w:pPr>
-      <w:bookmarkStart w:id="46" w:name="_Toc242212694"/>
+      <w:bookmarkStart w:id="46" w:name="_Toc242216411"/>
       <w:r>
         <w:t>Business details</w:t>
       </w:r>
@@ -17478,7 +17505,7 @@
           <w:noProof/>
         </w:rPr>
         <w:drawing>
-          <wp:inline distT="0" distB="0" distL="0" distR="0" wp14:anchorId="5775F4F5" wp14:editId="6343457A">
+          <wp:inline distT="0" distB="0" distL="0" distR="0" wp14:anchorId="43A2748D" wp14:editId="4A5E195E">
             <wp:extent cx="5760720" cy="1429893"/>
             <wp:effectExtent l="0" t="0" r="0" b="0"/>
             <wp:docPr id="39" name="Picture 39"/>
@@ -17842,7 +17869,7 @@
       <w:pPr>
         <w:pStyle w:val="Heading2"/>
       </w:pPr>
-      <w:bookmarkStart w:id="47" w:name="_Toc242212695"/>
+      <w:bookmarkStart w:id="47" w:name="_Toc242216412"/>
       <w:r>
         <w:t>Sales sheet terms</w:t>
       </w:r>
@@ -17865,7 +17892,7 @@
         </w:rPr>
         <w:lastRenderedPageBreak/>
         <w:drawing>
-          <wp:inline distT="0" distB="0" distL="0" distR="0" wp14:anchorId="26CD376F" wp14:editId="29D45632">
+          <wp:inline distT="0" distB="0" distL="0" distR="0" wp14:anchorId="17000451" wp14:editId="76B250BE">
             <wp:extent cx="5760720" cy="4937760"/>
             <wp:effectExtent l="0" t="0" r="0" b="0"/>
             <wp:docPr id="40" name="Picture 40"/>
@@ -18238,7 +18265,7 @@
       <w:pPr>
         <w:pStyle w:val="Heading2"/>
       </w:pPr>
-      <w:bookmarkStart w:id="48" w:name="_Toc242212696"/>
+      <w:bookmarkStart w:id="48" w:name="_Toc242216413"/>
       <w:r>
         <w:t>Receipt email</w:t>
       </w:r>
@@ -18260,7 +18287,7 @@
           <w:noProof/>
         </w:rPr>
         <w:drawing>
-          <wp:inline distT="0" distB="0" distL="0" distR="0" wp14:anchorId="51FB90D5" wp14:editId="3AF01EF6">
+          <wp:inline distT="0" distB="0" distL="0" distR="0" wp14:anchorId="31D08781" wp14:editId="27EB2AB8">
             <wp:extent cx="5760720" cy="4454271"/>
             <wp:effectExtent l="0" t="0" r="0" b="0"/>
             <wp:docPr id="41" name="Picture 41"/>
@@ -19237,7 +19264,7 @@
       <w:pPr>
         <w:pStyle w:val="Heading2"/>
       </w:pPr>
-      <w:bookmarkStart w:id="49" w:name="_Toc242212697"/>
+      <w:bookmarkStart w:id="49" w:name="_Toc242216414"/>
       <w:r>
         <w:t>New events</w:t>
       </w:r>
@@ -19254,7 +19281,7 @@
           <w:noProof/>
         </w:rPr>
         <w:drawing>
-          <wp:inline distT="0" distB="0" distL="0" distR="0" wp14:anchorId="28E08634" wp14:editId="488953A1">
+          <wp:inline distT="0" distB="0" distL="0" distR="0" wp14:anchorId="03D299EE" wp14:editId="41680512">
             <wp:extent cx="5760720" cy="1512189"/>
             <wp:effectExtent l="0" t="0" r="0" b="0"/>
             <wp:docPr id="42" name="Picture 42"/>
@@ -19332,7 +19359,7 @@
       <w:pPr>
         <w:pStyle w:val="Heading2"/>
       </w:pPr>
-      <w:bookmarkStart w:id="50" w:name="_Toc242212698"/>
+      <w:bookmarkStart w:id="50" w:name="_Toc242216415"/>
       <w:r>
         <w:t>Dashboard</w:t>
       </w:r>
@@ -19349,7 +19376,7 @@
           <w:noProof/>
         </w:rPr>
         <w:drawing>
-          <wp:inline distT="0" distB="0" distL="0" distR="0" wp14:anchorId="575A200D" wp14:editId="378C8763">
+          <wp:inline distT="0" distB="0" distL="0" distR="0" wp14:anchorId="4E975390" wp14:editId="1E6D94DB">
             <wp:extent cx="5760720" cy="1594485"/>
             <wp:effectExtent l="0" t="0" r="0" b="0"/>
             <wp:docPr id="43" name="Picture 43"/>
@@ -19679,7 +19706,7 @@
         <w:pStyle w:val="Heading1"/>
         <w:pageBreakBefore/>
       </w:pPr>
-      <w:bookmarkStart w:id="51" w:name="_Toc242212699"/>
+      <w:bookmarkStart w:id="51" w:name="_Toc242216416"/>
       <w:r>
         <w:lastRenderedPageBreak/>
         <w:t>Tips and troubleshooting</w:t>
@@ -20092,7 +20119,7 @@
         <w:pStyle w:val="Heading1"/>
         <w:pageBreakBefore/>
       </w:pPr>
-      <w:bookmarkStart w:id="52" w:name="_Toc242212700"/>
+      <w:bookmarkStart w:id="52" w:name="_Toc242216417"/>
       <w:r>
         <w:lastRenderedPageBreak/>
         <w:t>Quick reference</w:t>
@@ -20103,7 +20130,7 @@
       <w:pPr>
         <w:pStyle w:val="Heading2"/>
       </w:pPr>
-      <w:bookmarkStart w:id="53" w:name="_Toc242212701"/>
+      <w:bookmarkStart w:id="53" w:name="_Toc242216418"/>
       <w:r>
         <w:t>Sales rep checklist</w:t>
       </w:r>
@@ -20247,7 +20274,7 @@
       <w:pPr>
         <w:pStyle w:val="Heading2"/>
       </w:pPr>
-      <w:bookmarkStart w:id="54" w:name="_Toc242212702"/>
+      <w:bookmarkStart w:id="54" w:name="_Toc242216419"/>
       <w:r>
         <w:t>Checkout checklist</w:t>
       </w:r>
@@ -20435,7 +20462,7 @@
       <w:pPr>
         <w:pStyle w:val="Heading2"/>
       </w:pPr>
-      <w:bookmarkStart w:id="55" w:name="_Toc242212703"/>
+      <w:bookmarkStart w:id="55" w:name="_Toc242216420"/>
       <w:r>
         <w:t>Inventory counts</w:t>
       </w:r>
@@ -20639,7 +20666,7 @@
       <w:pPr>
         <w:pStyle w:val="Heading2"/>
       </w:pPr>
-      <w:bookmarkStart w:id="56" w:name="_Toc242212704"/>
+      <w:bookmarkStart w:id="56" w:name="_Toc242216421"/>
       <w:r>
         <w:t>Order status at a glance</w:t>
       </w:r>
@@ -21259,31 +21286,31 @@
       </w:rPr>
     </w:lvl>
   </w:abstractNum>
-  <w:num w:numId="1" w16cid:durableId="105780899">
+  <w:num w:numId="1" w16cid:durableId="1814057019">
     <w:abstractNumId w:val="8"/>
   </w:num>
-  <w:num w:numId="2" w16cid:durableId="2138793175">
+  <w:num w:numId="2" w16cid:durableId="1124808276">
     <w:abstractNumId w:val="6"/>
   </w:num>
-  <w:num w:numId="3" w16cid:durableId="599147952">
+  <w:num w:numId="3" w16cid:durableId="1426345471">
     <w:abstractNumId w:val="5"/>
   </w:num>
-  <w:num w:numId="4" w16cid:durableId="1577283908">
+  <w:num w:numId="4" w16cid:durableId="1880434500">
     <w:abstractNumId w:val="4"/>
   </w:num>
-  <w:num w:numId="5" w16cid:durableId="7298531">
+  <w:num w:numId="5" w16cid:durableId="1638218290">
     <w:abstractNumId w:val="7"/>
   </w:num>
-  <w:num w:numId="6" w16cid:durableId="717322894">
+  <w:num w:numId="6" w16cid:durableId="2025471542">
     <w:abstractNumId w:val="3"/>
   </w:num>
-  <w:num w:numId="7" w16cid:durableId="313723367">
+  <w:num w:numId="7" w16cid:durableId="1659264578">
     <w:abstractNumId w:val="2"/>
   </w:num>
-  <w:num w:numId="8" w16cid:durableId="1793093204">
+  <w:num w:numId="8" w16cid:durableId="460197279">
     <w:abstractNumId w:val="1"/>
   </w:num>
-  <w:num w:numId="9" w16cid:durableId="450175354">
+  <w:num w:numId="9" w16cid:durableId="1712068940">
     <w:abstractNumId w:val="0"/>
   </w:num>
 </w:numbering>
@@ -32675,7 +32702,7 @@
     <w:autoRedefine/>
     <w:uiPriority w:val="39"/>
     <w:unhideWhenUsed/>
-    <w:rsid w:val="004A5DC3"/>
+    <w:rsid w:val="00E00537"/>
     <w:pPr>
       <w:spacing w:after="100"/>
     </w:pPr>
@@ -32687,7 +32714,7 @@
     <w:autoRedefine/>
     <w:uiPriority w:val="39"/>
     <w:unhideWhenUsed/>
-    <w:rsid w:val="004A5DC3"/>
+    <w:rsid w:val="00E00537"/>
     <w:pPr>
       <w:spacing w:after="100"/>
       <w:ind w:left="220"/>
@@ -32698,7 +32725,7 @@
     <w:basedOn w:val="DefaultParagraphFont"/>
     <w:uiPriority w:val="99"/>
     <w:unhideWhenUsed/>
-    <w:rsid w:val="004A5DC3"/>
+    <w:rsid w:val="00E00537"/>
     <w:rPr>
       <w:color w:val="0000FF" w:themeColor="hyperlink"/>
       <w:u w:val="single"/>

</xml_diff>

<commit_message>
Alternate phone on the customer address form
The Hand tablet to customer form now asks for an optional alternate
phone for both the billing and delivery addresses, matching the Alt. #
on the employee form and the sales sheet.

Co-Authored-By: Claude Opus 5.5 <noreply@anthropic.com>
</commit_message>
<xml_diff>
--- a/Documents/CFS Sales App User Guide.docx
+++ b/Documents/CFS Sales App User Guide.docx
@@ -345,7 +345,7 @@
       <w:r>
         <w:fldChar w:fldCharType="separate"/>
       </w:r>
-      <w:hyperlink w:anchor="_Toc242216365" w:history="1">
+      <w:hyperlink w:anchor="_Toc242297342" w:history="1">
         <w:r>
           <w:rPr>
             <w:rStyle w:val="Hyperlink"/>
@@ -372,7 +372,7 @@
             <w:noProof/>
             <w:webHidden/>
           </w:rPr>
-          <w:instrText xml:space="preserve"> PAGEREF _Toc242216365 \h </w:instrText>
+          <w:instrText xml:space="preserve"> PAGEREF _Toc242297342 \h </w:instrText>
         </w:r>
         <w:r>
           <w:rPr>
@@ -413,7 +413,7 @@
           <w:noProof/>
         </w:rPr>
       </w:pPr>
-      <w:hyperlink w:anchor="_Toc242216366" w:history="1">
+      <w:hyperlink w:anchor="_Toc242297343" w:history="1">
         <w:r>
           <w:rPr>
             <w:rStyle w:val="Hyperlink"/>
@@ -440,7 +440,7 @@
             <w:noProof/>
             <w:webHidden/>
           </w:rPr>
-          <w:instrText xml:space="preserve"> PAGEREF _Toc242216366 \h </w:instrText>
+          <w:instrText xml:space="preserve"> PAGEREF _Toc242297343 \h </w:instrText>
         </w:r>
         <w:r>
           <w:rPr>
@@ -481,7 +481,7 @@
           <w:noProof/>
         </w:rPr>
       </w:pPr>
-      <w:hyperlink w:anchor="_Toc242216367" w:history="1">
+      <w:hyperlink w:anchor="_Toc242297344" w:history="1">
         <w:r>
           <w:rPr>
             <w:rStyle w:val="Hyperlink"/>
@@ -508,7 +508,7 @@
             <w:noProof/>
             <w:webHidden/>
           </w:rPr>
-          <w:instrText xml:space="preserve"> PAGEREF _Toc242216367 \h </w:instrText>
+          <w:instrText xml:space="preserve"> PAGEREF _Toc242297344 \h </w:instrText>
         </w:r>
         <w:r>
           <w:rPr>
@@ -549,7 +549,7 @@
           <w:noProof/>
         </w:rPr>
       </w:pPr>
-      <w:hyperlink w:anchor="_Toc242216368" w:history="1">
+      <w:hyperlink w:anchor="_Toc242297345" w:history="1">
         <w:r>
           <w:rPr>
             <w:rStyle w:val="Hyperlink"/>
@@ -576,7 +576,7 @@
             <w:noProof/>
             <w:webHidden/>
           </w:rPr>
-          <w:instrText xml:space="preserve"> PAGEREF _Toc242216368 \h </w:instrText>
+          <w:instrText xml:space="preserve"> PAGEREF _Toc242297345 \h </w:instrText>
         </w:r>
         <w:r>
           <w:rPr>
@@ -617,7 +617,7 @@
           <w:noProof/>
         </w:rPr>
       </w:pPr>
-      <w:hyperlink w:anchor="_Toc242216369" w:history="1">
+      <w:hyperlink w:anchor="_Toc242297346" w:history="1">
         <w:r>
           <w:rPr>
             <w:rStyle w:val="Hyperlink"/>
@@ -644,7 +644,7 @@
             <w:noProof/>
             <w:webHidden/>
           </w:rPr>
-          <w:instrText xml:space="preserve"> PAGEREF _Toc242216369 \h </w:instrText>
+          <w:instrText xml:space="preserve"> PAGEREF _Toc242297346 \h </w:instrText>
         </w:r>
         <w:r>
           <w:rPr>
@@ -685,7 +685,7 @@
           <w:noProof/>
         </w:rPr>
       </w:pPr>
-      <w:hyperlink w:anchor="_Toc242216370" w:history="1">
+      <w:hyperlink w:anchor="_Toc242297347" w:history="1">
         <w:r>
           <w:rPr>
             <w:rStyle w:val="Hyperlink"/>
@@ -712,7 +712,7 @@
             <w:noProof/>
             <w:webHidden/>
           </w:rPr>
-          <w:instrText xml:space="preserve"> PAGEREF _Toc242216370 \h </w:instrText>
+          <w:instrText xml:space="preserve"> PAGEREF _Toc242297347 \h </w:instrText>
         </w:r>
         <w:r>
           <w:rPr>
@@ -753,7 +753,7 @@
           <w:noProof/>
         </w:rPr>
       </w:pPr>
-      <w:hyperlink w:anchor="_Toc242216371" w:history="1">
+      <w:hyperlink w:anchor="_Toc242297348" w:history="1">
         <w:r>
           <w:rPr>
             <w:rStyle w:val="Hyperlink"/>
@@ -780,7 +780,7 @@
             <w:noProof/>
             <w:webHidden/>
           </w:rPr>
-          <w:instrText xml:space="preserve"> PAGEREF _Toc242216371 \h </w:instrText>
+          <w:instrText xml:space="preserve"> PAGEREF _Toc242297348 \h </w:instrText>
         </w:r>
         <w:r>
           <w:rPr>
@@ -821,7 +821,7 @@
           <w:noProof/>
         </w:rPr>
       </w:pPr>
-      <w:hyperlink w:anchor="_Toc242216372" w:history="1">
+      <w:hyperlink w:anchor="_Toc242297349" w:history="1">
         <w:r>
           <w:rPr>
             <w:rStyle w:val="Hyperlink"/>
@@ -848,7 +848,7 @@
             <w:noProof/>
             <w:webHidden/>
           </w:rPr>
-          <w:instrText xml:space="preserve"> PAGEREF _Toc242216372 \h </w:instrText>
+          <w:instrText xml:space="preserve"> PAGEREF _Toc242297349 \h </w:instrText>
         </w:r>
         <w:r>
           <w:rPr>
@@ -889,7 +889,7 @@
           <w:noProof/>
         </w:rPr>
       </w:pPr>
-      <w:hyperlink w:anchor="_Toc242216373" w:history="1">
+      <w:hyperlink w:anchor="_Toc242297350" w:history="1">
         <w:r>
           <w:rPr>
             <w:rStyle w:val="Hyperlink"/>
@@ -916,7 +916,7 @@
             <w:noProof/>
             <w:webHidden/>
           </w:rPr>
-          <w:instrText xml:space="preserve"> PAGEREF _Toc242216373 \h </w:instrText>
+          <w:instrText xml:space="preserve"> PAGEREF _Toc242297350 \h </w:instrText>
         </w:r>
         <w:r>
           <w:rPr>
@@ -957,7 +957,7 @@
           <w:noProof/>
         </w:rPr>
       </w:pPr>
-      <w:hyperlink w:anchor="_Toc242216374" w:history="1">
+      <w:hyperlink w:anchor="_Toc242297351" w:history="1">
         <w:r>
           <w:rPr>
             <w:rStyle w:val="Hyperlink"/>
@@ -984,7 +984,7 @@
             <w:noProof/>
             <w:webHidden/>
           </w:rPr>
-          <w:instrText xml:space="preserve"> PAGEREF _Toc242216374 \h </w:instrText>
+          <w:instrText xml:space="preserve"> PAGEREF _Toc242297351 \h </w:instrText>
         </w:r>
         <w:r>
           <w:rPr>
@@ -1025,7 +1025,7 @@
           <w:noProof/>
         </w:rPr>
       </w:pPr>
-      <w:hyperlink w:anchor="_Toc242216375" w:history="1">
+      <w:hyperlink w:anchor="_Toc242297352" w:history="1">
         <w:r>
           <w:rPr>
             <w:rStyle w:val="Hyperlink"/>
@@ -1052,7 +1052,7 @@
             <w:noProof/>
             <w:webHidden/>
           </w:rPr>
-          <w:instrText xml:space="preserve"> PAGEREF _Toc242216375 \h </w:instrText>
+          <w:instrText xml:space="preserve"> PAGEREF _Toc242297352 \h </w:instrText>
         </w:r>
         <w:r>
           <w:rPr>
@@ -1093,7 +1093,7 @@
           <w:noProof/>
         </w:rPr>
       </w:pPr>
-      <w:hyperlink w:anchor="_Toc242216376" w:history="1">
+      <w:hyperlink w:anchor="_Toc242297353" w:history="1">
         <w:r>
           <w:rPr>
             <w:rStyle w:val="Hyperlink"/>
@@ -1120,7 +1120,7 @@
             <w:noProof/>
             <w:webHidden/>
           </w:rPr>
-          <w:instrText xml:space="preserve"> PAGEREF _Toc242216376 \h </w:instrText>
+          <w:instrText xml:space="preserve"> PAGEREF _Toc242297353 \h </w:instrText>
         </w:r>
         <w:r>
           <w:rPr>
@@ -1161,7 +1161,7 @@
           <w:noProof/>
         </w:rPr>
       </w:pPr>
-      <w:hyperlink w:anchor="_Toc242216377" w:history="1">
+      <w:hyperlink w:anchor="_Toc242297354" w:history="1">
         <w:r>
           <w:rPr>
             <w:rStyle w:val="Hyperlink"/>
@@ -1188,7 +1188,7 @@
             <w:noProof/>
             <w:webHidden/>
           </w:rPr>
-          <w:instrText xml:space="preserve"> PAGEREF _Toc242216377 \h </w:instrText>
+          <w:instrText xml:space="preserve"> PAGEREF _Toc242297354 \h </w:instrText>
         </w:r>
         <w:r>
           <w:rPr>
@@ -1229,7 +1229,7 @@
           <w:noProof/>
         </w:rPr>
       </w:pPr>
-      <w:hyperlink w:anchor="_Toc242216378" w:history="1">
+      <w:hyperlink w:anchor="_Toc242297355" w:history="1">
         <w:r>
           <w:rPr>
             <w:rStyle w:val="Hyperlink"/>
@@ -1256,7 +1256,7 @@
             <w:noProof/>
             <w:webHidden/>
           </w:rPr>
-          <w:instrText xml:space="preserve"> PAGEREF _Toc242216378 \h </w:instrText>
+          <w:instrText xml:space="preserve"> PAGEREF _Toc242297355 \h </w:instrText>
         </w:r>
         <w:r>
           <w:rPr>
@@ -1297,7 +1297,7 @@
           <w:noProof/>
         </w:rPr>
       </w:pPr>
-      <w:hyperlink w:anchor="_Toc242216379" w:history="1">
+      <w:hyperlink w:anchor="_Toc242297356" w:history="1">
         <w:r>
           <w:rPr>
             <w:rStyle w:val="Hyperlink"/>
@@ -1324,7 +1324,7 @@
             <w:noProof/>
             <w:webHidden/>
           </w:rPr>
-          <w:instrText xml:space="preserve"> PAGEREF _Toc242216379 \h </w:instrText>
+          <w:instrText xml:space="preserve"> PAGEREF _Toc242297356 \h </w:instrText>
         </w:r>
         <w:r>
           <w:rPr>
@@ -1365,7 +1365,7 @@
           <w:noProof/>
         </w:rPr>
       </w:pPr>
-      <w:hyperlink w:anchor="_Toc242216380" w:history="1">
+      <w:hyperlink w:anchor="_Toc242297357" w:history="1">
         <w:r>
           <w:rPr>
             <w:rStyle w:val="Hyperlink"/>
@@ -1392,7 +1392,7 @@
             <w:noProof/>
             <w:webHidden/>
           </w:rPr>
-          <w:instrText xml:space="preserve"> PAGEREF _Toc242216380 \h </w:instrText>
+          <w:instrText xml:space="preserve"> PAGEREF _Toc242297357 \h </w:instrText>
         </w:r>
         <w:r>
           <w:rPr>
@@ -1433,7 +1433,7 @@
           <w:noProof/>
         </w:rPr>
       </w:pPr>
-      <w:hyperlink w:anchor="_Toc242216381" w:history="1">
+      <w:hyperlink w:anchor="_Toc242297358" w:history="1">
         <w:r>
           <w:rPr>
             <w:rStyle w:val="Hyperlink"/>
@@ -1460,7 +1460,7 @@
             <w:noProof/>
             <w:webHidden/>
           </w:rPr>
-          <w:instrText xml:space="preserve"> PAGEREF _Toc242216381 \h </w:instrText>
+          <w:instrText xml:space="preserve"> PAGEREF _Toc242297358 \h </w:instrText>
         </w:r>
         <w:r>
           <w:rPr>
@@ -1501,7 +1501,7 @@
           <w:noProof/>
         </w:rPr>
       </w:pPr>
-      <w:hyperlink w:anchor="_Toc242216382" w:history="1">
+      <w:hyperlink w:anchor="_Toc242297359" w:history="1">
         <w:r>
           <w:rPr>
             <w:rStyle w:val="Hyperlink"/>
@@ -1528,7 +1528,7 @@
             <w:noProof/>
             <w:webHidden/>
           </w:rPr>
-          <w:instrText xml:space="preserve"> PAGEREF _Toc242216382 \h </w:instrText>
+          <w:instrText xml:space="preserve"> PAGEREF _Toc242297359 \h </w:instrText>
         </w:r>
         <w:r>
           <w:rPr>
@@ -1569,7 +1569,7 @@
           <w:noProof/>
         </w:rPr>
       </w:pPr>
-      <w:hyperlink w:anchor="_Toc242216383" w:history="1">
+      <w:hyperlink w:anchor="_Toc242297360" w:history="1">
         <w:r>
           <w:rPr>
             <w:rStyle w:val="Hyperlink"/>
@@ -1596,7 +1596,7 @@
             <w:noProof/>
             <w:webHidden/>
           </w:rPr>
-          <w:instrText xml:space="preserve"> PAGEREF _Toc242216383 \h </w:instrText>
+          <w:instrText xml:space="preserve"> PAGEREF _Toc242297360 \h </w:instrText>
         </w:r>
         <w:r>
           <w:rPr>
@@ -1637,7 +1637,7 @@
           <w:noProof/>
         </w:rPr>
       </w:pPr>
-      <w:hyperlink w:anchor="_Toc242216384" w:history="1">
+      <w:hyperlink w:anchor="_Toc242297361" w:history="1">
         <w:r>
           <w:rPr>
             <w:rStyle w:val="Hyperlink"/>
@@ -1664,7 +1664,7 @@
             <w:noProof/>
             <w:webHidden/>
           </w:rPr>
-          <w:instrText xml:space="preserve"> PAGEREF _Toc242216384 \h </w:instrText>
+          <w:instrText xml:space="preserve"> PAGEREF _Toc242297361 \h </w:instrText>
         </w:r>
         <w:r>
           <w:rPr>
@@ -1705,7 +1705,7 @@
           <w:noProof/>
         </w:rPr>
       </w:pPr>
-      <w:hyperlink w:anchor="_Toc242216385" w:history="1">
+      <w:hyperlink w:anchor="_Toc242297362" w:history="1">
         <w:r>
           <w:rPr>
             <w:rStyle w:val="Hyperlink"/>
@@ -1732,7 +1732,7 @@
             <w:noProof/>
             <w:webHidden/>
           </w:rPr>
-          <w:instrText xml:space="preserve"> PAGEREF _Toc242216385 \h </w:instrText>
+          <w:instrText xml:space="preserve"> PAGEREF _Toc242297362 \h </w:instrText>
         </w:r>
         <w:r>
           <w:rPr>
@@ -1773,7 +1773,7 @@
           <w:noProof/>
         </w:rPr>
       </w:pPr>
-      <w:hyperlink w:anchor="_Toc242216386" w:history="1">
+      <w:hyperlink w:anchor="_Toc242297363" w:history="1">
         <w:r>
           <w:rPr>
             <w:rStyle w:val="Hyperlink"/>
@@ -1800,7 +1800,7 @@
             <w:noProof/>
             <w:webHidden/>
           </w:rPr>
-          <w:instrText xml:space="preserve"> PAGEREF _Toc242216386 \h </w:instrText>
+          <w:instrText xml:space="preserve"> PAGEREF _Toc242297363 \h </w:instrText>
         </w:r>
         <w:r>
           <w:rPr>
@@ -1841,7 +1841,7 @@
           <w:noProof/>
         </w:rPr>
       </w:pPr>
-      <w:hyperlink w:anchor="_Toc242216387" w:history="1">
+      <w:hyperlink w:anchor="_Toc242297364" w:history="1">
         <w:r>
           <w:rPr>
             <w:rStyle w:val="Hyperlink"/>
@@ -1868,7 +1868,7 @@
             <w:noProof/>
             <w:webHidden/>
           </w:rPr>
-          <w:instrText xml:space="preserve"> PAGEREF _Toc242216387 \h </w:instrText>
+          <w:instrText xml:space="preserve"> PAGEREF _Toc242297364 \h </w:instrText>
         </w:r>
         <w:r>
           <w:rPr>
@@ -1909,7 +1909,7 @@
           <w:noProof/>
         </w:rPr>
       </w:pPr>
-      <w:hyperlink w:anchor="_Toc242216388" w:history="1">
+      <w:hyperlink w:anchor="_Toc242297365" w:history="1">
         <w:r>
           <w:rPr>
             <w:rStyle w:val="Hyperlink"/>
@@ -1936,7 +1936,7 @@
             <w:noProof/>
             <w:webHidden/>
           </w:rPr>
-          <w:instrText xml:space="preserve"> PAGEREF _Toc242216388 \h </w:instrText>
+          <w:instrText xml:space="preserve"> PAGEREF _Toc242297365 \h </w:instrText>
         </w:r>
         <w:r>
           <w:rPr>
@@ -1977,7 +1977,7 @@
           <w:noProof/>
         </w:rPr>
       </w:pPr>
-      <w:hyperlink w:anchor="_Toc242216389" w:history="1">
+      <w:hyperlink w:anchor="_Toc242297366" w:history="1">
         <w:r>
           <w:rPr>
             <w:rStyle w:val="Hyperlink"/>
@@ -2004,7 +2004,7 @@
             <w:noProof/>
             <w:webHidden/>
           </w:rPr>
-          <w:instrText xml:space="preserve"> PAGEREF _Toc242216389 \h </w:instrText>
+          <w:instrText xml:space="preserve"> PAGEREF _Toc242297366 \h </w:instrText>
         </w:r>
         <w:r>
           <w:rPr>
@@ -2045,7 +2045,7 @@
           <w:noProof/>
         </w:rPr>
       </w:pPr>
-      <w:hyperlink w:anchor="_Toc242216390" w:history="1">
+      <w:hyperlink w:anchor="_Toc242297367" w:history="1">
         <w:r>
           <w:rPr>
             <w:rStyle w:val="Hyperlink"/>
@@ -2072,7 +2072,7 @@
             <w:noProof/>
             <w:webHidden/>
           </w:rPr>
-          <w:instrText xml:space="preserve"> PAGEREF _Toc242216390 \h </w:instrText>
+          <w:instrText xml:space="preserve"> PAGEREF _Toc242297367 \h </w:instrText>
         </w:r>
         <w:r>
           <w:rPr>
@@ -2113,7 +2113,7 @@
           <w:noProof/>
         </w:rPr>
       </w:pPr>
-      <w:hyperlink w:anchor="_Toc242216391" w:history="1">
+      <w:hyperlink w:anchor="_Toc242297368" w:history="1">
         <w:r>
           <w:rPr>
             <w:rStyle w:val="Hyperlink"/>
@@ -2140,7 +2140,7 @@
             <w:noProof/>
             <w:webHidden/>
           </w:rPr>
-          <w:instrText xml:space="preserve"> PAGEREF _Toc242216391 \h </w:instrText>
+          <w:instrText xml:space="preserve"> PAGEREF _Toc242297368 \h </w:instrText>
         </w:r>
         <w:r>
           <w:rPr>
@@ -2181,7 +2181,7 @@
           <w:noProof/>
         </w:rPr>
       </w:pPr>
-      <w:hyperlink w:anchor="_Toc242216392" w:history="1">
+      <w:hyperlink w:anchor="_Toc242297369" w:history="1">
         <w:r>
           <w:rPr>
             <w:rStyle w:val="Hyperlink"/>
@@ -2208,7 +2208,7 @@
             <w:noProof/>
             <w:webHidden/>
           </w:rPr>
-          <w:instrText xml:space="preserve"> PAGEREF _Toc242216392 \h </w:instrText>
+          <w:instrText xml:space="preserve"> PAGEREF _Toc242297369 \h </w:instrText>
         </w:r>
         <w:r>
           <w:rPr>
@@ -2249,7 +2249,7 @@
           <w:noProof/>
         </w:rPr>
       </w:pPr>
-      <w:hyperlink w:anchor="_Toc242216393" w:history="1">
+      <w:hyperlink w:anchor="_Toc242297370" w:history="1">
         <w:r>
           <w:rPr>
             <w:rStyle w:val="Hyperlink"/>
@@ -2276,7 +2276,7 @@
             <w:noProof/>
             <w:webHidden/>
           </w:rPr>
-          <w:instrText xml:space="preserve"> PAGEREF _Toc242216393 \h </w:instrText>
+          <w:instrText xml:space="preserve"> PAGEREF _Toc242297370 \h </w:instrText>
         </w:r>
         <w:r>
           <w:rPr>
@@ -2317,7 +2317,7 @@
           <w:noProof/>
         </w:rPr>
       </w:pPr>
-      <w:hyperlink w:anchor="_Toc242216394" w:history="1">
+      <w:hyperlink w:anchor="_Toc242297371" w:history="1">
         <w:r>
           <w:rPr>
             <w:rStyle w:val="Hyperlink"/>
@@ -2344,7 +2344,7 @@
             <w:noProof/>
             <w:webHidden/>
           </w:rPr>
-          <w:instrText xml:space="preserve"> PAGEREF _Toc242216394 \h </w:instrText>
+          <w:instrText xml:space="preserve"> PAGEREF _Toc242297371 \h </w:instrText>
         </w:r>
         <w:r>
           <w:rPr>
@@ -2385,7 +2385,7 @@
           <w:noProof/>
         </w:rPr>
       </w:pPr>
-      <w:hyperlink w:anchor="_Toc242216395" w:history="1">
+      <w:hyperlink w:anchor="_Toc242297372" w:history="1">
         <w:r>
           <w:rPr>
             <w:rStyle w:val="Hyperlink"/>
@@ -2412,7 +2412,7 @@
             <w:noProof/>
             <w:webHidden/>
           </w:rPr>
-          <w:instrText xml:space="preserve"> PAGEREF _Toc242216395 \h </w:instrText>
+          <w:instrText xml:space="preserve"> PAGEREF _Toc242297372 \h </w:instrText>
         </w:r>
         <w:r>
           <w:rPr>
@@ -2453,7 +2453,7 @@
           <w:noProof/>
         </w:rPr>
       </w:pPr>
-      <w:hyperlink w:anchor="_Toc242216396" w:history="1">
+      <w:hyperlink w:anchor="_Toc242297373" w:history="1">
         <w:r>
           <w:rPr>
             <w:rStyle w:val="Hyperlink"/>
@@ -2480,7 +2480,7 @@
             <w:noProof/>
             <w:webHidden/>
           </w:rPr>
-          <w:instrText xml:space="preserve"> PAGEREF _Toc242216396 \h </w:instrText>
+          <w:instrText xml:space="preserve"> PAGEREF _Toc242297373 \h </w:instrText>
         </w:r>
         <w:r>
           <w:rPr>
@@ -2521,7 +2521,7 @@
           <w:noProof/>
         </w:rPr>
       </w:pPr>
-      <w:hyperlink w:anchor="_Toc242216397" w:history="1">
+      <w:hyperlink w:anchor="_Toc242297374" w:history="1">
         <w:r>
           <w:rPr>
             <w:rStyle w:val="Hyperlink"/>
@@ -2548,7 +2548,7 @@
             <w:noProof/>
             <w:webHidden/>
           </w:rPr>
-          <w:instrText xml:space="preserve"> PAGEREF _Toc242216397 \h </w:instrText>
+          <w:instrText xml:space="preserve"> PAGEREF _Toc242297374 \h </w:instrText>
         </w:r>
         <w:r>
           <w:rPr>
@@ -2589,7 +2589,7 @@
           <w:noProof/>
         </w:rPr>
       </w:pPr>
-      <w:hyperlink w:anchor="_Toc242216398" w:history="1">
+      <w:hyperlink w:anchor="_Toc242297375" w:history="1">
         <w:r>
           <w:rPr>
             <w:rStyle w:val="Hyperlink"/>
@@ -2616,7 +2616,7 @@
             <w:noProof/>
             <w:webHidden/>
           </w:rPr>
-          <w:instrText xml:space="preserve"> PAGEREF _Toc242216398 \h </w:instrText>
+          <w:instrText xml:space="preserve"> PAGEREF _Toc242297375 \h </w:instrText>
         </w:r>
         <w:r>
           <w:rPr>
@@ -2657,7 +2657,7 @@
           <w:noProof/>
         </w:rPr>
       </w:pPr>
-      <w:hyperlink w:anchor="_Toc242216399" w:history="1">
+      <w:hyperlink w:anchor="_Toc242297376" w:history="1">
         <w:r>
           <w:rPr>
             <w:rStyle w:val="Hyperlink"/>
@@ -2684,7 +2684,7 @@
             <w:noProof/>
             <w:webHidden/>
           </w:rPr>
-          <w:instrText xml:space="preserve"> PAGEREF _Toc242216399 \h </w:instrText>
+          <w:instrText xml:space="preserve"> PAGEREF _Toc242297376 \h </w:instrText>
         </w:r>
         <w:r>
           <w:rPr>
@@ -2725,7 +2725,7 @@
           <w:noProof/>
         </w:rPr>
       </w:pPr>
-      <w:hyperlink w:anchor="_Toc242216400" w:history="1">
+      <w:hyperlink w:anchor="_Toc242297377" w:history="1">
         <w:r>
           <w:rPr>
             <w:rStyle w:val="Hyperlink"/>
@@ -2752,7 +2752,7 @@
             <w:noProof/>
             <w:webHidden/>
           </w:rPr>
-          <w:instrText xml:space="preserve"> PAGEREF _Toc242216400 \h </w:instrText>
+          <w:instrText xml:space="preserve"> PAGEREF _Toc242297377 \h </w:instrText>
         </w:r>
         <w:r>
           <w:rPr>
@@ -2793,7 +2793,7 @@
           <w:noProof/>
         </w:rPr>
       </w:pPr>
-      <w:hyperlink w:anchor="_Toc242216401" w:history="1">
+      <w:hyperlink w:anchor="_Toc242297378" w:history="1">
         <w:r>
           <w:rPr>
             <w:rStyle w:val="Hyperlink"/>
@@ -2820,7 +2820,7 @@
             <w:noProof/>
             <w:webHidden/>
           </w:rPr>
-          <w:instrText xml:space="preserve"> PAGEREF _Toc242216401 \h </w:instrText>
+          <w:instrText xml:space="preserve"> PAGEREF _Toc242297378 \h </w:instrText>
         </w:r>
         <w:r>
           <w:rPr>
@@ -2861,7 +2861,7 @@
           <w:noProof/>
         </w:rPr>
       </w:pPr>
-      <w:hyperlink w:anchor="_Toc242216402" w:history="1">
+      <w:hyperlink w:anchor="_Toc242297379" w:history="1">
         <w:r>
           <w:rPr>
             <w:rStyle w:val="Hyperlink"/>
@@ -2888,7 +2888,7 @@
             <w:noProof/>
             <w:webHidden/>
           </w:rPr>
-          <w:instrText xml:space="preserve"> PAGEREF _Toc242216402 \h </w:instrText>
+          <w:instrText xml:space="preserve"> PAGEREF _Toc242297379 \h </w:instrText>
         </w:r>
         <w:r>
           <w:rPr>
@@ -2929,7 +2929,7 @@
           <w:noProof/>
         </w:rPr>
       </w:pPr>
-      <w:hyperlink w:anchor="_Toc242216403" w:history="1">
+      <w:hyperlink w:anchor="_Toc242297380" w:history="1">
         <w:r>
           <w:rPr>
             <w:rStyle w:val="Hyperlink"/>
@@ -2956,7 +2956,7 @@
             <w:noProof/>
             <w:webHidden/>
           </w:rPr>
-          <w:instrText xml:space="preserve"> PAGEREF _Toc242216403 \h </w:instrText>
+          <w:instrText xml:space="preserve"> PAGEREF _Toc242297380 \h </w:instrText>
         </w:r>
         <w:r>
           <w:rPr>
@@ -2997,7 +2997,7 @@
           <w:noProof/>
         </w:rPr>
       </w:pPr>
-      <w:hyperlink w:anchor="_Toc242216404" w:history="1">
+      <w:hyperlink w:anchor="_Toc242297381" w:history="1">
         <w:r>
           <w:rPr>
             <w:rStyle w:val="Hyperlink"/>
@@ -3024,7 +3024,7 @@
             <w:noProof/>
             <w:webHidden/>
           </w:rPr>
-          <w:instrText xml:space="preserve"> PAGEREF _Toc242216404 \h </w:instrText>
+          <w:instrText xml:space="preserve"> PAGEREF _Toc242297381 \h </w:instrText>
         </w:r>
         <w:r>
           <w:rPr>
@@ -3065,7 +3065,7 @@
           <w:noProof/>
         </w:rPr>
       </w:pPr>
-      <w:hyperlink w:anchor="_Toc242216405" w:history="1">
+      <w:hyperlink w:anchor="_Toc242297382" w:history="1">
         <w:r>
           <w:rPr>
             <w:rStyle w:val="Hyperlink"/>
@@ -3092,7 +3092,7 @@
             <w:noProof/>
             <w:webHidden/>
           </w:rPr>
-          <w:instrText xml:space="preserve"> PAGEREF _Toc242216405 \h </w:instrText>
+          <w:instrText xml:space="preserve"> PAGEREF _Toc242297382 \h </w:instrText>
         </w:r>
         <w:r>
           <w:rPr>
@@ -3133,7 +3133,7 @@
           <w:noProof/>
         </w:rPr>
       </w:pPr>
-      <w:hyperlink w:anchor="_Toc242216406" w:history="1">
+      <w:hyperlink w:anchor="_Toc242297383" w:history="1">
         <w:r>
           <w:rPr>
             <w:rStyle w:val="Hyperlink"/>
@@ -3160,7 +3160,7 @@
             <w:noProof/>
             <w:webHidden/>
           </w:rPr>
-          <w:instrText xml:space="preserve"> PAGEREF _Toc242216406 \h </w:instrText>
+          <w:instrText xml:space="preserve"> PAGEREF _Toc242297383 \h </w:instrText>
         </w:r>
         <w:r>
           <w:rPr>
@@ -3201,7 +3201,7 @@
           <w:noProof/>
         </w:rPr>
       </w:pPr>
-      <w:hyperlink w:anchor="_Toc242216407" w:history="1">
+      <w:hyperlink w:anchor="_Toc242297384" w:history="1">
         <w:r>
           <w:rPr>
             <w:rStyle w:val="Hyperlink"/>
@@ -3228,7 +3228,7 @@
             <w:noProof/>
             <w:webHidden/>
           </w:rPr>
-          <w:instrText xml:space="preserve"> PAGEREF _Toc242216407 \h </w:instrText>
+          <w:instrText xml:space="preserve"> PAGEREF _Toc242297384 \h </w:instrText>
         </w:r>
         <w:r>
           <w:rPr>
@@ -3269,7 +3269,7 @@
           <w:noProof/>
         </w:rPr>
       </w:pPr>
-      <w:hyperlink w:anchor="_Toc242216408" w:history="1">
+      <w:hyperlink w:anchor="_Toc242297385" w:history="1">
         <w:r>
           <w:rPr>
             <w:rStyle w:val="Hyperlink"/>
@@ -3296,7 +3296,7 @@
             <w:noProof/>
             <w:webHidden/>
           </w:rPr>
-          <w:instrText xml:space="preserve"> PAGEREF _Toc242216408 \h </w:instrText>
+          <w:instrText xml:space="preserve"> PAGEREF _Toc242297385 \h </w:instrText>
         </w:r>
         <w:r>
           <w:rPr>
@@ -3337,7 +3337,7 @@
           <w:noProof/>
         </w:rPr>
       </w:pPr>
-      <w:hyperlink w:anchor="_Toc242216409" w:history="1">
+      <w:hyperlink w:anchor="_Toc242297386" w:history="1">
         <w:r>
           <w:rPr>
             <w:rStyle w:val="Hyperlink"/>
@@ -3364,7 +3364,7 @@
             <w:noProof/>
             <w:webHidden/>
           </w:rPr>
-          <w:instrText xml:space="preserve"> PAGEREF _Toc242216409 \h </w:instrText>
+          <w:instrText xml:space="preserve"> PAGEREF _Toc242297386 \h </w:instrText>
         </w:r>
         <w:r>
           <w:rPr>
@@ -3405,7 +3405,7 @@
           <w:noProof/>
         </w:rPr>
       </w:pPr>
-      <w:hyperlink w:anchor="_Toc242216410" w:history="1">
+      <w:hyperlink w:anchor="_Toc242297387" w:history="1">
         <w:r>
           <w:rPr>
             <w:rStyle w:val="Hyperlink"/>
@@ -3432,7 +3432,7 @@
             <w:noProof/>
             <w:webHidden/>
           </w:rPr>
-          <w:instrText xml:space="preserve"> PAGEREF _Toc242216410 \h </w:instrText>
+          <w:instrText xml:space="preserve"> PAGEREF _Toc242297387 \h </w:instrText>
         </w:r>
         <w:r>
           <w:rPr>
@@ -3473,7 +3473,7 @@
           <w:noProof/>
         </w:rPr>
       </w:pPr>
-      <w:hyperlink w:anchor="_Toc242216411" w:history="1">
+      <w:hyperlink w:anchor="_Toc242297388" w:history="1">
         <w:r>
           <w:rPr>
             <w:rStyle w:val="Hyperlink"/>
@@ -3500,7 +3500,7 @@
             <w:noProof/>
             <w:webHidden/>
           </w:rPr>
-          <w:instrText xml:space="preserve"> PAGEREF _Toc242216411 \h </w:instrText>
+          <w:instrText xml:space="preserve"> PAGEREF _Toc242297388 \h </w:instrText>
         </w:r>
         <w:r>
           <w:rPr>
@@ -3541,7 +3541,7 @@
           <w:noProof/>
         </w:rPr>
       </w:pPr>
-      <w:hyperlink w:anchor="_Toc242216412" w:history="1">
+      <w:hyperlink w:anchor="_Toc242297389" w:history="1">
         <w:r>
           <w:rPr>
             <w:rStyle w:val="Hyperlink"/>
@@ -3568,7 +3568,7 @@
             <w:noProof/>
             <w:webHidden/>
           </w:rPr>
-          <w:instrText xml:space="preserve"> PAGEREF _Toc242216412 \h </w:instrText>
+          <w:instrText xml:space="preserve"> PAGEREF _Toc242297389 \h </w:instrText>
         </w:r>
         <w:r>
           <w:rPr>
@@ -3609,7 +3609,7 @@
           <w:noProof/>
         </w:rPr>
       </w:pPr>
-      <w:hyperlink w:anchor="_Toc242216413" w:history="1">
+      <w:hyperlink w:anchor="_Toc242297390" w:history="1">
         <w:r>
           <w:rPr>
             <w:rStyle w:val="Hyperlink"/>
@@ -3636,7 +3636,7 @@
             <w:noProof/>
             <w:webHidden/>
           </w:rPr>
-          <w:instrText xml:space="preserve"> PAGEREF _Toc242216413 \h </w:instrText>
+          <w:instrText xml:space="preserve"> PAGEREF _Toc242297390 \h </w:instrText>
         </w:r>
         <w:r>
           <w:rPr>
@@ -3677,7 +3677,7 @@
           <w:noProof/>
         </w:rPr>
       </w:pPr>
-      <w:hyperlink w:anchor="_Toc242216414" w:history="1">
+      <w:hyperlink w:anchor="_Toc242297391" w:history="1">
         <w:r>
           <w:rPr>
             <w:rStyle w:val="Hyperlink"/>
@@ -3704,7 +3704,7 @@
             <w:noProof/>
             <w:webHidden/>
           </w:rPr>
-          <w:instrText xml:space="preserve"> PAGEREF _Toc242216414 \h </w:instrText>
+          <w:instrText xml:space="preserve"> PAGEREF _Toc242297391 \h </w:instrText>
         </w:r>
         <w:r>
           <w:rPr>
@@ -3745,7 +3745,7 @@
           <w:noProof/>
         </w:rPr>
       </w:pPr>
-      <w:hyperlink w:anchor="_Toc242216415" w:history="1">
+      <w:hyperlink w:anchor="_Toc242297392" w:history="1">
         <w:r>
           <w:rPr>
             <w:rStyle w:val="Hyperlink"/>
@@ -3772,7 +3772,7 @@
             <w:noProof/>
             <w:webHidden/>
           </w:rPr>
-          <w:instrText xml:space="preserve"> PAGEREF _Toc242216415 \h </w:instrText>
+          <w:instrText xml:space="preserve"> PAGEREF _Toc242297392 \h </w:instrText>
         </w:r>
         <w:r>
           <w:rPr>
@@ -3813,7 +3813,7 @@
           <w:noProof/>
         </w:rPr>
       </w:pPr>
-      <w:hyperlink w:anchor="_Toc242216416" w:history="1">
+      <w:hyperlink w:anchor="_Toc242297393" w:history="1">
         <w:r>
           <w:rPr>
             <w:rStyle w:val="Hyperlink"/>
@@ -3840,7 +3840,7 @@
             <w:noProof/>
             <w:webHidden/>
           </w:rPr>
-          <w:instrText xml:space="preserve"> PAGEREF _Toc242216416 \h </w:instrText>
+          <w:instrText xml:space="preserve"> PAGEREF _Toc242297393 \h </w:instrText>
         </w:r>
         <w:r>
           <w:rPr>
@@ -3881,7 +3881,7 @@
           <w:noProof/>
         </w:rPr>
       </w:pPr>
-      <w:hyperlink w:anchor="_Toc242216417" w:history="1">
+      <w:hyperlink w:anchor="_Toc242297394" w:history="1">
         <w:r>
           <w:rPr>
             <w:rStyle w:val="Hyperlink"/>
@@ -3908,7 +3908,7 @@
             <w:noProof/>
             <w:webHidden/>
           </w:rPr>
-          <w:instrText xml:space="preserve"> PAGEREF _Toc242216417 \h </w:instrText>
+          <w:instrText xml:space="preserve"> PAGEREF _Toc242297394 \h </w:instrText>
         </w:r>
         <w:r>
           <w:rPr>
@@ -3949,7 +3949,7 @@
           <w:noProof/>
         </w:rPr>
       </w:pPr>
-      <w:hyperlink w:anchor="_Toc242216418" w:history="1">
+      <w:hyperlink w:anchor="_Toc242297395" w:history="1">
         <w:r>
           <w:rPr>
             <w:rStyle w:val="Hyperlink"/>
@@ -3976,7 +3976,7 @@
             <w:noProof/>
             <w:webHidden/>
           </w:rPr>
-          <w:instrText xml:space="preserve"> PAGEREF _Toc242216418 \h </w:instrText>
+          <w:instrText xml:space="preserve"> PAGEREF _Toc242297395 \h </w:instrText>
         </w:r>
         <w:r>
           <w:rPr>
@@ -4017,7 +4017,7 @@
           <w:noProof/>
         </w:rPr>
       </w:pPr>
-      <w:hyperlink w:anchor="_Toc242216419" w:history="1">
+      <w:hyperlink w:anchor="_Toc242297396" w:history="1">
         <w:r>
           <w:rPr>
             <w:rStyle w:val="Hyperlink"/>
@@ -4044,7 +4044,7 @@
             <w:noProof/>
             <w:webHidden/>
           </w:rPr>
-          <w:instrText xml:space="preserve"> PAGEREF _Toc242216419 \h </w:instrText>
+          <w:instrText xml:space="preserve"> PAGEREF _Toc242297396 \h </w:instrText>
         </w:r>
         <w:r>
           <w:rPr>
@@ -4085,7 +4085,7 @@
           <w:noProof/>
         </w:rPr>
       </w:pPr>
-      <w:hyperlink w:anchor="_Toc242216420" w:history="1">
+      <w:hyperlink w:anchor="_Toc242297397" w:history="1">
         <w:r>
           <w:rPr>
             <w:rStyle w:val="Hyperlink"/>
@@ -4112,7 +4112,7 @@
             <w:noProof/>
             <w:webHidden/>
           </w:rPr>
-          <w:instrText xml:space="preserve"> PAGEREF _Toc242216420 \h </w:instrText>
+          <w:instrText xml:space="preserve"> PAGEREF _Toc242297397 \h </w:instrText>
         </w:r>
         <w:r>
           <w:rPr>
@@ -4153,7 +4153,7 @@
           <w:noProof/>
         </w:rPr>
       </w:pPr>
-      <w:hyperlink w:anchor="_Toc242216421" w:history="1">
+      <w:hyperlink w:anchor="_Toc242297398" w:history="1">
         <w:r>
           <w:rPr>
             <w:rStyle w:val="Hyperlink"/>
@@ -4180,7 +4180,7 @@
             <w:noProof/>
             <w:webHidden/>
           </w:rPr>
-          <w:instrText xml:space="preserve"> PAGEREF _Toc242216421 \h </w:instrText>
+          <w:instrText xml:space="preserve"> PAGEREF _Toc242297398 \h </w:instrText>
         </w:r>
         <w:r>
           <w:rPr>
@@ -4221,7 +4221,7 @@
         <w:pStyle w:val="Heading1"/>
         <w:pageBreakBefore/>
       </w:pPr>
-      <w:bookmarkStart w:id="0" w:name="_Toc242216365"/>
+      <w:bookmarkStart w:id="0" w:name="_Toc242297342"/>
       <w:r>
         <w:lastRenderedPageBreak/>
         <w:t>Welcome</w:t>
@@ -4237,7 +4237,7 @@
       <w:pPr>
         <w:pStyle w:val="Heading2"/>
       </w:pPr>
-      <w:bookmarkStart w:id="1" w:name="_Toc242216366"/>
+      <w:bookmarkStart w:id="1" w:name="_Toc242297343"/>
       <w:r>
         <w:t>How a sale moves through the app</w:t>
       </w:r>
@@ -4720,7 +4720,7 @@
       <w:pPr>
         <w:pStyle w:val="Heading2"/>
       </w:pPr>
-      <w:bookmarkStart w:id="2" w:name="_Toc242216367"/>
+      <w:bookmarkStart w:id="2" w:name="_Toc242297344"/>
       <w:r>
         <w:t>What you'll need</w:t>
       </w:r>
@@ -4829,7 +4829,7 @@
         <w:pStyle w:val="Heading1"/>
         <w:pageBreakBefore/>
       </w:pPr>
-      <w:bookmarkStart w:id="3" w:name="_Toc242216368"/>
+      <w:bookmarkStart w:id="3" w:name="_Toc242297345"/>
       <w:r>
         <w:lastRenderedPageBreak/>
         <w:t>Who can do what</w:t>
@@ -5305,7 +5305,7 @@
         <w:pStyle w:val="Heading1"/>
         <w:pageBreakBefore/>
       </w:pPr>
-      <w:bookmarkStart w:id="4" w:name="_Toc242216369"/>
+      <w:bookmarkStart w:id="4" w:name="_Toc242297346"/>
       <w:r>
         <w:lastRenderedPageBreak/>
         <w:t>Getting started</w:t>
@@ -5316,7 +5316,7 @@
       <w:pPr>
         <w:pStyle w:val="Heading2"/>
       </w:pPr>
-      <w:bookmarkStart w:id="5" w:name="_Toc242216370"/>
+      <w:bookmarkStart w:id="5" w:name="_Toc242297347"/>
       <w:r>
         <w:t>Signing in</w:t>
       </w:r>
@@ -5333,7 +5333,7 @@
           <w:noProof/>
         </w:rPr>
         <w:drawing>
-          <wp:inline distT="0" distB="0" distL="0" distR="0" wp14:anchorId="672F4AE1" wp14:editId="1C589945">
+          <wp:inline distT="0" distB="0" distL="0" distR="0" wp14:anchorId="6FBB7527" wp14:editId="058A490A">
             <wp:extent cx="3291840" cy="2211705"/>
             <wp:effectExtent l="0" t="0" r="0" b="0"/>
             <wp:docPr id="1" name="Picture 1"/>
@@ -5651,7 +5651,7 @@
       <w:pPr>
         <w:pStyle w:val="Heading2"/>
       </w:pPr>
-      <w:bookmarkStart w:id="6" w:name="_Toc242216371"/>
+      <w:bookmarkStart w:id="6" w:name="_Toc242297348"/>
       <w:r>
         <w:t>Changing your PIN</w:t>
       </w:r>
@@ -5833,7 +5833,7 @@
       <w:pPr>
         <w:pStyle w:val="Heading2"/>
       </w:pPr>
-      <w:bookmarkStart w:id="7" w:name="_Toc242216372"/>
+      <w:bookmarkStart w:id="7" w:name="_Toc242297349"/>
       <w:r>
         <w:lastRenderedPageBreak/>
         <w:t>Finding your way around</w:t>
@@ -6416,7 +6416,7 @@
       <w:pPr>
         <w:pStyle w:val="Heading2"/>
       </w:pPr>
-      <w:bookmarkStart w:id="8" w:name="_Toc242216373"/>
+      <w:bookmarkStart w:id="8" w:name="_Toc242297350"/>
       <w:r>
         <w:t>Mattress size guide</w:t>
       </w:r>
@@ -6439,7 +6439,7 @@
         </w:rPr>
         <w:lastRenderedPageBreak/>
         <w:drawing>
-          <wp:inline distT="0" distB="0" distL="0" distR="0" wp14:anchorId="0DFCA564" wp14:editId="30619F15">
+          <wp:inline distT="0" distB="0" distL="0" distR="0" wp14:anchorId="2520BF74" wp14:editId="745D8F2B">
             <wp:extent cx="5486400" cy="3686175"/>
             <wp:effectExtent l="0" t="0" r="0" b="0"/>
             <wp:docPr id="2" name="Picture 2"/>
@@ -6516,7 +6516,7 @@
       <w:pPr>
         <w:pStyle w:val="Heading2"/>
       </w:pPr>
-      <w:bookmarkStart w:id="9" w:name="_Toc242216374"/>
+      <w:bookmarkStart w:id="9" w:name="_Toc242297351"/>
       <w:r>
         <w:t>Light and dark mode</w:t>
       </w:r>
@@ -6531,7 +6531,7 @@
       <w:pPr>
         <w:pStyle w:val="Heading2"/>
       </w:pPr>
-      <w:bookmarkStart w:id="10" w:name="_Toc242216375"/>
+      <w:bookmarkStart w:id="10" w:name="_Toc242297352"/>
       <w:r>
         <w:t>Signing out</w:t>
       </w:r>
@@ -6556,7 +6556,7 @@
         <w:pStyle w:val="Heading1"/>
         <w:pageBreakBefore/>
       </w:pPr>
-      <w:bookmarkStart w:id="11" w:name="_Toc242216376"/>
+      <w:bookmarkStart w:id="11" w:name="_Toc242297353"/>
       <w:r>
         <w:lastRenderedPageBreak/>
         <w:t>Taking an order on the sales floor</w:t>
@@ -6588,7 +6588,7 @@
           <w:noProof/>
         </w:rPr>
         <w:drawing>
-          <wp:inline distT="0" distB="0" distL="0" distR="0" wp14:anchorId="2C20B37C" wp14:editId="7D926121">
+          <wp:inline distT="0" distB="0" distL="0" distR="0" wp14:anchorId="444A5025" wp14:editId="71F16817">
             <wp:extent cx="5760720" cy="3870484"/>
             <wp:effectExtent l="0" t="0" r="0" b="0"/>
             <wp:docPr id="3" name="Picture 3"/>
@@ -6713,7 +6713,7 @@
       <w:pPr>
         <w:pStyle w:val="Heading2"/>
       </w:pPr>
-      <w:bookmarkStart w:id="12" w:name="_Toc242216377"/>
+      <w:bookmarkStart w:id="12" w:name="_Toc242297354"/>
       <w:r>
         <w:t>Starting an order</w:t>
       </w:r>
@@ -6797,7 +6797,7 @@
       <w:pPr>
         <w:pStyle w:val="Heading2"/>
       </w:pPr>
-      <w:bookmarkStart w:id="13" w:name="_Toc242216378"/>
+      <w:bookmarkStart w:id="13" w:name="_Toc242297355"/>
       <w:r>
         <w:lastRenderedPageBreak/>
         <w:t>Adding items</w:t>
@@ -6946,7 +6946,7 @@
           <w:noProof/>
         </w:rPr>
         <w:drawing>
-          <wp:inline distT="0" distB="0" distL="0" distR="0" wp14:anchorId="73A51AF5" wp14:editId="20081F78">
+          <wp:inline distT="0" distB="0" distL="0" distR="0" wp14:anchorId="55333397" wp14:editId="284EFDCD">
             <wp:extent cx="5760720" cy="3870484"/>
             <wp:effectExtent l="0" t="0" r="0" b="0"/>
             <wp:docPr id="4" name="Picture 4"/>
@@ -7083,7 +7083,7 @@
           <w:noProof/>
         </w:rPr>
         <w:drawing>
-          <wp:inline distT="0" distB="0" distL="0" distR="0" wp14:anchorId="72ABF8CF" wp14:editId="4A752292">
+          <wp:inline distT="0" distB="0" distL="0" distR="0" wp14:anchorId="796B620F" wp14:editId="279DC952">
             <wp:extent cx="5760720" cy="3870484"/>
             <wp:effectExtent l="0" t="0" r="0" b="0"/>
             <wp:docPr id="5" name="Picture 5"/>
@@ -7480,7 +7480,7 @@
           <w:noProof/>
         </w:rPr>
         <w:drawing>
-          <wp:inline distT="0" distB="0" distL="0" distR="0" wp14:anchorId="0ABC212B" wp14:editId="6E513833">
+          <wp:inline distT="0" distB="0" distL="0" distR="0" wp14:anchorId="6B41099B" wp14:editId="391A6FB4">
             <wp:extent cx="5760720" cy="4545568"/>
             <wp:effectExtent l="0" t="0" r="0" b="0"/>
             <wp:docPr id="6" name="Picture 6"/>
@@ -7626,7 +7626,7 @@
         </w:rPr>
         <w:lastRenderedPageBreak/>
         <w:drawing>
-          <wp:inline distT="0" distB="0" distL="0" distR="0" wp14:anchorId="3CE5E49A" wp14:editId="5A7FCD52">
+          <wp:inline distT="0" distB="0" distL="0" distR="0" wp14:anchorId="463C118D" wp14:editId="097A1ACE">
             <wp:extent cx="5760720" cy="4050506"/>
             <wp:effectExtent l="0" t="0" r="0" b="0"/>
             <wp:docPr id="7" name="Picture 7"/>
@@ -7788,7 +7788,7 @@
         </w:rPr>
         <w:lastRenderedPageBreak/>
         <w:drawing>
-          <wp:inline distT="0" distB="0" distL="0" distR="0" wp14:anchorId="73F4B9C6" wp14:editId="0E87CBDB">
+          <wp:inline distT="0" distB="0" distL="0" distR="0" wp14:anchorId="2C62F660" wp14:editId="6B929AC9">
             <wp:extent cx="5486400" cy="3686175"/>
             <wp:effectExtent l="0" t="0" r="0" b="0"/>
             <wp:docPr id="8" name="Picture 8"/>
@@ -8002,7 +8002,7 @@
       <w:pPr>
         <w:pStyle w:val="Heading2"/>
       </w:pPr>
-      <w:bookmarkStart w:id="14" w:name="_Toc242216379"/>
+      <w:bookmarkStart w:id="14" w:name="_Toc242297356"/>
       <w:r>
         <w:t>Adding shipping or a service later</w:t>
       </w:r>
@@ -8043,7 +8043,7 @@
         </w:rPr>
         <w:lastRenderedPageBreak/>
         <w:drawing>
-          <wp:inline distT="0" distB="0" distL="0" distR="0" wp14:anchorId="0AA44BD5" wp14:editId="5BFDD17D">
+          <wp:inline distT="0" distB="0" distL="0" distR="0" wp14:anchorId="72491005" wp14:editId="77F88B85">
             <wp:extent cx="4754880" cy="3145155"/>
             <wp:effectExtent l="0" t="0" r="0" b="0"/>
             <wp:docPr id="9" name="Picture 9"/>
@@ -8159,7 +8159,7 @@
       <w:pPr>
         <w:pStyle w:val="Heading2"/>
       </w:pPr>
-      <w:bookmarkStart w:id="15" w:name="_Toc242216380"/>
+      <w:bookmarkStart w:id="15" w:name="_Toc242297357"/>
       <w:r>
         <w:t>Changing or removing an item</w:t>
       </w:r>
@@ -8333,7 +8333,7 @@
       <w:pPr>
         <w:pStyle w:val="Heading2"/>
       </w:pPr>
-      <w:bookmarkStart w:id="16" w:name="_Toc242216381"/>
+      <w:bookmarkStart w:id="16" w:name="_Toc242297358"/>
       <w:r>
         <w:t>Customer details</w:t>
       </w:r>
@@ -8474,13 +8474,22 @@
         <w:t>Floor</w:t>
       </w:r>
       <w:r>
+        <w:t xml:space="preserve">, </w:t>
+      </w:r>
+      <w:r>
+        <w:rPr>
+          <w:b/>
+        </w:rPr>
+        <w:t>Suite #</w:t>
+      </w:r>
+      <w:r>
         <w:t xml:space="preserve"> and </w:t>
       </w:r>
       <w:r>
         <w:rPr>
           <w:b/>
         </w:rPr>
-        <w:t>Suite #</w:t>
+        <w:t>Alternate phone</w:t>
       </w:r>
       <w:r>
         <w:t xml:space="preserve"> boxes as your form (all optional), and a choice of delivering </w:t>
@@ -8524,7 +8533,7 @@
           <w:noProof/>
         </w:rPr>
         <w:drawing>
-          <wp:inline distT="0" distB="0" distL="0" distR="0" wp14:anchorId="335AA192" wp14:editId="36F52CDD">
+          <wp:inline distT="0" distB="0" distL="0" distR="0" wp14:anchorId="150D6953" wp14:editId="3E8E604E">
             <wp:extent cx="4754880" cy="3194685"/>
             <wp:effectExtent l="0" t="0" r="0" b="0"/>
             <wp:docPr id="10" name="Picture 10"/>
@@ -8578,7 +8587,7 @@
       <w:pPr>
         <w:pStyle w:val="Heading2"/>
       </w:pPr>
-      <w:bookmarkStart w:id="17" w:name="_Toc242216382"/>
+      <w:bookmarkStart w:id="17" w:name="_Toc242297359"/>
       <w:r>
         <w:t>Sending the order to checkout</w:t>
       </w:r>
@@ -8757,7 +8766,7 @@
       <w:pPr>
         <w:pStyle w:val="Heading2"/>
       </w:pPr>
-      <w:bookmarkStart w:id="18" w:name="_Toc242216383"/>
+      <w:bookmarkStart w:id="18" w:name="_Toc242297360"/>
       <w:r>
         <w:t>Using a phone</w:t>
       </w:r>
@@ -8774,7 +8783,7 @@
           <w:noProof/>
         </w:rPr>
         <w:drawing>
-          <wp:inline distT="0" distB="0" distL="0" distR="0" wp14:anchorId="76C6F76B" wp14:editId="4A0EBB9B">
+          <wp:inline distT="0" distB="0" distL="0" distR="0" wp14:anchorId="7711714A" wp14:editId="733425BB">
             <wp:extent cx="2194560" cy="4749253"/>
             <wp:effectExtent l="0" t="0" r="0" b="0"/>
             <wp:docPr id="11" name="Picture 11"/>
@@ -8852,7 +8861,7 @@
         <w:pStyle w:val="Heading1"/>
         <w:pageBreakBefore/>
       </w:pPr>
-      <w:bookmarkStart w:id="19" w:name="_Toc242216384"/>
+      <w:bookmarkStart w:id="19" w:name="_Toc242297361"/>
       <w:r>
         <w:lastRenderedPageBreak/>
         <w:t>Checking out a customer</w:t>
@@ -8893,7 +8902,7 @@
           <w:noProof/>
         </w:rPr>
         <w:drawing>
-          <wp:inline distT="0" distB="0" distL="0" distR="0" wp14:anchorId="32400D57" wp14:editId="5E4C88E3">
+          <wp:inline distT="0" distB="0" distL="0" distR="0" wp14:anchorId="32986EE5" wp14:editId="1CE319B1">
             <wp:extent cx="5760720" cy="3870484"/>
             <wp:effectExtent l="0" t="0" r="0" b="0"/>
             <wp:docPr id="12" name="Picture 12"/>
@@ -8947,7 +8956,7 @@
       <w:pPr>
         <w:pStyle w:val="Heading2"/>
       </w:pPr>
-      <w:bookmarkStart w:id="20" w:name="_Toc242216385"/>
+      <w:bookmarkStart w:id="20" w:name="_Toc242297362"/>
       <w:r>
         <w:t>1. Review the order with the customer</w:t>
       </w:r>
@@ -9044,7 +9053,7 @@
       <w:pPr>
         <w:pStyle w:val="Heading2"/>
       </w:pPr>
-      <w:bookmarkStart w:id="21" w:name="_Toc242216386"/>
+      <w:bookmarkStart w:id="21" w:name="_Toc242297363"/>
       <w:r>
         <w:t>2. Take payment</w:t>
       </w:r>
@@ -9358,7 +9367,7 @@
       <w:pPr>
         <w:pStyle w:val="Heading2"/>
       </w:pPr>
-      <w:bookmarkStart w:id="22" w:name="_Toc242216387"/>
+      <w:bookmarkStart w:id="22" w:name="_Toc242297364"/>
       <w:r>
         <w:t>3. Acknowledgements (initials and signature)</w:t>
       </w:r>
@@ -9540,7 +9549,7 @@
         </w:rPr>
         <w:lastRenderedPageBreak/>
         <w:drawing>
-          <wp:inline distT="0" distB="0" distL="0" distR="0" wp14:anchorId="392C54D7" wp14:editId="74BF96EA">
+          <wp:inline distT="0" distB="0" distL="0" distR="0" wp14:anchorId="4F5D4E40" wp14:editId="498FDADF">
             <wp:extent cx="4937760" cy="3317558"/>
             <wp:effectExtent l="0" t="0" r="0" b="0"/>
             <wp:docPr id="13" name="Picture 13"/>
@@ -9729,7 +9738,7 @@
       <w:pPr>
         <w:pStyle w:val="Heading2"/>
       </w:pPr>
-      <w:bookmarkStart w:id="23" w:name="_Toc242216388"/>
+      <w:bookmarkStart w:id="23" w:name="_Toc242297365"/>
       <w:r>
         <w:t>4. Complete the sale</w:t>
       </w:r>
@@ -9951,7 +9960,7 @@
       <w:pPr>
         <w:pStyle w:val="Heading2"/>
       </w:pPr>
-      <w:bookmarkStart w:id="24" w:name="_Toc242216389"/>
+      <w:bookmarkStart w:id="24" w:name="_Toc242297366"/>
       <w:r>
         <w:t>Other checkout actions</w:t>
       </w:r>
@@ -10161,7 +10170,7 @@
         <w:pStyle w:val="Heading1"/>
         <w:pageBreakBefore/>
       </w:pPr>
-      <w:bookmarkStart w:id="25" w:name="_Toc242216390"/>
+      <w:bookmarkStart w:id="25" w:name="_Toc242297367"/>
       <w:r>
         <w:lastRenderedPageBreak/>
         <w:t>The sales sheet</w:t>
@@ -10184,7 +10193,7 @@
           <w:noProof/>
         </w:rPr>
         <w:drawing>
-          <wp:inline distT="0" distB="0" distL="0" distR="0" wp14:anchorId="750D94E7" wp14:editId="2516528A">
+          <wp:inline distT="0" distB="0" distL="0" distR="0" wp14:anchorId="2ECC6CE3" wp14:editId="737A0C11">
             <wp:extent cx="4023360" cy="3187256"/>
             <wp:effectExtent l="0" t="0" r="0" b="0"/>
             <wp:docPr id="14" name="Picture 14"/>
@@ -10631,7 +10640,7 @@
       <w:pPr>
         <w:pStyle w:val="Heading2"/>
       </w:pPr>
-      <w:bookmarkStart w:id="26" w:name="_Toc242216391"/>
+      <w:bookmarkStart w:id="26" w:name="_Toc242297368"/>
       <w:r>
         <w:t>Emailing a receipt</w:t>
       </w:r>
@@ -10758,7 +10767,7 @@
           <w:noProof/>
         </w:rPr>
         <w:drawing>
-          <wp:inline distT="0" distB="0" distL="0" distR="0" wp14:anchorId="64692BE8" wp14:editId="31C650D4">
+          <wp:inline distT="0" distB="0" distL="0" distR="0" wp14:anchorId="2C2DCC95" wp14:editId="740E32E3">
             <wp:extent cx="4572000" cy="3071812"/>
             <wp:effectExtent l="0" t="0" r="0" b="0"/>
             <wp:docPr id="15" name="Picture 15"/>
@@ -11219,7 +11228,7 @@
         <w:pStyle w:val="Heading1"/>
         <w:pageBreakBefore/>
       </w:pPr>
-      <w:bookmarkStart w:id="27" w:name="_Toc242216392"/>
+      <w:bookmarkStart w:id="27" w:name="_Toc242297369"/>
       <w:r>
         <w:lastRenderedPageBreak/>
         <w:t>Looking up orders</w:t>
@@ -11251,7 +11260,7 @@
           <w:noProof/>
         </w:rPr>
         <w:drawing>
-          <wp:inline distT="0" distB="0" distL="0" distR="0" wp14:anchorId="20179DEC" wp14:editId="45123675">
+          <wp:inline distT="0" distB="0" distL="0" distR="0" wp14:anchorId="5FC32899" wp14:editId="5CF9526B">
             <wp:extent cx="5760720" cy="3870484"/>
             <wp:effectExtent l="0" t="0" r="0" b="0"/>
             <wp:docPr id="16" name="Picture 16"/>
@@ -11371,7 +11380,7 @@
       <w:pPr>
         <w:pStyle w:val="Heading2"/>
       </w:pPr>
-      <w:bookmarkStart w:id="28" w:name="_Toc242216393"/>
+      <w:bookmarkStart w:id="28" w:name="_Toc242297370"/>
       <w:r>
         <w:t>Extra options for admins</w:t>
       </w:r>
@@ -11461,7 +11470,7 @@
         </w:rPr>
         <w:lastRenderedPageBreak/>
         <w:drawing>
-          <wp:inline distT="0" distB="0" distL="0" distR="0" wp14:anchorId="66C00A88" wp14:editId="7060F00D">
+          <wp:inline distT="0" distB="0" distL="0" distR="0" wp14:anchorId="63DBAEBB" wp14:editId="7DCB304B">
             <wp:extent cx="4754880" cy="3194685"/>
             <wp:effectExtent l="0" t="0" r="0" b="0"/>
             <wp:docPr id="17" name="Picture 17"/>
@@ -11569,7 +11578,7 @@
         <w:pStyle w:val="Heading1"/>
         <w:pageBreakBefore/>
       </w:pPr>
-      <w:bookmarkStart w:id="29" w:name="_Toc242216394"/>
+      <w:bookmarkStart w:id="29" w:name="_Toc242297371"/>
       <w:r>
         <w:lastRenderedPageBreak/>
         <w:t>The dashboard</w:t>
@@ -11633,7 +11642,7 @@
           <w:noProof/>
         </w:rPr>
         <w:drawing>
-          <wp:inline distT="0" distB="0" distL="0" distR="0" wp14:anchorId="51E60B19" wp14:editId="014498F9">
+          <wp:inline distT="0" distB="0" distL="0" distR="0" wp14:anchorId="7708B0D1" wp14:editId="237440A2">
             <wp:extent cx="4937760" cy="4305110"/>
             <wp:effectExtent l="0" t="0" r="0" b="0"/>
             <wp:docPr id="18" name="Picture 18"/>
@@ -12288,7 +12297,7 @@
         <w:pStyle w:val="Heading1"/>
         <w:pageBreakBefore/>
       </w:pPr>
-      <w:bookmarkStart w:id="30" w:name="_Toc242216395"/>
+      <w:bookmarkStart w:id="30" w:name="_Toc242297372"/>
       <w:r>
         <w:lastRenderedPageBreak/>
         <w:t>Keeping inventory</w:t>
@@ -12347,7 +12356,7 @@
           <w:noProof/>
         </w:rPr>
         <w:drawing>
-          <wp:inline distT="0" distB="0" distL="0" distR="0" wp14:anchorId="3FAD4899" wp14:editId="75C6DBA3">
+          <wp:inline distT="0" distB="0" distL="0" distR="0" wp14:anchorId="3DE04052" wp14:editId="5F106FD7">
             <wp:extent cx="5760720" cy="3870484"/>
             <wp:effectExtent l="0" t="0" r="0" b="0"/>
             <wp:docPr id="19" name="Picture 19"/>
@@ -12401,7 +12410,7 @@
       <w:pPr>
         <w:pStyle w:val="Heading2"/>
       </w:pPr>
-      <w:bookmarkStart w:id="31" w:name="_Toc242216396"/>
+      <w:bookmarkStart w:id="31" w:name="_Toc242297373"/>
       <w:r>
         <w:t>What's on the screen</w:t>
       </w:r>
@@ -12509,7 +12518,7 @@
         </w:rPr>
         <w:lastRenderedPageBreak/>
         <w:drawing>
-          <wp:inline distT="0" distB="0" distL="0" distR="0" wp14:anchorId="68E50183" wp14:editId="3477DDD3">
+          <wp:inline distT="0" distB="0" distL="0" distR="0" wp14:anchorId="149F7415" wp14:editId="44350F76">
             <wp:extent cx="5120640" cy="2295459"/>
             <wp:effectExtent l="0" t="0" r="0" b="0"/>
             <wp:docPr id="20" name="Picture 20"/>
@@ -12634,7 +12643,7 @@
       <w:pPr>
         <w:pStyle w:val="Heading2"/>
       </w:pPr>
-      <w:bookmarkStart w:id="32" w:name="_Toc242216397"/>
+      <w:bookmarkStart w:id="32" w:name="_Toc242297374"/>
       <w:r>
         <w:t>Updating a count</w:t>
       </w:r>
@@ -12711,7 +12720,7 @@
         </w:rPr>
         <w:lastRenderedPageBreak/>
         <w:drawing>
-          <wp:inline distT="0" distB="0" distL="0" distR="0" wp14:anchorId="7585BC52" wp14:editId="2696795F">
+          <wp:inline distT="0" distB="0" distL="0" distR="0" wp14:anchorId="429F06CC" wp14:editId="69D48D49">
             <wp:extent cx="5120640" cy="3440430"/>
             <wp:effectExtent l="0" t="0" r="0" b="0"/>
             <wp:docPr id="21" name="Picture 21"/>
@@ -12765,7 +12774,7 @@
       <w:pPr>
         <w:pStyle w:val="Heading2"/>
       </w:pPr>
-      <w:bookmarkStart w:id="33" w:name="_Toc242216398"/>
+      <w:bookmarkStart w:id="33" w:name="_Toc242297375"/>
       <w:r>
         <w:t>What changes the count automatically</w:t>
       </w:r>
@@ -13169,7 +13178,7 @@
       <w:pPr>
         <w:pStyle w:val="Heading2"/>
       </w:pPr>
-      <w:bookmarkStart w:id="34" w:name="_Toc242216399"/>
+      <w:bookmarkStart w:id="34" w:name="_Toc242297376"/>
       <w:r>
         <w:t>Seeing the history</w:t>
       </w:r>
@@ -13184,7 +13193,7 @@
       <w:pPr>
         <w:pStyle w:val="Heading2"/>
       </w:pPr>
-      <w:bookmarkStart w:id="35" w:name="_Toc242216400"/>
+      <w:bookmarkStart w:id="35" w:name="_Toc242297377"/>
       <w:r>
         <w:lastRenderedPageBreak/>
         <w:t>Notes for the inventory sheet</w:t>
@@ -13234,7 +13243,7 @@
           <w:noProof/>
         </w:rPr>
         <w:drawing>
-          <wp:inline distT="0" distB="0" distL="0" distR="0" wp14:anchorId="75BAF46B" wp14:editId="203FB4F1">
+          <wp:inline distT="0" distB="0" distL="0" distR="0" wp14:anchorId="1A3D06CF" wp14:editId="323AEC25">
             <wp:extent cx="5120640" cy="3440430"/>
             <wp:effectExtent l="0" t="0" r="0" b="0"/>
             <wp:docPr id="22" name="Picture 22"/>
@@ -13288,7 +13297,7 @@
       <w:pPr>
         <w:pStyle w:val="Heading2"/>
       </w:pPr>
-      <w:bookmarkStart w:id="36" w:name="_Toc242216401"/>
+      <w:bookmarkStart w:id="36" w:name="_Toc242297378"/>
       <w:r>
         <w:t>Start and end counts</w:t>
       </w:r>
@@ -13812,7 +13821,7 @@
           <w:noProof/>
         </w:rPr>
         <w:drawing>
-          <wp:inline distT="0" distB="0" distL="0" distR="0" wp14:anchorId="470D55FF" wp14:editId="65A8E64F">
+          <wp:inline distT="0" distB="0" distL="0" distR="0" wp14:anchorId="19822315" wp14:editId="308895BA">
             <wp:extent cx="5486400" cy="3686175"/>
             <wp:effectExtent l="0" t="0" r="0" b="0"/>
             <wp:docPr id="23" name="Picture 23"/>
@@ -13952,7 +13961,7 @@
         <w:pStyle w:val="Heading1"/>
         <w:pageBreakBefore/>
       </w:pPr>
-      <w:bookmarkStart w:id="37" w:name="_Toc242216402"/>
+      <w:bookmarkStart w:id="37" w:name="_Toc242297379"/>
       <w:r>
         <w:lastRenderedPageBreak/>
         <w:t>Admin: setting up an event</w:t>
@@ -13977,7 +13986,7 @@
       <w:pPr>
         <w:pStyle w:val="Heading2"/>
       </w:pPr>
-      <w:bookmarkStart w:id="38" w:name="_Toc242216403"/>
+      <w:bookmarkStart w:id="38" w:name="_Toc242297380"/>
       <w:r>
         <w:t>Creating or editing an event</w:t>
       </w:r>
@@ -13994,7 +14003,7 @@
           <w:noProof/>
         </w:rPr>
         <w:drawing>
-          <wp:inline distT="0" distB="0" distL="0" distR="0" wp14:anchorId="1B985A44" wp14:editId="3ECB95F4">
+          <wp:inline distT="0" distB="0" distL="0" distR="0" wp14:anchorId="02E4C3C9" wp14:editId="1D37A6E0">
             <wp:extent cx="5760720" cy="1134142"/>
             <wp:effectExtent l="0" t="0" r="0" b="0"/>
             <wp:docPr id="24" name="Picture 24"/>
@@ -14343,7 +14352,7 @@
           <w:noProof/>
         </w:rPr>
         <w:drawing>
-          <wp:inline distT="0" distB="0" distL="0" distR="0" wp14:anchorId="234494C6" wp14:editId="190C2F52">
+          <wp:inline distT="0" distB="0" distL="0" distR="0" wp14:anchorId="7B09A356" wp14:editId="3BCC016B">
             <wp:extent cx="3840480" cy="2580322"/>
             <wp:effectExtent l="0" t="0" r="0" b="0"/>
             <wp:docPr id="25" name="Picture 25"/>
@@ -14456,7 +14465,7 @@
       <w:pPr>
         <w:pStyle w:val="Heading2"/>
       </w:pPr>
-      <w:bookmarkStart w:id="39" w:name="_Toc242216404"/>
+      <w:bookmarkStart w:id="39" w:name="_Toc242297381"/>
       <w:r>
         <w:t>Closing out an event</w:t>
       </w:r>
@@ -14623,7 +14632,7 @@
       <w:pPr>
         <w:pStyle w:val="Heading2"/>
       </w:pPr>
-      <w:bookmarkStart w:id="40" w:name="_Toc242216405"/>
+      <w:bookmarkStart w:id="40" w:name="_Toc242297382"/>
       <w:r>
         <w:t>Event sales sheets</w:t>
       </w:r>
@@ -14681,7 +14690,7 @@
           <w:noProof/>
         </w:rPr>
         <w:drawing>
-          <wp:inline distT="0" distB="0" distL="0" distR="0" wp14:anchorId="038029E5" wp14:editId="66D3E625">
+          <wp:inline distT="0" distB="0" distL="0" distR="0" wp14:anchorId="1C5F445C" wp14:editId="0DCE32C6">
             <wp:extent cx="4389120" cy="2948940"/>
             <wp:effectExtent l="0" t="0" r="0" b="0"/>
             <wp:docPr id="26" name="Picture 26"/>
@@ -14810,7 +14819,7 @@
           <w:noProof/>
         </w:rPr>
         <w:drawing>
-          <wp:inline distT="0" distB="0" distL="0" distR="0" wp14:anchorId="6A30FCDE" wp14:editId="7461D246">
+          <wp:inline distT="0" distB="0" distL="0" distR="0" wp14:anchorId="3A7E95FE" wp14:editId="254D16BA">
             <wp:extent cx="4206240" cy="5717858"/>
             <wp:effectExtent l="0" t="0" r="0" b="0"/>
             <wp:docPr id="27" name="Picture 27"/>
@@ -14948,7 +14957,7 @@
           <w:noProof/>
         </w:rPr>
         <w:drawing>
-          <wp:inline distT="0" distB="0" distL="0" distR="0" wp14:anchorId="67CCAA68" wp14:editId="31B25609">
+          <wp:inline distT="0" distB="0" distL="0" distR="0" wp14:anchorId="196DB52A" wp14:editId="20CBCCB3">
             <wp:extent cx="4389120" cy="2948940"/>
             <wp:effectExtent l="0" t="0" r="0" b="0"/>
             <wp:docPr id="28" name="Picture 28"/>
@@ -15061,7 +15070,7 @@
         <w:pStyle w:val="Heading1"/>
         <w:pageBreakBefore/>
       </w:pPr>
-      <w:bookmarkStart w:id="41" w:name="_Toc242216406"/>
+      <w:bookmarkStart w:id="41" w:name="_Toc242297383"/>
       <w:r>
         <w:lastRenderedPageBreak/>
         <w:t>Admin: managing the catalog</w:t>
@@ -15165,7 +15174,7 @@
           <w:noProof/>
         </w:rPr>
         <w:drawing>
-          <wp:inline distT="0" distB="0" distL="0" distR="0" wp14:anchorId="219B7395" wp14:editId="63ADEC93">
+          <wp:inline distT="0" distB="0" distL="0" distR="0" wp14:anchorId="4578AA98" wp14:editId="41357291">
             <wp:extent cx="5760720" cy="4050506"/>
             <wp:effectExtent l="0" t="0" r="0" b="0"/>
             <wp:docPr id="29" name="Picture 29"/>
@@ -15219,7 +15228,7 @@
       <w:pPr>
         <w:pStyle w:val="Heading2"/>
       </w:pPr>
-      <w:bookmarkStart w:id="42" w:name="_Toc242216407"/>
+      <w:bookmarkStart w:id="42" w:name="_Toc242297384"/>
       <w:r>
         <w:lastRenderedPageBreak/>
         <w:t>Adding or editing a product</w:t>
@@ -15237,7 +15246,7 @@
           <w:noProof/>
         </w:rPr>
         <w:drawing>
-          <wp:inline distT="0" distB="0" distL="0" distR="0" wp14:anchorId="2259AE41" wp14:editId="657EA7D6">
+          <wp:inline distT="0" distB="0" distL="0" distR="0" wp14:anchorId="3A790D5A" wp14:editId="51020605">
             <wp:extent cx="5486400" cy="3686175"/>
             <wp:effectExtent l="0" t="0" r="0" b="0"/>
             <wp:docPr id="30" name="Picture 30"/>
@@ -15704,7 +15713,7 @@
         </w:rPr>
         <w:lastRenderedPageBreak/>
         <w:drawing>
-          <wp:inline distT="0" distB="0" distL="0" distR="0" wp14:anchorId="46F9ADBC" wp14:editId="738ADBD6">
+          <wp:inline distT="0" distB="0" distL="0" distR="0" wp14:anchorId="55ADBCDD" wp14:editId="05335C54">
             <wp:extent cx="5120640" cy="2130933"/>
             <wp:effectExtent l="0" t="0" r="0" b="0"/>
             <wp:docPr id="31" name="Picture 31"/>
@@ -15885,7 +15894,7 @@
           <w:noProof/>
         </w:rPr>
         <w:drawing>
-          <wp:inline distT="0" distB="0" distL="0" distR="0" wp14:anchorId="31209914" wp14:editId="4A9D6351">
+          <wp:inline distT="0" distB="0" distL="0" distR="0" wp14:anchorId="1E69C787" wp14:editId="5B1844AF">
             <wp:extent cx="5486400" cy="3686175"/>
             <wp:effectExtent l="0" t="0" r="0" b="0"/>
             <wp:docPr id="32" name="Picture 32"/>
@@ -16087,7 +16096,7 @@
           <w:noProof/>
         </w:rPr>
         <w:drawing>
-          <wp:inline distT="0" distB="0" distL="0" distR="0" wp14:anchorId="12F7E61B" wp14:editId="4B435ED1">
+          <wp:inline distT="0" distB="0" distL="0" distR="0" wp14:anchorId="4D0FC1B8" wp14:editId="70878901">
             <wp:extent cx="5486400" cy="3686175"/>
             <wp:effectExtent l="0" t="0" r="0" b="0"/>
             <wp:docPr id="33" name="Picture 33"/>
@@ -16335,7 +16344,7 @@
       <w:pPr>
         <w:pStyle w:val="Heading2"/>
       </w:pPr>
-      <w:bookmarkStart w:id="43" w:name="_Toc242216408"/>
+      <w:bookmarkStart w:id="43" w:name="_Toc242297385"/>
       <w:r>
         <w:t>Delivery and services</w:t>
       </w:r>
@@ -16366,7 +16375,7 @@
           <w:noProof/>
         </w:rPr>
         <w:drawing>
-          <wp:inline distT="0" distB="0" distL="0" distR="0" wp14:anchorId="72995CED" wp14:editId="008EEA9C">
+          <wp:inline distT="0" distB="0" distL="0" distR="0" wp14:anchorId="1A9FF16A" wp14:editId="04FD2157">
             <wp:extent cx="5760720" cy="3870484"/>
             <wp:effectExtent l="0" t="0" r="0" b="0"/>
             <wp:docPr id="34" name="Picture 34"/>
@@ -16887,7 +16896,7 @@
           <w:noProof/>
         </w:rPr>
         <w:drawing>
-          <wp:inline distT="0" distB="0" distL="0" distR="0" wp14:anchorId="05CB158D" wp14:editId="5B068283">
+          <wp:inline distT="0" distB="0" distL="0" distR="0" wp14:anchorId="7DF4B20F" wp14:editId="2F5FF724">
             <wp:extent cx="4206240" cy="4534852"/>
             <wp:effectExtent l="0" t="0" r="0" b="0"/>
             <wp:docPr id="35" name="Picture 35"/>
@@ -16999,7 +17008,7 @@
         </w:rPr>
         <w:lastRenderedPageBreak/>
         <w:drawing>
-          <wp:inline distT="0" distB="0" distL="0" distR="0" wp14:anchorId="23C9BB15" wp14:editId="0D1AE6E7">
+          <wp:inline distT="0" distB="0" distL="0" distR="0" wp14:anchorId="0F98E624" wp14:editId="77C1A02F">
             <wp:extent cx="5120640" cy="3829050"/>
             <wp:effectExtent l="0" t="0" r="0" b="0"/>
             <wp:docPr id="36" name="Picture 36"/>
@@ -17054,7 +17063,7 @@
         <w:pStyle w:val="Heading1"/>
         <w:pageBreakBefore/>
       </w:pPr>
-      <w:bookmarkStart w:id="44" w:name="_Toc242216409"/>
+      <w:bookmarkStart w:id="44" w:name="_Toc242297386"/>
       <w:r>
         <w:lastRenderedPageBreak/>
         <w:t>Admin: managing the crew</w:t>
@@ -17086,7 +17095,7 @@
           <w:noProof/>
         </w:rPr>
         <w:drawing>
-          <wp:inline distT="0" distB="0" distL="0" distR="0" wp14:anchorId="5C18F053" wp14:editId="43C89A23">
+          <wp:inline distT="0" distB="0" distL="0" distR="0" wp14:anchorId="5A2B1240" wp14:editId="4167FFBC">
             <wp:extent cx="5760720" cy="1854232"/>
             <wp:effectExtent l="0" t="0" r="0" b="0"/>
             <wp:docPr id="37" name="Picture 37"/>
@@ -17358,7 +17367,7 @@
           <w:noProof/>
         </w:rPr>
         <w:drawing>
-          <wp:inline distT="0" distB="0" distL="0" distR="0" wp14:anchorId="01CDFF78" wp14:editId="56CE4E66">
+          <wp:inline distT="0" distB="0" distL="0" distR="0" wp14:anchorId="4DCAAB02" wp14:editId="730F5227">
             <wp:extent cx="4023360" cy="2703195"/>
             <wp:effectExtent l="0" t="0" r="0" b="0"/>
             <wp:docPr id="38" name="Picture 38"/>
@@ -17418,7 +17427,7 @@
         <w:pStyle w:val="Heading1"/>
         <w:pageBreakBefore/>
       </w:pPr>
-      <w:bookmarkStart w:id="45" w:name="_Toc242216410"/>
+      <w:bookmarkStart w:id="45" w:name="_Toc242297387"/>
       <w:r>
         <w:lastRenderedPageBreak/>
         <w:t>Admin: settings</w:t>
@@ -17488,7 +17497,7 @@
       <w:pPr>
         <w:pStyle w:val="Heading2"/>
       </w:pPr>
-      <w:bookmarkStart w:id="46" w:name="_Toc242216411"/>
+      <w:bookmarkStart w:id="46" w:name="_Toc242297388"/>
       <w:r>
         <w:t>Business details</w:t>
       </w:r>
@@ -17505,7 +17514,7 @@
           <w:noProof/>
         </w:rPr>
         <w:drawing>
-          <wp:inline distT="0" distB="0" distL="0" distR="0" wp14:anchorId="43A2748D" wp14:editId="4A5E195E">
+          <wp:inline distT="0" distB="0" distL="0" distR="0" wp14:anchorId="2DCF879F" wp14:editId="0D92B682">
             <wp:extent cx="5760720" cy="1429893"/>
             <wp:effectExtent l="0" t="0" r="0" b="0"/>
             <wp:docPr id="39" name="Picture 39"/>
@@ -17869,7 +17878,7 @@
       <w:pPr>
         <w:pStyle w:val="Heading2"/>
       </w:pPr>
-      <w:bookmarkStart w:id="47" w:name="_Toc242216412"/>
+      <w:bookmarkStart w:id="47" w:name="_Toc242297389"/>
       <w:r>
         <w:t>Sales sheet terms</w:t>
       </w:r>
@@ -17892,7 +17901,7 @@
         </w:rPr>
         <w:lastRenderedPageBreak/>
         <w:drawing>
-          <wp:inline distT="0" distB="0" distL="0" distR="0" wp14:anchorId="17000451" wp14:editId="76B250BE">
+          <wp:inline distT="0" distB="0" distL="0" distR="0" wp14:anchorId="5070413D" wp14:editId="7D839AD9">
             <wp:extent cx="5760720" cy="4937760"/>
             <wp:effectExtent l="0" t="0" r="0" b="0"/>
             <wp:docPr id="40" name="Picture 40"/>
@@ -18265,7 +18274,7 @@
       <w:pPr>
         <w:pStyle w:val="Heading2"/>
       </w:pPr>
-      <w:bookmarkStart w:id="48" w:name="_Toc242216413"/>
+      <w:bookmarkStart w:id="48" w:name="_Toc242297390"/>
       <w:r>
         <w:t>Receipt email</w:t>
       </w:r>
@@ -18287,7 +18296,7 @@
           <w:noProof/>
         </w:rPr>
         <w:drawing>
-          <wp:inline distT="0" distB="0" distL="0" distR="0" wp14:anchorId="31D08781" wp14:editId="27EB2AB8">
+          <wp:inline distT="0" distB="0" distL="0" distR="0" wp14:anchorId="3CD860EE" wp14:editId="540B6C17">
             <wp:extent cx="5760720" cy="4454271"/>
             <wp:effectExtent l="0" t="0" r="0" b="0"/>
             <wp:docPr id="41" name="Picture 41"/>
@@ -19264,7 +19273,7 @@
       <w:pPr>
         <w:pStyle w:val="Heading2"/>
       </w:pPr>
-      <w:bookmarkStart w:id="49" w:name="_Toc242216414"/>
+      <w:bookmarkStart w:id="49" w:name="_Toc242297391"/>
       <w:r>
         <w:t>New events</w:t>
       </w:r>
@@ -19281,7 +19290,7 @@
           <w:noProof/>
         </w:rPr>
         <w:drawing>
-          <wp:inline distT="0" distB="0" distL="0" distR="0" wp14:anchorId="03D299EE" wp14:editId="41680512">
+          <wp:inline distT="0" distB="0" distL="0" distR="0" wp14:anchorId="553EA232" wp14:editId="5EE12AF5">
             <wp:extent cx="5760720" cy="1512189"/>
             <wp:effectExtent l="0" t="0" r="0" b="0"/>
             <wp:docPr id="42" name="Picture 42"/>
@@ -19359,7 +19368,7 @@
       <w:pPr>
         <w:pStyle w:val="Heading2"/>
       </w:pPr>
-      <w:bookmarkStart w:id="50" w:name="_Toc242216415"/>
+      <w:bookmarkStart w:id="50" w:name="_Toc242297392"/>
       <w:r>
         <w:t>Dashboard</w:t>
       </w:r>
@@ -19376,7 +19385,7 @@
           <w:noProof/>
         </w:rPr>
         <w:drawing>
-          <wp:inline distT="0" distB="0" distL="0" distR="0" wp14:anchorId="4E975390" wp14:editId="1E6D94DB">
+          <wp:inline distT="0" distB="0" distL="0" distR="0" wp14:anchorId="7F39EE30" wp14:editId="6C73AAEF">
             <wp:extent cx="5760720" cy="1594485"/>
             <wp:effectExtent l="0" t="0" r="0" b="0"/>
             <wp:docPr id="43" name="Picture 43"/>
@@ -19706,7 +19715,7 @@
         <w:pStyle w:val="Heading1"/>
         <w:pageBreakBefore/>
       </w:pPr>
-      <w:bookmarkStart w:id="51" w:name="_Toc242216416"/>
+      <w:bookmarkStart w:id="51" w:name="_Toc242297393"/>
       <w:r>
         <w:lastRenderedPageBreak/>
         <w:t>Tips and troubleshooting</w:t>
@@ -20119,7 +20128,7 @@
         <w:pStyle w:val="Heading1"/>
         <w:pageBreakBefore/>
       </w:pPr>
-      <w:bookmarkStart w:id="52" w:name="_Toc242216417"/>
+      <w:bookmarkStart w:id="52" w:name="_Toc242297394"/>
       <w:r>
         <w:lastRenderedPageBreak/>
         <w:t>Quick reference</w:t>
@@ -20130,7 +20139,7 @@
       <w:pPr>
         <w:pStyle w:val="Heading2"/>
       </w:pPr>
-      <w:bookmarkStart w:id="53" w:name="_Toc242216418"/>
+      <w:bookmarkStart w:id="53" w:name="_Toc242297395"/>
       <w:r>
         <w:t>Sales rep checklist</w:t>
       </w:r>
@@ -20274,7 +20283,7 @@
       <w:pPr>
         <w:pStyle w:val="Heading2"/>
       </w:pPr>
-      <w:bookmarkStart w:id="54" w:name="_Toc242216419"/>
+      <w:bookmarkStart w:id="54" w:name="_Toc242297396"/>
       <w:r>
         <w:t>Checkout checklist</w:t>
       </w:r>
@@ -20462,7 +20471,7 @@
       <w:pPr>
         <w:pStyle w:val="Heading2"/>
       </w:pPr>
-      <w:bookmarkStart w:id="55" w:name="_Toc242216420"/>
+      <w:bookmarkStart w:id="55" w:name="_Toc242297397"/>
       <w:r>
         <w:t>Inventory counts</w:t>
       </w:r>
@@ -20666,7 +20675,7 @@
       <w:pPr>
         <w:pStyle w:val="Heading2"/>
       </w:pPr>
-      <w:bookmarkStart w:id="56" w:name="_Toc242216421"/>
+      <w:bookmarkStart w:id="56" w:name="_Toc242297398"/>
       <w:r>
         <w:t>Order status at a glance</w:t>
       </w:r>
@@ -21286,31 +21295,31 @@
       </w:rPr>
     </w:lvl>
   </w:abstractNum>
-  <w:num w:numId="1" w16cid:durableId="1814057019">
+  <w:num w:numId="1" w16cid:durableId="560362032">
     <w:abstractNumId w:val="8"/>
   </w:num>
-  <w:num w:numId="2" w16cid:durableId="1124808276">
+  <w:num w:numId="2" w16cid:durableId="1242325102">
     <w:abstractNumId w:val="6"/>
   </w:num>
-  <w:num w:numId="3" w16cid:durableId="1426345471">
+  <w:num w:numId="3" w16cid:durableId="2000037912">
     <w:abstractNumId w:val="5"/>
   </w:num>
-  <w:num w:numId="4" w16cid:durableId="1880434500">
+  <w:num w:numId="4" w16cid:durableId="713624640">
     <w:abstractNumId w:val="4"/>
   </w:num>
-  <w:num w:numId="5" w16cid:durableId="1638218290">
+  <w:num w:numId="5" w16cid:durableId="2142309374">
     <w:abstractNumId w:val="7"/>
   </w:num>
-  <w:num w:numId="6" w16cid:durableId="2025471542">
+  <w:num w:numId="6" w16cid:durableId="767821100">
     <w:abstractNumId w:val="3"/>
   </w:num>
-  <w:num w:numId="7" w16cid:durableId="1659264578">
+  <w:num w:numId="7" w16cid:durableId="2098163897">
     <w:abstractNumId w:val="2"/>
   </w:num>
-  <w:num w:numId="8" w16cid:durableId="460197279">
+  <w:num w:numId="8" w16cid:durableId="290791509">
     <w:abstractNumId w:val="1"/>
   </w:num>
-  <w:num w:numId="9" w16cid:durableId="1712068940">
+  <w:num w:numId="9" w16cid:durableId="1914241206">
     <w:abstractNumId w:val="0"/>
   </w:num>
 </w:numbering>
@@ -32702,7 +32711,7 @@
     <w:autoRedefine/>
     <w:uiPriority w:val="39"/>
     <w:unhideWhenUsed/>
-    <w:rsid w:val="00E00537"/>
+    <w:rsid w:val="00007F75"/>
     <w:pPr>
       <w:spacing w:after="100"/>
     </w:pPr>
@@ -32714,7 +32723,7 @@
     <w:autoRedefine/>
     <w:uiPriority w:val="39"/>
     <w:unhideWhenUsed/>
-    <w:rsid w:val="00E00537"/>
+    <w:rsid w:val="00007F75"/>
     <w:pPr>
       <w:spacing w:after="100"/>
       <w:ind w:left="220"/>
@@ -32725,7 +32734,7 @@
     <w:basedOn w:val="DefaultParagraphFont"/>
     <w:uiPriority w:val="99"/>
     <w:unhideWhenUsed/>
-    <w:rsid w:val="00E00537"/>
+    <w:rsid w:val="00007F75"/>
     <w:rPr>
       <w:color w:val="0000FF" w:themeColor="hyperlink"/>
       <w:u w:val="single"/>

</xml_diff>

<commit_message>
User guide: sizes left out of inventory, financing details
- Checkout: a financing payment takes the type and financing number,
  printed in the sales sheet's Comments box; checklist and a
  troubleshooting entry updated.
- Catalog: new "Leaving a size out of inventory" section for the
  Count in inventory box; the Inventory screen and on-hand notes say
  such sizes aren't counted.
- Settings: new Financing section; the page now has six sections.
- Table of contents page numbers refreshed.

Co-Authored-By: Claude Opus 5.5 <noreply@anthropic.com>
</commit_message>
<xml_diff>
--- a/Documents/CFS Sales App User Guide.docx
+++ b/Documents/CFS Sales App User Guide.docx
@@ -3316,7 +3316,7 @@
             <w:noProof/>
             <w:webHidden/>
           </w:rPr>
-          <w:t>42</w:t>
+          <w:t>43</w:t>
         </w:r>
         <w:r>
           <w:rPr>
@@ -3384,7 +3384,7 @@
             <w:noProof/>
             <w:webHidden/>
           </w:rPr>
-          <w:t>45</w:t>
+          <w:t>46</w:t>
         </w:r>
         <w:r>
           <w:rPr>
@@ -3452,7 +3452,7 @@
             <w:noProof/>
             <w:webHidden/>
           </w:rPr>
-          <w:t>46</w:t>
+          <w:t>47</w:t>
         </w:r>
         <w:r>
           <w:rPr>
@@ -3520,7 +3520,7 @@
             <w:noProof/>
             <w:webHidden/>
           </w:rPr>
-          <w:t>46</w:t>
+          <w:t>47</w:t>
         </w:r>
         <w:r>
           <w:rPr>
@@ -3588,7 +3588,7 @@
             <w:noProof/>
             <w:webHidden/>
           </w:rPr>
-          <w:t>46</w:t>
+          <w:t>47</w:t>
         </w:r>
         <w:r>
           <w:rPr>
@@ -3656,7 +3656,7 @@
             <w:noProof/>
             <w:webHidden/>
           </w:rPr>
-          <w:t>48</w:t>
+          <w:t>49</w:t>
         </w:r>
         <w:r>
           <w:rPr>
@@ -3677,13 +3677,13 @@
           <w:noProof/>
         </w:rPr>
       </w:pPr>
-      <w:hyperlink w:anchor="_Toc242297391" w:history="1">
+      <w:hyperlink w:anchor="_Toc242297399" w:history="1">
         <w:r>
           <w:rPr>
             <w:rStyle w:val="Hyperlink"/>
             <w:noProof/>
           </w:rPr>
-          <w:t>New events</w:t>
+          <w:t>Financing</w:t>
         </w:r>
         <w:r>
           <w:rPr>
@@ -3704,7 +3704,7 @@
             <w:noProof/>
             <w:webHidden/>
           </w:rPr>
-          <w:instrText xml:space="preserve"> PAGEREF _Toc242297391 \h </w:instrText>
+          <w:instrText xml:space="preserve"> PAGEREF _Toc242297399 \h </w:instrText>
         </w:r>
         <w:r>
           <w:rPr>
@@ -3724,7 +3724,7 @@
             <w:noProof/>
             <w:webHidden/>
           </w:rPr>
-          <w:t>49</w:t>
+          <w:t>50</w:t>
         </w:r>
         <w:r>
           <w:rPr>
@@ -3745,6 +3745,74 @@
           <w:noProof/>
         </w:rPr>
       </w:pPr>
+      <w:hyperlink w:anchor="_Toc242297391" w:history="1">
+        <w:r>
+          <w:rPr>
+            <w:rStyle w:val="Hyperlink"/>
+            <w:noProof/>
+          </w:rPr>
+          <w:t>New events</w:t>
+        </w:r>
+        <w:r>
+          <w:rPr>
+            <w:noProof/>
+            <w:webHidden/>
+          </w:rPr>
+          <w:tab/>
+        </w:r>
+        <w:r>
+          <w:rPr>
+            <w:noProof/>
+            <w:webHidden/>
+          </w:rPr>
+          <w:fldChar w:fldCharType="begin"/>
+        </w:r>
+        <w:r>
+          <w:rPr>
+            <w:noProof/>
+            <w:webHidden/>
+          </w:rPr>
+          <w:instrText xml:space="preserve"> PAGEREF _Toc242297391 \h </w:instrText>
+        </w:r>
+        <w:r>
+          <w:rPr>
+            <w:noProof/>
+            <w:webHidden/>
+          </w:rPr>
+        </w:r>
+        <w:r>
+          <w:rPr>
+            <w:noProof/>
+            <w:webHidden/>
+          </w:rPr>
+          <w:fldChar w:fldCharType="separate"/>
+        </w:r>
+        <w:r>
+          <w:rPr>
+            <w:noProof/>
+            <w:webHidden/>
+          </w:rPr>
+          <w:t>51</w:t>
+        </w:r>
+        <w:r>
+          <w:rPr>
+            <w:noProof/>
+            <w:webHidden/>
+          </w:rPr>
+          <w:fldChar w:fldCharType="end"/>
+        </w:r>
+      </w:hyperlink>
+    </w:p>
+    <w:p>
+      <w:pPr>
+        <w:pStyle w:val="TOC2"/>
+        <w:tabs>
+          <w:tab w:val="right" w:leader="dot" w:pos="9350"/>
+        </w:tabs>
+        <w:rPr>
+          <w:noProof/>
+        </w:rPr>
+      </w:pPr>
       <w:hyperlink w:anchor="_Toc242297392" w:history="1">
         <w:r>
           <w:rPr>
@@ -3792,7 +3860,7 @@
             <w:noProof/>
             <w:webHidden/>
           </w:rPr>
-          <w:t>50</w:t>
+          <w:t>51</w:t>
         </w:r>
         <w:r>
           <w:rPr>
@@ -3860,7 +3928,7 @@
             <w:noProof/>
             <w:webHidden/>
           </w:rPr>
-          <w:t>51</w:t>
+          <w:t>52</w:t>
         </w:r>
         <w:r>
           <w:rPr>
@@ -3928,7 +3996,7 @@
             <w:noProof/>
             <w:webHidden/>
           </w:rPr>
-          <w:t>53</w:t>
+          <w:t>54</w:t>
         </w:r>
         <w:r>
           <w:rPr>
@@ -3996,7 +4064,7 @@
             <w:noProof/>
             <w:webHidden/>
           </w:rPr>
-          <w:t>53</w:t>
+          <w:t>54</w:t>
         </w:r>
         <w:r>
           <w:rPr>
@@ -4064,7 +4132,7 @@
             <w:noProof/>
             <w:webHidden/>
           </w:rPr>
-          <w:t>53</w:t>
+          <w:t>54</w:t>
         </w:r>
         <w:r>
           <w:rPr>
@@ -4132,7 +4200,7 @@
             <w:noProof/>
             <w:webHidden/>
           </w:rPr>
-          <w:t>53</w:t>
+          <w:t>54</w:t>
         </w:r>
         <w:r>
           <w:rPr>
@@ -4200,7 +4268,7 @@
             <w:noProof/>
             <w:webHidden/>
           </w:rPr>
-          <w:t>53</w:t>
+          <w:t>54</w:t>
         </w:r>
         <w:r>
           <w:rPr>
@@ -7746,7 +7814,7 @@
         <w:spacing w:after="60"/>
       </w:pPr>
       <w:r>
-        <w:t>Items that aren't counted, like mattresses, never show a stock number and are never blocked.</w:t>
+        <w:t>Items that aren't counted, like mattresses (or a size that's been left out of the count), never show a stock number and are never blocked.</w:t>
       </w:r>
     </w:p>
     <w:p>
@@ -9222,8 +9290,61 @@
           <w:b/>
           <w:color w:val="0369A1"/>
         </w:rPr>
+        <w:t>4.</w:t>
+      </w:r>
+      <w:r>
+        <w:rPr>
+          <w:b/>
+          <w:color w:val="0369A1"/>
+        </w:rPr>
+        <w:tab/>
+      </w:r>
+      <w:r>
+        <w:t xml:space="preserve">For financing, choose the </w:t>
+      </w:r>
+      <w:r>
+        <w:rPr>
+          <w:b/>
+        </w:rPr>
+        <w:t>Financing type</w:t>
+      </w:r>
+      <w:r>
+        <w:t xml:space="preserve"> and enter the </w:t>
+      </w:r>
+      <w:r>
+        <w:rPr>
+          <w:b/>
+        </w:rPr>
+        <w:t>Financing #</w:t>
+      </w:r>
+      <w:r>
+        <w:t xml:space="preserve">. Both print in the </w:t>
+      </w:r>
+      <w:r>
+        <w:rPr>
+          <w:b/>
+        </w:rPr>
+        <w:t>Comments</w:t>
+      </w:r>
+      <w:r>
+        <w:t xml:space="preserve"> box of the sales sheet, along with the amount financed.</w:t>
+      </w:r>
+    </w:p>
+    <w:p>
+      <w:pPr>
+        <w:tabs>
+          <w:tab w:val="left" w:pos="504"/>
+        </w:tabs>
+        <w:spacing w:after="80"/>
+        <w:ind w:left="504" w:hanging="432"/>
+      </w:pPr>
+      <w:r>
+        <w:rPr>
+          <w:b/>
+          <w:color w:val="0369A1"/>
+        </w:rPr>
         <w:lastRenderedPageBreak/>
-        <w:t>4.</w:t>
+        <w:t>5.</w:t>
       </w:r>
       <w:r>
         <w:rPr>
@@ -9361,6 +9482,33 @@
       </w:r>
       <w:r>
         <w:t>, it's normal for a balance to remain. The screen reminds you when a balance is left.</w:t>
+      </w:r>
+    </w:p>
+    <w:p>
+      <w:pPr>
+        <w:pStyle w:val="ListBullet"/>
+        <w:spacing w:after="60"/>
+      </w:pPr>
+      <w:r>
+        <w:t xml:space="preserve">The financing types to choose from are set by an administrator under </w:t>
+      </w:r>
+      <w:r>
+        <w:rPr>
+          <w:b/>
+        </w:rPr>
+        <w:t>Settings</w:t>
+      </w:r>
+      <w:r>
+        <w:t xml:space="preserve"> (see </w:t>
+      </w:r>
+      <w:r>
+        <w:rPr>
+          <w:b/>
+        </w:rPr>
+        <w:t>Admin: settings</w:t>
+      </w:r>
+      <w:r>
+        <w:t>). If none have been set up yet, type it in instead.</w:t>
       </w:r>
     </w:p>
     <w:p>
@@ -12422,7 +12570,7 @@
         <w:spacing w:after="60"/>
       </w:pPr>
       <w:r>
-        <w:t xml:space="preserve">Each counted product is listed under its category, with one row per size. A product counted by color has a row for each size and color, such as </w:t>
+        <w:t xml:space="preserve">Each counted product is listed under its category, with one row per size. A size that's been left out of the count isn't listed. A product counted by color has a row for each size and color, such as </w:t>
       </w:r>
       <w:r>
         <w:rPr>
@@ -15824,6 +15972,100 @@
       <w:pPr>
         <w:spacing w:after="40"/>
       </w:pPr>
+    </w:p>
+    <w:p>
+      <w:pPr>
+        <w:pStyle w:val="Heading3"/>
+      </w:pPr>
+      <w:r>
+        <w:t>Leaving a size out of inventory</w:t>
+      </w:r>
+    </w:p>
+    <w:p>
+      <w:r>
+        <w:t xml:space="preserve">With </w:t>
+      </w:r>
+      <w:r>
+        <w:rPr>
+          <w:b/>
+        </w:rPr>
+        <w:t>Track inventory</w:t>
+      </w:r>
+      <w:r>
+        <w:t xml:space="preserve"> on, each size row also has a </w:t>
+      </w:r>
+      <w:r>
+        <w:rPr>
+          <w:b/>
+        </w:rPr>
+        <w:t>Count in inventory</w:t>
+      </w:r>
+      <w:r>
+        <w:t xml:space="preserve"> box, ticked to start with. Untick it for a size the cart doesn't keep, for example a King pillow that always ships. Then tap </w:t>
+      </w:r>
+      <w:r>
+        <w:rPr>
+          <w:b/>
+        </w:rPr>
+        <w:t>Save</w:t>
+      </w:r>
+      <w:r>
+        <w:t>.</w:t>
+      </w:r>
+    </w:p>
+    <w:p>
+      <w:pPr>
+        <w:pStyle w:val="ListBullet"/>
+        <w:spacing w:after="60"/>
+      </w:pPr>
+      <w:r>
+        <w:t xml:space="preserve">That size isn't counted. It doesn't appear on the </w:t>
+      </w:r>
+      <w:r>
+        <w:rPr>
+          <w:b/>
+        </w:rPr>
+        <w:t>Inventory</w:t>
+      </w:r>
+      <w:r>
+        <w:t xml:space="preserve"> screen, in the start and end counts, or on the Accessory Inventory Sheet.</w:t>
+      </w:r>
+    </w:p>
+    <w:p>
+      <w:pPr>
+        <w:pStyle w:val="ListBullet"/>
+        <w:spacing w:after="60"/>
+      </w:pPr>
+      <w:r>
+        <w:t>Take With isn't limited by stock for that size, just like an item that isn't tracked.</w:t>
+      </w:r>
+    </w:p>
+    <w:p>
+      <w:pPr>
+        <w:pStyle w:val="ListBullet"/>
+        <w:spacing w:after="60"/>
+      </w:pPr>
+      <w:r>
+        <w:t xml:space="preserve">The catalog list shows how many sizes aren't counted, for example </w:t>
+      </w:r>
+      <w:r>
+        <w:rPr>
+          <w:b/>
+        </w:rPr>
+        <w:t>Tracked · 12 on hand (1 not counted)</w:t>
+      </w:r>
+      <w:r>
+        <w:t>.</w:t>
+      </w:r>
+    </w:p>
+    <w:p>
+      <w:pPr>
+        <w:pStyle w:val="ListBullet"/>
+        <w:spacing w:after="60"/>
+      </w:pPr>
+      <w:r>
+        <w:t>Tick the box again to start counting it. Any count it had before is still there.</w:t>
+      </w:r>
     </w:p>
     <w:p>
       <w:pPr>
@@ -17463,7 +17705,7 @@
         <w:t>More</w:t>
       </w:r>
       <w:r>
-        <w:t xml:space="preserve">. The page has five sections, and each one has its own </w:t>
+        <w:t xml:space="preserve">. The page has six sections, and each one has its own </w:t>
       </w:r>
       <w:r>
         <w:rPr>
@@ -19273,6 +19515,215 @@
       <w:pPr>
         <w:pStyle w:val="Heading2"/>
       </w:pPr>
+      <w:bookmarkStart w:id="9001" w:name="_Toc242297399"/>
+      <w:r>
+        <w:t>Financing</w:t>
+      </w:r>
+      <w:bookmarkEnd w:id="9001"/>
+    </w:p>
+    <w:p>
+      <w:r>
+        <w:t xml:space="preserve">The kinds of financing a customer can choose, such as </w:t>
+      </w:r>
+      <w:r>
+        <w:rPr>
+          <w:b/>
+        </w:rPr>
+        <w:t>12 months no interest</w:t>
+      </w:r>
+      <w:r>
+        <w:t xml:space="preserve">. When checkout records a </w:t>
+      </w:r>
+      <w:r>
+        <w:rPr>
+          <w:b/>
+        </w:rPr>
+        <w:t>Financing</w:t>
+      </w:r>
+      <w:r>
+        <w:t xml:space="preserve"> payment, they pick one of these as the </w:t>
+      </w:r>
+      <w:r>
+        <w:rPr>
+          <w:b/>
+        </w:rPr>
+        <w:t>Financing type</w:t>
+      </w:r>
+      <w:r>
+        <w:t xml:space="preserve"> and enter the </w:t>
+      </w:r>
+      <w:r>
+        <w:rPr>
+          <w:b/>
+        </w:rPr>
+        <w:t>Financing #</w:t>
+      </w:r>
+      <w:r>
+        <w:t xml:space="preserve">. Both print in the </w:t>
+      </w:r>
+      <w:r>
+        <w:rPr>
+          <w:b/>
+        </w:rPr>
+        <w:t>Comments</w:t>
+      </w:r>
+      <w:r>
+        <w:t xml:space="preserve"> box of the sales sheet, with the amount financed.</w:t>
+      </w:r>
+    </w:p>
+    <w:p>
+      <w:pPr>
+        <w:tabs>
+          <w:tab w:val="left" w:pos="504"/>
+        </w:tabs>
+        <w:spacing w:after="80"/>
+        <w:ind w:left="504" w:hanging="432"/>
+      </w:pPr>
+      <w:r>
+        <w:rPr>
+          <w:b/>
+          <w:color w:val="0369A1"/>
+        </w:rPr>
+        <w:t>1.</w:t>
+      </w:r>
+      <w:r>
+        <w:rPr>
+          <w:b/>
+          <w:color w:val="0369A1"/>
+        </w:rPr>
+        <w:tab/>
+      </w:r>
+      <w:r>
+        <w:t xml:space="preserve">Tap </w:t>
+      </w:r>
+      <w:r>
+        <w:rPr>
+          <w:b/>
+        </w:rPr>
+        <w:t>Add finance option</w:t>
+      </w:r>
+      <w:r>
+        <w:t xml:space="preserve"> and type its name.</w:t>
+      </w:r>
+    </w:p>
+    <w:p>
+      <w:pPr>
+        <w:tabs>
+          <w:tab w:val="left" w:pos="504"/>
+        </w:tabs>
+        <w:spacing w:after="80"/>
+        <w:ind w:left="504" w:hanging="432"/>
+      </w:pPr>
+      <w:r>
+        <w:rPr>
+          <w:b/>
+          <w:color w:val="0369A1"/>
+        </w:rPr>
+        <w:t>2.</w:t>
+      </w:r>
+      <w:r>
+        <w:rPr>
+          <w:b/>
+          <w:color w:val="0369A1"/>
+        </w:rPr>
+        <w:tab/>
+      </w:r>
+      <w:r>
+        <w:t>Use the arrows to change the order checkout sees them in, and the trash icon to remove one.</w:t>
+      </w:r>
+    </w:p>
+    <w:p>
+      <w:pPr>
+        <w:tabs>
+          <w:tab w:val="left" w:pos="504"/>
+        </w:tabs>
+        <w:spacing w:after="80"/>
+        <w:ind w:left="504" w:hanging="432"/>
+      </w:pPr>
+      <w:r>
+        <w:rPr>
+          <w:b/>
+          <w:color w:val="0369A1"/>
+        </w:rPr>
+        <w:t>3.</w:t>
+      </w:r>
+      <w:r>
+        <w:rPr>
+          <w:b/>
+          <w:color w:val="0369A1"/>
+        </w:rPr>
+        <w:tab/>
+      </w:r>
+      <w:r>
+        <w:t xml:space="preserve">Tap </w:t>
+      </w:r>
+      <w:r>
+        <w:rPr>
+          <w:b/>
+        </w:rPr>
+        <w:t>Save</w:t>
+      </w:r>
+      <w:r>
+        <w:t>.</w:t>
+      </w:r>
+    </w:p>
+    <w:tbl>
+      <w:tblPr>
+        <w:tblW w:w="0" w:type="auto"/>
+        <w:jc w:val="center"/>
+        <w:tblLook w:val="04A0" w:firstRow="1" w:lastRow="0" w:firstColumn="1" w:lastColumn="0" w:noHBand="0" w:noVBand="1"/>
+      </w:tblPr>
+      <w:tblGrid>
+        <w:gridCol w:w="9360"/>
+      </w:tblGrid>
+      <w:tr>
+        <w:trPr>
+          <w:jc w:val="center"/>
+        </w:trPr>
+        <w:tc>
+          <w:tcPr>
+            <w:tcW w:w="9360" w:type="dxa"/>
+            <w:tcBorders>
+              <w:top w:val="single" w:sz="4" w:space="0" w:color="F3F4F6"/>
+              <w:left w:val="single" w:sz="36" w:space="0" w:color="6B7280"/>
+              <w:bottom w:val="single" w:sz="4" w:space="0" w:color="F3F4F6"/>
+              <w:right w:val="single" w:sz="4" w:space="0" w:color="F3F4F6"/>
+            </w:tcBorders>
+            <w:shd w:val="clear" w:color="auto" w:fill="F3F4F6"/>
+            <w:tcMar>
+              <w:top w:w="120" w:type="dxa"/>
+              <w:left w:w="200" w:type="dxa"/>
+              <w:bottom w:w="120" w:type="dxa"/>
+              <w:right w:w="160" w:type="dxa"/>
+            </w:tcMar>
+          </w:tcPr>
+          <w:p>
+            <w:pPr>
+              <w:spacing w:after="0"/>
+            </w:pPr>
+            <w:r>
+              <w:rPr>
+                <w:b/>
+                <w:color w:val="6B7280"/>
+              </w:rPr>
+              <w:t xml:space="preserve">Good to know:  </w:t>
+            </w:r>
+            <w:r>
+              <w:t>Until any finance options are set up, checkout types the kind of financing in by hand. Removing an option doesn't change sales already recorded with it.</w:t>
+            </w:r>
+          </w:p>
+        </w:tc>
+      </w:tr>
+    </w:tbl>
+    <w:p>
+      <w:pPr>
+        <w:spacing w:after="40"/>
+      </w:pPr>
+    </w:p>
+    <w:p>
+      <w:pPr>
+        <w:pStyle w:val="Heading2"/>
+      </w:pPr>
       <w:bookmarkStart w:id="49" w:name="_Toc242297391"/>
       <w:r>
         <w:t>New events</w:t>
@@ -19816,6 +20267,37 @@
         <w:pStyle w:val="Heading3"/>
       </w:pPr>
       <w:r>
+        <w:t>Checkout won't record a financing payment.</w:t>
+      </w:r>
+    </w:p>
+    <w:p>
+      <w:r>
+        <w:t xml:space="preserve">Choose the </w:t>
+      </w:r>
+      <w:r>
+        <w:rPr>
+          <w:b/>
+        </w:rPr>
+        <w:t>Financing type</w:t>
+      </w:r>
+      <w:r>
+        <w:t xml:space="preserve"> and enter the </w:t>
+      </w:r>
+      <w:r>
+        <w:rPr>
+          <w:b/>
+        </w:rPr>
+        <w:t>Financing #</w:t>
+      </w:r>
+      <w:r>
+        <w:t xml:space="preserve"> first. Both are needed for a financing payment.</w:t>
+      </w:r>
+    </w:p>
+    <w:p>
+      <w:pPr>
+        <w:pStyle w:val="Heading3"/>
+      </w:pPr>
+      <w:r>
         <w:t>A product shows "Inquire" instead of a price.</w:t>
       </w:r>
     </w:p>
@@ -20373,7 +20855,7 @@
         <w:tab/>
       </w:r>
       <w:r>
-        <w:t xml:space="preserve">Pick the payment method, then </w:t>
+        <w:t xml:space="preserve">Pick the payment method (for financing, also the type and financing #), then </w:t>
       </w:r>
       <w:r>
         <w:rPr>

</xml_diff>

<commit_message>
User guide: financing options in the Catalog, Other at checkout
- Checkout: the financing type is picked from a list, with Other for
  typing one in when it's offered.
- Catalog: new "Financing options" section for the Financing Options tab.
- Settings: the Financing section now covers the Offer "Other" at
  checkout switch.
- Menu table, troubleshooting entry and table of contents updated.

Co-Authored-By: Claude Opus 5.5 <noreply@anthropic.com>
</commit_message>
<xml_diff>
--- a/Documents/CFS Sales App User Guide.docx
+++ b/Documents/CFS Sales App User Guide.docx
@@ -3317,6 +3317,74 @@
             <w:webHidden/>
           </w:rPr>
           <w:t>43</w:t>
+        </w:r>
+        <w:r>
+          <w:rPr>
+            <w:noProof/>
+            <w:webHidden/>
+          </w:rPr>
+          <w:fldChar w:fldCharType="end"/>
+        </w:r>
+      </w:hyperlink>
+    </w:p>
+    <w:p>
+      <w:pPr>
+        <w:pStyle w:val="TOC2"/>
+        <w:tabs>
+          <w:tab w:val="right" w:leader="dot" w:pos="9350"/>
+        </w:tabs>
+        <w:rPr>
+          <w:noProof/>
+        </w:rPr>
+      </w:pPr>
+      <w:hyperlink w:anchor="_Toc909000001" w:history="1">
+        <w:r>
+          <w:rPr>
+            <w:rStyle w:val="Hyperlink"/>
+            <w:noProof/>
+          </w:rPr>
+          <w:t>Financing options</w:t>
+        </w:r>
+        <w:r>
+          <w:rPr>
+            <w:noProof/>
+            <w:webHidden/>
+          </w:rPr>
+          <w:tab/>
+        </w:r>
+        <w:r>
+          <w:rPr>
+            <w:noProof/>
+            <w:webHidden/>
+          </w:rPr>
+          <w:fldChar w:fldCharType="begin"/>
+        </w:r>
+        <w:r>
+          <w:rPr>
+            <w:noProof/>
+            <w:webHidden/>
+          </w:rPr>
+          <w:instrText xml:space="preserve"> PAGEREF _Toc909000001 \h </w:instrText>
+        </w:r>
+        <w:r>
+          <w:rPr>
+            <w:noProof/>
+            <w:webHidden/>
+          </w:rPr>
+        </w:r>
+        <w:r>
+          <w:rPr>
+            <w:noProof/>
+            <w:webHidden/>
+          </w:rPr>
+          <w:fldChar w:fldCharType="separate"/>
+        </w:r>
+        <w:r>
+          <w:rPr>
+            <w:noProof/>
+            <w:webHidden/>
+          </w:rPr>
+          <w:t>45</w:t>
         </w:r>
         <w:r>
           <w:rPr>
@@ -6337,7 +6405,7 @@
               <w:spacing w:after="0"/>
             </w:pPr>
             <w:r>
-              <w:t>Admins: products, prices, sizes and delivery options.</w:t>
+              <w:t>Admins: products, prices, sizes, delivery options and financing options.</w:t>
             </w:r>
           </w:p>
         </w:tc>
@@ -9300,7 +9368,7 @@
         <w:tab/>
       </w:r>
       <w:r>
-        <w:t xml:space="preserve">For financing, choose the </w:t>
+        <w:t xml:space="preserve">For financing, pick the </w:t>
       </w:r>
       <w:r>
         <w:rPr>
@@ -9309,7 +9377,16 @@
         <w:t>Financing type</w:t>
       </w:r>
       <w:r>
-        <w:t xml:space="preserve"> and enter the </w:t>
+        <w:t xml:space="preserve"> from the list. If the customer's financing isn't listed, pick </w:t>
+      </w:r>
+      <w:r>
+        <w:rPr>
+          <w:b/>
+        </w:rPr>
+        <w:t>Other</w:t>
+      </w:r>
+      <w:r>
+        <w:t xml:space="preserve"> at the bottom (when it's offered) and type it in. Then enter the </w:t>
       </w:r>
       <w:r>
         <w:rPr>
@@ -9490,7 +9567,34 @@
         <w:spacing w:after="60"/>
       </w:pPr>
       <w:r>
-        <w:t xml:space="preserve">The financing types to choose from are set by an administrator under </w:t>
+        <w:t xml:space="preserve">The financing types in the list are set up in the Catalog, under </w:t>
+      </w:r>
+      <w:r>
+        <w:rPr>
+          <w:b/>
+        </w:rPr>
+        <w:t>Financing Options</w:t>
+      </w:r>
+      <w:r>
+        <w:t xml:space="preserve"> (see </w:t>
+      </w:r>
+      <w:r>
+        <w:rPr>
+          <w:b/>
+        </w:rPr>
+        <w:t>Admin: managing the catalog</w:t>
+      </w:r>
+      <w:r>
+        <w:t xml:space="preserve">). Whether </w:t>
+      </w:r>
+      <w:r>
+        <w:rPr>
+          <w:b/>
+        </w:rPr>
+        <w:t>Other</w:t>
+      </w:r>
+      <w:r>
+        <w:t xml:space="preserve"> is offered is set under </w:t>
       </w:r>
       <w:r>
         <w:rPr>
@@ -9508,7 +9612,7 @@
         <w:t>Admin: settings</w:t>
       </w:r>
       <w:r>
-        <w:t>). If none have been set up yet, type it in instead.</w:t>
+        <w:t>).</w:t>
       </w:r>
     </w:p>
     <w:p>
@@ -17299,6 +17403,275 @@
         </w:rPr>
         <w:t>This mattress gets $30 off White Glove; its other options follow their own sales</w:t>
       </w:r>
+    </w:p>
+    <w:p>
+      <w:pPr>
+        <w:pStyle w:val="Heading2"/>
+      </w:pPr>
+      <w:bookmarkStart w:id="9101" w:name="_Toc909000001"/>
+      <w:r>
+        <w:t>Financing options</w:t>
+      </w:r>
+      <w:bookmarkEnd w:id="9101"/>
+    </w:p>
+    <w:p>
+      <w:r>
+        <w:t xml:space="preserve">Tap the </w:t>
+      </w:r>
+      <w:r>
+        <w:rPr>
+          <w:b/>
+        </w:rPr>
+        <w:t>Financing Options</w:t>
+      </w:r>
+      <w:r>
+        <w:t xml:space="preserve"> tab in the Catalog to set up the kinds of financing a customer can choose, such as </w:t>
+      </w:r>
+      <w:r>
+        <w:rPr>
+          <w:b/>
+        </w:rPr>
+        <w:t>12 months no interest</w:t>
+      </w:r>
+      <w:r>
+        <w:t>. Checkout picks one from a list when a sale is financed.</w:t>
+      </w:r>
+    </w:p>
+    <w:p>
+      <w:pPr>
+        <w:tabs>
+          <w:tab w:val="left" w:pos="504"/>
+        </w:tabs>
+        <w:spacing w:after="80"/>
+        <w:ind w:left="504" w:hanging="432"/>
+      </w:pPr>
+      <w:r>
+        <w:rPr>
+          <w:b/>
+          <w:color w:val="0369A1"/>
+        </w:rPr>
+        <w:t>1.</w:t>
+      </w:r>
+      <w:r>
+        <w:rPr>
+          <w:b/>
+          <w:color w:val="0369A1"/>
+        </w:rPr>
+        <w:tab/>
+      </w:r>
+      <w:r>
+        <w:t xml:space="preserve">Tap </w:t>
+      </w:r>
+      <w:r>
+        <w:rPr>
+          <w:b/>
+        </w:rPr>
+        <w:t>Add</w:t>
+      </w:r>
+      <w:r>
+        <w:t>.</w:t>
+      </w:r>
+    </w:p>
+    <w:p>
+      <w:pPr>
+        <w:tabs>
+          <w:tab w:val="left" w:pos="504"/>
+        </w:tabs>
+        <w:spacing w:after="80"/>
+        <w:ind w:left="504" w:hanging="432"/>
+      </w:pPr>
+      <w:r>
+        <w:rPr>
+          <w:b/>
+          <w:color w:val="0369A1"/>
+        </w:rPr>
+        <w:t>2.</w:t>
+      </w:r>
+      <w:r>
+        <w:rPr>
+          <w:b/>
+          <w:color w:val="0369A1"/>
+        </w:rPr>
+        <w:tab/>
+      </w:r>
+      <w:r>
+        <w:t xml:space="preserve">Type the </w:t>
+      </w:r>
+      <w:r>
+        <w:rPr>
+          <w:b/>
+        </w:rPr>
+        <w:t>Name</w:t>
+      </w:r>
+      <w:r>
+        <w:t>.</w:t>
+      </w:r>
+    </w:p>
+    <w:p>
+      <w:pPr>
+        <w:tabs>
+          <w:tab w:val="left" w:pos="504"/>
+        </w:tabs>
+        <w:spacing w:after="80"/>
+        <w:ind w:left="504" w:hanging="432"/>
+      </w:pPr>
+      <w:r>
+        <w:rPr>
+          <w:b/>
+          <w:color w:val="0369A1"/>
+        </w:rPr>
+        <w:t>3.</w:t>
+      </w:r>
+      <w:r>
+        <w:rPr>
+          <w:b/>
+          <w:color w:val="0369A1"/>
+        </w:rPr>
+        <w:tab/>
+      </w:r>
+      <w:r>
+        <w:t xml:space="preserve">Leave </w:t>
+      </w:r>
+      <w:r>
+        <w:rPr>
+          <w:b/>
+        </w:rPr>
+        <w:t>Offered at checkout</w:t>
+      </w:r>
+      <w:r>
+        <w:t xml:space="preserve"> ticked and tap </w:t>
+      </w:r>
+      <w:r>
+        <w:rPr>
+          <w:b/>
+        </w:rPr>
+        <w:t>Save</w:t>
+      </w:r>
+      <w:r>
+        <w:t>.</w:t>
+      </w:r>
+    </w:p>
+    <w:p>
+      <w:pPr>
+        <w:pStyle w:val="ListBullet"/>
+        <w:spacing w:after="60"/>
+      </w:pPr>
+      <w:r>
+        <w:t>Use the arrows to change the order checkout lists them in.</w:t>
+      </w:r>
+    </w:p>
+    <w:p>
+      <w:pPr>
+        <w:pStyle w:val="ListBullet"/>
+        <w:spacing w:after="60"/>
+      </w:pPr>
+      <w:r>
+        <w:rPr>
+          <w:b/>
+        </w:rPr>
+        <w:t>Edit</w:t>
+      </w:r>
+      <w:r>
+        <w:t xml:space="preserve"> renames an option, or untick </w:t>
+      </w:r>
+      <w:r>
+        <w:rPr>
+          <w:b/>
+        </w:rPr>
+        <w:t>Offered at checkout</w:t>
+      </w:r>
+      <w:r>
+        <w:t xml:space="preserve"> to take it off the list without deleting it.</w:t>
+      </w:r>
+    </w:p>
+    <w:p>
+      <w:pPr>
+        <w:pStyle w:val="ListBullet"/>
+        <w:spacing w:after="60"/>
+      </w:pPr>
+      <w:r>
+        <w:t>The trash icon deletes an option.</w:t>
+      </w:r>
+    </w:p>
+    <w:tbl>
+      <w:tblPr>
+        <w:tblW w:w="0" w:type="auto"/>
+        <w:jc w:val="center"/>
+        <w:tblLook w:val="04A0" w:firstRow="1" w:lastRow="0" w:firstColumn="1" w:lastColumn="0" w:noHBand="0" w:noVBand="1"/>
+      </w:tblPr>
+      <w:tblGrid>
+        <w:gridCol w:w="9360"/>
+      </w:tblGrid>
+      <w:tr>
+        <w:trPr>
+          <w:jc w:val="center"/>
+        </w:trPr>
+        <w:tc>
+          <w:tcPr>
+            <w:tcW w:w="9360" w:type="dxa"/>
+            <w:tcBorders>
+              <w:top w:val="single" w:sz="4" w:space="0" w:color="F3F4F6"/>
+              <w:left w:val="single" w:sz="36" w:space="0" w:color="6B7280"/>
+              <w:bottom w:val="single" w:sz="4" w:space="0" w:color="F3F4F6"/>
+              <w:right w:val="single" w:sz="4" w:space="0" w:color="F3F4F6"/>
+            </w:tcBorders>
+            <w:shd w:val="clear" w:color="auto" w:fill="F3F4F6"/>
+            <w:tcMar>
+              <w:top w:w="120" w:type="dxa"/>
+              <w:left w:w="200" w:type="dxa"/>
+              <w:bottom w:w="120" w:type="dxa"/>
+              <w:right w:w="160" w:type="dxa"/>
+            </w:tcMar>
+          </w:tcPr>
+          <w:p>
+            <w:pPr>
+              <w:spacing w:after="0"/>
+            </w:pPr>
+            <w:r>
+              <w:rPr>
+                <w:b/>
+                <w:color w:val="6B7280"/>
+              </w:rPr>
+              <w:t xml:space="preserve">Good to know:  </w:t>
+            </w:r>
+            <w:r>
+              <w:t xml:space="preserve">Renaming or deleting an option never changes a sale already recorded with it. Whether checkout can also pick </w:t>
+            </w:r>
+            <w:r>
+              <w:rPr>
+                <w:b/>
+              </w:rPr>
+              <w:t>Other</w:t>
+            </w:r>
+            <w:r>
+              <w:t xml:space="preserve"> and type one in is set under </w:t>
+            </w:r>
+            <w:r>
+              <w:rPr>
+                <w:b/>
+              </w:rPr>
+              <w:t>Settings</w:t>
+            </w:r>
+            <w:r>
+              <w:t xml:space="preserve"> (see </w:t>
+            </w:r>
+            <w:r>
+              <w:rPr>
+                <w:b/>
+              </w:rPr>
+              <w:t>Admin: settings</w:t>
+            </w:r>
+            <w:r>
+              <w:t>).</w:t>
+            </w:r>
+          </w:p>
+        </w:tc>
+      </w:tr>
+    </w:tbl>
+    <w:p>
+      <w:pPr>
+        <w:spacing w:after="40"/>
+      </w:pPr>
     </w:p>
     <w:p>
       <w:pPr>
@@ -19523,25 +19896,7 @@
     </w:p>
     <w:p>
       <w:r>
-        <w:t xml:space="preserve">The kinds of financing a customer can choose, such as </w:t>
-      </w:r>
-      <w:r>
-        <w:rPr>
-          <w:b/>
-        </w:rPr>
-        <w:t>12 months no interest</w:t>
-      </w:r>
-      <w:r>
-        <w:t xml:space="preserve">. When checkout records a </w:t>
-      </w:r>
-      <w:r>
-        <w:rPr>
-          <w:b/>
-        </w:rPr>
-        <w:t>Financing</w:t>
-      </w:r>
-      <w:r>
-        <w:t xml:space="preserve"> payment, they pick one of these as the </w:t>
+        <w:t xml:space="preserve">Choose whether checkout's </w:t>
       </w:r>
       <w:r>
         <w:rPr>
@@ -19550,112 +19905,34 @@
         <w:t>Financing type</w:t>
       </w:r>
       <w:r>
-        <w:t xml:space="preserve"> and enter the </w:t>
-      </w:r>
-      <w:r>
-        <w:rPr>
-          <w:b/>
-        </w:rPr>
-        <w:t>Financing #</w:t>
-      </w:r>
-      <w:r>
-        <w:t xml:space="preserve">. Both print in the </w:t>
-      </w:r>
-      <w:r>
-        <w:rPr>
-          <w:b/>
-        </w:rPr>
-        <w:t>Comments</w:t>
-      </w:r>
-      <w:r>
-        <w:t xml:space="preserve"> box of the sales sheet, with the amount financed.</w:t>
-      </w:r>
-    </w:p>
-    <w:p>
-      <w:pPr>
-        <w:tabs>
-          <w:tab w:val="left" w:pos="504"/>
-        </w:tabs>
-        <w:spacing w:after="80"/>
-        <w:ind w:left="504" w:hanging="432"/>
-      </w:pPr>
-      <w:r>
-        <w:rPr>
-          <w:b/>
-          <w:color w:val="0369A1"/>
-        </w:rPr>
-        <w:t>1.</w:t>
-      </w:r>
-      <w:r>
-        <w:rPr>
-          <w:b/>
-          <w:color w:val="0369A1"/>
-        </w:rPr>
-        <w:tab/>
-      </w:r>
-      <w:r>
-        <w:t xml:space="preserve">Tap </w:t>
-      </w:r>
-      <w:r>
-        <w:rPr>
-          <w:b/>
-        </w:rPr>
-        <w:t>Add finance option</w:t>
-      </w:r>
-      <w:r>
-        <w:t xml:space="preserve"> and type its name.</w:t>
-      </w:r>
-    </w:p>
-    <w:p>
-      <w:pPr>
-        <w:tabs>
-          <w:tab w:val="left" w:pos="504"/>
-        </w:tabs>
-        <w:spacing w:after="80"/>
-        <w:ind w:left="504" w:hanging="432"/>
-      </w:pPr>
-      <w:r>
-        <w:rPr>
-          <w:b/>
-          <w:color w:val="0369A1"/>
-        </w:rPr>
-        <w:t>2.</w:t>
-      </w:r>
-      <w:r>
-        <w:rPr>
-          <w:b/>
-          <w:color w:val="0369A1"/>
-        </w:rPr>
-        <w:tab/>
-      </w:r>
-      <w:r>
-        <w:t>Use the arrows to change the order checkout sees them in, and the trash icon to remove one.</w:t>
-      </w:r>
-    </w:p>
-    <w:p>
-      <w:pPr>
-        <w:tabs>
-          <w:tab w:val="left" w:pos="504"/>
-        </w:tabs>
-        <w:spacing w:after="80"/>
-        <w:ind w:left="504" w:hanging="432"/>
-      </w:pPr>
-      <w:r>
-        <w:rPr>
-          <w:b/>
-          <w:color w:val="0369A1"/>
-        </w:rPr>
-        <w:t>3.</w:t>
-      </w:r>
-      <w:r>
-        <w:rPr>
-          <w:b/>
-          <w:color w:val="0369A1"/>
-        </w:rPr>
-        <w:tab/>
-      </w:r>
-      <w:r>
-        <w:t xml:space="preserve">Tap </w:t>
+        <w:t xml:space="preserve"> list ends with </w:t>
+      </w:r>
+      <w:r>
+        <w:rPr>
+          <w:b/>
+        </w:rPr>
+        <w:t>Other</w:t>
+      </w:r>
+      <w:r>
+        <w:t xml:space="preserve">. With </w:t>
+      </w:r>
+      <w:r>
+        <w:rPr>
+          <w:b/>
+        </w:rPr>
+        <w:t>Offer "Other" at checkout</w:t>
+      </w:r>
+      <w:r>
+        <w:t xml:space="preserve"> ticked (the normal setting), checkout can pick </w:t>
+      </w:r>
+      <w:r>
+        <w:rPr>
+          <w:b/>
+        </w:rPr>
+        <w:t>Other</w:t>
+      </w:r>
+      <w:r>
+        <w:t xml:space="preserve"> and type in a kind of financing that isn't one of the financing options. Untick it so checkout can only pick from the list, then tap </w:t>
       </w:r>
       <w:r>
         <w:rPr>
@@ -19709,7 +19986,16 @@
               <w:t xml:space="preserve">Good to know:  </w:t>
             </w:r>
             <w:r>
-              <w:t>Until any finance options are set up, checkout types the kind of financing in by hand. Removing an option doesn't change sales already recorded with it.</w:t>
+              <w:t xml:space="preserve">The financing options themselves are set up in the Catalog (see </w:t>
+            </w:r>
+            <w:r>
+              <w:rPr>
+                <w:b/>
+              </w:rPr>
+              <w:t>Admin: managing the catalog</w:t>
+            </w:r>
+            <w:r>
+              <w:t>).</w:t>
             </w:r>
           </w:p>
         </w:tc>
@@ -20281,7 +20567,16 @@
         <w:t>Financing type</w:t>
       </w:r>
       <w:r>
-        <w:t xml:space="preserve"> and enter the </w:t>
+        <w:t xml:space="preserve"> (or </w:t>
+      </w:r>
+      <w:r>
+        <w:rPr>
+          <w:b/>
+        </w:rPr>
+        <w:t>Other</w:t>
+      </w:r>
+      <w:r>
+        <w:t xml:space="preserve"> and type it in) and enter the </w:t>
       </w:r>
       <w:r>
         <w:rPr>
@@ -20290,7 +20585,7 @@
         <w:t>Financing #</w:t>
       </w:r>
       <w:r>
-        <w:t xml:space="preserve"> first. Both are needed for a financing payment.</w:t>
+        <w:t xml:space="preserve"> first. Both are needed. If the list is empty and there's no Other, an administrator needs to add financing options in the Catalog.</w:t>
       </w:r>
     </w:p>
     <w:p>

</xml_diff>

<commit_message>
Reorder items and delivery options; financing in catalog files
Arrows on each item on Sell and Checkout move it up or down the order,
and the sales sheet prints in that order. The rows under an item always
follow it in the same order - included items, then upcharges, then
shipping and services - however they were added.

The Delivery tab in the Catalog gets the same arrows as financing
options, setting the order the floor offers them in; a new option goes
to the end.

Catalog export now includes the financing options, in order, and a
restore matches them by name. A file made before they were exported
leaves the current financing options alone, even on a replace.

Co-Authored-By: Claude Opus 5.5 <noreply@anthropic.com>
</commit_message>
<xml_diff>
--- a/Documents/CFS Sales App User Guide.docx
+++ b/Documents/CFS Sales App User Guide.docx
@@ -345,7 +345,7 @@
       <w:r>
         <w:fldChar w:fldCharType="separate"/>
       </w:r>
-      <w:hyperlink w:anchor="_Toc242436260" w:history="1">
+      <w:hyperlink w:anchor="_Toc242438343" w:history="1">
         <w:r>
           <w:rPr>
             <w:rStyle w:val="Hyperlink"/>
@@ -372,7 +372,7 @@
             <w:noProof/>
             <w:webHidden/>
           </w:rPr>
-          <w:instrText xml:space="preserve"> PAGEREF _Toc242436260 \h </w:instrText>
+          <w:instrText xml:space="preserve"> PAGEREF _Toc242438343 \h </w:instrText>
         </w:r>
         <w:r>
           <w:rPr>
@@ -413,7 +413,7 @@
           <w:noProof/>
         </w:rPr>
       </w:pPr>
-      <w:hyperlink w:anchor="_Toc242436261" w:history="1">
+      <w:hyperlink w:anchor="_Toc242438344" w:history="1">
         <w:r>
           <w:rPr>
             <w:rStyle w:val="Hyperlink"/>
@@ -440,7 +440,7 @@
             <w:noProof/>
             <w:webHidden/>
           </w:rPr>
-          <w:instrText xml:space="preserve"> PAGEREF _Toc242436261 \h </w:instrText>
+          <w:instrText xml:space="preserve"> PAGEREF _Toc242438344 \h </w:instrText>
         </w:r>
         <w:r>
           <w:rPr>
@@ -481,7 +481,7 @@
           <w:noProof/>
         </w:rPr>
       </w:pPr>
-      <w:hyperlink w:anchor="_Toc242436262" w:history="1">
+      <w:hyperlink w:anchor="_Toc242438345" w:history="1">
         <w:r>
           <w:rPr>
             <w:rStyle w:val="Hyperlink"/>
@@ -508,7 +508,7 @@
             <w:noProof/>
             <w:webHidden/>
           </w:rPr>
-          <w:instrText xml:space="preserve"> PAGEREF _Toc242436262 \h </w:instrText>
+          <w:instrText xml:space="preserve"> PAGEREF _Toc242438345 \h </w:instrText>
         </w:r>
         <w:r>
           <w:rPr>
@@ -549,7 +549,7 @@
           <w:noProof/>
         </w:rPr>
       </w:pPr>
-      <w:hyperlink w:anchor="_Toc242436263" w:history="1">
+      <w:hyperlink w:anchor="_Toc242438346" w:history="1">
         <w:r>
           <w:rPr>
             <w:rStyle w:val="Hyperlink"/>
@@ -576,7 +576,7 @@
             <w:noProof/>
             <w:webHidden/>
           </w:rPr>
-          <w:instrText xml:space="preserve"> PAGEREF _Toc242436263 \h </w:instrText>
+          <w:instrText xml:space="preserve"> PAGEREF _Toc242438346 \h </w:instrText>
         </w:r>
         <w:r>
           <w:rPr>
@@ -617,7 +617,7 @@
           <w:noProof/>
         </w:rPr>
       </w:pPr>
-      <w:hyperlink w:anchor="_Toc242436264" w:history="1">
+      <w:hyperlink w:anchor="_Toc242438347" w:history="1">
         <w:r>
           <w:rPr>
             <w:rStyle w:val="Hyperlink"/>
@@ -644,7 +644,7 @@
             <w:noProof/>
             <w:webHidden/>
           </w:rPr>
-          <w:instrText xml:space="preserve"> PAGEREF _Toc242436264 \h </w:instrText>
+          <w:instrText xml:space="preserve"> PAGEREF _Toc242438347 \h </w:instrText>
         </w:r>
         <w:r>
           <w:rPr>
@@ -685,7 +685,7 @@
           <w:noProof/>
         </w:rPr>
       </w:pPr>
-      <w:hyperlink w:anchor="_Toc242436265" w:history="1">
+      <w:hyperlink w:anchor="_Toc242438348" w:history="1">
         <w:r>
           <w:rPr>
             <w:rStyle w:val="Hyperlink"/>
@@ -712,7 +712,7 @@
             <w:noProof/>
             <w:webHidden/>
           </w:rPr>
-          <w:instrText xml:space="preserve"> PAGEREF _Toc242436265 \h </w:instrText>
+          <w:instrText xml:space="preserve"> PAGEREF _Toc242438348 \h </w:instrText>
         </w:r>
         <w:r>
           <w:rPr>
@@ -753,7 +753,7 @@
           <w:noProof/>
         </w:rPr>
       </w:pPr>
-      <w:hyperlink w:anchor="_Toc242436266" w:history="1">
+      <w:hyperlink w:anchor="_Toc242438349" w:history="1">
         <w:r>
           <w:rPr>
             <w:rStyle w:val="Hyperlink"/>
@@ -780,7 +780,7 @@
             <w:noProof/>
             <w:webHidden/>
           </w:rPr>
-          <w:instrText xml:space="preserve"> PAGEREF _Toc242436266 \h </w:instrText>
+          <w:instrText xml:space="preserve"> PAGEREF _Toc242438349 \h </w:instrText>
         </w:r>
         <w:r>
           <w:rPr>
@@ -821,7 +821,7 @@
           <w:noProof/>
         </w:rPr>
       </w:pPr>
-      <w:hyperlink w:anchor="_Toc242436267" w:history="1">
+      <w:hyperlink w:anchor="_Toc242438350" w:history="1">
         <w:r>
           <w:rPr>
             <w:rStyle w:val="Hyperlink"/>
@@ -848,7 +848,7 @@
             <w:noProof/>
             <w:webHidden/>
           </w:rPr>
-          <w:instrText xml:space="preserve"> PAGEREF _Toc242436267 \h </w:instrText>
+          <w:instrText xml:space="preserve"> PAGEREF _Toc242438350 \h </w:instrText>
         </w:r>
         <w:r>
           <w:rPr>
@@ -889,7 +889,7 @@
           <w:noProof/>
         </w:rPr>
       </w:pPr>
-      <w:hyperlink w:anchor="_Toc242436268" w:history="1">
+      <w:hyperlink w:anchor="_Toc242438351" w:history="1">
         <w:r>
           <w:rPr>
             <w:rStyle w:val="Hyperlink"/>
@@ -916,7 +916,7 @@
             <w:noProof/>
             <w:webHidden/>
           </w:rPr>
-          <w:instrText xml:space="preserve"> PAGEREF _Toc242436268 \h </w:instrText>
+          <w:instrText xml:space="preserve"> PAGEREF _Toc242438351 \h </w:instrText>
         </w:r>
         <w:r>
           <w:rPr>
@@ -957,7 +957,7 @@
           <w:noProof/>
         </w:rPr>
       </w:pPr>
-      <w:hyperlink w:anchor="_Toc242436269" w:history="1">
+      <w:hyperlink w:anchor="_Toc242438352" w:history="1">
         <w:r>
           <w:rPr>
             <w:rStyle w:val="Hyperlink"/>
@@ -984,7 +984,7 @@
             <w:noProof/>
             <w:webHidden/>
           </w:rPr>
-          <w:instrText xml:space="preserve"> PAGEREF _Toc242436269 \h </w:instrText>
+          <w:instrText xml:space="preserve"> PAGEREF _Toc242438352 \h </w:instrText>
         </w:r>
         <w:r>
           <w:rPr>
@@ -1025,7 +1025,7 @@
           <w:noProof/>
         </w:rPr>
       </w:pPr>
-      <w:hyperlink w:anchor="_Toc242436270" w:history="1">
+      <w:hyperlink w:anchor="_Toc242438353" w:history="1">
         <w:r>
           <w:rPr>
             <w:rStyle w:val="Hyperlink"/>
@@ -1052,7 +1052,7 @@
             <w:noProof/>
             <w:webHidden/>
           </w:rPr>
-          <w:instrText xml:space="preserve"> PAGEREF _Toc242436270 \h </w:instrText>
+          <w:instrText xml:space="preserve"> PAGEREF _Toc242438353 \h </w:instrText>
         </w:r>
         <w:r>
           <w:rPr>
@@ -1093,7 +1093,7 @@
           <w:noProof/>
         </w:rPr>
       </w:pPr>
-      <w:hyperlink w:anchor="_Toc242436271" w:history="1">
+      <w:hyperlink w:anchor="_Toc242438354" w:history="1">
         <w:r>
           <w:rPr>
             <w:rStyle w:val="Hyperlink"/>
@@ -1120,7 +1120,7 @@
             <w:noProof/>
             <w:webHidden/>
           </w:rPr>
-          <w:instrText xml:space="preserve"> PAGEREF _Toc242436271 \h </w:instrText>
+          <w:instrText xml:space="preserve"> PAGEREF _Toc242438354 \h </w:instrText>
         </w:r>
         <w:r>
           <w:rPr>
@@ -1161,7 +1161,7 @@
           <w:noProof/>
         </w:rPr>
       </w:pPr>
-      <w:hyperlink w:anchor="_Toc242436272" w:history="1">
+      <w:hyperlink w:anchor="_Toc242438355" w:history="1">
         <w:r>
           <w:rPr>
             <w:rStyle w:val="Hyperlink"/>
@@ -1188,7 +1188,7 @@
             <w:noProof/>
             <w:webHidden/>
           </w:rPr>
-          <w:instrText xml:space="preserve"> PAGEREF _Toc242436272 \h </w:instrText>
+          <w:instrText xml:space="preserve"> PAGEREF _Toc242438355 \h </w:instrText>
         </w:r>
         <w:r>
           <w:rPr>
@@ -1229,7 +1229,7 @@
           <w:noProof/>
         </w:rPr>
       </w:pPr>
-      <w:hyperlink w:anchor="_Toc242436273" w:history="1">
+      <w:hyperlink w:anchor="_Toc242438356" w:history="1">
         <w:r>
           <w:rPr>
             <w:rStyle w:val="Hyperlink"/>
@@ -1256,7 +1256,7 @@
             <w:noProof/>
             <w:webHidden/>
           </w:rPr>
-          <w:instrText xml:space="preserve"> PAGEREF _Toc242436273 \h </w:instrText>
+          <w:instrText xml:space="preserve"> PAGEREF _Toc242438356 \h </w:instrText>
         </w:r>
         <w:r>
           <w:rPr>
@@ -1297,7 +1297,7 @@
           <w:noProof/>
         </w:rPr>
       </w:pPr>
-      <w:hyperlink w:anchor="_Toc242436274" w:history="1">
+      <w:hyperlink w:anchor="_Toc242438357" w:history="1">
         <w:r>
           <w:rPr>
             <w:rStyle w:val="Hyperlink"/>
@@ -1324,7 +1324,7 @@
             <w:noProof/>
             <w:webHidden/>
           </w:rPr>
-          <w:instrText xml:space="preserve"> PAGEREF _Toc242436274 \h </w:instrText>
+          <w:instrText xml:space="preserve"> PAGEREF _Toc242438357 \h </w:instrText>
         </w:r>
         <w:r>
           <w:rPr>
@@ -1365,7 +1365,7 @@
           <w:noProof/>
         </w:rPr>
       </w:pPr>
-      <w:hyperlink w:anchor="_Toc242436275" w:history="1">
+      <w:hyperlink w:anchor="_Toc242438358" w:history="1">
         <w:r>
           <w:rPr>
             <w:rStyle w:val="Hyperlink"/>
@@ -1392,7 +1392,7 @@
             <w:noProof/>
             <w:webHidden/>
           </w:rPr>
-          <w:instrText xml:space="preserve"> PAGEREF _Toc242436275 \h </w:instrText>
+          <w:instrText xml:space="preserve"> PAGEREF _Toc242438358 \h </w:instrText>
         </w:r>
         <w:r>
           <w:rPr>
@@ -1433,7 +1433,7 @@
           <w:noProof/>
         </w:rPr>
       </w:pPr>
-      <w:hyperlink w:anchor="_Toc242436276" w:history="1">
+      <w:hyperlink w:anchor="_Toc242438359" w:history="1">
         <w:r>
           <w:rPr>
             <w:rStyle w:val="Hyperlink"/>
@@ -1460,7 +1460,7 @@
             <w:noProof/>
             <w:webHidden/>
           </w:rPr>
-          <w:instrText xml:space="preserve"> PAGEREF _Toc242436276 \h </w:instrText>
+          <w:instrText xml:space="preserve"> PAGEREF _Toc242438359 \h </w:instrText>
         </w:r>
         <w:r>
           <w:rPr>
@@ -1501,7 +1501,7 @@
           <w:noProof/>
         </w:rPr>
       </w:pPr>
-      <w:hyperlink w:anchor="_Toc242436277" w:history="1">
+      <w:hyperlink w:anchor="_Toc242438360" w:history="1">
         <w:r>
           <w:rPr>
             <w:rStyle w:val="Hyperlink"/>
@@ -1528,7 +1528,7 @@
             <w:noProof/>
             <w:webHidden/>
           </w:rPr>
-          <w:instrText xml:space="preserve"> PAGEREF _Toc242436277 \h </w:instrText>
+          <w:instrText xml:space="preserve"> PAGEREF _Toc242438360 \h </w:instrText>
         </w:r>
         <w:r>
           <w:rPr>
@@ -1548,7 +1548,7 @@
             <w:noProof/>
             <w:webHidden/>
           </w:rPr>
-          <w:t>16</w:t>
+          <w:t>17</w:t>
         </w:r>
         <w:r>
           <w:rPr>
@@ -1569,7 +1569,7 @@
           <w:noProof/>
         </w:rPr>
       </w:pPr>
-      <w:hyperlink w:anchor="_Toc242436278" w:history="1">
+      <w:hyperlink w:anchor="_Toc242438361" w:history="1">
         <w:r>
           <w:rPr>
             <w:rStyle w:val="Hyperlink"/>
@@ -1596,7 +1596,7 @@
             <w:noProof/>
             <w:webHidden/>
           </w:rPr>
-          <w:instrText xml:space="preserve"> PAGEREF _Toc242436278 \h </w:instrText>
+          <w:instrText xml:space="preserve"> PAGEREF _Toc242438361 \h </w:instrText>
         </w:r>
         <w:r>
           <w:rPr>
@@ -1616,7 +1616,7 @@
             <w:noProof/>
             <w:webHidden/>
           </w:rPr>
-          <w:t>17</w:t>
+          <w:t>18</w:t>
         </w:r>
         <w:r>
           <w:rPr>
@@ -1637,7 +1637,7 @@
           <w:noProof/>
         </w:rPr>
       </w:pPr>
-      <w:hyperlink w:anchor="_Toc242436279" w:history="1">
+      <w:hyperlink w:anchor="_Toc242438362" w:history="1">
         <w:r>
           <w:rPr>
             <w:rStyle w:val="Hyperlink"/>
@@ -1664,7 +1664,7 @@
             <w:noProof/>
             <w:webHidden/>
           </w:rPr>
-          <w:instrText xml:space="preserve"> PAGEREF _Toc242436279 \h </w:instrText>
+          <w:instrText xml:space="preserve"> PAGEREF _Toc242438362 \h </w:instrText>
         </w:r>
         <w:r>
           <w:rPr>
@@ -1684,7 +1684,7 @@
             <w:noProof/>
             <w:webHidden/>
           </w:rPr>
-          <w:t>18</w:t>
+          <w:t>19</w:t>
         </w:r>
         <w:r>
           <w:rPr>
@@ -1705,7 +1705,7 @@
           <w:noProof/>
         </w:rPr>
       </w:pPr>
-      <w:hyperlink w:anchor="_Toc242436280" w:history="1">
+      <w:hyperlink w:anchor="_Toc242438363" w:history="1">
         <w:r>
           <w:rPr>
             <w:rStyle w:val="Hyperlink"/>
@@ -1732,7 +1732,7 @@
             <w:noProof/>
             <w:webHidden/>
           </w:rPr>
-          <w:instrText xml:space="preserve"> PAGEREF _Toc242436280 \h </w:instrText>
+          <w:instrText xml:space="preserve"> PAGEREF _Toc242438363 \h </w:instrText>
         </w:r>
         <w:r>
           <w:rPr>
@@ -1752,7 +1752,7 @@
             <w:noProof/>
             <w:webHidden/>
           </w:rPr>
-          <w:t>19</w:t>
+          <w:t>20</w:t>
         </w:r>
         <w:r>
           <w:rPr>
@@ -1773,7 +1773,7 @@
           <w:noProof/>
         </w:rPr>
       </w:pPr>
-      <w:hyperlink w:anchor="_Toc242436281" w:history="1">
+      <w:hyperlink w:anchor="_Toc242438364" w:history="1">
         <w:r>
           <w:rPr>
             <w:rStyle w:val="Hyperlink"/>
@@ -1800,7 +1800,7 @@
             <w:noProof/>
             <w:webHidden/>
           </w:rPr>
-          <w:instrText xml:space="preserve"> PAGEREF _Toc242436281 \h </w:instrText>
+          <w:instrText xml:space="preserve"> PAGEREF _Toc242438364 \h </w:instrText>
         </w:r>
         <w:r>
           <w:rPr>
@@ -1820,7 +1820,7 @@
             <w:noProof/>
             <w:webHidden/>
           </w:rPr>
-          <w:t>19</w:t>
+          <w:t>20</w:t>
         </w:r>
         <w:r>
           <w:rPr>
@@ -1841,7 +1841,7 @@
           <w:noProof/>
         </w:rPr>
       </w:pPr>
-      <w:hyperlink w:anchor="_Toc242436282" w:history="1">
+      <w:hyperlink w:anchor="_Toc242438365" w:history="1">
         <w:r>
           <w:rPr>
             <w:rStyle w:val="Hyperlink"/>
@@ -1868,7 +1868,7 @@
             <w:noProof/>
             <w:webHidden/>
           </w:rPr>
-          <w:instrText xml:space="preserve"> PAGEREF _Toc242436282 \h </w:instrText>
+          <w:instrText xml:space="preserve"> PAGEREF _Toc242438365 \h </w:instrText>
         </w:r>
         <w:r>
           <w:rPr>
@@ -1888,7 +1888,7 @@
             <w:noProof/>
             <w:webHidden/>
           </w:rPr>
-          <w:t>19</w:t>
+          <w:t>20</w:t>
         </w:r>
         <w:r>
           <w:rPr>
@@ -1909,7 +1909,7 @@
           <w:noProof/>
         </w:rPr>
       </w:pPr>
-      <w:hyperlink w:anchor="_Toc242436283" w:history="1">
+      <w:hyperlink w:anchor="_Toc242438366" w:history="1">
         <w:r>
           <w:rPr>
             <w:rStyle w:val="Hyperlink"/>
@@ -1936,7 +1936,7 @@
             <w:noProof/>
             <w:webHidden/>
           </w:rPr>
-          <w:instrText xml:space="preserve"> PAGEREF _Toc242436283 \h </w:instrText>
+          <w:instrText xml:space="preserve"> PAGEREF _Toc242438366 \h </w:instrText>
         </w:r>
         <w:r>
           <w:rPr>
@@ -1956,7 +1956,7 @@
             <w:noProof/>
             <w:webHidden/>
           </w:rPr>
-          <w:t>20</w:t>
+          <w:t>21</w:t>
         </w:r>
         <w:r>
           <w:rPr>
@@ -1977,7 +1977,7 @@
           <w:noProof/>
         </w:rPr>
       </w:pPr>
-      <w:hyperlink w:anchor="_Toc242436284" w:history="1">
+      <w:hyperlink w:anchor="_Toc242438367" w:history="1">
         <w:r>
           <w:rPr>
             <w:rStyle w:val="Hyperlink"/>
@@ -2004,7 +2004,7 @@
             <w:noProof/>
             <w:webHidden/>
           </w:rPr>
-          <w:instrText xml:space="preserve"> PAGEREF _Toc242436284 \h </w:instrText>
+          <w:instrText xml:space="preserve"> PAGEREF _Toc242438367 \h </w:instrText>
         </w:r>
         <w:r>
           <w:rPr>
@@ -2024,7 +2024,7 @@
             <w:noProof/>
             <w:webHidden/>
           </w:rPr>
-          <w:t>21</w:t>
+          <w:t>22</w:t>
         </w:r>
         <w:r>
           <w:rPr>
@@ -2045,7 +2045,7 @@
           <w:noProof/>
         </w:rPr>
       </w:pPr>
-      <w:hyperlink w:anchor="_Toc242436285" w:history="1">
+      <w:hyperlink w:anchor="_Toc242438368" w:history="1">
         <w:r>
           <w:rPr>
             <w:rStyle w:val="Hyperlink"/>
@@ -2072,7 +2072,7 @@
             <w:noProof/>
             <w:webHidden/>
           </w:rPr>
-          <w:instrText xml:space="preserve"> PAGEREF _Toc242436285 \h </w:instrText>
+          <w:instrText xml:space="preserve"> PAGEREF _Toc242438368 \h </w:instrText>
         </w:r>
         <w:r>
           <w:rPr>
@@ -2092,7 +2092,7 @@
             <w:noProof/>
             <w:webHidden/>
           </w:rPr>
-          <w:t>22</w:t>
+          <w:t>23</w:t>
         </w:r>
         <w:r>
           <w:rPr>
@@ -2113,7 +2113,7 @@
           <w:noProof/>
         </w:rPr>
       </w:pPr>
-      <w:hyperlink w:anchor="_Toc242436286" w:history="1">
+      <w:hyperlink w:anchor="_Toc242438369" w:history="1">
         <w:r>
           <w:rPr>
             <w:rStyle w:val="Hyperlink"/>
@@ -2140,7 +2140,7 @@
             <w:noProof/>
             <w:webHidden/>
           </w:rPr>
-          <w:instrText xml:space="preserve"> PAGEREF _Toc242436286 \h </w:instrText>
+          <w:instrText xml:space="preserve"> PAGEREF _Toc242438369 \h </w:instrText>
         </w:r>
         <w:r>
           <w:rPr>
@@ -2160,7 +2160,7 @@
             <w:noProof/>
             <w:webHidden/>
           </w:rPr>
-          <w:t>23</w:t>
+          <w:t>24</w:t>
         </w:r>
         <w:r>
           <w:rPr>
@@ -2181,7 +2181,7 @@
           <w:noProof/>
         </w:rPr>
       </w:pPr>
-      <w:hyperlink w:anchor="_Toc242436287" w:history="1">
+      <w:hyperlink w:anchor="_Toc242438370" w:history="1">
         <w:r>
           <w:rPr>
             <w:rStyle w:val="Hyperlink"/>
@@ -2208,7 +2208,7 @@
             <w:noProof/>
             <w:webHidden/>
           </w:rPr>
-          <w:instrText xml:space="preserve"> PAGEREF _Toc242436287 \h </w:instrText>
+          <w:instrText xml:space="preserve"> PAGEREF _Toc242438370 \h </w:instrText>
         </w:r>
         <w:r>
           <w:rPr>
@@ -2228,7 +2228,7 @@
             <w:noProof/>
             <w:webHidden/>
           </w:rPr>
-          <w:t>24</w:t>
+          <w:t>25</w:t>
         </w:r>
         <w:r>
           <w:rPr>
@@ -2249,7 +2249,7 @@
           <w:noProof/>
         </w:rPr>
       </w:pPr>
-      <w:hyperlink w:anchor="_Toc242436288" w:history="1">
+      <w:hyperlink w:anchor="_Toc242438371" w:history="1">
         <w:r>
           <w:rPr>
             <w:rStyle w:val="Hyperlink"/>
@@ -2276,7 +2276,7 @@
             <w:noProof/>
             <w:webHidden/>
           </w:rPr>
-          <w:instrText xml:space="preserve"> PAGEREF _Toc242436288 \h </w:instrText>
+          <w:instrText xml:space="preserve"> PAGEREF _Toc242438371 \h </w:instrText>
         </w:r>
         <w:r>
           <w:rPr>
@@ -2296,7 +2296,7 @@
             <w:noProof/>
             <w:webHidden/>
           </w:rPr>
-          <w:t>26</w:t>
+          <w:t>27</w:t>
         </w:r>
         <w:r>
           <w:rPr>
@@ -2317,7 +2317,7 @@
           <w:noProof/>
         </w:rPr>
       </w:pPr>
-      <w:hyperlink w:anchor="_Toc242436289" w:history="1">
+      <w:hyperlink w:anchor="_Toc242438372" w:history="1">
         <w:r>
           <w:rPr>
             <w:rStyle w:val="Hyperlink"/>
@@ -2344,7 +2344,7 @@
             <w:noProof/>
             <w:webHidden/>
           </w:rPr>
-          <w:instrText xml:space="preserve"> PAGEREF _Toc242436289 \h </w:instrText>
+          <w:instrText xml:space="preserve"> PAGEREF _Toc242438372 \h </w:instrText>
         </w:r>
         <w:r>
           <w:rPr>
@@ -2364,7 +2364,7 @@
             <w:noProof/>
             <w:webHidden/>
           </w:rPr>
-          <w:t>26</w:t>
+          <w:t>27</w:t>
         </w:r>
         <w:r>
           <w:rPr>
@@ -2385,7 +2385,7 @@
           <w:noProof/>
         </w:rPr>
       </w:pPr>
-      <w:hyperlink w:anchor="_Toc242436290" w:history="1">
+      <w:hyperlink w:anchor="_Toc242438373" w:history="1">
         <w:r>
           <w:rPr>
             <w:rStyle w:val="Hyperlink"/>
@@ -2412,7 +2412,7 @@
             <w:noProof/>
             <w:webHidden/>
           </w:rPr>
-          <w:instrText xml:space="preserve"> PAGEREF _Toc242436290 \h </w:instrText>
+          <w:instrText xml:space="preserve"> PAGEREF _Toc242438373 \h </w:instrText>
         </w:r>
         <w:r>
           <w:rPr>
@@ -2432,7 +2432,7 @@
             <w:noProof/>
             <w:webHidden/>
           </w:rPr>
-          <w:t>28</w:t>
+          <w:t>29</w:t>
         </w:r>
         <w:r>
           <w:rPr>
@@ -2453,7 +2453,7 @@
           <w:noProof/>
         </w:rPr>
       </w:pPr>
-      <w:hyperlink w:anchor="_Toc242436291" w:history="1">
+      <w:hyperlink w:anchor="_Toc242438374" w:history="1">
         <w:r>
           <w:rPr>
             <w:rStyle w:val="Hyperlink"/>
@@ -2480,7 +2480,7 @@
             <w:noProof/>
             <w:webHidden/>
           </w:rPr>
-          <w:instrText xml:space="preserve"> PAGEREF _Toc242436291 \h </w:instrText>
+          <w:instrText xml:space="preserve"> PAGEREF _Toc242438374 \h </w:instrText>
         </w:r>
         <w:r>
           <w:rPr>
@@ -2500,7 +2500,7 @@
             <w:noProof/>
             <w:webHidden/>
           </w:rPr>
-          <w:t>30</w:t>
+          <w:t>31</w:t>
         </w:r>
         <w:r>
           <w:rPr>
@@ -2521,7 +2521,7 @@
           <w:noProof/>
         </w:rPr>
       </w:pPr>
-      <w:hyperlink w:anchor="_Toc242436292" w:history="1">
+      <w:hyperlink w:anchor="_Toc242438375" w:history="1">
         <w:r>
           <w:rPr>
             <w:rStyle w:val="Hyperlink"/>
@@ -2548,7 +2548,7 @@
             <w:noProof/>
             <w:webHidden/>
           </w:rPr>
-          <w:instrText xml:space="preserve"> PAGEREF _Toc242436292 \h </w:instrText>
+          <w:instrText xml:space="preserve"> PAGEREF _Toc242438375 \h </w:instrText>
         </w:r>
         <w:r>
           <w:rPr>
@@ -2568,7 +2568,7 @@
             <w:noProof/>
             <w:webHidden/>
           </w:rPr>
-          <w:t>30</w:t>
+          <w:t>31</w:t>
         </w:r>
         <w:r>
           <w:rPr>
@@ -2589,7 +2589,7 @@
           <w:noProof/>
         </w:rPr>
       </w:pPr>
-      <w:hyperlink w:anchor="_Toc242436293" w:history="1">
+      <w:hyperlink w:anchor="_Toc242438376" w:history="1">
         <w:r>
           <w:rPr>
             <w:rStyle w:val="Hyperlink"/>
@@ -2616,7 +2616,7 @@
             <w:noProof/>
             <w:webHidden/>
           </w:rPr>
-          <w:instrText xml:space="preserve"> PAGEREF _Toc242436293 \h </w:instrText>
+          <w:instrText xml:space="preserve"> PAGEREF _Toc242438376 \h </w:instrText>
         </w:r>
         <w:r>
           <w:rPr>
@@ -2636,7 +2636,7 @@
             <w:noProof/>
             <w:webHidden/>
           </w:rPr>
-          <w:t>31</w:t>
+          <w:t>32</w:t>
         </w:r>
         <w:r>
           <w:rPr>
@@ -2657,7 +2657,7 @@
           <w:noProof/>
         </w:rPr>
       </w:pPr>
-      <w:hyperlink w:anchor="_Toc242436294" w:history="1">
+      <w:hyperlink w:anchor="_Toc242438377" w:history="1">
         <w:r>
           <w:rPr>
             <w:rStyle w:val="Hyperlink"/>
@@ -2684,7 +2684,7 @@
             <w:noProof/>
             <w:webHidden/>
           </w:rPr>
-          <w:instrText xml:space="preserve"> PAGEREF _Toc242436294 \h </w:instrText>
+          <w:instrText xml:space="preserve"> PAGEREF _Toc242438377 \h </w:instrText>
         </w:r>
         <w:r>
           <w:rPr>
@@ -2704,7 +2704,7 @@
             <w:noProof/>
             <w:webHidden/>
           </w:rPr>
-          <w:t>32</w:t>
+          <w:t>33</w:t>
         </w:r>
         <w:r>
           <w:rPr>
@@ -2725,7 +2725,7 @@
           <w:noProof/>
         </w:rPr>
       </w:pPr>
-      <w:hyperlink w:anchor="_Toc242436295" w:history="1">
+      <w:hyperlink w:anchor="_Toc242438378" w:history="1">
         <w:r>
           <w:rPr>
             <w:rStyle w:val="Hyperlink"/>
@@ -2752,7 +2752,7 @@
             <w:noProof/>
             <w:webHidden/>
           </w:rPr>
-          <w:instrText xml:space="preserve"> PAGEREF _Toc242436295 \h </w:instrText>
+          <w:instrText xml:space="preserve"> PAGEREF _Toc242438378 \h </w:instrText>
         </w:r>
         <w:r>
           <w:rPr>
@@ -2772,7 +2772,7 @@
             <w:noProof/>
             <w:webHidden/>
           </w:rPr>
-          <w:t>32</w:t>
+          <w:t>33</w:t>
         </w:r>
         <w:r>
           <w:rPr>
@@ -2793,7 +2793,7 @@
           <w:noProof/>
         </w:rPr>
       </w:pPr>
-      <w:hyperlink w:anchor="_Toc242436296" w:history="1">
+      <w:hyperlink w:anchor="_Toc242438379" w:history="1">
         <w:r>
           <w:rPr>
             <w:rStyle w:val="Hyperlink"/>
@@ -2820,7 +2820,7 @@
             <w:noProof/>
             <w:webHidden/>
           </w:rPr>
-          <w:instrText xml:space="preserve"> PAGEREF _Toc242436296 \h </w:instrText>
+          <w:instrText xml:space="preserve"> PAGEREF _Toc242438379 \h </w:instrText>
         </w:r>
         <w:r>
           <w:rPr>
@@ -2840,7 +2840,7 @@
             <w:noProof/>
             <w:webHidden/>
           </w:rPr>
-          <w:t>33</w:t>
+          <w:t>34</w:t>
         </w:r>
         <w:r>
           <w:rPr>
@@ -2861,7 +2861,7 @@
           <w:noProof/>
         </w:rPr>
       </w:pPr>
-      <w:hyperlink w:anchor="_Toc242436297" w:history="1">
+      <w:hyperlink w:anchor="_Toc242438380" w:history="1">
         <w:r>
           <w:rPr>
             <w:rStyle w:val="Hyperlink"/>
@@ -2888,7 +2888,7 @@
             <w:noProof/>
             <w:webHidden/>
           </w:rPr>
-          <w:instrText xml:space="preserve"> PAGEREF _Toc242436297 \h </w:instrText>
+          <w:instrText xml:space="preserve"> PAGEREF _Toc242438380 \h </w:instrText>
         </w:r>
         <w:r>
           <w:rPr>
@@ -2908,7 +2908,7 @@
             <w:noProof/>
             <w:webHidden/>
           </w:rPr>
-          <w:t>33</w:t>
+          <w:t>34</w:t>
         </w:r>
         <w:r>
           <w:rPr>
@@ -2929,7 +2929,7 @@
           <w:noProof/>
         </w:rPr>
       </w:pPr>
-      <w:hyperlink w:anchor="_Toc242436298" w:history="1">
+      <w:hyperlink w:anchor="_Toc242438381" w:history="1">
         <w:r>
           <w:rPr>
             <w:rStyle w:val="Hyperlink"/>
@@ -2956,7 +2956,7 @@
             <w:noProof/>
             <w:webHidden/>
           </w:rPr>
-          <w:instrText xml:space="preserve"> PAGEREF _Toc242436298 \h </w:instrText>
+          <w:instrText xml:space="preserve"> PAGEREF _Toc242438381 \h </w:instrText>
         </w:r>
         <w:r>
           <w:rPr>
@@ -2976,7 +2976,7 @@
             <w:noProof/>
             <w:webHidden/>
           </w:rPr>
-          <w:t>35</w:t>
+          <w:t>36</w:t>
         </w:r>
         <w:r>
           <w:rPr>
@@ -2997,7 +2997,7 @@
           <w:noProof/>
         </w:rPr>
       </w:pPr>
-      <w:hyperlink w:anchor="_Toc242436299" w:history="1">
+      <w:hyperlink w:anchor="_Toc242438382" w:history="1">
         <w:r>
           <w:rPr>
             <w:rStyle w:val="Hyperlink"/>
@@ -3024,7 +3024,7 @@
             <w:noProof/>
             <w:webHidden/>
           </w:rPr>
-          <w:instrText xml:space="preserve"> PAGEREF _Toc242436299 \h </w:instrText>
+          <w:instrText xml:space="preserve"> PAGEREF _Toc242438382 \h </w:instrText>
         </w:r>
         <w:r>
           <w:rPr>
@@ -3044,7 +3044,7 @@
             <w:noProof/>
             <w:webHidden/>
           </w:rPr>
-          <w:t>35</w:t>
+          <w:t>36</w:t>
         </w:r>
         <w:r>
           <w:rPr>
@@ -3065,7 +3065,7 @@
           <w:noProof/>
         </w:rPr>
       </w:pPr>
-      <w:hyperlink w:anchor="_Toc242436300" w:history="1">
+      <w:hyperlink w:anchor="_Toc242438383" w:history="1">
         <w:r>
           <w:rPr>
             <w:rStyle w:val="Hyperlink"/>
@@ -3092,7 +3092,7 @@
             <w:noProof/>
             <w:webHidden/>
           </w:rPr>
-          <w:instrText xml:space="preserve"> PAGEREF _Toc242436300 \h </w:instrText>
+          <w:instrText xml:space="preserve"> PAGEREF _Toc242438383 \h </w:instrText>
         </w:r>
         <w:r>
           <w:rPr>
@@ -3112,7 +3112,7 @@
             <w:noProof/>
             <w:webHidden/>
           </w:rPr>
-          <w:t>36</w:t>
+          <w:t>37</w:t>
         </w:r>
         <w:r>
           <w:rPr>
@@ -3133,7 +3133,7 @@
           <w:noProof/>
         </w:rPr>
       </w:pPr>
-      <w:hyperlink w:anchor="_Toc242436301" w:history="1">
+      <w:hyperlink w:anchor="_Toc242438384" w:history="1">
         <w:r>
           <w:rPr>
             <w:rStyle w:val="Hyperlink"/>
@@ -3160,7 +3160,7 @@
             <w:noProof/>
             <w:webHidden/>
           </w:rPr>
-          <w:instrText xml:space="preserve"> PAGEREF _Toc242436301 \h </w:instrText>
+          <w:instrText xml:space="preserve"> PAGEREF _Toc242438384 \h </w:instrText>
         </w:r>
         <w:r>
           <w:rPr>
@@ -3180,7 +3180,7 @@
             <w:noProof/>
             <w:webHidden/>
           </w:rPr>
-          <w:t>36</w:t>
+          <w:t>37</w:t>
         </w:r>
         <w:r>
           <w:rPr>
@@ -3201,7 +3201,7 @@
           <w:noProof/>
         </w:rPr>
       </w:pPr>
-      <w:hyperlink w:anchor="_Toc242436302" w:history="1">
+      <w:hyperlink w:anchor="_Toc242438385" w:history="1">
         <w:r>
           <w:rPr>
             <w:rStyle w:val="Hyperlink"/>
@@ -3228,7 +3228,7 @@
             <w:noProof/>
             <w:webHidden/>
           </w:rPr>
-          <w:instrText xml:space="preserve"> PAGEREF _Toc242436302 \h </w:instrText>
+          <w:instrText xml:space="preserve"> PAGEREF _Toc242438385 \h </w:instrText>
         </w:r>
         <w:r>
           <w:rPr>
@@ -3248,7 +3248,7 @@
             <w:noProof/>
             <w:webHidden/>
           </w:rPr>
-          <w:t>39</w:t>
+          <w:t>40</w:t>
         </w:r>
         <w:r>
           <w:rPr>
@@ -3269,7 +3269,7 @@
           <w:noProof/>
         </w:rPr>
       </w:pPr>
-      <w:hyperlink w:anchor="_Toc242436303" w:history="1">
+      <w:hyperlink w:anchor="_Toc242438386" w:history="1">
         <w:r>
           <w:rPr>
             <w:rStyle w:val="Hyperlink"/>
@@ -3296,7 +3296,7 @@
             <w:noProof/>
             <w:webHidden/>
           </w:rPr>
-          <w:instrText xml:space="preserve"> PAGEREF _Toc242436303 \h </w:instrText>
+          <w:instrText xml:space="preserve"> PAGEREF _Toc242438386 \h </w:instrText>
         </w:r>
         <w:r>
           <w:rPr>
@@ -3316,7 +3316,7 @@
             <w:noProof/>
             <w:webHidden/>
           </w:rPr>
-          <w:t>40</w:t>
+          <w:t>41</w:t>
         </w:r>
         <w:r>
           <w:rPr>
@@ -3337,7 +3337,7 @@
           <w:noProof/>
         </w:rPr>
       </w:pPr>
-      <w:hyperlink w:anchor="_Toc242436304" w:history="1">
+      <w:hyperlink w:anchor="_Toc242438387" w:history="1">
         <w:r>
           <w:rPr>
             <w:rStyle w:val="Hyperlink"/>
@@ -3364,7 +3364,7 @@
             <w:noProof/>
             <w:webHidden/>
           </w:rPr>
-          <w:instrText xml:space="preserve"> PAGEREF _Toc242436304 \h </w:instrText>
+          <w:instrText xml:space="preserve"> PAGEREF _Toc242438387 \h </w:instrText>
         </w:r>
         <w:r>
           <w:rPr>
@@ -3384,7 +3384,7 @@
             <w:noProof/>
             <w:webHidden/>
           </w:rPr>
-          <w:t>43</w:t>
+          <w:t>44</w:t>
         </w:r>
         <w:r>
           <w:rPr>
@@ -3405,7 +3405,7 @@
           <w:noProof/>
         </w:rPr>
       </w:pPr>
-      <w:hyperlink w:anchor="_Toc242436305" w:history="1">
+      <w:hyperlink w:anchor="_Toc242438388" w:history="1">
         <w:r>
           <w:rPr>
             <w:rStyle w:val="Hyperlink"/>
@@ -3432,7 +3432,7 @@
             <w:noProof/>
             <w:webHidden/>
           </w:rPr>
-          <w:instrText xml:space="preserve"> PAGEREF _Toc242436305 \h </w:instrText>
+          <w:instrText xml:space="preserve"> PAGEREF _Toc242438388 \h </w:instrText>
         </w:r>
         <w:r>
           <w:rPr>
@@ -3452,7 +3452,7 @@
             <w:noProof/>
             <w:webHidden/>
           </w:rPr>
-          <w:t>46</w:t>
+          <w:t>47</w:t>
         </w:r>
         <w:r>
           <w:rPr>
@@ -3473,7 +3473,7 @@
           <w:noProof/>
         </w:rPr>
       </w:pPr>
-      <w:hyperlink w:anchor="_Toc242436306" w:history="1">
+      <w:hyperlink w:anchor="_Toc242438389" w:history="1">
         <w:r>
           <w:rPr>
             <w:rStyle w:val="Hyperlink"/>
@@ -3500,7 +3500,7 @@
             <w:noProof/>
             <w:webHidden/>
           </w:rPr>
-          <w:instrText xml:space="preserve"> PAGEREF _Toc242436306 \h </w:instrText>
+          <w:instrText xml:space="preserve"> PAGEREF _Toc242438389 \h </w:instrText>
         </w:r>
         <w:r>
           <w:rPr>
@@ -3520,7 +3520,7 @@
             <w:noProof/>
             <w:webHidden/>
           </w:rPr>
-          <w:t>47</w:t>
+          <w:t>48</w:t>
         </w:r>
         <w:r>
           <w:rPr>
@@ -3541,7 +3541,7 @@
           <w:noProof/>
         </w:rPr>
       </w:pPr>
-      <w:hyperlink w:anchor="_Toc242436307" w:history="1">
+      <w:hyperlink w:anchor="_Toc242438390" w:history="1">
         <w:r>
           <w:rPr>
             <w:rStyle w:val="Hyperlink"/>
@@ -3568,7 +3568,7 @@
             <w:noProof/>
             <w:webHidden/>
           </w:rPr>
-          <w:instrText xml:space="preserve"> PAGEREF _Toc242436307 \h </w:instrText>
+          <w:instrText xml:space="preserve"> PAGEREF _Toc242438390 \h </w:instrText>
         </w:r>
         <w:r>
           <w:rPr>
@@ -3588,7 +3588,7 @@
             <w:noProof/>
             <w:webHidden/>
           </w:rPr>
-          <w:t>47</w:t>
+          <w:t>48</w:t>
         </w:r>
         <w:r>
           <w:rPr>
@@ -3609,7 +3609,7 @@
           <w:noProof/>
         </w:rPr>
       </w:pPr>
-      <w:hyperlink w:anchor="_Toc242436308" w:history="1">
+      <w:hyperlink w:anchor="_Toc242438391" w:history="1">
         <w:r>
           <w:rPr>
             <w:rStyle w:val="Hyperlink"/>
@@ -3636,7 +3636,7 @@
             <w:noProof/>
             <w:webHidden/>
           </w:rPr>
-          <w:instrText xml:space="preserve"> PAGEREF _Toc242436308 \h </w:instrText>
+          <w:instrText xml:space="preserve"> PAGEREF _Toc242438391 \h </w:instrText>
         </w:r>
         <w:r>
           <w:rPr>
@@ -3656,7 +3656,7 @@
             <w:noProof/>
             <w:webHidden/>
           </w:rPr>
-          <w:t>47</w:t>
+          <w:t>48</w:t>
         </w:r>
         <w:r>
           <w:rPr>
@@ -3677,7 +3677,7 @@
           <w:noProof/>
         </w:rPr>
       </w:pPr>
-      <w:hyperlink w:anchor="_Toc242436309" w:history="1">
+      <w:hyperlink w:anchor="_Toc242438392" w:history="1">
         <w:r>
           <w:rPr>
             <w:rStyle w:val="Hyperlink"/>
@@ -3704,7 +3704,7 @@
             <w:noProof/>
             <w:webHidden/>
           </w:rPr>
-          <w:instrText xml:space="preserve"> PAGEREF _Toc242436309 \h </w:instrText>
+          <w:instrText xml:space="preserve"> PAGEREF _Toc242438392 \h </w:instrText>
         </w:r>
         <w:r>
           <w:rPr>
@@ -3724,7 +3724,7 @@
             <w:noProof/>
             <w:webHidden/>
           </w:rPr>
-          <w:t>49</w:t>
+          <w:t>50</w:t>
         </w:r>
         <w:r>
           <w:rPr>
@@ -3745,7 +3745,7 @@
           <w:noProof/>
         </w:rPr>
       </w:pPr>
-      <w:hyperlink w:anchor="_Toc242436310" w:history="1">
+      <w:hyperlink w:anchor="_Toc242438393" w:history="1">
         <w:r>
           <w:rPr>
             <w:rStyle w:val="Hyperlink"/>
@@ -3772,7 +3772,7 @@
             <w:noProof/>
             <w:webHidden/>
           </w:rPr>
-          <w:instrText xml:space="preserve"> PAGEREF _Toc242436310 \h </w:instrText>
+          <w:instrText xml:space="preserve"> PAGEREF _Toc242438393 \h </w:instrText>
         </w:r>
         <w:r>
           <w:rPr>
@@ -3792,7 +3792,7 @@
             <w:noProof/>
             <w:webHidden/>
           </w:rPr>
-          <w:t>50</w:t>
+          <w:t>51</w:t>
         </w:r>
         <w:r>
           <w:rPr>
@@ -3813,7 +3813,7 @@
           <w:noProof/>
         </w:rPr>
       </w:pPr>
-      <w:hyperlink w:anchor="_Toc242436311" w:history="1">
+      <w:hyperlink w:anchor="_Toc242438394" w:history="1">
         <w:r>
           <w:rPr>
             <w:rStyle w:val="Hyperlink"/>
@@ -3840,7 +3840,7 @@
             <w:noProof/>
             <w:webHidden/>
           </w:rPr>
-          <w:instrText xml:space="preserve"> PAGEREF _Toc242436311 \h </w:instrText>
+          <w:instrText xml:space="preserve"> PAGEREF _Toc242438394 \h </w:instrText>
         </w:r>
         <w:r>
           <w:rPr>
@@ -3860,7 +3860,7 @@
             <w:noProof/>
             <w:webHidden/>
           </w:rPr>
-          <w:t>51</w:t>
+          <w:t>52</w:t>
         </w:r>
         <w:r>
           <w:rPr>
@@ -3881,7 +3881,7 @@
           <w:noProof/>
         </w:rPr>
       </w:pPr>
-      <w:hyperlink w:anchor="_Toc242436312" w:history="1">
+      <w:hyperlink w:anchor="_Toc242438395" w:history="1">
         <w:r>
           <w:rPr>
             <w:rStyle w:val="Hyperlink"/>
@@ -3908,7 +3908,7 @@
             <w:noProof/>
             <w:webHidden/>
           </w:rPr>
-          <w:instrText xml:space="preserve"> PAGEREF _Toc242436312 \h </w:instrText>
+          <w:instrText xml:space="preserve"> PAGEREF _Toc242438395 \h </w:instrText>
         </w:r>
         <w:r>
           <w:rPr>
@@ -3928,7 +3928,7 @@
             <w:noProof/>
             <w:webHidden/>
           </w:rPr>
-          <w:t>52</w:t>
+          <w:t>53</w:t>
         </w:r>
         <w:r>
           <w:rPr>
@@ -3949,7 +3949,7 @@
           <w:noProof/>
         </w:rPr>
       </w:pPr>
-      <w:hyperlink w:anchor="_Toc242436313" w:history="1">
+      <w:hyperlink w:anchor="_Toc242438396" w:history="1">
         <w:r>
           <w:rPr>
             <w:rStyle w:val="Hyperlink"/>
@@ -3976,7 +3976,7 @@
             <w:noProof/>
             <w:webHidden/>
           </w:rPr>
-          <w:instrText xml:space="preserve"> PAGEREF _Toc242436313 \h </w:instrText>
+          <w:instrText xml:space="preserve"> PAGEREF _Toc242438396 \h </w:instrText>
         </w:r>
         <w:r>
           <w:rPr>
@@ -3996,7 +3996,7 @@
             <w:noProof/>
             <w:webHidden/>
           </w:rPr>
-          <w:t>54</w:t>
+          <w:t>55</w:t>
         </w:r>
         <w:r>
           <w:rPr>
@@ -4017,7 +4017,7 @@
           <w:noProof/>
         </w:rPr>
       </w:pPr>
-      <w:hyperlink w:anchor="_Toc242436314" w:history="1">
+      <w:hyperlink w:anchor="_Toc242438397" w:history="1">
         <w:r>
           <w:rPr>
             <w:rStyle w:val="Hyperlink"/>
@@ -4044,7 +4044,7 @@
             <w:noProof/>
             <w:webHidden/>
           </w:rPr>
-          <w:instrText xml:space="preserve"> PAGEREF _Toc242436314 \h </w:instrText>
+          <w:instrText xml:space="preserve"> PAGEREF _Toc242438397 \h </w:instrText>
         </w:r>
         <w:r>
           <w:rPr>
@@ -4064,7 +4064,7 @@
             <w:noProof/>
             <w:webHidden/>
           </w:rPr>
-          <w:t>54</w:t>
+          <w:t>55</w:t>
         </w:r>
         <w:r>
           <w:rPr>
@@ -4085,7 +4085,7 @@
           <w:noProof/>
         </w:rPr>
       </w:pPr>
-      <w:hyperlink w:anchor="_Toc242436315" w:history="1">
+      <w:hyperlink w:anchor="_Toc242438398" w:history="1">
         <w:r>
           <w:rPr>
             <w:rStyle w:val="Hyperlink"/>
@@ -4112,7 +4112,7 @@
             <w:noProof/>
             <w:webHidden/>
           </w:rPr>
-          <w:instrText xml:space="preserve"> PAGEREF _Toc242436315 \h </w:instrText>
+          <w:instrText xml:space="preserve"> PAGEREF _Toc242438398 \h </w:instrText>
         </w:r>
         <w:r>
           <w:rPr>
@@ -4132,7 +4132,7 @@
             <w:noProof/>
             <w:webHidden/>
           </w:rPr>
-          <w:t>54</w:t>
+          <w:t>55</w:t>
         </w:r>
         <w:r>
           <w:rPr>
@@ -4153,7 +4153,7 @@
           <w:noProof/>
         </w:rPr>
       </w:pPr>
-      <w:hyperlink w:anchor="_Toc242436316" w:history="1">
+      <w:hyperlink w:anchor="_Toc242438399" w:history="1">
         <w:r>
           <w:rPr>
             <w:rStyle w:val="Hyperlink"/>
@@ -4180,7 +4180,7 @@
             <w:noProof/>
             <w:webHidden/>
           </w:rPr>
-          <w:instrText xml:space="preserve"> PAGEREF _Toc242436316 \h </w:instrText>
+          <w:instrText xml:space="preserve"> PAGEREF _Toc242438399 \h </w:instrText>
         </w:r>
         <w:r>
           <w:rPr>
@@ -4200,7 +4200,7 @@
             <w:noProof/>
             <w:webHidden/>
           </w:rPr>
-          <w:t>54</w:t>
+          <w:t>55</w:t>
         </w:r>
         <w:r>
           <w:rPr>
@@ -4221,7 +4221,7 @@
           <w:noProof/>
         </w:rPr>
       </w:pPr>
-      <w:hyperlink w:anchor="_Toc242436317" w:history="1">
+      <w:hyperlink w:anchor="_Toc242438400" w:history="1">
         <w:r>
           <w:rPr>
             <w:rStyle w:val="Hyperlink"/>
@@ -4248,7 +4248,7 @@
             <w:noProof/>
             <w:webHidden/>
           </w:rPr>
-          <w:instrText xml:space="preserve"> PAGEREF _Toc242436317 \h </w:instrText>
+          <w:instrText xml:space="preserve"> PAGEREF _Toc242438400 \h </w:instrText>
         </w:r>
         <w:r>
           <w:rPr>
@@ -4268,7 +4268,7 @@
             <w:noProof/>
             <w:webHidden/>
           </w:rPr>
-          <w:t>54</w:t>
+          <w:t>55</w:t>
         </w:r>
         <w:r>
           <w:rPr>
@@ -4289,7 +4289,7 @@
         <w:pStyle w:val="Heading1"/>
         <w:pageBreakBefore/>
       </w:pPr>
-      <w:bookmarkStart w:id="0" w:name="_Toc242436260"/>
+      <w:bookmarkStart w:id="0" w:name="_Toc242438343"/>
       <w:r>
         <w:lastRenderedPageBreak/>
         <w:t>Welcome</w:t>
@@ -4305,7 +4305,7 @@
       <w:pPr>
         <w:pStyle w:val="Heading2"/>
       </w:pPr>
-      <w:bookmarkStart w:id="1" w:name="_Toc242436261"/>
+      <w:bookmarkStart w:id="1" w:name="_Toc242438344"/>
       <w:r>
         <w:t>How a sale moves through the app</w:t>
       </w:r>
@@ -4788,7 +4788,7 @@
       <w:pPr>
         <w:pStyle w:val="Heading2"/>
       </w:pPr>
-      <w:bookmarkStart w:id="2" w:name="_Toc242436262"/>
+      <w:bookmarkStart w:id="2" w:name="_Toc242438345"/>
       <w:r>
         <w:t>What you'll need</w:t>
       </w:r>
@@ -4897,7 +4897,7 @@
         <w:pStyle w:val="Heading1"/>
         <w:pageBreakBefore/>
       </w:pPr>
-      <w:bookmarkStart w:id="3" w:name="_Toc242436263"/>
+      <w:bookmarkStart w:id="3" w:name="_Toc242438346"/>
       <w:r>
         <w:lastRenderedPageBreak/>
         <w:t>Who can do what</w:t>
@@ -5373,7 +5373,7 @@
         <w:pStyle w:val="Heading1"/>
         <w:pageBreakBefore/>
       </w:pPr>
-      <w:bookmarkStart w:id="4" w:name="_Toc242436264"/>
+      <w:bookmarkStart w:id="4" w:name="_Toc242438347"/>
       <w:r>
         <w:lastRenderedPageBreak/>
         <w:t>Getting started</w:t>
@@ -5384,7 +5384,7 @@
       <w:pPr>
         <w:pStyle w:val="Heading2"/>
       </w:pPr>
-      <w:bookmarkStart w:id="5" w:name="_Toc242436265"/>
+      <w:bookmarkStart w:id="5" w:name="_Toc242438348"/>
       <w:r>
         <w:t>Signing in</w:t>
       </w:r>
@@ -5401,7 +5401,7 @@
           <w:noProof/>
         </w:rPr>
         <w:drawing>
-          <wp:inline distT="0" distB="0" distL="0" distR="0" wp14:anchorId="246F637D" wp14:editId="6048794A">
+          <wp:inline distT="0" distB="0" distL="0" distR="0" wp14:anchorId="72C4962A" wp14:editId="7AC1D033">
             <wp:extent cx="3291840" cy="2211705"/>
             <wp:effectExtent l="0" t="0" r="0" b="0"/>
             <wp:docPr id="1" name="Picture 1"/>
@@ -5719,7 +5719,7 @@
       <w:pPr>
         <w:pStyle w:val="Heading2"/>
       </w:pPr>
-      <w:bookmarkStart w:id="6" w:name="_Toc242436266"/>
+      <w:bookmarkStart w:id="6" w:name="_Toc242438349"/>
       <w:r>
         <w:t>Changing your PIN</w:t>
       </w:r>
@@ -5901,7 +5901,7 @@
       <w:pPr>
         <w:pStyle w:val="Heading2"/>
       </w:pPr>
-      <w:bookmarkStart w:id="7" w:name="_Toc242436267"/>
+      <w:bookmarkStart w:id="7" w:name="_Toc242438350"/>
       <w:r>
         <w:lastRenderedPageBreak/>
         <w:t>Finding your way around</w:t>
@@ -6484,7 +6484,7 @@
       <w:pPr>
         <w:pStyle w:val="Heading2"/>
       </w:pPr>
-      <w:bookmarkStart w:id="8" w:name="_Toc242436268"/>
+      <w:bookmarkStart w:id="8" w:name="_Toc242438351"/>
       <w:r>
         <w:t>Mattress size guide</w:t>
       </w:r>
@@ -6507,7 +6507,7 @@
         </w:rPr>
         <w:lastRenderedPageBreak/>
         <w:drawing>
-          <wp:inline distT="0" distB="0" distL="0" distR="0" wp14:anchorId="576205A4" wp14:editId="667F44C9">
+          <wp:inline distT="0" distB="0" distL="0" distR="0" wp14:anchorId="785D39F9" wp14:editId="2B85F2A1">
             <wp:extent cx="5486400" cy="3686175"/>
             <wp:effectExtent l="0" t="0" r="0" b="0"/>
             <wp:docPr id="2" name="Picture 2"/>
@@ -6584,7 +6584,7 @@
       <w:pPr>
         <w:pStyle w:val="Heading2"/>
       </w:pPr>
-      <w:bookmarkStart w:id="9" w:name="_Toc242436269"/>
+      <w:bookmarkStart w:id="9" w:name="_Toc242438352"/>
       <w:r>
         <w:t>Light and dark mode</w:t>
       </w:r>
@@ -6599,7 +6599,7 @@
       <w:pPr>
         <w:pStyle w:val="Heading2"/>
       </w:pPr>
-      <w:bookmarkStart w:id="10" w:name="_Toc242436270"/>
+      <w:bookmarkStart w:id="10" w:name="_Toc242438353"/>
       <w:r>
         <w:t>Signing out</w:t>
       </w:r>
@@ -6624,7 +6624,7 @@
         <w:pStyle w:val="Heading1"/>
         <w:pageBreakBefore/>
       </w:pPr>
-      <w:bookmarkStart w:id="11" w:name="_Toc242436271"/>
+      <w:bookmarkStart w:id="11" w:name="_Toc242438354"/>
       <w:r>
         <w:lastRenderedPageBreak/>
         <w:t>Taking an order on the sales floor</w:t>
@@ -6656,7 +6656,7 @@
           <w:noProof/>
         </w:rPr>
         <w:drawing>
-          <wp:inline distT="0" distB="0" distL="0" distR="0" wp14:anchorId="3B7EB58D" wp14:editId="0707B699">
+          <wp:inline distT="0" distB="0" distL="0" distR="0" wp14:anchorId="4CB9D6FD" wp14:editId="10799336">
             <wp:extent cx="5760720" cy="3870484"/>
             <wp:effectExtent l="0" t="0" r="0" b="0"/>
             <wp:docPr id="3" name="Picture 3"/>
@@ -6781,7 +6781,7 @@
       <w:pPr>
         <w:pStyle w:val="Heading2"/>
       </w:pPr>
-      <w:bookmarkStart w:id="12" w:name="_Toc242436272"/>
+      <w:bookmarkStart w:id="12" w:name="_Toc242438355"/>
       <w:r>
         <w:t>Starting an order</w:t>
       </w:r>
@@ -6865,7 +6865,7 @@
       <w:pPr>
         <w:pStyle w:val="Heading2"/>
       </w:pPr>
-      <w:bookmarkStart w:id="13" w:name="_Toc242436273"/>
+      <w:bookmarkStart w:id="13" w:name="_Toc242438356"/>
       <w:r>
         <w:lastRenderedPageBreak/>
         <w:t>Adding items</w:t>
@@ -7014,7 +7014,7 @@
           <w:noProof/>
         </w:rPr>
         <w:drawing>
-          <wp:inline distT="0" distB="0" distL="0" distR="0" wp14:anchorId="4DF4ACED" wp14:editId="3E9AD36B">
+          <wp:inline distT="0" distB="0" distL="0" distR="0" wp14:anchorId="2311364A" wp14:editId="665C8D25">
             <wp:extent cx="5760720" cy="3870484"/>
             <wp:effectExtent l="0" t="0" r="0" b="0"/>
             <wp:docPr id="4" name="Picture 4"/>
@@ -7151,7 +7151,7 @@
           <w:noProof/>
         </w:rPr>
         <w:drawing>
-          <wp:inline distT="0" distB="0" distL="0" distR="0" wp14:anchorId="54AD891C" wp14:editId="2071DDD3">
+          <wp:inline distT="0" distB="0" distL="0" distR="0" wp14:anchorId="079FC399" wp14:editId="171F816D">
             <wp:extent cx="5760720" cy="3870484"/>
             <wp:effectExtent l="0" t="0" r="0" b="0"/>
             <wp:docPr id="5" name="Picture 5"/>
@@ -7548,7 +7548,7 @@
           <w:noProof/>
         </w:rPr>
         <w:drawing>
-          <wp:inline distT="0" distB="0" distL="0" distR="0" wp14:anchorId="4B57BBA6" wp14:editId="7FC69A87">
+          <wp:inline distT="0" distB="0" distL="0" distR="0" wp14:anchorId="2EB4F8F5" wp14:editId="6FBF97FB">
             <wp:extent cx="5760720" cy="4545568"/>
             <wp:effectExtent l="0" t="0" r="0" b="0"/>
             <wp:docPr id="6" name="Picture 6"/>
@@ -7694,7 +7694,7 @@
         </w:rPr>
         <w:lastRenderedPageBreak/>
         <w:drawing>
-          <wp:inline distT="0" distB="0" distL="0" distR="0" wp14:anchorId="01233B56" wp14:editId="3FA80352">
+          <wp:inline distT="0" distB="0" distL="0" distR="0" wp14:anchorId="2436753E" wp14:editId="583C8524">
             <wp:extent cx="5760720" cy="4050506"/>
             <wp:effectExtent l="0" t="0" r="0" b="0"/>
             <wp:docPr id="7" name="Picture 7"/>
@@ -7856,7 +7856,7 @@
         </w:rPr>
         <w:lastRenderedPageBreak/>
         <w:drawing>
-          <wp:inline distT="0" distB="0" distL="0" distR="0" wp14:anchorId="2B9439A8" wp14:editId="7074B14E">
+          <wp:inline distT="0" distB="0" distL="0" distR="0" wp14:anchorId="24CCAA12" wp14:editId="5AA52EE8">
             <wp:extent cx="5486400" cy="3686175"/>
             <wp:effectExtent l="0" t="0" r="0" b="0"/>
             <wp:docPr id="8" name="Picture 8"/>
@@ -8070,7 +8070,7 @@
       <w:pPr>
         <w:pStyle w:val="Heading2"/>
       </w:pPr>
-      <w:bookmarkStart w:id="14" w:name="_Toc242436274"/>
+      <w:bookmarkStart w:id="14" w:name="_Toc242438357"/>
       <w:r>
         <w:t>Adding shipping or a service later</w:t>
       </w:r>
@@ -8111,7 +8111,7 @@
         </w:rPr>
         <w:lastRenderedPageBreak/>
         <w:drawing>
-          <wp:inline distT="0" distB="0" distL="0" distR="0" wp14:anchorId="47C2DDEB" wp14:editId="19C85F75">
+          <wp:inline distT="0" distB="0" distL="0" distR="0" wp14:anchorId="0E05673B" wp14:editId="0055F9F6">
             <wp:extent cx="4754880" cy="3145155"/>
             <wp:effectExtent l="0" t="0" r="0" b="0"/>
             <wp:docPr id="9" name="Picture 9"/>
@@ -8227,7 +8227,7 @@
       <w:pPr>
         <w:pStyle w:val="Heading2"/>
       </w:pPr>
-      <w:bookmarkStart w:id="15" w:name="_Toc242436275"/>
+      <w:bookmarkStart w:id="15" w:name="_Toc242438358"/>
       <w:r>
         <w:t>Adding an upcharge</w:t>
       </w:r>
@@ -8294,7 +8294,7 @@
           <w:noProof/>
         </w:rPr>
         <w:drawing>
-          <wp:inline distT="0" distB="0" distL="0" distR="0" wp14:anchorId="3702D23D" wp14:editId="0248339F">
+          <wp:inline distT="0" distB="0" distL="0" distR="0" wp14:anchorId="7D62F654" wp14:editId="5890FBE9">
             <wp:extent cx="4206240" cy="2382441"/>
             <wp:effectExtent l="0" t="0" r="0" b="0"/>
             <wp:docPr id="10" name="Picture 10"/>
@@ -8410,7 +8410,7 @@
           <w:noProof/>
         </w:rPr>
         <w:drawing>
-          <wp:inline distT="0" distB="0" distL="0" distR="0" wp14:anchorId="26F11CDA" wp14:editId="0AEC929F">
+          <wp:inline distT="0" distB="0" distL="0" distR="0" wp14:anchorId="4D1D0A90" wp14:editId="6E2B05E2">
             <wp:extent cx="4754880" cy="1648358"/>
             <wp:effectExtent l="0" t="0" r="0" b="0"/>
             <wp:docPr id="11" name="Picture 11"/>
@@ -8464,7 +8464,7 @@
       <w:pPr>
         <w:pStyle w:val="Heading2"/>
       </w:pPr>
-      <w:bookmarkStart w:id="16" w:name="_Toc242436276"/>
+      <w:bookmarkStart w:id="16" w:name="_Toc242438359"/>
       <w:r>
         <w:t>Changing or removing an item</w:t>
       </w:r>
@@ -8533,22 +8533,25 @@
         <w:spacing w:after="60"/>
       </w:pPr>
       <w:r>
-        <w:rPr>
-          <w:b/>
-        </w:rPr>
-        <w:t>Notes</w:t>
-      </w:r>
-      <w:r>
-        <w:t xml:space="preserve">: add or change an item's note with </w:t>
-      </w:r>
-      <w:r>
-        <w:rPr>
-          <w:b/>
-        </w:rPr>
-        <w:t>Edit</w:t>
-      </w:r>
-      <w:r>
-        <w:t>. The note shows under the item on screen, and on the sales sheet it prints directly under the item, above its shipping row.</w:t>
+        <w:t xml:space="preserve">The </w:t>
+      </w:r>
+      <w:r>
+        <w:rPr>
+          <w:b/>
+        </w:rPr>
+        <w:t>up</w:t>
+      </w:r>
+      <w:r>
+        <w:t xml:space="preserve"> and </w:t>
+      </w:r>
+      <w:r>
+        <w:rPr>
+          <w:b/>
+        </w:rPr>
+        <w:t>down arrows</w:t>
+      </w:r>
+      <w:r>
+        <w:t xml:space="preserve"> at the right of an item move it up or down the order, and the sales sheet prints in that order. Everything under the item moves with it.</w:t>
       </w:r>
     </w:p>
     <w:p>
@@ -8560,102 +8563,19 @@
         <w:rPr>
           <w:b/>
         </w:rPr>
-        <w:t>Remove</w:t>
-      </w:r>
-      <w:r>
-        <w:t xml:space="preserve"> takes the item off the order. The app asks you to confirm first.</w:t>
-      </w:r>
-    </w:p>
-    <w:p>
-      <w:r>
-        <w:t xml:space="preserve">Small labels on each item help you check the order at a glance: </w:t>
-      </w:r>
-      <w:r>
-        <w:rPr>
-          <w:b/>
-        </w:rPr>
-        <w:t>Take with</w:t>
-      </w:r>
-      <w:r>
-        <w:t xml:space="preserve">, </w:t>
-      </w:r>
-      <w:r>
-        <w:rPr>
-          <w:b/>
-        </w:rPr>
-        <w:t>Included</w:t>
-      </w:r>
-      <w:r>
-        <w:t xml:space="preserve"> (part of a bundle), a sale such as </w:t>
-      </w:r>
-      <w:r>
-        <w:rPr>
-          <w:b/>
-        </w:rPr>
-        <w:t>Sale -20%</w:t>
-      </w:r>
-      <w:r>
-        <w:t xml:space="preserve">, your extra discount such as </w:t>
-      </w:r>
-      <w:r>
-        <w:rPr>
-          <w:b/>
-        </w:rPr>
-        <w:t>-10%</w:t>
-      </w:r>
-      <w:r>
-        <w:t xml:space="preserve"> or </w:t>
-      </w:r>
-      <w:r>
-        <w:rPr>
-          <w:b/>
-        </w:rPr>
-        <w:t>-$5 ea</w:t>
-      </w:r>
-      <w:r>
-        <w:t xml:space="preserve">, and </w:t>
-      </w:r>
-      <w:r>
-        <w:rPr>
-          <w:b/>
-        </w:rPr>
-        <w:t>Not on sales sheet</w:t>
-      </w:r>
-      <w:r>
-        <w:t xml:space="preserve"> for a free service row that won't print. Any selections show after the name, for example </w:t>
-      </w:r>
-      <w:r>
-        <w:rPr>
-          <w:b/>
-        </w:rPr>
-        <w:t>Color: Gray</w:t>
-      </w:r>
-      <w:r>
-        <w:t>, and print the same way on the sales sheet.</w:t>
-      </w:r>
-    </w:p>
-    <w:p>
-      <w:pPr>
-        <w:pStyle w:val="Heading2"/>
-      </w:pPr>
-      <w:bookmarkStart w:id="17" w:name="_Toc242436277"/>
-      <w:r>
-        <w:t>Customer details</w:t>
-      </w:r>
-      <w:bookmarkEnd w:id="17"/>
-    </w:p>
-    <w:p>
-      <w:r>
-        <w:t xml:space="preserve">The right side of the screen (or the </w:t>
-      </w:r>
-      <w:r>
-        <w:rPr>
-          <w:b/>
-        </w:rPr>
-        <w:t>Customer</w:t>
-      </w:r>
-      <w:r>
-        <w:t xml:space="preserve"> tab on a phone) holds the same fields as the paper sales sheet:</w:t>
+        <w:t>Notes</w:t>
+      </w:r>
+      <w:r>
+        <w:t xml:space="preserve">: add or change an item's note with </w:t>
+      </w:r>
+      <w:r>
+        <w:rPr>
+          <w:b/>
+        </w:rPr>
+        <w:t>Edit</w:t>
+      </w:r>
+      <w:r>
+        <w:t>. The note shows under the item on screen, and on the sales sheet it prints directly under the item, above its shipping row.</w:t>
       </w:r>
     </w:p>
     <w:p>
@@ -8667,164 +8587,15 @@
         <w:rPr>
           <w:b/>
         </w:rPr>
-        <w:t>Sale details</w:t>
-      </w:r>
-      <w:r>
-        <w:t>: Organization, Advertising source, Referral name and CFS rep name.</w:t>
-      </w:r>
-    </w:p>
-    <w:p>
-      <w:pPr>
-        <w:pStyle w:val="ListBullet"/>
-        <w:spacing w:after="60"/>
-      </w:pPr>
-      <w:r>
-        <w:rPr>
-          <w:b/>
-        </w:rPr>
-        <w:t>Customer billing name and address</w:t>
-      </w:r>
-      <w:r>
-        <w:t>: name, street address, unit, floor, suite, city, state, zip, cell, alternate phone and email.</w:t>
-      </w:r>
-    </w:p>
-    <w:p>
-      <w:pPr>
-        <w:pStyle w:val="ListBullet"/>
-        <w:spacing w:after="60"/>
-      </w:pPr>
-      <w:r>
-        <w:rPr>
-          <w:b/>
-        </w:rPr>
-        <w:t>Delivery address</w:t>
-      </w:r>
-      <w:r>
-        <w:t xml:space="preserve">: leave </w:t>
-      </w:r>
-      <w:r>
-        <w:rPr>
-          <w:b/>
-        </w:rPr>
-        <w:t>Same as billing</w:t>
-      </w:r>
-      <w:r>
-        <w:t xml:space="preserve"> ticked, or untick it to enter a different address.</w:t>
-      </w:r>
-    </w:p>
-    <w:p>
-      <w:pPr>
-        <w:pStyle w:val="ListBullet"/>
-        <w:spacing w:after="60"/>
-      </w:pPr>
-      <w:r>
-        <w:rPr>
-          <w:b/>
-        </w:rPr>
-        <w:t>Comments</w:t>
-      </w:r>
-      <w:r>
-        <w:t>: anything the delivery crew or checkout table should know.</w:t>
-      </w:r>
-    </w:p>
-    <w:p>
-      <w:r>
-        <w:t>Details tidy themselves up when you move to the next box: a phone number becomes (724) 555-0100, the state becomes capitals, and the email is lower-cased.</w:t>
-      </w:r>
-    </w:p>
-    <w:p>
-      <w:pPr>
-        <w:pStyle w:val="Heading3"/>
-      </w:pPr>
-      <w:r>
-        <w:lastRenderedPageBreak/>
-        <w:t>Letting the customer type it in</w:t>
-      </w:r>
-    </w:p>
-    <w:p>
-      <w:r>
-        <w:t xml:space="preserve">Customers are often quicker (and more accurate) typing their own address. Tap </w:t>
-      </w:r>
-      <w:r>
-        <w:rPr>
-          <w:b/>
-        </w:rPr>
-        <w:t>Hand tablet to customer</w:t>
-      </w:r>
-      <w:r>
-        <w:t xml:space="preserve">. The customer sees a simple, large-print form titled </w:t>
-      </w:r>
-      <w:r>
-        <w:rPr>
-          <w:b/>
-        </w:rPr>
-        <w:t>Where should we deliver?</w:t>
-      </w:r>
-      <w:r>
-        <w:t xml:space="preserve"> with only the fields they need: the same </w:t>
-      </w:r>
-      <w:r>
-        <w:rPr>
-          <w:b/>
-        </w:rPr>
-        <w:t>Unit #</w:t>
-      </w:r>
-      <w:r>
-        <w:t xml:space="preserve">, </w:t>
-      </w:r>
-      <w:r>
-        <w:rPr>
-          <w:b/>
-        </w:rPr>
-        <w:t>Floor</w:t>
-      </w:r>
-      <w:r>
-        <w:t xml:space="preserve">, </w:t>
-      </w:r>
-      <w:r>
-        <w:rPr>
-          <w:b/>
-        </w:rPr>
-        <w:t>Suite #</w:t>
-      </w:r>
-      <w:r>
-        <w:t xml:space="preserve"> and </w:t>
-      </w:r>
-      <w:r>
-        <w:rPr>
-          <w:b/>
-        </w:rPr>
-        <w:t>Alternate phone</w:t>
-      </w:r>
-      <w:r>
-        <w:t xml:space="preserve"> boxes as your form (all optional), and a choice of delivering </w:t>
-      </w:r>
-      <w:r>
-        <w:rPr>
-          <w:b/>
-        </w:rPr>
-        <w:t>To the address above</w:t>
-      </w:r>
-      <w:r>
-        <w:t xml:space="preserve"> or </w:t>
-      </w:r>
-      <w:r>
-        <w:rPr>
-          <w:b/>
-        </w:rPr>
-        <w:t>Somewhere else</w:t>
-      </w:r>
-      <w:r>
-        <w:t xml:space="preserve">, which asks for the delivery address the same way. When they tap </w:t>
-      </w:r>
-      <w:r>
-        <w:rPr>
-          <w:b/>
-        </w:rPr>
-        <w:t>Done</w:t>
-      </w:r>
-      <w:r>
-        <w:t>, the details drop into the order and they hand the tablet back.</w:t>
+        <w:t>Remove</w:t>
+      </w:r>
+      <w:r>
+        <w:t xml:space="preserve"> takes the item off the order. The app asks you to confirm first.</w:t>
+      </w:r>
+    </w:p>
+    <w:p>
+      <w:r>
+        <w:t>Under each item, its rows always go in the same order: what a bundle includes first, then upcharges, then shipping and services. A row added later still goes in its place, so you never need to tidy them up.</w:t>
       </w:r>
     </w:p>
     <w:p>
@@ -8837,11 +8608,334 @@
         <w:rPr>
           <w:noProof/>
         </w:rPr>
+        <w:lastRenderedPageBreak/>
         <w:drawing>
-          <wp:inline distT="0" distB="0" distL="0" distR="0" wp14:anchorId="30C18374" wp14:editId="0ADCBAA2">
+          <wp:inline distT="0" distB="0" distL="0" distR="0" wp14:anchorId="038DAB90" wp14:editId="6CFB5B8C">
+            <wp:extent cx="4754880" cy="2451405"/>
+            <wp:effectExtent l="0" t="0" r="0" b="0"/>
+            <wp:docPr id="12" name="Picture 12"/>
+            <wp:cNvGraphicFramePr>
+              <a:graphicFrameLocks xmlns:a="http://schemas.openxmlformats.org/drawingml/2006/main" noChangeAspect="1"/>
+            </wp:cNvGraphicFramePr>
+            <a:graphic xmlns:a="http://schemas.openxmlformats.org/drawingml/2006/main">
+              <a:graphicData uri="http://schemas.openxmlformats.org/drawingml/2006/picture">
+                <pic:pic xmlns:pic="http://schemas.openxmlformats.org/drawingml/2006/picture">
+                  <pic:nvPicPr>
+                    <pic:cNvPr id="0" name="55_reorder_items.png"/>
+                    <pic:cNvPicPr/>
+                  </pic:nvPicPr>
+                  <pic:blipFill>
+                    <a:blip r:embed="rId20"/>
+                    <a:stretch>
+                      <a:fillRect/>
+                    </a:stretch>
+                  </pic:blipFill>
+                  <pic:spPr>
+                    <a:xfrm>
+                      <a:off x="0" y="0"/>
+                      <a:ext cx="4754880" cy="2451405"/>
+                    </a:xfrm>
+                    <a:prstGeom prst="rect">
+                      <a:avLst/>
+                    </a:prstGeom>
+                  </pic:spPr>
+                </pic:pic>
+              </a:graphicData>
+            </a:graphic>
+          </wp:inline>
+        </w:drawing>
+      </w:r>
+    </w:p>
+    <w:p>
+      <w:pPr>
+        <w:spacing w:after="200"/>
+        <w:jc w:val="center"/>
+      </w:pPr>
+      <w:r>
+        <w:rPr>
+          <w:i/>
+          <w:color w:val="6B7280"/>
+          <w:sz w:val="18"/>
+        </w:rPr>
+        <w:t>Each item has arrows to move it; its upcharge and shipping move with it</w:t>
+      </w:r>
+    </w:p>
+    <w:p>
+      <w:r>
+        <w:t xml:space="preserve">Small labels on each item help you check the order at a glance: </w:t>
+      </w:r>
+      <w:r>
+        <w:rPr>
+          <w:b/>
+        </w:rPr>
+        <w:t>Take with</w:t>
+      </w:r>
+      <w:r>
+        <w:t xml:space="preserve">, </w:t>
+      </w:r>
+      <w:r>
+        <w:rPr>
+          <w:b/>
+        </w:rPr>
+        <w:t>Included</w:t>
+      </w:r>
+      <w:r>
+        <w:t xml:space="preserve"> (part of a bundle), a sale such as </w:t>
+      </w:r>
+      <w:r>
+        <w:rPr>
+          <w:b/>
+        </w:rPr>
+        <w:t>Sale -20%</w:t>
+      </w:r>
+      <w:r>
+        <w:t xml:space="preserve">, your extra discount such as </w:t>
+      </w:r>
+      <w:r>
+        <w:rPr>
+          <w:b/>
+        </w:rPr>
+        <w:t>-10%</w:t>
+      </w:r>
+      <w:r>
+        <w:t xml:space="preserve"> or </w:t>
+      </w:r>
+      <w:r>
+        <w:rPr>
+          <w:b/>
+        </w:rPr>
+        <w:t>-$5 ea</w:t>
+      </w:r>
+      <w:r>
+        <w:t xml:space="preserve">, and </w:t>
+      </w:r>
+      <w:r>
+        <w:rPr>
+          <w:b/>
+        </w:rPr>
+        <w:t>Not on sales sheet</w:t>
+      </w:r>
+      <w:r>
+        <w:t xml:space="preserve"> for a free service row that won't print. Any selections show after the name, for example </w:t>
+      </w:r>
+      <w:r>
+        <w:rPr>
+          <w:b/>
+        </w:rPr>
+        <w:t>Color: Gray</w:t>
+      </w:r>
+      <w:r>
+        <w:t>, and print the same way on the sales sheet.</w:t>
+      </w:r>
+    </w:p>
+    <w:p>
+      <w:pPr>
+        <w:pStyle w:val="Heading2"/>
+      </w:pPr>
+      <w:bookmarkStart w:id="17" w:name="_Toc242438360"/>
+      <w:r>
+        <w:t>Customer details</w:t>
+      </w:r>
+      <w:bookmarkEnd w:id="17"/>
+    </w:p>
+    <w:p>
+      <w:r>
+        <w:t xml:space="preserve">The right side of the screen (or the </w:t>
+      </w:r>
+      <w:r>
+        <w:rPr>
+          <w:b/>
+        </w:rPr>
+        <w:t>Customer</w:t>
+      </w:r>
+      <w:r>
+        <w:t xml:space="preserve"> tab on a phone) holds the same fields as the paper sales sheet:</w:t>
+      </w:r>
+    </w:p>
+    <w:p>
+      <w:pPr>
+        <w:pStyle w:val="ListBullet"/>
+        <w:spacing w:after="60"/>
+      </w:pPr>
+      <w:r>
+        <w:rPr>
+          <w:b/>
+        </w:rPr>
+        <w:t>Sale details</w:t>
+      </w:r>
+      <w:r>
+        <w:t>: Organization, Advertising source, Referral name and CFS rep name.</w:t>
+      </w:r>
+    </w:p>
+    <w:p>
+      <w:pPr>
+        <w:pStyle w:val="ListBullet"/>
+        <w:spacing w:after="60"/>
+      </w:pPr>
+      <w:r>
+        <w:rPr>
+          <w:b/>
+        </w:rPr>
+        <w:t>Customer billing name and address</w:t>
+      </w:r>
+      <w:r>
+        <w:t>: name, street address, unit, floor, suite, city, state, zip, cell, alternate phone and email.</w:t>
+      </w:r>
+    </w:p>
+    <w:p>
+      <w:pPr>
+        <w:pStyle w:val="ListBullet"/>
+        <w:spacing w:after="60"/>
+      </w:pPr>
+      <w:r>
+        <w:rPr>
+          <w:b/>
+        </w:rPr>
+        <w:t>Delivery address</w:t>
+      </w:r>
+      <w:r>
+        <w:t xml:space="preserve">: leave </w:t>
+      </w:r>
+      <w:r>
+        <w:rPr>
+          <w:b/>
+        </w:rPr>
+        <w:t>Same as billing</w:t>
+      </w:r>
+      <w:r>
+        <w:t xml:space="preserve"> ticked, or untick it to enter a different address.</w:t>
+      </w:r>
+    </w:p>
+    <w:p>
+      <w:pPr>
+        <w:pStyle w:val="ListBullet"/>
+        <w:spacing w:after="60"/>
+      </w:pPr>
+      <w:r>
+        <w:rPr>
+          <w:b/>
+        </w:rPr>
+        <w:t>Comments</w:t>
+      </w:r>
+      <w:r>
+        <w:t>: anything the delivery crew or checkout table should know.</w:t>
+      </w:r>
+    </w:p>
+    <w:p>
+      <w:r>
+        <w:t>Details tidy themselves up when you move to the next box: a phone number becomes (724) 555-0100, the state becomes capitals, and the email is lower-cased.</w:t>
+      </w:r>
+    </w:p>
+    <w:p>
+      <w:pPr>
+        <w:pStyle w:val="Heading3"/>
+      </w:pPr>
+      <w:r>
+        <w:t>Letting the customer type it in</w:t>
+      </w:r>
+    </w:p>
+    <w:p>
+      <w:r>
+        <w:t xml:space="preserve">Customers are often quicker (and more accurate) typing their own address. Tap </w:t>
+      </w:r>
+      <w:r>
+        <w:rPr>
+          <w:b/>
+        </w:rPr>
+        <w:t>Hand tablet to customer</w:t>
+      </w:r>
+      <w:r>
+        <w:t xml:space="preserve">. The customer sees a simple, large-print form titled </w:t>
+      </w:r>
+      <w:r>
+        <w:rPr>
+          <w:b/>
+        </w:rPr>
+        <w:t>Where should we deliver?</w:t>
+      </w:r>
+      <w:r>
+        <w:t xml:space="preserve"> with only the fields they need: the same </w:t>
+      </w:r>
+      <w:r>
+        <w:rPr>
+          <w:b/>
+        </w:rPr>
+        <w:t>Unit #</w:t>
+      </w:r>
+      <w:r>
+        <w:t xml:space="preserve">, </w:t>
+      </w:r>
+      <w:r>
+        <w:rPr>
+          <w:b/>
+        </w:rPr>
+        <w:t>Floor</w:t>
+      </w:r>
+      <w:r>
+        <w:t xml:space="preserve">, </w:t>
+      </w:r>
+      <w:r>
+        <w:rPr>
+          <w:b/>
+        </w:rPr>
+        <w:t>Suite #</w:t>
+      </w:r>
+      <w:r>
+        <w:t xml:space="preserve"> and </w:t>
+      </w:r>
+      <w:r>
+        <w:rPr>
+          <w:b/>
+        </w:rPr>
+        <w:t>Alternate phone</w:t>
+      </w:r>
+      <w:r>
+        <w:t xml:space="preserve"> boxes as your form (all optional), and a choice of delivering </w:t>
+      </w:r>
+      <w:r>
+        <w:rPr>
+          <w:b/>
+        </w:rPr>
+        <w:t>To the address above</w:t>
+      </w:r>
+      <w:r>
+        <w:t xml:space="preserve"> or </w:t>
+      </w:r>
+      <w:r>
+        <w:rPr>
+          <w:b/>
+        </w:rPr>
+        <w:t>Somewhere else</w:t>
+      </w:r>
+      <w:r>
+        <w:t xml:space="preserve">, which asks for the delivery address the same way. When they tap </w:t>
+      </w:r>
+      <w:r>
+        <w:rPr>
+          <w:b/>
+        </w:rPr>
+        <w:t>Done</w:t>
+      </w:r>
+      <w:r>
+        <w:t>, the details drop into the order and they hand the tablet back.</w:t>
+      </w:r>
+    </w:p>
+    <w:p>
+      <w:pPr>
+        <w:keepNext/>
+        <w:spacing w:after="40"/>
+        <w:jc w:val="center"/>
+      </w:pPr>
+      <w:r>
+        <w:rPr>
+          <w:noProof/>
+        </w:rPr>
+        <w:lastRenderedPageBreak/>
+        <w:drawing>
+          <wp:inline distT="0" distB="0" distL="0" distR="0" wp14:anchorId="01F3F875" wp14:editId="078F57E1">
             <wp:extent cx="4754880" cy="3194685"/>
             <wp:effectExtent l="0" t="0" r="0" b="0"/>
-            <wp:docPr id="12" name="Picture 12"/>
+            <wp:docPr id="13" name="Picture 13"/>
             <wp:cNvGraphicFramePr>
               <a:graphicFrameLocks xmlns:a="http://schemas.openxmlformats.org/drawingml/2006/main" noChangeAspect="1"/>
             </wp:cNvGraphicFramePr>
@@ -8853,7 +8947,7 @@
                     <pic:cNvPicPr/>
                   </pic:nvPicPr>
                   <pic:blipFill>
-                    <a:blip r:embed="rId20"/>
+                    <a:blip r:embed="rId21"/>
                     <a:stretch>
                       <a:fillRect/>
                     </a:stretch>
@@ -8892,7 +8986,7 @@
       <w:pPr>
         <w:pStyle w:val="Heading2"/>
       </w:pPr>
-      <w:bookmarkStart w:id="18" w:name="_Toc242436278"/>
+      <w:bookmarkStart w:id="18" w:name="_Toc242438361"/>
       <w:r>
         <w:t>Sending the order to checkout</w:t>
       </w:r>
@@ -9070,7 +9164,7 @@
       <w:pPr>
         <w:pStyle w:val="Heading2"/>
       </w:pPr>
-      <w:bookmarkStart w:id="19" w:name="_Toc242436279"/>
+      <w:bookmarkStart w:id="19" w:name="_Toc242438362"/>
       <w:r>
         <w:lastRenderedPageBreak/>
         <w:t>Using a phone</w:t>
@@ -9088,10 +9182,10 @@
           <w:noProof/>
         </w:rPr>
         <w:drawing>
-          <wp:inline distT="0" distB="0" distL="0" distR="0" wp14:anchorId="50F082E3" wp14:editId="35DA147C">
+          <wp:inline distT="0" distB="0" distL="0" distR="0" wp14:anchorId="212B0F23" wp14:editId="0BF06542">
             <wp:extent cx="2194560" cy="4749253"/>
             <wp:effectExtent l="0" t="0" r="0" b="0"/>
-            <wp:docPr id="13" name="Picture 13"/>
+            <wp:docPr id="14" name="Picture 14"/>
             <wp:cNvGraphicFramePr>
               <a:graphicFrameLocks xmlns:a="http://schemas.openxmlformats.org/drawingml/2006/main" noChangeAspect="1"/>
             </wp:cNvGraphicFramePr>
@@ -9103,7 +9197,7 @@
                     <pic:cNvPicPr/>
                   </pic:nvPicPr>
                   <pic:blipFill>
-                    <a:blip r:embed="rId21"/>
+                    <a:blip r:embed="rId22"/>
                     <a:stretch>
                       <a:fillRect/>
                     </a:stretch>
@@ -9166,7 +9260,7 @@
         <w:pStyle w:val="Heading1"/>
         <w:pageBreakBefore/>
       </w:pPr>
-      <w:bookmarkStart w:id="20" w:name="_Toc242436280"/>
+      <w:bookmarkStart w:id="20" w:name="_Toc242438363"/>
       <w:r>
         <w:lastRenderedPageBreak/>
         <w:t>Checking out a customer</w:t>
@@ -9207,10 +9301,10 @@
           <w:noProof/>
         </w:rPr>
         <w:drawing>
-          <wp:inline distT="0" distB="0" distL="0" distR="0" wp14:anchorId="0A50A09B" wp14:editId="522E1FB1">
+          <wp:inline distT="0" distB="0" distL="0" distR="0" wp14:anchorId="20695E5F" wp14:editId="055625FD">
             <wp:extent cx="5760720" cy="3870484"/>
             <wp:effectExtent l="0" t="0" r="0" b="0"/>
-            <wp:docPr id="14" name="Picture 14"/>
+            <wp:docPr id="15" name="Picture 15"/>
             <wp:cNvGraphicFramePr>
               <a:graphicFrameLocks xmlns:a="http://schemas.openxmlformats.org/drawingml/2006/main" noChangeAspect="1"/>
             </wp:cNvGraphicFramePr>
@@ -9222,7 +9316,7 @@
                     <pic:cNvPicPr/>
                   </pic:nvPicPr>
                   <pic:blipFill>
-                    <a:blip r:embed="rId22"/>
+                    <a:blip r:embed="rId23"/>
                     <a:stretch>
                       <a:fillRect/>
                     </a:stretch>
@@ -9261,7 +9355,7 @@
       <w:pPr>
         <w:pStyle w:val="Heading2"/>
       </w:pPr>
-      <w:bookmarkStart w:id="21" w:name="_Toc242436281"/>
+      <w:bookmarkStart w:id="21" w:name="_Toc242438364"/>
       <w:r>
         <w:t>1. Review the order with the customer</w:t>
       </w:r>
@@ -9367,7 +9461,7 @@
       <w:pPr>
         <w:pStyle w:val="Heading2"/>
       </w:pPr>
-      <w:bookmarkStart w:id="22" w:name="_Toc242436282"/>
+      <w:bookmarkStart w:id="22" w:name="_Toc242438365"/>
       <w:r>
         <w:t>2. Take payment</w:t>
       </w:r>
@@ -9655,10 +9749,10 @@
           <w:noProof/>
         </w:rPr>
         <w:drawing>
-          <wp:inline distT="0" distB="0" distL="0" distR="0" wp14:anchorId="4E82AAC8" wp14:editId="05DEA090">
+          <wp:inline distT="0" distB="0" distL="0" distR="0" wp14:anchorId="54FC10F8" wp14:editId="6523E92C">
             <wp:extent cx="4572000" cy="1517073"/>
             <wp:effectExtent l="0" t="0" r="0" b="0"/>
-            <wp:docPr id="15" name="Picture 15"/>
+            <wp:docPr id="16" name="Picture 16"/>
             <wp:cNvGraphicFramePr>
               <a:graphicFrameLocks xmlns:a="http://schemas.openxmlformats.org/drawingml/2006/main" noChangeAspect="1"/>
             </wp:cNvGraphicFramePr>
@@ -9670,7 +9764,7 @@
                     <pic:cNvPicPr/>
                   </pic:nvPicPr>
                   <pic:blipFill>
-                    <a:blip r:embed="rId23"/>
+                    <a:blip r:embed="rId24"/>
                     <a:stretch>
                       <a:fillRect/>
                     </a:stretch>
@@ -9765,7 +9859,7 @@
       <w:pPr>
         <w:pStyle w:val="Heading2"/>
       </w:pPr>
-      <w:bookmarkStart w:id="23" w:name="_Toc242436283"/>
+      <w:bookmarkStart w:id="23" w:name="_Toc242438366"/>
       <w:r>
         <w:t>3. Acknowledgements (initials and signature)</w:t>
       </w:r>
@@ -9947,10 +10041,10 @@
         </w:rPr>
         <w:lastRenderedPageBreak/>
         <w:drawing>
-          <wp:inline distT="0" distB="0" distL="0" distR="0" wp14:anchorId="48C268FD" wp14:editId="65427FFC">
+          <wp:inline distT="0" distB="0" distL="0" distR="0" wp14:anchorId="2DB534DF" wp14:editId="1BBA1A78">
             <wp:extent cx="4937760" cy="3317558"/>
             <wp:effectExtent l="0" t="0" r="0" b="0"/>
-            <wp:docPr id="16" name="Picture 16"/>
+            <wp:docPr id="17" name="Picture 17"/>
             <wp:cNvGraphicFramePr>
               <a:graphicFrameLocks xmlns:a="http://schemas.openxmlformats.org/drawingml/2006/main" noChangeAspect="1"/>
             </wp:cNvGraphicFramePr>
@@ -9962,7 +10056,7 @@
                     <pic:cNvPicPr/>
                   </pic:nvPicPr>
                   <pic:blipFill>
-                    <a:blip r:embed="rId24"/>
+                    <a:blip r:embed="rId25"/>
                     <a:stretch>
                       <a:fillRect/>
                     </a:stretch>
@@ -10136,7 +10230,7 @@
       <w:pPr>
         <w:pStyle w:val="Heading2"/>
       </w:pPr>
-      <w:bookmarkStart w:id="24" w:name="_Toc242436284"/>
+      <w:bookmarkStart w:id="24" w:name="_Toc242438367"/>
       <w:r>
         <w:t>4. Complete the sale</w:t>
       </w:r>
@@ -10358,7 +10452,7 @@
       <w:pPr>
         <w:pStyle w:val="Heading2"/>
       </w:pPr>
-      <w:bookmarkStart w:id="25" w:name="_Toc242436285"/>
+      <w:bookmarkStart w:id="25" w:name="_Toc242438368"/>
       <w:r>
         <w:t>Other checkout actions</w:t>
       </w:r>
@@ -10568,7 +10662,7 @@
         <w:pStyle w:val="Heading1"/>
         <w:pageBreakBefore/>
       </w:pPr>
-      <w:bookmarkStart w:id="26" w:name="_Toc242436286"/>
+      <w:bookmarkStart w:id="26" w:name="_Toc242438369"/>
       <w:r>
         <w:lastRenderedPageBreak/>
         <w:t>The sales sheet</w:t>
@@ -10591,10 +10685,10 @@
           <w:noProof/>
         </w:rPr>
         <w:drawing>
-          <wp:inline distT="0" distB="0" distL="0" distR="0" wp14:anchorId="4334CABA" wp14:editId="5B5215CA">
+          <wp:inline distT="0" distB="0" distL="0" distR="0" wp14:anchorId="4D961DB2" wp14:editId="12FE2709">
             <wp:extent cx="4023360" cy="3187256"/>
             <wp:effectExtent l="0" t="0" r="0" b="0"/>
-            <wp:docPr id="17" name="Picture 17"/>
+            <wp:docPr id="18" name="Picture 18"/>
             <wp:cNvGraphicFramePr>
               <a:graphicFrameLocks xmlns:a="http://schemas.openxmlformats.org/drawingml/2006/main" noChangeAspect="1"/>
             </wp:cNvGraphicFramePr>
@@ -10606,7 +10700,7 @@
                     <pic:cNvPicPr/>
                   </pic:nvPicPr>
                   <pic:blipFill>
-                    <a:blip r:embed="rId25"/>
+                    <a:blip r:embed="rId26"/>
                     <a:stretch>
                       <a:fillRect/>
                     </a:stretch>
@@ -11038,7 +11132,7 @@
       <w:pPr>
         <w:pStyle w:val="Heading2"/>
       </w:pPr>
-      <w:bookmarkStart w:id="27" w:name="_Toc242436287"/>
+      <w:bookmarkStart w:id="27" w:name="_Toc242438370"/>
       <w:r>
         <w:t>Emailing a receipt</w:t>
       </w:r>
@@ -11165,10 +11259,10 @@
           <w:noProof/>
         </w:rPr>
         <w:drawing>
-          <wp:inline distT="0" distB="0" distL="0" distR="0" wp14:anchorId="771AC683" wp14:editId="593E9184">
+          <wp:inline distT="0" distB="0" distL="0" distR="0" wp14:anchorId="3B2C30ED" wp14:editId="295DD7D4">
             <wp:extent cx="4572000" cy="3071812"/>
             <wp:effectExtent l="0" t="0" r="0" b="0"/>
-            <wp:docPr id="18" name="Picture 18"/>
+            <wp:docPr id="19" name="Picture 19"/>
             <wp:cNvGraphicFramePr>
               <a:graphicFrameLocks xmlns:a="http://schemas.openxmlformats.org/drawingml/2006/main" noChangeAspect="1"/>
             </wp:cNvGraphicFramePr>
@@ -11180,7 +11274,7 @@
                     <pic:cNvPicPr/>
                   </pic:nvPicPr>
                   <pic:blipFill>
-                    <a:blip r:embed="rId26"/>
+                    <a:blip r:embed="rId27"/>
                     <a:stretch>
                       <a:fillRect/>
                     </a:stretch>
@@ -11626,7 +11720,7 @@
         <w:pStyle w:val="Heading1"/>
         <w:pageBreakBefore/>
       </w:pPr>
-      <w:bookmarkStart w:id="28" w:name="_Toc242436288"/>
+      <w:bookmarkStart w:id="28" w:name="_Toc242438371"/>
       <w:r>
         <w:lastRenderedPageBreak/>
         <w:t>Looking up orders</w:t>
@@ -11658,10 +11752,10 @@
           <w:noProof/>
         </w:rPr>
         <w:drawing>
-          <wp:inline distT="0" distB="0" distL="0" distR="0" wp14:anchorId="50614D98" wp14:editId="3FEA957D">
+          <wp:inline distT="0" distB="0" distL="0" distR="0" wp14:anchorId="102DB0CB" wp14:editId="43E407E1">
             <wp:extent cx="5760720" cy="3870484"/>
             <wp:effectExtent l="0" t="0" r="0" b="0"/>
-            <wp:docPr id="19" name="Picture 19"/>
+            <wp:docPr id="20" name="Picture 20"/>
             <wp:cNvGraphicFramePr>
               <a:graphicFrameLocks xmlns:a="http://schemas.openxmlformats.org/drawingml/2006/main" noChangeAspect="1"/>
             </wp:cNvGraphicFramePr>
@@ -11673,7 +11767,7 @@
                     <pic:cNvPicPr/>
                   </pic:nvPicPr>
                   <pic:blipFill>
-                    <a:blip r:embed="rId27"/>
+                    <a:blip r:embed="rId28"/>
                     <a:stretch>
                       <a:fillRect/>
                     </a:stretch>
@@ -11778,7 +11872,7 @@
       <w:pPr>
         <w:pStyle w:val="Heading2"/>
       </w:pPr>
-      <w:bookmarkStart w:id="29" w:name="_Toc242436289"/>
+      <w:bookmarkStart w:id="29" w:name="_Toc242438372"/>
       <w:r>
         <w:t>Extra options for admins</w:t>
       </w:r>
@@ -11868,10 +11962,10 @@
         </w:rPr>
         <w:lastRenderedPageBreak/>
         <w:drawing>
-          <wp:inline distT="0" distB="0" distL="0" distR="0" wp14:anchorId="2575AB03" wp14:editId="2E2E5A52">
+          <wp:inline distT="0" distB="0" distL="0" distR="0" wp14:anchorId="1E0F1C0E" wp14:editId="44B40C58">
             <wp:extent cx="4754880" cy="3194685"/>
             <wp:effectExtent l="0" t="0" r="0" b="0"/>
-            <wp:docPr id="20" name="Picture 20"/>
+            <wp:docPr id="21" name="Picture 21"/>
             <wp:cNvGraphicFramePr>
               <a:graphicFrameLocks xmlns:a="http://schemas.openxmlformats.org/drawingml/2006/main" noChangeAspect="1"/>
             </wp:cNvGraphicFramePr>
@@ -11883,7 +11977,7 @@
                     <pic:cNvPicPr/>
                   </pic:nvPicPr>
                   <pic:blipFill>
-                    <a:blip r:embed="rId28"/>
+                    <a:blip r:embed="rId29"/>
                     <a:stretch>
                       <a:fillRect/>
                     </a:stretch>
@@ -11976,7 +12070,7 @@
         <w:pStyle w:val="Heading1"/>
         <w:pageBreakBefore/>
       </w:pPr>
-      <w:bookmarkStart w:id="30" w:name="_Toc242436290"/>
+      <w:bookmarkStart w:id="30" w:name="_Toc242438373"/>
       <w:r>
         <w:lastRenderedPageBreak/>
         <w:t>The dashboard</w:t>
@@ -12040,10 +12134,10 @@
           <w:noProof/>
         </w:rPr>
         <w:drawing>
-          <wp:inline distT="0" distB="0" distL="0" distR="0" wp14:anchorId="434BD986" wp14:editId="4FE4CC6F">
+          <wp:inline distT="0" distB="0" distL="0" distR="0" wp14:anchorId="4A4A5BD8" wp14:editId="21B23913">
             <wp:extent cx="4937760" cy="4305110"/>
             <wp:effectExtent l="0" t="0" r="0" b="0"/>
-            <wp:docPr id="21" name="Picture 21"/>
+            <wp:docPr id="22" name="Picture 22"/>
             <wp:cNvGraphicFramePr>
               <a:graphicFrameLocks xmlns:a="http://schemas.openxmlformats.org/drawingml/2006/main" noChangeAspect="1"/>
             </wp:cNvGraphicFramePr>
@@ -12055,7 +12149,7 @@
                     <pic:cNvPicPr/>
                   </pic:nvPicPr>
                   <pic:blipFill>
-                    <a:blip r:embed="rId29"/>
+                    <a:blip r:embed="rId30"/>
                     <a:stretch>
                       <a:fillRect/>
                     </a:stretch>
@@ -12695,7 +12789,7 @@
         <w:pStyle w:val="Heading1"/>
         <w:pageBreakBefore/>
       </w:pPr>
-      <w:bookmarkStart w:id="31" w:name="_Toc242436291"/>
+      <w:bookmarkStart w:id="31" w:name="_Toc242438374"/>
       <w:r>
         <w:lastRenderedPageBreak/>
         <w:t>Keeping inventory</w:t>
@@ -12754,10 +12848,10 @@
           <w:noProof/>
         </w:rPr>
         <w:drawing>
-          <wp:inline distT="0" distB="0" distL="0" distR="0" wp14:anchorId="1783A79A" wp14:editId="30C17A4A">
+          <wp:inline distT="0" distB="0" distL="0" distR="0" wp14:anchorId="4D444BF1" wp14:editId="502245AD">
             <wp:extent cx="5760720" cy="3870484"/>
             <wp:effectExtent l="0" t="0" r="0" b="0"/>
-            <wp:docPr id="22" name="Picture 22"/>
+            <wp:docPr id="23" name="Picture 23"/>
             <wp:cNvGraphicFramePr>
               <a:graphicFrameLocks xmlns:a="http://schemas.openxmlformats.org/drawingml/2006/main" noChangeAspect="1"/>
             </wp:cNvGraphicFramePr>
@@ -12769,7 +12863,7 @@
                     <pic:cNvPicPr/>
                   </pic:nvPicPr>
                   <pic:blipFill>
-                    <a:blip r:embed="rId30"/>
+                    <a:blip r:embed="rId31"/>
                     <a:stretch>
                       <a:fillRect/>
                     </a:stretch>
@@ -12808,7 +12902,7 @@
       <w:pPr>
         <w:pStyle w:val="Heading2"/>
       </w:pPr>
-      <w:bookmarkStart w:id="32" w:name="_Toc242436292"/>
+      <w:bookmarkStart w:id="32" w:name="_Toc242438375"/>
       <w:r>
         <w:t>What's on the screen</w:t>
       </w:r>
@@ -12916,10 +13010,10 @@
         </w:rPr>
         <w:lastRenderedPageBreak/>
         <w:drawing>
-          <wp:inline distT="0" distB="0" distL="0" distR="0" wp14:anchorId="097D3D55" wp14:editId="24A68E31">
+          <wp:inline distT="0" distB="0" distL="0" distR="0" wp14:anchorId="4DD7D19E" wp14:editId="6B917715">
             <wp:extent cx="5120640" cy="2295459"/>
             <wp:effectExtent l="0" t="0" r="0" b="0"/>
-            <wp:docPr id="23" name="Picture 23"/>
+            <wp:docPr id="24" name="Picture 24"/>
             <wp:cNvGraphicFramePr>
               <a:graphicFrameLocks xmlns:a="http://schemas.openxmlformats.org/drawingml/2006/main" noChangeAspect="1"/>
             </wp:cNvGraphicFramePr>
@@ -12931,7 +13025,7 @@
                     <pic:cNvPicPr/>
                   </pic:nvPicPr>
                   <pic:blipFill>
-                    <a:blip r:embed="rId31"/>
+                    <a:blip r:embed="rId32"/>
                     <a:stretch>
                       <a:fillRect/>
                     </a:stretch>
@@ -13041,7 +13135,7 @@
       <w:pPr>
         <w:pStyle w:val="Heading2"/>
       </w:pPr>
-      <w:bookmarkStart w:id="33" w:name="_Toc242436293"/>
+      <w:bookmarkStart w:id="33" w:name="_Toc242438376"/>
       <w:r>
         <w:t>Updating a count</w:t>
       </w:r>
@@ -13118,10 +13212,10 @@
         </w:rPr>
         <w:lastRenderedPageBreak/>
         <w:drawing>
-          <wp:inline distT="0" distB="0" distL="0" distR="0" wp14:anchorId="24A9BD01" wp14:editId="1EC4829E">
+          <wp:inline distT="0" distB="0" distL="0" distR="0" wp14:anchorId="469254EB" wp14:editId="76D0919C">
             <wp:extent cx="5120640" cy="3440430"/>
             <wp:effectExtent l="0" t="0" r="0" b="0"/>
-            <wp:docPr id="24" name="Picture 24"/>
+            <wp:docPr id="25" name="Picture 25"/>
             <wp:cNvGraphicFramePr>
               <a:graphicFrameLocks xmlns:a="http://schemas.openxmlformats.org/drawingml/2006/main" noChangeAspect="1"/>
             </wp:cNvGraphicFramePr>
@@ -13133,7 +13227,7 @@
                     <pic:cNvPicPr/>
                   </pic:nvPicPr>
                   <pic:blipFill>
-                    <a:blip r:embed="rId32"/>
+                    <a:blip r:embed="rId33"/>
                     <a:stretch>
                       <a:fillRect/>
                     </a:stretch>
@@ -13172,7 +13266,7 @@
       <w:pPr>
         <w:pStyle w:val="Heading2"/>
       </w:pPr>
-      <w:bookmarkStart w:id="34" w:name="_Toc242436294"/>
+      <w:bookmarkStart w:id="34" w:name="_Toc242438377"/>
       <w:r>
         <w:t>What changes the count automatically</w:t>
       </w:r>
@@ -13576,7 +13670,7 @@
       <w:pPr>
         <w:pStyle w:val="Heading2"/>
       </w:pPr>
-      <w:bookmarkStart w:id="35" w:name="_Toc242436295"/>
+      <w:bookmarkStart w:id="35" w:name="_Toc242438378"/>
       <w:r>
         <w:t>Seeing the history</w:t>
       </w:r>
@@ -13591,7 +13685,7 @@
       <w:pPr>
         <w:pStyle w:val="Heading2"/>
       </w:pPr>
-      <w:bookmarkStart w:id="36" w:name="_Toc242436296"/>
+      <w:bookmarkStart w:id="36" w:name="_Toc242438379"/>
       <w:r>
         <w:lastRenderedPageBreak/>
         <w:t>Notes for the inventory sheet</w:t>
@@ -13641,10 +13735,10 @@
           <w:noProof/>
         </w:rPr>
         <w:drawing>
-          <wp:inline distT="0" distB="0" distL="0" distR="0" wp14:anchorId="73D3A42A" wp14:editId="194DC503">
+          <wp:inline distT="0" distB="0" distL="0" distR="0" wp14:anchorId="3A6F107F" wp14:editId="51D8B7AB">
             <wp:extent cx="5120640" cy="3440430"/>
             <wp:effectExtent l="0" t="0" r="0" b="0"/>
-            <wp:docPr id="25" name="Picture 25"/>
+            <wp:docPr id="26" name="Picture 26"/>
             <wp:cNvGraphicFramePr>
               <a:graphicFrameLocks xmlns:a="http://schemas.openxmlformats.org/drawingml/2006/main" noChangeAspect="1"/>
             </wp:cNvGraphicFramePr>
@@ -13656,7 +13750,7 @@
                     <pic:cNvPicPr/>
                   </pic:nvPicPr>
                   <pic:blipFill>
-                    <a:blip r:embed="rId33"/>
+                    <a:blip r:embed="rId34"/>
                     <a:stretch>
                       <a:fillRect/>
                     </a:stretch>
@@ -13695,7 +13789,7 @@
       <w:pPr>
         <w:pStyle w:val="Heading2"/>
       </w:pPr>
-      <w:bookmarkStart w:id="37" w:name="_Toc242436297"/>
+      <w:bookmarkStart w:id="37" w:name="_Toc242438380"/>
       <w:r>
         <w:t>Start and end counts</w:t>
       </w:r>
@@ -14219,10 +14313,10 @@
           <w:noProof/>
         </w:rPr>
         <w:drawing>
-          <wp:inline distT="0" distB="0" distL="0" distR="0" wp14:anchorId="578BD157" wp14:editId="29EADADC">
+          <wp:inline distT="0" distB="0" distL="0" distR="0" wp14:anchorId="020B0BAB" wp14:editId="7CCB4BDA">
             <wp:extent cx="5486400" cy="3686175"/>
             <wp:effectExtent l="0" t="0" r="0" b="0"/>
-            <wp:docPr id="26" name="Picture 26"/>
+            <wp:docPr id="27" name="Picture 27"/>
             <wp:cNvGraphicFramePr>
               <a:graphicFrameLocks xmlns:a="http://schemas.openxmlformats.org/drawingml/2006/main" noChangeAspect="1"/>
             </wp:cNvGraphicFramePr>
@@ -14234,7 +14328,7 @@
                     <pic:cNvPicPr/>
                   </pic:nvPicPr>
                   <pic:blipFill>
-                    <a:blip r:embed="rId34"/>
+                    <a:blip r:embed="rId35"/>
                     <a:stretch>
                       <a:fillRect/>
                     </a:stretch>
@@ -14359,7 +14453,7 @@
         <w:pStyle w:val="Heading1"/>
         <w:pageBreakBefore/>
       </w:pPr>
-      <w:bookmarkStart w:id="38" w:name="_Toc242436298"/>
+      <w:bookmarkStart w:id="38" w:name="_Toc242438381"/>
       <w:r>
         <w:lastRenderedPageBreak/>
         <w:t>Admin: setting up an event</w:t>
@@ -14384,7 +14478,7 @@
       <w:pPr>
         <w:pStyle w:val="Heading2"/>
       </w:pPr>
-      <w:bookmarkStart w:id="39" w:name="_Toc242436299"/>
+      <w:bookmarkStart w:id="39" w:name="_Toc242438382"/>
       <w:r>
         <w:t>Creating or editing an event</w:t>
       </w:r>
@@ -14401,10 +14495,10 @@
           <w:noProof/>
         </w:rPr>
         <w:drawing>
-          <wp:inline distT="0" distB="0" distL="0" distR="0" wp14:anchorId="31DB051C" wp14:editId="3A5FDF2F">
+          <wp:inline distT="0" distB="0" distL="0" distR="0" wp14:anchorId="1E29D4E6" wp14:editId="45D938EC">
             <wp:extent cx="5760720" cy="1134142"/>
             <wp:effectExtent l="0" t="0" r="0" b="0"/>
-            <wp:docPr id="27" name="Picture 27"/>
+            <wp:docPr id="28" name="Picture 28"/>
             <wp:cNvGraphicFramePr>
               <a:graphicFrameLocks xmlns:a="http://schemas.openxmlformats.org/drawingml/2006/main" noChangeAspect="1"/>
             </wp:cNvGraphicFramePr>
@@ -14416,7 +14510,7 @@
                     <pic:cNvPicPr/>
                   </pic:nvPicPr>
                   <pic:blipFill>
-                    <a:blip r:embed="rId35"/>
+                    <a:blip r:embed="rId36"/>
                     <a:stretch>
                       <a:fillRect/>
                     </a:stretch>
@@ -14750,10 +14844,10 @@
           <w:noProof/>
         </w:rPr>
         <w:drawing>
-          <wp:inline distT="0" distB="0" distL="0" distR="0" wp14:anchorId="0B01EA04" wp14:editId="637B4A0F">
+          <wp:inline distT="0" distB="0" distL="0" distR="0" wp14:anchorId="39698682" wp14:editId="2059FBBA">
             <wp:extent cx="3840480" cy="2580322"/>
             <wp:effectExtent l="0" t="0" r="0" b="0"/>
-            <wp:docPr id="28" name="Picture 28"/>
+            <wp:docPr id="29" name="Picture 29"/>
             <wp:cNvGraphicFramePr>
               <a:graphicFrameLocks xmlns:a="http://schemas.openxmlformats.org/drawingml/2006/main" noChangeAspect="1"/>
             </wp:cNvGraphicFramePr>
@@ -14765,7 +14859,7 @@
                     <pic:cNvPicPr/>
                   </pic:nvPicPr>
                   <pic:blipFill>
-                    <a:blip r:embed="rId36"/>
+                    <a:blip r:embed="rId37"/>
                     <a:stretch>
                       <a:fillRect/>
                     </a:stretch>
@@ -14863,7 +14957,7 @@
       <w:pPr>
         <w:pStyle w:val="Heading2"/>
       </w:pPr>
-      <w:bookmarkStart w:id="40" w:name="_Toc242436300"/>
+      <w:bookmarkStart w:id="40" w:name="_Toc242438383"/>
       <w:r>
         <w:t>Closing out an event</w:t>
       </w:r>
@@ -15030,7 +15124,7 @@
       <w:pPr>
         <w:pStyle w:val="Heading2"/>
       </w:pPr>
-      <w:bookmarkStart w:id="41" w:name="_Toc242436301"/>
+      <w:bookmarkStart w:id="41" w:name="_Toc242438384"/>
       <w:r>
         <w:t>Event sales sheets</w:t>
       </w:r>
@@ -15088,10 +15182,10 @@
           <w:noProof/>
         </w:rPr>
         <w:drawing>
-          <wp:inline distT="0" distB="0" distL="0" distR="0" wp14:anchorId="0BD4FA8B" wp14:editId="049C58DA">
+          <wp:inline distT="0" distB="0" distL="0" distR="0" wp14:anchorId="371AC186" wp14:editId="187EF8F0">
             <wp:extent cx="4389120" cy="2948940"/>
             <wp:effectExtent l="0" t="0" r="0" b="0"/>
-            <wp:docPr id="29" name="Picture 29"/>
+            <wp:docPr id="30" name="Picture 30"/>
             <wp:cNvGraphicFramePr>
               <a:graphicFrameLocks xmlns:a="http://schemas.openxmlformats.org/drawingml/2006/main" noChangeAspect="1"/>
             </wp:cNvGraphicFramePr>
@@ -15103,7 +15197,7 @@
                     <pic:cNvPicPr/>
                   </pic:nvPicPr>
                   <pic:blipFill>
-                    <a:blip r:embed="rId37"/>
+                    <a:blip r:embed="rId38"/>
                     <a:stretch>
                       <a:fillRect/>
                     </a:stretch>
@@ -15217,10 +15311,10 @@
           <w:noProof/>
         </w:rPr>
         <w:drawing>
-          <wp:inline distT="0" distB="0" distL="0" distR="0" wp14:anchorId="7D095911" wp14:editId="6AAAD204">
+          <wp:inline distT="0" distB="0" distL="0" distR="0" wp14:anchorId="5A20DF0F" wp14:editId="3A1A346A">
             <wp:extent cx="4206240" cy="5717858"/>
             <wp:effectExtent l="0" t="0" r="0" b="0"/>
-            <wp:docPr id="30" name="Picture 30"/>
+            <wp:docPr id="31" name="Picture 31"/>
             <wp:cNvGraphicFramePr>
               <a:graphicFrameLocks xmlns:a="http://schemas.openxmlformats.org/drawingml/2006/main" noChangeAspect="1"/>
             </wp:cNvGraphicFramePr>
@@ -15232,7 +15326,7 @@
                     <pic:cNvPicPr/>
                   </pic:nvPicPr>
                   <pic:blipFill>
-                    <a:blip r:embed="rId38"/>
+                    <a:blip r:embed="rId39"/>
                     <a:stretch>
                       <a:fillRect/>
                     </a:stretch>
@@ -15355,10 +15449,10 @@
           <w:noProof/>
         </w:rPr>
         <w:drawing>
-          <wp:inline distT="0" distB="0" distL="0" distR="0" wp14:anchorId="3647D293" wp14:editId="7C661330">
+          <wp:inline distT="0" distB="0" distL="0" distR="0" wp14:anchorId="1A59AAEA" wp14:editId="7CFE95C4">
             <wp:extent cx="4389120" cy="2948940"/>
             <wp:effectExtent l="0" t="0" r="0" b="0"/>
-            <wp:docPr id="31" name="Picture 31"/>
+            <wp:docPr id="32" name="Picture 32"/>
             <wp:cNvGraphicFramePr>
               <a:graphicFrameLocks xmlns:a="http://schemas.openxmlformats.org/drawingml/2006/main" noChangeAspect="1"/>
             </wp:cNvGraphicFramePr>
@@ -15370,7 +15464,7 @@
                     <pic:cNvPicPr/>
                   </pic:nvPicPr>
                   <pic:blipFill>
-                    <a:blip r:embed="rId39"/>
+                    <a:blip r:embed="rId40"/>
                     <a:stretch>
                       <a:fillRect/>
                     </a:stretch>
@@ -15468,7 +15562,7 @@
         <w:pStyle w:val="Heading1"/>
         <w:pageBreakBefore/>
       </w:pPr>
-      <w:bookmarkStart w:id="42" w:name="_Toc242436302"/>
+      <w:bookmarkStart w:id="42" w:name="_Toc242438385"/>
       <w:r>
         <w:lastRenderedPageBreak/>
         <w:t>Admin: managing the catalog</w:t>
@@ -15572,10 +15666,10 @@
           <w:noProof/>
         </w:rPr>
         <w:drawing>
-          <wp:inline distT="0" distB="0" distL="0" distR="0" wp14:anchorId="72FB04B5" wp14:editId="22F07FBA">
+          <wp:inline distT="0" distB="0" distL="0" distR="0" wp14:anchorId="4DC47A56" wp14:editId="05961215">
             <wp:extent cx="5760720" cy="4050506"/>
             <wp:effectExtent l="0" t="0" r="0" b="0"/>
-            <wp:docPr id="32" name="Picture 32"/>
+            <wp:docPr id="33" name="Picture 33"/>
             <wp:cNvGraphicFramePr>
               <a:graphicFrameLocks xmlns:a="http://schemas.openxmlformats.org/drawingml/2006/main" noChangeAspect="1"/>
             </wp:cNvGraphicFramePr>
@@ -15587,7 +15681,7 @@
                     <pic:cNvPicPr/>
                   </pic:nvPicPr>
                   <pic:blipFill>
-                    <a:blip r:embed="rId40"/>
+                    <a:blip r:embed="rId41"/>
                     <a:stretch>
                       <a:fillRect/>
                     </a:stretch>
@@ -15626,7 +15720,7 @@
       <w:pPr>
         <w:pStyle w:val="Heading2"/>
       </w:pPr>
-      <w:bookmarkStart w:id="43" w:name="_Toc242436303"/>
+      <w:bookmarkStart w:id="43" w:name="_Toc242438386"/>
       <w:r>
         <w:lastRenderedPageBreak/>
         <w:t>Adding or editing a product</w:t>
@@ -15644,10 +15738,10 @@
           <w:noProof/>
         </w:rPr>
         <w:drawing>
-          <wp:inline distT="0" distB="0" distL="0" distR="0" wp14:anchorId="7F60D2AA" wp14:editId="407ECAA1">
+          <wp:inline distT="0" distB="0" distL="0" distR="0" wp14:anchorId="69406520" wp14:editId="667470FD">
             <wp:extent cx="5486400" cy="3686175"/>
             <wp:effectExtent l="0" t="0" r="0" b="0"/>
-            <wp:docPr id="33" name="Picture 33"/>
+            <wp:docPr id="34" name="Picture 34"/>
             <wp:cNvGraphicFramePr>
               <a:graphicFrameLocks xmlns:a="http://schemas.openxmlformats.org/drawingml/2006/main" noChangeAspect="1"/>
             </wp:cNvGraphicFramePr>
@@ -15659,7 +15753,7 @@
                     <pic:cNvPicPr/>
                   </pic:nvPicPr>
                   <pic:blipFill>
-                    <a:blip r:embed="rId41"/>
+                    <a:blip r:embed="rId42"/>
                     <a:stretch>
                       <a:fillRect/>
                     </a:stretch>
@@ -16111,10 +16205,10 @@
         </w:rPr>
         <w:lastRenderedPageBreak/>
         <w:drawing>
-          <wp:inline distT="0" distB="0" distL="0" distR="0" wp14:anchorId="5B305A87" wp14:editId="690DD74A">
+          <wp:inline distT="0" distB="0" distL="0" distR="0" wp14:anchorId="1C1F7720" wp14:editId="7E29B899">
             <wp:extent cx="5120640" cy="2130933"/>
             <wp:effectExtent l="0" t="0" r="0" b="0"/>
-            <wp:docPr id="34" name="Picture 34"/>
+            <wp:docPr id="35" name="Picture 35"/>
             <wp:cNvGraphicFramePr>
               <a:graphicFrameLocks xmlns:a="http://schemas.openxmlformats.org/drawingml/2006/main" noChangeAspect="1"/>
             </wp:cNvGraphicFramePr>
@@ -16126,7 +16220,7 @@
                     <pic:cNvPicPr/>
                   </pic:nvPicPr>
                   <pic:blipFill>
-                    <a:blip r:embed="rId42"/>
+                    <a:blip r:embed="rId43"/>
                     <a:stretch>
                       <a:fillRect/>
                     </a:stretch>
@@ -16292,10 +16386,10 @@
           <w:noProof/>
         </w:rPr>
         <w:drawing>
-          <wp:inline distT="0" distB="0" distL="0" distR="0" wp14:anchorId="53092173" wp14:editId="20552460">
+          <wp:inline distT="0" distB="0" distL="0" distR="0" wp14:anchorId="219BCBB5" wp14:editId="70E2979F">
             <wp:extent cx="5486400" cy="3686175"/>
             <wp:effectExtent l="0" t="0" r="0" b="0"/>
-            <wp:docPr id="35" name="Picture 35"/>
+            <wp:docPr id="36" name="Picture 36"/>
             <wp:cNvGraphicFramePr>
               <a:graphicFrameLocks xmlns:a="http://schemas.openxmlformats.org/drawingml/2006/main" noChangeAspect="1"/>
             </wp:cNvGraphicFramePr>
@@ -16307,7 +16401,7 @@
                     <pic:cNvPicPr/>
                   </pic:nvPicPr>
                   <pic:blipFill>
-                    <a:blip r:embed="rId43"/>
+                    <a:blip r:embed="rId44"/>
                     <a:stretch>
                       <a:fillRect/>
                     </a:stretch>
@@ -16494,10 +16588,10 @@
           <w:noProof/>
         </w:rPr>
         <w:drawing>
-          <wp:inline distT="0" distB="0" distL="0" distR="0" wp14:anchorId="7D614A6B" wp14:editId="1870D905">
+          <wp:inline distT="0" distB="0" distL="0" distR="0" wp14:anchorId="3FDFA9CB" wp14:editId="0281B47B">
             <wp:extent cx="5486400" cy="3686175"/>
             <wp:effectExtent l="0" t="0" r="0" b="0"/>
-            <wp:docPr id="36" name="Picture 36"/>
+            <wp:docPr id="37" name="Picture 37"/>
             <wp:cNvGraphicFramePr>
               <a:graphicFrameLocks xmlns:a="http://schemas.openxmlformats.org/drawingml/2006/main" noChangeAspect="1"/>
             </wp:cNvGraphicFramePr>
@@ -16509,7 +16603,7 @@
                     <pic:cNvPicPr/>
                   </pic:nvPicPr>
                   <pic:blipFill>
-                    <a:blip r:embed="rId44"/>
+                    <a:blip r:embed="rId45"/>
                     <a:stretch>
                       <a:fillRect/>
                     </a:stretch>
@@ -16742,7 +16836,7 @@
       <w:pPr>
         <w:pStyle w:val="Heading2"/>
       </w:pPr>
-      <w:bookmarkStart w:id="44" w:name="_Toc242436304"/>
+      <w:bookmarkStart w:id="44" w:name="_Toc242438387"/>
       <w:r>
         <w:t>Delivery and services</w:t>
       </w:r>
@@ -16760,6 +16854,29 @@
       </w:r>
       <w:r>
         <w:t xml:space="preserve"> tab in the Catalog to manage shipping methods and in-home services such as Drop Ship, Take With, White Glove, Haul Away and Local Delivery.</w:t>
+      </w:r>
+    </w:p>
+    <w:p>
+      <w:r>
+        <w:t xml:space="preserve">The </w:t>
+      </w:r>
+      <w:r>
+        <w:rPr>
+          <w:b/>
+        </w:rPr>
+        <w:t>up</w:t>
+      </w:r>
+      <w:r>
+        <w:t xml:space="preserve"> and </w:t>
+      </w:r>
+      <w:r>
+        <w:rPr>
+          <w:b/>
+        </w:rPr>
+        <w:t>down arrows</w:t>
+      </w:r>
+      <w:r>
+        <w:t xml:space="preserve"> set the order the options are offered in on the sales floor, when adding an item or a service.</w:t>
       </w:r>
     </w:p>
     <w:p>
@@ -16773,10 +16890,10 @@
           <w:noProof/>
         </w:rPr>
         <w:drawing>
-          <wp:inline distT="0" distB="0" distL="0" distR="0" wp14:anchorId="3C4248E4" wp14:editId="55F335E2">
-            <wp:extent cx="5760720" cy="3870484"/>
+          <wp:inline distT="0" distB="0" distL="0" distR="0" wp14:anchorId="44F57D18" wp14:editId="18CCD438">
+            <wp:extent cx="5760720" cy="1710214"/>
             <wp:effectExtent l="0" t="0" r="0" b="0"/>
-            <wp:docPr id="37" name="Picture 37"/>
+            <wp:docPr id="38" name="Picture 38"/>
             <wp:cNvGraphicFramePr>
               <a:graphicFrameLocks xmlns:a="http://schemas.openxmlformats.org/drawingml/2006/main" noChangeAspect="1"/>
             </wp:cNvGraphicFramePr>
@@ -16788,7 +16905,7 @@
                     <pic:cNvPicPr/>
                   </pic:nvPicPr>
                   <pic:blipFill>
-                    <a:blip r:embed="rId45"/>
+                    <a:blip r:embed="rId46"/>
                     <a:stretch>
                       <a:fillRect/>
                     </a:stretch>
@@ -16796,7 +16913,7 @@
                   <pic:spPr>
                     <a:xfrm>
                       <a:off x="0" y="0"/>
-                      <a:ext cx="5760720" cy="3870484"/>
+                      <a:ext cx="5760720" cy="1710214"/>
                     </a:xfrm>
                     <a:prstGeom prst="rect">
                       <a:avLst/>
@@ -16820,7 +16937,7 @@
           <w:color w:val="6B7280"/>
           <w:sz w:val="18"/>
         </w:rPr>
-        <w:t>Delivery and service options</w:t>
+        <w:t>Delivery and service options, with arrows to set their order</w:t>
       </w:r>
     </w:p>
     <w:tbl>
@@ -16985,7 +17102,6 @@
               <w:rPr>
                 <w:b/>
               </w:rPr>
-              <w:lastRenderedPageBreak/>
               <w:t>Taxable</w:t>
             </w:r>
           </w:p>
@@ -17222,6 +17338,7 @@
               <w:rPr>
                 <w:b/>
               </w:rPr>
+              <w:lastRenderedPageBreak/>
               <w:t>Sale on this option</w:t>
             </w:r>
           </w:p>
@@ -17294,10 +17411,10 @@
           <w:noProof/>
         </w:rPr>
         <w:drawing>
-          <wp:inline distT="0" distB="0" distL="0" distR="0" wp14:anchorId="6E66FDE2" wp14:editId="0026BEB1">
+          <wp:inline distT="0" distB="0" distL="0" distR="0" wp14:anchorId="04F6324D" wp14:editId="73F47229">
             <wp:extent cx="4206240" cy="4534852"/>
             <wp:effectExtent l="0" t="0" r="0" b="0"/>
-            <wp:docPr id="38" name="Picture 38"/>
+            <wp:docPr id="39" name="Picture 39"/>
             <wp:cNvGraphicFramePr>
               <a:graphicFrameLocks xmlns:a="http://schemas.openxmlformats.org/drawingml/2006/main" noChangeAspect="1"/>
             </wp:cNvGraphicFramePr>
@@ -17309,7 +17426,7 @@
                     <pic:cNvPicPr/>
                   </pic:nvPicPr>
                   <pic:blipFill>
-                    <a:blip r:embed="rId46"/>
+                    <a:blip r:embed="rId47"/>
                     <a:stretch>
                       <a:fillRect/>
                     </a:stretch>
@@ -17406,10 +17523,10 @@
         </w:rPr>
         <w:lastRenderedPageBreak/>
         <w:drawing>
-          <wp:inline distT="0" distB="0" distL="0" distR="0" wp14:anchorId="696E3BE1" wp14:editId="44FC0DB1">
+          <wp:inline distT="0" distB="0" distL="0" distR="0" wp14:anchorId="03CC85F6" wp14:editId="583BD39B">
             <wp:extent cx="5120640" cy="3829050"/>
             <wp:effectExtent l="0" t="0" r="0" b="0"/>
-            <wp:docPr id="39" name="Picture 39"/>
+            <wp:docPr id="40" name="Picture 40"/>
             <wp:cNvGraphicFramePr>
               <a:graphicFrameLocks xmlns:a="http://schemas.openxmlformats.org/drawingml/2006/main" noChangeAspect="1"/>
             </wp:cNvGraphicFramePr>
@@ -17421,7 +17538,7 @@
                     <pic:cNvPicPr/>
                   </pic:nvPicPr>
                   <pic:blipFill>
-                    <a:blip r:embed="rId47"/>
+                    <a:blip r:embed="rId48"/>
                     <a:stretch>
                       <a:fillRect/>
                     </a:stretch>
@@ -17461,7 +17578,7 @@
         <w:pStyle w:val="Heading1"/>
         <w:pageBreakBefore/>
       </w:pPr>
-      <w:bookmarkStart w:id="45" w:name="_Toc242436305"/>
+      <w:bookmarkStart w:id="45" w:name="_Toc242438388"/>
       <w:r>
         <w:lastRenderedPageBreak/>
         <w:t>Admin: managing the crew</w:t>
@@ -17493,10 +17610,10 @@
           <w:noProof/>
         </w:rPr>
         <w:drawing>
-          <wp:inline distT="0" distB="0" distL="0" distR="0" wp14:anchorId="14A61732" wp14:editId="42D48F1D">
+          <wp:inline distT="0" distB="0" distL="0" distR="0" wp14:anchorId="0A31C5B7" wp14:editId="327AC03E">
             <wp:extent cx="5760720" cy="1854232"/>
             <wp:effectExtent l="0" t="0" r="0" b="0"/>
-            <wp:docPr id="40" name="Picture 40"/>
+            <wp:docPr id="41" name="Picture 41"/>
             <wp:cNvGraphicFramePr>
               <a:graphicFrameLocks xmlns:a="http://schemas.openxmlformats.org/drawingml/2006/main" noChangeAspect="1"/>
             </wp:cNvGraphicFramePr>
@@ -17508,7 +17625,7 @@
                     <pic:cNvPicPr/>
                   </pic:nvPicPr>
                   <pic:blipFill>
-                    <a:blip r:embed="rId48"/>
+                    <a:blip r:embed="rId49"/>
                     <a:stretch>
                       <a:fillRect/>
                     </a:stretch>
@@ -17765,10 +17882,10 @@
           <w:noProof/>
         </w:rPr>
         <w:drawing>
-          <wp:inline distT="0" distB="0" distL="0" distR="0" wp14:anchorId="6F831CFB" wp14:editId="13FBB409">
+          <wp:inline distT="0" distB="0" distL="0" distR="0" wp14:anchorId="2A2DDE4C" wp14:editId="3CB5BFEF">
             <wp:extent cx="4023360" cy="2703195"/>
             <wp:effectExtent l="0" t="0" r="0" b="0"/>
-            <wp:docPr id="41" name="Picture 41"/>
+            <wp:docPr id="42" name="Picture 42"/>
             <wp:cNvGraphicFramePr>
               <a:graphicFrameLocks xmlns:a="http://schemas.openxmlformats.org/drawingml/2006/main" noChangeAspect="1"/>
             </wp:cNvGraphicFramePr>
@@ -17780,7 +17897,7 @@
                     <pic:cNvPicPr/>
                   </pic:nvPicPr>
                   <pic:blipFill>
-                    <a:blip r:embed="rId49"/>
+                    <a:blip r:embed="rId50"/>
                     <a:stretch>
                       <a:fillRect/>
                     </a:stretch>
@@ -17825,7 +17942,7 @@
         <w:pStyle w:val="Heading1"/>
         <w:pageBreakBefore/>
       </w:pPr>
-      <w:bookmarkStart w:id="46" w:name="_Toc242436306"/>
+      <w:bookmarkStart w:id="46" w:name="_Toc242438389"/>
       <w:r>
         <w:lastRenderedPageBreak/>
         <w:t>Admin: settings</w:t>
@@ -17895,7 +18012,7 @@
       <w:pPr>
         <w:pStyle w:val="Heading2"/>
       </w:pPr>
-      <w:bookmarkStart w:id="47" w:name="_Toc242436307"/>
+      <w:bookmarkStart w:id="47" w:name="_Toc242438390"/>
       <w:r>
         <w:t>Business details</w:t>
       </w:r>
@@ -17912,10 +18029,10 @@
           <w:noProof/>
         </w:rPr>
         <w:drawing>
-          <wp:inline distT="0" distB="0" distL="0" distR="0" wp14:anchorId="3A3671A5" wp14:editId="55B29F81">
+          <wp:inline distT="0" distB="0" distL="0" distR="0" wp14:anchorId="239101C0" wp14:editId="0CFCF8FF">
             <wp:extent cx="5760720" cy="1429893"/>
             <wp:effectExtent l="0" t="0" r="0" b="0"/>
-            <wp:docPr id="42" name="Picture 42"/>
+            <wp:docPr id="43" name="Picture 43"/>
             <wp:cNvGraphicFramePr>
               <a:graphicFrameLocks xmlns:a="http://schemas.openxmlformats.org/drawingml/2006/main" noChangeAspect="1"/>
             </wp:cNvGraphicFramePr>
@@ -17927,7 +18044,7 @@
                     <pic:cNvPicPr/>
                   </pic:nvPicPr>
                   <pic:blipFill>
-                    <a:blip r:embed="rId50"/>
+                    <a:blip r:embed="rId51"/>
                     <a:stretch>
                       <a:fillRect/>
                     </a:stretch>
@@ -18276,7 +18393,7 @@
       <w:pPr>
         <w:pStyle w:val="Heading2"/>
       </w:pPr>
-      <w:bookmarkStart w:id="48" w:name="_Toc242436308"/>
+      <w:bookmarkStart w:id="48" w:name="_Toc242438391"/>
       <w:r>
         <w:t>Sales sheet terms</w:t>
       </w:r>
@@ -18299,10 +18416,10 @@
         </w:rPr>
         <w:lastRenderedPageBreak/>
         <w:drawing>
-          <wp:inline distT="0" distB="0" distL="0" distR="0" wp14:anchorId="409E0C87" wp14:editId="0A5369C4">
+          <wp:inline distT="0" distB="0" distL="0" distR="0" wp14:anchorId="5FE904BC" wp14:editId="09677FAF">
             <wp:extent cx="5760720" cy="4937760"/>
             <wp:effectExtent l="0" t="0" r="0" b="0"/>
-            <wp:docPr id="43" name="Picture 43"/>
+            <wp:docPr id="44" name="Picture 44"/>
             <wp:cNvGraphicFramePr>
               <a:graphicFrameLocks xmlns:a="http://schemas.openxmlformats.org/drawingml/2006/main" noChangeAspect="1"/>
             </wp:cNvGraphicFramePr>
@@ -18314,7 +18431,7 @@
                     <pic:cNvPicPr/>
                   </pic:nvPicPr>
                   <pic:blipFill>
-                    <a:blip r:embed="rId51"/>
+                    <a:blip r:embed="rId52"/>
                     <a:stretch>
                       <a:fillRect/>
                     </a:stretch>
@@ -18672,7 +18789,7 @@
       <w:pPr>
         <w:pStyle w:val="Heading2"/>
       </w:pPr>
-      <w:bookmarkStart w:id="49" w:name="_Toc242436309"/>
+      <w:bookmarkStart w:id="49" w:name="_Toc242438392"/>
       <w:r>
         <w:t>Receipt email</w:t>
       </w:r>
@@ -18694,10 +18811,10 @@
           <w:noProof/>
         </w:rPr>
         <w:drawing>
-          <wp:inline distT="0" distB="0" distL="0" distR="0" wp14:anchorId="3D0D4C0F" wp14:editId="422BBCB5">
+          <wp:inline distT="0" distB="0" distL="0" distR="0" wp14:anchorId="629A18D1" wp14:editId="4CB6E543">
             <wp:extent cx="5760720" cy="4454271"/>
             <wp:effectExtent l="0" t="0" r="0" b="0"/>
-            <wp:docPr id="44" name="Picture 44"/>
+            <wp:docPr id="45" name="Picture 45"/>
             <wp:cNvGraphicFramePr>
               <a:graphicFrameLocks xmlns:a="http://schemas.openxmlformats.org/drawingml/2006/main" noChangeAspect="1"/>
             </wp:cNvGraphicFramePr>
@@ -18709,7 +18826,7 @@
                     <pic:cNvPicPr/>
                   </pic:nvPicPr>
                   <pic:blipFill>
-                    <a:blip r:embed="rId52"/>
+                    <a:blip r:embed="rId53"/>
                     <a:stretch>
                       <a:fillRect/>
                     </a:stretch>
@@ -19671,7 +19788,7 @@
       <w:pPr>
         <w:pStyle w:val="Heading2"/>
       </w:pPr>
-      <w:bookmarkStart w:id="50" w:name="_Toc242436310"/>
+      <w:bookmarkStart w:id="50" w:name="_Toc242438393"/>
       <w:r>
         <w:t>New events</w:t>
       </w:r>
@@ -19688,10 +19805,10 @@
           <w:noProof/>
         </w:rPr>
         <w:drawing>
-          <wp:inline distT="0" distB="0" distL="0" distR="0" wp14:anchorId="22F33CC1" wp14:editId="686E7926">
+          <wp:inline distT="0" distB="0" distL="0" distR="0" wp14:anchorId="1F86254A" wp14:editId="78515B93">
             <wp:extent cx="5760720" cy="1512189"/>
             <wp:effectExtent l="0" t="0" r="0" b="0"/>
-            <wp:docPr id="45" name="Picture 45"/>
+            <wp:docPr id="46" name="Picture 46"/>
             <wp:cNvGraphicFramePr>
               <a:graphicFrameLocks xmlns:a="http://schemas.openxmlformats.org/drawingml/2006/main" noChangeAspect="1"/>
             </wp:cNvGraphicFramePr>
@@ -19703,7 +19820,7 @@
                     <pic:cNvPicPr/>
                   </pic:nvPicPr>
                   <pic:blipFill>
-                    <a:blip r:embed="rId53"/>
+                    <a:blip r:embed="rId54"/>
                     <a:stretch>
                       <a:fillRect/>
                     </a:stretch>
@@ -19766,7 +19883,7 @@
       <w:pPr>
         <w:pStyle w:val="Heading2"/>
       </w:pPr>
-      <w:bookmarkStart w:id="51" w:name="_Toc242436311"/>
+      <w:bookmarkStart w:id="51" w:name="_Toc242438394"/>
       <w:r>
         <w:t>Dashboard</w:t>
       </w:r>
@@ -19783,10 +19900,10 @@
           <w:noProof/>
         </w:rPr>
         <w:drawing>
-          <wp:inline distT="0" distB="0" distL="0" distR="0" wp14:anchorId="712A9A1E" wp14:editId="0A675FA5">
+          <wp:inline distT="0" distB="0" distL="0" distR="0" wp14:anchorId="6433127B" wp14:editId="1658F119">
             <wp:extent cx="5760720" cy="1594485"/>
             <wp:effectExtent l="0" t="0" r="0" b="0"/>
-            <wp:docPr id="46" name="Picture 46"/>
+            <wp:docPr id="47" name="Picture 47"/>
             <wp:cNvGraphicFramePr>
               <a:graphicFrameLocks xmlns:a="http://schemas.openxmlformats.org/drawingml/2006/main" noChangeAspect="1"/>
             </wp:cNvGraphicFramePr>
@@ -19798,7 +19915,7 @@
                     <pic:cNvPicPr/>
                   </pic:nvPicPr>
                   <pic:blipFill>
-                    <a:blip r:embed="rId54"/>
+                    <a:blip r:embed="rId55"/>
                     <a:stretch>
                       <a:fillRect/>
                     </a:stretch>
@@ -20113,7 +20230,7 @@
         <w:pStyle w:val="Heading1"/>
         <w:pageBreakBefore/>
       </w:pPr>
-      <w:bookmarkStart w:id="52" w:name="_Toc242436312"/>
+      <w:bookmarkStart w:id="52" w:name="_Toc242438395"/>
       <w:r>
         <w:lastRenderedPageBreak/>
         <w:t>Tips and troubleshooting</w:t>
@@ -20535,7 +20652,7 @@
         <w:pStyle w:val="Heading1"/>
         <w:pageBreakBefore/>
       </w:pPr>
-      <w:bookmarkStart w:id="53" w:name="_Toc242436313"/>
+      <w:bookmarkStart w:id="53" w:name="_Toc242438396"/>
       <w:r>
         <w:lastRenderedPageBreak/>
         <w:t>Quick reference</w:t>
@@ -20546,7 +20663,7 @@
       <w:pPr>
         <w:pStyle w:val="Heading2"/>
       </w:pPr>
-      <w:bookmarkStart w:id="54" w:name="_Toc242436314"/>
+      <w:bookmarkStart w:id="54" w:name="_Toc242438397"/>
       <w:r>
         <w:t>Sales rep checklist</w:t>
       </w:r>
@@ -20690,7 +20807,7 @@
       <w:pPr>
         <w:pStyle w:val="Heading2"/>
       </w:pPr>
-      <w:bookmarkStart w:id="55" w:name="_Toc242436315"/>
+      <w:bookmarkStart w:id="55" w:name="_Toc242438398"/>
       <w:r>
         <w:t>Checkout checklist</w:t>
       </w:r>
@@ -20878,7 +20995,7 @@
       <w:pPr>
         <w:pStyle w:val="Heading2"/>
       </w:pPr>
-      <w:bookmarkStart w:id="56" w:name="_Toc242436316"/>
+      <w:bookmarkStart w:id="56" w:name="_Toc242438399"/>
       <w:r>
         <w:t>Inventory counts</w:t>
       </w:r>
@@ -21082,7 +21199,7 @@
       <w:pPr>
         <w:pStyle w:val="Heading2"/>
       </w:pPr>
-      <w:bookmarkStart w:id="57" w:name="_Toc242436317"/>
+      <w:bookmarkStart w:id="57" w:name="_Toc242438400"/>
       <w:r>
         <w:t>Order status at a glance</w:t>
       </w:r>
@@ -21406,7 +21523,7 @@
       </w:pPr>
     </w:p>
     <w:sectPr>
-      <w:footerReference w:type="default" r:id="rId55"/>
+      <w:footerReference w:type="default" r:id="rId56"/>
       <w:pgSz w:w="12240" w:h="15840"/>
       <w:pgMar w:top="1296" w:right="1440" w:bottom="1296" w:left="1440" w:header="720" w:footer="720" w:gutter="0"/>
       <w:cols w:space="720"/>
@@ -21702,31 +21819,31 @@
       </w:rPr>
     </w:lvl>
   </w:abstractNum>
-  <w:num w:numId="1" w16cid:durableId="1008172673">
+  <w:num w:numId="1" w16cid:durableId="2137330798">
     <w:abstractNumId w:val="8"/>
   </w:num>
-  <w:num w:numId="2" w16cid:durableId="672611972">
+  <w:num w:numId="2" w16cid:durableId="300813283">
     <w:abstractNumId w:val="6"/>
   </w:num>
-  <w:num w:numId="3" w16cid:durableId="161703953">
+  <w:num w:numId="3" w16cid:durableId="2030329441">
     <w:abstractNumId w:val="5"/>
   </w:num>
-  <w:num w:numId="4" w16cid:durableId="193930449">
+  <w:num w:numId="4" w16cid:durableId="409888177">
     <w:abstractNumId w:val="4"/>
   </w:num>
-  <w:num w:numId="5" w16cid:durableId="879318220">
+  <w:num w:numId="5" w16cid:durableId="441346801">
     <w:abstractNumId w:val="7"/>
   </w:num>
-  <w:num w:numId="6" w16cid:durableId="228854064">
+  <w:num w:numId="6" w16cid:durableId="2141147422">
     <w:abstractNumId w:val="3"/>
   </w:num>
-  <w:num w:numId="7" w16cid:durableId="2142073822">
+  <w:num w:numId="7" w16cid:durableId="2047024151">
     <w:abstractNumId w:val="2"/>
   </w:num>
-  <w:num w:numId="8" w16cid:durableId="418646490">
+  <w:num w:numId="8" w16cid:durableId="2037534991">
     <w:abstractNumId w:val="1"/>
   </w:num>
-  <w:num w:numId="9" w16cid:durableId="1480879904">
+  <w:num w:numId="9" w16cid:durableId="489952672">
     <w:abstractNumId w:val="0"/>
   </w:num>
 </w:numbering>
@@ -33118,7 +33235,7 @@
     <w:autoRedefine/>
     <w:uiPriority w:val="39"/>
     <w:unhideWhenUsed/>
-    <w:rsid w:val="00440C25"/>
+    <w:rsid w:val="00C66154"/>
     <w:pPr>
       <w:spacing w:after="100"/>
     </w:pPr>
@@ -33130,7 +33247,7 @@
     <w:autoRedefine/>
     <w:uiPriority w:val="39"/>
     <w:unhideWhenUsed/>
-    <w:rsid w:val="00440C25"/>
+    <w:rsid w:val="00C66154"/>
     <w:pPr>
       <w:spacing w:after="100"/>
       <w:ind w:left="220"/>
@@ -33141,7 +33258,7 @@
     <w:basedOn w:val="DefaultParagraphFont"/>
     <w:uiPriority w:val="99"/>
     <w:unhideWhenUsed/>
-    <w:rsid w:val="00440C25"/>
+    <w:rsid w:val="00C66154"/>
     <w:rPr>
       <w:color w:val="0000FF" w:themeColor="hyperlink"/>
       <w:u w:val="single"/>

</xml_diff>

<commit_message>
No Take With for a size left out of inventory
A size whose Count in inventory box is unticked isn't kept at the cart,
so it can no longer be a Take With - nor can a bundle that includes one.
The API refuses it when adding the item, ticking Take With or adding a
Take With service, and Add item, Add service and Edit show Take With as
"Not kept at the cart".

The user guide also gets back the sections an earlier rebuild dropped:
financing options in the Catalog, the Financing setting, the financing
type and number at checkout, and leaving a size out of inventory (now
with the new Take With rule).

Co-Authored-By: Claude Opus 5.5 <noreply@anthropic.com>
</commit_message>
<xml_diff>
--- a/Documents/CFS Sales App User Guide.docx
+++ b/Documents/CFS Sales App User Guide.docx
@@ -345,7 +345,7 @@
       <w:r>
         <w:fldChar w:fldCharType="separate"/>
       </w:r>
-      <w:hyperlink w:anchor="_Toc242438343" w:history="1">
+      <w:hyperlink w:anchor="_Toc242440223" w:history="1">
         <w:r>
           <w:rPr>
             <w:rStyle w:val="Hyperlink"/>
@@ -372,7 +372,7 @@
             <w:noProof/>
             <w:webHidden/>
           </w:rPr>
-          <w:instrText xml:space="preserve"> PAGEREF _Toc242438343 \h </w:instrText>
+          <w:instrText xml:space="preserve"> PAGEREF _Toc242440223 \h </w:instrText>
         </w:r>
         <w:r>
           <w:rPr>
@@ -413,7 +413,7 @@
           <w:noProof/>
         </w:rPr>
       </w:pPr>
-      <w:hyperlink w:anchor="_Toc242438344" w:history="1">
+      <w:hyperlink w:anchor="_Toc242440224" w:history="1">
         <w:r>
           <w:rPr>
             <w:rStyle w:val="Hyperlink"/>
@@ -440,7 +440,7 @@
             <w:noProof/>
             <w:webHidden/>
           </w:rPr>
-          <w:instrText xml:space="preserve"> PAGEREF _Toc242438344 \h </w:instrText>
+          <w:instrText xml:space="preserve"> PAGEREF _Toc242440224 \h </w:instrText>
         </w:r>
         <w:r>
           <w:rPr>
@@ -481,7 +481,7 @@
           <w:noProof/>
         </w:rPr>
       </w:pPr>
-      <w:hyperlink w:anchor="_Toc242438345" w:history="1">
+      <w:hyperlink w:anchor="_Toc242440225" w:history="1">
         <w:r>
           <w:rPr>
             <w:rStyle w:val="Hyperlink"/>
@@ -508,7 +508,7 @@
             <w:noProof/>
             <w:webHidden/>
           </w:rPr>
-          <w:instrText xml:space="preserve"> PAGEREF _Toc242438345 \h </w:instrText>
+          <w:instrText xml:space="preserve"> PAGEREF _Toc242440225 \h </w:instrText>
         </w:r>
         <w:r>
           <w:rPr>
@@ -549,7 +549,7 @@
           <w:noProof/>
         </w:rPr>
       </w:pPr>
-      <w:hyperlink w:anchor="_Toc242438346" w:history="1">
+      <w:hyperlink w:anchor="_Toc242440226" w:history="1">
         <w:r>
           <w:rPr>
             <w:rStyle w:val="Hyperlink"/>
@@ -576,7 +576,7 @@
             <w:noProof/>
             <w:webHidden/>
           </w:rPr>
-          <w:instrText xml:space="preserve"> PAGEREF _Toc242438346 \h </w:instrText>
+          <w:instrText xml:space="preserve"> PAGEREF _Toc242440226 \h </w:instrText>
         </w:r>
         <w:r>
           <w:rPr>
@@ -617,7 +617,7 @@
           <w:noProof/>
         </w:rPr>
       </w:pPr>
-      <w:hyperlink w:anchor="_Toc242438347" w:history="1">
+      <w:hyperlink w:anchor="_Toc242440227" w:history="1">
         <w:r>
           <w:rPr>
             <w:rStyle w:val="Hyperlink"/>
@@ -644,7 +644,7 @@
             <w:noProof/>
             <w:webHidden/>
           </w:rPr>
-          <w:instrText xml:space="preserve"> PAGEREF _Toc242438347 \h </w:instrText>
+          <w:instrText xml:space="preserve"> PAGEREF _Toc242440227 \h </w:instrText>
         </w:r>
         <w:r>
           <w:rPr>
@@ -685,7 +685,7 @@
           <w:noProof/>
         </w:rPr>
       </w:pPr>
-      <w:hyperlink w:anchor="_Toc242438348" w:history="1">
+      <w:hyperlink w:anchor="_Toc242440228" w:history="1">
         <w:r>
           <w:rPr>
             <w:rStyle w:val="Hyperlink"/>
@@ -712,7 +712,7 @@
             <w:noProof/>
             <w:webHidden/>
           </w:rPr>
-          <w:instrText xml:space="preserve"> PAGEREF _Toc242438348 \h </w:instrText>
+          <w:instrText xml:space="preserve"> PAGEREF _Toc242440228 \h </w:instrText>
         </w:r>
         <w:r>
           <w:rPr>
@@ -753,7 +753,7 @@
           <w:noProof/>
         </w:rPr>
       </w:pPr>
-      <w:hyperlink w:anchor="_Toc242438349" w:history="1">
+      <w:hyperlink w:anchor="_Toc242440229" w:history="1">
         <w:r>
           <w:rPr>
             <w:rStyle w:val="Hyperlink"/>
@@ -780,7 +780,7 @@
             <w:noProof/>
             <w:webHidden/>
           </w:rPr>
-          <w:instrText xml:space="preserve"> PAGEREF _Toc242438349 \h </w:instrText>
+          <w:instrText xml:space="preserve"> PAGEREF _Toc242440229 \h </w:instrText>
         </w:r>
         <w:r>
           <w:rPr>
@@ -821,7 +821,7 @@
           <w:noProof/>
         </w:rPr>
       </w:pPr>
-      <w:hyperlink w:anchor="_Toc242438350" w:history="1">
+      <w:hyperlink w:anchor="_Toc242440230" w:history="1">
         <w:r>
           <w:rPr>
             <w:rStyle w:val="Hyperlink"/>
@@ -848,7 +848,7 @@
             <w:noProof/>
             <w:webHidden/>
           </w:rPr>
-          <w:instrText xml:space="preserve"> PAGEREF _Toc242438350 \h </w:instrText>
+          <w:instrText xml:space="preserve"> PAGEREF _Toc242440230 \h </w:instrText>
         </w:r>
         <w:r>
           <w:rPr>
@@ -889,7 +889,7 @@
           <w:noProof/>
         </w:rPr>
       </w:pPr>
-      <w:hyperlink w:anchor="_Toc242438351" w:history="1">
+      <w:hyperlink w:anchor="_Toc242440231" w:history="1">
         <w:r>
           <w:rPr>
             <w:rStyle w:val="Hyperlink"/>
@@ -916,7 +916,7 @@
             <w:noProof/>
             <w:webHidden/>
           </w:rPr>
-          <w:instrText xml:space="preserve"> PAGEREF _Toc242438351 \h </w:instrText>
+          <w:instrText xml:space="preserve"> PAGEREF _Toc242440231 \h </w:instrText>
         </w:r>
         <w:r>
           <w:rPr>
@@ -957,7 +957,7 @@
           <w:noProof/>
         </w:rPr>
       </w:pPr>
-      <w:hyperlink w:anchor="_Toc242438352" w:history="1">
+      <w:hyperlink w:anchor="_Toc242440232" w:history="1">
         <w:r>
           <w:rPr>
             <w:rStyle w:val="Hyperlink"/>
@@ -984,7 +984,7 @@
             <w:noProof/>
             <w:webHidden/>
           </w:rPr>
-          <w:instrText xml:space="preserve"> PAGEREF _Toc242438352 \h </w:instrText>
+          <w:instrText xml:space="preserve"> PAGEREF _Toc242440232 \h </w:instrText>
         </w:r>
         <w:r>
           <w:rPr>
@@ -1025,7 +1025,7 @@
           <w:noProof/>
         </w:rPr>
       </w:pPr>
-      <w:hyperlink w:anchor="_Toc242438353" w:history="1">
+      <w:hyperlink w:anchor="_Toc242440233" w:history="1">
         <w:r>
           <w:rPr>
             <w:rStyle w:val="Hyperlink"/>
@@ -1052,7 +1052,7 @@
             <w:noProof/>
             <w:webHidden/>
           </w:rPr>
-          <w:instrText xml:space="preserve"> PAGEREF _Toc242438353 \h </w:instrText>
+          <w:instrText xml:space="preserve"> PAGEREF _Toc242440233 \h </w:instrText>
         </w:r>
         <w:r>
           <w:rPr>
@@ -1093,7 +1093,7 @@
           <w:noProof/>
         </w:rPr>
       </w:pPr>
-      <w:hyperlink w:anchor="_Toc242438354" w:history="1">
+      <w:hyperlink w:anchor="_Toc242440234" w:history="1">
         <w:r>
           <w:rPr>
             <w:rStyle w:val="Hyperlink"/>
@@ -1120,7 +1120,7 @@
             <w:noProof/>
             <w:webHidden/>
           </w:rPr>
-          <w:instrText xml:space="preserve"> PAGEREF _Toc242438354 \h </w:instrText>
+          <w:instrText xml:space="preserve"> PAGEREF _Toc242440234 \h </w:instrText>
         </w:r>
         <w:r>
           <w:rPr>
@@ -1161,7 +1161,7 @@
           <w:noProof/>
         </w:rPr>
       </w:pPr>
-      <w:hyperlink w:anchor="_Toc242438355" w:history="1">
+      <w:hyperlink w:anchor="_Toc242440235" w:history="1">
         <w:r>
           <w:rPr>
             <w:rStyle w:val="Hyperlink"/>
@@ -1188,7 +1188,7 @@
             <w:noProof/>
             <w:webHidden/>
           </w:rPr>
-          <w:instrText xml:space="preserve"> PAGEREF _Toc242438355 \h </w:instrText>
+          <w:instrText xml:space="preserve"> PAGEREF _Toc242440235 \h </w:instrText>
         </w:r>
         <w:r>
           <w:rPr>
@@ -1229,7 +1229,7 @@
           <w:noProof/>
         </w:rPr>
       </w:pPr>
-      <w:hyperlink w:anchor="_Toc242438356" w:history="1">
+      <w:hyperlink w:anchor="_Toc242440236" w:history="1">
         <w:r>
           <w:rPr>
             <w:rStyle w:val="Hyperlink"/>
@@ -1256,7 +1256,7 @@
             <w:noProof/>
             <w:webHidden/>
           </w:rPr>
-          <w:instrText xml:space="preserve"> PAGEREF _Toc242438356 \h </w:instrText>
+          <w:instrText xml:space="preserve"> PAGEREF _Toc242440236 \h </w:instrText>
         </w:r>
         <w:r>
           <w:rPr>
@@ -1297,7 +1297,7 @@
           <w:noProof/>
         </w:rPr>
       </w:pPr>
-      <w:hyperlink w:anchor="_Toc242438357" w:history="1">
+      <w:hyperlink w:anchor="_Toc242440237" w:history="1">
         <w:r>
           <w:rPr>
             <w:rStyle w:val="Hyperlink"/>
@@ -1324,7 +1324,7 @@
             <w:noProof/>
             <w:webHidden/>
           </w:rPr>
-          <w:instrText xml:space="preserve"> PAGEREF _Toc242438357 \h </w:instrText>
+          <w:instrText xml:space="preserve"> PAGEREF _Toc242440237 \h </w:instrText>
         </w:r>
         <w:r>
           <w:rPr>
@@ -1365,7 +1365,7 @@
           <w:noProof/>
         </w:rPr>
       </w:pPr>
-      <w:hyperlink w:anchor="_Toc242438358" w:history="1">
+      <w:hyperlink w:anchor="_Toc242440238" w:history="1">
         <w:r>
           <w:rPr>
             <w:rStyle w:val="Hyperlink"/>
@@ -1392,7 +1392,7 @@
             <w:noProof/>
             <w:webHidden/>
           </w:rPr>
-          <w:instrText xml:space="preserve"> PAGEREF _Toc242438358 \h </w:instrText>
+          <w:instrText xml:space="preserve"> PAGEREF _Toc242440238 \h </w:instrText>
         </w:r>
         <w:r>
           <w:rPr>
@@ -1433,7 +1433,7 @@
           <w:noProof/>
         </w:rPr>
       </w:pPr>
-      <w:hyperlink w:anchor="_Toc242438359" w:history="1">
+      <w:hyperlink w:anchor="_Toc242440239" w:history="1">
         <w:r>
           <w:rPr>
             <w:rStyle w:val="Hyperlink"/>
@@ -1460,7 +1460,7 @@
             <w:noProof/>
             <w:webHidden/>
           </w:rPr>
-          <w:instrText xml:space="preserve"> PAGEREF _Toc242438359 \h </w:instrText>
+          <w:instrText xml:space="preserve"> PAGEREF _Toc242440239 \h </w:instrText>
         </w:r>
         <w:r>
           <w:rPr>
@@ -1501,7 +1501,7 @@
           <w:noProof/>
         </w:rPr>
       </w:pPr>
-      <w:hyperlink w:anchor="_Toc242438360" w:history="1">
+      <w:hyperlink w:anchor="_Toc242440240" w:history="1">
         <w:r>
           <w:rPr>
             <w:rStyle w:val="Hyperlink"/>
@@ -1528,7 +1528,7 @@
             <w:noProof/>
             <w:webHidden/>
           </w:rPr>
-          <w:instrText xml:space="preserve"> PAGEREF _Toc242438360 \h </w:instrText>
+          <w:instrText xml:space="preserve"> PAGEREF _Toc242440240 \h </w:instrText>
         </w:r>
         <w:r>
           <w:rPr>
@@ -1569,7 +1569,7 @@
           <w:noProof/>
         </w:rPr>
       </w:pPr>
-      <w:hyperlink w:anchor="_Toc242438361" w:history="1">
+      <w:hyperlink w:anchor="_Toc242440241" w:history="1">
         <w:r>
           <w:rPr>
             <w:rStyle w:val="Hyperlink"/>
@@ -1596,7 +1596,7 @@
             <w:noProof/>
             <w:webHidden/>
           </w:rPr>
-          <w:instrText xml:space="preserve"> PAGEREF _Toc242438361 \h </w:instrText>
+          <w:instrText xml:space="preserve"> PAGEREF _Toc242440241 \h </w:instrText>
         </w:r>
         <w:r>
           <w:rPr>
@@ -1637,7 +1637,7 @@
           <w:noProof/>
         </w:rPr>
       </w:pPr>
-      <w:hyperlink w:anchor="_Toc242438362" w:history="1">
+      <w:hyperlink w:anchor="_Toc242440242" w:history="1">
         <w:r>
           <w:rPr>
             <w:rStyle w:val="Hyperlink"/>
@@ -1664,7 +1664,7 @@
             <w:noProof/>
             <w:webHidden/>
           </w:rPr>
-          <w:instrText xml:space="preserve"> PAGEREF _Toc242438362 \h </w:instrText>
+          <w:instrText xml:space="preserve"> PAGEREF _Toc242440242 \h </w:instrText>
         </w:r>
         <w:r>
           <w:rPr>
@@ -1705,7 +1705,7 @@
           <w:noProof/>
         </w:rPr>
       </w:pPr>
-      <w:hyperlink w:anchor="_Toc242438363" w:history="1">
+      <w:hyperlink w:anchor="_Toc242440243" w:history="1">
         <w:r>
           <w:rPr>
             <w:rStyle w:val="Hyperlink"/>
@@ -1732,7 +1732,7 @@
             <w:noProof/>
             <w:webHidden/>
           </w:rPr>
-          <w:instrText xml:space="preserve"> PAGEREF _Toc242438363 \h </w:instrText>
+          <w:instrText xml:space="preserve"> PAGEREF _Toc242440243 \h </w:instrText>
         </w:r>
         <w:r>
           <w:rPr>
@@ -1773,7 +1773,7 @@
           <w:noProof/>
         </w:rPr>
       </w:pPr>
-      <w:hyperlink w:anchor="_Toc242438364" w:history="1">
+      <w:hyperlink w:anchor="_Toc242440244" w:history="1">
         <w:r>
           <w:rPr>
             <w:rStyle w:val="Hyperlink"/>
@@ -1800,7 +1800,7 @@
             <w:noProof/>
             <w:webHidden/>
           </w:rPr>
-          <w:instrText xml:space="preserve"> PAGEREF _Toc242438364 \h </w:instrText>
+          <w:instrText xml:space="preserve"> PAGEREF _Toc242440244 \h </w:instrText>
         </w:r>
         <w:r>
           <w:rPr>
@@ -1841,7 +1841,7 @@
           <w:noProof/>
         </w:rPr>
       </w:pPr>
-      <w:hyperlink w:anchor="_Toc242438365" w:history="1">
+      <w:hyperlink w:anchor="_Toc242440245" w:history="1">
         <w:r>
           <w:rPr>
             <w:rStyle w:val="Hyperlink"/>
@@ -1868,7 +1868,7 @@
             <w:noProof/>
             <w:webHidden/>
           </w:rPr>
-          <w:instrText xml:space="preserve"> PAGEREF _Toc242438365 \h </w:instrText>
+          <w:instrText xml:space="preserve"> PAGEREF _Toc242440245 \h </w:instrText>
         </w:r>
         <w:r>
           <w:rPr>
@@ -1909,7 +1909,7 @@
           <w:noProof/>
         </w:rPr>
       </w:pPr>
-      <w:hyperlink w:anchor="_Toc242438366" w:history="1">
+      <w:hyperlink w:anchor="_Toc242440246" w:history="1">
         <w:r>
           <w:rPr>
             <w:rStyle w:val="Hyperlink"/>
@@ -1936,7 +1936,7 @@
             <w:noProof/>
             <w:webHidden/>
           </w:rPr>
-          <w:instrText xml:space="preserve"> PAGEREF _Toc242438366 \h </w:instrText>
+          <w:instrText xml:space="preserve"> PAGEREF _Toc242440246 \h </w:instrText>
         </w:r>
         <w:r>
           <w:rPr>
@@ -1977,7 +1977,7 @@
           <w:noProof/>
         </w:rPr>
       </w:pPr>
-      <w:hyperlink w:anchor="_Toc242438367" w:history="1">
+      <w:hyperlink w:anchor="_Toc242440247" w:history="1">
         <w:r>
           <w:rPr>
             <w:rStyle w:val="Hyperlink"/>
@@ -2004,7 +2004,7 @@
             <w:noProof/>
             <w:webHidden/>
           </w:rPr>
-          <w:instrText xml:space="preserve"> PAGEREF _Toc242438367 \h </w:instrText>
+          <w:instrText xml:space="preserve"> PAGEREF _Toc242440247 \h </w:instrText>
         </w:r>
         <w:r>
           <w:rPr>
@@ -2045,7 +2045,7 @@
           <w:noProof/>
         </w:rPr>
       </w:pPr>
-      <w:hyperlink w:anchor="_Toc242438368" w:history="1">
+      <w:hyperlink w:anchor="_Toc242440248" w:history="1">
         <w:r>
           <w:rPr>
             <w:rStyle w:val="Hyperlink"/>
@@ -2072,7 +2072,7 @@
             <w:noProof/>
             <w:webHidden/>
           </w:rPr>
-          <w:instrText xml:space="preserve"> PAGEREF _Toc242438368 \h </w:instrText>
+          <w:instrText xml:space="preserve"> PAGEREF _Toc242440248 \h </w:instrText>
         </w:r>
         <w:r>
           <w:rPr>
@@ -2113,7 +2113,7 @@
           <w:noProof/>
         </w:rPr>
       </w:pPr>
-      <w:hyperlink w:anchor="_Toc242438369" w:history="1">
+      <w:hyperlink w:anchor="_Toc242440249" w:history="1">
         <w:r>
           <w:rPr>
             <w:rStyle w:val="Hyperlink"/>
@@ -2140,7 +2140,7 @@
             <w:noProof/>
             <w:webHidden/>
           </w:rPr>
-          <w:instrText xml:space="preserve"> PAGEREF _Toc242438369 \h </w:instrText>
+          <w:instrText xml:space="preserve"> PAGEREF _Toc242440249 \h </w:instrText>
         </w:r>
         <w:r>
           <w:rPr>
@@ -2181,7 +2181,7 @@
           <w:noProof/>
         </w:rPr>
       </w:pPr>
-      <w:hyperlink w:anchor="_Toc242438370" w:history="1">
+      <w:hyperlink w:anchor="_Toc242440250" w:history="1">
         <w:r>
           <w:rPr>
             <w:rStyle w:val="Hyperlink"/>
@@ -2208,7 +2208,7 @@
             <w:noProof/>
             <w:webHidden/>
           </w:rPr>
-          <w:instrText xml:space="preserve"> PAGEREF _Toc242438370 \h </w:instrText>
+          <w:instrText xml:space="preserve"> PAGEREF _Toc242440250 \h </w:instrText>
         </w:r>
         <w:r>
           <w:rPr>
@@ -2249,7 +2249,7 @@
           <w:noProof/>
         </w:rPr>
       </w:pPr>
-      <w:hyperlink w:anchor="_Toc242438371" w:history="1">
+      <w:hyperlink w:anchor="_Toc242440251" w:history="1">
         <w:r>
           <w:rPr>
             <w:rStyle w:val="Hyperlink"/>
@@ -2276,7 +2276,7 @@
             <w:noProof/>
             <w:webHidden/>
           </w:rPr>
-          <w:instrText xml:space="preserve"> PAGEREF _Toc242438371 \h </w:instrText>
+          <w:instrText xml:space="preserve"> PAGEREF _Toc242440251 \h </w:instrText>
         </w:r>
         <w:r>
           <w:rPr>
@@ -2317,7 +2317,7 @@
           <w:noProof/>
         </w:rPr>
       </w:pPr>
-      <w:hyperlink w:anchor="_Toc242438372" w:history="1">
+      <w:hyperlink w:anchor="_Toc242440252" w:history="1">
         <w:r>
           <w:rPr>
             <w:rStyle w:val="Hyperlink"/>
@@ -2344,7 +2344,7 @@
             <w:noProof/>
             <w:webHidden/>
           </w:rPr>
-          <w:instrText xml:space="preserve"> PAGEREF _Toc242438372 \h </w:instrText>
+          <w:instrText xml:space="preserve"> PAGEREF _Toc242440252 \h </w:instrText>
         </w:r>
         <w:r>
           <w:rPr>
@@ -2385,7 +2385,7 @@
           <w:noProof/>
         </w:rPr>
       </w:pPr>
-      <w:hyperlink w:anchor="_Toc242438373" w:history="1">
+      <w:hyperlink w:anchor="_Toc242440253" w:history="1">
         <w:r>
           <w:rPr>
             <w:rStyle w:val="Hyperlink"/>
@@ -2412,7 +2412,7 @@
             <w:noProof/>
             <w:webHidden/>
           </w:rPr>
-          <w:instrText xml:space="preserve"> PAGEREF _Toc242438373 \h </w:instrText>
+          <w:instrText xml:space="preserve"> PAGEREF _Toc242440253 \h </w:instrText>
         </w:r>
         <w:r>
           <w:rPr>
@@ -2453,7 +2453,7 @@
           <w:noProof/>
         </w:rPr>
       </w:pPr>
-      <w:hyperlink w:anchor="_Toc242438374" w:history="1">
+      <w:hyperlink w:anchor="_Toc242440254" w:history="1">
         <w:r>
           <w:rPr>
             <w:rStyle w:val="Hyperlink"/>
@@ -2480,7 +2480,7 @@
             <w:noProof/>
             <w:webHidden/>
           </w:rPr>
-          <w:instrText xml:space="preserve"> PAGEREF _Toc242438374 \h </w:instrText>
+          <w:instrText xml:space="preserve"> PAGEREF _Toc242440254 \h </w:instrText>
         </w:r>
         <w:r>
           <w:rPr>
@@ -2521,7 +2521,7 @@
           <w:noProof/>
         </w:rPr>
       </w:pPr>
-      <w:hyperlink w:anchor="_Toc242438375" w:history="1">
+      <w:hyperlink w:anchor="_Toc242440255" w:history="1">
         <w:r>
           <w:rPr>
             <w:rStyle w:val="Hyperlink"/>
@@ -2548,7 +2548,7 @@
             <w:noProof/>
             <w:webHidden/>
           </w:rPr>
-          <w:instrText xml:space="preserve"> PAGEREF _Toc242438375 \h </w:instrText>
+          <w:instrText xml:space="preserve"> PAGEREF _Toc242440255 \h </w:instrText>
         </w:r>
         <w:r>
           <w:rPr>
@@ -2589,7 +2589,7 @@
           <w:noProof/>
         </w:rPr>
       </w:pPr>
-      <w:hyperlink w:anchor="_Toc242438376" w:history="1">
+      <w:hyperlink w:anchor="_Toc242440256" w:history="1">
         <w:r>
           <w:rPr>
             <w:rStyle w:val="Hyperlink"/>
@@ -2616,7 +2616,7 @@
             <w:noProof/>
             <w:webHidden/>
           </w:rPr>
-          <w:instrText xml:space="preserve"> PAGEREF _Toc242438376 \h </w:instrText>
+          <w:instrText xml:space="preserve"> PAGEREF _Toc242440256 \h </w:instrText>
         </w:r>
         <w:r>
           <w:rPr>
@@ -2657,7 +2657,7 @@
           <w:noProof/>
         </w:rPr>
       </w:pPr>
-      <w:hyperlink w:anchor="_Toc242438377" w:history="1">
+      <w:hyperlink w:anchor="_Toc242440257" w:history="1">
         <w:r>
           <w:rPr>
             <w:rStyle w:val="Hyperlink"/>
@@ -2684,7 +2684,7 @@
             <w:noProof/>
             <w:webHidden/>
           </w:rPr>
-          <w:instrText xml:space="preserve"> PAGEREF _Toc242438377 \h </w:instrText>
+          <w:instrText xml:space="preserve"> PAGEREF _Toc242440257 \h </w:instrText>
         </w:r>
         <w:r>
           <w:rPr>
@@ -2725,7 +2725,7 @@
           <w:noProof/>
         </w:rPr>
       </w:pPr>
-      <w:hyperlink w:anchor="_Toc242438378" w:history="1">
+      <w:hyperlink w:anchor="_Toc242440258" w:history="1">
         <w:r>
           <w:rPr>
             <w:rStyle w:val="Hyperlink"/>
@@ -2752,7 +2752,7 @@
             <w:noProof/>
             <w:webHidden/>
           </w:rPr>
-          <w:instrText xml:space="preserve"> PAGEREF _Toc242438378 \h </w:instrText>
+          <w:instrText xml:space="preserve"> PAGEREF _Toc242440258 \h </w:instrText>
         </w:r>
         <w:r>
           <w:rPr>
@@ -2793,7 +2793,7 @@
           <w:noProof/>
         </w:rPr>
       </w:pPr>
-      <w:hyperlink w:anchor="_Toc242438379" w:history="1">
+      <w:hyperlink w:anchor="_Toc242440259" w:history="1">
         <w:r>
           <w:rPr>
             <w:rStyle w:val="Hyperlink"/>
@@ -2820,7 +2820,7 @@
             <w:noProof/>
             <w:webHidden/>
           </w:rPr>
-          <w:instrText xml:space="preserve"> PAGEREF _Toc242438379 \h </w:instrText>
+          <w:instrText xml:space="preserve"> PAGEREF _Toc242440259 \h </w:instrText>
         </w:r>
         <w:r>
           <w:rPr>
@@ -2861,7 +2861,7 @@
           <w:noProof/>
         </w:rPr>
       </w:pPr>
-      <w:hyperlink w:anchor="_Toc242438380" w:history="1">
+      <w:hyperlink w:anchor="_Toc242440260" w:history="1">
         <w:r>
           <w:rPr>
             <w:rStyle w:val="Hyperlink"/>
@@ -2888,7 +2888,7 @@
             <w:noProof/>
             <w:webHidden/>
           </w:rPr>
-          <w:instrText xml:space="preserve"> PAGEREF _Toc242438380 \h </w:instrText>
+          <w:instrText xml:space="preserve"> PAGEREF _Toc242440260 \h </w:instrText>
         </w:r>
         <w:r>
           <w:rPr>
@@ -2929,7 +2929,7 @@
           <w:noProof/>
         </w:rPr>
       </w:pPr>
-      <w:hyperlink w:anchor="_Toc242438381" w:history="1">
+      <w:hyperlink w:anchor="_Toc242440261" w:history="1">
         <w:r>
           <w:rPr>
             <w:rStyle w:val="Hyperlink"/>
@@ -2956,7 +2956,7 @@
             <w:noProof/>
             <w:webHidden/>
           </w:rPr>
-          <w:instrText xml:space="preserve"> PAGEREF _Toc242438381 \h </w:instrText>
+          <w:instrText xml:space="preserve"> PAGEREF _Toc242440261 \h </w:instrText>
         </w:r>
         <w:r>
           <w:rPr>
@@ -2997,7 +2997,7 @@
           <w:noProof/>
         </w:rPr>
       </w:pPr>
-      <w:hyperlink w:anchor="_Toc242438382" w:history="1">
+      <w:hyperlink w:anchor="_Toc242440262" w:history="1">
         <w:r>
           <w:rPr>
             <w:rStyle w:val="Hyperlink"/>
@@ -3024,7 +3024,7 @@
             <w:noProof/>
             <w:webHidden/>
           </w:rPr>
-          <w:instrText xml:space="preserve"> PAGEREF _Toc242438382 \h </w:instrText>
+          <w:instrText xml:space="preserve"> PAGEREF _Toc242440262 \h </w:instrText>
         </w:r>
         <w:r>
           <w:rPr>
@@ -3065,7 +3065,7 @@
           <w:noProof/>
         </w:rPr>
       </w:pPr>
-      <w:hyperlink w:anchor="_Toc242438383" w:history="1">
+      <w:hyperlink w:anchor="_Toc242440263" w:history="1">
         <w:r>
           <w:rPr>
             <w:rStyle w:val="Hyperlink"/>
@@ -3092,7 +3092,7 @@
             <w:noProof/>
             <w:webHidden/>
           </w:rPr>
-          <w:instrText xml:space="preserve"> PAGEREF _Toc242438383 \h </w:instrText>
+          <w:instrText xml:space="preserve"> PAGEREF _Toc242440263 \h </w:instrText>
         </w:r>
         <w:r>
           <w:rPr>
@@ -3133,7 +3133,7 @@
           <w:noProof/>
         </w:rPr>
       </w:pPr>
-      <w:hyperlink w:anchor="_Toc242438384" w:history="1">
+      <w:hyperlink w:anchor="_Toc242440264" w:history="1">
         <w:r>
           <w:rPr>
             <w:rStyle w:val="Hyperlink"/>
@@ -3160,7 +3160,7 @@
             <w:noProof/>
             <w:webHidden/>
           </w:rPr>
-          <w:instrText xml:space="preserve"> PAGEREF _Toc242438384 \h </w:instrText>
+          <w:instrText xml:space="preserve"> PAGEREF _Toc242440264 \h </w:instrText>
         </w:r>
         <w:r>
           <w:rPr>
@@ -3201,7 +3201,7 @@
           <w:noProof/>
         </w:rPr>
       </w:pPr>
-      <w:hyperlink w:anchor="_Toc242438385" w:history="1">
+      <w:hyperlink w:anchor="_Toc242440265" w:history="1">
         <w:r>
           <w:rPr>
             <w:rStyle w:val="Hyperlink"/>
@@ -3228,7 +3228,7 @@
             <w:noProof/>
             <w:webHidden/>
           </w:rPr>
-          <w:instrText xml:space="preserve"> PAGEREF _Toc242438385 \h </w:instrText>
+          <w:instrText xml:space="preserve"> PAGEREF _Toc242440265 \h </w:instrText>
         </w:r>
         <w:r>
           <w:rPr>
@@ -3269,7 +3269,7 @@
           <w:noProof/>
         </w:rPr>
       </w:pPr>
-      <w:hyperlink w:anchor="_Toc242438386" w:history="1">
+      <w:hyperlink w:anchor="_Toc242440266" w:history="1">
         <w:r>
           <w:rPr>
             <w:rStyle w:val="Hyperlink"/>
@@ -3296,7 +3296,7 @@
             <w:noProof/>
             <w:webHidden/>
           </w:rPr>
-          <w:instrText xml:space="preserve"> PAGEREF _Toc242438386 \h </w:instrText>
+          <w:instrText xml:space="preserve"> PAGEREF _Toc242440266 \h </w:instrText>
         </w:r>
         <w:r>
           <w:rPr>
@@ -3337,7 +3337,7 @@
           <w:noProof/>
         </w:rPr>
       </w:pPr>
-      <w:hyperlink w:anchor="_Toc242438387" w:history="1">
+      <w:hyperlink w:anchor="_Toc242440267" w:history="1">
         <w:r>
           <w:rPr>
             <w:rStyle w:val="Hyperlink"/>
@@ -3364,7 +3364,7 @@
             <w:noProof/>
             <w:webHidden/>
           </w:rPr>
-          <w:instrText xml:space="preserve"> PAGEREF _Toc242438387 \h </w:instrText>
+          <w:instrText xml:space="preserve"> PAGEREF _Toc242440267 \h </w:instrText>
         </w:r>
         <w:r>
           <w:rPr>
@@ -3384,7 +3384,75 @@
             <w:noProof/>
             <w:webHidden/>
           </w:rPr>
-          <w:t>44</w:t>
+          <w:t>45</w:t>
+        </w:r>
+        <w:r>
+          <w:rPr>
+            <w:noProof/>
+            <w:webHidden/>
+          </w:rPr>
+          <w:fldChar w:fldCharType="end"/>
+        </w:r>
+      </w:hyperlink>
+    </w:p>
+    <w:p>
+      <w:pPr>
+        <w:pStyle w:val="TOC2"/>
+        <w:tabs>
+          <w:tab w:val="right" w:leader="dot" w:pos="9350"/>
+        </w:tabs>
+        <w:rPr>
+          <w:noProof/>
+        </w:rPr>
+      </w:pPr>
+      <w:hyperlink w:anchor="_Toc242440268" w:history="1">
+        <w:r>
+          <w:rPr>
+            <w:rStyle w:val="Hyperlink"/>
+            <w:noProof/>
+          </w:rPr>
+          <w:t>Financing options</w:t>
+        </w:r>
+        <w:r>
+          <w:rPr>
+            <w:noProof/>
+            <w:webHidden/>
+          </w:rPr>
+          <w:tab/>
+        </w:r>
+        <w:r>
+          <w:rPr>
+            <w:noProof/>
+            <w:webHidden/>
+          </w:rPr>
+          <w:fldChar w:fldCharType="begin"/>
+        </w:r>
+        <w:r>
+          <w:rPr>
+            <w:noProof/>
+            <w:webHidden/>
+          </w:rPr>
+          <w:instrText xml:space="preserve"> PAGEREF _Toc242440268 \h </w:instrText>
+        </w:r>
+        <w:r>
+          <w:rPr>
+            <w:noProof/>
+            <w:webHidden/>
+          </w:rPr>
+        </w:r>
+        <w:r>
+          <w:rPr>
+            <w:noProof/>
+            <w:webHidden/>
+          </w:rPr>
+          <w:fldChar w:fldCharType="separate"/>
+        </w:r>
+        <w:r>
+          <w:rPr>
+            <w:noProof/>
+            <w:webHidden/>
+          </w:rPr>
+          <w:t>47</w:t>
         </w:r>
         <w:r>
           <w:rPr>
@@ -3405,7 +3473,7 @@
           <w:noProof/>
         </w:rPr>
       </w:pPr>
-      <w:hyperlink w:anchor="_Toc242438388" w:history="1">
+      <w:hyperlink w:anchor="_Toc242440269" w:history="1">
         <w:r>
           <w:rPr>
             <w:rStyle w:val="Hyperlink"/>
@@ -3432,7 +3500,7 @@
             <w:noProof/>
             <w:webHidden/>
           </w:rPr>
-          <w:instrText xml:space="preserve"> PAGEREF _Toc242438388 \h </w:instrText>
+          <w:instrText xml:space="preserve"> PAGEREF _Toc242440269 \h </w:instrText>
         </w:r>
         <w:r>
           <w:rPr>
@@ -3452,7 +3520,7 @@
             <w:noProof/>
             <w:webHidden/>
           </w:rPr>
-          <w:t>47</w:t>
+          <w:t>48</w:t>
         </w:r>
         <w:r>
           <w:rPr>
@@ -3473,7 +3541,7 @@
           <w:noProof/>
         </w:rPr>
       </w:pPr>
-      <w:hyperlink w:anchor="_Toc242438389" w:history="1">
+      <w:hyperlink w:anchor="_Toc242440270" w:history="1">
         <w:r>
           <w:rPr>
             <w:rStyle w:val="Hyperlink"/>
@@ -3500,7 +3568,7 @@
             <w:noProof/>
             <w:webHidden/>
           </w:rPr>
-          <w:instrText xml:space="preserve"> PAGEREF _Toc242438389 \h </w:instrText>
+          <w:instrText xml:space="preserve"> PAGEREF _Toc242440270 \h </w:instrText>
         </w:r>
         <w:r>
           <w:rPr>
@@ -3520,7 +3588,7 @@
             <w:noProof/>
             <w:webHidden/>
           </w:rPr>
-          <w:t>48</w:t>
+          <w:t>49</w:t>
         </w:r>
         <w:r>
           <w:rPr>
@@ -3541,7 +3609,7 @@
           <w:noProof/>
         </w:rPr>
       </w:pPr>
-      <w:hyperlink w:anchor="_Toc242438390" w:history="1">
+      <w:hyperlink w:anchor="_Toc242440271" w:history="1">
         <w:r>
           <w:rPr>
             <w:rStyle w:val="Hyperlink"/>
@@ -3568,7 +3636,7 @@
             <w:noProof/>
             <w:webHidden/>
           </w:rPr>
-          <w:instrText xml:space="preserve"> PAGEREF _Toc242438390 \h </w:instrText>
+          <w:instrText xml:space="preserve"> PAGEREF _Toc242440271 \h </w:instrText>
         </w:r>
         <w:r>
           <w:rPr>
@@ -3588,7 +3656,7 @@
             <w:noProof/>
             <w:webHidden/>
           </w:rPr>
-          <w:t>48</w:t>
+          <w:t>49</w:t>
         </w:r>
         <w:r>
           <w:rPr>
@@ -3609,7 +3677,7 @@
           <w:noProof/>
         </w:rPr>
       </w:pPr>
-      <w:hyperlink w:anchor="_Toc242438391" w:history="1">
+      <w:hyperlink w:anchor="_Toc242440272" w:history="1">
         <w:r>
           <w:rPr>
             <w:rStyle w:val="Hyperlink"/>
@@ -3636,7 +3704,7 @@
             <w:noProof/>
             <w:webHidden/>
           </w:rPr>
-          <w:instrText xml:space="preserve"> PAGEREF _Toc242438391 \h </w:instrText>
+          <w:instrText xml:space="preserve"> PAGEREF _Toc242440272 \h </w:instrText>
         </w:r>
         <w:r>
           <w:rPr>
@@ -3656,7 +3724,7 @@
             <w:noProof/>
             <w:webHidden/>
           </w:rPr>
-          <w:t>48</w:t>
+          <w:t>49</w:t>
         </w:r>
         <w:r>
           <w:rPr>
@@ -3677,7 +3745,7 @@
           <w:noProof/>
         </w:rPr>
       </w:pPr>
-      <w:hyperlink w:anchor="_Toc242438392" w:history="1">
+      <w:hyperlink w:anchor="_Toc242440273" w:history="1">
         <w:r>
           <w:rPr>
             <w:rStyle w:val="Hyperlink"/>
@@ -3704,7 +3772,7 @@
             <w:noProof/>
             <w:webHidden/>
           </w:rPr>
-          <w:instrText xml:space="preserve"> PAGEREF _Toc242438392 \h </w:instrText>
+          <w:instrText xml:space="preserve"> PAGEREF _Toc242440273 \h </w:instrText>
         </w:r>
         <w:r>
           <w:rPr>
@@ -3724,7 +3792,7 @@
             <w:noProof/>
             <w:webHidden/>
           </w:rPr>
-          <w:t>50</w:t>
+          <w:t>51</w:t>
         </w:r>
         <w:r>
           <w:rPr>
@@ -3745,13 +3813,13 @@
           <w:noProof/>
         </w:rPr>
       </w:pPr>
-      <w:hyperlink w:anchor="_Toc242438393" w:history="1">
+      <w:hyperlink w:anchor="_Toc242440274" w:history="1">
         <w:r>
           <w:rPr>
             <w:rStyle w:val="Hyperlink"/>
             <w:noProof/>
           </w:rPr>
-          <w:t>New events</w:t>
+          <w:t>Financing</w:t>
         </w:r>
         <w:r>
           <w:rPr>
@@ -3772,7 +3840,7 @@
             <w:noProof/>
             <w:webHidden/>
           </w:rPr>
-          <w:instrText xml:space="preserve"> PAGEREF _Toc242438393 \h </w:instrText>
+          <w:instrText xml:space="preserve"> PAGEREF _Toc242440274 \h </w:instrText>
         </w:r>
         <w:r>
           <w:rPr>
@@ -3792,7 +3860,7 @@
             <w:noProof/>
             <w:webHidden/>
           </w:rPr>
-          <w:t>51</w:t>
+          <w:t>52</w:t>
         </w:r>
         <w:r>
           <w:rPr>
@@ -3813,12 +3881,80 @@
           <w:noProof/>
         </w:rPr>
       </w:pPr>
-      <w:hyperlink w:anchor="_Toc242438394" w:history="1">
+      <w:hyperlink w:anchor="_Toc242440275" w:history="1">
         <w:r>
           <w:rPr>
             <w:rStyle w:val="Hyperlink"/>
             <w:noProof/>
           </w:rPr>
+          <w:t>New events</w:t>
+        </w:r>
+        <w:r>
+          <w:rPr>
+            <w:noProof/>
+            <w:webHidden/>
+          </w:rPr>
+          <w:tab/>
+        </w:r>
+        <w:r>
+          <w:rPr>
+            <w:noProof/>
+            <w:webHidden/>
+          </w:rPr>
+          <w:fldChar w:fldCharType="begin"/>
+        </w:r>
+        <w:r>
+          <w:rPr>
+            <w:noProof/>
+            <w:webHidden/>
+          </w:rPr>
+          <w:instrText xml:space="preserve"> PAGEREF _Toc242440275 \h </w:instrText>
+        </w:r>
+        <w:r>
+          <w:rPr>
+            <w:noProof/>
+            <w:webHidden/>
+          </w:rPr>
+        </w:r>
+        <w:r>
+          <w:rPr>
+            <w:noProof/>
+            <w:webHidden/>
+          </w:rPr>
+          <w:fldChar w:fldCharType="separate"/>
+        </w:r>
+        <w:r>
+          <w:rPr>
+            <w:noProof/>
+            <w:webHidden/>
+          </w:rPr>
+          <w:t>53</w:t>
+        </w:r>
+        <w:r>
+          <w:rPr>
+            <w:noProof/>
+            <w:webHidden/>
+          </w:rPr>
+          <w:fldChar w:fldCharType="end"/>
+        </w:r>
+      </w:hyperlink>
+    </w:p>
+    <w:p>
+      <w:pPr>
+        <w:pStyle w:val="TOC2"/>
+        <w:tabs>
+          <w:tab w:val="right" w:leader="dot" w:pos="9350"/>
+        </w:tabs>
+        <w:rPr>
+          <w:noProof/>
+        </w:rPr>
+      </w:pPr>
+      <w:hyperlink w:anchor="_Toc242440276" w:history="1">
+        <w:r>
+          <w:rPr>
+            <w:rStyle w:val="Hyperlink"/>
+            <w:noProof/>
+          </w:rPr>
           <w:t>Dashboard</w:t>
         </w:r>
         <w:r>
@@ -3840,7 +3976,7 @@
             <w:noProof/>
             <w:webHidden/>
           </w:rPr>
-          <w:instrText xml:space="preserve"> PAGEREF _Toc242438394 \h </w:instrText>
+          <w:instrText xml:space="preserve"> PAGEREF _Toc242440276 \h </w:instrText>
         </w:r>
         <w:r>
           <w:rPr>
@@ -3860,7 +3996,7 @@
             <w:noProof/>
             <w:webHidden/>
           </w:rPr>
-          <w:t>52</w:t>
+          <w:t>53</w:t>
         </w:r>
         <w:r>
           <w:rPr>
@@ -3881,7 +4017,7 @@
           <w:noProof/>
         </w:rPr>
       </w:pPr>
-      <w:hyperlink w:anchor="_Toc242438395" w:history="1">
+      <w:hyperlink w:anchor="_Toc242440277" w:history="1">
         <w:r>
           <w:rPr>
             <w:rStyle w:val="Hyperlink"/>
@@ -3908,7 +4044,7 @@
             <w:noProof/>
             <w:webHidden/>
           </w:rPr>
-          <w:instrText xml:space="preserve"> PAGEREF _Toc242438395 \h </w:instrText>
+          <w:instrText xml:space="preserve"> PAGEREF _Toc242440277 \h </w:instrText>
         </w:r>
         <w:r>
           <w:rPr>
@@ -3928,7 +4064,7 @@
             <w:noProof/>
             <w:webHidden/>
           </w:rPr>
-          <w:t>53</w:t>
+          <w:t>54</w:t>
         </w:r>
         <w:r>
           <w:rPr>
@@ -3949,7 +4085,7 @@
           <w:noProof/>
         </w:rPr>
       </w:pPr>
-      <w:hyperlink w:anchor="_Toc242438396" w:history="1">
+      <w:hyperlink w:anchor="_Toc242440278" w:history="1">
         <w:r>
           <w:rPr>
             <w:rStyle w:val="Hyperlink"/>
@@ -3976,7 +4112,7 @@
             <w:noProof/>
             <w:webHidden/>
           </w:rPr>
-          <w:instrText xml:space="preserve"> PAGEREF _Toc242438396 \h </w:instrText>
+          <w:instrText xml:space="preserve"> PAGEREF _Toc242440278 \h </w:instrText>
         </w:r>
         <w:r>
           <w:rPr>
@@ -3996,7 +4132,7 @@
             <w:noProof/>
             <w:webHidden/>
           </w:rPr>
-          <w:t>55</w:t>
+          <w:t>56</w:t>
         </w:r>
         <w:r>
           <w:rPr>
@@ -4017,7 +4153,7 @@
           <w:noProof/>
         </w:rPr>
       </w:pPr>
-      <w:hyperlink w:anchor="_Toc242438397" w:history="1">
+      <w:hyperlink w:anchor="_Toc242440279" w:history="1">
         <w:r>
           <w:rPr>
             <w:rStyle w:val="Hyperlink"/>
@@ -4044,7 +4180,7 @@
             <w:noProof/>
             <w:webHidden/>
           </w:rPr>
-          <w:instrText xml:space="preserve"> PAGEREF _Toc242438397 \h </w:instrText>
+          <w:instrText xml:space="preserve"> PAGEREF _Toc242440279 \h </w:instrText>
         </w:r>
         <w:r>
           <w:rPr>
@@ -4064,7 +4200,7 @@
             <w:noProof/>
             <w:webHidden/>
           </w:rPr>
-          <w:t>55</w:t>
+          <w:t>56</w:t>
         </w:r>
         <w:r>
           <w:rPr>
@@ -4085,7 +4221,7 @@
           <w:noProof/>
         </w:rPr>
       </w:pPr>
-      <w:hyperlink w:anchor="_Toc242438398" w:history="1">
+      <w:hyperlink w:anchor="_Toc242440280" w:history="1">
         <w:r>
           <w:rPr>
             <w:rStyle w:val="Hyperlink"/>
@@ -4112,7 +4248,7 @@
             <w:noProof/>
             <w:webHidden/>
           </w:rPr>
-          <w:instrText xml:space="preserve"> PAGEREF _Toc242438398 \h </w:instrText>
+          <w:instrText xml:space="preserve"> PAGEREF _Toc242440280 \h </w:instrText>
         </w:r>
         <w:r>
           <w:rPr>
@@ -4132,7 +4268,7 @@
             <w:noProof/>
             <w:webHidden/>
           </w:rPr>
-          <w:t>55</w:t>
+          <w:t>56</w:t>
         </w:r>
         <w:r>
           <w:rPr>
@@ -4153,7 +4289,7 @@
           <w:noProof/>
         </w:rPr>
       </w:pPr>
-      <w:hyperlink w:anchor="_Toc242438399" w:history="1">
+      <w:hyperlink w:anchor="_Toc242440281" w:history="1">
         <w:r>
           <w:rPr>
             <w:rStyle w:val="Hyperlink"/>
@@ -4180,7 +4316,7 @@
             <w:noProof/>
             <w:webHidden/>
           </w:rPr>
-          <w:instrText xml:space="preserve"> PAGEREF _Toc242438399 \h </w:instrText>
+          <w:instrText xml:space="preserve"> PAGEREF _Toc242440281 \h </w:instrText>
         </w:r>
         <w:r>
           <w:rPr>
@@ -4200,7 +4336,7 @@
             <w:noProof/>
             <w:webHidden/>
           </w:rPr>
-          <w:t>55</w:t>
+          <w:t>56</w:t>
         </w:r>
         <w:r>
           <w:rPr>
@@ -4221,7 +4357,7 @@
           <w:noProof/>
         </w:rPr>
       </w:pPr>
-      <w:hyperlink w:anchor="_Toc242438400" w:history="1">
+      <w:hyperlink w:anchor="_Toc242440282" w:history="1">
         <w:r>
           <w:rPr>
             <w:rStyle w:val="Hyperlink"/>
@@ -4248,7 +4384,7 @@
             <w:noProof/>
             <w:webHidden/>
           </w:rPr>
-          <w:instrText xml:space="preserve"> PAGEREF _Toc242438400 \h </w:instrText>
+          <w:instrText xml:space="preserve"> PAGEREF _Toc242440282 \h </w:instrText>
         </w:r>
         <w:r>
           <w:rPr>
@@ -4268,7 +4404,7 @@
             <w:noProof/>
             <w:webHidden/>
           </w:rPr>
-          <w:t>55</w:t>
+          <w:t>56</w:t>
         </w:r>
         <w:r>
           <w:rPr>
@@ -4289,7 +4425,7 @@
         <w:pStyle w:val="Heading1"/>
         <w:pageBreakBefore/>
       </w:pPr>
-      <w:bookmarkStart w:id="0" w:name="_Toc242438343"/>
+      <w:bookmarkStart w:id="0" w:name="_Toc242440223"/>
       <w:r>
         <w:lastRenderedPageBreak/>
         <w:t>Welcome</w:t>
@@ -4305,7 +4441,7 @@
       <w:pPr>
         <w:pStyle w:val="Heading2"/>
       </w:pPr>
-      <w:bookmarkStart w:id="1" w:name="_Toc242438344"/>
+      <w:bookmarkStart w:id="1" w:name="_Toc242440224"/>
       <w:r>
         <w:t>How a sale moves through the app</w:t>
       </w:r>
@@ -4788,7 +4924,7 @@
       <w:pPr>
         <w:pStyle w:val="Heading2"/>
       </w:pPr>
-      <w:bookmarkStart w:id="2" w:name="_Toc242438345"/>
+      <w:bookmarkStart w:id="2" w:name="_Toc242440225"/>
       <w:r>
         <w:t>What you'll need</w:t>
       </w:r>
@@ -4897,7 +5033,7 @@
         <w:pStyle w:val="Heading1"/>
         <w:pageBreakBefore/>
       </w:pPr>
-      <w:bookmarkStart w:id="3" w:name="_Toc242438346"/>
+      <w:bookmarkStart w:id="3" w:name="_Toc242440226"/>
       <w:r>
         <w:lastRenderedPageBreak/>
         <w:t>Who can do what</w:t>
@@ -5373,7 +5509,7 @@
         <w:pStyle w:val="Heading1"/>
         <w:pageBreakBefore/>
       </w:pPr>
-      <w:bookmarkStart w:id="4" w:name="_Toc242438347"/>
+      <w:bookmarkStart w:id="4" w:name="_Toc242440227"/>
       <w:r>
         <w:lastRenderedPageBreak/>
         <w:t>Getting started</w:t>
@@ -5384,7 +5520,7 @@
       <w:pPr>
         <w:pStyle w:val="Heading2"/>
       </w:pPr>
-      <w:bookmarkStart w:id="5" w:name="_Toc242438348"/>
+      <w:bookmarkStart w:id="5" w:name="_Toc242440228"/>
       <w:r>
         <w:t>Signing in</w:t>
       </w:r>
@@ -5401,7 +5537,7 @@
           <w:noProof/>
         </w:rPr>
         <w:drawing>
-          <wp:inline distT="0" distB="0" distL="0" distR="0" wp14:anchorId="72C4962A" wp14:editId="7AC1D033">
+          <wp:inline distT="0" distB="0" distL="0" distR="0" wp14:anchorId="7E12CD0E" wp14:editId="3251852D">
             <wp:extent cx="3291840" cy="2211705"/>
             <wp:effectExtent l="0" t="0" r="0" b="0"/>
             <wp:docPr id="1" name="Picture 1"/>
@@ -5719,7 +5855,7 @@
       <w:pPr>
         <w:pStyle w:val="Heading2"/>
       </w:pPr>
-      <w:bookmarkStart w:id="6" w:name="_Toc242438349"/>
+      <w:bookmarkStart w:id="6" w:name="_Toc242440229"/>
       <w:r>
         <w:t>Changing your PIN</w:t>
       </w:r>
@@ -5901,7 +6037,7 @@
       <w:pPr>
         <w:pStyle w:val="Heading2"/>
       </w:pPr>
-      <w:bookmarkStart w:id="7" w:name="_Toc242438350"/>
+      <w:bookmarkStart w:id="7" w:name="_Toc242440230"/>
       <w:r>
         <w:lastRenderedPageBreak/>
         <w:t>Finding your way around</w:t>
@@ -6337,7 +6473,7 @@
               <w:spacing w:after="0"/>
             </w:pPr>
             <w:r>
-              <w:t>Admins: products, prices, sizes and delivery options.</w:t>
+              <w:t>Admins: products, prices, sizes, delivery options and financing options.</w:t>
             </w:r>
           </w:p>
         </w:tc>
@@ -6484,7 +6620,7 @@
       <w:pPr>
         <w:pStyle w:val="Heading2"/>
       </w:pPr>
-      <w:bookmarkStart w:id="8" w:name="_Toc242438351"/>
+      <w:bookmarkStart w:id="8" w:name="_Toc242440231"/>
       <w:r>
         <w:t>Mattress size guide</w:t>
       </w:r>
@@ -6507,7 +6643,7 @@
         </w:rPr>
         <w:lastRenderedPageBreak/>
         <w:drawing>
-          <wp:inline distT="0" distB="0" distL="0" distR="0" wp14:anchorId="785D39F9" wp14:editId="2B85F2A1">
+          <wp:inline distT="0" distB="0" distL="0" distR="0" wp14:anchorId="7C6EE92F" wp14:editId="45F4A81C">
             <wp:extent cx="5486400" cy="3686175"/>
             <wp:effectExtent l="0" t="0" r="0" b="0"/>
             <wp:docPr id="2" name="Picture 2"/>
@@ -6584,7 +6720,7 @@
       <w:pPr>
         <w:pStyle w:val="Heading2"/>
       </w:pPr>
-      <w:bookmarkStart w:id="9" w:name="_Toc242438352"/>
+      <w:bookmarkStart w:id="9" w:name="_Toc242440232"/>
       <w:r>
         <w:t>Light and dark mode</w:t>
       </w:r>
@@ -6599,7 +6735,7 @@
       <w:pPr>
         <w:pStyle w:val="Heading2"/>
       </w:pPr>
-      <w:bookmarkStart w:id="10" w:name="_Toc242438353"/>
+      <w:bookmarkStart w:id="10" w:name="_Toc242440233"/>
       <w:r>
         <w:t>Signing out</w:t>
       </w:r>
@@ -6624,7 +6760,7 @@
         <w:pStyle w:val="Heading1"/>
         <w:pageBreakBefore/>
       </w:pPr>
-      <w:bookmarkStart w:id="11" w:name="_Toc242438354"/>
+      <w:bookmarkStart w:id="11" w:name="_Toc242440234"/>
       <w:r>
         <w:lastRenderedPageBreak/>
         <w:t>Taking an order on the sales floor</w:t>
@@ -6656,7 +6792,7 @@
           <w:noProof/>
         </w:rPr>
         <w:drawing>
-          <wp:inline distT="0" distB="0" distL="0" distR="0" wp14:anchorId="4CB9D6FD" wp14:editId="10799336">
+          <wp:inline distT="0" distB="0" distL="0" distR="0" wp14:anchorId="55E213B6" wp14:editId="5D1B0947">
             <wp:extent cx="5760720" cy="3870484"/>
             <wp:effectExtent l="0" t="0" r="0" b="0"/>
             <wp:docPr id="3" name="Picture 3"/>
@@ -6781,7 +6917,7 @@
       <w:pPr>
         <w:pStyle w:val="Heading2"/>
       </w:pPr>
-      <w:bookmarkStart w:id="12" w:name="_Toc242438355"/>
+      <w:bookmarkStart w:id="12" w:name="_Toc242440235"/>
       <w:r>
         <w:t>Starting an order</w:t>
       </w:r>
@@ -6865,7 +7001,7 @@
       <w:pPr>
         <w:pStyle w:val="Heading2"/>
       </w:pPr>
-      <w:bookmarkStart w:id="13" w:name="_Toc242438356"/>
+      <w:bookmarkStart w:id="13" w:name="_Toc242440236"/>
       <w:r>
         <w:lastRenderedPageBreak/>
         <w:t>Adding items</w:t>
@@ -7014,7 +7150,7 @@
           <w:noProof/>
         </w:rPr>
         <w:drawing>
-          <wp:inline distT="0" distB="0" distL="0" distR="0" wp14:anchorId="2311364A" wp14:editId="665C8D25">
+          <wp:inline distT="0" distB="0" distL="0" distR="0" wp14:anchorId="713FD2AA" wp14:editId="3881B6D9">
             <wp:extent cx="5760720" cy="3870484"/>
             <wp:effectExtent l="0" t="0" r="0" b="0"/>
             <wp:docPr id="4" name="Picture 4"/>
@@ -7151,7 +7287,7 @@
           <w:noProof/>
         </w:rPr>
         <w:drawing>
-          <wp:inline distT="0" distB="0" distL="0" distR="0" wp14:anchorId="079FC399" wp14:editId="171F816D">
+          <wp:inline distT="0" distB="0" distL="0" distR="0" wp14:anchorId="63507CAB" wp14:editId="21CBA429">
             <wp:extent cx="5760720" cy="3870484"/>
             <wp:effectExtent l="0" t="0" r="0" b="0"/>
             <wp:docPr id="5" name="Picture 5"/>
@@ -7548,7 +7684,7 @@
           <w:noProof/>
         </w:rPr>
         <w:drawing>
-          <wp:inline distT="0" distB="0" distL="0" distR="0" wp14:anchorId="2EB4F8F5" wp14:editId="6FBF97FB">
+          <wp:inline distT="0" distB="0" distL="0" distR="0" wp14:anchorId="1C656BEC" wp14:editId="79EA0AF5">
             <wp:extent cx="5760720" cy="4545568"/>
             <wp:effectExtent l="0" t="0" r="0" b="0"/>
             <wp:docPr id="6" name="Picture 6"/>
@@ -7694,7 +7830,7 @@
         </w:rPr>
         <w:lastRenderedPageBreak/>
         <w:drawing>
-          <wp:inline distT="0" distB="0" distL="0" distR="0" wp14:anchorId="2436753E" wp14:editId="583C8524">
+          <wp:inline distT="0" distB="0" distL="0" distR="0" wp14:anchorId="22B34B1F" wp14:editId="5355B050">
             <wp:extent cx="5760720" cy="4050506"/>
             <wp:effectExtent l="0" t="0" r="0" b="0"/>
             <wp:docPr id="7" name="Picture 7"/>
@@ -7823,6 +7959,33 @@
         <w:spacing w:after="60"/>
       </w:pPr>
       <w:r>
+        <w:t xml:space="preserve">A size that's been left out of the count isn't kept at the cart, so it can't be a </w:t>
+      </w:r>
+      <w:r>
+        <w:rPr>
+          <w:b/>
+        </w:rPr>
+        <w:t>Take With</w:t>
+      </w:r>
+      <w:r>
+        <w:t xml:space="preserve"> - the Take With choice is greyed out with </w:t>
+      </w:r>
+      <w:r>
+        <w:rPr>
+          <w:b/>
+        </w:rPr>
+        <w:t>Not kept at the cart</w:t>
+      </w:r>
+      <w:r>
+        <w:t>. Choose a shipping method instead.</w:t>
+      </w:r>
+    </w:p>
+    <w:p>
+      <w:pPr>
+        <w:pStyle w:val="ListBullet"/>
+        <w:spacing w:after="60"/>
+      </w:pPr>
+      <w:r>
         <w:t xml:space="preserve">Some items are counted by color (or another selection) as well as size. Then each choice shows its own count, for example </w:t>
       </w:r>
       <w:r>
@@ -7856,7 +8019,7 @@
         </w:rPr>
         <w:lastRenderedPageBreak/>
         <w:drawing>
-          <wp:inline distT="0" distB="0" distL="0" distR="0" wp14:anchorId="24CCAA12" wp14:editId="5AA52EE8">
+          <wp:inline distT="0" distB="0" distL="0" distR="0" wp14:anchorId="1959D4EA" wp14:editId="2649E568">
             <wp:extent cx="5486400" cy="3686175"/>
             <wp:effectExtent l="0" t="0" r="0" b="0"/>
             <wp:docPr id="8" name="Picture 8"/>
@@ -8070,7 +8233,7 @@
       <w:pPr>
         <w:pStyle w:val="Heading2"/>
       </w:pPr>
-      <w:bookmarkStart w:id="14" w:name="_Toc242438357"/>
+      <w:bookmarkStart w:id="14" w:name="_Toc242440237"/>
       <w:r>
         <w:t>Adding shipping or a service later</w:t>
       </w:r>
@@ -8111,7 +8274,7 @@
         </w:rPr>
         <w:lastRenderedPageBreak/>
         <w:drawing>
-          <wp:inline distT="0" distB="0" distL="0" distR="0" wp14:anchorId="0E05673B" wp14:editId="0055F9F6">
+          <wp:inline distT="0" distB="0" distL="0" distR="0" wp14:anchorId="7BF29CCC" wp14:editId="25762C08">
             <wp:extent cx="4754880" cy="3145155"/>
             <wp:effectExtent l="0" t="0" r="0" b="0"/>
             <wp:docPr id="9" name="Picture 9"/>
@@ -8227,7 +8390,7 @@
       <w:pPr>
         <w:pStyle w:val="Heading2"/>
       </w:pPr>
-      <w:bookmarkStart w:id="15" w:name="_Toc242438358"/>
+      <w:bookmarkStart w:id="15" w:name="_Toc242440238"/>
       <w:r>
         <w:t>Adding an upcharge</w:t>
       </w:r>
@@ -8294,7 +8457,7 @@
           <w:noProof/>
         </w:rPr>
         <w:drawing>
-          <wp:inline distT="0" distB="0" distL="0" distR="0" wp14:anchorId="7D62F654" wp14:editId="5890FBE9">
+          <wp:inline distT="0" distB="0" distL="0" distR="0" wp14:anchorId="4183F45D" wp14:editId="7E427C3B">
             <wp:extent cx="4206240" cy="2382441"/>
             <wp:effectExtent l="0" t="0" r="0" b="0"/>
             <wp:docPr id="10" name="Picture 10"/>
@@ -8410,7 +8573,7 @@
           <w:noProof/>
         </w:rPr>
         <w:drawing>
-          <wp:inline distT="0" distB="0" distL="0" distR="0" wp14:anchorId="4D1D0A90" wp14:editId="6E2B05E2">
+          <wp:inline distT="0" distB="0" distL="0" distR="0" wp14:anchorId="57A4EB94" wp14:editId="6CEE6840">
             <wp:extent cx="4754880" cy="1648358"/>
             <wp:effectExtent l="0" t="0" r="0" b="0"/>
             <wp:docPr id="11" name="Picture 11"/>
@@ -8464,7 +8627,7 @@
       <w:pPr>
         <w:pStyle w:val="Heading2"/>
       </w:pPr>
-      <w:bookmarkStart w:id="16" w:name="_Toc242438359"/>
+      <w:bookmarkStart w:id="16" w:name="_Toc242440239"/>
       <w:r>
         <w:t>Changing or removing an item</w:t>
       </w:r>
@@ -8610,7 +8773,7 @@
         </w:rPr>
         <w:lastRenderedPageBreak/>
         <w:drawing>
-          <wp:inline distT="0" distB="0" distL="0" distR="0" wp14:anchorId="038DAB90" wp14:editId="6CFB5B8C">
+          <wp:inline distT="0" distB="0" distL="0" distR="0" wp14:anchorId="11225723" wp14:editId="6D75A52A">
             <wp:extent cx="4754880" cy="2451405"/>
             <wp:effectExtent l="0" t="0" r="0" b="0"/>
             <wp:docPr id="12" name="Picture 12"/>
@@ -8732,7 +8895,7 @@
       <w:pPr>
         <w:pStyle w:val="Heading2"/>
       </w:pPr>
-      <w:bookmarkStart w:id="17" w:name="_Toc242438360"/>
+      <w:bookmarkStart w:id="17" w:name="_Toc242440240"/>
       <w:r>
         <w:t>Customer details</w:t>
       </w:r>
@@ -8932,7 +9095,7 @@
         </w:rPr>
         <w:lastRenderedPageBreak/>
         <w:drawing>
-          <wp:inline distT="0" distB="0" distL="0" distR="0" wp14:anchorId="01F3F875" wp14:editId="078F57E1">
+          <wp:inline distT="0" distB="0" distL="0" distR="0" wp14:anchorId="554E3916" wp14:editId="34F0F282">
             <wp:extent cx="4754880" cy="3194685"/>
             <wp:effectExtent l="0" t="0" r="0" b="0"/>
             <wp:docPr id="13" name="Picture 13"/>
@@ -8986,7 +9149,7 @@
       <w:pPr>
         <w:pStyle w:val="Heading2"/>
       </w:pPr>
-      <w:bookmarkStart w:id="18" w:name="_Toc242438361"/>
+      <w:bookmarkStart w:id="18" w:name="_Toc242440241"/>
       <w:r>
         <w:t>Sending the order to checkout</w:t>
       </w:r>
@@ -9164,7 +9327,7 @@
       <w:pPr>
         <w:pStyle w:val="Heading2"/>
       </w:pPr>
-      <w:bookmarkStart w:id="19" w:name="_Toc242438362"/>
+      <w:bookmarkStart w:id="19" w:name="_Toc242440242"/>
       <w:r>
         <w:lastRenderedPageBreak/>
         <w:t>Using a phone</w:t>
@@ -9182,7 +9345,7 @@
           <w:noProof/>
         </w:rPr>
         <w:drawing>
-          <wp:inline distT="0" distB="0" distL="0" distR="0" wp14:anchorId="212B0F23" wp14:editId="0BF06542">
+          <wp:inline distT="0" distB="0" distL="0" distR="0" wp14:anchorId="1A944630" wp14:editId="45555490">
             <wp:extent cx="2194560" cy="4749253"/>
             <wp:effectExtent l="0" t="0" r="0" b="0"/>
             <wp:docPr id="14" name="Picture 14"/>
@@ -9260,7 +9423,7 @@
         <w:pStyle w:val="Heading1"/>
         <w:pageBreakBefore/>
       </w:pPr>
-      <w:bookmarkStart w:id="20" w:name="_Toc242438363"/>
+      <w:bookmarkStart w:id="20" w:name="_Toc242440243"/>
       <w:r>
         <w:lastRenderedPageBreak/>
         <w:t>Checking out a customer</w:t>
@@ -9301,7 +9464,7 @@
           <w:noProof/>
         </w:rPr>
         <w:drawing>
-          <wp:inline distT="0" distB="0" distL="0" distR="0" wp14:anchorId="20695E5F" wp14:editId="055625FD">
+          <wp:inline distT="0" distB="0" distL="0" distR="0" wp14:anchorId="7599E9D5" wp14:editId="2CAC8232">
             <wp:extent cx="5760720" cy="3870484"/>
             <wp:effectExtent l="0" t="0" r="0" b="0"/>
             <wp:docPr id="15" name="Picture 15"/>
@@ -9355,7 +9518,7 @@
       <w:pPr>
         <w:pStyle w:val="Heading2"/>
       </w:pPr>
-      <w:bookmarkStart w:id="21" w:name="_Toc242438364"/>
+      <w:bookmarkStart w:id="21" w:name="_Toc242440244"/>
       <w:r>
         <w:t>1. Review the order with the customer</w:t>
       </w:r>
@@ -9461,7 +9624,7 @@
       <w:pPr>
         <w:pStyle w:val="Heading2"/>
       </w:pPr>
-      <w:bookmarkStart w:id="22" w:name="_Toc242438365"/>
+      <w:bookmarkStart w:id="22" w:name="_Toc242440245"/>
       <w:r>
         <w:t>2. Take payment</w:t>
       </w:r>
@@ -9632,6 +9795,59 @@
         </w:rPr>
         <w:lastRenderedPageBreak/>
         <w:t>4.</w:t>
+      </w:r>
+      <w:r>
+        <w:rPr>
+          <w:b/>
+          <w:color w:val="0369A1"/>
+        </w:rPr>
+        <w:tab/>
+      </w:r>
+      <w:r>
+        <w:t xml:space="preserve">For financing, pick the </w:t>
+      </w:r>
+      <w:r>
+        <w:rPr>
+          <w:b/>
+        </w:rPr>
+        <w:t>Financing type</w:t>
+      </w:r>
+      <w:r>
+        <w:t xml:space="preserve"> from the list. If the customer's financing isn't listed, pick </w:t>
+      </w:r>
+      <w:r>
+        <w:rPr>
+          <w:b/>
+        </w:rPr>
+        <w:t>Other</w:t>
+      </w:r>
+      <w:r>
+        <w:t xml:space="preserve"> at the bottom (when it's offered) and type it in. Then enter the </w:t>
+      </w:r>
+      <w:r>
+        <w:rPr>
+          <w:b/>
+        </w:rPr>
+        <w:t>Financing #</w:t>
+      </w:r>
+      <w:r>
+        <w:t>. Both print in the Comments box of the sales sheet, along with the amount financed.</w:t>
+      </w:r>
+    </w:p>
+    <w:p>
+      <w:pPr>
+        <w:tabs>
+          <w:tab w:val="left" w:pos="504"/>
+        </w:tabs>
+        <w:spacing w:after="80"/>
+        <w:ind w:left="504" w:hanging="432"/>
+      </w:pPr>
+      <w:r>
+        <w:rPr>
+          <w:b/>
+          <w:color w:val="0369A1"/>
+        </w:rPr>
+        <w:t>5.</w:t>
       </w:r>
       <w:r>
         <w:rPr>
@@ -9749,7 +9965,7 @@
           <w:noProof/>
         </w:rPr>
         <w:drawing>
-          <wp:inline distT="0" distB="0" distL="0" distR="0" wp14:anchorId="54FC10F8" wp14:editId="6523E92C">
+          <wp:inline distT="0" distB="0" distL="0" distR="0" wp14:anchorId="710B8EB4" wp14:editId="636E87B9">
             <wp:extent cx="4572000" cy="1517073"/>
             <wp:effectExtent l="0" t="0" r="0" b="0"/>
             <wp:docPr id="16" name="Picture 16"/>
@@ -9857,9 +10073,54 @@
     </w:p>
     <w:p>
       <w:pPr>
+        <w:pStyle w:val="ListBullet"/>
+        <w:spacing w:after="60"/>
+      </w:pPr>
+      <w:r>
+        <w:t xml:space="preserve">The financing types in the list are set up in the Catalog, under </w:t>
+      </w:r>
+      <w:r>
+        <w:rPr>
+          <w:b/>
+        </w:rPr>
+        <w:t>Financing Options</w:t>
+      </w:r>
+      <w:r>
+        <w:t xml:space="preserve"> (see </w:t>
+      </w:r>
+      <w:r>
+        <w:rPr>
+          <w:b/>
+        </w:rPr>
+        <w:t>Admin: managing the catalog</w:t>
+      </w:r>
+      <w:r>
+        <w:t xml:space="preserve">). Whether </w:t>
+      </w:r>
+      <w:r>
+        <w:rPr>
+          <w:b/>
+        </w:rPr>
+        <w:t>Other</w:t>
+      </w:r>
+      <w:r>
+        <w:t xml:space="preserve"> is offered is set under Settings (see </w:t>
+      </w:r>
+      <w:r>
+        <w:rPr>
+          <w:b/>
+        </w:rPr>
+        <w:t>Admin: settings</w:t>
+      </w:r>
+      <w:r>
+        <w:t>).</w:t>
+      </w:r>
+    </w:p>
+    <w:p>
+      <w:pPr>
         <w:pStyle w:val="Heading2"/>
       </w:pPr>
-      <w:bookmarkStart w:id="23" w:name="_Toc242438366"/>
+      <w:bookmarkStart w:id="23" w:name="_Toc242440246"/>
       <w:r>
         <w:t>3. Acknowledgements (initials and signature)</w:t>
       </w:r>
@@ -9942,6 +10203,7 @@
           <w:b/>
           <w:color w:val="0369A1"/>
         </w:rPr>
+        <w:lastRenderedPageBreak/>
         <w:t>2.</w:t>
       </w:r>
       <w:r>
@@ -10039,9 +10301,8 @@
         <w:rPr>
           <w:noProof/>
         </w:rPr>
-        <w:lastRenderedPageBreak/>
         <w:drawing>
-          <wp:inline distT="0" distB="0" distL="0" distR="0" wp14:anchorId="2DB534DF" wp14:editId="1BBA1A78">
+          <wp:inline distT="0" distB="0" distL="0" distR="0" wp14:anchorId="2259B99F" wp14:editId="6732D470">
             <wp:extent cx="4937760" cy="3317558"/>
             <wp:effectExtent l="0" t="0" r="0" b="0"/>
             <wp:docPr id="17" name="Picture 17"/>
@@ -10230,7 +10491,7 @@
       <w:pPr>
         <w:pStyle w:val="Heading2"/>
       </w:pPr>
-      <w:bookmarkStart w:id="24" w:name="_Toc242438367"/>
+      <w:bookmarkStart w:id="24" w:name="_Toc242440247"/>
       <w:r>
         <w:t>4. Complete the sale</w:t>
       </w:r>
@@ -10339,6 +10600,7 @@
                 <w:b/>
                 <w:color w:val="6B7280"/>
               </w:rPr>
+              <w:lastRenderedPageBreak/>
               <w:t xml:space="preserve">Good to know:  </w:t>
             </w:r>
             <w:r>
@@ -10355,7 +10617,6 @@
     </w:p>
     <w:p>
       <w:r>
-        <w:lastRenderedPageBreak/>
         <w:t xml:space="preserve">Completing an order also takes any counted </w:t>
       </w:r>
       <w:r>
@@ -10452,7 +10713,7 @@
       <w:pPr>
         <w:pStyle w:val="Heading2"/>
       </w:pPr>
-      <w:bookmarkStart w:id="25" w:name="_Toc242438368"/>
+      <w:bookmarkStart w:id="25" w:name="_Toc242440248"/>
       <w:r>
         <w:t>Other checkout actions</w:t>
       </w:r>
@@ -10662,7 +10923,7 @@
         <w:pStyle w:val="Heading1"/>
         <w:pageBreakBefore/>
       </w:pPr>
-      <w:bookmarkStart w:id="26" w:name="_Toc242438369"/>
+      <w:bookmarkStart w:id="26" w:name="_Toc242440249"/>
       <w:r>
         <w:lastRenderedPageBreak/>
         <w:t>The sales sheet</w:t>
@@ -10685,7 +10946,7 @@
           <w:noProof/>
         </w:rPr>
         <w:drawing>
-          <wp:inline distT="0" distB="0" distL="0" distR="0" wp14:anchorId="4D961DB2" wp14:editId="12FE2709">
+          <wp:inline distT="0" distB="0" distL="0" distR="0" wp14:anchorId="240CB810" wp14:editId="16FDFC75">
             <wp:extent cx="4023360" cy="3187256"/>
             <wp:effectExtent l="0" t="0" r="0" b="0"/>
             <wp:docPr id="18" name="Picture 18"/>
@@ -11132,7 +11393,7 @@
       <w:pPr>
         <w:pStyle w:val="Heading2"/>
       </w:pPr>
-      <w:bookmarkStart w:id="27" w:name="_Toc242438370"/>
+      <w:bookmarkStart w:id="27" w:name="_Toc242440250"/>
       <w:r>
         <w:t>Emailing a receipt</w:t>
       </w:r>
@@ -11259,7 +11520,7 @@
           <w:noProof/>
         </w:rPr>
         <w:drawing>
-          <wp:inline distT="0" distB="0" distL="0" distR="0" wp14:anchorId="3B2C30ED" wp14:editId="295DD7D4">
+          <wp:inline distT="0" distB="0" distL="0" distR="0" wp14:anchorId="28CAC249" wp14:editId="058C43B0">
             <wp:extent cx="4572000" cy="3071812"/>
             <wp:effectExtent l="0" t="0" r="0" b="0"/>
             <wp:docPr id="19" name="Picture 19"/>
@@ -11720,7 +11981,7 @@
         <w:pStyle w:val="Heading1"/>
         <w:pageBreakBefore/>
       </w:pPr>
-      <w:bookmarkStart w:id="28" w:name="_Toc242438371"/>
+      <w:bookmarkStart w:id="28" w:name="_Toc242440251"/>
       <w:r>
         <w:lastRenderedPageBreak/>
         <w:t>Looking up orders</w:t>
@@ -11752,7 +12013,7 @@
           <w:noProof/>
         </w:rPr>
         <w:drawing>
-          <wp:inline distT="0" distB="0" distL="0" distR="0" wp14:anchorId="102DB0CB" wp14:editId="43E407E1">
+          <wp:inline distT="0" distB="0" distL="0" distR="0" wp14:anchorId="710D7041" wp14:editId="2B986C18">
             <wp:extent cx="5760720" cy="3870484"/>
             <wp:effectExtent l="0" t="0" r="0" b="0"/>
             <wp:docPr id="20" name="Picture 20"/>
@@ -11872,7 +12133,7 @@
       <w:pPr>
         <w:pStyle w:val="Heading2"/>
       </w:pPr>
-      <w:bookmarkStart w:id="29" w:name="_Toc242438372"/>
+      <w:bookmarkStart w:id="29" w:name="_Toc242440252"/>
       <w:r>
         <w:t>Extra options for admins</w:t>
       </w:r>
@@ -11962,7 +12223,7 @@
         </w:rPr>
         <w:lastRenderedPageBreak/>
         <w:drawing>
-          <wp:inline distT="0" distB="0" distL="0" distR="0" wp14:anchorId="1E0F1C0E" wp14:editId="44B40C58">
+          <wp:inline distT="0" distB="0" distL="0" distR="0" wp14:anchorId="11779F93" wp14:editId="35318F7D">
             <wp:extent cx="4754880" cy="3194685"/>
             <wp:effectExtent l="0" t="0" r="0" b="0"/>
             <wp:docPr id="21" name="Picture 21"/>
@@ -12070,7 +12331,7 @@
         <w:pStyle w:val="Heading1"/>
         <w:pageBreakBefore/>
       </w:pPr>
-      <w:bookmarkStart w:id="30" w:name="_Toc242438373"/>
+      <w:bookmarkStart w:id="30" w:name="_Toc242440253"/>
       <w:r>
         <w:lastRenderedPageBreak/>
         <w:t>The dashboard</w:t>
@@ -12134,7 +12395,7 @@
           <w:noProof/>
         </w:rPr>
         <w:drawing>
-          <wp:inline distT="0" distB="0" distL="0" distR="0" wp14:anchorId="4A4A5BD8" wp14:editId="21B23913">
+          <wp:inline distT="0" distB="0" distL="0" distR="0" wp14:anchorId="495A7405" wp14:editId="2E21B3D7">
             <wp:extent cx="4937760" cy="4305110"/>
             <wp:effectExtent l="0" t="0" r="0" b="0"/>
             <wp:docPr id="22" name="Picture 22"/>
@@ -12789,7 +13050,7 @@
         <w:pStyle w:val="Heading1"/>
         <w:pageBreakBefore/>
       </w:pPr>
-      <w:bookmarkStart w:id="31" w:name="_Toc242438374"/>
+      <w:bookmarkStart w:id="31" w:name="_Toc242440254"/>
       <w:r>
         <w:lastRenderedPageBreak/>
         <w:t>Keeping inventory</w:t>
@@ -12848,7 +13109,7 @@
           <w:noProof/>
         </w:rPr>
         <w:drawing>
-          <wp:inline distT="0" distB="0" distL="0" distR="0" wp14:anchorId="4D444BF1" wp14:editId="502245AD">
+          <wp:inline distT="0" distB="0" distL="0" distR="0" wp14:anchorId="5DFD18A5" wp14:editId="51A74E1A">
             <wp:extent cx="5760720" cy="3870484"/>
             <wp:effectExtent l="0" t="0" r="0" b="0"/>
             <wp:docPr id="23" name="Picture 23"/>
@@ -12902,7 +13163,7 @@
       <w:pPr>
         <w:pStyle w:val="Heading2"/>
       </w:pPr>
-      <w:bookmarkStart w:id="32" w:name="_Toc242438375"/>
+      <w:bookmarkStart w:id="32" w:name="_Toc242440255"/>
       <w:r>
         <w:t>What's on the screen</w:t>
       </w:r>
@@ -12914,7 +13175,7 @@
         <w:spacing w:after="60"/>
       </w:pPr>
       <w:r>
-        <w:t xml:space="preserve">Each counted product is listed under its category, with one row per size. A product counted by color has a row for each size and color, such as </w:t>
+        <w:t xml:space="preserve">Each counted product is listed under its category, with one row per size. A size that's been left out of the count isn't listed. A product counted by color has a row for each size and color, such as </w:t>
       </w:r>
       <w:r>
         <w:rPr>
@@ -13010,7 +13271,7 @@
         </w:rPr>
         <w:lastRenderedPageBreak/>
         <w:drawing>
-          <wp:inline distT="0" distB="0" distL="0" distR="0" wp14:anchorId="4DD7D19E" wp14:editId="6B917715">
+          <wp:inline distT="0" distB="0" distL="0" distR="0" wp14:anchorId="1A6C2552" wp14:editId="41E08784">
             <wp:extent cx="5120640" cy="2295459"/>
             <wp:effectExtent l="0" t="0" r="0" b="0"/>
             <wp:docPr id="24" name="Picture 24"/>
@@ -13135,7 +13396,7 @@
       <w:pPr>
         <w:pStyle w:val="Heading2"/>
       </w:pPr>
-      <w:bookmarkStart w:id="33" w:name="_Toc242438376"/>
+      <w:bookmarkStart w:id="33" w:name="_Toc242440256"/>
       <w:r>
         <w:t>Updating a count</w:t>
       </w:r>
@@ -13212,7 +13473,7 @@
         </w:rPr>
         <w:lastRenderedPageBreak/>
         <w:drawing>
-          <wp:inline distT="0" distB="0" distL="0" distR="0" wp14:anchorId="469254EB" wp14:editId="76D0919C">
+          <wp:inline distT="0" distB="0" distL="0" distR="0" wp14:anchorId="5DBBACCA" wp14:editId="03E0B96C">
             <wp:extent cx="5120640" cy="3440430"/>
             <wp:effectExtent l="0" t="0" r="0" b="0"/>
             <wp:docPr id="25" name="Picture 25"/>
@@ -13266,7 +13527,7 @@
       <w:pPr>
         <w:pStyle w:val="Heading2"/>
       </w:pPr>
-      <w:bookmarkStart w:id="34" w:name="_Toc242438377"/>
+      <w:bookmarkStart w:id="34" w:name="_Toc242440257"/>
       <w:r>
         <w:t>What changes the count automatically</w:t>
       </w:r>
@@ -13670,7 +13931,7 @@
       <w:pPr>
         <w:pStyle w:val="Heading2"/>
       </w:pPr>
-      <w:bookmarkStart w:id="35" w:name="_Toc242438378"/>
+      <w:bookmarkStart w:id="35" w:name="_Toc242440258"/>
       <w:r>
         <w:t>Seeing the history</w:t>
       </w:r>
@@ -13685,7 +13946,7 @@
       <w:pPr>
         <w:pStyle w:val="Heading2"/>
       </w:pPr>
-      <w:bookmarkStart w:id="36" w:name="_Toc242438379"/>
+      <w:bookmarkStart w:id="36" w:name="_Toc242440259"/>
       <w:r>
         <w:lastRenderedPageBreak/>
         <w:t>Notes for the inventory sheet</w:t>
@@ -13735,7 +13996,7 @@
           <w:noProof/>
         </w:rPr>
         <w:drawing>
-          <wp:inline distT="0" distB="0" distL="0" distR="0" wp14:anchorId="3A6F107F" wp14:editId="51D8B7AB">
+          <wp:inline distT="0" distB="0" distL="0" distR="0" wp14:anchorId="5F361742" wp14:editId="39273391">
             <wp:extent cx="5120640" cy="3440430"/>
             <wp:effectExtent l="0" t="0" r="0" b="0"/>
             <wp:docPr id="26" name="Picture 26"/>
@@ -13789,7 +14050,7 @@
       <w:pPr>
         <w:pStyle w:val="Heading2"/>
       </w:pPr>
-      <w:bookmarkStart w:id="37" w:name="_Toc242438380"/>
+      <w:bookmarkStart w:id="37" w:name="_Toc242440260"/>
       <w:r>
         <w:t>Start and end counts</w:t>
       </w:r>
@@ -14313,7 +14574,7 @@
           <w:noProof/>
         </w:rPr>
         <w:drawing>
-          <wp:inline distT="0" distB="0" distL="0" distR="0" wp14:anchorId="020B0BAB" wp14:editId="7CCB4BDA">
+          <wp:inline distT="0" distB="0" distL="0" distR="0" wp14:anchorId="2FF20D6E" wp14:editId="73FA00EF">
             <wp:extent cx="5486400" cy="3686175"/>
             <wp:effectExtent l="0" t="0" r="0" b="0"/>
             <wp:docPr id="27" name="Picture 27"/>
@@ -14453,7 +14714,7 @@
         <w:pStyle w:val="Heading1"/>
         <w:pageBreakBefore/>
       </w:pPr>
-      <w:bookmarkStart w:id="38" w:name="_Toc242438381"/>
+      <w:bookmarkStart w:id="38" w:name="_Toc242440261"/>
       <w:r>
         <w:lastRenderedPageBreak/>
         <w:t>Admin: setting up an event</w:t>
@@ -14478,7 +14739,7 @@
       <w:pPr>
         <w:pStyle w:val="Heading2"/>
       </w:pPr>
-      <w:bookmarkStart w:id="39" w:name="_Toc242438382"/>
+      <w:bookmarkStart w:id="39" w:name="_Toc242440262"/>
       <w:r>
         <w:t>Creating or editing an event</w:t>
       </w:r>
@@ -14495,7 +14756,7 @@
           <w:noProof/>
         </w:rPr>
         <w:drawing>
-          <wp:inline distT="0" distB="0" distL="0" distR="0" wp14:anchorId="1E29D4E6" wp14:editId="45D938EC">
+          <wp:inline distT="0" distB="0" distL="0" distR="0" wp14:anchorId="5902D812" wp14:editId="5D27FF22">
             <wp:extent cx="5760720" cy="1134142"/>
             <wp:effectExtent l="0" t="0" r="0" b="0"/>
             <wp:docPr id="28" name="Picture 28"/>
@@ -14844,7 +15105,7 @@
           <w:noProof/>
         </w:rPr>
         <w:drawing>
-          <wp:inline distT="0" distB="0" distL="0" distR="0" wp14:anchorId="39698682" wp14:editId="2059FBBA">
+          <wp:inline distT="0" distB="0" distL="0" distR="0" wp14:anchorId="627397F6" wp14:editId="0799A5B1">
             <wp:extent cx="3840480" cy="2580322"/>
             <wp:effectExtent l="0" t="0" r="0" b="0"/>
             <wp:docPr id="29" name="Picture 29"/>
@@ -14957,7 +15218,7 @@
       <w:pPr>
         <w:pStyle w:val="Heading2"/>
       </w:pPr>
-      <w:bookmarkStart w:id="40" w:name="_Toc242438383"/>
+      <w:bookmarkStart w:id="40" w:name="_Toc242440263"/>
       <w:r>
         <w:t>Closing out an event</w:t>
       </w:r>
@@ -15124,7 +15385,7 @@
       <w:pPr>
         <w:pStyle w:val="Heading2"/>
       </w:pPr>
-      <w:bookmarkStart w:id="41" w:name="_Toc242438384"/>
+      <w:bookmarkStart w:id="41" w:name="_Toc242440264"/>
       <w:r>
         <w:t>Event sales sheets</w:t>
       </w:r>
@@ -15182,7 +15443,7 @@
           <w:noProof/>
         </w:rPr>
         <w:drawing>
-          <wp:inline distT="0" distB="0" distL="0" distR="0" wp14:anchorId="371AC186" wp14:editId="187EF8F0">
+          <wp:inline distT="0" distB="0" distL="0" distR="0" wp14:anchorId="2C762B4D" wp14:editId="4C68050F">
             <wp:extent cx="4389120" cy="2948940"/>
             <wp:effectExtent l="0" t="0" r="0" b="0"/>
             <wp:docPr id="30" name="Picture 30"/>
@@ -15311,7 +15572,7 @@
           <w:noProof/>
         </w:rPr>
         <w:drawing>
-          <wp:inline distT="0" distB="0" distL="0" distR="0" wp14:anchorId="5A20DF0F" wp14:editId="3A1A346A">
+          <wp:inline distT="0" distB="0" distL="0" distR="0" wp14:anchorId="4D96F35B" wp14:editId="3302BAE8">
             <wp:extent cx="4206240" cy="5717858"/>
             <wp:effectExtent l="0" t="0" r="0" b="0"/>
             <wp:docPr id="31" name="Picture 31"/>
@@ -15449,7 +15710,7 @@
           <w:noProof/>
         </w:rPr>
         <w:drawing>
-          <wp:inline distT="0" distB="0" distL="0" distR="0" wp14:anchorId="1A59AAEA" wp14:editId="7CFE95C4">
+          <wp:inline distT="0" distB="0" distL="0" distR="0" wp14:anchorId="0AC92FC0" wp14:editId="63398794">
             <wp:extent cx="4389120" cy="2948940"/>
             <wp:effectExtent l="0" t="0" r="0" b="0"/>
             <wp:docPr id="32" name="Picture 32"/>
@@ -15562,7 +15823,7 @@
         <w:pStyle w:val="Heading1"/>
         <w:pageBreakBefore/>
       </w:pPr>
-      <w:bookmarkStart w:id="42" w:name="_Toc242438385"/>
+      <w:bookmarkStart w:id="42" w:name="_Toc242440265"/>
       <w:r>
         <w:lastRenderedPageBreak/>
         <w:t>Admin: managing the catalog</w:t>
@@ -15666,7 +15927,7 @@
           <w:noProof/>
         </w:rPr>
         <w:drawing>
-          <wp:inline distT="0" distB="0" distL="0" distR="0" wp14:anchorId="4DC47A56" wp14:editId="05961215">
+          <wp:inline distT="0" distB="0" distL="0" distR="0" wp14:anchorId="311326C3" wp14:editId="46C2D331">
             <wp:extent cx="5760720" cy="4050506"/>
             <wp:effectExtent l="0" t="0" r="0" b="0"/>
             <wp:docPr id="33" name="Picture 33"/>
@@ -15720,7 +15981,7 @@
       <w:pPr>
         <w:pStyle w:val="Heading2"/>
       </w:pPr>
-      <w:bookmarkStart w:id="43" w:name="_Toc242438386"/>
+      <w:bookmarkStart w:id="43" w:name="_Toc242440266"/>
       <w:r>
         <w:lastRenderedPageBreak/>
         <w:t>Adding or editing a product</w:t>
@@ -15738,7 +15999,7 @@
           <w:noProof/>
         </w:rPr>
         <w:drawing>
-          <wp:inline distT="0" distB="0" distL="0" distR="0" wp14:anchorId="69406520" wp14:editId="667470FD">
+          <wp:inline distT="0" distB="0" distL="0" distR="0" wp14:anchorId="3B2CDC29" wp14:editId="4306F72C">
             <wp:extent cx="5486400" cy="3686175"/>
             <wp:effectExtent l="0" t="0" r="0" b="0"/>
             <wp:docPr id="34" name="Picture 34"/>
@@ -16205,7 +16466,7 @@
         </w:rPr>
         <w:lastRenderedPageBreak/>
         <w:drawing>
-          <wp:inline distT="0" distB="0" distL="0" distR="0" wp14:anchorId="1C1F7720" wp14:editId="7E29B899">
+          <wp:inline distT="0" distB="0" distL="0" distR="0" wp14:anchorId="7D452A7F" wp14:editId="617C5055">
             <wp:extent cx="5120640" cy="2130933"/>
             <wp:effectExtent l="0" t="0" r="0" b="0"/>
             <wp:docPr id="35" name="Picture 35"/>
@@ -16322,6 +16583,127 @@
         <w:pStyle w:val="Heading3"/>
       </w:pPr>
       <w:r>
+        <w:t>Leaving a size out of inventory</w:t>
+      </w:r>
+    </w:p>
+    <w:p>
+      <w:r>
+        <w:t xml:space="preserve">With </w:t>
+      </w:r>
+      <w:r>
+        <w:rPr>
+          <w:b/>
+        </w:rPr>
+        <w:t>Track inventory</w:t>
+      </w:r>
+      <w:r>
+        <w:t xml:space="preserve"> on, each size row also has a </w:t>
+      </w:r>
+      <w:r>
+        <w:rPr>
+          <w:b/>
+        </w:rPr>
+        <w:t>Count in inventory</w:t>
+      </w:r>
+      <w:r>
+        <w:t xml:space="preserve"> box, ticked to start with. Untick it for a size the cart doesn't keep, for example a King pillow that always ships. Then tap </w:t>
+      </w:r>
+      <w:r>
+        <w:rPr>
+          <w:b/>
+        </w:rPr>
+        <w:t>Save</w:t>
+      </w:r>
+      <w:r>
+        <w:t>.</w:t>
+      </w:r>
+    </w:p>
+    <w:p>
+      <w:pPr>
+        <w:pStyle w:val="ListBullet"/>
+        <w:spacing w:after="60"/>
+      </w:pPr>
+      <w:r>
+        <w:t xml:space="preserve">That size isn't counted. It doesn't appear on the </w:t>
+      </w:r>
+      <w:r>
+        <w:rPr>
+          <w:b/>
+        </w:rPr>
+        <w:t>Inventory</w:t>
+      </w:r>
+      <w:r>
+        <w:t xml:space="preserve"> screen, in the start and end counts, or on the </w:t>
+      </w:r>
+      <w:r>
+        <w:rPr>
+          <w:b/>
+        </w:rPr>
+        <w:t>Accessory Inventory Sheet</w:t>
+      </w:r>
+      <w:r>
+        <w:t>.</w:t>
+      </w:r>
+    </w:p>
+    <w:p>
+      <w:pPr>
+        <w:pStyle w:val="ListBullet"/>
+        <w:spacing w:after="60"/>
+      </w:pPr>
+      <w:r>
+        <w:t xml:space="preserve">That size can't be a </w:t>
+      </w:r>
+      <w:r>
+        <w:rPr>
+          <w:b/>
+        </w:rPr>
+        <w:t>Take With</w:t>
+      </w:r>
+      <w:r>
+        <w:t xml:space="preserve">, since the cart doesn't keep it: the Take With choice is greyed out with </w:t>
+      </w:r>
+      <w:r>
+        <w:rPr>
+          <w:b/>
+        </w:rPr>
+        <w:t>Not kept at the cart</w:t>
+      </w:r>
+      <w:r>
+        <w:t>, and it has to ship. The same goes for a bundle that includes a size left out of the count.</w:t>
+      </w:r>
+    </w:p>
+    <w:p>
+      <w:pPr>
+        <w:pStyle w:val="ListBullet"/>
+        <w:spacing w:after="60"/>
+      </w:pPr>
+      <w:r>
+        <w:t xml:space="preserve">The catalog list shows how many sizes aren't counted, for example </w:t>
+      </w:r>
+      <w:r>
+        <w:rPr>
+          <w:b/>
+        </w:rPr>
+        <w:t>Tracked · 12 on hand (1 not counted)</w:t>
+      </w:r>
+      <w:r>
+        <w:t>.</w:t>
+      </w:r>
+    </w:p>
+    <w:p>
+      <w:pPr>
+        <w:pStyle w:val="ListBullet"/>
+        <w:spacing w:after="60"/>
+      </w:pPr>
+      <w:r>
+        <w:t>Tick the box again to start counting it. Any count it had before is still there.</w:t>
+      </w:r>
+    </w:p>
+    <w:p>
+      <w:pPr>
+        <w:pStyle w:val="Heading3"/>
+      </w:pPr>
+      <w:r>
         <w:t>Putting a product on sale</w:t>
       </w:r>
     </w:p>
@@ -16385,8 +16767,9 @@
         <w:rPr>
           <w:noProof/>
         </w:rPr>
+        <w:lastRenderedPageBreak/>
         <w:drawing>
-          <wp:inline distT="0" distB="0" distL="0" distR="0" wp14:anchorId="219BCBB5" wp14:editId="70E2979F">
+          <wp:inline distT="0" distB="0" distL="0" distR="0" wp14:anchorId="7922B301" wp14:editId="433A1D4E">
             <wp:extent cx="5486400" cy="3686175"/>
             <wp:effectExtent l="0" t="0" r="0" b="0"/>
             <wp:docPr id="36" name="Picture 36"/>
@@ -16438,7 +16821,6 @@
     </w:p>
     <w:p>
       <w:r>
-        <w:lastRenderedPageBreak/>
         <w:t xml:space="preserve">Each size also has </w:t>
       </w:r>
       <w:r>
@@ -16587,8 +16969,9 @@
         <w:rPr>
           <w:noProof/>
         </w:rPr>
+        <w:lastRenderedPageBreak/>
         <w:drawing>
-          <wp:inline distT="0" distB="0" distL="0" distR="0" wp14:anchorId="3FDFA9CB" wp14:editId="0281B47B">
+          <wp:inline distT="0" distB="0" distL="0" distR="0" wp14:anchorId="27832190" wp14:editId="6CAB5E30">
             <wp:extent cx="5486400" cy="3686175"/>
             <wp:effectExtent l="0" t="0" r="0" b="0"/>
             <wp:docPr id="37" name="Picture 37"/>
@@ -16755,11 +17138,7 @@
               <w:t>Count stock for each choice</w:t>
             </w:r>
             <w:r>
-              <w:t xml:space="preserve">, or removing that selection, clears the counts </w:t>
-            </w:r>
-            <w:r>
-              <w:lastRenderedPageBreak/>
-              <w:t>kept for each choice. Removing a choice keeps old sales sheets correct - it just stops being offered.</w:t>
+              <w:t>, or removing that selection, clears the counts kept for each choice. Removing a choice keeps old sales sheets correct - it just stops being offered.</w:t>
             </w:r>
           </w:p>
         </w:tc>
@@ -16836,8 +17215,9 @@
       <w:pPr>
         <w:pStyle w:val="Heading2"/>
       </w:pPr>
-      <w:bookmarkStart w:id="44" w:name="_Toc242438387"/>
-      <w:r>
+      <w:bookmarkStart w:id="44" w:name="_Toc242440267"/>
+      <w:r>
+        <w:lastRenderedPageBreak/>
         <w:t>Delivery and services</w:t>
       </w:r>
       <w:bookmarkEnd w:id="44"/>
@@ -16890,7 +17270,7 @@
           <w:noProof/>
         </w:rPr>
         <w:drawing>
-          <wp:inline distT="0" distB="0" distL="0" distR="0" wp14:anchorId="44F57D18" wp14:editId="18CCD438">
+          <wp:inline distT="0" distB="0" distL="0" distR="0" wp14:anchorId="05493F38" wp14:editId="660AEA7C">
             <wp:extent cx="5760720" cy="1710214"/>
             <wp:effectExtent l="0" t="0" r="0" b="0"/>
             <wp:docPr id="38" name="Picture 38"/>
@@ -17338,7 +17718,6 @@
               <w:rPr>
                 <w:b/>
               </w:rPr>
-              <w:lastRenderedPageBreak/>
               <w:t>Sale on this option</w:t>
             </w:r>
           </w:p>
@@ -17410,8 +17789,9 @@
         <w:rPr>
           <w:noProof/>
         </w:rPr>
+        <w:lastRenderedPageBreak/>
         <w:drawing>
-          <wp:inline distT="0" distB="0" distL="0" distR="0" wp14:anchorId="04F6324D" wp14:editId="73F47229">
+          <wp:inline distT="0" distB="0" distL="0" distR="0" wp14:anchorId="4BD27827" wp14:editId="64585997">
             <wp:extent cx="4206240" cy="4534852"/>
             <wp:effectExtent l="0" t="0" r="0" b="0"/>
             <wp:docPr id="39" name="Picture 39"/>
@@ -17523,7 +17903,7 @@
         </w:rPr>
         <w:lastRenderedPageBreak/>
         <w:drawing>
-          <wp:inline distT="0" distB="0" distL="0" distR="0" wp14:anchorId="03CC85F6" wp14:editId="583BD39B">
+          <wp:inline distT="0" distB="0" distL="0" distR="0" wp14:anchorId="2C71E580" wp14:editId="287E2BB4">
             <wp:extent cx="5120640" cy="3829050"/>
             <wp:effectExtent l="0" t="0" r="0" b="0"/>
             <wp:docPr id="40" name="Picture 40"/>
@@ -17575,15 +17955,266 @@
     </w:p>
     <w:p>
       <w:pPr>
+        <w:pStyle w:val="Heading2"/>
+      </w:pPr>
+      <w:bookmarkStart w:id="45" w:name="_Toc242440268"/>
+      <w:r>
+        <w:t>Financing options</w:t>
+      </w:r>
+      <w:bookmarkEnd w:id="45"/>
+    </w:p>
+    <w:p>
+      <w:r>
+        <w:t xml:space="preserve">Tap the </w:t>
+      </w:r>
+      <w:r>
+        <w:rPr>
+          <w:b/>
+        </w:rPr>
+        <w:t>Financing Options</w:t>
+      </w:r>
+      <w:r>
+        <w:t xml:space="preserve"> tab in the Catalog to set up the kinds of financing a customer can choose, such as 12 months no interest. Checkout picks one from a list when a sale is financed.</w:t>
+      </w:r>
+    </w:p>
+    <w:p>
+      <w:pPr>
+        <w:tabs>
+          <w:tab w:val="left" w:pos="504"/>
+        </w:tabs>
+        <w:spacing w:after="80"/>
+        <w:ind w:left="504" w:hanging="432"/>
+      </w:pPr>
+      <w:r>
+        <w:rPr>
+          <w:b/>
+          <w:color w:val="0369A1"/>
+        </w:rPr>
+        <w:t>1.</w:t>
+      </w:r>
+      <w:r>
+        <w:rPr>
+          <w:b/>
+          <w:color w:val="0369A1"/>
+        </w:rPr>
+        <w:tab/>
+      </w:r>
+      <w:r>
+        <w:t xml:space="preserve">Tap </w:t>
+      </w:r>
+      <w:r>
+        <w:rPr>
+          <w:b/>
+        </w:rPr>
+        <w:t>Add</w:t>
+      </w:r>
+      <w:r>
+        <w:t>.</w:t>
+      </w:r>
+    </w:p>
+    <w:p>
+      <w:pPr>
+        <w:tabs>
+          <w:tab w:val="left" w:pos="504"/>
+        </w:tabs>
+        <w:spacing w:after="80"/>
+        <w:ind w:left="504" w:hanging="432"/>
+      </w:pPr>
+      <w:r>
+        <w:rPr>
+          <w:b/>
+          <w:color w:val="0369A1"/>
+        </w:rPr>
+        <w:t>2.</w:t>
+      </w:r>
+      <w:r>
+        <w:rPr>
+          <w:b/>
+          <w:color w:val="0369A1"/>
+        </w:rPr>
+        <w:tab/>
+      </w:r>
+      <w:r>
+        <w:t xml:space="preserve">Type the </w:t>
+      </w:r>
+      <w:r>
+        <w:rPr>
+          <w:b/>
+        </w:rPr>
+        <w:t>Name</w:t>
+      </w:r>
+      <w:r>
+        <w:t>.</w:t>
+      </w:r>
+    </w:p>
+    <w:p>
+      <w:pPr>
+        <w:tabs>
+          <w:tab w:val="left" w:pos="504"/>
+        </w:tabs>
+        <w:spacing w:after="80"/>
+        <w:ind w:left="504" w:hanging="432"/>
+      </w:pPr>
+      <w:r>
+        <w:rPr>
+          <w:b/>
+          <w:color w:val="0369A1"/>
+        </w:rPr>
+        <w:t>3.</w:t>
+      </w:r>
+      <w:r>
+        <w:rPr>
+          <w:b/>
+          <w:color w:val="0369A1"/>
+        </w:rPr>
+        <w:tab/>
+      </w:r>
+      <w:r>
+        <w:t xml:space="preserve">Leave </w:t>
+      </w:r>
+      <w:r>
+        <w:rPr>
+          <w:b/>
+        </w:rPr>
+        <w:t>Offered at checkout</w:t>
+      </w:r>
+      <w:r>
+        <w:t xml:space="preserve"> ticked and tap </w:t>
+      </w:r>
+      <w:r>
+        <w:rPr>
+          <w:b/>
+        </w:rPr>
+        <w:t>Save</w:t>
+      </w:r>
+      <w:r>
+        <w:t>.</w:t>
+      </w:r>
+    </w:p>
+    <w:p>
+      <w:pPr>
+        <w:pStyle w:val="ListBullet"/>
+        <w:spacing w:after="60"/>
+      </w:pPr>
+      <w:r>
+        <w:t>Use the arrows to change the order checkout lists them in.</w:t>
+      </w:r>
+    </w:p>
+    <w:p>
+      <w:pPr>
+        <w:pStyle w:val="ListBullet"/>
+        <w:spacing w:after="60"/>
+      </w:pPr>
+      <w:r>
+        <w:rPr>
+          <w:b/>
+        </w:rPr>
+        <w:t>Edit</w:t>
+      </w:r>
+      <w:r>
+        <w:t xml:space="preserve"> renames an option, or untick </w:t>
+      </w:r>
+      <w:r>
+        <w:rPr>
+          <w:b/>
+        </w:rPr>
+        <w:t>Offered at checkout</w:t>
+      </w:r>
+      <w:r>
+        <w:t xml:space="preserve"> to take it off the list without deleting it.</w:t>
+      </w:r>
+    </w:p>
+    <w:p>
+      <w:pPr>
+        <w:pStyle w:val="ListBullet"/>
+        <w:spacing w:after="60"/>
+      </w:pPr>
+      <w:r>
+        <w:t>The trash icon deletes an option.</w:t>
+      </w:r>
+    </w:p>
+    <w:tbl>
+      <w:tblPr>
+        <w:tblW w:w="0" w:type="auto"/>
+        <w:jc w:val="center"/>
+        <w:tblLook w:val="04A0" w:firstRow="1" w:lastRow="0" w:firstColumn="1" w:lastColumn="0" w:noHBand="0" w:noVBand="1"/>
+      </w:tblPr>
+      <w:tblGrid>
+        <w:gridCol w:w="9360"/>
+      </w:tblGrid>
+      <w:tr>
+        <w:trPr>
+          <w:jc w:val="center"/>
+        </w:trPr>
+        <w:tc>
+          <w:tcPr>
+            <w:tcW w:w="9360" w:type="dxa"/>
+            <w:tcBorders>
+              <w:top w:val="single" w:sz="4" w:space="0" w:color="F3F4F6"/>
+              <w:left w:val="single" w:sz="36" w:space="0" w:color="6B7280"/>
+              <w:bottom w:val="single" w:sz="4" w:space="0" w:color="F3F4F6"/>
+              <w:right w:val="single" w:sz="4" w:space="0" w:color="F3F4F6"/>
+            </w:tcBorders>
+            <w:shd w:val="clear" w:color="auto" w:fill="F3F4F6"/>
+            <w:tcMar>
+              <w:top w:w="120" w:type="dxa"/>
+              <w:left w:w="200" w:type="dxa"/>
+              <w:bottom w:w="120" w:type="dxa"/>
+              <w:right w:w="160" w:type="dxa"/>
+            </w:tcMar>
+          </w:tcPr>
+          <w:p>
+            <w:pPr>
+              <w:spacing w:after="0"/>
+            </w:pPr>
+            <w:r>
+              <w:rPr>
+                <w:b/>
+                <w:color w:val="6B7280"/>
+              </w:rPr>
+              <w:t xml:space="preserve">Good to know:  </w:t>
+            </w:r>
+            <w:r>
+              <w:t xml:space="preserve">Renaming or deleting an option never changes a sale already recorded with it. Whether checkout can also pick </w:t>
+            </w:r>
+            <w:r>
+              <w:rPr>
+                <w:b/>
+              </w:rPr>
+              <w:t>Other</w:t>
+            </w:r>
+            <w:r>
+              <w:t xml:space="preserve"> and type one in is set under Settings (see </w:t>
+            </w:r>
+            <w:r>
+              <w:rPr>
+                <w:b/>
+              </w:rPr>
+              <w:t>Admin: settings</w:t>
+            </w:r>
+            <w:r>
+              <w:t>).</w:t>
+            </w:r>
+          </w:p>
+        </w:tc>
+      </w:tr>
+    </w:tbl>
+    <w:p>
+      <w:pPr>
+        <w:spacing w:after="40"/>
+      </w:pPr>
+    </w:p>
+    <w:p>
+      <w:pPr>
         <w:pStyle w:val="Heading1"/>
         <w:pageBreakBefore/>
       </w:pPr>
-      <w:bookmarkStart w:id="45" w:name="_Toc242438388"/>
+      <w:bookmarkStart w:id="46" w:name="_Toc242440269"/>
       <w:r>
         <w:lastRenderedPageBreak/>
         <w:t>Admin: managing the crew</w:t>
       </w:r>
-      <w:bookmarkEnd w:id="45"/>
+      <w:bookmarkEnd w:id="46"/>
     </w:p>
     <w:p>
       <w:r>
@@ -17610,7 +18241,7 @@
           <w:noProof/>
         </w:rPr>
         <w:drawing>
-          <wp:inline distT="0" distB="0" distL="0" distR="0" wp14:anchorId="0A31C5B7" wp14:editId="327AC03E">
+          <wp:inline distT="0" distB="0" distL="0" distR="0" wp14:anchorId="0B5F67D1" wp14:editId="661E8514">
             <wp:extent cx="5760720" cy="1854232"/>
             <wp:effectExtent l="0" t="0" r="0" b="0"/>
             <wp:docPr id="41" name="Picture 41"/>
@@ -17882,7 +18513,7 @@
           <w:noProof/>
         </w:rPr>
         <w:drawing>
-          <wp:inline distT="0" distB="0" distL="0" distR="0" wp14:anchorId="2A2DDE4C" wp14:editId="3CB5BFEF">
+          <wp:inline distT="0" distB="0" distL="0" distR="0" wp14:anchorId="3BE44D65" wp14:editId="407A0291">
             <wp:extent cx="4023360" cy="2703195"/>
             <wp:effectExtent l="0" t="0" r="0" b="0"/>
             <wp:docPr id="42" name="Picture 42"/>
@@ -17942,12 +18573,12 @@
         <w:pStyle w:val="Heading1"/>
         <w:pageBreakBefore/>
       </w:pPr>
-      <w:bookmarkStart w:id="46" w:name="_Toc242438389"/>
+      <w:bookmarkStart w:id="47" w:name="_Toc242440270"/>
       <w:r>
         <w:lastRenderedPageBreak/>
         <w:t>Admin: settings</w:t>
       </w:r>
-      <w:bookmarkEnd w:id="46"/>
+      <w:bookmarkEnd w:id="47"/>
     </w:p>
     <w:p>
       <w:r>
@@ -17978,7 +18609,7 @@
         <w:t>More</w:t>
       </w:r>
       <w:r>
-        <w:t xml:space="preserve">. The page has five sections, and each one has its own </w:t>
+        <w:t xml:space="preserve">. The page has six sections, and each one has its own </w:t>
       </w:r>
       <w:r>
         <w:rPr>
@@ -18012,11 +18643,11 @@
       <w:pPr>
         <w:pStyle w:val="Heading2"/>
       </w:pPr>
-      <w:bookmarkStart w:id="47" w:name="_Toc242438390"/>
+      <w:bookmarkStart w:id="48" w:name="_Toc242440271"/>
       <w:r>
         <w:t>Business details</w:t>
       </w:r>
-      <w:bookmarkEnd w:id="47"/>
+      <w:bookmarkEnd w:id="48"/>
     </w:p>
     <w:p>
       <w:pPr>
@@ -18029,7 +18660,7 @@
           <w:noProof/>
         </w:rPr>
         <w:drawing>
-          <wp:inline distT="0" distB="0" distL="0" distR="0" wp14:anchorId="239101C0" wp14:editId="0CFCF8FF">
+          <wp:inline distT="0" distB="0" distL="0" distR="0" wp14:anchorId="23C15D94" wp14:editId="4C2FB5A1">
             <wp:extent cx="5760720" cy="1429893"/>
             <wp:effectExtent l="0" t="0" r="0" b="0"/>
             <wp:docPr id="43" name="Picture 43"/>
@@ -18393,11 +19024,11 @@
       <w:pPr>
         <w:pStyle w:val="Heading2"/>
       </w:pPr>
-      <w:bookmarkStart w:id="48" w:name="_Toc242438391"/>
+      <w:bookmarkStart w:id="49" w:name="_Toc242440272"/>
       <w:r>
         <w:t>Sales sheet terms</w:t>
       </w:r>
-      <w:bookmarkEnd w:id="48"/>
+      <w:bookmarkEnd w:id="49"/>
     </w:p>
     <w:p>
       <w:r>
@@ -18416,7 +19047,7 @@
         </w:rPr>
         <w:lastRenderedPageBreak/>
         <w:drawing>
-          <wp:inline distT="0" distB="0" distL="0" distR="0" wp14:anchorId="5FE904BC" wp14:editId="09677FAF">
+          <wp:inline distT="0" distB="0" distL="0" distR="0" wp14:anchorId="5D57CA89" wp14:editId="0C01DCF0">
             <wp:extent cx="5760720" cy="4937760"/>
             <wp:effectExtent l="0" t="0" r="0" b="0"/>
             <wp:docPr id="44" name="Picture 44"/>
@@ -18789,11 +19420,11 @@
       <w:pPr>
         <w:pStyle w:val="Heading2"/>
       </w:pPr>
-      <w:bookmarkStart w:id="49" w:name="_Toc242438392"/>
+      <w:bookmarkStart w:id="50" w:name="_Toc242440273"/>
       <w:r>
         <w:t>Receipt email</w:t>
       </w:r>
-      <w:bookmarkEnd w:id="49"/>
+      <w:bookmarkEnd w:id="50"/>
     </w:p>
     <w:p>
       <w:r>
@@ -18811,7 +19442,7 @@
           <w:noProof/>
         </w:rPr>
         <w:drawing>
-          <wp:inline distT="0" distB="0" distL="0" distR="0" wp14:anchorId="629A18D1" wp14:editId="4CB6E543">
+          <wp:inline distT="0" distB="0" distL="0" distR="0" wp14:anchorId="3E859DA2" wp14:editId="26FD1D67">
             <wp:extent cx="5760720" cy="4454271"/>
             <wp:effectExtent l="0" t="0" r="0" b="0"/>
             <wp:docPr id="45" name="Picture 45"/>
@@ -19788,11 +20419,134 @@
       <w:pPr>
         <w:pStyle w:val="Heading2"/>
       </w:pPr>
-      <w:bookmarkStart w:id="50" w:name="_Toc242438393"/>
-      <w:r>
+      <w:bookmarkStart w:id="51" w:name="_Toc242440274"/>
+      <w:r>
+        <w:t>Financing</w:t>
+      </w:r>
+      <w:bookmarkEnd w:id="51"/>
+    </w:p>
+    <w:p>
+      <w:r>
+        <w:t xml:space="preserve">Choose whether checkout's </w:t>
+      </w:r>
+      <w:r>
+        <w:rPr>
+          <w:b/>
+        </w:rPr>
+        <w:t>Financing type</w:t>
+      </w:r>
+      <w:r>
+        <w:t xml:space="preserve"> list ends with </w:t>
+      </w:r>
+      <w:r>
+        <w:rPr>
+          <w:b/>
+        </w:rPr>
+        <w:t>Other</w:t>
+      </w:r>
+      <w:r>
+        <w:t xml:space="preserve">. With </w:t>
+      </w:r>
+      <w:r>
+        <w:rPr>
+          <w:b/>
+        </w:rPr>
+        <w:t>Offer "Other" at checkout</w:t>
+      </w:r>
+      <w:r>
+        <w:t xml:space="preserve"> ticked (the normal setting), checkout can pick </w:t>
+      </w:r>
+      <w:r>
+        <w:rPr>
+          <w:b/>
+        </w:rPr>
+        <w:t>Other</w:t>
+      </w:r>
+      <w:r>
+        <w:t xml:space="preserve"> and type in a kind of financing that isn't one of the financing options. Untick it so checkout can only pick from the list, then tap </w:t>
+      </w:r>
+      <w:r>
+        <w:rPr>
+          <w:b/>
+        </w:rPr>
+        <w:t>Save</w:t>
+      </w:r>
+      <w:r>
+        <w:t>.</w:t>
+      </w:r>
+    </w:p>
+    <w:tbl>
+      <w:tblPr>
+        <w:tblW w:w="0" w:type="auto"/>
+        <w:jc w:val="center"/>
+        <w:tblLook w:val="04A0" w:firstRow="1" w:lastRow="0" w:firstColumn="1" w:lastColumn="0" w:noHBand="0" w:noVBand="1"/>
+      </w:tblPr>
+      <w:tblGrid>
+        <w:gridCol w:w="9360"/>
+      </w:tblGrid>
+      <w:tr>
+        <w:trPr>
+          <w:jc w:val="center"/>
+        </w:trPr>
+        <w:tc>
+          <w:tcPr>
+            <w:tcW w:w="9360" w:type="dxa"/>
+            <w:tcBorders>
+              <w:top w:val="single" w:sz="4" w:space="0" w:color="F3F4F6"/>
+              <w:left w:val="single" w:sz="36" w:space="0" w:color="6B7280"/>
+              <w:bottom w:val="single" w:sz="4" w:space="0" w:color="F3F4F6"/>
+              <w:right w:val="single" w:sz="4" w:space="0" w:color="F3F4F6"/>
+            </w:tcBorders>
+            <w:shd w:val="clear" w:color="auto" w:fill="F3F4F6"/>
+            <w:tcMar>
+              <w:top w:w="120" w:type="dxa"/>
+              <w:left w:w="200" w:type="dxa"/>
+              <w:bottom w:w="120" w:type="dxa"/>
+              <w:right w:w="160" w:type="dxa"/>
+            </w:tcMar>
+          </w:tcPr>
+          <w:p>
+            <w:pPr>
+              <w:spacing w:after="0"/>
+            </w:pPr>
+            <w:r>
+              <w:rPr>
+                <w:b/>
+                <w:color w:val="6B7280"/>
+              </w:rPr>
+              <w:t xml:space="preserve">Good to know:  </w:t>
+            </w:r>
+            <w:r>
+              <w:t xml:space="preserve">The financing options themselves are set up in the Catalog (see </w:t>
+            </w:r>
+            <w:r>
+              <w:rPr>
+                <w:b/>
+              </w:rPr>
+              <w:t>Admin: managing the catalog</w:t>
+            </w:r>
+            <w:r>
+              <w:t>).</w:t>
+            </w:r>
+          </w:p>
+        </w:tc>
+      </w:tr>
+    </w:tbl>
+    <w:p>
+      <w:pPr>
+        <w:spacing w:after="40"/>
+      </w:pPr>
+    </w:p>
+    <w:p>
+      <w:pPr>
+        <w:pStyle w:val="Heading2"/>
+      </w:pPr>
+      <w:bookmarkStart w:id="52" w:name="_Toc242440275"/>
+      <w:r>
+        <w:lastRenderedPageBreak/>
         <w:t>New events</w:t>
       </w:r>
-      <w:bookmarkEnd w:id="50"/>
+      <w:bookmarkEnd w:id="52"/>
     </w:p>
     <w:p>
       <w:pPr>
@@ -19805,7 +20559,7 @@
           <w:noProof/>
         </w:rPr>
         <w:drawing>
-          <wp:inline distT="0" distB="0" distL="0" distR="0" wp14:anchorId="1F86254A" wp14:editId="78515B93">
+          <wp:inline distT="0" distB="0" distL="0" distR="0" wp14:anchorId="575DD22E" wp14:editId="45551FC7">
             <wp:extent cx="5760720" cy="1512189"/>
             <wp:effectExtent l="0" t="0" r="0" b="0"/>
             <wp:docPr id="46" name="Picture 46"/>
@@ -19857,7 +20611,6 @@
     </w:p>
     <w:p>
       <w:r>
-        <w:lastRenderedPageBreak/>
         <w:t xml:space="preserve">Set the </w:t>
       </w:r>
       <w:r>
@@ -19883,11 +20636,11 @@
       <w:pPr>
         <w:pStyle w:val="Heading2"/>
       </w:pPr>
-      <w:bookmarkStart w:id="51" w:name="_Toc242438394"/>
+      <w:bookmarkStart w:id="53" w:name="_Toc242440276"/>
       <w:r>
         <w:t>Dashboard</w:t>
       </w:r>
-      <w:bookmarkEnd w:id="51"/>
+      <w:bookmarkEnd w:id="53"/>
     </w:p>
     <w:p>
       <w:pPr>
@@ -19900,7 +20653,7 @@
           <w:noProof/>
         </w:rPr>
         <w:drawing>
-          <wp:inline distT="0" distB="0" distL="0" distR="0" wp14:anchorId="6433127B" wp14:editId="1658F119">
+          <wp:inline distT="0" distB="0" distL="0" distR="0" wp14:anchorId="6DB0F2CD" wp14:editId="385F96B0">
             <wp:extent cx="5760720" cy="1594485"/>
             <wp:effectExtent l="0" t="0" r="0" b="0"/>
             <wp:docPr id="47" name="Picture 47"/>
@@ -20230,12 +20983,12 @@
         <w:pStyle w:val="Heading1"/>
         <w:pageBreakBefore/>
       </w:pPr>
-      <w:bookmarkStart w:id="52" w:name="_Toc242438395"/>
+      <w:bookmarkStart w:id="54" w:name="_Toc242440277"/>
       <w:r>
         <w:lastRenderedPageBreak/>
         <w:t>Tips and troubleshooting</w:t>
       </w:r>
-      <w:bookmarkEnd w:id="52"/>
+      <w:bookmarkEnd w:id="54"/>
     </w:p>
     <w:p>
       <w:r>
@@ -20340,6 +21093,59 @@
         <w:pStyle w:val="Heading3"/>
       </w:pPr>
       <w:r>
+        <w:t>Checkout won't record a financing payment.</w:t>
+      </w:r>
+    </w:p>
+    <w:p>
+      <w:r>
+        <w:t xml:space="preserve">Choose the </w:t>
+      </w:r>
+      <w:r>
+        <w:rPr>
+          <w:b/>
+        </w:rPr>
+        <w:t>Financing type</w:t>
+      </w:r>
+      <w:r>
+        <w:t xml:space="preserve"> (or </w:t>
+      </w:r>
+      <w:r>
+        <w:rPr>
+          <w:b/>
+        </w:rPr>
+        <w:t>Other</w:t>
+      </w:r>
+      <w:r>
+        <w:t xml:space="preserve"> and type it in) and enter the </w:t>
+      </w:r>
+      <w:r>
+        <w:rPr>
+          <w:b/>
+        </w:rPr>
+        <w:t>Financing #</w:t>
+      </w:r>
+      <w:r>
+        <w:t xml:space="preserve"> first. Both are needed. If the list is empty and there's no Other, an administrator needs to add financing options in the Catalog.</w:t>
+      </w:r>
+    </w:p>
+    <w:p>
+      <w:pPr>
+        <w:pStyle w:val="Heading3"/>
+      </w:pPr>
+      <w:r>
+        <w:t>Take With is greyed out with "Not kept at the cart".</w:t>
+      </w:r>
+    </w:p>
+    <w:p>
+      <w:r>
+        <w:t>That size has been left out of the inventory count, so the cart doesn't keep it. Choose a shipping method instead.</w:t>
+      </w:r>
+    </w:p>
+    <w:p>
+      <w:pPr>
+        <w:pStyle w:val="Heading3"/>
+      </w:pPr>
+      <w:r>
         <w:t>A product shows "Inquire" instead of a price.</w:t>
       </w:r>
     </w:p>
@@ -20423,6 +21229,7 @@
         <w:pStyle w:val="Heading3"/>
       </w:pPr>
       <w:r>
+        <w:lastRenderedPageBreak/>
         <w:t>Email says email isn't set up.</w:t>
       </w:r>
     </w:p>
@@ -20458,7 +21265,6 @@
         <w:pStyle w:val="Heading3"/>
       </w:pPr>
       <w:r>
-        <w:lastRenderedPageBreak/>
         <w:t>The customer didn't get their receipt email.</w:t>
       </w:r>
     </w:p>
@@ -20652,22 +21458,22 @@
         <w:pStyle w:val="Heading1"/>
         <w:pageBreakBefore/>
       </w:pPr>
-      <w:bookmarkStart w:id="53" w:name="_Toc242438396"/>
+      <w:bookmarkStart w:id="55" w:name="_Toc242440278"/>
       <w:r>
         <w:lastRenderedPageBreak/>
         <w:t>Quick reference</w:t>
       </w:r>
-      <w:bookmarkEnd w:id="53"/>
+      <w:bookmarkEnd w:id="55"/>
     </w:p>
     <w:p>
       <w:pPr>
         <w:pStyle w:val="Heading2"/>
       </w:pPr>
-      <w:bookmarkStart w:id="54" w:name="_Toc242438397"/>
+      <w:bookmarkStart w:id="56" w:name="_Toc242440279"/>
       <w:r>
         <w:t>Sales rep checklist</w:t>
       </w:r>
-      <w:bookmarkEnd w:id="54"/>
+      <w:bookmarkEnd w:id="56"/>
     </w:p>
     <w:p>
       <w:pPr>
@@ -20807,11 +21613,11 @@
       <w:pPr>
         <w:pStyle w:val="Heading2"/>
       </w:pPr>
-      <w:bookmarkStart w:id="55" w:name="_Toc242438398"/>
+      <w:bookmarkStart w:id="57" w:name="_Toc242440280"/>
       <w:r>
         <w:t>Checkout checklist</w:t>
       </w:r>
-      <w:bookmarkEnd w:id="55"/>
+      <w:bookmarkEnd w:id="57"/>
     </w:p>
     <w:p>
       <w:pPr>
@@ -20897,7 +21703,7 @@
         <w:tab/>
       </w:r>
       <w:r>
-        <w:t xml:space="preserve">Pick the payment method, then </w:t>
+        <w:t xml:space="preserve">Pick the payment method (for financing, also the type and financing #), then </w:t>
       </w:r>
       <w:r>
         <w:rPr>
@@ -20995,11 +21801,11 @@
       <w:pPr>
         <w:pStyle w:val="Heading2"/>
       </w:pPr>
-      <w:bookmarkStart w:id="56" w:name="_Toc242438399"/>
+      <w:bookmarkStart w:id="58" w:name="_Toc242440281"/>
       <w:r>
         <w:t>Inventory counts</w:t>
       </w:r>
-      <w:bookmarkEnd w:id="56"/>
+      <w:bookmarkEnd w:id="58"/>
     </w:p>
     <w:p>
       <w:pPr>
@@ -21199,11 +22005,11 @@
       <w:pPr>
         <w:pStyle w:val="Heading2"/>
       </w:pPr>
-      <w:bookmarkStart w:id="57" w:name="_Toc242438400"/>
+      <w:bookmarkStart w:id="59" w:name="_Toc242440282"/>
       <w:r>
         <w:t>Order status at a glance</w:t>
       </w:r>
-      <w:bookmarkEnd w:id="57"/>
+      <w:bookmarkEnd w:id="59"/>
     </w:p>
     <w:tbl>
       <w:tblPr>
@@ -21819,31 +22625,31 @@
       </w:rPr>
     </w:lvl>
   </w:abstractNum>
-  <w:num w:numId="1" w16cid:durableId="2137330798">
+  <w:num w:numId="1" w16cid:durableId="239558724">
     <w:abstractNumId w:val="8"/>
   </w:num>
-  <w:num w:numId="2" w16cid:durableId="300813283">
+  <w:num w:numId="2" w16cid:durableId="1254123213">
     <w:abstractNumId w:val="6"/>
   </w:num>
-  <w:num w:numId="3" w16cid:durableId="2030329441">
+  <w:num w:numId="3" w16cid:durableId="1728339063">
     <w:abstractNumId w:val="5"/>
   </w:num>
-  <w:num w:numId="4" w16cid:durableId="409888177">
+  <w:num w:numId="4" w16cid:durableId="1767076590">
     <w:abstractNumId w:val="4"/>
   </w:num>
-  <w:num w:numId="5" w16cid:durableId="441346801">
+  <w:num w:numId="5" w16cid:durableId="2050256717">
     <w:abstractNumId w:val="7"/>
   </w:num>
-  <w:num w:numId="6" w16cid:durableId="2141147422">
+  <w:num w:numId="6" w16cid:durableId="213930178">
     <w:abstractNumId w:val="3"/>
   </w:num>
-  <w:num w:numId="7" w16cid:durableId="2047024151">
+  <w:num w:numId="7" w16cid:durableId="1575703671">
     <w:abstractNumId w:val="2"/>
   </w:num>
-  <w:num w:numId="8" w16cid:durableId="2037534991">
+  <w:num w:numId="8" w16cid:durableId="1417750307">
     <w:abstractNumId w:val="1"/>
   </w:num>
-  <w:num w:numId="9" w16cid:durableId="489952672">
+  <w:num w:numId="9" w16cid:durableId="1930577699">
     <w:abstractNumId w:val="0"/>
   </w:num>
 </w:numbering>
@@ -33235,7 +34041,7 @@
     <w:autoRedefine/>
     <w:uiPriority w:val="39"/>
     <w:unhideWhenUsed/>
-    <w:rsid w:val="00C66154"/>
+    <w:rsid w:val="00673564"/>
     <w:pPr>
       <w:spacing w:after="100"/>
     </w:pPr>
@@ -33247,7 +34053,7 @@
     <w:autoRedefine/>
     <w:uiPriority w:val="39"/>
     <w:unhideWhenUsed/>
-    <w:rsid w:val="00C66154"/>
+    <w:rsid w:val="00673564"/>
     <w:pPr>
       <w:spacing w:after="100"/>
       <w:ind w:left="220"/>
@@ -33258,7 +34064,7 @@
     <w:basedOn w:val="DefaultParagraphFont"/>
     <w:uiPriority w:val="99"/>
     <w:unhideWhenUsed/>
-    <w:rsid w:val="00C66154"/>
+    <w:rsid w:val="00673564"/>
     <w:rPr>
       <w:color w:val="0000FF" w:themeColor="hyperlink"/>
       <w:u w:val="single"/>

</xml_diff>

<commit_message>
Dashboard: All events overview in place of Today
The Today filter becomes All events: totals across every event, plus a
list of each event's sales, matts/bases, average and net with a bar for
its total sales; tapping one opens that event. A new endpoint,
GET api/Dashboard/stats/all, returns the totals with each event's
figures; the unused stats/day endpoint is removed. The user guide's
Dashboard section is updated.

Co-Authored-By: Claude Opus 5.5 <noreply@anthropic.com>
</commit_message>
<xml_diff>
--- a/Documents/CFS Sales App User Guide.docx
+++ b/Documents/CFS Sales App User Guide.docx
@@ -12355,10 +12355,10 @@
         <w:rPr>
           <w:b/>
         </w:rPr>
-        <w:t>Today</w:t>
-      </w:r>
-      <w:r>
-        <w:t xml:space="preserve"> for everything sold today, or a fundraiser's name to see that whole event. Tap </w:t>
+        <w:t>All events</w:t>
+      </w:r>
+      <w:r>
+        <w:t xml:space="preserve"> for the totals across every fundraiser, with a list of what each one sold - tap one in the list to open it - or a fundraiser's name to see that whole event. Tap </w:t>
       </w:r>
       <w:r>
         <w:rPr>
@@ -12372,7 +12372,7 @@
     </w:p>
     <w:p>
       <w:r>
-        <w:t xml:space="preserve">On both the Dashboard and the Orders screen, the event buttons run from newest on the left to oldest on the right, with the active event always first. Past events carry a small </w:t>
+        <w:t xml:space="preserve">On both the Dashboard and the Orders screen, the event buttons run from newest on the left to oldest on the right, with the active event always first (after All events, on the Dashboard). Past events carry a small </w:t>
       </w:r>
       <w:r>
         <w:rPr>

</xml_diff>

<commit_message>
App: readable status bar in light mode; checkout badge, orders summary, tab titles
- App: the menu bar on every tab, and the blue band on the customer's
  sheets, are dark in both themes, so the status bar over them (time,
  signal, battery) is now white whatever the theme. Screens with a light
  header keep the theme's own, and the amber offline banner keeps it dark.
- App and dashboard: the Checkout tab shows how many customers are
  waiting at the checkout table, read every 20 seconds while the app or
  page is in view, for anyone who works checkout.
- App and dashboard: Orders shows how many orders the list holds, what
  they come to and what is still owed (voided orders aren't counted).
- Dashboard: each screen names itself in the browser tab, such as
  "Orders · CFS".

README and the user guide mention the badge and the summary line.

Co-Authored-By: Claude Opus 5.5 <noreply@anthropic.com>
</commit_message>
<xml_diff>
--- a/Documents/CFS Sales App User Guide.docx
+++ b/Documents/CFS Sales App User Guide.docx
@@ -9450,7 +9450,7 @@
         <w:t>Waiting to pay</w:t>
       </w:r>
       <w:r>
-        <w:t xml:space="preserve"> queue the moment a rep completes them, along with the customer's name, the rep, the item count, how long ago the order was sent over and the total. Tap an order to open it.</w:t>
+        <w:t xml:space="preserve"> queue the moment a rep completes them, along with the customer's name, the rep, the item count, how long ago the order was sent over and the total. Tap an order to open it. On any screen, a number on the Checkout tab shows how many customers are waiting.</w:t>
       </w:r>
     </w:p>
     <w:p>
@@ -12090,7 +12090,7 @@
         <w:t>Search</w:t>
       </w:r>
       <w:r>
-        <w:t xml:space="preserve"> by customer name, rep name, order number, phone number or email, then tap the magnifier or press Enter. A phone number matches however it was typed, so 5550100 finds (724) 555-0100.</w:t>
+        <w:t xml:space="preserve"> by customer name, rep name, order number, phone number or email, then tap the magnifier or press Enter. A phone number matches however it was typed, so 5550100 finds (724) 555-0100. The line above the list shows how many orders it holds, what they come to and what is still owed.</w:t>
       </w:r>
     </w:p>
     <w:p>

</xml_diff>

<commit_message>
Catalog: a note for the rep on each size
- Each size of a product has a "Note for the rep" (up to 300 characters)
  in Catalog, shown in Add item when that size is picked, in the same
  amber box as the product's own note.
- Catalog files carry the size note alongside the product's warranty and
  warranty length, so export/restore covers every product and size
  setting (stock counts stay out, as before). Checked with a round trip:
  export, change, restore, export again, then restore the original.
- Migration adds ProductVariants.Notes; the seed file can set it too.

README and the user guide mention the size note.

Co-Authored-By: Claude Opus 5.5 <noreply@anthropic.com>
</commit_message>
<xml_diff>
--- a/Documents/CFS Sales App User Guide.docx
+++ b/Documents/CFS Sales App User Guide.docx
@@ -16276,7 +16276,16 @@
         <w:t>Price</w:t>
       </w:r>
       <w:r>
-        <w:t>.</w:t>
+        <w:t xml:space="preserve">. Optionally add a </w:t>
+      </w:r>
+      <w:r>
+        <w:rPr>
+          <w:b/>
+        </w:rPr>
+        <w:t>Note for the rep</w:t>
+      </w:r>
+      <w:r>
+        <w:t xml:space="preserve"> for that size, such as "Special order - 4 to 6 weeks". The rep sees it in Add item when they pick the size.</w:t>
       </w:r>
     </w:p>
     <w:p>

</xml_diff>